<commit_message>
Start each top-level section of the Word report on a new page
Co-Authored-By: Claude Opus 5.5 <noreply@anthropic.com>
</commit_message>
<xml_diff>
--- a/report/assignment-1/Assignment-1-Report.docx
+++ b/report/assignment-1/Assignment-1-Report.docx
@@ -217,7 +217,15 @@
         <w:t xml:space="preserve">HAND OUT DATE: </w:t>
       </w:r>
       <w:r>
-        <w:t>- dd-mm-yyyy -</w:t>
+        <w:t>- dd-mm-</w:t>
+      </w:r>
+      <w:proofErr w:type="spellStart"/>
+      <w:r>
+        <w:t>yyyy</w:t>
+      </w:r>
+      <w:proofErr w:type="spellEnd"/>
+      <w:r>
+        <w:t xml:space="preserve"> -</w:t>
       </w:r>
     </w:p>
     <w:p>
@@ -243,7 +251,21 @@
         <w:rPr>
           <w:sz w:val="28"/>
         </w:rPr>
-        <w:t xml:space="preserve">HAND IN DATE:     - dd-mm-yyyy -   </w:t>
+        <w:t>HAND IN DATE:     - dd-mm-</w:t>
+      </w:r>
+      <w:proofErr w:type="spellStart"/>
+      <w:r>
+        <w:rPr>
+          <w:sz w:val="28"/>
+        </w:rPr>
+        <w:t>yyyy</w:t>
+      </w:r>
+      <w:proofErr w:type="spellEnd"/>
+      <w:r>
+        <w:rPr>
+          <w:sz w:val="28"/>
+        </w:rPr>
+        <w:t xml:space="preserve"> -   </w:t>
       </w:r>
     </w:p>
     <w:p>
@@ -671,7 +693,7 @@
         <w:rPr>
           <w:noProof/>
         </w:rPr>
-        <w:instrText xml:space="preserve"> PAGEREF _Toc244220530 \h </w:instrText>
+        <w:instrText xml:space="preserve"> PAGEREF _Toc244220588 \h </w:instrText>
       </w:r>
       <w:r>
         <w:rPr>
@@ -731,7 +753,7 @@
         <w:rPr>
           <w:noProof/>
         </w:rPr>
-        <w:instrText xml:space="preserve"> PAGEREF _Toc244220531 \h </w:instrText>
+        <w:instrText xml:space="preserve"> PAGEREF _Toc244220589 \h </w:instrText>
       </w:r>
       <w:r>
         <w:rPr>
@@ -748,7 +770,7 @@
         <w:rPr>
           <w:noProof/>
         </w:rPr>
-        <w:t>1</w:t>
+        <w:t>2</w:t>
       </w:r>
       <w:r>
         <w:rPr>
@@ -790,7 +812,7 @@
         <w:rPr>
           <w:noProof/>
         </w:rPr>
-        <w:instrText xml:space="preserve"> PAGEREF _Toc244220532 \h </w:instrText>
+        <w:instrText xml:space="preserve"> PAGEREF _Toc244220590 \h </w:instrText>
       </w:r>
       <w:r>
         <w:rPr>
@@ -807,7 +829,7 @@
         <w:rPr>
           <w:noProof/>
         </w:rPr>
-        <w:t>1</w:t>
+        <w:t>2</w:t>
       </w:r>
       <w:r>
         <w:rPr>
@@ -849,7 +871,7 @@
         <w:rPr>
           <w:noProof/>
         </w:rPr>
-        <w:instrText xml:space="preserve"> PAGEREF _Toc244220533 \h </w:instrText>
+        <w:instrText xml:space="preserve"> PAGEREF _Toc244220591 \h </w:instrText>
       </w:r>
       <w:r>
         <w:rPr>
@@ -866,7 +888,7 @@
         <w:rPr>
           <w:noProof/>
         </w:rPr>
-        <w:t>1</w:t>
+        <w:t>2</w:t>
       </w:r>
       <w:r>
         <w:rPr>
@@ -908,7 +930,7 @@
         <w:rPr>
           <w:noProof/>
         </w:rPr>
-        <w:instrText xml:space="preserve"> PAGEREF _Toc244220534 \h </w:instrText>
+        <w:instrText xml:space="preserve"> PAGEREF _Toc244220592 \h </w:instrText>
       </w:r>
       <w:r>
         <w:rPr>
@@ -967,7 +989,7 @@
         <w:rPr>
           <w:noProof/>
         </w:rPr>
-        <w:instrText xml:space="preserve"> PAGEREF _Toc244220535 \h </w:instrText>
+        <w:instrText xml:space="preserve"> PAGEREF _Toc244220593 \h </w:instrText>
       </w:r>
       <w:r>
         <w:rPr>
@@ -984,7 +1006,7 @@
         <w:rPr>
           <w:noProof/>
         </w:rPr>
-        <w:t>2</w:t>
+        <w:t>3</w:t>
       </w:r>
       <w:r>
         <w:rPr>
@@ -1026,7 +1048,7 @@
         <w:rPr>
           <w:noProof/>
         </w:rPr>
-        <w:instrText xml:space="preserve"> PAGEREF _Toc244220536 \h </w:instrText>
+        <w:instrText xml:space="preserve"> PAGEREF _Toc244220594 \h </w:instrText>
       </w:r>
       <w:r>
         <w:rPr>
@@ -1043,7 +1065,7 @@
         <w:rPr>
           <w:noProof/>
         </w:rPr>
-        <w:t>2</w:t>
+        <w:t>3</w:t>
       </w:r>
       <w:r>
         <w:rPr>
@@ -1086,7 +1108,7 @@
         <w:rPr>
           <w:noProof/>
         </w:rPr>
-        <w:instrText xml:space="preserve"> PAGEREF _Toc244220537 \h </w:instrText>
+        <w:instrText xml:space="preserve"> PAGEREF _Toc244220595 \h </w:instrText>
       </w:r>
       <w:r>
         <w:rPr>
@@ -1103,7 +1125,7 @@
         <w:rPr>
           <w:noProof/>
         </w:rPr>
-        <w:t>3</w:t>
+        <w:t>4</w:t>
       </w:r>
       <w:r>
         <w:rPr>
@@ -1145,7 +1167,7 @@
         <w:rPr>
           <w:noProof/>
         </w:rPr>
-        <w:instrText xml:space="preserve"> PAGEREF _Toc244220538 \h </w:instrText>
+        <w:instrText xml:space="preserve"> PAGEREF _Toc244220596 \h </w:instrText>
       </w:r>
       <w:r>
         <w:rPr>
@@ -1162,7 +1184,7 @@
         <w:rPr>
           <w:noProof/>
         </w:rPr>
-        <w:t>3</w:t>
+        <w:t>4</w:t>
       </w:r>
       <w:r>
         <w:rPr>
@@ -1204,7 +1226,7 @@
         <w:rPr>
           <w:noProof/>
         </w:rPr>
-        <w:instrText xml:space="preserve"> PAGEREF _Toc244220539 \h </w:instrText>
+        <w:instrText xml:space="preserve"> PAGEREF _Toc244220597 \h </w:instrText>
       </w:r>
       <w:r>
         <w:rPr>
@@ -1221,7 +1243,7 @@
         <w:rPr>
           <w:noProof/>
         </w:rPr>
-        <w:t>4</w:t>
+        <w:t>5</w:t>
       </w:r>
       <w:r>
         <w:rPr>
@@ -1263,7 +1285,7 @@
         <w:rPr>
           <w:noProof/>
         </w:rPr>
-        <w:instrText xml:space="preserve"> PAGEREF _Toc244220540 \h </w:instrText>
+        <w:instrText xml:space="preserve"> PAGEREF _Toc244220598 \h </w:instrText>
       </w:r>
       <w:r>
         <w:rPr>
@@ -1280,7 +1302,7 @@
         <w:rPr>
           <w:noProof/>
         </w:rPr>
-        <w:t>5</w:t>
+        <w:t>6</w:t>
       </w:r>
       <w:r>
         <w:rPr>
@@ -1322,7 +1344,7 @@
         <w:rPr>
           <w:noProof/>
         </w:rPr>
-        <w:instrText xml:space="preserve"> PAGEREF _Toc244220541 \h </w:instrText>
+        <w:instrText xml:space="preserve"> PAGEREF _Toc244220599 \h </w:instrText>
       </w:r>
       <w:r>
         <w:rPr>
@@ -1339,7 +1361,7 @@
         <w:rPr>
           <w:noProof/>
         </w:rPr>
-        <w:t>6</w:t>
+        <w:t>7</w:t>
       </w:r>
       <w:r>
         <w:rPr>
@@ -1382,7 +1404,7 @@
         <w:rPr>
           <w:noProof/>
         </w:rPr>
-        <w:instrText xml:space="preserve"> PAGEREF _Toc244220542 \h </w:instrText>
+        <w:instrText xml:space="preserve"> PAGEREF _Toc244220600 \h </w:instrText>
       </w:r>
       <w:r>
         <w:rPr>
@@ -1399,7 +1421,7 @@
         <w:rPr>
           <w:noProof/>
         </w:rPr>
-        <w:t>7</w:t>
+        <w:t>9</w:t>
       </w:r>
       <w:r>
         <w:rPr>
@@ -1441,7 +1463,7 @@
         <w:rPr>
           <w:noProof/>
         </w:rPr>
-        <w:instrText xml:space="preserve"> PAGEREF _Toc244220543 \h </w:instrText>
+        <w:instrText xml:space="preserve"> PAGEREF _Toc244220601 \h </w:instrText>
       </w:r>
       <w:r>
         <w:rPr>
@@ -1458,7 +1480,7 @@
         <w:rPr>
           <w:noProof/>
         </w:rPr>
-        <w:t>7</w:t>
+        <w:t>9</w:t>
       </w:r>
       <w:r>
         <w:rPr>
@@ -1500,7 +1522,7 @@
         <w:rPr>
           <w:noProof/>
         </w:rPr>
-        <w:instrText xml:space="preserve"> PAGEREF _Toc244220544 \h </w:instrText>
+        <w:instrText xml:space="preserve"> PAGEREF _Toc244220602 \h </w:instrText>
       </w:r>
       <w:r>
         <w:rPr>
@@ -1517,7 +1539,7 @@
         <w:rPr>
           <w:noProof/>
         </w:rPr>
-        <w:t>7</w:t>
+        <w:t>9</w:t>
       </w:r>
       <w:r>
         <w:rPr>
@@ -1559,7 +1581,7 @@
         <w:rPr>
           <w:noProof/>
         </w:rPr>
-        <w:instrText xml:space="preserve"> PAGEREF _Toc244220545 \h </w:instrText>
+        <w:instrText xml:space="preserve"> PAGEREF _Toc244220603 \h </w:instrText>
       </w:r>
       <w:r>
         <w:rPr>
@@ -1576,7 +1598,7 @@
         <w:rPr>
           <w:noProof/>
         </w:rPr>
-        <w:t>8</w:t>
+        <w:t>10</w:t>
       </w:r>
       <w:r>
         <w:rPr>
@@ -1618,7 +1640,7 @@
         <w:rPr>
           <w:noProof/>
         </w:rPr>
-        <w:instrText xml:space="preserve"> PAGEREF _Toc244220546 \h </w:instrText>
+        <w:instrText xml:space="preserve"> PAGEREF _Toc244220604 \h </w:instrText>
       </w:r>
       <w:r>
         <w:rPr>
@@ -1635,7 +1657,7 @@
         <w:rPr>
           <w:noProof/>
         </w:rPr>
-        <w:t>8</w:t>
+        <w:t>10</w:t>
       </w:r>
       <w:r>
         <w:rPr>
@@ -1677,7 +1699,7 @@
         <w:rPr>
           <w:noProof/>
         </w:rPr>
-        <w:instrText xml:space="preserve"> PAGEREF _Toc244220547 \h </w:instrText>
+        <w:instrText xml:space="preserve"> PAGEREF _Toc244220605 \h </w:instrText>
       </w:r>
       <w:r>
         <w:rPr>
@@ -1694,7 +1716,7 @@
         <w:rPr>
           <w:noProof/>
         </w:rPr>
-        <w:t>9</w:t>
+        <w:t>11</w:t>
       </w:r>
       <w:r>
         <w:rPr>
@@ -1736,7 +1758,7 @@
         <w:rPr>
           <w:noProof/>
         </w:rPr>
-        <w:instrText xml:space="preserve"> PAGEREF _Toc244220548 \h </w:instrText>
+        <w:instrText xml:space="preserve"> PAGEREF _Toc244220606 \h </w:instrText>
       </w:r>
       <w:r>
         <w:rPr>
@@ -1753,7 +1775,7 @@
         <w:rPr>
           <w:noProof/>
         </w:rPr>
-        <w:t>10</w:t>
+        <w:t>12</w:t>
       </w:r>
       <w:r>
         <w:rPr>
@@ -1796,7 +1818,7 @@
         <w:rPr>
           <w:noProof/>
         </w:rPr>
-        <w:instrText xml:space="preserve"> PAGEREF _Toc244220549 \h </w:instrText>
+        <w:instrText xml:space="preserve"> PAGEREF _Toc244220607 \h </w:instrText>
       </w:r>
       <w:r>
         <w:rPr>
@@ -1813,7 +1835,7 @@
         <w:rPr>
           <w:noProof/>
         </w:rPr>
-        <w:t>10</w:t>
+        <w:t>13</w:t>
       </w:r>
       <w:r>
         <w:rPr>
@@ -1855,7 +1877,7 @@
         <w:rPr>
           <w:noProof/>
         </w:rPr>
-        <w:instrText xml:space="preserve"> PAGEREF _Toc244220550 \h </w:instrText>
+        <w:instrText xml:space="preserve"> PAGEREF _Toc244220608 \h </w:instrText>
       </w:r>
       <w:r>
         <w:rPr>
@@ -1872,7 +1894,7 @@
         <w:rPr>
           <w:noProof/>
         </w:rPr>
-        <w:t>10</w:t>
+        <w:t>13</w:t>
       </w:r>
       <w:r>
         <w:rPr>
@@ -1914,7 +1936,7 @@
         <w:rPr>
           <w:noProof/>
         </w:rPr>
-        <w:instrText xml:space="preserve"> PAGEREF _Toc244220551 \h </w:instrText>
+        <w:instrText xml:space="preserve"> PAGEREF _Toc244220609 \h </w:instrText>
       </w:r>
       <w:r>
         <w:rPr>
@@ -1931,7 +1953,7 @@
         <w:rPr>
           <w:noProof/>
         </w:rPr>
-        <w:t>11</w:t>
+        <w:t>14</w:t>
       </w:r>
       <w:r>
         <w:rPr>
@@ -1973,7 +1995,7 @@
         <w:rPr>
           <w:noProof/>
         </w:rPr>
-        <w:instrText xml:space="preserve"> PAGEREF _Toc244220552 \h </w:instrText>
+        <w:instrText xml:space="preserve"> PAGEREF _Toc244220610 \h </w:instrText>
       </w:r>
       <w:r>
         <w:rPr>
@@ -1990,7 +2012,7 @@
         <w:rPr>
           <w:noProof/>
         </w:rPr>
-        <w:t>13</w:t>
+        <w:t>15</w:t>
       </w:r>
       <w:r>
         <w:rPr>
@@ -2033,7 +2055,7 @@
         <w:rPr>
           <w:noProof/>
         </w:rPr>
-        <w:instrText xml:space="preserve"> PAGEREF _Toc244220553 \h </w:instrText>
+        <w:instrText xml:space="preserve"> PAGEREF _Toc244220611 \h </w:instrText>
       </w:r>
       <w:r>
         <w:rPr>
@@ -2050,7 +2072,7 @@
         <w:rPr>
           <w:noProof/>
         </w:rPr>
-        <w:t>14</w:t>
+        <w:t>17</w:t>
       </w:r>
       <w:r>
         <w:rPr>
@@ -2093,7 +2115,7 @@
         <w:rPr>
           <w:noProof/>
         </w:rPr>
-        <w:instrText xml:space="preserve"> PAGEREF _Toc244220554 \h </w:instrText>
+        <w:instrText xml:space="preserve"> PAGEREF _Toc244220612 \h </w:instrText>
       </w:r>
       <w:r>
         <w:rPr>
@@ -2110,7 +2132,7 @@
         <w:rPr>
           <w:noProof/>
         </w:rPr>
-        <w:t>16</w:t>
+        <w:t>20</w:t>
       </w:r>
       <w:r>
         <w:rPr>
@@ -2152,7 +2174,7 @@
         <w:rPr>
           <w:noProof/>
         </w:rPr>
-        <w:instrText xml:space="preserve"> PAGEREF _Toc244220555 \h </w:instrText>
+        <w:instrText xml:space="preserve"> PAGEREF _Toc244220613 \h </w:instrText>
       </w:r>
       <w:r>
         <w:rPr>
@@ -2169,7 +2191,7 @@
         <w:rPr>
           <w:noProof/>
         </w:rPr>
-        <w:t>16</w:t>
+        <w:t>20</w:t>
       </w:r>
       <w:r>
         <w:rPr>
@@ -2211,7 +2233,7 @@
         <w:rPr>
           <w:noProof/>
         </w:rPr>
-        <w:instrText xml:space="preserve"> PAGEREF _Toc244220556 \h </w:instrText>
+        <w:instrText xml:space="preserve"> PAGEREF _Toc244220614 \h </w:instrText>
       </w:r>
       <w:r>
         <w:rPr>
@@ -2228,7 +2250,7 @@
         <w:rPr>
           <w:noProof/>
         </w:rPr>
-        <w:t>17</w:t>
+        <w:t>21</w:t>
       </w:r>
       <w:r>
         <w:rPr>
@@ -2270,7 +2292,7 @@
         <w:rPr>
           <w:noProof/>
         </w:rPr>
-        <w:instrText xml:space="preserve"> PAGEREF _Toc244220557 \h </w:instrText>
+        <w:instrText xml:space="preserve"> PAGEREF _Toc244220615 \h </w:instrText>
       </w:r>
       <w:r>
         <w:rPr>
@@ -2287,7 +2309,7 @@
         <w:rPr>
           <w:noProof/>
         </w:rPr>
-        <w:t>18</w:t>
+        <w:t>21</w:t>
       </w:r>
       <w:r>
         <w:rPr>
@@ -2330,7 +2352,7 @@
         <w:rPr>
           <w:noProof/>
         </w:rPr>
-        <w:instrText xml:space="preserve"> PAGEREF _Toc244220558 \h </w:instrText>
+        <w:instrText xml:space="preserve"> PAGEREF _Toc244220616 \h </w:instrText>
       </w:r>
       <w:r>
         <w:rPr>
@@ -2347,7 +2369,7 @@
         <w:rPr>
           <w:noProof/>
         </w:rPr>
-        <w:t>20</w:t>
+        <w:t>24</w:t>
       </w:r>
       <w:r>
         <w:rPr>
@@ -2380,16 +2402,13 @@
     </w:p>
     <w:p>
       <w:pPr>
-        <w:spacing w:line="240" w:lineRule="auto"/>
-      </w:pPr>
-    </w:p>
-    <w:p>
-      <w:pPr>
         <w:pStyle w:val="Heading1"/>
+        <w:pageBreakBefore w:val="0"/>
       </w:pPr>
       <w:bookmarkStart w:id="1" w:name="executive-summary"/>
-      <w:bookmarkStart w:id="2" w:name="_Toc244220530"/>
-      <w:r>
+      <w:bookmarkStart w:id="2" w:name="_Toc244220588"/>
+      <w:r>
+        <w:lastRenderedPageBreak/>
         <w:t>Executive Summary</w:t>
       </w:r>
       <w:bookmarkEnd w:id="2"/>
@@ -2431,9 +2450,10 @@
         <w:pStyle w:val="Heading1"/>
       </w:pPr>
       <w:bookmarkStart w:id="3" w:name="introduction"/>
-      <w:bookmarkStart w:id="4" w:name="_Toc244220531"/>
+      <w:bookmarkStart w:id="4" w:name="_Toc244220589"/>
       <w:bookmarkEnd w:id="1"/>
       <w:r>
+        <w:lastRenderedPageBreak/>
         <w:t>1 Introduction</w:t>
       </w:r>
       <w:bookmarkEnd w:id="4"/>
@@ -2443,7 +2463,7 @@
         <w:pStyle w:val="Heading2"/>
       </w:pPr>
       <w:bookmarkStart w:id="5" w:name="background-and-purpose"/>
-      <w:bookmarkStart w:id="6" w:name="_Toc244220532"/>
+      <w:bookmarkStart w:id="6" w:name="_Toc244220590"/>
       <w:r>
         <w:t>1.1 Background and Purpose</w:t>
       </w:r>
@@ -2478,7 +2498,7 @@
         <w:pStyle w:val="Heading2"/>
       </w:pPr>
       <w:bookmarkStart w:id="7" w:name="what-is-actual-budget"/>
-      <w:bookmarkStart w:id="8" w:name="_Toc244220533"/>
+      <w:bookmarkStart w:id="8" w:name="_Toc244220591"/>
       <w:bookmarkEnd w:id="5"/>
       <w:r>
         <w:t>1.2 What Is Actual Budget</w:t>
@@ -2498,7 +2518,6 @@
         <w:pStyle w:val="BodyText"/>
       </w:pPr>
       <w:r>
-        <w:lastRenderedPageBreak/>
         <w:t>Actual was created by James Long, who ran it as a paid product for over four years (Stacoviak &amp; Santo, 2022). In early 2022 he decided to close the commercial product and released it as open source, and it is now maintained by volunteers, which led by a core team that formed after pull requests had waited months for review (Aboltins, 2025).</w:t>
       </w:r>
     </w:p>
@@ -2507,7 +2526,7 @@
         <w:pStyle w:val="Heading2"/>
       </w:pPr>
       <w:bookmarkStart w:id="9" w:name="main-features-and-how-it-works"/>
-      <w:bookmarkStart w:id="10" w:name="_Toc244220534"/>
+      <w:bookmarkStart w:id="10" w:name="_Toc244220592"/>
       <w:bookmarkEnd w:id="7"/>
       <w:r>
         <w:t>1.3 Main Features and How It Works</w:t>
@@ -2600,9 +2619,10 @@
         <w:pStyle w:val="Heading2"/>
       </w:pPr>
       <w:bookmarkStart w:id="11" w:name="who-is-involved"/>
-      <w:bookmarkStart w:id="12" w:name="_Toc244220535"/>
+      <w:bookmarkStart w:id="12" w:name="_Toc244220593"/>
       <w:bookmarkEnd w:id="9"/>
       <w:r>
+        <w:lastRenderedPageBreak/>
         <w:t>1.4 Who Is Involved</w:t>
       </w:r>
       <w:bookmarkEnd w:id="12"/>
@@ -2875,7 +2895,7 @@
         <w:spacing w:before="240"/>
       </w:pPr>
       <w:bookmarkStart w:id="13" w:name="main-challenges"/>
-      <w:bookmarkStart w:id="14" w:name="_Toc244220536"/>
+      <w:bookmarkStart w:id="14" w:name="_Toc244220594"/>
       <w:bookmarkEnd w:id="11"/>
       <w:r>
         <w:t>1.5 Main Challenges</w:t>
@@ -2933,7 +2953,6 @@
           <w:b/>
           <w:bCs/>
         </w:rPr>
-        <w:lastRenderedPageBreak/>
         <w:t>Escaped defects and security flaws.</w:t>
       </w:r>
       <w:r>
@@ -2945,10 +2964,11 @@
         <w:pStyle w:val="Heading1"/>
       </w:pPr>
       <w:bookmarkStart w:id="15" w:name="software-development-methodology"/>
-      <w:bookmarkStart w:id="16" w:name="_Toc244220537"/>
+      <w:bookmarkStart w:id="16" w:name="_Toc244220595"/>
       <w:bookmarkEnd w:id="3"/>
       <w:bookmarkEnd w:id="13"/>
       <w:r>
+        <w:lastRenderedPageBreak/>
         <w:t>2 Software Development Methodology</w:t>
       </w:r>
       <w:bookmarkEnd w:id="16"/>
@@ -2966,7 +2986,7 @@
         <w:pStyle w:val="Heading2"/>
       </w:pPr>
       <w:bookmarkStart w:id="17" w:name="current-development-process-of-actual"/>
-      <w:bookmarkStart w:id="18" w:name="_Toc244220538"/>
+      <w:bookmarkStart w:id="18" w:name="_Toc244220596"/>
       <w:r>
         <w:t>2.1 Current Development Process of Actual</w:t>
       </w:r>
@@ -3075,7 +3095,7 @@
         <w:pStyle w:val="Heading2"/>
       </w:pPr>
       <w:bookmarkStart w:id="19" w:name="why-kanban-fits-actual"/>
-      <w:bookmarkStart w:id="20" w:name="_Toc244220539"/>
+      <w:bookmarkStart w:id="20" w:name="_Toc244220597"/>
       <w:bookmarkEnd w:id="17"/>
       <w:r>
         <w:t>2.2 Why Kanban Fits Actual</w:t>
@@ -3131,7 +3151,7 @@
         <w:pStyle w:val="Heading2"/>
       </w:pPr>
       <w:bookmarkStart w:id="21" w:name="applying-kanban-to-actual"/>
-      <w:bookmarkStart w:id="22" w:name="_Toc244220540"/>
+      <w:bookmarkStart w:id="22" w:name="_Toc244220598"/>
       <w:bookmarkEnd w:id="19"/>
       <w:r>
         <w:t>2.3 Applying Kanban to Actual</w:t>
@@ -3225,7 +3245,7 @@
         <w:pStyle w:val="Heading2"/>
       </w:pPr>
       <w:bookmarkStart w:id="23" w:name="critical-evaluation"/>
-      <w:bookmarkStart w:id="24" w:name="_Toc244220541"/>
+      <w:bookmarkStart w:id="24" w:name="_Toc244220599"/>
       <w:bookmarkEnd w:id="21"/>
       <w:r>
         <w:t>2.4 Critical Evaluation</w:t>
@@ -3249,10 +3269,11 @@
         <w:pStyle w:val="Heading1"/>
       </w:pPr>
       <w:bookmarkStart w:id="25" w:name="quality-assurance-process"/>
-      <w:bookmarkStart w:id="26" w:name="_Toc244220542"/>
+      <w:bookmarkStart w:id="26" w:name="_Toc244220600"/>
       <w:bookmarkEnd w:id="15"/>
       <w:bookmarkEnd w:id="23"/>
       <w:r>
+        <w:lastRenderedPageBreak/>
         <w:t>3 Quality Assurance Process</w:t>
       </w:r>
       <w:bookmarkEnd w:id="26"/>
@@ -3270,7 +3291,7 @@
         <w:pStyle w:val="Heading2"/>
       </w:pPr>
       <w:bookmarkStart w:id="27" w:name="what-quality-means-for-actual"/>
-      <w:bookmarkStart w:id="28" w:name="_Toc244220543"/>
+      <w:bookmarkStart w:id="28" w:name="_Toc244220601"/>
       <w:r>
         <w:t>3.1 What Quality Means for Actual</w:t>
       </w:r>
@@ -3357,7 +3378,7 @@
         <w:pStyle w:val="Heading2"/>
       </w:pPr>
       <w:bookmarkStart w:id="29" w:name="key-quality-attributes"/>
-      <w:bookmarkStart w:id="30" w:name="_Toc244220544"/>
+      <w:bookmarkStart w:id="30" w:name="_Toc244220602"/>
       <w:bookmarkEnd w:id="27"/>
       <w:r>
         <w:t>3.2 Key Quality Attributes</w:t>
@@ -3393,7 +3414,6 @@
         </w:numPr>
       </w:pPr>
       <w:r>
-        <w:lastRenderedPageBreak/>
         <w:t>Reliability: Users decide what to spend based on the balances Actual shows, so budget data must stay correct and in sync across devices, including after the app recovers from a failure. If it fails, users may stop trusting their numbers or be locked out of their own budget.</w:t>
       </w:r>
     </w:p>
@@ -3414,9 +3434,10 @@
         <w:pStyle w:val="Heading2"/>
       </w:pPr>
       <w:bookmarkStart w:id="31" w:name="current-qa-practices-and-gaps"/>
-      <w:bookmarkStart w:id="32" w:name="_Toc244220545"/>
+      <w:bookmarkStart w:id="32" w:name="_Toc244220603"/>
       <w:bookmarkEnd w:id="29"/>
       <w:r>
+        <w:lastRenderedPageBreak/>
         <w:t>3.3 Current QA Practices and Gaps</w:t>
       </w:r>
       <w:bookmarkEnd w:id="32"/>
@@ -3450,7 +3471,7 @@
         <w:pStyle w:val="Heading2"/>
       </w:pPr>
       <w:bookmarkStart w:id="33" w:name="selected-standards-and-practices"/>
-      <w:bookmarkStart w:id="34" w:name="_Toc244220546"/>
+      <w:bookmarkStart w:id="34" w:name="_Toc244220604"/>
       <w:bookmarkEnd w:id="31"/>
       <w:r>
         <w:t>3.4 Selected Standards and Practices</w:t>
@@ -3475,7 +3496,6 @@
           <w:i/>
           <w:iCs/>
         </w:rPr>
-        <w:lastRenderedPageBreak/>
         <w:t>Table 3.1. How each gap is closed.</w:t>
       </w:r>
     </w:p>
@@ -3742,6 +3762,7 @@
               <w:jc w:val="left"/>
             </w:pPr>
             <w:r>
+              <w:lastRenderedPageBreak/>
               <w:t>Interaction capability</w:t>
             </w:r>
           </w:p>
@@ -3834,7 +3855,7 @@
         <w:spacing w:before="240"/>
       </w:pPr>
       <w:bookmarkStart w:id="35" w:name="applying-the-qa-process-within-kanban"/>
-      <w:bookmarkStart w:id="36" w:name="_Toc244220547"/>
+      <w:bookmarkStart w:id="36" w:name="_Toc244220605"/>
       <w:bookmarkEnd w:id="33"/>
       <w:r>
         <w:t>3.5 Applying the QA Process within Kanban</w:t>
@@ -3919,7 +3940,6 @@
           <w:i/>
           <w:iCs/>
         </w:rPr>
-        <w:lastRenderedPageBreak/>
         <w:t>Table 3.2. QA checks added to each Kanban column.</w:t>
       </w:r>
     </w:p>
@@ -4256,6 +4276,7 @@
               <w:jc w:val="left"/>
             </w:pPr>
             <w:r>
+              <w:lastRenderedPageBreak/>
               <w:t>Verify</w:t>
             </w:r>
           </w:p>
@@ -4443,7 +4464,7 @@
         <w:spacing w:before="240"/>
       </w:pPr>
       <w:bookmarkStart w:id="37" w:name="critical-evaluation-1"/>
-      <w:bookmarkStart w:id="38" w:name="_Toc244220548"/>
+      <w:bookmarkStart w:id="38" w:name="_Toc244220606"/>
       <w:bookmarkEnd w:id="35"/>
       <w:r>
         <w:t>3.6 Critical Evaluation</w:t>
@@ -4463,10 +4484,11 @@
         <w:pStyle w:val="Heading1"/>
       </w:pPr>
       <w:bookmarkStart w:id="39" w:name="integrating-ivv-with-kanban"/>
-      <w:bookmarkStart w:id="40" w:name="_Toc244220549"/>
+      <w:bookmarkStart w:id="40" w:name="_Toc244220607"/>
       <w:bookmarkEnd w:id="25"/>
       <w:bookmarkEnd w:id="37"/>
       <w:r>
+        <w:lastRenderedPageBreak/>
         <w:t>4 Integrating IV&amp;V with Kanban</w:t>
       </w:r>
       <w:bookmarkEnd w:id="40"/>
@@ -4484,7 +4506,7 @@
         <w:pStyle w:val="Heading2"/>
       </w:pPr>
       <w:bookmarkStart w:id="41" w:name="X0aa91b5be94bdb8348825913a91d765f72af6ee"/>
-      <w:bookmarkStart w:id="42" w:name="_Toc244220550"/>
+      <w:bookmarkStart w:id="42" w:name="_Toc244220608"/>
       <w:r>
         <w:t>4.1 Current V&amp;V in Actual and Its Independence</w:t>
       </w:r>
@@ -4495,11 +4517,7 @@
         <w:pStyle w:val="FirstParagraph"/>
       </w:pPr>
       <w:r>
-        <w:t xml:space="preserve">IEEE 1012-2024 describes verification as checking whether the products of an activity conform to that activity's requirements, and validation as checking whether the product satisfies its </w:t>
-      </w:r>
-      <w:r>
-        <w:lastRenderedPageBreak/>
-        <w:t>intended use and user needs (IEEE, 2025). In independent V&amp;V (IV&amp;V), the work of each phase is checked by someone other than the person who built it.</w:t>
+        <w:t>IEEE 1012-2024 describes verification as checking whether the products of an activity conform to that activity's requirements, and validation as checking whether the product satisfies its intended use and user needs (IEEE, 2025). In independent V&amp;V (IV&amp;V), the work of each phase is checked by someone other than the person who built it.</w:t>
       </w:r>
     </w:p>
     <w:p>
@@ -5248,7 +5266,11 @@
         <w:spacing w:before="240"/>
       </w:pPr>
       <w:r>
-        <w:t>Actual already has some independent checking, but it is ad hoc. Nobody other than the contributor checks requirements or design, and how closely a change is checked depends on who happens to review it, whatever its risk is. Some of the checking also comes late after release, such as the three 2026 advisories in Section 3.3 which were found in released versions, by reporters outside the core team (Actual Budget, 2026b, 2026c, 2026d).</w:t>
+        <w:t xml:space="preserve">Actual already has some independent checking, but it is ad hoc. Nobody other than the contributor checks requirements or design, and how closely a change is checked depends on </w:t>
+      </w:r>
+      <w:r>
+        <w:lastRenderedPageBreak/>
+        <w:t>who happens to review it, whatever its risk is. Some of the checking also comes late after release, such as the three 2026 advisories in Section 3.3 which were found in released versions, by reporters outside the core team (Actual Budget, 2026b, 2026c, 2026d).</w:t>
       </w:r>
     </w:p>
     <w:p>
@@ -5256,7 +5278,7 @@
         <w:pStyle w:val="Heading2"/>
       </w:pPr>
       <w:bookmarkStart w:id="43" w:name="ivv-integration-model-for-kanban"/>
-      <w:bookmarkStart w:id="44" w:name="_Toc244220551"/>
+      <w:bookmarkStart w:id="44" w:name="_Toc244220609"/>
       <w:bookmarkEnd w:id="41"/>
       <w:r>
         <w:t>4.2 IV&amp;V Integration Model for Kanban</w:t>
@@ -5276,7 +5298,6 @@
         <w:pStyle w:val="BodyText"/>
       </w:pPr>
       <w:r>
-        <w:lastRenderedPageBreak/>
         <w:t>Within the team, High-tier cards (Section 3.5) get an independent reviewer. This is a maintainer who did not write the change and does not own that area in Actual's CODEOWNERS file (Actual Budget, 2026a). Other cards keep the usual review, which protects the few reviewers that Section 2 found to be the bottleneck.</w:t>
       </w:r>
     </w:p>
@@ -5642,6 +5663,7 @@
               <w:jc w:val="left"/>
             </w:pPr>
             <w:r>
+              <w:lastRenderedPageBreak/>
               <w:t>Verify</w:t>
             </w:r>
           </w:p>
@@ -5707,7 +5729,6 @@
               <w:jc w:val="left"/>
             </w:pPr>
             <w:r>
-              <w:lastRenderedPageBreak/>
               <w:t>Release train</w:t>
             </w:r>
           </w:p>
@@ -5838,7 +5859,7 @@
         <w:pStyle w:val="Heading2"/>
       </w:pPr>
       <w:bookmarkStart w:id="45" w:name="X1475a41517db6ec60255518d1ac8cff0c25dd20"/>
-      <w:bookmarkStart w:id="46" w:name="_Toc244220552"/>
+      <w:bookmarkStart w:id="46" w:name="_Toc244220610"/>
       <w:bookmarkEnd w:id="43"/>
       <w:r>
         <w:t>4.3 How the Integration Meets the Three Goals</w:t>
@@ -5866,7 +5887,11 @@
         <w:pStyle w:val="BodyText"/>
       </w:pPr>
       <w:r>
-        <w:t>Requirements compliance means showing that what users asked for was built and tested. In Actual, a feature request starts as an issue, the PR template asks the contributor to link that issue, and a release note describes what shipped (Actual Budget, 2026a). However, no step checks that the finished PR actually does what the issue asked for. Under the proposed model, someone other than the requester makes sure that at triage, each acceptance criterion can be tested, and the reviewer only approves at Verify once every criterion has a passing test.</w:t>
+        <w:t xml:space="preserve">Requirements compliance means showing that what users asked for was built and tested. In Actual, a feature request starts as an issue, the PR template asks the contributor to link that issue, and a release note describes what shipped (Actual Budget, 2026a). However, no step checks that the finished PR actually does what the issue asked for. Under the proposed model, </w:t>
+      </w:r>
+      <w:r>
+        <w:lastRenderedPageBreak/>
+        <w:t>someone other than the requester makes sure that at triage, each acceptance criterion can be tested, and the reviewer only approves at Verify once every criterion has a passing test.</w:t>
       </w:r>
     </w:p>
     <w:p>
@@ -5882,7 +5907,7 @@
         <w:pStyle w:val="Heading1"/>
       </w:pPr>
       <w:bookmarkStart w:id="47" w:name="references"/>
-      <w:bookmarkStart w:id="48" w:name="_Toc244220553"/>
+      <w:bookmarkStart w:id="48" w:name="_Toc244220611"/>
       <w:bookmarkEnd w:id="39"/>
       <w:bookmarkEnd w:id="45"/>
       <w:r>
@@ -6548,9 +6573,10 @@
         <w:pStyle w:val="Heading1"/>
       </w:pPr>
       <w:bookmarkStart w:id="49" w:name="appendix-a-methodology-selection"/>
-      <w:bookmarkStart w:id="50" w:name="_Toc244220554"/>
+      <w:bookmarkStart w:id="50" w:name="_Toc244220612"/>
       <w:bookmarkEnd w:id="47"/>
       <w:r>
+        <w:lastRenderedPageBreak/>
         <w:t>Appendix A: Methodology Selection</w:t>
       </w:r>
       <w:bookmarkEnd w:id="50"/>
@@ -6572,7 +6598,7 @@
         <w:pStyle w:val="Heading2"/>
       </w:pPr>
       <w:bookmarkStart w:id="51" w:name="X028abdb72f6729402371f99d307e7d170450399"/>
-      <w:bookmarkStart w:id="52" w:name="_Toc244220555"/>
+      <w:bookmarkStart w:id="52" w:name="_Toc244220613"/>
       <w:r>
         <w:t>A.1 Project Characteristics and Requirements</w:t>
       </w:r>
@@ -7104,16 +7130,19 @@
         <w:spacing w:before="240"/>
       </w:pPr>
       <w:r>
+        <w:t>Most factors point to an agile model, but two complicate it. Agile models need an experienced, self-disciplined team, and low risk tolerance favours linear models (GeeksforGeeks, 2025). Actual's experienced reviewers are few volunteers whose review time has already run out once, and a wrong balance can lead a household to a poor spending decision; in 2026 a critical security flaw let anyone read users' bank balances and transactions without logging in (Actual Budget, 2026c).</w:t>
+      </w:r>
+    </w:p>
+    <w:p>
+      <w:pPr>
+        <w:pStyle w:val="BodyText"/>
+      </w:pPr>
+      <w:r>
+        <w:t xml:space="preserve">Actual therefore needs an agile model with written controls added where team expertise and risk tolerance leave it exposed, as the same guidance recommends combining approaches when a project's needs are mixed (GeeksforGeeks, 2025). Table A.2 turns this profile into five </w:t>
+      </w:r>
+      <w:r>
         <w:lastRenderedPageBreak/>
-        <w:t>Most factors point to an agile model, but two complicate it. Agile models need an experienced, self-disciplined team, and low risk tolerance favours linear models (GeeksforGeeks, 2025). Actual's experienced reviewers are few volunteers whose review time has already run out once, and a wrong balance can lead a household to a poor spending decision; in 2026 a critical security flaw let anyone read users' bank balances and transactions without logging in (Actual Budget, 2026c).</w:t>
-      </w:r>
-    </w:p>
-    <w:p>
-      <w:pPr>
-        <w:pStyle w:val="BodyText"/>
-      </w:pPr>
-      <w:r>
-        <w:t>Actual therefore needs an agile model with written controls added where team expertise and risk tolerance leave it exposed, as the same guidance recommends combining approaches when a project's needs are mixed (GeeksforGeeks, 2025). Table A.2 turns this profile into five requirements, each with the reason Actual needs it and the part of the brief it answers. Section A.3 tests every candidate against them.</w:t>
+        <w:t>requirements, each with the reason Actual needs it and the part of the brief it answers. Section A.3 tests every candidate against them.</w:t>
       </w:r>
     </w:p>
     <w:p>
@@ -7484,7 +7513,7 @@
         <w:spacing w:before="240"/>
       </w:pPr>
       <w:bookmarkStart w:id="53" w:name="a.2-candidate-methodologies"/>
-      <w:bookmarkStart w:id="54" w:name="_Toc244220556"/>
+      <w:bookmarkStart w:id="54" w:name="_Toc244220614"/>
       <w:bookmarkEnd w:id="51"/>
       <w:r>
         <w:t>A.2 Candidate Methodologies</w:t>
@@ -7504,7 +7533,6 @@
         <w:pStyle w:val="BodyText"/>
       </w:pPr>
       <w:r>
-        <w:lastRenderedPageBreak/>
         <w:t>Actual's current process is also kept in the comparison as a reference point. It is not a candidate, but any change must prove better than today.</w:t>
       </w:r>
     </w:p>
@@ -7513,7 +7541,7 @@
         <w:pStyle w:val="Heading2"/>
       </w:pPr>
       <w:bookmarkStart w:id="55" w:name="a.3-evaluation-and-selection"/>
-      <w:bookmarkStart w:id="56" w:name="_Toc244220557"/>
+      <w:bookmarkStart w:id="56" w:name="_Toc244220615"/>
       <w:bookmarkEnd w:id="53"/>
       <w:r>
         <w:t>A.3 Evaluation and Selection</w:t>
@@ -7537,6 +7565,7 @@
         </w:numPr>
       </w:pPr>
       <w:r>
+        <w:lastRenderedPageBreak/>
         <w:t xml:space="preserve">a </w:t>
       </w:r>
       <w:r>
@@ -7995,7 +8024,6 @@
               <w:jc w:val="left"/>
             </w:pPr>
             <w:r>
-              <w:lastRenderedPageBreak/>
               <w:t>DevOps</w:t>
             </w:r>
           </w:p>
@@ -8061,6 +8089,7 @@
               <w:jc w:val="left"/>
             </w:pPr>
             <w:r>
+              <w:lastRenderedPageBreak/>
               <w:t>Current process (reference)</w:t>
             </w:r>
           </w:p>
@@ -8160,11 +8189,7 @@
         <w:t>mandatory quality gates (QA gates)</w:t>
       </w:r>
       <w:r>
-        <w:t xml:space="preserve">: risk-scaled checks, </w:t>
-      </w:r>
-      <w:r>
-        <w:lastRenderedPageBreak/>
-        <w:t xml:space="preserve">defined in Section 3, added to each column's exit policy. </w:t>
+        <w:t xml:space="preserve">: risk-scaled checks, defined in Section 3, added to each column's exit policy. </w:t>
       </w:r>
       <w:r>
         <w:rPr>
@@ -8179,10 +8204,11 @@
         <w:pStyle w:val="Heading1"/>
       </w:pPr>
       <w:bookmarkStart w:id="57" w:name="appendix-b-worked-example-of-the-qa-plan"/>
-      <w:bookmarkStart w:id="58" w:name="_Toc244220558"/>
+      <w:bookmarkStart w:id="58" w:name="_Toc244220616"/>
       <w:bookmarkEnd w:id="49"/>
       <w:bookmarkEnd w:id="55"/>
       <w:r>
+        <w:lastRenderedPageBreak/>
         <w:t>Appendix B: Worked Example of the QA Plan</w:t>
       </w:r>
       <w:bookmarkEnd w:id="58"/>
@@ -8262,7 +8288,15 @@
       <w:pStyle w:val="Footer"/>
     </w:pPr>
     <w:r>
-      <w:t>Version 1.2 UCTI AssCv 2007-10-23</w:t>
+      <w:t xml:space="preserve">Version 1.2 UCTI </w:t>
+    </w:r>
+    <w:proofErr w:type="spellStart"/>
+    <w:r>
+      <w:t>AssCv</w:t>
+    </w:r>
+    <w:proofErr w:type="spellEnd"/>
+    <w:r>
+      <w:t xml:space="preserve"> 2007-10-23</w:t>
     </w:r>
   </w:p>
 </w:ftr>
@@ -9178,6 +9212,7 @@
     <w:pPr>
       <w:keepNext/>
       <w:keepLines/>
+      <w:pageBreakBefore/>
       <w:spacing w:before="360" w:after="120" w:line="240" w:lineRule="auto"/>
       <w:outlineLvl w:val="0"/>
     </w:pPr>

</xml_diff>

<commit_message>
Use Word multilevel numbering (X.0 / X.Y) for report headings
Co-Authored-By: Claude Opus 5.5 <noreply@anthropic.com>
</commit_message>
<xml_diff>
--- a/report/assignment-1/Assignment-1-Report.docx
+++ b/report/assignment-1/Assignment-1-Report.docx
@@ -637,8 +637,13 @@
     </w:p>
     <w:p>
       <w:pPr>
-        <w:pStyle w:val="TOCHeading"/>
-      </w:pPr>
+        <w:pStyle w:val="Heading1"/>
+        <w:numPr>
+          <w:ilvl w:val="0"/>
+          <w:numId w:val="0"/>
+        </w:numPr>
+      </w:pPr>
+      <w:bookmarkStart w:id="1" w:name="_Toc244220671"/>
       <w:r>
         <w:lastRenderedPageBreak/>
         <w:t xml:space="preserve">Table </w:t>
@@ -649,6 +654,7 @@
       <w:r>
         <w:t>f Contents</w:t>
       </w:r>
+      <w:bookmarkEnd w:id="1"/>
     </w:p>
     <w:p>
       <w:pPr>
@@ -675,7 +681,7 @@
         <w:rPr>
           <w:noProof/>
         </w:rPr>
-        <w:t>Executive Summary</w:t>
+        <w:t>Table of Contents</w:t>
       </w:r>
       <w:r>
         <w:rPr>
@@ -693,7 +699,7 @@
         <w:rPr>
           <w:noProof/>
         </w:rPr>
-        <w:instrText xml:space="preserve"> PAGEREF _Toc244220588 \h </w:instrText>
+        <w:instrText xml:space="preserve"> PAGEREF _Toc244220671 \h </w:instrText>
       </w:r>
       <w:r>
         <w:rPr>
@@ -710,7 +716,7 @@
         <w:rPr>
           <w:noProof/>
         </w:rPr>
-        <w:t>1</w:t>
+        <w:t>i</w:t>
       </w:r>
       <w:r>
         <w:rPr>
@@ -735,7 +741,7 @@
         <w:rPr>
           <w:noProof/>
         </w:rPr>
-        <w:t>1 Introduction</w:t>
+        <w:t>Executive Summary</w:t>
       </w:r>
       <w:r>
         <w:rPr>
@@ -753,7 +759,67 @@
         <w:rPr>
           <w:noProof/>
         </w:rPr>
-        <w:instrText xml:space="preserve"> PAGEREF _Toc244220589 \h </w:instrText>
+        <w:instrText xml:space="preserve"> PAGEREF _Toc244220672 \h </w:instrText>
+      </w:r>
+      <w:r>
+        <w:rPr>
+          <w:noProof/>
+        </w:rPr>
+      </w:r>
+      <w:r>
+        <w:rPr>
+          <w:noProof/>
+        </w:rPr>
+        <w:fldChar w:fldCharType="separate"/>
+      </w:r>
+      <w:r>
+        <w:rPr>
+          <w:noProof/>
+        </w:rPr>
+        <w:t>1</w:t>
+      </w:r>
+      <w:r>
+        <w:rPr>
+          <w:noProof/>
+        </w:rPr>
+        <w:fldChar w:fldCharType="end"/>
+      </w:r>
+    </w:p>
+    <w:p>
+      <w:pPr>
+        <w:pStyle w:val="TOC1"/>
+        <w:tabs>
+          <w:tab w:val="right" w:leader="dot" w:pos="9016"/>
+        </w:tabs>
+        <w:rPr>
+          <w:rFonts w:asciiTheme="minorHAnsi" w:hAnsiTheme="minorHAnsi" w:cstheme="minorBidi"/>
+          <w:b w:val="0"/>
+          <w:noProof/>
+        </w:rPr>
+      </w:pPr>
+      <w:r>
+        <w:rPr>
+          <w:noProof/>
+        </w:rPr>
+        <w:t>1.0 Introduction</w:t>
+      </w:r>
+      <w:r>
+        <w:rPr>
+          <w:noProof/>
+        </w:rPr>
+        <w:tab/>
+      </w:r>
+      <w:r>
+        <w:rPr>
+          <w:noProof/>
+        </w:rPr>
+        <w:fldChar w:fldCharType="begin"/>
+      </w:r>
+      <w:r>
+        <w:rPr>
+          <w:noProof/>
+        </w:rPr>
+        <w:instrText xml:space="preserve"> PAGEREF _Toc244220673 \h </w:instrText>
       </w:r>
       <w:r>
         <w:rPr>
@@ -812,7 +878,7 @@
         <w:rPr>
           <w:noProof/>
         </w:rPr>
-        <w:instrText xml:space="preserve"> PAGEREF _Toc244220590 \h </w:instrText>
+        <w:instrText xml:space="preserve"> PAGEREF _Toc244220674 \h </w:instrText>
       </w:r>
       <w:r>
         <w:rPr>
@@ -871,7 +937,7 @@
         <w:rPr>
           <w:noProof/>
         </w:rPr>
-        <w:instrText xml:space="preserve"> PAGEREF _Toc244220591 \h </w:instrText>
+        <w:instrText xml:space="preserve"> PAGEREF _Toc244220675 \h </w:instrText>
       </w:r>
       <w:r>
         <w:rPr>
@@ -930,7 +996,7 @@
         <w:rPr>
           <w:noProof/>
         </w:rPr>
-        <w:instrText xml:space="preserve"> PAGEREF _Toc244220592 \h </w:instrText>
+        <w:instrText xml:space="preserve"> PAGEREF _Toc244220676 \h </w:instrText>
       </w:r>
       <w:r>
         <w:rPr>
@@ -989,7 +1055,7 @@
         <w:rPr>
           <w:noProof/>
         </w:rPr>
-        <w:instrText xml:space="preserve"> PAGEREF _Toc244220593 \h </w:instrText>
+        <w:instrText xml:space="preserve"> PAGEREF _Toc244220677 \h </w:instrText>
       </w:r>
       <w:r>
         <w:rPr>
@@ -1048,7 +1114,7 @@
         <w:rPr>
           <w:noProof/>
         </w:rPr>
-        <w:instrText xml:space="preserve"> PAGEREF _Toc244220594 \h </w:instrText>
+        <w:instrText xml:space="preserve"> PAGEREF _Toc244220678 \h </w:instrText>
       </w:r>
       <w:r>
         <w:rPr>
@@ -1090,7 +1156,7 @@
         <w:rPr>
           <w:noProof/>
         </w:rPr>
-        <w:t>2 Software Development Methodology</w:t>
+        <w:t>2.0 Software Development Methodology</w:t>
       </w:r>
       <w:r>
         <w:rPr>
@@ -1108,7 +1174,7 @@
         <w:rPr>
           <w:noProof/>
         </w:rPr>
-        <w:instrText xml:space="preserve"> PAGEREF _Toc244220595 \h </w:instrText>
+        <w:instrText xml:space="preserve"> PAGEREF _Toc244220679 \h </w:instrText>
       </w:r>
       <w:r>
         <w:rPr>
@@ -1167,7 +1233,7 @@
         <w:rPr>
           <w:noProof/>
         </w:rPr>
-        <w:instrText xml:space="preserve"> PAGEREF _Toc244220596 \h </w:instrText>
+        <w:instrText xml:space="preserve"> PAGEREF _Toc244220680 \h </w:instrText>
       </w:r>
       <w:r>
         <w:rPr>
@@ -1226,7 +1292,7 @@
         <w:rPr>
           <w:noProof/>
         </w:rPr>
-        <w:instrText xml:space="preserve"> PAGEREF _Toc244220597 \h </w:instrText>
+        <w:instrText xml:space="preserve"> PAGEREF _Toc244220681 \h </w:instrText>
       </w:r>
       <w:r>
         <w:rPr>
@@ -1285,7 +1351,7 @@
         <w:rPr>
           <w:noProof/>
         </w:rPr>
-        <w:instrText xml:space="preserve"> PAGEREF _Toc244220598 \h </w:instrText>
+        <w:instrText xml:space="preserve"> PAGEREF _Toc244220682 \h </w:instrText>
       </w:r>
       <w:r>
         <w:rPr>
@@ -1344,7 +1410,7 @@
         <w:rPr>
           <w:noProof/>
         </w:rPr>
-        <w:instrText xml:space="preserve"> PAGEREF _Toc244220599 \h </w:instrText>
+        <w:instrText xml:space="preserve"> PAGEREF _Toc244220683 \h </w:instrText>
       </w:r>
       <w:r>
         <w:rPr>
@@ -1386,7 +1452,7 @@
         <w:rPr>
           <w:noProof/>
         </w:rPr>
-        <w:t>3 Quality Assurance Process</w:t>
+        <w:t>3.0 Quality Assurance Process</w:t>
       </w:r>
       <w:r>
         <w:rPr>
@@ -1404,7 +1470,7 @@
         <w:rPr>
           <w:noProof/>
         </w:rPr>
-        <w:instrText xml:space="preserve"> PAGEREF _Toc244220600 \h </w:instrText>
+        <w:instrText xml:space="preserve"> PAGEREF _Toc244220684 \h </w:instrText>
       </w:r>
       <w:r>
         <w:rPr>
@@ -1463,7 +1529,7 @@
         <w:rPr>
           <w:noProof/>
         </w:rPr>
-        <w:instrText xml:space="preserve"> PAGEREF _Toc244220601 \h </w:instrText>
+        <w:instrText xml:space="preserve"> PAGEREF _Toc244220685 \h </w:instrText>
       </w:r>
       <w:r>
         <w:rPr>
@@ -1522,7 +1588,7 @@
         <w:rPr>
           <w:noProof/>
         </w:rPr>
-        <w:instrText xml:space="preserve"> PAGEREF _Toc244220602 \h </w:instrText>
+        <w:instrText xml:space="preserve"> PAGEREF _Toc244220686 \h </w:instrText>
       </w:r>
       <w:r>
         <w:rPr>
@@ -1581,7 +1647,7 @@
         <w:rPr>
           <w:noProof/>
         </w:rPr>
-        <w:instrText xml:space="preserve"> PAGEREF _Toc244220603 \h </w:instrText>
+        <w:instrText xml:space="preserve"> PAGEREF _Toc244220687 \h </w:instrText>
       </w:r>
       <w:r>
         <w:rPr>
@@ -1640,7 +1706,7 @@
         <w:rPr>
           <w:noProof/>
         </w:rPr>
-        <w:instrText xml:space="preserve"> PAGEREF _Toc244220604 \h </w:instrText>
+        <w:instrText xml:space="preserve"> PAGEREF _Toc244220688 \h </w:instrText>
       </w:r>
       <w:r>
         <w:rPr>
@@ -1699,7 +1765,7 @@
         <w:rPr>
           <w:noProof/>
         </w:rPr>
-        <w:instrText xml:space="preserve"> PAGEREF _Toc244220605 \h </w:instrText>
+        <w:instrText xml:space="preserve"> PAGEREF _Toc244220689 \h </w:instrText>
       </w:r>
       <w:r>
         <w:rPr>
@@ -1758,7 +1824,7 @@
         <w:rPr>
           <w:noProof/>
         </w:rPr>
-        <w:instrText xml:space="preserve"> PAGEREF _Toc244220606 \h </w:instrText>
+        <w:instrText xml:space="preserve"> PAGEREF _Toc244220690 \h </w:instrText>
       </w:r>
       <w:r>
         <w:rPr>
@@ -1800,7 +1866,7 @@
         <w:rPr>
           <w:noProof/>
         </w:rPr>
-        <w:t>4 Integrating IV&amp;V with Kanban</w:t>
+        <w:t>4.0 Integrating IV&amp;V with Kanban</w:t>
       </w:r>
       <w:r>
         <w:rPr>
@@ -1818,7 +1884,7 @@
         <w:rPr>
           <w:noProof/>
         </w:rPr>
-        <w:instrText xml:space="preserve"> PAGEREF _Toc244220607 \h </w:instrText>
+        <w:instrText xml:space="preserve"> PAGEREF _Toc244220691 \h </w:instrText>
       </w:r>
       <w:r>
         <w:rPr>
@@ -1877,7 +1943,7 @@
         <w:rPr>
           <w:noProof/>
         </w:rPr>
-        <w:instrText xml:space="preserve"> PAGEREF _Toc244220608 \h </w:instrText>
+        <w:instrText xml:space="preserve"> PAGEREF _Toc244220692 \h </w:instrText>
       </w:r>
       <w:r>
         <w:rPr>
@@ -1936,7 +2002,7 @@
         <w:rPr>
           <w:noProof/>
         </w:rPr>
-        <w:instrText xml:space="preserve"> PAGEREF _Toc244220609 \h </w:instrText>
+        <w:instrText xml:space="preserve"> PAGEREF _Toc244220693 \h </w:instrText>
       </w:r>
       <w:r>
         <w:rPr>
@@ -1995,7 +2061,7 @@
         <w:rPr>
           <w:noProof/>
         </w:rPr>
-        <w:instrText xml:space="preserve"> PAGEREF _Toc244220610 \h </w:instrText>
+        <w:instrText xml:space="preserve"> PAGEREF _Toc244220694 \h </w:instrText>
       </w:r>
       <w:r>
         <w:rPr>
@@ -2055,7 +2121,7 @@
         <w:rPr>
           <w:noProof/>
         </w:rPr>
-        <w:instrText xml:space="preserve"> PAGEREF _Toc244220611 \h </w:instrText>
+        <w:instrText xml:space="preserve"> PAGEREF _Toc244220695 \h </w:instrText>
       </w:r>
       <w:r>
         <w:rPr>
@@ -2115,7 +2181,7 @@
         <w:rPr>
           <w:noProof/>
         </w:rPr>
-        <w:instrText xml:space="preserve"> PAGEREF _Toc244220612 \h </w:instrText>
+        <w:instrText xml:space="preserve"> PAGEREF _Toc244220696 \h </w:instrText>
       </w:r>
       <w:r>
         <w:rPr>
@@ -2174,7 +2240,7 @@
         <w:rPr>
           <w:noProof/>
         </w:rPr>
-        <w:instrText xml:space="preserve"> PAGEREF _Toc244220613 \h </w:instrText>
+        <w:instrText xml:space="preserve"> PAGEREF _Toc244220697 \h </w:instrText>
       </w:r>
       <w:r>
         <w:rPr>
@@ -2233,7 +2299,7 @@
         <w:rPr>
           <w:noProof/>
         </w:rPr>
-        <w:instrText xml:space="preserve"> PAGEREF _Toc244220614 \h </w:instrText>
+        <w:instrText xml:space="preserve"> PAGEREF _Toc244220698 \h </w:instrText>
       </w:r>
       <w:r>
         <w:rPr>
@@ -2292,7 +2358,7 @@
         <w:rPr>
           <w:noProof/>
         </w:rPr>
-        <w:instrText xml:space="preserve"> PAGEREF _Toc244220615 \h </w:instrText>
+        <w:instrText xml:space="preserve"> PAGEREF _Toc244220699 \h </w:instrText>
       </w:r>
       <w:r>
         <w:rPr>
@@ -2352,7 +2418,7 @@
         <w:rPr>
           <w:noProof/>
         </w:rPr>
-        <w:instrText xml:space="preserve"> PAGEREF _Toc244220616 \h </w:instrText>
+        <w:instrText xml:space="preserve"> PAGEREF _Toc244220700 \h </w:instrText>
       </w:r>
       <w:r>
         <w:rPr>
@@ -2404,21 +2470,81 @@
       <w:pPr>
         <w:pStyle w:val="Heading1"/>
         <w:pageBreakBefore w:val="0"/>
-      </w:pPr>
-      <w:bookmarkStart w:id="1" w:name="executive-summary"/>
-      <w:bookmarkStart w:id="2" w:name="_Toc244220588"/>
+        <w:numPr>
+          <w:ilvl w:val="0"/>
+          <w:numId w:val="0"/>
+        </w:numPr>
+      </w:pPr>
+      <w:bookmarkStart w:id="2" w:name="executive-summary"/>
+      <w:bookmarkStart w:id="3" w:name="_Toc244220672"/>
       <w:r>
         <w:lastRenderedPageBreak/>
         <w:t>Executive Summary</w:t>
       </w:r>
+      <w:bookmarkEnd w:id="3"/>
+    </w:p>
+    <w:p>
+      <w:pPr>
+        <w:pStyle w:val="FirstParagraph"/>
+      </w:pPr>
+      <w:r>
+        <w:t>This report evaluates Actual Budget, a free, open-source and local-first personal finance application run by a small volunteer team, whose users must be able to trust its numbers and the security of their data.</w:t>
+      </w:r>
+    </w:p>
+    <w:p>
+      <w:pPr>
+        <w:pStyle w:val="BodyText"/>
+      </w:pPr>
+      <w:r>
+        <w:t>Actual has a defined workflow but no deliberate methodology. Its profile suits an agile approach, except that its few reviewers are overloaded and its defects can affect money and data. Out of five candidates, we chose Kanban because it limits the review backlog, and then mandatory quality gates are added because Kanban prescribes no quality practices.</w:t>
+      </w:r>
+    </w:p>
+    <w:p>
+      <w:pPr>
+        <w:pStyle w:val="BodyText"/>
+      </w:pPr>
+      <w:r>
+        <w:t>Furthermore, The QA process focuses on three ISO/IEC 25010:2023 characteristics: Security, Reliability and Interaction capability. Public evidence shows no written QA plan and gaps in proactive security verification, coverage measurement and accessibility testing. The plan also adopts OWASP ASVS 5.0.0 and WCAG 2.2 and writes risk-scaled checks into the exit policy of each Kanban column.</w:t>
+      </w:r>
+    </w:p>
+    <w:p>
+      <w:pPr>
+        <w:pStyle w:val="BodyText"/>
+      </w:pPr>
+      <w:r>
+        <w:t>Lastly, IV&amp;V adds risk-tiered independent review inside the team, plus external checks through coordinated disclosure and an optional funded audit. The outside checks are kept because all three 2026 security flaws were found by reporters outside the team, after release.</w:t>
+      </w:r>
+    </w:p>
+    <w:p>
+      <w:pPr>
+        <w:pStyle w:val="Heading1"/>
+      </w:pPr>
+      <w:bookmarkStart w:id="4" w:name="introduction"/>
+      <w:bookmarkStart w:id="5" w:name="_Toc244220673"/>
       <w:bookmarkEnd w:id="2"/>
+      <w:r>
+        <w:lastRenderedPageBreak/>
+        <w:t>Introduction</w:t>
+      </w:r>
+      <w:bookmarkEnd w:id="5"/>
+    </w:p>
+    <w:p>
+      <w:pPr>
+        <w:pStyle w:val="Heading2"/>
+      </w:pPr>
+      <w:bookmarkStart w:id="6" w:name="background-and-purpose"/>
+      <w:bookmarkStart w:id="7" w:name="_Toc244220674"/>
+      <w:r>
+        <w:t>Background and Purpose</w:t>
+      </w:r>
+      <w:bookmarkEnd w:id="7"/>
     </w:p>
     <w:p>
       <w:pPr>
         <w:pStyle w:val="FirstParagraph"/>
       </w:pPr>
       <w:r>
-        <w:t>This report evaluates Actual Budget, a free, open-source and local-first personal finance application run by a small volunteer team, whose users must be able to trust its numbers and the security of their data.</w:t>
+        <w:t>Personal finance applications help people record spending and plan a budget. Because they hold balances, transactions and sometimes bank connections, their quality matters. A wrong total can lead to a poor financial decision, while a security flaw can expose private data.</w:t>
       </w:r>
     </w:p>
     <w:p>
@@ -2426,7 +2552,7 @@
         <w:pStyle w:val="BodyText"/>
       </w:pPr>
       <w:r>
-        <w:t>Actual has a defined workflow but no deliberate methodology. Its profile suits an agile approach, except that its few reviewers are overloaded and its defects can affect money and data. Out of five candidates, we chose Kanban because it limits the review backlog, and then mandatory quality gates are added because Kanban prescribes no quality practices.</w:t>
+        <w:t>I chose Actual Budget because I was looking for an open-source personal finance application that I could self-host on an old laptop at home to manage and keep track of my finances. And this assignment allowed me to examine it in depth.</w:t>
       </w:r>
     </w:p>
     <w:p>
@@ -2434,7 +2560,27 @@
         <w:pStyle w:val="BodyText"/>
       </w:pPr>
       <w:r>
-        <w:t>Furthermore, The QA process focuses on three ISO/IEC 25010:2023 characteristics: Security, Reliability and Interaction capability. Public evidence shows no written QA plan and gaps in proactive security verification, coverage measurement and accessibility testing. The plan also adopts OWASP ASVS 5.0.0 and WCAG 2.2 and writes risk-scaled checks into the exit policy of each Kanban column.</w:t>
+        <w:t>This report covers three topics. Section 2 selects a software development methodology for the project, Section 3 sets out a quality assurance (QA) process, and Section 4 integrates independent verification and validation (IV&amp;V) into the selected methodology.</w:t>
+      </w:r>
+    </w:p>
+    <w:p>
+      <w:pPr>
+        <w:pStyle w:val="Heading2"/>
+      </w:pPr>
+      <w:bookmarkStart w:id="8" w:name="what-is-actual-budget"/>
+      <w:bookmarkStart w:id="9" w:name="_Toc244220675"/>
+      <w:bookmarkEnd w:id="6"/>
+      <w:r>
+        <w:t>What Is Actual Budget</w:t>
+      </w:r>
+      <w:bookmarkEnd w:id="9"/>
+    </w:p>
+    <w:p>
+      <w:pPr>
+        <w:pStyle w:val="FirstParagraph"/>
+      </w:pPr>
+      <w:r>
+        <w:t>Actual Budget ("Actual") is a free, open-source personal finance application released under the MIT licence. Its focus is mainly on local-first, and the budget is kept on the user's own device, while syncing between devices is optional (Actual Budget, 2026a). It targets privacy-minded budgeters, self-hosters and families. Furthermore, the project defines success as users trusting its numbers (Actual Budget, 2026a). By default, Actual uses envelope budgeting, in which people budget the money they already have, rather than the income they expect to receive (Actual Budget, n.d.-j).</w:t>
       </w:r>
     </w:p>
     <w:p>
@@ -2442,96 +2588,20 @@
         <w:pStyle w:val="BodyText"/>
       </w:pPr>
       <w:r>
-        <w:t>Lastly, IV&amp;V adds risk-tiered independent review inside the team, plus external checks through coordinated disclosure and an optional funded audit. The outside checks are kept because all three 2026 security flaws were found by reporters outside the team, after release.</w:t>
-      </w:r>
-    </w:p>
-    <w:p>
-      <w:pPr>
-        <w:pStyle w:val="Heading1"/>
-      </w:pPr>
-      <w:bookmarkStart w:id="3" w:name="introduction"/>
-      <w:bookmarkStart w:id="4" w:name="_Toc244220589"/>
-      <w:bookmarkEnd w:id="1"/>
-      <w:r>
-        <w:lastRenderedPageBreak/>
-        <w:t>1 Introduction</w:t>
-      </w:r>
-      <w:bookmarkEnd w:id="4"/>
+        <w:t>Actual was created by James Long, who ran it as a paid product for over four years (Stacoviak &amp; Santo, 2022). In early 2022 he decided to close the commercial product and released it as open source, and it is now maintained by volunteers, which led by a core team that formed after pull requests had waited months for review (Aboltins, 2025).</w:t>
+      </w:r>
     </w:p>
     <w:p>
       <w:pPr>
         <w:pStyle w:val="Heading2"/>
       </w:pPr>
-      <w:bookmarkStart w:id="5" w:name="background-and-purpose"/>
-      <w:bookmarkStart w:id="6" w:name="_Toc244220590"/>
-      <w:r>
-        <w:t>1.1 Background and Purpose</w:t>
-      </w:r>
-      <w:bookmarkEnd w:id="6"/>
-    </w:p>
-    <w:p>
-      <w:pPr>
-        <w:pStyle w:val="FirstParagraph"/>
-      </w:pPr>
-      <w:r>
-        <w:t>Personal finance applications help people record spending and plan a budget. Because they hold balances, transactions and sometimes bank connections, their quality matters. A wrong total can lead to a poor financial decision, while a security flaw can expose private data.</w:t>
-      </w:r>
-    </w:p>
-    <w:p>
-      <w:pPr>
-        <w:pStyle w:val="BodyText"/>
-      </w:pPr>
-      <w:r>
-        <w:t>I chose Actual Budget because I was looking for an open-source personal finance application that I could self-host on an old laptop at home to manage and keep track of my finances. And this assignment allowed me to examine it in depth.</w:t>
-      </w:r>
-    </w:p>
-    <w:p>
-      <w:pPr>
-        <w:pStyle w:val="BodyText"/>
-      </w:pPr>
-      <w:r>
-        <w:t>This report covers three topics. Section 2 selects a software development methodology for the project, Section 3 sets out a quality assurance (QA) process, and Section 4 integrates independent verification and validation (IV&amp;V) into the selected methodology.</w:t>
-      </w:r>
-    </w:p>
-    <w:p>
-      <w:pPr>
-        <w:pStyle w:val="Heading2"/>
-      </w:pPr>
-      <w:bookmarkStart w:id="7" w:name="what-is-actual-budget"/>
-      <w:bookmarkStart w:id="8" w:name="_Toc244220591"/>
-      <w:bookmarkEnd w:id="5"/>
-      <w:r>
-        <w:t>1.2 What Is Actual Budget</w:t>
-      </w:r>
+      <w:bookmarkStart w:id="10" w:name="main-features-and-how-it-works"/>
+      <w:bookmarkStart w:id="11" w:name="_Toc244220676"/>
       <w:bookmarkEnd w:id="8"/>
-    </w:p>
-    <w:p>
-      <w:pPr>
-        <w:pStyle w:val="FirstParagraph"/>
-      </w:pPr>
-      <w:r>
-        <w:t>Actual Budget ("Actual") is a free, open-source personal finance application released under the MIT licence. Its focus is mainly on local-first, and the budget is kept on the user's own device, while syncing between devices is optional (Actual Budget, 2026a). It targets privacy-minded budgeters, self-hosters and families. Furthermore, the project defines success as users trusting its numbers (Actual Budget, 2026a). By default, Actual uses envelope budgeting, in which people budget the money they already have, rather than the income they expect to receive (Actual Budget, n.d.-j).</w:t>
-      </w:r>
-    </w:p>
-    <w:p>
-      <w:pPr>
-        <w:pStyle w:val="BodyText"/>
-      </w:pPr>
-      <w:r>
-        <w:t>Actual was created by James Long, who ran it as a paid product for over four years (Stacoviak &amp; Santo, 2022). In early 2022 he decided to close the commercial product and released it as open source, and it is now maintained by volunteers, which led by a core team that formed after pull requests had waited months for review (Aboltins, 2025).</w:t>
-      </w:r>
-    </w:p>
-    <w:p>
-      <w:pPr>
-        <w:pStyle w:val="Heading2"/>
-      </w:pPr>
-      <w:bookmarkStart w:id="9" w:name="main-features-and-how-it-works"/>
-      <w:bookmarkStart w:id="10" w:name="_Toc244220592"/>
-      <w:bookmarkEnd w:id="7"/>
-      <w:r>
-        <w:t>1.3 Main Features and How It Works</w:t>
-      </w:r>
-      <w:bookmarkEnd w:id="10"/>
+      <w:r>
+        <w:t>Main Features and How It Works</w:t>
+      </w:r>
+      <w:bookmarkEnd w:id="11"/>
     </w:p>
     <w:p>
       <w:pPr>
@@ -2618,14 +2688,14 @@
       <w:pPr>
         <w:pStyle w:val="Heading2"/>
       </w:pPr>
-      <w:bookmarkStart w:id="11" w:name="who-is-involved"/>
-      <w:bookmarkStart w:id="12" w:name="_Toc244220593"/>
-      <w:bookmarkEnd w:id="9"/>
+      <w:bookmarkStart w:id="12" w:name="who-is-involved"/>
+      <w:bookmarkStart w:id="13" w:name="_Toc244220677"/>
+      <w:bookmarkEnd w:id="10"/>
       <w:r>
         <w:lastRenderedPageBreak/>
-        <w:t>1.4 Who Is Involved</w:t>
-      </w:r>
-      <w:bookmarkEnd w:id="12"/>
+        <w:t>Who Is Involved</w:t>
+      </w:r>
+      <w:bookmarkEnd w:id="13"/>
     </w:p>
     <w:p>
       <w:pPr>
@@ -2894,13 +2964,13 @@
         <w:pStyle w:val="Heading2"/>
         <w:spacing w:before="240"/>
       </w:pPr>
-      <w:bookmarkStart w:id="13" w:name="main-challenges"/>
-      <w:bookmarkStart w:id="14" w:name="_Toc244220594"/>
-      <w:bookmarkEnd w:id="11"/>
-      <w:r>
-        <w:t>1.5 Main Challenges</w:t>
-      </w:r>
-      <w:bookmarkEnd w:id="14"/>
+      <w:bookmarkStart w:id="14" w:name="main-challenges"/>
+      <w:bookmarkStart w:id="15" w:name="_Toc244220678"/>
+      <w:bookmarkEnd w:id="12"/>
+      <w:r>
+        <w:t>Main Challenges</w:t>
+      </w:r>
+      <w:bookmarkEnd w:id="15"/>
     </w:p>
     <w:p>
       <w:pPr>
@@ -2963,15 +3033,15 @@
       <w:pPr>
         <w:pStyle w:val="Heading1"/>
       </w:pPr>
-      <w:bookmarkStart w:id="15" w:name="software-development-methodology"/>
-      <w:bookmarkStart w:id="16" w:name="_Toc244220595"/>
-      <w:bookmarkEnd w:id="3"/>
-      <w:bookmarkEnd w:id="13"/>
+      <w:bookmarkStart w:id="16" w:name="software-development-methodology"/>
+      <w:bookmarkStart w:id="17" w:name="_Toc244220679"/>
+      <w:bookmarkEnd w:id="4"/>
+      <w:bookmarkEnd w:id="14"/>
       <w:r>
         <w:lastRenderedPageBreak/>
-        <w:t>2 Software Development Methodology</w:t>
-      </w:r>
-      <w:bookmarkEnd w:id="16"/>
+        <w:t>Software Development Methodology</w:t>
+      </w:r>
+      <w:bookmarkEnd w:id="17"/>
     </w:p>
     <w:p>
       <w:pPr>
@@ -2985,12 +3055,12 @@
       <w:pPr>
         <w:pStyle w:val="Heading2"/>
       </w:pPr>
-      <w:bookmarkStart w:id="17" w:name="current-development-process-of-actual"/>
-      <w:bookmarkStart w:id="18" w:name="_Toc244220596"/>
-      <w:r>
-        <w:t>2.1 Current Development Process of Actual</w:t>
-      </w:r>
-      <w:bookmarkEnd w:id="18"/>
+      <w:bookmarkStart w:id="18" w:name="current-development-process-of-actual"/>
+      <w:bookmarkStart w:id="19" w:name="_Toc244220680"/>
+      <w:r>
+        <w:t>Current Development Process of Actual</w:t>
+      </w:r>
+      <w:bookmarkEnd w:id="19"/>
     </w:p>
     <w:p>
       <w:pPr>
@@ -3094,13 +3164,13 @@
       <w:pPr>
         <w:pStyle w:val="Heading2"/>
       </w:pPr>
-      <w:bookmarkStart w:id="19" w:name="why-kanban-fits-actual"/>
-      <w:bookmarkStart w:id="20" w:name="_Toc244220597"/>
-      <w:bookmarkEnd w:id="17"/>
-      <w:r>
-        <w:t>2.2 Why Kanban Fits Actual</w:t>
-      </w:r>
-      <w:bookmarkEnd w:id="20"/>
+      <w:bookmarkStart w:id="20" w:name="why-kanban-fits-actual"/>
+      <w:bookmarkStart w:id="21" w:name="_Toc244220681"/>
+      <w:bookmarkEnd w:id="18"/>
+      <w:r>
+        <w:t>Why Kanban Fits Actual</w:t>
+      </w:r>
+      <w:bookmarkEnd w:id="21"/>
     </w:p>
     <w:p>
       <w:pPr>
@@ -3150,13 +3220,13 @@
       <w:pPr>
         <w:pStyle w:val="Heading2"/>
       </w:pPr>
-      <w:bookmarkStart w:id="21" w:name="applying-kanban-to-actual"/>
-      <w:bookmarkStart w:id="22" w:name="_Toc244220598"/>
-      <w:bookmarkEnd w:id="19"/>
-      <w:r>
-        <w:t>2.3 Applying Kanban to Actual</w:t>
-      </w:r>
-      <w:bookmarkEnd w:id="22"/>
+      <w:bookmarkStart w:id="22" w:name="applying-kanban-to-actual"/>
+      <w:bookmarkStart w:id="23" w:name="_Toc244220682"/>
+      <w:bookmarkEnd w:id="20"/>
+      <w:r>
+        <w:t>Applying Kanban to Actual</w:t>
+      </w:r>
+      <w:bookmarkEnd w:id="23"/>
     </w:p>
     <w:p>
       <w:pPr>
@@ -3244,13 +3314,13 @@
       <w:pPr>
         <w:pStyle w:val="Heading2"/>
       </w:pPr>
-      <w:bookmarkStart w:id="23" w:name="critical-evaluation"/>
-      <w:bookmarkStart w:id="24" w:name="_Toc244220599"/>
-      <w:bookmarkEnd w:id="21"/>
-      <w:r>
-        <w:t>2.4 Critical Evaluation</w:t>
-      </w:r>
-      <w:bookmarkEnd w:id="24"/>
+      <w:bookmarkStart w:id="24" w:name="critical-evaluation"/>
+      <w:bookmarkStart w:id="25" w:name="_Toc244220683"/>
+      <w:bookmarkEnd w:id="22"/>
+      <w:r>
+        <w:t>Critical Evaluation</w:t>
+      </w:r>
+      <w:bookmarkEnd w:id="25"/>
     </w:p>
     <w:p>
       <w:pPr>
@@ -3268,15 +3338,15 @@
       <w:pPr>
         <w:pStyle w:val="Heading1"/>
       </w:pPr>
-      <w:bookmarkStart w:id="25" w:name="quality-assurance-process"/>
-      <w:bookmarkStart w:id="26" w:name="_Toc244220600"/>
-      <w:bookmarkEnd w:id="15"/>
-      <w:bookmarkEnd w:id="23"/>
+      <w:bookmarkStart w:id="26" w:name="quality-assurance-process"/>
+      <w:bookmarkStart w:id="27" w:name="_Toc244220684"/>
+      <w:bookmarkEnd w:id="16"/>
+      <w:bookmarkEnd w:id="24"/>
       <w:r>
         <w:lastRenderedPageBreak/>
-        <w:t>3 Quality Assurance Process</w:t>
-      </w:r>
-      <w:bookmarkEnd w:id="26"/>
+        <w:t>Quality Assurance Process</w:t>
+      </w:r>
+      <w:bookmarkEnd w:id="27"/>
     </w:p>
     <w:p>
       <w:pPr>
@@ -3290,12 +3360,12 @@
       <w:pPr>
         <w:pStyle w:val="Heading2"/>
       </w:pPr>
-      <w:bookmarkStart w:id="27" w:name="what-quality-means-for-actual"/>
-      <w:bookmarkStart w:id="28" w:name="_Toc244220601"/>
-      <w:r>
-        <w:t>3.1 What Quality Means for Actual</w:t>
-      </w:r>
-      <w:bookmarkEnd w:id="28"/>
+      <w:bookmarkStart w:id="28" w:name="what-quality-means-for-actual"/>
+      <w:bookmarkStart w:id="29" w:name="_Toc244220685"/>
+      <w:r>
+        <w:t>What Quality Means for Actual</w:t>
+      </w:r>
+      <w:bookmarkEnd w:id="29"/>
     </w:p>
     <w:p>
       <w:pPr>
@@ -3377,13 +3447,13 @@
       <w:pPr>
         <w:pStyle w:val="Heading2"/>
       </w:pPr>
-      <w:bookmarkStart w:id="29" w:name="key-quality-attributes"/>
-      <w:bookmarkStart w:id="30" w:name="_Toc244220602"/>
-      <w:bookmarkEnd w:id="27"/>
-      <w:r>
-        <w:t>3.2 Key Quality Attributes</w:t>
-      </w:r>
-      <w:bookmarkEnd w:id="30"/>
+      <w:bookmarkStart w:id="30" w:name="key-quality-attributes"/>
+      <w:bookmarkStart w:id="31" w:name="_Toc244220686"/>
+      <w:bookmarkEnd w:id="28"/>
+      <w:r>
+        <w:t>Key Quality Attributes</w:t>
+      </w:r>
+      <w:bookmarkEnd w:id="31"/>
     </w:p>
     <w:p>
       <w:pPr>
@@ -3433,50 +3503,50 @@
       <w:pPr>
         <w:pStyle w:val="Heading2"/>
       </w:pPr>
-      <w:bookmarkStart w:id="31" w:name="current-qa-practices-and-gaps"/>
-      <w:bookmarkStart w:id="32" w:name="_Toc244220603"/>
-      <w:bookmarkEnd w:id="29"/>
+      <w:bookmarkStart w:id="32" w:name="current-qa-practices-and-gaps"/>
+      <w:bookmarkStart w:id="33" w:name="_Toc244220687"/>
+      <w:bookmarkEnd w:id="30"/>
       <w:r>
         <w:lastRenderedPageBreak/>
-        <w:t>3.3 Current QA Practices and Gaps</w:t>
-      </w:r>
+        <w:t>Current QA Practices and Gaps</w:t>
+      </w:r>
+      <w:bookmarkEnd w:id="33"/>
+    </w:p>
+    <w:p>
+      <w:pPr>
+        <w:pStyle w:val="FirstParagraph"/>
+      </w:pPr>
+      <w:r>
+        <w:t>Actual already runs substantial automated QA. Every pull request triggers linting, type checking, Vitest unit tests and a database migration check, Playwright end-to-end and visual regression tests run on pull requests or in the merge queue (Actual Budget, 2026a, n.d.-i).</w:t>
+      </w:r>
+    </w:p>
+    <w:p>
+      <w:pPr>
+        <w:pStyle w:val="BodyText"/>
+      </w:pPr>
+      <w:r>
+        <w:t>It also uses a semantic code analysis engine (CodeQL) to scan every pull requests and pushes (Actual Budget, 2026a). Moreover, releases will need approval from at least two other maintainers and do smoke tests (Actual Budget, n.d.-b). Actual's own security policy also asks for private vulnerability reporting and coordinated disclosure (Actual Budget, n.d.-g).</w:t>
+      </w:r>
+    </w:p>
+    <w:p>
+      <w:pPr>
+        <w:pStyle w:val="BodyText"/>
+      </w:pPr>
+      <w:r>
+        <w:t>There are also four gaps that are discovered or happened from the research: - Security: No proactive check of access control before release. Three access-control flaws in the sync server feature were published in 2026 (Actual Budget, 2026b, 2026c, 2026d). The most critical one was about missing authentication on six of the SimpleFIN and Pluggy AI bank-sync endpoints, which the GoCardless endpoints had it (Actual Budget, 2026c). This shows inconsistent authentication across bank-sync providers, and the flaw was only found after release. The security policy also states no response time for reports (Actual Budget, n.d.-g). - Reliability: There is no test coverage measurement. Test coverage would not prove that the code is correct, but it would at least show what is untested. And reliability defects still reach users, like a sync defect that stopped some budgets from opening and it's stayed in released versions for years (Brown, 2026). Although Actual's testing checklist asks for "appropriate test coverage" (Actual Budget, n.d.-i, Testing Checklist section), there's no coverage report found in the repository, and sync-server tests have coverage switched off (Actual Budget, 2026a). Therefore, nobody can tell how much of the sync and migration code is actually tested and actually safe. - Interaction capability: No automated accessibility testing was found, despite the WCAG target (Actual Budget, 2026a). - Process: No written QA plan. Quality rules are spread across documentation, templates and CI files, so there's no a single place that states what must be checked before work moves on.</w:t>
+      </w:r>
+    </w:p>
+    <w:p>
+      <w:pPr>
+        <w:pStyle w:val="Heading2"/>
+      </w:pPr>
+      <w:bookmarkStart w:id="34" w:name="selected-standards-and-practices"/>
+      <w:bookmarkStart w:id="35" w:name="_Toc244220688"/>
       <w:bookmarkEnd w:id="32"/>
-    </w:p>
-    <w:p>
-      <w:pPr>
-        <w:pStyle w:val="FirstParagraph"/>
-      </w:pPr>
-      <w:r>
-        <w:t>Actual already runs substantial automated QA. Every pull request triggers linting, type checking, Vitest unit tests and a database migration check, Playwright end-to-end and visual regression tests run on pull requests or in the merge queue (Actual Budget, 2026a, n.d.-i).</w:t>
-      </w:r>
-    </w:p>
-    <w:p>
-      <w:pPr>
-        <w:pStyle w:val="BodyText"/>
-      </w:pPr>
-      <w:r>
-        <w:t>It also uses a semantic code analysis engine (CodeQL) to scan every pull requests and pushes (Actual Budget, 2026a). Moreover, releases will need approval from at least two other maintainers and do smoke tests (Actual Budget, n.d.-b). Actual's own security policy also asks for private vulnerability reporting and coordinated disclosure (Actual Budget, n.d.-g).</w:t>
-      </w:r>
-    </w:p>
-    <w:p>
-      <w:pPr>
-        <w:pStyle w:val="BodyText"/>
-      </w:pPr>
-      <w:r>
-        <w:t>There are also four gaps that are discovered or happened from the research: - Security: No proactive check of access control before release. Three access-control flaws in the sync server feature were published in 2026 (Actual Budget, 2026b, 2026c, 2026d). The most critical one was about missing authentication on six of the SimpleFIN and Pluggy AI bank-sync endpoints, which the GoCardless endpoints had it (Actual Budget, 2026c). This shows inconsistent authentication across bank-sync providers, and the flaw was only found after release. The security policy also states no response time for reports (Actual Budget, n.d.-g). - Reliability: There is no test coverage measurement. Test coverage would not prove that the code is correct, but it would at least show what is untested. And reliability defects still reach users, like a sync defect that stopped some budgets from opening and it's stayed in released versions for years (Brown, 2026). Although Actual's testing checklist asks for "appropriate test coverage" (Actual Budget, n.d.-i, Testing Checklist section), there's no coverage report found in the repository, and sync-server tests have coverage switched off (Actual Budget, 2026a). Therefore, nobody can tell how much of the sync and migration code is actually tested and actually safe. - Interaction capability: No automated accessibility testing was found, despite the WCAG target (Actual Budget, 2026a). - Process: No written QA plan. Quality rules are spread across documentation, templates and CI files, so there's no a single place that states what must be checked before work moves on.</w:t>
-      </w:r>
-    </w:p>
-    <w:p>
-      <w:pPr>
-        <w:pStyle w:val="Heading2"/>
-      </w:pPr>
-      <w:bookmarkStart w:id="33" w:name="selected-standards-and-practices"/>
-      <w:bookmarkStart w:id="34" w:name="_Toc244220604"/>
-      <w:bookmarkEnd w:id="31"/>
-      <w:r>
-        <w:t>3.4 Selected Standards and Practices</w:t>
-      </w:r>
-      <w:bookmarkEnd w:id="34"/>
+      <w:r>
+        <w:t>Selected Standards and Practices</w:t>
+      </w:r>
+      <w:bookmarkEnd w:id="35"/>
     </w:p>
     <w:p>
       <w:pPr>
@@ -3854,13 +3924,13 @@
         <w:pStyle w:val="Heading2"/>
         <w:spacing w:before="240"/>
       </w:pPr>
-      <w:bookmarkStart w:id="35" w:name="applying-the-qa-process-within-kanban"/>
-      <w:bookmarkStart w:id="36" w:name="_Toc244220605"/>
-      <w:bookmarkEnd w:id="33"/>
-      <w:r>
-        <w:t>3.5 Applying the QA Process within Kanban</w:t>
-      </w:r>
-      <w:bookmarkEnd w:id="36"/>
+      <w:bookmarkStart w:id="36" w:name="applying-the-qa-process-within-kanban"/>
+      <w:bookmarkStart w:id="37" w:name="_Toc244220689"/>
+      <w:bookmarkEnd w:id="34"/>
+      <w:r>
+        <w:t>Applying the QA Process within Kanban</w:t>
+      </w:r>
+      <w:bookmarkEnd w:id="37"/>
     </w:p>
     <w:p>
       <w:pPr>
@@ -4463,41 +4533,41 @@
         <w:pStyle w:val="Heading2"/>
         <w:spacing w:before="240"/>
       </w:pPr>
-      <w:bookmarkStart w:id="37" w:name="critical-evaluation-1"/>
-      <w:bookmarkStart w:id="38" w:name="_Toc244220606"/>
-      <w:bookmarkEnd w:id="35"/>
-      <w:r>
-        <w:t>3.6 Critical Evaluation</w:t>
-      </w:r>
+      <w:bookmarkStart w:id="38" w:name="critical-evaluation-1"/>
+      <w:bookmarkStart w:id="39" w:name="_Toc244220690"/>
+      <w:bookmarkEnd w:id="36"/>
+      <w:r>
+        <w:t>Critical Evaluation</w:t>
+      </w:r>
+      <w:bookmarkEnd w:id="39"/>
+    </w:p>
+    <w:p>
+      <w:pPr>
+        <w:pStyle w:val="FirstParagraph"/>
+      </w:pPr>
+      <w:r>
+        <w:t>The plan's main cost is volunteer time. Each check added to an exit policy is more work for a small team that already has little time for review (Section 2.1). The risk tiers keep this cost under control, since only High-tier cards go through the full set of checks. However, the tiers depend on judgement at triage, and a card given too low a tier will skip checks it needed. This matters most for security and data changes, where a missed check could reach users unnoticed.</w:t>
+      </w:r>
+    </w:p>
+    <w:p>
+      <w:pPr>
+        <w:pStyle w:val="Heading1"/>
+      </w:pPr>
+      <w:bookmarkStart w:id="40" w:name="integrating-ivv-with-kanban"/>
+      <w:bookmarkStart w:id="41" w:name="_Toc244220691"/>
+      <w:bookmarkEnd w:id="26"/>
       <w:bookmarkEnd w:id="38"/>
+      <w:r>
+        <w:lastRenderedPageBreak/>
+        <w:t>Integrating IV&amp;V with Kanban</w:t>
+      </w:r>
+      <w:bookmarkEnd w:id="41"/>
     </w:p>
     <w:p>
       <w:pPr>
         <w:pStyle w:val="FirstParagraph"/>
       </w:pPr>
       <w:r>
-        <w:t>The plan's main cost is volunteer time. Each check added to an exit policy is more work for a small team that already has little time for review (Section 2.1). The risk tiers keep this cost under control, since only High-tier cards go through the full set of checks. However, the tiers depend on judgement at triage, and a card given too low a tier will skip checks it needed. This matters most for security and data changes, where a missed check could reach users unnoticed.</w:t>
-      </w:r>
-    </w:p>
-    <w:p>
-      <w:pPr>
-        <w:pStyle w:val="Heading1"/>
-      </w:pPr>
-      <w:bookmarkStart w:id="39" w:name="integrating-ivv-with-kanban"/>
-      <w:bookmarkStart w:id="40" w:name="_Toc244220607"/>
-      <w:bookmarkEnd w:id="25"/>
-      <w:bookmarkEnd w:id="37"/>
-      <w:r>
-        <w:lastRenderedPageBreak/>
-        <w:t>4 Integrating IV&amp;V with Kanban</w:t>
-      </w:r>
-      <w:bookmarkEnd w:id="40"/>
-    </w:p>
-    <w:p>
-      <w:pPr>
-        <w:pStyle w:val="FirstParagraph"/>
-      </w:pPr>
-      <w:r>
         <w:t>This section examines how independently Actual's work is checked today, proposes an IV&amp;V model built into the Kanban board from Section 2 and the QA plan from Section 3, and shows how the model meets the assignment's three goals, which are early defect detection, requirements compliance and overall quality.</w:t>
       </w:r>
     </w:p>
@@ -4505,12 +4575,12 @@
       <w:pPr>
         <w:pStyle w:val="Heading2"/>
       </w:pPr>
-      <w:bookmarkStart w:id="41" w:name="X0aa91b5be94bdb8348825913a91d765f72af6ee"/>
-      <w:bookmarkStart w:id="42" w:name="_Toc244220608"/>
-      <w:r>
-        <w:t>4.1 Current V&amp;V in Actual and Its Independence</w:t>
-      </w:r>
-      <w:bookmarkEnd w:id="42"/>
+      <w:bookmarkStart w:id="42" w:name="X0aa91b5be94bdb8348825913a91d765f72af6ee"/>
+      <w:bookmarkStart w:id="43" w:name="_Toc244220692"/>
+      <w:r>
+        <w:t>Current V&amp;V in Actual and Its Independence</w:t>
+      </w:r>
+      <w:bookmarkEnd w:id="43"/>
     </w:p>
     <w:p>
       <w:pPr>
@@ -5277,13 +5347,13 @@
       <w:pPr>
         <w:pStyle w:val="Heading2"/>
       </w:pPr>
-      <w:bookmarkStart w:id="43" w:name="ivv-integration-model-for-kanban"/>
-      <w:bookmarkStart w:id="44" w:name="_Toc244220609"/>
-      <w:bookmarkEnd w:id="41"/>
-      <w:r>
-        <w:t>4.2 IV&amp;V Integration Model for Kanban</w:t>
-      </w:r>
-      <w:bookmarkEnd w:id="44"/>
+      <w:bookmarkStart w:id="44" w:name="ivv-integration-model-for-kanban"/>
+      <w:bookmarkStart w:id="45" w:name="_Toc244220693"/>
+      <w:bookmarkEnd w:id="42"/>
+      <w:r>
+        <w:t>IV&amp;V Integration Model for Kanban</w:t>
+      </w:r>
+      <w:bookmarkEnd w:id="45"/>
     </w:p>
     <w:p>
       <w:pPr>
@@ -5858,13 +5928,13 @@
       <w:pPr>
         <w:pStyle w:val="Heading2"/>
       </w:pPr>
-      <w:bookmarkStart w:id="45" w:name="X1475a41517db6ec60255518d1ac8cff0c25dd20"/>
-      <w:bookmarkStart w:id="46" w:name="_Toc244220610"/>
-      <w:bookmarkEnd w:id="43"/>
-      <w:r>
-        <w:t>4.3 How the Integration Meets the Three Goals</w:t>
-      </w:r>
-      <w:bookmarkEnd w:id="46"/>
+      <w:bookmarkStart w:id="46" w:name="X1475a41517db6ec60255518d1ac8cff0c25dd20"/>
+      <w:bookmarkStart w:id="47" w:name="_Toc244220694"/>
+      <w:bookmarkEnd w:id="44"/>
+      <w:r>
+        <w:t>How the Integration Meets the Three Goals</w:t>
+      </w:r>
+      <w:bookmarkEnd w:id="47"/>
     </w:p>
     <w:p>
       <w:pPr>
@@ -5905,16 +5975,20 @@
     <w:p>
       <w:pPr>
         <w:pStyle w:val="Heading1"/>
-      </w:pPr>
-      <w:bookmarkStart w:id="47" w:name="references"/>
-      <w:bookmarkStart w:id="48" w:name="_Toc244220611"/>
-      <w:bookmarkEnd w:id="39"/>
-      <w:bookmarkEnd w:id="45"/>
+        <w:numPr>
+          <w:ilvl w:val="0"/>
+          <w:numId w:val="0"/>
+        </w:numPr>
+      </w:pPr>
+      <w:bookmarkStart w:id="48" w:name="references"/>
+      <w:bookmarkStart w:id="49" w:name="_Toc244220695"/>
+      <w:bookmarkEnd w:id="40"/>
+      <w:bookmarkEnd w:id="46"/>
       <w:r>
         <w:lastRenderedPageBreak/>
         <w:t>References</w:t>
       </w:r>
-      <w:bookmarkEnd w:id="48"/>
+      <w:bookmarkEnd w:id="49"/>
     </w:p>
     <w:p>
       <w:pPr>
@@ -6571,15 +6645,19 @@
     <w:p>
       <w:pPr>
         <w:pStyle w:val="Heading1"/>
-      </w:pPr>
-      <w:bookmarkStart w:id="49" w:name="appendix-a-methodology-selection"/>
-      <w:bookmarkStart w:id="50" w:name="_Toc244220612"/>
-      <w:bookmarkEnd w:id="47"/>
+        <w:numPr>
+          <w:ilvl w:val="0"/>
+          <w:numId w:val="0"/>
+        </w:numPr>
+      </w:pPr>
+      <w:bookmarkStart w:id="50" w:name="appendix-a-methodology-selection"/>
+      <w:bookmarkStart w:id="51" w:name="_Toc244220696"/>
+      <w:bookmarkEnd w:id="48"/>
       <w:r>
         <w:lastRenderedPageBreak/>
         <w:t>Appendix A: Methodology Selection</w:t>
       </w:r>
-      <w:bookmarkEnd w:id="50"/>
+      <w:bookmarkEnd w:id="51"/>
     </w:p>
     <w:p>
       <w:pPr>
@@ -6596,13 +6674,17 @@
     <w:p>
       <w:pPr>
         <w:pStyle w:val="Heading2"/>
-      </w:pPr>
-      <w:bookmarkStart w:id="51" w:name="X028abdb72f6729402371f99d307e7d170450399"/>
-      <w:bookmarkStart w:id="52" w:name="_Toc244220613"/>
+        <w:numPr>
+          <w:ilvl w:val="0"/>
+          <w:numId w:val="0"/>
+        </w:numPr>
+      </w:pPr>
+      <w:bookmarkStart w:id="52" w:name="X028abdb72f6729402371f99d307e7d170450399"/>
+      <w:bookmarkStart w:id="53" w:name="_Toc244220697"/>
       <w:r>
         <w:t>A.1 Project Characteristics and Requirements</w:t>
       </w:r>
-      <w:bookmarkEnd w:id="52"/>
+      <w:bookmarkEnd w:id="53"/>
     </w:p>
     <w:p>
       <w:pPr>
@@ -7510,43 +7592,51 @@
     <w:p>
       <w:pPr>
         <w:pStyle w:val="Heading2"/>
+        <w:numPr>
+          <w:ilvl w:val="0"/>
+          <w:numId w:val="0"/>
+        </w:numPr>
         <w:spacing w:before="240"/>
       </w:pPr>
-      <w:bookmarkStart w:id="53" w:name="a.2-candidate-methodologies"/>
-      <w:bookmarkStart w:id="54" w:name="_Toc244220614"/>
-      <w:bookmarkEnd w:id="51"/>
+      <w:bookmarkStart w:id="54" w:name="a.2-candidate-methodologies"/>
+      <w:bookmarkStart w:id="55" w:name="_Toc244220698"/>
+      <w:bookmarkEnd w:id="52"/>
       <w:r>
         <w:t>A.2 Candidate Methodologies</w:t>
       </w:r>
+      <w:bookmarkEnd w:id="55"/>
+    </w:p>
+    <w:p>
+      <w:pPr>
+        <w:pStyle w:val="FirstParagraph"/>
+      </w:pPr>
+      <w:r>
+        <w:t>The comparison focuses on five established methodologies, each representing a different approach: Spiral, Scrum, Extreme Programming (XP), Kanban and DevOps. Waterfall and the V-Model were not shortlisted, because they suit stable requirements and leave little room for change (GeeksforGeeks, 2025), whereas Actual's requirements change with every vote. RAD and RUP were set aside because their planned phases and deliverables assume a team that can be scheduled, while Actual's volunteers choose their own work. Spiral is included although it is not agile, because risk tolerance is the one factor on which Actual leans away from agile methods.</w:t>
+      </w:r>
+    </w:p>
+    <w:p>
+      <w:pPr>
+        <w:pStyle w:val="BodyText"/>
+      </w:pPr>
+      <w:r>
+        <w:t>Actual's current process is also kept in the comparison as a reference point. It is not a candidate, but any change must prove better than today.</w:t>
+      </w:r>
+    </w:p>
+    <w:p>
+      <w:pPr>
+        <w:pStyle w:val="Heading2"/>
+        <w:numPr>
+          <w:ilvl w:val="0"/>
+          <w:numId w:val="0"/>
+        </w:numPr>
+      </w:pPr>
+      <w:bookmarkStart w:id="56" w:name="a.3-evaluation-and-selection"/>
+      <w:bookmarkStart w:id="57" w:name="_Toc244220699"/>
       <w:bookmarkEnd w:id="54"/>
-    </w:p>
-    <w:p>
-      <w:pPr>
-        <w:pStyle w:val="FirstParagraph"/>
-      </w:pPr>
-      <w:r>
-        <w:t>The comparison focuses on five established methodologies, each representing a different approach: Spiral, Scrum, Extreme Programming (XP), Kanban and DevOps. Waterfall and the V-Model were not shortlisted, because they suit stable requirements and leave little room for change (GeeksforGeeks, 2025), whereas Actual's requirements change with every vote. RAD and RUP were set aside because their planned phases and deliverables assume a team that can be scheduled, while Actual's volunteers choose their own work. Spiral is included although it is not agile, because risk tolerance is the one factor on which Actual leans away from agile methods.</w:t>
-      </w:r>
-    </w:p>
-    <w:p>
-      <w:pPr>
-        <w:pStyle w:val="BodyText"/>
-      </w:pPr>
-      <w:r>
-        <w:t>Actual's current process is also kept in the comparison as a reference point. It is not a candidate, but any change must prove better than today.</w:t>
-      </w:r>
-    </w:p>
-    <w:p>
-      <w:pPr>
-        <w:pStyle w:val="Heading2"/>
-      </w:pPr>
-      <w:bookmarkStart w:id="55" w:name="a.3-evaluation-and-selection"/>
-      <w:bookmarkStart w:id="56" w:name="_Toc244220615"/>
-      <w:bookmarkEnd w:id="53"/>
       <w:r>
         <w:t>A.3 Evaluation and Selection</w:t>
       </w:r>
-      <w:bookmarkEnd w:id="56"/>
+      <w:bookmarkEnd w:id="57"/>
     </w:p>
     <w:p>
       <w:pPr>
@@ -8202,16 +8292,20 @@
     <w:p>
       <w:pPr>
         <w:pStyle w:val="Heading1"/>
-      </w:pPr>
-      <w:bookmarkStart w:id="57" w:name="appendix-b-worked-example-of-the-qa-plan"/>
-      <w:bookmarkStart w:id="58" w:name="_Toc244220616"/>
-      <w:bookmarkEnd w:id="49"/>
-      <w:bookmarkEnd w:id="55"/>
+        <w:numPr>
+          <w:ilvl w:val="0"/>
+          <w:numId w:val="0"/>
+        </w:numPr>
+      </w:pPr>
+      <w:bookmarkStart w:id="58" w:name="appendix-b-worked-example-of-the-qa-plan"/>
+      <w:bookmarkStart w:id="59" w:name="_Toc244220700"/>
+      <w:bookmarkEnd w:id="50"/>
+      <w:bookmarkEnd w:id="56"/>
       <w:r>
         <w:lastRenderedPageBreak/>
         <w:t>Appendix B: Worked Example of the QA Plan</w:t>
       </w:r>
-      <w:bookmarkEnd w:id="58"/>
+      <w:bookmarkEnd w:id="59"/>
     </w:p>
     <w:p>
       <w:pPr>
@@ -8233,7 +8327,7 @@
         <w:t>Suppose a contributor adds a new bank-sync provider, the kind of change behind GHSA-m2cq-xjgm-f668 (Section 3.3). At triage, the card is marked High tier because it touches bank sync, and an acceptance criterion is written: every new endpoint must refuse requests without a valid login. At design, the implementer lists the new endpoints and who may call each one. At Build/PR, the endpoints are added to the authorisation test matrix. If the login check is missing, that test fails and the card cannot move to Verify, so a flaw like the 2026 one could be stopped before release. A typo fix in the documentation, by contrast, is Low tier and passes through the normal checks only.</w:t>
       </w:r>
     </w:p>
-    <w:bookmarkEnd w:id="57"/>
+    <w:bookmarkEnd w:id="58"/>
     <w:p>
       <w:pPr>
         <w:spacing w:line="240" w:lineRule="auto"/>
@@ -8785,11 +8879,117 @@
       </w:pPr>
     </w:lvl>
   </w:abstractNum>
+  <w:abstractNum w:abstractNumId="2" w15:restartNumberingAfterBreak="0">
+    <w:nsid w:val="7CE06A69"/>
+    <w:multiLevelType w:val="multilevel"/>
+    <w:tmpl w:val="081EB290"/>
+    <w:name w:val="ReportHeadings"/>
+    <w:lvl w:ilvl="0">
+      <w:start w:val="1"/>
+      <w:numFmt w:val="decimal"/>
+      <w:lvlRestart w:val="0"/>
+      <w:pStyle w:val="Heading1"/>
+      <w:suff w:val="space"/>
+      <w:lvlText w:val="%1.0"/>
+      <w:lvlJc w:val="left"/>
+      <w:pPr>
+        <w:ind w:left="0" w:firstLine="0"/>
+      </w:pPr>
+      <w:rPr>
+        <w:b/>
+      </w:rPr>
+    </w:lvl>
+    <w:lvl w:ilvl="1">
+      <w:start w:val="1"/>
+      <w:numFmt w:val="decimal"/>
+      <w:pStyle w:val="Heading2"/>
+      <w:suff w:val="space"/>
+      <w:lvlText w:val="%1.%2"/>
+      <w:lvlJc w:val="left"/>
+      <w:pPr>
+        <w:ind w:left="0" w:firstLine="0"/>
+      </w:pPr>
+      <w:rPr>
+        <w:b/>
+      </w:rPr>
+    </w:lvl>
+    <w:lvl w:ilvl="2">
+      <w:start w:val="1"/>
+      <w:numFmt w:val="decimal"/>
+      <w:pStyle w:val="Heading3"/>
+      <w:suff w:val="space"/>
+      <w:lvlText w:val="%1.%2.%3"/>
+      <w:lvlJc w:val="left"/>
+      <w:pPr>
+        <w:ind w:left="0" w:firstLine="0"/>
+      </w:pPr>
+      <w:rPr>
+        <w:b/>
+      </w:rPr>
+    </w:lvl>
+    <w:lvl w:ilvl="3">
+      <w:start w:val="1"/>
+      <w:numFmt w:val="decimal"/>
+      <w:lvlText w:val="(%4)"/>
+      <w:lvlJc w:val="left"/>
+      <w:pPr>
+        <w:ind w:left="1440" w:hanging="360"/>
+      </w:pPr>
+    </w:lvl>
+    <w:lvl w:ilvl="4">
+      <w:start w:val="1"/>
+      <w:numFmt w:val="lowerLetter"/>
+      <w:lvlText w:val="(%5)"/>
+      <w:lvlJc w:val="left"/>
+      <w:pPr>
+        <w:ind w:left="1800" w:hanging="360"/>
+      </w:pPr>
+    </w:lvl>
+    <w:lvl w:ilvl="5">
+      <w:start w:val="1"/>
+      <w:numFmt w:val="lowerRoman"/>
+      <w:lvlText w:val="(%6)"/>
+      <w:lvlJc w:val="left"/>
+      <w:pPr>
+        <w:ind w:left="2160" w:hanging="360"/>
+      </w:pPr>
+    </w:lvl>
+    <w:lvl w:ilvl="6">
+      <w:start w:val="1"/>
+      <w:numFmt w:val="decimal"/>
+      <w:lvlText w:val="%7."/>
+      <w:lvlJc w:val="left"/>
+      <w:pPr>
+        <w:ind w:left="2520" w:hanging="360"/>
+      </w:pPr>
+    </w:lvl>
+    <w:lvl w:ilvl="7">
+      <w:start w:val="1"/>
+      <w:numFmt w:val="lowerLetter"/>
+      <w:lvlText w:val="%8."/>
+      <w:lvlJc w:val="left"/>
+      <w:pPr>
+        <w:ind w:left="2880" w:hanging="360"/>
+      </w:pPr>
+    </w:lvl>
+    <w:lvl w:ilvl="8">
+      <w:start w:val="1"/>
+      <w:numFmt w:val="lowerRoman"/>
+      <w:lvlText w:val="%9."/>
+      <w:lvlJc w:val="left"/>
+      <w:pPr>
+        <w:ind w:left="3240" w:hanging="360"/>
+      </w:pPr>
+    </w:lvl>
+  </w:abstractNum>
   <w:num w:numId="1" w16cid:durableId="822158145">
     <w:abstractNumId w:val="1"/>
   </w:num>
   <w:num w:numId="2" w16cid:durableId="2114588318">
     <w:abstractNumId w:val="0"/>
+  </w:num>
+  <w:num w:numId="3" w16cid:durableId="1996765505">
+    <w:abstractNumId w:val="2"/>
   </w:num>
 </w:numbering>
 </file>
@@ -9208,11 +9408,14 @@
     <w:link w:val="Heading1Char"/>
     <w:uiPriority w:val="9"/>
     <w:qFormat/>
-    <w:rsid w:val="00CA2E77"/>
+    <w:rsid w:val="007318F9"/>
     <w:pPr>
       <w:keepNext/>
       <w:keepLines/>
       <w:pageBreakBefore/>
+      <w:numPr>
+        <w:numId w:val="3"/>
+      </w:numPr>
       <w:spacing w:before="360" w:after="120" w:line="240" w:lineRule="auto"/>
       <w:outlineLvl w:val="0"/>
     </w:pPr>
@@ -9233,10 +9436,14 @@
     <w:semiHidden/>
     <w:unhideWhenUsed/>
     <w:qFormat/>
-    <w:rsid w:val="00CA2E77"/>
+    <w:rsid w:val="007318F9"/>
     <w:pPr>
       <w:keepNext/>
       <w:keepLines/>
+      <w:numPr>
+        <w:ilvl w:val="1"/>
+        <w:numId w:val="3"/>
+      </w:numPr>
       <w:spacing w:before="360" w:after="120" w:line="240" w:lineRule="auto"/>
       <w:outlineLvl w:val="1"/>
     </w:pPr>
@@ -9257,10 +9464,14 @@
     <w:semiHidden/>
     <w:unhideWhenUsed/>
     <w:qFormat/>
-    <w:rsid w:val="00CA2E77"/>
+    <w:rsid w:val="007318F9"/>
     <w:pPr>
       <w:keepNext/>
       <w:keepLines/>
+      <w:numPr>
+        <w:ilvl w:val="2"/>
+        <w:numId w:val="3"/>
+      </w:numPr>
       <w:spacing w:before="360" w:after="120" w:line="240" w:lineRule="auto"/>
       <w:outlineLvl w:val="2"/>
     </w:pPr>

</xml_diff>

<commit_message>
Keep TOC title out of the table of contents
Co-Authored-By: Claude Opus 5.5 <noreply@anthropic.com>
</commit_message>
<xml_diff>
--- a/report/assignment-1/Assignment-1-Report.docx
+++ b/report/assignment-1/Assignment-1-Report.docx
@@ -38,7 +38,7 @@
             <o:lock v:ext="edit" aspectratio="t"/>
           </v:shapetype>
           <v:shape id="Image1" o:spid="_x0000_s2051" type="#_x0000_t75" style="position:absolute;left:0;text-align:left;margin-left:148.05pt;margin-top:-35.8pt;width:117pt;height:117pt;z-index:251660288;visibility:visible;mso-wrap-style:square;mso-wrap-distance-left:9.05pt;mso-wrap-distance-top:0;mso-wrap-distance-right:9.05pt;mso-wrap-distance-bottom:0;mso-position-horizontal:absolute;mso-position-horizontal-relative:text;mso-position-vertical:absolute;mso-position-vertical-relative:text">
-            <v:imagedata r:id="rId7" o:title="" croptop="-3f" cropbottom="-3f" cropleft="-2131f" cropright="-3f"/>
+            <v:imagedata r:id="rId8" o:title="" croptop="-3f" cropbottom="-3f" cropleft="-2131f" cropright="-3f"/>
           </v:shape>
         </w:pict>
       </w:r>
@@ -49,7 +49,7 @@
         </w:rPr>
         <w:pict w14:anchorId="2E9FE4B3">
           <v:shape id="APU Logo Final" o:spid="_x0000_s2052" type="#_x0000_t75" style="position:absolute;left:0;text-align:left;margin-left:0;margin-top:-40.8pt;width:133.55pt;height:133.55pt;z-index:251661312;visibility:visible;mso-wrap-style:square;mso-wrap-distance-left:9.05pt;mso-wrap-distance-top:0;mso-wrap-distance-right:9.05pt;mso-wrap-distance-bottom:0;mso-position-horizontal:center;mso-position-horizontal-relative:text;mso-position-vertical:absolute;mso-position-vertical-relative:text">
-            <v:imagedata r:id="rId8" o:title="" croptop="-2f" cropbottom="-2f" cropleft="-2f" cropright="-2f"/>
+            <v:imagedata r:id="rId9" o:title="" croptop="-2f" cropbottom="-2f" cropleft="-2f" cropright="-2f"/>
           </v:shape>
         </w:pict>
       </w:r>
@@ -627,7 +627,7 @@
           <w:sz w:val="2"/>
         </w:rPr>
         <w:sectPr>
-          <w:footerReference w:type="default" r:id="rId9"/>
+          <w:footerReference w:type="default" r:id="rId10"/>
           <w:pgSz w:w="11906" w:h="16838"/>
           <w:pgMar w:top="1440" w:right="1440" w:bottom="1440" w:left="1440" w:header="708" w:footer="708" w:gutter="0"/>
           <w:cols w:space="708"/>
@@ -637,24 +637,34 @@
     </w:p>
     <w:p>
       <w:pPr>
-        <w:pStyle w:val="Heading1"/>
-        <w:numPr>
-          <w:ilvl w:val="0"/>
-          <w:numId w:val="0"/>
-        </w:numPr>
-      </w:pPr>
-      <w:bookmarkStart w:id="1" w:name="_Toc244220671"/>
-      <w:r>
+        <w:spacing w:after="240" w:line="240" w:lineRule="auto"/>
+        <w:rPr>
+          <w:b/>
+          <w:sz w:val="32"/>
+        </w:rPr>
+      </w:pPr>
+      <w:r>
+        <w:rPr>
+          <w:b/>
+          <w:sz w:val="32"/>
+        </w:rPr>
         <w:lastRenderedPageBreak/>
         <w:t xml:space="preserve">Table </w:t>
       </w:r>
       <w:r>
+        <w:rPr>
+          <w:b/>
+          <w:sz w:val="32"/>
+        </w:rPr>
         <w:t>o</w:t>
       </w:r>
       <w:r>
+        <w:rPr>
+          <w:b/>
+          <w:sz w:val="32"/>
+        </w:rPr>
         <w:t>f Contents</w:t>
       </w:r>
-      <w:bookmarkEnd w:id="1"/>
     </w:p>
     <w:p>
       <w:pPr>
@@ -681,7 +691,7 @@
         <w:rPr>
           <w:noProof/>
         </w:rPr>
-        <w:t>Table of Contents</w:t>
+        <w:t>Executive Summary</w:t>
       </w:r>
       <w:r>
         <w:rPr>
@@ -699,7 +709,7 @@
         <w:rPr>
           <w:noProof/>
         </w:rPr>
-        <w:instrText xml:space="preserve"> PAGEREF _Toc244220671 \h </w:instrText>
+        <w:instrText xml:space="preserve"> PAGEREF _Toc244220706 \h </w:instrText>
       </w:r>
       <w:r>
         <w:rPr>
@@ -716,7 +726,7 @@
         <w:rPr>
           <w:noProof/>
         </w:rPr>
-        <w:t>i</w:t>
+        <w:t>1</w:t>
       </w:r>
       <w:r>
         <w:rPr>
@@ -741,7 +751,7 @@
         <w:rPr>
           <w:noProof/>
         </w:rPr>
-        <w:t>Executive Summary</w:t>
+        <w:t>1.0 Introduction</w:t>
       </w:r>
       <w:r>
         <w:rPr>
@@ -759,7 +769,7 @@
         <w:rPr>
           <w:noProof/>
         </w:rPr>
-        <w:instrText xml:space="preserve"> PAGEREF _Toc244220672 \h </w:instrText>
+        <w:instrText xml:space="preserve"> PAGEREF _Toc244220707 \h </w:instrText>
       </w:r>
       <w:r>
         <w:rPr>
@@ -776,7 +786,302 @@
         <w:rPr>
           <w:noProof/>
         </w:rPr>
-        <w:t>1</w:t>
+        <w:t>2</w:t>
+      </w:r>
+      <w:r>
+        <w:rPr>
+          <w:noProof/>
+        </w:rPr>
+        <w:fldChar w:fldCharType="end"/>
+      </w:r>
+    </w:p>
+    <w:p>
+      <w:pPr>
+        <w:pStyle w:val="TOC2"/>
+        <w:tabs>
+          <w:tab w:val="right" w:leader="dot" w:pos="9016"/>
+        </w:tabs>
+        <w:rPr>
+          <w:rFonts w:asciiTheme="minorHAnsi" w:hAnsiTheme="minorHAnsi" w:cstheme="minorBidi"/>
+          <w:noProof/>
+        </w:rPr>
+      </w:pPr>
+      <w:r>
+        <w:rPr>
+          <w:noProof/>
+        </w:rPr>
+        <w:t>1.1 Background and Purpose</w:t>
+      </w:r>
+      <w:r>
+        <w:rPr>
+          <w:noProof/>
+        </w:rPr>
+        <w:tab/>
+      </w:r>
+      <w:r>
+        <w:rPr>
+          <w:noProof/>
+        </w:rPr>
+        <w:fldChar w:fldCharType="begin"/>
+      </w:r>
+      <w:r>
+        <w:rPr>
+          <w:noProof/>
+        </w:rPr>
+        <w:instrText xml:space="preserve"> PAGEREF _Toc244220708 \h </w:instrText>
+      </w:r>
+      <w:r>
+        <w:rPr>
+          <w:noProof/>
+        </w:rPr>
+      </w:r>
+      <w:r>
+        <w:rPr>
+          <w:noProof/>
+        </w:rPr>
+        <w:fldChar w:fldCharType="separate"/>
+      </w:r>
+      <w:r>
+        <w:rPr>
+          <w:noProof/>
+        </w:rPr>
+        <w:t>2</w:t>
+      </w:r>
+      <w:r>
+        <w:rPr>
+          <w:noProof/>
+        </w:rPr>
+        <w:fldChar w:fldCharType="end"/>
+      </w:r>
+    </w:p>
+    <w:p>
+      <w:pPr>
+        <w:pStyle w:val="TOC2"/>
+        <w:tabs>
+          <w:tab w:val="right" w:leader="dot" w:pos="9016"/>
+        </w:tabs>
+        <w:rPr>
+          <w:rFonts w:asciiTheme="minorHAnsi" w:hAnsiTheme="minorHAnsi" w:cstheme="minorBidi"/>
+          <w:noProof/>
+        </w:rPr>
+      </w:pPr>
+      <w:r>
+        <w:rPr>
+          <w:noProof/>
+        </w:rPr>
+        <w:t>1.2 What Is Actual Budget</w:t>
+      </w:r>
+      <w:r>
+        <w:rPr>
+          <w:noProof/>
+        </w:rPr>
+        <w:tab/>
+      </w:r>
+      <w:r>
+        <w:rPr>
+          <w:noProof/>
+        </w:rPr>
+        <w:fldChar w:fldCharType="begin"/>
+      </w:r>
+      <w:r>
+        <w:rPr>
+          <w:noProof/>
+        </w:rPr>
+        <w:instrText xml:space="preserve"> PAGEREF _Toc244220709 \h </w:instrText>
+      </w:r>
+      <w:r>
+        <w:rPr>
+          <w:noProof/>
+        </w:rPr>
+      </w:r>
+      <w:r>
+        <w:rPr>
+          <w:noProof/>
+        </w:rPr>
+        <w:fldChar w:fldCharType="separate"/>
+      </w:r>
+      <w:r>
+        <w:rPr>
+          <w:noProof/>
+        </w:rPr>
+        <w:t>2</w:t>
+      </w:r>
+      <w:r>
+        <w:rPr>
+          <w:noProof/>
+        </w:rPr>
+        <w:fldChar w:fldCharType="end"/>
+      </w:r>
+    </w:p>
+    <w:p>
+      <w:pPr>
+        <w:pStyle w:val="TOC2"/>
+        <w:tabs>
+          <w:tab w:val="right" w:leader="dot" w:pos="9016"/>
+        </w:tabs>
+        <w:rPr>
+          <w:rFonts w:asciiTheme="minorHAnsi" w:hAnsiTheme="minorHAnsi" w:cstheme="minorBidi"/>
+          <w:noProof/>
+        </w:rPr>
+      </w:pPr>
+      <w:r>
+        <w:rPr>
+          <w:noProof/>
+        </w:rPr>
+        <w:t>1.3 Main Features and How It Works</w:t>
+      </w:r>
+      <w:r>
+        <w:rPr>
+          <w:noProof/>
+        </w:rPr>
+        <w:tab/>
+      </w:r>
+      <w:r>
+        <w:rPr>
+          <w:noProof/>
+        </w:rPr>
+        <w:fldChar w:fldCharType="begin"/>
+      </w:r>
+      <w:r>
+        <w:rPr>
+          <w:noProof/>
+        </w:rPr>
+        <w:instrText xml:space="preserve"> PAGEREF _Toc244220710 \h </w:instrText>
+      </w:r>
+      <w:r>
+        <w:rPr>
+          <w:noProof/>
+        </w:rPr>
+      </w:r>
+      <w:r>
+        <w:rPr>
+          <w:noProof/>
+        </w:rPr>
+        <w:fldChar w:fldCharType="separate"/>
+      </w:r>
+      <w:r>
+        <w:rPr>
+          <w:noProof/>
+        </w:rPr>
+        <w:t>2</w:t>
+      </w:r>
+      <w:r>
+        <w:rPr>
+          <w:noProof/>
+        </w:rPr>
+        <w:fldChar w:fldCharType="end"/>
+      </w:r>
+    </w:p>
+    <w:p>
+      <w:pPr>
+        <w:pStyle w:val="TOC2"/>
+        <w:tabs>
+          <w:tab w:val="right" w:leader="dot" w:pos="9016"/>
+        </w:tabs>
+        <w:rPr>
+          <w:rFonts w:asciiTheme="minorHAnsi" w:hAnsiTheme="minorHAnsi" w:cstheme="minorBidi"/>
+          <w:noProof/>
+        </w:rPr>
+      </w:pPr>
+      <w:r>
+        <w:rPr>
+          <w:noProof/>
+        </w:rPr>
+        <w:t>1.4 Who Is Involved</w:t>
+      </w:r>
+      <w:r>
+        <w:rPr>
+          <w:noProof/>
+        </w:rPr>
+        <w:tab/>
+      </w:r>
+      <w:r>
+        <w:rPr>
+          <w:noProof/>
+        </w:rPr>
+        <w:fldChar w:fldCharType="begin"/>
+      </w:r>
+      <w:r>
+        <w:rPr>
+          <w:noProof/>
+        </w:rPr>
+        <w:instrText xml:space="preserve"> PAGEREF _Toc244220711 \h </w:instrText>
+      </w:r>
+      <w:r>
+        <w:rPr>
+          <w:noProof/>
+        </w:rPr>
+      </w:r>
+      <w:r>
+        <w:rPr>
+          <w:noProof/>
+        </w:rPr>
+        <w:fldChar w:fldCharType="separate"/>
+      </w:r>
+      <w:r>
+        <w:rPr>
+          <w:noProof/>
+        </w:rPr>
+        <w:t>3</w:t>
+      </w:r>
+      <w:r>
+        <w:rPr>
+          <w:noProof/>
+        </w:rPr>
+        <w:fldChar w:fldCharType="end"/>
+      </w:r>
+    </w:p>
+    <w:p>
+      <w:pPr>
+        <w:pStyle w:val="TOC2"/>
+        <w:tabs>
+          <w:tab w:val="right" w:leader="dot" w:pos="9016"/>
+        </w:tabs>
+        <w:rPr>
+          <w:rFonts w:asciiTheme="minorHAnsi" w:hAnsiTheme="minorHAnsi" w:cstheme="minorBidi"/>
+          <w:noProof/>
+        </w:rPr>
+      </w:pPr>
+      <w:r>
+        <w:rPr>
+          <w:noProof/>
+        </w:rPr>
+        <w:t>1.5 Main Challenges</w:t>
+      </w:r>
+      <w:r>
+        <w:rPr>
+          <w:noProof/>
+        </w:rPr>
+        <w:tab/>
+      </w:r>
+      <w:r>
+        <w:rPr>
+          <w:noProof/>
+        </w:rPr>
+        <w:fldChar w:fldCharType="begin"/>
+      </w:r>
+      <w:r>
+        <w:rPr>
+          <w:noProof/>
+        </w:rPr>
+        <w:instrText xml:space="preserve"> PAGEREF _Toc244220712 \h </w:instrText>
+      </w:r>
+      <w:r>
+        <w:rPr>
+          <w:noProof/>
+        </w:rPr>
+      </w:r>
+      <w:r>
+        <w:rPr>
+          <w:noProof/>
+        </w:rPr>
+        <w:fldChar w:fldCharType="separate"/>
+      </w:r>
+      <w:r>
+        <w:rPr>
+          <w:noProof/>
+        </w:rPr>
+        <w:t>3</w:t>
       </w:r>
       <w:r>
         <w:rPr>
@@ -801,7 +1106,7 @@
         <w:rPr>
           <w:noProof/>
         </w:rPr>
-        <w:t>1.0 Introduction</w:t>
+        <w:t>2.0 Software Development Methodology</w:t>
       </w:r>
       <w:r>
         <w:rPr>
@@ -819,7 +1124,7 @@
         <w:rPr>
           <w:noProof/>
         </w:rPr>
-        <w:instrText xml:space="preserve"> PAGEREF _Toc244220673 \h </w:instrText>
+        <w:instrText xml:space="preserve"> PAGEREF _Toc244220713 \h </w:instrText>
       </w:r>
       <w:r>
         <w:rPr>
@@ -836,7 +1141,7 @@
         <w:rPr>
           <w:noProof/>
         </w:rPr>
-        <w:t>2</w:t>
+        <w:t>4</w:t>
       </w:r>
       <w:r>
         <w:rPr>
@@ -860,7 +1165,7 @@
         <w:rPr>
           <w:noProof/>
         </w:rPr>
-        <w:t>1.1 Background and Purpose</w:t>
+        <w:t>2.1 Current Development Process of Actual</w:t>
       </w:r>
       <w:r>
         <w:rPr>
@@ -878,7 +1183,7 @@
         <w:rPr>
           <w:noProof/>
         </w:rPr>
-        <w:instrText xml:space="preserve"> PAGEREF _Toc244220674 \h </w:instrText>
+        <w:instrText xml:space="preserve"> PAGEREF _Toc244220714 \h </w:instrText>
       </w:r>
       <w:r>
         <w:rPr>
@@ -895,7 +1200,7 @@
         <w:rPr>
           <w:noProof/>
         </w:rPr>
-        <w:t>2</w:t>
+        <w:t>4</w:t>
       </w:r>
       <w:r>
         <w:rPr>
@@ -919,7 +1224,7 @@
         <w:rPr>
           <w:noProof/>
         </w:rPr>
-        <w:t>1.2 What Is Actual Budget</w:t>
+        <w:t>2.2 Why Kanban Fits Actual</w:t>
       </w:r>
       <w:r>
         <w:rPr>
@@ -937,7 +1242,7 @@
         <w:rPr>
           <w:noProof/>
         </w:rPr>
-        <w:instrText xml:space="preserve"> PAGEREF _Toc244220675 \h </w:instrText>
+        <w:instrText xml:space="preserve"> PAGEREF _Toc244220715 \h </w:instrText>
       </w:r>
       <w:r>
         <w:rPr>
@@ -954,7 +1259,7 @@
         <w:rPr>
           <w:noProof/>
         </w:rPr>
-        <w:t>2</w:t>
+        <w:t>5</w:t>
       </w:r>
       <w:r>
         <w:rPr>
@@ -978,7 +1283,7 @@
         <w:rPr>
           <w:noProof/>
         </w:rPr>
-        <w:t>1.3 Main Features and How It Works</w:t>
+        <w:t>2.3 Applying Kanban to Actual</w:t>
       </w:r>
       <w:r>
         <w:rPr>
@@ -996,7 +1301,7 @@
         <w:rPr>
           <w:noProof/>
         </w:rPr>
-        <w:instrText xml:space="preserve"> PAGEREF _Toc244220676 \h </w:instrText>
+        <w:instrText xml:space="preserve"> PAGEREF _Toc244220716 \h </w:instrText>
       </w:r>
       <w:r>
         <w:rPr>
@@ -1013,7 +1318,7 @@
         <w:rPr>
           <w:noProof/>
         </w:rPr>
-        <w:t>2</w:t>
+        <w:t>6</w:t>
       </w:r>
       <w:r>
         <w:rPr>
@@ -1037,7 +1342,7 @@
         <w:rPr>
           <w:noProof/>
         </w:rPr>
-        <w:t>1.4 Who Is Involved</w:t>
+        <w:t>2.4 Critical Evaluation</w:t>
       </w:r>
       <w:r>
         <w:rPr>
@@ -1055,7 +1360,7 @@
         <w:rPr>
           <w:noProof/>
         </w:rPr>
-        <w:instrText xml:space="preserve"> PAGEREF _Toc244220677 \h </w:instrText>
+        <w:instrText xml:space="preserve"> PAGEREF _Toc244220717 \h </w:instrText>
       </w:r>
       <w:r>
         <w:rPr>
@@ -1072,7 +1377,67 @@
         <w:rPr>
           <w:noProof/>
         </w:rPr>
-        <w:t>3</w:t>
+        <w:t>7</w:t>
+      </w:r>
+      <w:r>
+        <w:rPr>
+          <w:noProof/>
+        </w:rPr>
+        <w:fldChar w:fldCharType="end"/>
+      </w:r>
+    </w:p>
+    <w:p>
+      <w:pPr>
+        <w:pStyle w:val="TOC1"/>
+        <w:tabs>
+          <w:tab w:val="right" w:leader="dot" w:pos="9016"/>
+        </w:tabs>
+        <w:rPr>
+          <w:rFonts w:asciiTheme="minorHAnsi" w:hAnsiTheme="minorHAnsi" w:cstheme="minorBidi"/>
+          <w:b w:val="0"/>
+          <w:noProof/>
+        </w:rPr>
+      </w:pPr>
+      <w:r>
+        <w:rPr>
+          <w:noProof/>
+        </w:rPr>
+        <w:t>3.0 Quality Assurance Process</w:t>
+      </w:r>
+      <w:r>
+        <w:rPr>
+          <w:noProof/>
+        </w:rPr>
+        <w:tab/>
+      </w:r>
+      <w:r>
+        <w:rPr>
+          <w:noProof/>
+        </w:rPr>
+        <w:fldChar w:fldCharType="begin"/>
+      </w:r>
+      <w:r>
+        <w:rPr>
+          <w:noProof/>
+        </w:rPr>
+        <w:instrText xml:space="preserve"> PAGEREF _Toc244220718 \h </w:instrText>
+      </w:r>
+      <w:r>
+        <w:rPr>
+          <w:noProof/>
+        </w:rPr>
+      </w:r>
+      <w:r>
+        <w:rPr>
+          <w:noProof/>
+        </w:rPr>
+        <w:fldChar w:fldCharType="separate"/>
+      </w:r>
+      <w:r>
+        <w:rPr>
+          <w:noProof/>
+        </w:rPr>
+        <w:t>9</w:t>
       </w:r>
       <w:r>
         <w:rPr>
@@ -1096,7 +1461,7 @@
         <w:rPr>
           <w:noProof/>
         </w:rPr>
-        <w:t>1.5 Main Challenges</w:t>
+        <w:t>3.1 What Quality Means for Actual</w:t>
       </w:r>
       <w:r>
         <w:rPr>
@@ -1114,7 +1479,7 @@
         <w:rPr>
           <w:noProof/>
         </w:rPr>
-        <w:instrText xml:space="preserve"> PAGEREF _Toc244220678 \h </w:instrText>
+        <w:instrText xml:space="preserve"> PAGEREF _Toc244220719 \h </w:instrText>
       </w:r>
       <w:r>
         <w:rPr>
@@ -1131,7 +1496,302 @@
         <w:rPr>
           <w:noProof/>
         </w:rPr>
-        <w:t>3</w:t>
+        <w:t>9</w:t>
+      </w:r>
+      <w:r>
+        <w:rPr>
+          <w:noProof/>
+        </w:rPr>
+        <w:fldChar w:fldCharType="end"/>
+      </w:r>
+    </w:p>
+    <w:p>
+      <w:pPr>
+        <w:pStyle w:val="TOC2"/>
+        <w:tabs>
+          <w:tab w:val="right" w:leader="dot" w:pos="9016"/>
+        </w:tabs>
+        <w:rPr>
+          <w:rFonts w:asciiTheme="minorHAnsi" w:hAnsiTheme="minorHAnsi" w:cstheme="minorBidi"/>
+          <w:noProof/>
+        </w:rPr>
+      </w:pPr>
+      <w:r>
+        <w:rPr>
+          <w:noProof/>
+        </w:rPr>
+        <w:t>3.2 Key Quality Attributes</w:t>
+      </w:r>
+      <w:r>
+        <w:rPr>
+          <w:noProof/>
+        </w:rPr>
+        <w:tab/>
+      </w:r>
+      <w:r>
+        <w:rPr>
+          <w:noProof/>
+        </w:rPr>
+        <w:fldChar w:fldCharType="begin"/>
+      </w:r>
+      <w:r>
+        <w:rPr>
+          <w:noProof/>
+        </w:rPr>
+        <w:instrText xml:space="preserve"> PAGEREF _Toc244220720 \h </w:instrText>
+      </w:r>
+      <w:r>
+        <w:rPr>
+          <w:noProof/>
+        </w:rPr>
+      </w:r>
+      <w:r>
+        <w:rPr>
+          <w:noProof/>
+        </w:rPr>
+        <w:fldChar w:fldCharType="separate"/>
+      </w:r>
+      <w:r>
+        <w:rPr>
+          <w:noProof/>
+        </w:rPr>
+        <w:t>9</w:t>
+      </w:r>
+      <w:r>
+        <w:rPr>
+          <w:noProof/>
+        </w:rPr>
+        <w:fldChar w:fldCharType="end"/>
+      </w:r>
+    </w:p>
+    <w:p>
+      <w:pPr>
+        <w:pStyle w:val="TOC2"/>
+        <w:tabs>
+          <w:tab w:val="right" w:leader="dot" w:pos="9016"/>
+        </w:tabs>
+        <w:rPr>
+          <w:rFonts w:asciiTheme="minorHAnsi" w:hAnsiTheme="minorHAnsi" w:cstheme="minorBidi"/>
+          <w:noProof/>
+        </w:rPr>
+      </w:pPr>
+      <w:r>
+        <w:rPr>
+          <w:noProof/>
+        </w:rPr>
+        <w:t>3.3 Current QA Practices and Gaps</w:t>
+      </w:r>
+      <w:r>
+        <w:rPr>
+          <w:noProof/>
+        </w:rPr>
+        <w:tab/>
+      </w:r>
+      <w:r>
+        <w:rPr>
+          <w:noProof/>
+        </w:rPr>
+        <w:fldChar w:fldCharType="begin"/>
+      </w:r>
+      <w:r>
+        <w:rPr>
+          <w:noProof/>
+        </w:rPr>
+        <w:instrText xml:space="preserve"> PAGEREF _Toc244220721 \h </w:instrText>
+      </w:r>
+      <w:r>
+        <w:rPr>
+          <w:noProof/>
+        </w:rPr>
+      </w:r>
+      <w:r>
+        <w:rPr>
+          <w:noProof/>
+        </w:rPr>
+        <w:fldChar w:fldCharType="separate"/>
+      </w:r>
+      <w:r>
+        <w:rPr>
+          <w:noProof/>
+        </w:rPr>
+        <w:t>10</w:t>
+      </w:r>
+      <w:r>
+        <w:rPr>
+          <w:noProof/>
+        </w:rPr>
+        <w:fldChar w:fldCharType="end"/>
+      </w:r>
+    </w:p>
+    <w:p>
+      <w:pPr>
+        <w:pStyle w:val="TOC2"/>
+        <w:tabs>
+          <w:tab w:val="right" w:leader="dot" w:pos="9016"/>
+        </w:tabs>
+        <w:rPr>
+          <w:rFonts w:asciiTheme="minorHAnsi" w:hAnsiTheme="minorHAnsi" w:cstheme="minorBidi"/>
+          <w:noProof/>
+        </w:rPr>
+      </w:pPr>
+      <w:r>
+        <w:rPr>
+          <w:noProof/>
+        </w:rPr>
+        <w:t>3.4 Selected Standards and Practices</w:t>
+      </w:r>
+      <w:r>
+        <w:rPr>
+          <w:noProof/>
+        </w:rPr>
+        <w:tab/>
+      </w:r>
+      <w:r>
+        <w:rPr>
+          <w:noProof/>
+        </w:rPr>
+        <w:fldChar w:fldCharType="begin"/>
+      </w:r>
+      <w:r>
+        <w:rPr>
+          <w:noProof/>
+        </w:rPr>
+        <w:instrText xml:space="preserve"> PAGEREF _Toc244220722 \h </w:instrText>
+      </w:r>
+      <w:r>
+        <w:rPr>
+          <w:noProof/>
+        </w:rPr>
+      </w:r>
+      <w:r>
+        <w:rPr>
+          <w:noProof/>
+        </w:rPr>
+        <w:fldChar w:fldCharType="separate"/>
+      </w:r>
+      <w:r>
+        <w:rPr>
+          <w:noProof/>
+        </w:rPr>
+        <w:t>10</w:t>
+      </w:r>
+      <w:r>
+        <w:rPr>
+          <w:noProof/>
+        </w:rPr>
+        <w:fldChar w:fldCharType="end"/>
+      </w:r>
+    </w:p>
+    <w:p>
+      <w:pPr>
+        <w:pStyle w:val="TOC2"/>
+        <w:tabs>
+          <w:tab w:val="right" w:leader="dot" w:pos="9016"/>
+        </w:tabs>
+        <w:rPr>
+          <w:rFonts w:asciiTheme="minorHAnsi" w:hAnsiTheme="minorHAnsi" w:cstheme="minorBidi"/>
+          <w:noProof/>
+        </w:rPr>
+      </w:pPr>
+      <w:r>
+        <w:rPr>
+          <w:noProof/>
+        </w:rPr>
+        <w:t>3.5 Applying the QA Process within Kanban</w:t>
+      </w:r>
+      <w:r>
+        <w:rPr>
+          <w:noProof/>
+        </w:rPr>
+        <w:tab/>
+      </w:r>
+      <w:r>
+        <w:rPr>
+          <w:noProof/>
+        </w:rPr>
+        <w:fldChar w:fldCharType="begin"/>
+      </w:r>
+      <w:r>
+        <w:rPr>
+          <w:noProof/>
+        </w:rPr>
+        <w:instrText xml:space="preserve"> PAGEREF _Toc244220723 \h </w:instrText>
+      </w:r>
+      <w:r>
+        <w:rPr>
+          <w:noProof/>
+        </w:rPr>
+      </w:r>
+      <w:r>
+        <w:rPr>
+          <w:noProof/>
+        </w:rPr>
+        <w:fldChar w:fldCharType="separate"/>
+      </w:r>
+      <w:r>
+        <w:rPr>
+          <w:noProof/>
+        </w:rPr>
+        <w:t>11</w:t>
+      </w:r>
+      <w:r>
+        <w:rPr>
+          <w:noProof/>
+        </w:rPr>
+        <w:fldChar w:fldCharType="end"/>
+      </w:r>
+    </w:p>
+    <w:p>
+      <w:pPr>
+        <w:pStyle w:val="TOC2"/>
+        <w:tabs>
+          <w:tab w:val="right" w:leader="dot" w:pos="9016"/>
+        </w:tabs>
+        <w:rPr>
+          <w:rFonts w:asciiTheme="minorHAnsi" w:hAnsiTheme="minorHAnsi" w:cstheme="minorBidi"/>
+          <w:noProof/>
+        </w:rPr>
+      </w:pPr>
+      <w:r>
+        <w:rPr>
+          <w:noProof/>
+        </w:rPr>
+        <w:t>3.6 Critical Evaluation</w:t>
+      </w:r>
+      <w:r>
+        <w:rPr>
+          <w:noProof/>
+        </w:rPr>
+        <w:tab/>
+      </w:r>
+      <w:r>
+        <w:rPr>
+          <w:noProof/>
+        </w:rPr>
+        <w:fldChar w:fldCharType="begin"/>
+      </w:r>
+      <w:r>
+        <w:rPr>
+          <w:noProof/>
+        </w:rPr>
+        <w:instrText xml:space="preserve"> PAGEREF _Toc244220724 \h </w:instrText>
+      </w:r>
+      <w:r>
+        <w:rPr>
+          <w:noProof/>
+        </w:rPr>
+      </w:r>
+      <w:r>
+        <w:rPr>
+          <w:noProof/>
+        </w:rPr>
+        <w:fldChar w:fldCharType="separate"/>
+      </w:r>
+      <w:r>
+        <w:rPr>
+          <w:noProof/>
+        </w:rPr>
+        <w:t>12</w:t>
       </w:r>
       <w:r>
         <w:rPr>
@@ -1156,7 +1816,7 @@
         <w:rPr>
           <w:noProof/>
         </w:rPr>
-        <w:t>2.0 Software Development Methodology</w:t>
+        <w:t>4.0 Integrating IV&amp;V with Kanban</w:t>
       </w:r>
       <w:r>
         <w:rPr>
@@ -1174,7 +1834,7 @@
         <w:rPr>
           <w:noProof/>
         </w:rPr>
-        <w:instrText xml:space="preserve"> PAGEREF _Toc244220679 \h </w:instrText>
+        <w:instrText xml:space="preserve"> PAGEREF _Toc244220725 \h </w:instrText>
       </w:r>
       <w:r>
         <w:rPr>
@@ -1191,7 +1851,7 @@
         <w:rPr>
           <w:noProof/>
         </w:rPr>
-        <w:t>4</w:t>
+        <w:t>13</w:t>
       </w:r>
       <w:r>
         <w:rPr>
@@ -1215,7 +1875,7 @@
         <w:rPr>
           <w:noProof/>
         </w:rPr>
-        <w:t>2.1 Current Development Process of Actual</w:t>
+        <w:t>4.1 Current V&amp;V in Actual and Its Independence</w:t>
       </w:r>
       <w:r>
         <w:rPr>
@@ -1233,7 +1893,7 @@
         <w:rPr>
           <w:noProof/>
         </w:rPr>
-        <w:instrText xml:space="preserve"> PAGEREF _Toc244220680 \h </w:instrText>
+        <w:instrText xml:space="preserve"> PAGEREF _Toc244220726 \h </w:instrText>
       </w:r>
       <w:r>
         <w:rPr>
@@ -1250,7 +1910,7 @@
         <w:rPr>
           <w:noProof/>
         </w:rPr>
-        <w:t>4</w:t>
+        <w:t>13</w:t>
       </w:r>
       <w:r>
         <w:rPr>
@@ -1274,7 +1934,7 @@
         <w:rPr>
           <w:noProof/>
         </w:rPr>
-        <w:t>2.2 Why Kanban Fits Actual</w:t>
+        <w:t>4.2 IV&amp;V Integration Model for Kanban</w:t>
       </w:r>
       <w:r>
         <w:rPr>
@@ -1292,7 +1952,7 @@
         <w:rPr>
           <w:noProof/>
         </w:rPr>
-        <w:instrText xml:space="preserve"> PAGEREF _Toc244220681 \h </w:instrText>
+        <w:instrText xml:space="preserve"> PAGEREF _Toc244220727 \h </w:instrText>
       </w:r>
       <w:r>
         <w:rPr>
@@ -1309,7 +1969,7 @@
         <w:rPr>
           <w:noProof/>
         </w:rPr>
-        <w:t>5</w:t>
+        <w:t>14</w:t>
       </w:r>
       <w:r>
         <w:rPr>
@@ -1333,7 +1993,7 @@
         <w:rPr>
           <w:noProof/>
         </w:rPr>
-        <w:t>2.3 Applying Kanban to Actual</w:t>
+        <w:t>4.3 How the Integration Meets the Three Goals</w:t>
       </w:r>
       <w:r>
         <w:rPr>
@@ -1351,7 +2011,7 @@
         <w:rPr>
           <w:noProof/>
         </w:rPr>
-        <w:instrText xml:space="preserve"> PAGEREF _Toc244220682 \h </w:instrText>
+        <w:instrText xml:space="preserve"> PAGEREF _Toc244220728 \h </w:instrText>
       </w:r>
       <w:r>
         <w:rPr>
@@ -1368,7 +2028,127 @@
         <w:rPr>
           <w:noProof/>
         </w:rPr>
-        <w:t>6</w:t>
+        <w:t>15</w:t>
+      </w:r>
+      <w:r>
+        <w:rPr>
+          <w:noProof/>
+        </w:rPr>
+        <w:fldChar w:fldCharType="end"/>
+      </w:r>
+    </w:p>
+    <w:p>
+      <w:pPr>
+        <w:pStyle w:val="TOC1"/>
+        <w:tabs>
+          <w:tab w:val="right" w:leader="dot" w:pos="9016"/>
+        </w:tabs>
+        <w:rPr>
+          <w:rFonts w:asciiTheme="minorHAnsi" w:hAnsiTheme="minorHAnsi" w:cstheme="minorBidi"/>
+          <w:b w:val="0"/>
+          <w:noProof/>
+        </w:rPr>
+      </w:pPr>
+      <w:r>
+        <w:rPr>
+          <w:noProof/>
+        </w:rPr>
+        <w:t>References</w:t>
+      </w:r>
+      <w:r>
+        <w:rPr>
+          <w:noProof/>
+        </w:rPr>
+        <w:tab/>
+      </w:r>
+      <w:r>
+        <w:rPr>
+          <w:noProof/>
+        </w:rPr>
+        <w:fldChar w:fldCharType="begin"/>
+      </w:r>
+      <w:r>
+        <w:rPr>
+          <w:noProof/>
+        </w:rPr>
+        <w:instrText xml:space="preserve"> PAGEREF _Toc244220729 \h </w:instrText>
+      </w:r>
+      <w:r>
+        <w:rPr>
+          <w:noProof/>
+        </w:rPr>
+      </w:r>
+      <w:r>
+        <w:rPr>
+          <w:noProof/>
+        </w:rPr>
+        <w:fldChar w:fldCharType="separate"/>
+      </w:r>
+      <w:r>
+        <w:rPr>
+          <w:noProof/>
+        </w:rPr>
+        <w:t>17</w:t>
+      </w:r>
+      <w:r>
+        <w:rPr>
+          <w:noProof/>
+        </w:rPr>
+        <w:fldChar w:fldCharType="end"/>
+      </w:r>
+    </w:p>
+    <w:p>
+      <w:pPr>
+        <w:pStyle w:val="TOC1"/>
+        <w:tabs>
+          <w:tab w:val="right" w:leader="dot" w:pos="9016"/>
+        </w:tabs>
+        <w:rPr>
+          <w:rFonts w:asciiTheme="minorHAnsi" w:hAnsiTheme="minorHAnsi" w:cstheme="minorBidi"/>
+          <w:b w:val="0"/>
+          <w:noProof/>
+        </w:rPr>
+      </w:pPr>
+      <w:r>
+        <w:rPr>
+          <w:noProof/>
+        </w:rPr>
+        <w:t>Appendix A: Methodology Selection</w:t>
+      </w:r>
+      <w:r>
+        <w:rPr>
+          <w:noProof/>
+        </w:rPr>
+        <w:tab/>
+      </w:r>
+      <w:r>
+        <w:rPr>
+          <w:noProof/>
+        </w:rPr>
+        <w:fldChar w:fldCharType="begin"/>
+      </w:r>
+      <w:r>
+        <w:rPr>
+          <w:noProof/>
+        </w:rPr>
+        <w:instrText xml:space="preserve"> PAGEREF _Toc244220730 \h </w:instrText>
+      </w:r>
+      <w:r>
+        <w:rPr>
+          <w:noProof/>
+        </w:rPr>
+      </w:r>
+      <w:r>
+        <w:rPr>
+          <w:noProof/>
+        </w:rPr>
+        <w:fldChar w:fldCharType="separate"/>
+      </w:r>
+      <w:r>
+        <w:rPr>
+          <w:noProof/>
+        </w:rPr>
+        <w:t>20</w:t>
       </w:r>
       <w:r>
         <w:rPr>
@@ -1392,7 +2172,7 @@
         <w:rPr>
           <w:noProof/>
         </w:rPr>
-        <w:t>2.4 Critical Evaluation</w:t>
+        <w:t>A.1 Project Characteristics and Requirements</w:t>
       </w:r>
       <w:r>
         <w:rPr>
@@ -1410,7 +2190,7 @@
         <w:rPr>
           <w:noProof/>
         </w:rPr>
-        <w:instrText xml:space="preserve"> PAGEREF _Toc244220683 \h </w:instrText>
+        <w:instrText xml:space="preserve"> PAGEREF _Toc244220731 \h </w:instrText>
       </w:r>
       <w:r>
         <w:rPr>
@@ -1427,7 +2207,125 @@
         <w:rPr>
           <w:noProof/>
         </w:rPr>
-        <w:t>7</w:t>
+        <w:t>20</w:t>
+      </w:r>
+      <w:r>
+        <w:rPr>
+          <w:noProof/>
+        </w:rPr>
+        <w:fldChar w:fldCharType="end"/>
+      </w:r>
+    </w:p>
+    <w:p>
+      <w:pPr>
+        <w:pStyle w:val="TOC2"/>
+        <w:tabs>
+          <w:tab w:val="right" w:leader="dot" w:pos="9016"/>
+        </w:tabs>
+        <w:rPr>
+          <w:rFonts w:asciiTheme="minorHAnsi" w:hAnsiTheme="minorHAnsi" w:cstheme="minorBidi"/>
+          <w:noProof/>
+        </w:rPr>
+      </w:pPr>
+      <w:r>
+        <w:rPr>
+          <w:noProof/>
+        </w:rPr>
+        <w:t>A.2 Candidate Methodologies</w:t>
+      </w:r>
+      <w:r>
+        <w:rPr>
+          <w:noProof/>
+        </w:rPr>
+        <w:tab/>
+      </w:r>
+      <w:r>
+        <w:rPr>
+          <w:noProof/>
+        </w:rPr>
+        <w:fldChar w:fldCharType="begin"/>
+      </w:r>
+      <w:r>
+        <w:rPr>
+          <w:noProof/>
+        </w:rPr>
+        <w:instrText xml:space="preserve"> PAGEREF _Toc244220732 \h </w:instrText>
+      </w:r>
+      <w:r>
+        <w:rPr>
+          <w:noProof/>
+        </w:rPr>
+      </w:r>
+      <w:r>
+        <w:rPr>
+          <w:noProof/>
+        </w:rPr>
+        <w:fldChar w:fldCharType="separate"/>
+      </w:r>
+      <w:r>
+        <w:rPr>
+          <w:noProof/>
+        </w:rPr>
+        <w:t>21</w:t>
+      </w:r>
+      <w:r>
+        <w:rPr>
+          <w:noProof/>
+        </w:rPr>
+        <w:fldChar w:fldCharType="end"/>
+      </w:r>
+    </w:p>
+    <w:p>
+      <w:pPr>
+        <w:pStyle w:val="TOC2"/>
+        <w:tabs>
+          <w:tab w:val="right" w:leader="dot" w:pos="9016"/>
+        </w:tabs>
+        <w:rPr>
+          <w:rFonts w:asciiTheme="minorHAnsi" w:hAnsiTheme="minorHAnsi" w:cstheme="minorBidi"/>
+          <w:noProof/>
+        </w:rPr>
+      </w:pPr>
+      <w:r>
+        <w:rPr>
+          <w:noProof/>
+        </w:rPr>
+        <w:t>A.3 Evaluation and Selection</w:t>
+      </w:r>
+      <w:r>
+        <w:rPr>
+          <w:noProof/>
+        </w:rPr>
+        <w:tab/>
+      </w:r>
+      <w:r>
+        <w:rPr>
+          <w:noProof/>
+        </w:rPr>
+        <w:fldChar w:fldCharType="begin"/>
+      </w:r>
+      <w:r>
+        <w:rPr>
+          <w:noProof/>
+        </w:rPr>
+        <w:instrText xml:space="preserve"> PAGEREF _Toc244220733 \h </w:instrText>
+      </w:r>
+      <w:r>
+        <w:rPr>
+          <w:noProof/>
+        </w:rPr>
+      </w:r>
+      <w:r>
+        <w:rPr>
+          <w:noProof/>
+        </w:rPr>
+        <w:fldChar w:fldCharType="separate"/>
+      </w:r>
+      <w:r>
+        <w:rPr>
+          <w:noProof/>
+        </w:rPr>
+        <w:t>21</w:t>
       </w:r>
       <w:r>
         <w:rPr>
@@ -1452,7 +2350,7 @@
         <w:rPr>
           <w:noProof/>
         </w:rPr>
-        <w:t>3.0 Quality Assurance Process</w:t>
+        <w:t>Appendix B: Worked Example of the QA Plan</w:t>
       </w:r>
       <w:r>
         <w:rPr>
@@ -1470,7 +2368,7 @@
         <w:rPr>
           <w:noProof/>
         </w:rPr>
-        <w:instrText xml:space="preserve"> PAGEREF _Toc244220684 \h </w:instrText>
+        <w:instrText xml:space="preserve"> PAGEREF _Toc244220734 \h </w:instrText>
       </w:r>
       <w:r>
         <w:rPr>
@@ -1487,7 +2385,7 @@
         <w:rPr>
           <w:noProof/>
         </w:rPr>
-        <w:t>9</w:t>
+        <w:t>24</w:t>
       </w:r>
       <w:r>
         <w:rPr>
@@ -1497,967 +2395,19 @@
       </w:r>
     </w:p>
     <w:p>
-      <w:pPr>
-        <w:pStyle w:val="TOC2"/>
-        <w:tabs>
-          <w:tab w:val="right" w:leader="dot" w:pos="9016"/>
-        </w:tabs>
-        <w:rPr>
-          <w:rFonts w:asciiTheme="minorHAnsi" w:hAnsiTheme="minorHAnsi" w:cstheme="minorBidi"/>
-          <w:noProof/>
-        </w:rPr>
-      </w:pPr>
-      <w:r>
-        <w:rPr>
-          <w:noProof/>
-        </w:rPr>
-        <w:t>3.1 What Quality Means for Actual</w:t>
-      </w:r>
-      <w:r>
-        <w:rPr>
-          <w:noProof/>
-        </w:rPr>
-        <w:tab/>
-      </w:r>
-      <w:r>
-        <w:rPr>
-          <w:noProof/>
-        </w:rPr>
-        <w:fldChar w:fldCharType="begin"/>
-      </w:r>
-      <w:r>
-        <w:rPr>
-          <w:noProof/>
-        </w:rPr>
-        <w:instrText xml:space="preserve"> PAGEREF _Toc244220685 \h </w:instrText>
-      </w:r>
-      <w:r>
-        <w:rPr>
-          <w:noProof/>
-        </w:rPr>
-      </w:r>
-      <w:r>
-        <w:rPr>
-          <w:noProof/>
-        </w:rPr>
-        <w:fldChar w:fldCharType="separate"/>
-      </w:r>
-      <w:r>
-        <w:rPr>
-          <w:noProof/>
-        </w:rPr>
-        <w:t>9</w:t>
-      </w:r>
-      <w:r>
-        <w:rPr>
-          <w:noProof/>
-        </w:rPr>
+      <w:r>
         <w:fldChar w:fldCharType="end"/>
       </w:r>
     </w:p>
     <w:p>
       <w:pPr>
-        <w:pStyle w:val="TOC2"/>
-        <w:tabs>
-          <w:tab w:val="right" w:leader="dot" w:pos="9016"/>
-        </w:tabs>
-        <w:rPr>
-          <w:rFonts w:asciiTheme="minorHAnsi" w:hAnsiTheme="minorHAnsi" w:cstheme="minorBidi"/>
-          <w:noProof/>
-        </w:rPr>
-      </w:pPr>
-      <w:r>
-        <w:rPr>
-          <w:noProof/>
-        </w:rPr>
-        <w:t>3.2 Key Quality Attributes</w:t>
-      </w:r>
-      <w:r>
-        <w:rPr>
-          <w:noProof/>
-        </w:rPr>
-        <w:tab/>
-      </w:r>
-      <w:r>
-        <w:rPr>
-          <w:noProof/>
-        </w:rPr>
-        <w:fldChar w:fldCharType="begin"/>
-      </w:r>
-      <w:r>
-        <w:rPr>
-          <w:noProof/>
-        </w:rPr>
-        <w:instrText xml:space="preserve"> PAGEREF _Toc244220686 \h </w:instrText>
-      </w:r>
-      <w:r>
-        <w:rPr>
-          <w:noProof/>
-        </w:rPr>
-      </w:r>
-      <w:r>
-        <w:rPr>
-          <w:noProof/>
-        </w:rPr>
-        <w:fldChar w:fldCharType="separate"/>
-      </w:r>
-      <w:r>
-        <w:rPr>
-          <w:noProof/>
-        </w:rPr>
-        <w:t>9</w:t>
-      </w:r>
-      <w:r>
-        <w:rPr>
-          <w:noProof/>
-        </w:rPr>
-        <w:fldChar w:fldCharType="end"/>
-      </w:r>
-    </w:p>
-    <w:p>
-      <w:pPr>
-        <w:pStyle w:val="TOC2"/>
-        <w:tabs>
-          <w:tab w:val="right" w:leader="dot" w:pos="9016"/>
-        </w:tabs>
-        <w:rPr>
-          <w:rFonts w:asciiTheme="minorHAnsi" w:hAnsiTheme="minorHAnsi" w:cstheme="minorBidi"/>
-          <w:noProof/>
-        </w:rPr>
-      </w:pPr>
-      <w:r>
-        <w:rPr>
-          <w:noProof/>
-        </w:rPr>
-        <w:t>3.3 Current QA Practices and Gaps</w:t>
-      </w:r>
-      <w:r>
-        <w:rPr>
-          <w:noProof/>
-        </w:rPr>
-        <w:tab/>
-      </w:r>
-      <w:r>
-        <w:rPr>
-          <w:noProof/>
-        </w:rPr>
-        <w:fldChar w:fldCharType="begin"/>
-      </w:r>
-      <w:r>
-        <w:rPr>
-          <w:noProof/>
-        </w:rPr>
-        <w:instrText xml:space="preserve"> PAGEREF _Toc244220687 \h </w:instrText>
-      </w:r>
-      <w:r>
-        <w:rPr>
-          <w:noProof/>
-        </w:rPr>
-      </w:r>
-      <w:r>
-        <w:rPr>
-          <w:noProof/>
-        </w:rPr>
-        <w:fldChar w:fldCharType="separate"/>
-      </w:r>
-      <w:r>
-        <w:rPr>
-          <w:noProof/>
-        </w:rPr>
-        <w:t>10</w:t>
-      </w:r>
-      <w:r>
-        <w:rPr>
-          <w:noProof/>
-        </w:rPr>
-        <w:fldChar w:fldCharType="end"/>
-      </w:r>
-    </w:p>
-    <w:p>
-      <w:pPr>
-        <w:pStyle w:val="TOC2"/>
-        <w:tabs>
-          <w:tab w:val="right" w:leader="dot" w:pos="9016"/>
-        </w:tabs>
-        <w:rPr>
-          <w:rFonts w:asciiTheme="minorHAnsi" w:hAnsiTheme="minorHAnsi" w:cstheme="minorBidi"/>
-          <w:noProof/>
-        </w:rPr>
-      </w:pPr>
-      <w:r>
-        <w:rPr>
-          <w:noProof/>
-        </w:rPr>
-        <w:t>3.4 Selected Standards and Practices</w:t>
-      </w:r>
-      <w:r>
-        <w:rPr>
-          <w:noProof/>
-        </w:rPr>
-        <w:tab/>
-      </w:r>
-      <w:r>
-        <w:rPr>
-          <w:noProof/>
-        </w:rPr>
-        <w:fldChar w:fldCharType="begin"/>
-      </w:r>
-      <w:r>
-        <w:rPr>
-          <w:noProof/>
-        </w:rPr>
-        <w:instrText xml:space="preserve"> PAGEREF _Toc244220688 \h </w:instrText>
-      </w:r>
-      <w:r>
-        <w:rPr>
-          <w:noProof/>
-        </w:rPr>
-      </w:r>
-      <w:r>
-        <w:rPr>
-          <w:noProof/>
-        </w:rPr>
-        <w:fldChar w:fldCharType="separate"/>
-      </w:r>
-      <w:r>
-        <w:rPr>
-          <w:noProof/>
-        </w:rPr>
-        <w:t>10</w:t>
-      </w:r>
-      <w:r>
-        <w:rPr>
-          <w:noProof/>
-        </w:rPr>
-        <w:fldChar w:fldCharType="end"/>
-      </w:r>
-    </w:p>
-    <w:p>
-      <w:pPr>
-        <w:pStyle w:val="TOC2"/>
-        <w:tabs>
-          <w:tab w:val="right" w:leader="dot" w:pos="9016"/>
-        </w:tabs>
-        <w:rPr>
-          <w:rFonts w:asciiTheme="minorHAnsi" w:hAnsiTheme="minorHAnsi" w:cstheme="minorBidi"/>
-          <w:noProof/>
-        </w:rPr>
-      </w:pPr>
-      <w:r>
-        <w:rPr>
-          <w:noProof/>
-        </w:rPr>
-        <w:t>3.5 Applying the QA Process within Kanban</w:t>
-      </w:r>
-      <w:r>
-        <w:rPr>
-          <w:noProof/>
-        </w:rPr>
-        <w:tab/>
-      </w:r>
-      <w:r>
-        <w:rPr>
-          <w:noProof/>
-        </w:rPr>
-        <w:fldChar w:fldCharType="begin"/>
-      </w:r>
-      <w:r>
-        <w:rPr>
-          <w:noProof/>
-        </w:rPr>
-        <w:instrText xml:space="preserve"> PAGEREF _Toc244220689 \h </w:instrText>
-      </w:r>
-      <w:r>
-        <w:rPr>
-          <w:noProof/>
-        </w:rPr>
-      </w:r>
-      <w:r>
-        <w:rPr>
-          <w:noProof/>
-        </w:rPr>
-        <w:fldChar w:fldCharType="separate"/>
-      </w:r>
-      <w:r>
-        <w:rPr>
-          <w:noProof/>
-        </w:rPr>
-        <w:t>11</w:t>
-      </w:r>
-      <w:r>
-        <w:rPr>
-          <w:noProof/>
-        </w:rPr>
-        <w:fldChar w:fldCharType="end"/>
-      </w:r>
-    </w:p>
-    <w:p>
-      <w:pPr>
-        <w:pStyle w:val="TOC2"/>
-        <w:tabs>
-          <w:tab w:val="right" w:leader="dot" w:pos="9016"/>
-        </w:tabs>
-        <w:rPr>
-          <w:rFonts w:asciiTheme="minorHAnsi" w:hAnsiTheme="minorHAnsi" w:cstheme="minorBidi"/>
-          <w:noProof/>
-        </w:rPr>
-      </w:pPr>
-      <w:r>
-        <w:rPr>
-          <w:noProof/>
-        </w:rPr>
-        <w:t>3.6 Critical Evaluation</w:t>
-      </w:r>
-      <w:r>
-        <w:rPr>
-          <w:noProof/>
-        </w:rPr>
-        <w:tab/>
-      </w:r>
-      <w:r>
-        <w:rPr>
-          <w:noProof/>
-        </w:rPr>
-        <w:fldChar w:fldCharType="begin"/>
-      </w:r>
-      <w:r>
-        <w:rPr>
-          <w:noProof/>
-        </w:rPr>
-        <w:instrText xml:space="preserve"> PAGEREF _Toc244220690 \h </w:instrText>
-      </w:r>
-      <w:r>
-        <w:rPr>
-          <w:noProof/>
-        </w:rPr>
-      </w:r>
-      <w:r>
-        <w:rPr>
-          <w:noProof/>
-        </w:rPr>
-        <w:fldChar w:fldCharType="separate"/>
-      </w:r>
-      <w:r>
-        <w:rPr>
-          <w:noProof/>
-        </w:rPr>
-        <w:t>12</w:t>
-      </w:r>
-      <w:r>
-        <w:rPr>
-          <w:noProof/>
-        </w:rPr>
-        <w:fldChar w:fldCharType="end"/>
-      </w:r>
-    </w:p>
-    <w:p>
-      <w:pPr>
-        <w:pStyle w:val="TOC1"/>
-        <w:tabs>
-          <w:tab w:val="right" w:leader="dot" w:pos="9016"/>
-        </w:tabs>
-        <w:rPr>
-          <w:rFonts w:asciiTheme="minorHAnsi" w:hAnsiTheme="minorHAnsi" w:cstheme="minorBidi"/>
-          <w:b w:val="0"/>
-          <w:noProof/>
-        </w:rPr>
-      </w:pPr>
-      <w:r>
-        <w:rPr>
-          <w:noProof/>
-        </w:rPr>
-        <w:t>4.0 Integrating IV&amp;V with Kanban</w:t>
-      </w:r>
-      <w:r>
-        <w:rPr>
-          <w:noProof/>
-        </w:rPr>
-        <w:tab/>
-      </w:r>
-      <w:r>
-        <w:rPr>
-          <w:noProof/>
-        </w:rPr>
-        <w:fldChar w:fldCharType="begin"/>
-      </w:r>
-      <w:r>
-        <w:rPr>
-          <w:noProof/>
-        </w:rPr>
-        <w:instrText xml:space="preserve"> PAGEREF _Toc244220691 \h </w:instrText>
-      </w:r>
-      <w:r>
-        <w:rPr>
-          <w:noProof/>
-        </w:rPr>
-      </w:r>
-      <w:r>
-        <w:rPr>
-          <w:noProof/>
-        </w:rPr>
-        <w:fldChar w:fldCharType="separate"/>
-      </w:r>
-      <w:r>
-        <w:rPr>
-          <w:noProof/>
-        </w:rPr>
-        <w:t>13</w:t>
-      </w:r>
-      <w:r>
-        <w:rPr>
-          <w:noProof/>
-        </w:rPr>
-        <w:fldChar w:fldCharType="end"/>
-      </w:r>
-    </w:p>
-    <w:p>
-      <w:pPr>
-        <w:pStyle w:val="TOC2"/>
-        <w:tabs>
-          <w:tab w:val="right" w:leader="dot" w:pos="9016"/>
-        </w:tabs>
-        <w:rPr>
-          <w:rFonts w:asciiTheme="minorHAnsi" w:hAnsiTheme="minorHAnsi" w:cstheme="minorBidi"/>
-          <w:noProof/>
-        </w:rPr>
-      </w:pPr>
-      <w:r>
-        <w:rPr>
-          <w:noProof/>
-        </w:rPr>
-        <w:t>4.1 Current V&amp;V in Actual and Its Independence</w:t>
-      </w:r>
-      <w:r>
-        <w:rPr>
-          <w:noProof/>
-        </w:rPr>
-        <w:tab/>
-      </w:r>
-      <w:r>
-        <w:rPr>
-          <w:noProof/>
-        </w:rPr>
-        <w:fldChar w:fldCharType="begin"/>
-      </w:r>
-      <w:r>
-        <w:rPr>
-          <w:noProof/>
-        </w:rPr>
-        <w:instrText xml:space="preserve"> PAGEREF _Toc244220692 \h </w:instrText>
-      </w:r>
-      <w:r>
-        <w:rPr>
-          <w:noProof/>
-        </w:rPr>
-      </w:r>
-      <w:r>
-        <w:rPr>
-          <w:noProof/>
-        </w:rPr>
-        <w:fldChar w:fldCharType="separate"/>
-      </w:r>
-      <w:r>
-        <w:rPr>
-          <w:noProof/>
-        </w:rPr>
-        <w:t>13</w:t>
-      </w:r>
-      <w:r>
-        <w:rPr>
-          <w:noProof/>
-        </w:rPr>
-        <w:fldChar w:fldCharType="end"/>
-      </w:r>
-    </w:p>
-    <w:p>
-      <w:pPr>
-        <w:pStyle w:val="TOC2"/>
-        <w:tabs>
-          <w:tab w:val="right" w:leader="dot" w:pos="9016"/>
-        </w:tabs>
-        <w:rPr>
-          <w:rFonts w:asciiTheme="minorHAnsi" w:hAnsiTheme="minorHAnsi" w:cstheme="minorBidi"/>
-          <w:noProof/>
-        </w:rPr>
-      </w:pPr>
-      <w:r>
-        <w:rPr>
-          <w:noProof/>
-        </w:rPr>
-        <w:t>4.2 IV&amp;V Integration Model for Kanban</w:t>
-      </w:r>
-      <w:r>
-        <w:rPr>
-          <w:noProof/>
-        </w:rPr>
-        <w:tab/>
-      </w:r>
-      <w:r>
-        <w:rPr>
-          <w:noProof/>
-        </w:rPr>
-        <w:fldChar w:fldCharType="begin"/>
-      </w:r>
-      <w:r>
-        <w:rPr>
-          <w:noProof/>
-        </w:rPr>
-        <w:instrText xml:space="preserve"> PAGEREF _Toc244220693 \h </w:instrText>
-      </w:r>
-      <w:r>
-        <w:rPr>
-          <w:noProof/>
-        </w:rPr>
-      </w:r>
-      <w:r>
-        <w:rPr>
-          <w:noProof/>
-        </w:rPr>
-        <w:fldChar w:fldCharType="separate"/>
-      </w:r>
-      <w:r>
-        <w:rPr>
-          <w:noProof/>
-        </w:rPr>
-        <w:t>14</w:t>
-      </w:r>
-      <w:r>
-        <w:rPr>
-          <w:noProof/>
-        </w:rPr>
-        <w:fldChar w:fldCharType="end"/>
-      </w:r>
-    </w:p>
-    <w:p>
-      <w:pPr>
-        <w:pStyle w:val="TOC2"/>
-        <w:tabs>
-          <w:tab w:val="right" w:leader="dot" w:pos="9016"/>
-        </w:tabs>
-        <w:rPr>
-          <w:rFonts w:asciiTheme="minorHAnsi" w:hAnsiTheme="minorHAnsi" w:cstheme="minorBidi"/>
-          <w:noProof/>
-        </w:rPr>
-      </w:pPr>
-      <w:r>
-        <w:rPr>
-          <w:noProof/>
-        </w:rPr>
-        <w:t>4.3 How the Integration Meets the Three Goals</w:t>
-      </w:r>
-      <w:r>
-        <w:rPr>
-          <w:noProof/>
-        </w:rPr>
-        <w:tab/>
-      </w:r>
-      <w:r>
-        <w:rPr>
-          <w:noProof/>
-        </w:rPr>
-        <w:fldChar w:fldCharType="begin"/>
-      </w:r>
-      <w:r>
-        <w:rPr>
-          <w:noProof/>
-        </w:rPr>
-        <w:instrText xml:space="preserve"> PAGEREF _Toc244220694 \h </w:instrText>
-      </w:r>
-      <w:r>
-        <w:rPr>
-          <w:noProof/>
-        </w:rPr>
-      </w:r>
-      <w:r>
-        <w:rPr>
-          <w:noProof/>
-        </w:rPr>
-        <w:fldChar w:fldCharType="separate"/>
-      </w:r>
-      <w:r>
-        <w:rPr>
-          <w:noProof/>
-        </w:rPr>
-        <w:t>15</w:t>
-      </w:r>
-      <w:r>
-        <w:rPr>
-          <w:noProof/>
-        </w:rPr>
-        <w:fldChar w:fldCharType="end"/>
-      </w:r>
-    </w:p>
-    <w:p>
-      <w:pPr>
-        <w:pStyle w:val="TOC1"/>
-        <w:tabs>
-          <w:tab w:val="right" w:leader="dot" w:pos="9016"/>
-        </w:tabs>
-        <w:rPr>
-          <w:rFonts w:asciiTheme="minorHAnsi" w:hAnsiTheme="minorHAnsi" w:cstheme="minorBidi"/>
-          <w:b w:val="0"/>
-          <w:noProof/>
-        </w:rPr>
-      </w:pPr>
-      <w:r>
-        <w:rPr>
-          <w:noProof/>
-        </w:rPr>
-        <w:t>References</w:t>
-      </w:r>
-      <w:r>
-        <w:rPr>
-          <w:noProof/>
-        </w:rPr>
-        <w:tab/>
-      </w:r>
-      <w:r>
-        <w:rPr>
-          <w:noProof/>
-        </w:rPr>
-        <w:fldChar w:fldCharType="begin"/>
-      </w:r>
-      <w:r>
-        <w:rPr>
-          <w:noProof/>
-        </w:rPr>
-        <w:instrText xml:space="preserve"> PAGEREF _Toc244220695 \h </w:instrText>
-      </w:r>
-      <w:r>
-        <w:rPr>
-          <w:noProof/>
-        </w:rPr>
-      </w:r>
-      <w:r>
-        <w:rPr>
-          <w:noProof/>
-        </w:rPr>
-        <w:fldChar w:fldCharType="separate"/>
-      </w:r>
-      <w:r>
-        <w:rPr>
-          <w:noProof/>
-        </w:rPr>
-        <w:t>17</w:t>
-      </w:r>
-      <w:r>
-        <w:rPr>
-          <w:noProof/>
-        </w:rPr>
-        <w:fldChar w:fldCharType="end"/>
-      </w:r>
-    </w:p>
-    <w:p>
-      <w:pPr>
-        <w:pStyle w:val="TOC1"/>
-        <w:tabs>
-          <w:tab w:val="right" w:leader="dot" w:pos="9016"/>
-        </w:tabs>
-        <w:rPr>
-          <w:rFonts w:asciiTheme="minorHAnsi" w:hAnsiTheme="minorHAnsi" w:cstheme="minorBidi"/>
-          <w:b w:val="0"/>
-          <w:noProof/>
-        </w:rPr>
-      </w:pPr>
-      <w:r>
-        <w:rPr>
-          <w:noProof/>
-        </w:rPr>
-        <w:t>Appendix A: Methodology Selection</w:t>
-      </w:r>
-      <w:r>
-        <w:rPr>
-          <w:noProof/>
-        </w:rPr>
-        <w:tab/>
-      </w:r>
-      <w:r>
-        <w:rPr>
-          <w:noProof/>
-        </w:rPr>
-        <w:fldChar w:fldCharType="begin"/>
-      </w:r>
-      <w:r>
-        <w:rPr>
-          <w:noProof/>
-        </w:rPr>
-        <w:instrText xml:space="preserve"> PAGEREF _Toc244220696 \h </w:instrText>
-      </w:r>
-      <w:r>
-        <w:rPr>
-          <w:noProof/>
-        </w:rPr>
-      </w:r>
-      <w:r>
-        <w:rPr>
-          <w:noProof/>
-        </w:rPr>
-        <w:fldChar w:fldCharType="separate"/>
-      </w:r>
-      <w:r>
-        <w:rPr>
-          <w:noProof/>
-        </w:rPr>
-        <w:t>20</w:t>
-      </w:r>
-      <w:r>
-        <w:rPr>
-          <w:noProof/>
-        </w:rPr>
-        <w:fldChar w:fldCharType="end"/>
-      </w:r>
-    </w:p>
-    <w:p>
-      <w:pPr>
-        <w:pStyle w:val="TOC2"/>
-        <w:tabs>
-          <w:tab w:val="right" w:leader="dot" w:pos="9016"/>
-        </w:tabs>
-        <w:rPr>
-          <w:rFonts w:asciiTheme="minorHAnsi" w:hAnsiTheme="minorHAnsi" w:cstheme="minorBidi"/>
-          <w:noProof/>
-        </w:rPr>
-      </w:pPr>
-      <w:r>
-        <w:rPr>
-          <w:noProof/>
-        </w:rPr>
-        <w:t>A.1 Project Characteristics and Requirements</w:t>
-      </w:r>
-      <w:r>
-        <w:rPr>
-          <w:noProof/>
-        </w:rPr>
-        <w:tab/>
-      </w:r>
-      <w:r>
-        <w:rPr>
-          <w:noProof/>
-        </w:rPr>
-        <w:fldChar w:fldCharType="begin"/>
-      </w:r>
-      <w:r>
-        <w:rPr>
-          <w:noProof/>
-        </w:rPr>
-        <w:instrText xml:space="preserve"> PAGEREF _Toc244220697 \h </w:instrText>
-      </w:r>
-      <w:r>
-        <w:rPr>
-          <w:noProof/>
-        </w:rPr>
-      </w:r>
-      <w:r>
-        <w:rPr>
-          <w:noProof/>
-        </w:rPr>
-        <w:fldChar w:fldCharType="separate"/>
-      </w:r>
-      <w:r>
-        <w:rPr>
-          <w:noProof/>
-        </w:rPr>
-        <w:t>20</w:t>
-      </w:r>
-      <w:r>
-        <w:rPr>
-          <w:noProof/>
-        </w:rPr>
-        <w:fldChar w:fldCharType="end"/>
-      </w:r>
-    </w:p>
-    <w:p>
-      <w:pPr>
-        <w:pStyle w:val="TOC2"/>
-        <w:tabs>
-          <w:tab w:val="right" w:leader="dot" w:pos="9016"/>
-        </w:tabs>
-        <w:rPr>
-          <w:rFonts w:asciiTheme="minorHAnsi" w:hAnsiTheme="minorHAnsi" w:cstheme="minorBidi"/>
-          <w:noProof/>
-        </w:rPr>
-      </w:pPr>
-      <w:r>
-        <w:rPr>
-          <w:noProof/>
-        </w:rPr>
-        <w:t>A.2 Candidate Methodologies</w:t>
-      </w:r>
-      <w:r>
-        <w:rPr>
-          <w:noProof/>
-        </w:rPr>
-        <w:tab/>
-      </w:r>
-      <w:r>
-        <w:rPr>
-          <w:noProof/>
-        </w:rPr>
-        <w:fldChar w:fldCharType="begin"/>
-      </w:r>
-      <w:r>
-        <w:rPr>
-          <w:noProof/>
-        </w:rPr>
-        <w:instrText xml:space="preserve"> PAGEREF _Toc244220698 \h </w:instrText>
-      </w:r>
-      <w:r>
-        <w:rPr>
-          <w:noProof/>
-        </w:rPr>
-      </w:r>
-      <w:r>
-        <w:rPr>
-          <w:noProof/>
-        </w:rPr>
-        <w:fldChar w:fldCharType="separate"/>
-      </w:r>
-      <w:r>
-        <w:rPr>
-          <w:noProof/>
-        </w:rPr>
-        <w:t>21</w:t>
-      </w:r>
-      <w:r>
-        <w:rPr>
-          <w:noProof/>
-        </w:rPr>
-        <w:fldChar w:fldCharType="end"/>
-      </w:r>
-    </w:p>
-    <w:p>
-      <w:pPr>
-        <w:pStyle w:val="TOC2"/>
-        <w:tabs>
-          <w:tab w:val="right" w:leader="dot" w:pos="9016"/>
-        </w:tabs>
-        <w:rPr>
-          <w:rFonts w:asciiTheme="minorHAnsi" w:hAnsiTheme="minorHAnsi" w:cstheme="minorBidi"/>
-          <w:noProof/>
-        </w:rPr>
-      </w:pPr>
-      <w:r>
-        <w:rPr>
-          <w:noProof/>
-        </w:rPr>
-        <w:t>A.3 Evaluation and Selection</w:t>
-      </w:r>
-      <w:r>
-        <w:rPr>
-          <w:noProof/>
-        </w:rPr>
-        <w:tab/>
-      </w:r>
-      <w:r>
-        <w:rPr>
-          <w:noProof/>
-        </w:rPr>
-        <w:fldChar w:fldCharType="begin"/>
-      </w:r>
-      <w:r>
-        <w:rPr>
-          <w:noProof/>
-        </w:rPr>
-        <w:instrText xml:space="preserve"> PAGEREF _Toc244220699 \h </w:instrText>
-      </w:r>
-      <w:r>
-        <w:rPr>
-          <w:noProof/>
-        </w:rPr>
-      </w:r>
-      <w:r>
-        <w:rPr>
-          <w:noProof/>
-        </w:rPr>
-        <w:fldChar w:fldCharType="separate"/>
-      </w:r>
-      <w:r>
-        <w:rPr>
-          <w:noProof/>
-        </w:rPr>
-        <w:t>21</w:t>
-      </w:r>
-      <w:r>
-        <w:rPr>
-          <w:noProof/>
-        </w:rPr>
-        <w:fldChar w:fldCharType="end"/>
-      </w:r>
-    </w:p>
-    <w:p>
-      <w:pPr>
-        <w:pStyle w:val="TOC1"/>
-        <w:tabs>
-          <w:tab w:val="right" w:leader="dot" w:pos="9016"/>
-        </w:tabs>
-        <w:rPr>
-          <w:rFonts w:asciiTheme="minorHAnsi" w:hAnsiTheme="minorHAnsi" w:cstheme="minorBidi"/>
-          <w:b w:val="0"/>
-          <w:noProof/>
-        </w:rPr>
-      </w:pPr>
-      <w:r>
-        <w:rPr>
-          <w:noProof/>
-        </w:rPr>
-        <w:t>Appendix B: Worked Example of the QA Plan</w:t>
-      </w:r>
-      <w:r>
-        <w:rPr>
-          <w:noProof/>
-        </w:rPr>
-        <w:tab/>
-      </w:r>
-      <w:r>
-        <w:rPr>
-          <w:noProof/>
-        </w:rPr>
-        <w:fldChar w:fldCharType="begin"/>
-      </w:r>
-      <w:r>
-        <w:rPr>
-          <w:noProof/>
-        </w:rPr>
-        <w:instrText xml:space="preserve"> PAGEREF _Toc244220700 \h </w:instrText>
-      </w:r>
-      <w:r>
-        <w:rPr>
-          <w:noProof/>
-        </w:rPr>
-      </w:r>
-      <w:r>
-        <w:rPr>
-          <w:noProof/>
-        </w:rPr>
-        <w:fldChar w:fldCharType="separate"/>
-      </w:r>
-      <w:r>
-        <w:rPr>
-          <w:noProof/>
-        </w:rPr>
-        <w:t>24</w:t>
-      </w:r>
-      <w:r>
-        <w:rPr>
-          <w:noProof/>
-        </w:rPr>
-        <w:fldChar w:fldCharType="end"/>
-      </w:r>
-    </w:p>
-    <w:p>
-      <w:r>
-        <w:fldChar w:fldCharType="end"/>
-      </w:r>
-    </w:p>
-    <w:p>
-      <w:pPr>
         <w:sectPr>
-          <w:headerReference w:type="even" r:id="rId10"/>
-          <w:headerReference w:type="default" r:id="rId11"/>
-          <w:footerReference w:type="even" r:id="rId12"/>
-          <w:footerReference w:type="default" r:id="rId13"/>
-          <w:headerReference w:type="first" r:id="rId14"/>
-          <w:footerReference w:type="first" r:id="rId15"/>
+          <w:headerReference w:type="even" r:id="rId11"/>
+          <w:headerReference w:type="default" r:id="rId12"/>
+          <w:footerReference w:type="even" r:id="rId13"/>
+          <w:footerReference w:type="default" r:id="rId14"/>
+          <w:headerReference w:type="first" r:id="rId15"/>
+          <w:footerReference w:type="first" r:id="rId16"/>
           <w:pgSz w:w="11906" w:h="16838"/>
           <w:pgMar w:top="1440" w:right="1440" w:bottom="1440" w:left="1440" w:header="708" w:footer="708" w:gutter="0"/>
           <w:pgNumType w:fmt="lowerRoman" w:start="1"/>
@@ -2475,13 +2425,13 @@
           <w:numId w:val="0"/>
         </w:numPr>
       </w:pPr>
-      <w:bookmarkStart w:id="2" w:name="executive-summary"/>
-      <w:bookmarkStart w:id="3" w:name="_Toc244220672"/>
+      <w:bookmarkStart w:id="1" w:name="executive-summary"/>
+      <w:bookmarkStart w:id="2" w:name="_Toc244220706"/>
       <w:r>
         <w:lastRenderedPageBreak/>
         <w:t>Executive Summary</w:t>
       </w:r>
-      <w:bookmarkEnd w:id="3"/>
+      <w:bookmarkEnd w:id="2"/>
     </w:p>
     <w:p>
       <w:pPr>
@@ -2519,89 +2469,89 @@
       <w:pPr>
         <w:pStyle w:val="Heading1"/>
       </w:pPr>
-      <w:bookmarkStart w:id="4" w:name="introduction"/>
-      <w:bookmarkStart w:id="5" w:name="_Toc244220673"/>
-      <w:bookmarkEnd w:id="2"/>
+      <w:bookmarkStart w:id="3" w:name="introduction"/>
+      <w:bookmarkStart w:id="4" w:name="_Toc244220707"/>
+      <w:bookmarkEnd w:id="1"/>
       <w:r>
         <w:lastRenderedPageBreak/>
         <w:t>Introduction</w:t>
       </w:r>
+      <w:bookmarkEnd w:id="4"/>
+    </w:p>
+    <w:p>
+      <w:pPr>
+        <w:pStyle w:val="Heading2"/>
+      </w:pPr>
+      <w:bookmarkStart w:id="5" w:name="background-and-purpose"/>
+      <w:bookmarkStart w:id="6" w:name="_Toc244220708"/>
+      <w:r>
+        <w:t>Background and Purpose</w:t>
+      </w:r>
+      <w:bookmarkEnd w:id="6"/>
+    </w:p>
+    <w:p>
+      <w:pPr>
+        <w:pStyle w:val="FirstParagraph"/>
+      </w:pPr>
+      <w:r>
+        <w:t>Personal finance applications help people record spending and plan a budget. Because they hold balances, transactions and sometimes bank connections, their quality matters. A wrong total can lead to a poor financial decision, while a security flaw can expose private data.</w:t>
+      </w:r>
+    </w:p>
+    <w:p>
+      <w:pPr>
+        <w:pStyle w:val="BodyText"/>
+      </w:pPr>
+      <w:r>
+        <w:t>I chose Actual Budget because I was looking for an open-source personal finance application that I could self-host on an old laptop at home to manage and keep track of my finances. And this assignment allowed me to examine it in depth.</w:t>
+      </w:r>
+    </w:p>
+    <w:p>
+      <w:pPr>
+        <w:pStyle w:val="BodyText"/>
+      </w:pPr>
+      <w:r>
+        <w:t>This report covers three topics. Section 2 selects a software development methodology for the project, Section 3 sets out a quality assurance (QA) process, and Section 4 integrates independent verification and validation (IV&amp;V) into the selected methodology.</w:t>
+      </w:r>
+    </w:p>
+    <w:p>
+      <w:pPr>
+        <w:pStyle w:val="Heading2"/>
+      </w:pPr>
+      <w:bookmarkStart w:id="7" w:name="what-is-actual-budget"/>
+      <w:bookmarkStart w:id="8" w:name="_Toc244220709"/>
       <w:bookmarkEnd w:id="5"/>
+      <w:r>
+        <w:t>What Is Actual Budget</w:t>
+      </w:r>
+      <w:bookmarkEnd w:id="8"/>
+    </w:p>
+    <w:p>
+      <w:pPr>
+        <w:pStyle w:val="FirstParagraph"/>
+      </w:pPr>
+      <w:r>
+        <w:t>Actual Budget ("Actual") is a free, open-source personal finance application released under the MIT licence. Its focus is mainly on local-first, and the budget is kept on the user's own device, while syncing between devices is optional (Actual Budget, 2026a). It targets privacy-minded budgeters, self-hosters and families. Furthermore, the project defines success as users trusting its numbers (Actual Budget, 2026a). By default, Actual uses envelope budgeting, in which people budget the money they already have, rather than the income they expect to receive (Actual Budget, n.d.-j).</w:t>
+      </w:r>
+    </w:p>
+    <w:p>
+      <w:pPr>
+        <w:pStyle w:val="BodyText"/>
+      </w:pPr>
+      <w:r>
+        <w:t>Actual was created by James Long, who ran it as a paid product for over four years (Stacoviak &amp; Santo, 2022). In early 2022 he decided to close the commercial product and released it as open source, and it is now maintained by volunteers, which led by a core team that formed after pull requests had waited months for review (Aboltins, 2025).</w:t>
+      </w:r>
     </w:p>
     <w:p>
       <w:pPr>
         <w:pStyle w:val="Heading2"/>
       </w:pPr>
-      <w:bookmarkStart w:id="6" w:name="background-and-purpose"/>
-      <w:bookmarkStart w:id="7" w:name="_Toc244220674"/>
-      <w:r>
-        <w:t>Background and Purpose</w:t>
-      </w:r>
+      <w:bookmarkStart w:id="9" w:name="main-features-and-how-it-works"/>
+      <w:bookmarkStart w:id="10" w:name="_Toc244220710"/>
       <w:bookmarkEnd w:id="7"/>
-    </w:p>
-    <w:p>
-      <w:pPr>
-        <w:pStyle w:val="FirstParagraph"/>
-      </w:pPr>
-      <w:r>
-        <w:t>Personal finance applications help people record spending and plan a budget. Because they hold balances, transactions and sometimes bank connections, their quality matters. A wrong total can lead to a poor financial decision, while a security flaw can expose private data.</w:t>
-      </w:r>
-    </w:p>
-    <w:p>
-      <w:pPr>
-        <w:pStyle w:val="BodyText"/>
-      </w:pPr>
-      <w:r>
-        <w:t>I chose Actual Budget because I was looking for an open-source personal finance application that I could self-host on an old laptop at home to manage and keep track of my finances. And this assignment allowed me to examine it in depth.</w:t>
-      </w:r>
-    </w:p>
-    <w:p>
-      <w:pPr>
-        <w:pStyle w:val="BodyText"/>
-      </w:pPr>
-      <w:r>
-        <w:t>This report covers three topics. Section 2 selects a software development methodology for the project, Section 3 sets out a quality assurance (QA) process, and Section 4 integrates independent verification and validation (IV&amp;V) into the selected methodology.</w:t>
-      </w:r>
-    </w:p>
-    <w:p>
-      <w:pPr>
-        <w:pStyle w:val="Heading2"/>
-      </w:pPr>
-      <w:bookmarkStart w:id="8" w:name="what-is-actual-budget"/>
-      <w:bookmarkStart w:id="9" w:name="_Toc244220675"/>
-      <w:bookmarkEnd w:id="6"/>
-      <w:r>
-        <w:t>What Is Actual Budget</w:t>
-      </w:r>
-      <w:bookmarkEnd w:id="9"/>
-    </w:p>
-    <w:p>
-      <w:pPr>
-        <w:pStyle w:val="FirstParagraph"/>
-      </w:pPr>
-      <w:r>
-        <w:t>Actual Budget ("Actual") is a free, open-source personal finance application released under the MIT licence. Its focus is mainly on local-first, and the budget is kept on the user's own device, while syncing between devices is optional (Actual Budget, 2026a). It targets privacy-minded budgeters, self-hosters and families. Furthermore, the project defines success as users trusting its numbers (Actual Budget, 2026a). By default, Actual uses envelope budgeting, in which people budget the money they already have, rather than the income they expect to receive (Actual Budget, n.d.-j).</w:t>
-      </w:r>
-    </w:p>
-    <w:p>
-      <w:pPr>
-        <w:pStyle w:val="BodyText"/>
-      </w:pPr>
-      <w:r>
-        <w:t>Actual was created by James Long, who ran it as a paid product for over four years (Stacoviak &amp; Santo, 2022). In early 2022 he decided to close the commercial product and released it as open source, and it is now maintained by volunteers, which led by a core team that formed after pull requests had waited months for review (Aboltins, 2025).</w:t>
-      </w:r>
-    </w:p>
-    <w:p>
-      <w:pPr>
-        <w:pStyle w:val="Heading2"/>
-      </w:pPr>
-      <w:bookmarkStart w:id="10" w:name="main-features-and-how-it-works"/>
-      <w:bookmarkStart w:id="11" w:name="_Toc244220676"/>
-      <w:bookmarkEnd w:id="8"/>
       <w:r>
         <w:t>Main Features and How It Works</w:t>
       </w:r>
-      <w:bookmarkEnd w:id="11"/>
+      <w:bookmarkEnd w:id="10"/>
     </w:p>
     <w:p>
       <w:pPr>
@@ -2645,7 +2595,7 @@
                     </pic:cNvPicPr>
                   </pic:nvPicPr>
                   <pic:blipFill>
-                    <a:blip r:embed="rId16"/>
+                    <a:blip r:embed="rId17"/>
                     <a:stretch>
                       <a:fillRect/>
                     </a:stretch>
@@ -2688,14 +2638,14 @@
       <w:pPr>
         <w:pStyle w:val="Heading2"/>
       </w:pPr>
-      <w:bookmarkStart w:id="12" w:name="who-is-involved"/>
-      <w:bookmarkStart w:id="13" w:name="_Toc244220677"/>
-      <w:bookmarkEnd w:id="10"/>
+      <w:bookmarkStart w:id="11" w:name="who-is-involved"/>
+      <w:bookmarkStart w:id="12" w:name="_Toc244220711"/>
+      <w:bookmarkEnd w:id="9"/>
       <w:r>
         <w:lastRenderedPageBreak/>
         <w:t>Who Is Involved</w:t>
       </w:r>
-      <w:bookmarkEnd w:id="13"/>
+      <w:bookmarkEnd w:id="12"/>
     </w:p>
     <w:p>
       <w:pPr>
@@ -2964,13 +2914,13 @@
         <w:pStyle w:val="Heading2"/>
         <w:spacing w:before="240"/>
       </w:pPr>
-      <w:bookmarkStart w:id="14" w:name="main-challenges"/>
-      <w:bookmarkStart w:id="15" w:name="_Toc244220678"/>
-      <w:bookmarkEnd w:id="12"/>
+      <w:bookmarkStart w:id="13" w:name="main-challenges"/>
+      <w:bookmarkStart w:id="14" w:name="_Toc244220712"/>
+      <w:bookmarkEnd w:id="11"/>
       <w:r>
         <w:t>Main Challenges</w:t>
       </w:r>
-      <w:bookmarkEnd w:id="15"/>
+      <w:bookmarkEnd w:id="14"/>
     </w:p>
     <w:p>
       <w:pPr>
@@ -3033,15 +2983,15 @@
       <w:pPr>
         <w:pStyle w:val="Heading1"/>
       </w:pPr>
-      <w:bookmarkStart w:id="16" w:name="software-development-methodology"/>
-      <w:bookmarkStart w:id="17" w:name="_Toc244220679"/>
-      <w:bookmarkEnd w:id="4"/>
-      <w:bookmarkEnd w:id="14"/>
+      <w:bookmarkStart w:id="15" w:name="software-development-methodology"/>
+      <w:bookmarkStart w:id="16" w:name="_Toc244220713"/>
+      <w:bookmarkEnd w:id="3"/>
+      <w:bookmarkEnd w:id="13"/>
       <w:r>
         <w:lastRenderedPageBreak/>
         <w:t>Software Development Methodology</w:t>
       </w:r>
-      <w:bookmarkEnd w:id="17"/>
+      <w:bookmarkEnd w:id="16"/>
     </w:p>
     <w:p>
       <w:pPr>
@@ -3055,12 +3005,12 @@
       <w:pPr>
         <w:pStyle w:val="Heading2"/>
       </w:pPr>
-      <w:bookmarkStart w:id="18" w:name="current-development-process-of-actual"/>
-      <w:bookmarkStart w:id="19" w:name="_Toc244220680"/>
+      <w:bookmarkStart w:id="17" w:name="current-development-process-of-actual"/>
+      <w:bookmarkStart w:id="18" w:name="_Toc244220714"/>
       <w:r>
         <w:t>Current Development Process of Actual</w:t>
       </w:r>
-      <w:bookmarkEnd w:id="19"/>
+      <w:bookmarkEnd w:id="18"/>
     </w:p>
     <w:p>
       <w:pPr>
@@ -3121,7 +3071,7 @@
                     </pic:cNvPicPr>
                   </pic:nvPicPr>
                   <pic:blipFill>
-                    <a:blip r:embed="rId17"/>
+                    <a:blip r:embed="rId18"/>
                     <a:stretch>
                       <a:fillRect/>
                     </a:stretch>
@@ -3164,13 +3114,13 @@
       <w:pPr>
         <w:pStyle w:val="Heading2"/>
       </w:pPr>
-      <w:bookmarkStart w:id="20" w:name="why-kanban-fits-actual"/>
-      <w:bookmarkStart w:id="21" w:name="_Toc244220681"/>
-      <w:bookmarkEnd w:id="18"/>
+      <w:bookmarkStart w:id="19" w:name="why-kanban-fits-actual"/>
+      <w:bookmarkStart w:id="20" w:name="_Toc244220715"/>
+      <w:bookmarkEnd w:id="17"/>
       <w:r>
         <w:t>Why Kanban Fits Actual</w:t>
       </w:r>
-      <w:bookmarkEnd w:id="21"/>
+      <w:bookmarkEnd w:id="20"/>
     </w:p>
     <w:p>
       <w:pPr>
@@ -3220,13 +3170,13 @@
       <w:pPr>
         <w:pStyle w:val="Heading2"/>
       </w:pPr>
-      <w:bookmarkStart w:id="22" w:name="applying-kanban-to-actual"/>
-      <w:bookmarkStart w:id="23" w:name="_Toc244220682"/>
-      <w:bookmarkEnd w:id="20"/>
+      <w:bookmarkStart w:id="21" w:name="applying-kanban-to-actual"/>
+      <w:bookmarkStart w:id="22" w:name="_Toc244220716"/>
+      <w:bookmarkEnd w:id="19"/>
       <w:r>
         <w:t>Applying Kanban to Actual</w:t>
       </w:r>
-      <w:bookmarkEnd w:id="23"/>
+      <w:bookmarkEnd w:id="22"/>
     </w:p>
     <w:p>
       <w:pPr>
@@ -3271,7 +3221,7 @@
                     </pic:cNvPicPr>
                   </pic:nvPicPr>
                   <pic:blipFill>
-                    <a:blip r:embed="rId18"/>
+                    <a:blip r:embed="rId19"/>
                     <a:stretch>
                       <a:fillRect/>
                     </a:stretch>
@@ -3314,13 +3264,13 @@
       <w:pPr>
         <w:pStyle w:val="Heading2"/>
       </w:pPr>
-      <w:bookmarkStart w:id="24" w:name="critical-evaluation"/>
-      <w:bookmarkStart w:id="25" w:name="_Toc244220683"/>
-      <w:bookmarkEnd w:id="22"/>
+      <w:bookmarkStart w:id="23" w:name="critical-evaluation"/>
+      <w:bookmarkStart w:id="24" w:name="_Toc244220717"/>
+      <w:bookmarkEnd w:id="21"/>
       <w:r>
         <w:t>Critical Evaluation</w:t>
       </w:r>
-      <w:bookmarkEnd w:id="25"/>
+      <w:bookmarkEnd w:id="24"/>
     </w:p>
     <w:p>
       <w:pPr>
@@ -3338,15 +3288,15 @@
       <w:pPr>
         <w:pStyle w:val="Heading1"/>
       </w:pPr>
-      <w:bookmarkStart w:id="26" w:name="quality-assurance-process"/>
-      <w:bookmarkStart w:id="27" w:name="_Toc244220684"/>
-      <w:bookmarkEnd w:id="16"/>
-      <w:bookmarkEnd w:id="24"/>
+      <w:bookmarkStart w:id="25" w:name="quality-assurance-process"/>
+      <w:bookmarkStart w:id="26" w:name="_Toc244220718"/>
+      <w:bookmarkEnd w:id="15"/>
+      <w:bookmarkEnd w:id="23"/>
       <w:r>
         <w:lastRenderedPageBreak/>
         <w:t>Quality Assurance Process</w:t>
       </w:r>
-      <w:bookmarkEnd w:id="27"/>
+      <w:bookmarkEnd w:id="26"/>
     </w:p>
     <w:p>
       <w:pPr>
@@ -3360,12 +3310,12 @@
       <w:pPr>
         <w:pStyle w:val="Heading2"/>
       </w:pPr>
-      <w:bookmarkStart w:id="28" w:name="what-quality-means-for-actual"/>
-      <w:bookmarkStart w:id="29" w:name="_Toc244220685"/>
+      <w:bookmarkStart w:id="27" w:name="what-quality-means-for-actual"/>
+      <w:bookmarkStart w:id="28" w:name="_Toc244220719"/>
       <w:r>
         <w:t>What Quality Means for Actual</w:t>
       </w:r>
-      <w:bookmarkEnd w:id="29"/>
+      <w:bookmarkEnd w:id="28"/>
     </w:p>
     <w:p>
       <w:pPr>
@@ -3447,13 +3397,13 @@
       <w:pPr>
         <w:pStyle w:val="Heading2"/>
       </w:pPr>
-      <w:bookmarkStart w:id="30" w:name="key-quality-attributes"/>
-      <w:bookmarkStart w:id="31" w:name="_Toc244220686"/>
-      <w:bookmarkEnd w:id="28"/>
+      <w:bookmarkStart w:id="29" w:name="key-quality-attributes"/>
+      <w:bookmarkStart w:id="30" w:name="_Toc244220720"/>
+      <w:bookmarkEnd w:id="27"/>
       <w:r>
         <w:t>Key Quality Attributes</w:t>
       </w:r>
-      <w:bookmarkEnd w:id="31"/>
+      <w:bookmarkEnd w:id="30"/>
     </w:p>
     <w:p>
       <w:pPr>
@@ -3503,14 +3453,14 @@
       <w:pPr>
         <w:pStyle w:val="Heading2"/>
       </w:pPr>
-      <w:bookmarkStart w:id="32" w:name="current-qa-practices-and-gaps"/>
-      <w:bookmarkStart w:id="33" w:name="_Toc244220687"/>
-      <w:bookmarkEnd w:id="30"/>
+      <w:bookmarkStart w:id="31" w:name="current-qa-practices-and-gaps"/>
+      <w:bookmarkStart w:id="32" w:name="_Toc244220721"/>
+      <w:bookmarkEnd w:id="29"/>
       <w:r>
         <w:lastRenderedPageBreak/>
         <w:t>Current QA Practices and Gaps</w:t>
       </w:r>
-      <w:bookmarkEnd w:id="33"/>
+      <w:bookmarkEnd w:id="32"/>
     </w:p>
     <w:p>
       <w:pPr>
@@ -3540,13 +3490,13 @@
       <w:pPr>
         <w:pStyle w:val="Heading2"/>
       </w:pPr>
-      <w:bookmarkStart w:id="34" w:name="selected-standards-and-practices"/>
-      <w:bookmarkStart w:id="35" w:name="_Toc244220688"/>
-      <w:bookmarkEnd w:id="32"/>
+      <w:bookmarkStart w:id="33" w:name="selected-standards-and-practices"/>
+      <w:bookmarkStart w:id="34" w:name="_Toc244220722"/>
+      <w:bookmarkEnd w:id="31"/>
       <w:r>
         <w:t>Selected Standards and Practices</w:t>
       </w:r>
-      <w:bookmarkEnd w:id="35"/>
+      <w:bookmarkEnd w:id="34"/>
     </w:p>
     <w:p>
       <w:pPr>
@@ -3924,13 +3874,13 @@
         <w:pStyle w:val="Heading2"/>
         <w:spacing w:before="240"/>
       </w:pPr>
-      <w:bookmarkStart w:id="36" w:name="applying-the-qa-process-within-kanban"/>
-      <w:bookmarkStart w:id="37" w:name="_Toc244220689"/>
-      <w:bookmarkEnd w:id="34"/>
+      <w:bookmarkStart w:id="35" w:name="applying-the-qa-process-within-kanban"/>
+      <w:bookmarkStart w:id="36" w:name="_Toc244220723"/>
+      <w:bookmarkEnd w:id="33"/>
       <w:r>
         <w:t>Applying the QA Process within Kanban</w:t>
       </w:r>
-      <w:bookmarkEnd w:id="37"/>
+      <w:bookmarkEnd w:id="36"/>
     </w:p>
     <w:p>
       <w:pPr>
@@ -4533,13 +4483,13 @@
         <w:pStyle w:val="Heading2"/>
         <w:spacing w:before="240"/>
       </w:pPr>
-      <w:bookmarkStart w:id="38" w:name="critical-evaluation-1"/>
-      <w:bookmarkStart w:id="39" w:name="_Toc244220690"/>
-      <w:bookmarkEnd w:id="36"/>
+      <w:bookmarkStart w:id="37" w:name="critical-evaluation-1"/>
+      <w:bookmarkStart w:id="38" w:name="_Toc244220724"/>
+      <w:bookmarkEnd w:id="35"/>
       <w:r>
         <w:t>Critical Evaluation</w:t>
       </w:r>
-      <w:bookmarkEnd w:id="39"/>
+      <w:bookmarkEnd w:id="38"/>
     </w:p>
     <w:p>
       <w:pPr>
@@ -4553,15 +4503,15 @@
       <w:pPr>
         <w:pStyle w:val="Heading1"/>
       </w:pPr>
-      <w:bookmarkStart w:id="40" w:name="integrating-ivv-with-kanban"/>
-      <w:bookmarkStart w:id="41" w:name="_Toc244220691"/>
-      <w:bookmarkEnd w:id="26"/>
-      <w:bookmarkEnd w:id="38"/>
+      <w:bookmarkStart w:id="39" w:name="integrating-ivv-with-kanban"/>
+      <w:bookmarkStart w:id="40" w:name="_Toc244220725"/>
+      <w:bookmarkEnd w:id="25"/>
+      <w:bookmarkEnd w:id="37"/>
       <w:r>
         <w:lastRenderedPageBreak/>
         <w:t>Integrating IV&amp;V with Kanban</w:t>
       </w:r>
-      <w:bookmarkEnd w:id="41"/>
+      <w:bookmarkEnd w:id="40"/>
     </w:p>
     <w:p>
       <w:pPr>
@@ -4575,12 +4525,12 @@
       <w:pPr>
         <w:pStyle w:val="Heading2"/>
       </w:pPr>
-      <w:bookmarkStart w:id="42" w:name="X0aa91b5be94bdb8348825913a91d765f72af6ee"/>
-      <w:bookmarkStart w:id="43" w:name="_Toc244220692"/>
+      <w:bookmarkStart w:id="41" w:name="X0aa91b5be94bdb8348825913a91d765f72af6ee"/>
+      <w:bookmarkStart w:id="42" w:name="_Toc244220726"/>
       <w:r>
         <w:t>Current V&amp;V in Actual and Its Independence</w:t>
       </w:r>
-      <w:bookmarkEnd w:id="43"/>
+      <w:bookmarkEnd w:id="42"/>
     </w:p>
     <w:p>
       <w:pPr>
@@ -5347,13 +5297,13 @@
       <w:pPr>
         <w:pStyle w:val="Heading2"/>
       </w:pPr>
-      <w:bookmarkStart w:id="44" w:name="ivv-integration-model-for-kanban"/>
-      <w:bookmarkStart w:id="45" w:name="_Toc244220693"/>
-      <w:bookmarkEnd w:id="42"/>
+      <w:bookmarkStart w:id="43" w:name="ivv-integration-model-for-kanban"/>
+      <w:bookmarkStart w:id="44" w:name="_Toc244220727"/>
+      <w:bookmarkEnd w:id="41"/>
       <w:r>
         <w:t>IV&amp;V Integration Model for Kanban</w:t>
       </w:r>
-      <w:bookmarkEnd w:id="45"/>
+      <w:bookmarkEnd w:id="44"/>
     </w:p>
     <w:p>
       <w:pPr>
@@ -5928,13 +5878,13 @@
       <w:pPr>
         <w:pStyle w:val="Heading2"/>
       </w:pPr>
-      <w:bookmarkStart w:id="46" w:name="X1475a41517db6ec60255518d1ac8cff0c25dd20"/>
-      <w:bookmarkStart w:id="47" w:name="_Toc244220694"/>
-      <w:bookmarkEnd w:id="44"/>
+      <w:bookmarkStart w:id="45" w:name="X1475a41517db6ec60255518d1ac8cff0c25dd20"/>
+      <w:bookmarkStart w:id="46" w:name="_Toc244220728"/>
+      <w:bookmarkEnd w:id="43"/>
       <w:r>
         <w:t>How the Integration Meets the Three Goals</w:t>
       </w:r>
-      <w:bookmarkEnd w:id="47"/>
+      <w:bookmarkEnd w:id="46"/>
     </w:p>
     <w:p>
       <w:pPr>
@@ -5980,15 +5930,15 @@
           <w:numId w:val="0"/>
         </w:numPr>
       </w:pPr>
-      <w:bookmarkStart w:id="48" w:name="references"/>
-      <w:bookmarkStart w:id="49" w:name="_Toc244220695"/>
-      <w:bookmarkEnd w:id="40"/>
-      <w:bookmarkEnd w:id="46"/>
+      <w:bookmarkStart w:id="47" w:name="references"/>
+      <w:bookmarkStart w:id="48" w:name="_Toc244220729"/>
+      <w:bookmarkEnd w:id="39"/>
+      <w:bookmarkEnd w:id="45"/>
       <w:r>
         <w:lastRenderedPageBreak/>
         <w:t>References</w:t>
       </w:r>
-      <w:bookmarkEnd w:id="49"/>
+      <w:bookmarkEnd w:id="48"/>
     </w:p>
     <w:p>
       <w:pPr>
@@ -6650,14 +6600,14 @@
           <w:numId w:val="0"/>
         </w:numPr>
       </w:pPr>
-      <w:bookmarkStart w:id="50" w:name="appendix-a-methodology-selection"/>
-      <w:bookmarkStart w:id="51" w:name="_Toc244220696"/>
-      <w:bookmarkEnd w:id="48"/>
+      <w:bookmarkStart w:id="49" w:name="appendix-a-methodology-selection"/>
+      <w:bookmarkStart w:id="50" w:name="_Toc244220730"/>
+      <w:bookmarkEnd w:id="47"/>
       <w:r>
         <w:lastRenderedPageBreak/>
         <w:t>Appendix A: Methodology Selection</w:t>
       </w:r>
-      <w:bookmarkEnd w:id="51"/>
+      <w:bookmarkEnd w:id="50"/>
     </w:p>
     <w:p>
       <w:pPr>
@@ -6679,12 +6629,12 @@
           <w:numId w:val="0"/>
         </w:numPr>
       </w:pPr>
-      <w:bookmarkStart w:id="52" w:name="X028abdb72f6729402371f99d307e7d170450399"/>
-      <w:bookmarkStart w:id="53" w:name="_Toc244220697"/>
+      <w:bookmarkStart w:id="51" w:name="X028abdb72f6729402371f99d307e7d170450399"/>
+      <w:bookmarkStart w:id="52" w:name="_Toc244220731"/>
       <w:r>
         <w:t>A.1 Project Characteristics and Requirements</w:t>
       </w:r>
-      <w:bookmarkEnd w:id="53"/>
+      <w:bookmarkEnd w:id="52"/>
     </w:p>
     <w:p>
       <w:pPr>
@@ -7598,13 +7548,13 @@
         </w:numPr>
         <w:spacing w:before="240"/>
       </w:pPr>
-      <w:bookmarkStart w:id="54" w:name="a.2-candidate-methodologies"/>
-      <w:bookmarkStart w:id="55" w:name="_Toc244220698"/>
-      <w:bookmarkEnd w:id="52"/>
+      <w:bookmarkStart w:id="53" w:name="a.2-candidate-methodologies"/>
+      <w:bookmarkStart w:id="54" w:name="_Toc244220732"/>
+      <w:bookmarkEnd w:id="51"/>
       <w:r>
         <w:t>A.2 Candidate Methodologies</w:t>
       </w:r>
-      <w:bookmarkEnd w:id="55"/>
+      <w:bookmarkEnd w:id="54"/>
     </w:p>
     <w:p>
       <w:pPr>
@@ -7630,13 +7580,13 @@
           <w:numId w:val="0"/>
         </w:numPr>
       </w:pPr>
-      <w:bookmarkStart w:id="56" w:name="a.3-evaluation-and-selection"/>
-      <w:bookmarkStart w:id="57" w:name="_Toc244220699"/>
-      <w:bookmarkEnd w:id="54"/>
+      <w:bookmarkStart w:id="55" w:name="a.3-evaluation-and-selection"/>
+      <w:bookmarkStart w:id="56" w:name="_Toc244220733"/>
+      <w:bookmarkEnd w:id="53"/>
       <w:r>
         <w:t>A.3 Evaluation and Selection</w:t>
       </w:r>
-      <w:bookmarkEnd w:id="57"/>
+      <w:bookmarkEnd w:id="56"/>
     </w:p>
     <w:p>
       <w:pPr>
@@ -8297,15 +8247,15 @@
           <w:numId w:val="0"/>
         </w:numPr>
       </w:pPr>
-      <w:bookmarkStart w:id="58" w:name="appendix-b-worked-example-of-the-qa-plan"/>
-      <w:bookmarkStart w:id="59" w:name="_Toc244220700"/>
-      <w:bookmarkEnd w:id="50"/>
-      <w:bookmarkEnd w:id="56"/>
+      <w:bookmarkStart w:id="57" w:name="appendix-b-worked-example-of-the-qa-plan"/>
+      <w:bookmarkStart w:id="58" w:name="_Toc244220734"/>
+      <w:bookmarkEnd w:id="49"/>
+      <w:bookmarkEnd w:id="55"/>
       <w:r>
         <w:lastRenderedPageBreak/>
         <w:t>Appendix B: Worked Example of the QA Plan</w:t>
       </w:r>
-      <w:bookmarkEnd w:id="59"/>
+      <w:bookmarkEnd w:id="58"/>
     </w:p>
     <w:p>
       <w:pPr>
@@ -8327,19 +8277,19 @@
         <w:t>Suppose a contributor adds a new bank-sync provider, the kind of change behind GHSA-m2cq-xjgm-f668 (Section 3.3). At triage, the card is marked High tier because it touches bank sync, and an acceptance criterion is written: every new endpoint must refuse requests without a valid login. At design, the implementer lists the new endpoints and who may call each one. At Build/PR, the endpoints are added to the authorisation test matrix. If the login check is missing, that test fails and the card cannot move to Verify, so a flaw like the 2026 one could be stopped before release. A typo fix in the documentation, by contrast, is Low tier and passes through the normal checks only.</w:t>
       </w:r>
     </w:p>
-    <w:bookmarkEnd w:id="58"/>
+    <w:bookmarkEnd w:id="57"/>
     <w:p>
       <w:pPr>
         <w:spacing w:line="240" w:lineRule="auto"/>
       </w:pPr>
     </w:p>
     <w:sectPr>
-      <w:headerReference w:type="even" r:id="rId19"/>
-      <w:headerReference w:type="default" r:id="rId20"/>
-      <w:footerReference w:type="even" r:id="rId21"/>
-      <w:footerReference w:type="default" r:id="rId22"/>
-      <w:headerReference w:type="first" r:id="rId23"/>
-      <w:footerReference w:type="first" r:id="rId24"/>
+      <w:headerReference w:type="even" r:id="rId20"/>
+      <w:headerReference w:type="default" r:id="rId21"/>
+      <w:footerReference w:type="even" r:id="rId22"/>
+      <w:footerReference w:type="default" r:id="rId23"/>
+      <w:headerReference w:type="first" r:id="rId24"/>
+      <w:footerReference w:type="first" r:id="rId25"/>
       <w:pgSz w:w="11906" w:h="16838"/>
       <w:pgMar w:top="1440" w:right="1440" w:bottom="1440" w:left="1440" w:header="708" w:footer="708" w:gutter="0"/>
       <w:pgNumType w:start="1"/>
@@ -10520,4 +10470,16 @@
     </a:ext>
   </a:extLst>
 </a:theme>
+</file>
+
+<file path=customXml/item1.xml><?xml version="1.0" encoding="utf-8"?>
+<b:Sources xmlns:b="http://schemas.openxmlformats.org/officeDocument/2006/bibliography" xmlns="http://schemas.openxmlformats.org/officeDocument/2006/bibliography" SelectedStyle="\APASixthEditionOfficeOnline.xsl" StyleName="APA" Version="6"/>
+</file>
+
+<file path=customXml/itemProps1.xml><?xml version="1.0" encoding="utf-8"?>
+<ds:datastoreItem xmlns:ds="http://schemas.openxmlformats.org/officeDocument/2006/customXml" ds:itemID="{E33D7206-8E3F-4949-8581-19820C2F63C2}">
+  <ds:schemaRefs>
+    <ds:schemaRef ds:uri="http://schemas.openxmlformats.org/officeDocument/2006/bibliography"/>
+  </ds:schemaRefs>
+</ds:datastoreItem>
 </file>
</xml_diff>

<commit_message>
Replace TOC with Word's built-in automatic table of contents
Co-Authored-By: Claude Opus 5.5 <noreply@anthropic.com>
</commit_message>
<xml_diff>
--- a/report/assignment-1/Assignment-1-Report.docx
+++ b/report/assignment-1/Assignment-1-Report.docx
@@ -217,15 +217,7 @@
         <w:t xml:space="preserve">HAND OUT DATE: </w:t>
       </w:r>
       <w:r>
-        <w:t>- dd-mm-</w:t>
-      </w:r>
-      <w:proofErr w:type="spellStart"/>
-      <w:r>
-        <w:t>yyyy</w:t>
-      </w:r>
-      <w:proofErr w:type="spellEnd"/>
-      <w:r>
-        <w:t xml:space="preserve"> -</w:t>
+        <w:t>- dd-mm-yyyy -</w:t>
       </w:r>
     </w:p>
     <w:p>
@@ -251,21 +243,7 @@
         <w:rPr>
           <w:sz w:val="28"/>
         </w:rPr>
-        <w:t>HAND IN DATE:     - dd-mm-</w:t>
-      </w:r>
-      <w:proofErr w:type="spellStart"/>
-      <w:r>
-        <w:rPr>
-          <w:sz w:val="28"/>
-        </w:rPr>
-        <w:t>yyyy</w:t>
-      </w:r>
-      <w:proofErr w:type="spellEnd"/>
-      <w:r>
-        <w:rPr>
-          <w:sz w:val="28"/>
-        </w:rPr>
-        <w:t xml:space="preserve"> -   </w:t>
+        <w:t xml:space="preserve">HAND IN DATE:     - dd-mm-yyyy -   </w:t>
       </w:r>
     </w:p>
     <w:p>
@@ -635,1770 +613,2069 @@
         </w:sectPr>
       </w:pPr>
     </w:p>
-    <w:p>
-      <w:pPr>
-        <w:spacing w:after="240" w:line="240" w:lineRule="auto"/>
-        <w:rPr>
-          <w:b/>
-          <w:sz w:val="32"/>
-        </w:rPr>
-      </w:pPr>
-      <w:r>
-        <w:rPr>
-          <w:b/>
-          <w:sz w:val="32"/>
-        </w:rPr>
-        <w:lastRenderedPageBreak/>
-        <w:t xml:space="preserve">Table </w:t>
-      </w:r>
-      <w:r>
-        <w:rPr>
-          <w:b/>
-          <w:sz w:val="32"/>
-        </w:rPr>
-        <w:t>o</w:t>
-      </w:r>
-      <w:r>
-        <w:rPr>
-          <w:b/>
-          <w:sz w:val="32"/>
-        </w:rPr>
-        <w:t>f Contents</w:t>
-      </w:r>
-    </w:p>
-    <w:p>
-      <w:pPr>
-        <w:pStyle w:val="TOC1"/>
-        <w:tabs>
-          <w:tab w:val="right" w:leader="dot" w:pos="9016"/>
-        </w:tabs>
-        <w:rPr>
-          <w:rFonts w:asciiTheme="minorHAnsi" w:hAnsiTheme="minorHAnsi" w:cstheme="minorBidi"/>
-          <w:b w:val="0"/>
+    <w:sdt>
+      <w:sdtPr>
+        <w:id w:val="1808208011"/>
+        <w:docPartObj>
+          <w:docPartGallery w:val="Table of Contents"/>
+          <w:docPartUnique/>
+        </w:docPartObj>
+      </w:sdtPr>
+      <w:sdtEndPr>
+        <w:rPr>
+          <w:bCs/>
           <w:noProof/>
-        </w:rPr>
-      </w:pPr>
-      <w:r>
-        <w:fldChar w:fldCharType="begin"/>
-      </w:r>
-      <w:r>
-        <w:instrText xml:space="preserve"> TOC \o "1-2" </w:instrText>
-      </w:r>
-      <w:r>
-        <w:fldChar w:fldCharType="separate"/>
-      </w:r>
-      <w:r>
-        <w:rPr>
-          <w:noProof/>
-        </w:rPr>
-        <w:t>Executive Summary</w:t>
-      </w:r>
-      <w:r>
-        <w:rPr>
-          <w:noProof/>
-        </w:rPr>
-        <w:tab/>
-      </w:r>
-      <w:r>
-        <w:rPr>
-          <w:noProof/>
-        </w:rPr>
-        <w:fldChar w:fldCharType="begin"/>
-      </w:r>
-      <w:r>
-        <w:rPr>
-          <w:noProof/>
-        </w:rPr>
-        <w:instrText xml:space="preserve"> PAGEREF _Toc244220706 \h </w:instrText>
-      </w:r>
-      <w:r>
-        <w:rPr>
-          <w:noProof/>
-        </w:rPr>
-      </w:r>
-      <w:r>
-        <w:rPr>
-          <w:noProof/>
-        </w:rPr>
-        <w:fldChar w:fldCharType="separate"/>
-      </w:r>
-      <w:r>
-        <w:rPr>
-          <w:noProof/>
-        </w:rPr>
-        <w:t>1</w:t>
-      </w:r>
-      <w:r>
-        <w:rPr>
-          <w:noProof/>
-        </w:rPr>
-        <w:fldChar w:fldCharType="end"/>
-      </w:r>
-    </w:p>
-    <w:p>
-      <w:pPr>
-        <w:pStyle w:val="TOC1"/>
-        <w:tabs>
-          <w:tab w:val="right" w:leader="dot" w:pos="9016"/>
-        </w:tabs>
-        <w:rPr>
-          <w:rFonts w:asciiTheme="minorHAnsi" w:hAnsiTheme="minorHAnsi" w:cstheme="minorBidi"/>
-          <w:b w:val="0"/>
-          <w:noProof/>
-        </w:rPr>
-      </w:pPr>
-      <w:r>
-        <w:rPr>
-          <w:noProof/>
-        </w:rPr>
-        <w:t>1.0 Introduction</w:t>
-      </w:r>
-      <w:r>
-        <w:rPr>
-          <w:noProof/>
-        </w:rPr>
-        <w:tab/>
-      </w:r>
-      <w:r>
-        <w:rPr>
-          <w:noProof/>
-        </w:rPr>
-        <w:fldChar w:fldCharType="begin"/>
-      </w:r>
-      <w:r>
-        <w:rPr>
-          <w:noProof/>
-        </w:rPr>
-        <w:instrText xml:space="preserve"> PAGEREF _Toc244220707 \h </w:instrText>
-      </w:r>
-      <w:r>
-        <w:rPr>
-          <w:noProof/>
-        </w:rPr>
-      </w:r>
-      <w:r>
-        <w:rPr>
-          <w:noProof/>
-        </w:rPr>
-        <w:fldChar w:fldCharType="separate"/>
-      </w:r>
-      <w:r>
-        <w:rPr>
-          <w:noProof/>
-        </w:rPr>
-        <w:t>2</w:t>
-      </w:r>
-      <w:r>
-        <w:rPr>
-          <w:noProof/>
-        </w:rPr>
-        <w:fldChar w:fldCharType="end"/>
-      </w:r>
-    </w:p>
-    <w:p>
-      <w:pPr>
-        <w:pStyle w:val="TOC2"/>
-        <w:tabs>
-          <w:tab w:val="right" w:leader="dot" w:pos="9016"/>
-        </w:tabs>
-        <w:rPr>
-          <w:rFonts w:asciiTheme="minorHAnsi" w:hAnsiTheme="minorHAnsi" w:cstheme="minorBidi"/>
-          <w:noProof/>
-        </w:rPr>
-      </w:pPr>
-      <w:r>
-        <w:rPr>
-          <w:noProof/>
-        </w:rPr>
-        <w:t>1.1 Background and Purpose</w:t>
-      </w:r>
-      <w:r>
-        <w:rPr>
-          <w:noProof/>
-        </w:rPr>
-        <w:tab/>
-      </w:r>
-      <w:r>
-        <w:rPr>
-          <w:noProof/>
-        </w:rPr>
-        <w:fldChar w:fldCharType="begin"/>
-      </w:r>
-      <w:r>
-        <w:rPr>
-          <w:noProof/>
-        </w:rPr>
-        <w:instrText xml:space="preserve"> PAGEREF _Toc244220708 \h </w:instrText>
-      </w:r>
-      <w:r>
-        <w:rPr>
-          <w:noProof/>
-        </w:rPr>
-      </w:r>
-      <w:r>
-        <w:rPr>
-          <w:noProof/>
-        </w:rPr>
-        <w:fldChar w:fldCharType="separate"/>
-      </w:r>
-      <w:r>
-        <w:rPr>
-          <w:noProof/>
-        </w:rPr>
-        <w:t>2</w:t>
-      </w:r>
-      <w:r>
-        <w:rPr>
-          <w:noProof/>
-        </w:rPr>
-        <w:fldChar w:fldCharType="end"/>
-      </w:r>
-    </w:p>
-    <w:p>
-      <w:pPr>
-        <w:pStyle w:val="TOC2"/>
-        <w:tabs>
-          <w:tab w:val="right" w:leader="dot" w:pos="9016"/>
-        </w:tabs>
-        <w:rPr>
-          <w:rFonts w:asciiTheme="minorHAnsi" w:hAnsiTheme="minorHAnsi" w:cstheme="minorBidi"/>
-          <w:noProof/>
-        </w:rPr>
-      </w:pPr>
-      <w:r>
-        <w:rPr>
-          <w:noProof/>
-        </w:rPr>
-        <w:t>1.2 What Is Actual Budget</w:t>
-      </w:r>
-      <w:r>
-        <w:rPr>
-          <w:noProof/>
-        </w:rPr>
-        <w:tab/>
-      </w:r>
-      <w:r>
-        <w:rPr>
-          <w:noProof/>
-        </w:rPr>
-        <w:fldChar w:fldCharType="begin"/>
-      </w:r>
-      <w:r>
-        <w:rPr>
-          <w:noProof/>
-        </w:rPr>
-        <w:instrText xml:space="preserve"> PAGEREF _Toc244220709 \h </w:instrText>
-      </w:r>
-      <w:r>
-        <w:rPr>
-          <w:noProof/>
-        </w:rPr>
-      </w:r>
-      <w:r>
-        <w:rPr>
-          <w:noProof/>
-        </w:rPr>
-        <w:fldChar w:fldCharType="separate"/>
-      </w:r>
-      <w:r>
-        <w:rPr>
-          <w:noProof/>
-        </w:rPr>
-        <w:t>2</w:t>
-      </w:r>
-      <w:r>
-        <w:rPr>
-          <w:noProof/>
-        </w:rPr>
-        <w:fldChar w:fldCharType="end"/>
-      </w:r>
-    </w:p>
-    <w:p>
-      <w:pPr>
-        <w:pStyle w:val="TOC2"/>
-        <w:tabs>
-          <w:tab w:val="right" w:leader="dot" w:pos="9016"/>
-        </w:tabs>
-        <w:rPr>
-          <w:rFonts w:asciiTheme="minorHAnsi" w:hAnsiTheme="minorHAnsi" w:cstheme="minorBidi"/>
-          <w:noProof/>
-        </w:rPr>
-      </w:pPr>
-      <w:r>
-        <w:rPr>
-          <w:noProof/>
-        </w:rPr>
-        <w:t>1.3 Main Features and How It Works</w:t>
-      </w:r>
-      <w:r>
-        <w:rPr>
-          <w:noProof/>
-        </w:rPr>
-        <w:tab/>
-      </w:r>
-      <w:r>
-        <w:rPr>
-          <w:noProof/>
-        </w:rPr>
-        <w:fldChar w:fldCharType="begin"/>
-      </w:r>
-      <w:r>
-        <w:rPr>
-          <w:noProof/>
-        </w:rPr>
-        <w:instrText xml:space="preserve"> PAGEREF _Toc244220710 \h </w:instrText>
-      </w:r>
-      <w:r>
-        <w:rPr>
-          <w:noProof/>
-        </w:rPr>
-      </w:r>
-      <w:r>
-        <w:rPr>
-          <w:noProof/>
-        </w:rPr>
-        <w:fldChar w:fldCharType="separate"/>
-      </w:r>
-      <w:r>
-        <w:rPr>
-          <w:noProof/>
-        </w:rPr>
-        <w:t>2</w:t>
-      </w:r>
-      <w:r>
-        <w:rPr>
-          <w:noProof/>
-        </w:rPr>
-        <w:fldChar w:fldCharType="end"/>
-      </w:r>
-    </w:p>
-    <w:p>
-      <w:pPr>
-        <w:pStyle w:val="TOC2"/>
-        <w:tabs>
-          <w:tab w:val="right" w:leader="dot" w:pos="9016"/>
-        </w:tabs>
-        <w:rPr>
-          <w:rFonts w:asciiTheme="minorHAnsi" w:hAnsiTheme="minorHAnsi" w:cstheme="minorBidi"/>
-          <w:noProof/>
-        </w:rPr>
-      </w:pPr>
-      <w:r>
-        <w:rPr>
-          <w:noProof/>
-        </w:rPr>
-        <w:t>1.4 Who Is Involved</w:t>
-      </w:r>
-      <w:r>
-        <w:rPr>
-          <w:noProof/>
-        </w:rPr>
-        <w:tab/>
-      </w:r>
-      <w:r>
-        <w:rPr>
-          <w:noProof/>
-        </w:rPr>
-        <w:fldChar w:fldCharType="begin"/>
-      </w:r>
-      <w:r>
-        <w:rPr>
-          <w:noProof/>
-        </w:rPr>
-        <w:instrText xml:space="preserve"> PAGEREF _Toc244220711 \h </w:instrText>
-      </w:r>
-      <w:r>
-        <w:rPr>
-          <w:noProof/>
-        </w:rPr>
-      </w:r>
-      <w:r>
-        <w:rPr>
-          <w:noProof/>
-        </w:rPr>
-        <w:fldChar w:fldCharType="separate"/>
-      </w:r>
-      <w:r>
-        <w:rPr>
-          <w:noProof/>
-        </w:rPr>
-        <w:t>3</w:t>
-      </w:r>
-      <w:r>
-        <w:rPr>
-          <w:noProof/>
-        </w:rPr>
-        <w:fldChar w:fldCharType="end"/>
-      </w:r>
-    </w:p>
-    <w:p>
-      <w:pPr>
-        <w:pStyle w:val="TOC2"/>
-        <w:tabs>
-          <w:tab w:val="right" w:leader="dot" w:pos="9016"/>
-        </w:tabs>
-        <w:rPr>
-          <w:rFonts w:asciiTheme="minorHAnsi" w:hAnsiTheme="minorHAnsi" w:cstheme="minorBidi"/>
-          <w:noProof/>
-        </w:rPr>
-      </w:pPr>
-      <w:r>
-        <w:rPr>
-          <w:noProof/>
-        </w:rPr>
-        <w:t>1.5 Main Challenges</w:t>
-      </w:r>
-      <w:r>
-        <w:rPr>
-          <w:noProof/>
-        </w:rPr>
-        <w:tab/>
-      </w:r>
-      <w:r>
-        <w:rPr>
-          <w:noProof/>
-        </w:rPr>
-        <w:fldChar w:fldCharType="begin"/>
-      </w:r>
-      <w:r>
-        <w:rPr>
-          <w:noProof/>
-        </w:rPr>
-        <w:instrText xml:space="preserve"> PAGEREF _Toc244220712 \h </w:instrText>
-      </w:r>
-      <w:r>
-        <w:rPr>
-          <w:noProof/>
-        </w:rPr>
-      </w:r>
-      <w:r>
-        <w:rPr>
-          <w:noProof/>
-        </w:rPr>
-        <w:fldChar w:fldCharType="separate"/>
-      </w:r>
-      <w:r>
-        <w:rPr>
-          <w:noProof/>
-        </w:rPr>
-        <w:t>3</w:t>
-      </w:r>
-      <w:r>
-        <w:rPr>
-          <w:noProof/>
-        </w:rPr>
-        <w:fldChar w:fldCharType="end"/>
-      </w:r>
-    </w:p>
-    <w:p>
-      <w:pPr>
-        <w:pStyle w:val="TOC1"/>
-        <w:tabs>
-          <w:tab w:val="right" w:leader="dot" w:pos="9016"/>
-        </w:tabs>
-        <w:rPr>
-          <w:rFonts w:asciiTheme="minorHAnsi" w:hAnsiTheme="minorHAnsi" w:cstheme="minorBidi"/>
-          <w:b w:val="0"/>
-          <w:noProof/>
-        </w:rPr>
-      </w:pPr>
-      <w:r>
-        <w:rPr>
-          <w:noProof/>
-        </w:rPr>
-        <w:t>2.0 Software Development Methodology</w:t>
-      </w:r>
-      <w:r>
-        <w:rPr>
-          <w:noProof/>
-        </w:rPr>
-        <w:tab/>
-      </w:r>
-      <w:r>
-        <w:rPr>
-          <w:noProof/>
-        </w:rPr>
-        <w:fldChar w:fldCharType="begin"/>
-      </w:r>
-      <w:r>
-        <w:rPr>
-          <w:noProof/>
-        </w:rPr>
-        <w:instrText xml:space="preserve"> PAGEREF _Toc244220713 \h </w:instrText>
-      </w:r>
-      <w:r>
-        <w:rPr>
-          <w:noProof/>
-        </w:rPr>
-      </w:r>
-      <w:r>
-        <w:rPr>
-          <w:noProof/>
-        </w:rPr>
-        <w:fldChar w:fldCharType="separate"/>
-      </w:r>
-      <w:r>
-        <w:rPr>
-          <w:noProof/>
-        </w:rPr>
-        <w:t>4</w:t>
-      </w:r>
-      <w:r>
-        <w:rPr>
-          <w:noProof/>
-        </w:rPr>
-        <w:fldChar w:fldCharType="end"/>
-      </w:r>
-    </w:p>
-    <w:p>
-      <w:pPr>
-        <w:pStyle w:val="TOC2"/>
-        <w:tabs>
-          <w:tab w:val="right" w:leader="dot" w:pos="9016"/>
-        </w:tabs>
-        <w:rPr>
-          <w:rFonts w:asciiTheme="minorHAnsi" w:hAnsiTheme="minorHAnsi" w:cstheme="minorBidi"/>
-          <w:noProof/>
-        </w:rPr>
-      </w:pPr>
-      <w:r>
-        <w:rPr>
-          <w:noProof/>
-        </w:rPr>
-        <w:t>2.1 Current Development Process of Actual</w:t>
-      </w:r>
-      <w:r>
-        <w:rPr>
-          <w:noProof/>
-        </w:rPr>
-        <w:tab/>
-      </w:r>
-      <w:r>
-        <w:rPr>
-          <w:noProof/>
-        </w:rPr>
-        <w:fldChar w:fldCharType="begin"/>
-      </w:r>
-      <w:r>
-        <w:rPr>
-          <w:noProof/>
-        </w:rPr>
-        <w:instrText xml:space="preserve"> PAGEREF _Toc244220714 \h </w:instrText>
-      </w:r>
-      <w:r>
-        <w:rPr>
-          <w:noProof/>
-        </w:rPr>
-      </w:r>
-      <w:r>
-        <w:rPr>
-          <w:noProof/>
-        </w:rPr>
-        <w:fldChar w:fldCharType="separate"/>
-      </w:r>
-      <w:r>
-        <w:rPr>
-          <w:noProof/>
-        </w:rPr>
-        <w:t>4</w:t>
-      </w:r>
-      <w:r>
-        <w:rPr>
-          <w:noProof/>
-        </w:rPr>
-        <w:fldChar w:fldCharType="end"/>
-      </w:r>
-    </w:p>
-    <w:p>
-      <w:pPr>
-        <w:pStyle w:val="TOC2"/>
-        <w:tabs>
-          <w:tab w:val="right" w:leader="dot" w:pos="9016"/>
-        </w:tabs>
-        <w:rPr>
-          <w:rFonts w:asciiTheme="minorHAnsi" w:hAnsiTheme="minorHAnsi" w:cstheme="minorBidi"/>
-          <w:noProof/>
-        </w:rPr>
-      </w:pPr>
-      <w:r>
-        <w:rPr>
-          <w:noProof/>
-        </w:rPr>
-        <w:t>2.2 Why Kanban Fits Actual</w:t>
-      </w:r>
-      <w:r>
-        <w:rPr>
-          <w:noProof/>
-        </w:rPr>
-        <w:tab/>
-      </w:r>
-      <w:r>
-        <w:rPr>
-          <w:noProof/>
-        </w:rPr>
-        <w:fldChar w:fldCharType="begin"/>
-      </w:r>
-      <w:r>
-        <w:rPr>
-          <w:noProof/>
-        </w:rPr>
-        <w:instrText xml:space="preserve"> PAGEREF _Toc244220715 \h </w:instrText>
-      </w:r>
-      <w:r>
-        <w:rPr>
-          <w:noProof/>
-        </w:rPr>
-      </w:r>
-      <w:r>
-        <w:rPr>
-          <w:noProof/>
-        </w:rPr>
-        <w:fldChar w:fldCharType="separate"/>
-      </w:r>
-      <w:r>
-        <w:rPr>
-          <w:noProof/>
-        </w:rPr>
-        <w:t>5</w:t>
-      </w:r>
-      <w:r>
-        <w:rPr>
-          <w:noProof/>
-        </w:rPr>
-        <w:fldChar w:fldCharType="end"/>
-      </w:r>
-    </w:p>
-    <w:p>
-      <w:pPr>
-        <w:pStyle w:val="TOC2"/>
-        <w:tabs>
-          <w:tab w:val="right" w:leader="dot" w:pos="9016"/>
-        </w:tabs>
-        <w:rPr>
-          <w:rFonts w:asciiTheme="minorHAnsi" w:hAnsiTheme="minorHAnsi" w:cstheme="minorBidi"/>
-          <w:noProof/>
-        </w:rPr>
-      </w:pPr>
-      <w:r>
-        <w:rPr>
-          <w:noProof/>
-        </w:rPr>
-        <w:t>2.3 Applying Kanban to Actual</w:t>
-      </w:r>
-      <w:r>
-        <w:rPr>
-          <w:noProof/>
-        </w:rPr>
-        <w:tab/>
-      </w:r>
-      <w:r>
-        <w:rPr>
-          <w:noProof/>
-        </w:rPr>
-        <w:fldChar w:fldCharType="begin"/>
-      </w:r>
-      <w:r>
-        <w:rPr>
-          <w:noProof/>
-        </w:rPr>
-        <w:instrText xml:space="preserve"> PAGEREF _Toc244220716 \h </w:instrText>
-      </w:r>
-      <w:r>
-        <w:rPr>
-          <w:noProof/>
-        </w:rPr>
-      </w:r>
-      <w:r>
-        <w:rPr>
-          <w:noProof/>
-        </w:rPr>
-        <w:fldChar w:fldCharType="separate"/>
-      </w:r>
-      <w:r>
-        <w:rPr>
-          <w:noProof/>
-        </w:rPr>
-        <w:t>6</w:t>
-      </w:r>
-      <w:r>
-        <w:rPr>
-          <w:noProof/>
-        </w:rPr>
-        <w:fldChar w:fldCharType="end"/>
-      </w:r>
-    </w:p>
-    <w:p>
-      <w:pPr>
-        <w:pStyle w:val="TOC2"/>
-        <w:tabs>
-          <w:tab w:val="right" w:leader="dot" w:pos="9016"/>
-        </w:tabs>
-        <w:rPr>
-          <w:rFonts w:asciiTheme="minorHAnsi" w:hAnsiTheme="minorHAnsi" w:cstheme="minorBidi"/>
-          <w:noProof/>
-        </w:rPr>
-      </w:pPr>
-      <w:r>
-        <w:rPr>
-          <w:noProof/>
-        </w:rPr>
-        <w:t>2.4 Critical Evaluation</w:t>
-      </w:r>
-      <w:r>
-        <w:rPr>
-          <w:noProof/>
-        </w:rPr>
-        <w:tab/>
-      </w:r>
-      <w:r>
-        <w:rPr>
-          <w:noProof/>
-        </w:rPr>
-        <w:fldChar w:fldCharType="begin"/>
-      </w:r>
-      <w:r>
-        <w:rPr>
-          <w:noProof/>
-        </w:rPr>
-        <w:instrText xml:space="preserve"> PAGEREF _Toc244220717 \h </w:instrText>
-      </w:r>
-      <w:r>
-        <w:rPr>
-          <w:noProof/>
-        </w:rPr>
-      </w:r>
-      <w:r>
-        <w:rPr>
-          <w:noProof/>
-        </w:rPr>
-        <w:fldChar w:fldCharType="separate"/>
-      </w:r>
-      <w:r>
-        <w:rPr>
-          <w:noProof/>
-        </w:rPr>
-        <w:t>7</w:t>
-      </w:r>
-      <w:r>
-        <w:rPr>
-          <w:noProof/>
-        </w:rPr>
-        <w:fldChar w:fldCharType="end"/>
-      </w:r>
-    </w:p>
-    <w:p>
-      <w:pPr>
-        <w:pStyle w:val="TOC1"/>
-        <w:tabs>
-          <w:tab w:val="right" w:leader="dot" w:pos="9016"/>
-        </w:tabs>
-        <w:rPr>
-          <w:rFonts w:asciiTheme="minorHAnsi" w:hAnsiTheme="minorHAnsi" w:cstheme="minorBidi"/>
-          <w:b w:val="0"/>
-          <w:noProof/>
-        </w:rPr>
-      </w:pPr>
-      <w:r>
-        <w:rPr>
-          <w:noProof/>
-        </w:rPr>
-        <w:t>3.0 Quality Assurance Process</w:t>
-      </w:r>
-      <w:r>
-        <w:rPr>
-          <w:noProof/>
-        </w:rPr>
-        <w:tab/>
-      </w:r>
-      <w:r>
-        <w:rPr>
-          <w:noProof/>
-        </w:rPr>
-        <w:fldChar w:fldCharType="begin"/>
-      </w:r>
-      <w:r>
-        <w:rPr>
-          <w:noProof/>
-        </w:rPr>
-        <w:instrText xml:space="preserve"> PAGEREF _Toc244220718 \h </w:instrText>
-      </w:r>
-      <w:r>
-        <w:rPr>
-          <w:noProof/>
-        </w:rPr>
-      </w:r>
-      <w:r>
-        <w:rPr>
-          <w:noProof/>
-        </w:rPr>
-        <w:fldChar w:fldCharType="separate"/>
-      </w:r>
-      <w:r>
-        <w:rPr>
-          <w:noProof/>
-        </w:rPr>
-        <w:t>9</w:t>
-      </w:r>
-      <w:r>
-        <w:rPr>
-          <w:noProof/>
-        </w:rPr>
-        <w:fldChar w:fldCharType="end"/>
-      </w:r>
-    </w:p>
-    <w:p>
-      <w:pPr>
-        <w:pStyle w:val="TOC2"/>
-        <w:tabs>
-          <w:tab w:val="right" w:leader="dot" w:pos="9016"/>
-        </w:tabs>
-        <w:rPr>
-          <w:rFonts w:asciiTheme="minorHAnsi" w:hAnsiTheme="minorHAnsi" w:cstheme="minorBidi"/>
-          <w:noProof/>
-        </w:rPr>
-      </w:pPr>
-      <w:r>
-        <w:rPr>
-          <w:noProof/>
-        </w:rPr>
-        <w:t>3.1 What Quality Means for Actual</w:t>
-      </w:r>
-      <w:r>
-        <w:rPr>
-          <w:noProof/>
-        </w:rPr>
-        <w:tab/>
-      </w:r>
-      <w:r>
-        <w:rPr>
-          <w:noProof/>
-        </w:rPr>
-        <w:fldChar w:fldCharType="begin"/>
-      </w:r>
-      <w:r>
-        <w:rPr>
-          <w:noProof/>
-        </w:rPr>
-        <w:instrText xml:space="preserve"> PAGEREF _Toc244220719 \h </w:instrText>
-      </w:r>
-      <w:r>
-        <w:rPr>
-          <w:noProof/>
-        </w:rPr>
-      </w:r>
-      <w:r>
-        <w:rPr>
-          <w:noProof/>
-        </w:rPr>
-        <w:fldChar w:fldCharType="separate"/>
-      </w:r>
-      <w:r>
-        <w:rPr>
-          <w:noProof/>
-        </w:rPr>
-        <w:t>9</w:t>
-      </w:r>
-      <w:r>
-        <w:rPr>
-          <w:noProof/>
-        </w:rPr>
-        <w:fldChar w:fldCharType="end"/>
-      </w:r>
-    </w:p>
-    <w:p>
-      <w:pPr>
-        <w:pStyle w:val="TOC2"/>
-        <w:tabs>
-          <w:tab w:val="right" w:leader="dot" w:pos="9016"/>
-        </w:tabs>
-        <w:rPr>
-          <w:rFonts w:asciiTheme="minorHAnsi" w:hAnsiTheme="minorHAnsi" w:cstheme="minorBidi"/>
-          <w:noProof/>
-        </w:rPr>
-      </w:pPr>
-      <w:r>
-        <w:rPr>
-          <w:noProof/>
-        </w:rPr>
-        <w:t>3.2 Key Quality Attributes</w:t>
-      </w:r>
-      <w:r>
-        <w:rPr>
-          <w:noProof/>
-        </w:rPr>
-        <w:tab/>
-      </w:r>
-      <w:r>
-        <w:rPr>
-          <w:noProof/>
-        </w:rPr>
-        <w:fldChar w:fldCharType="begin"/>
-      </w:r>
-      <w:r>
-        <w:rPr>
-          <w:noProof/>
-        </w:rPr>
-        <w:instrText xml:space="preserve"> PAGEREF _Toc244220720 \h </w:instrText>
-      </w:r>
-      <w:r>
-        <w:rPr>
-          <w:noProof/>
-        </w:rPr>
-      </w:r>
-      <w:r>
-        <w:rPr>
-          <w:noProof/>
-        </w:rPr>
-        <w:fldChar w:fldCharType="separate"/>
-      </w:r>
-      <w:r>
-        <w:rPr>
-          <w:noProof/>
-        </w:rPr>
-        <w:t>9</w:t>
-      </w:r>
-      <w:r>
-        <w:rPr>
-          <w:noProof/>
-        </w:rPr>
-        <w:fldChar w:fldCharType="end"/>
-      </w:r>
-    </w:p>
-    <w:p>
-      <w:pPr>
-        <w:pStyle w:val="TOC2"/>
-        <w:tabs>
-          <w:tab w:val="right" w:leader="dot" w:pos="9016"/>
-        </w:tabs>
-        <w:rPr>
-          <w:rFonts w:asciiTheme="minorHAnsi" w:hAnsiTheme="minorHAnsi" w:cstheme="minorBidi"/>
-          <w:noProof/>
-        </w:rPr>
-      </w:pPr>
-      <w:r>
-        <w:rPr>
-          <w:noProof/>
-        </w:rPr>
-        <w:t>3.3 Current QA Practices and Gaps</w:t>
-      </w:r>
-      <w:r>
-        <w:rPr>
-          <w:noProof/>
-        </w:rPr>
-        <w:tab/>
-      </w:r>
-      <w:r>
-        <w:rPr>
-          <w:noProof/>
-        </w:rPr>
-        <w:fldChar w:fldCharType="begin"/>
-      </w:r>
-      <w:r>
-        <w:rPr>
-          <w:noProof/>
-        </w:rPr>
-        <w:instrText xml:space="preserve"> PAGEREF _Toc244220721 \h </w:instrText>
-      </w:r>
-      <w:r>
-        <w:rPr>
-          <w:noProof/>
-        </w:rPr>
-      </w:r>
-      <w:r>
-        <w:rPr>
-          <w:noProof/>
-        </w:rPr>
-        <w:fldChar w:fldCharType="separate"/>
-      </w:r>
-      <w:r>
-        <w:rPr>
-          <w:noProof/>
-        </w:rPr>
-        <w:t>10</w:t>
-      </w:r>
-      <w:r>
-        <w:rPr>
-          <w:noProof/>
-        </w:rPr>
-        <w:fldChar w:fldCharType="end"/>
-      </w:r>
-    </w:p>
-    <w:p>
-      <w:pPr>
-        <w:pStyle w:val="TOC2"/>
-        <w:tabs>
-          <w:tab w:val="right" w:leader="dot" w:pos="9016"/>
-        </w:tabs>
-        <w:rPr>
-          <w:rFonts w:asciiTheme="minorHAnsi" w:hAnsiTheme="minorHAnsi" w:cstheme="minorBidi"/>
-          <w:noProof/>
-        </w:rPr>
-      </w:pPr>
-      <w:r>
-        <w:rPr>
-          <w:noProof/>
-        </w:rPr>
-        <w:t>3.4 Selected Standards and Practices</w:t>
-      </w:r>
-      <w:r>
-        <w:rPr>
-          <w:noProof/>
-        </w:rPr>
-        <w:tab/>
-      </w:r>
-      <w:r>
-        <w:rPr>
-          <w:noProof/>
-        </w:rPr>
-        <w:fldChar w:fldCharType="begin"/>
-      </w:r>
-      <w:r>
-        <w:rPr>
-          <w:noProof/>
-        </w:rPr>
-        <w:instrText xml:space="preserve"> PAGEREF _Toc244220722 \h </w:instrText>
-      </w:r>
-      <w:r>
-        <w:rPr>
-          <w:noProof/>
-        </w:rPr>
-      </w:r>
-      <w:r>
-        <w:rPr>
-          <w:noProof/>
-        </w:rPr>
-        <w:fldChar w:fldCharType="separate"/>
-      </w:r>
-      <w:r>
-        <w:rPr>
-          <w:noProof/>
-        </w:rPr>
-        <w:t>10</w:t>
-      </w:r>
-      <w:r>
-        <w:rPr>
-          <w:noProof/>
-        </w:rPr>
-        <w:fldChar w:fldCharType="end"/>
-      </w:r>
-    </w:p>
-    <w:p>
-      <w:pPr>
-        <w:pStyle w:val="TOC2"/>
-        <w:tabs>
-          <w:tab w:val="right" w:leader="dot" w:pos="9016"/>
-        </w:tabs>
-        <w:rPr>
-          <w:rFonts w:asciiTheme="minorHAnsi" w:hAnsiTheme="minorHAnsi" w:cstheme="minorBidi"/>
-          <w:noProof/>
-        </w:rPr>
-      </w:pPr>
-      <w:r>
-        <w:rPr>
-          <w:noProof/>
-        </w:rPr>
-        <w:t>3.5 Applying the QA Process within Kanban</w:t>
-      </w:r>
-      <w:r>
-        <w:rPr>
-          <w:noProof/>
-        </w:rPr>
-        <w:tab/>
-      </w:r>
-      <w:r>
-        <w:rPr>
-          <w:noProof/>
-        </w:rPr>
-        <w:fldChar w:fldCharType="begin"/>
-      </w:r>
-      <w:r>
-        <w:rPr>
-          <w:noProof/>
-        </w:rPr>
-        <w:instrText xml:space="preserve"> PAGEREF _Toc244220723 \h </w:instrText>
-      </w:r>
-      <w:r>
-        <w:rPr>
-          <w:noProof/>
-        </w:rPr>
-      </w:r>
-      <w:r>
-        <w:rPr>
-          <w:noProof/>
-        </w:rPr>
-        <w:fldChar w:fldCharType="separate"/>
-      </w:r>
-      <w:r>
-        <w:rPr>
-          <w:noProof/>
-        </w:rPr>
-        <w:t>11</w:t>
-      </w:r>
-      <w:r>
-        <w:rPr>
-          <w:noProof/>
-        </w:rPr>
-        <w:fldChar w:fldCharType="end"/>
-      </w:r>
-    </w:p>
-    <w:p>
-      <w:pPr>
-        <w:pStyle w:val="TOC2"/>
-        <w:tabs>
-          <w:tab w:val="right" w:leader="dot" w:pos="9016"/>
-        </w:tabs>
-        <w:rPr>
-          <w:rFonts w:asciiTheme="minorHAnsi" w:hAnsiTheme="minorHAnsi" w:cstheme="minorBidi"/>
-          <w:noProof/>
-        </w:rPr>
-      </w:pPr>
-      <w:r>
-        <w:rPr>
-          <w:noProof/>
-        </w:rPr>
-        <w:t>3.6 Critical Evaluation</w:t>
-      </w:r>
-      <w:r>
-        <w:rPr>
-          <w:noProof/>
-        </w:rPr>
-        <w:tab/>
-      </w:r>
-      <w:r>
-        <w:rPr>
-          <w:noProof/>
-        </w:rPr>
-        <w:fldChar w:fldCharType="begin"/>
-      </w:r>
-      <w:r>
-        <w:rPr>
-          <w:noProof/>
-        </w:rPr>
-        <w:instrText xml:space="preserve"> PAGEREF _Toc244220724 \h </w:instrText>
-      </w:r>
-      <w:r>
-        <w:rPr>
-          <w:noProof/>
-        </w:rPr>
-      </w:r>
-      <w:r>
-        <w:rPr>
-          <w:noProof/>
-        </w:rPr>
-        <w:fldChar w:fldCharType="separate"/>
-      </w:r>
-      <w:r>
-        <w:rPr>
-          <w:noProof/>
-        </w:rPr>
-        <w:t>12</w:t>
-      </w:r>
-      <w:r>
-        <w:rPr>
-          <w:noProof/>
-        </w:rPr>
-        <w:fldChar w:fldCharType="end"/>
-      </w:r>
-    </w:p>
-    <w:p>
-      <w:pPr>
-        <w:pStyle w:val="TOC1"/>
-        <w:tabs>
-          <w:tab w:val="right" w:leader="dot" w:pos="9016"/>
-        </w:tabs>
-        <w:rPr>
-          <w:rFonts w:asciiTheme="minorHAnsi" w:hAnsiTheme="minorHAnsi" w:cstheme="minorBidi"/>
-          <w:b w:val="0"/>
-          <w:noProof/>
-        </w:rPr>
-      </w:pPr>
-      <w:r>
-        <w:rPr>
-          <w:noProof/>
-        </w:rPr>
-        <w:t>4.0 Integrating IV&amp;V with Kanban</w:t>
-      </w:r>
-      <w:r>
-        <w:rPr>
-          <w:noProof/>
-        </w:rPr>
-        <w:tab/>
-      </w:r>
-      <w:r>
-        <w:rPr>
-          <w:noProof/>
-        </w:rPr>
-        <w:fldChar w:fldCharType="begin"/>
-      </w:r>
-      <w:r>
-        <w:rPr>
-          <w:noProof/>
-        </w:rPr>
-        <w:instrText xml:space="preserve"> PAGEREF _Toc244220725 \h </w:instrText>
-      </w:r>
-      <w:r>
-        <w:rPr>
-          <w:noProof/>
-        </w:rPr>
-      </w:r>
-      <w:r>
-        <w:rPr>
-          <w:noProof/>
-        </w:rPr>
-        <w:fldChar w:fldCharType="separate"/>
-      </w:r>
-      <w:r>
-        <w:rPr>
-          <w:noProof/>
-        </w:rPr>
-        <w:t>13</w:t>
-      </w:r>
-      <w:r>
-        <w:rPr>
-          <w:noProof/>
-        </w:rPr>
-        <w:fldChar w:fldCharType="end"/>
-      </w:r>
-    </w:p>
-    <w:p>
-      <w:pPr>
-        <w:pStyle w:val="TOC2"/>
-        <w:tabs>
-          <w:tab w:val="right" w:leader="dot" w:pos="9016"/>
-        </w:tabs>
-        <w:rPr>
-          <w:rFonts w:asciiTheme="minorHAnsi" w:hAnsiTheme="minorHAnsi" w:cstheme="minorBidi"/>
-          <w:noProof/>
-        </w:rPr>
-      </w:pPr>
-      <w:r>
-        <w:rPr>
-          <w:noProof/>
-        </w:rPr>
-        <w:t>4.1 Current V&amp;V in Actual and Its Independence</w:t>
-      </w:r>
-      <w:r>
-        <w:rPr>
-          <w:noProof/>
-        </w:rPr>
-        <w:tab/>
-      </w:r>
-      <w:r>
-        <w:rPr>
-          <w:noProof/>
-        </w:rPr>
-        <w:fldChar w:fldCharType="begin"/>
-      </w:r>
-      <w:r>
-        <w:rPr>
-          <w:noProof/>
-        </w:rPr>
-        <w:instrText xml:space="preserve"> PAGEREF _Toc244220726 \h </w:instrText>
-      </w:r>
-      <w:r>
-        <w:rPr>
-          <w:noProof/>
-        </w:rPr>
-      </w:r>
-      <w:r>
-        <w:rPr>
-          <w:noProof/>
-        </w:rPr>
-        <w:fldChar w:fldCharType="separate"/>
-      </w:r>
-      <w:r>
-        <w:rPr>
-          <w:noProof/>
-        </w:rPr>
-        <w:t>13</w:t>
-      </w:r>
-      <w:r>
-        <w:rPr>
-          <w:noProof/>
-        </w:rPr>
-        <w:fldChar w:fldCharType="end"/>
-      </w:r>
-    </w:p>
-    <w:p>
-      <w:pPr>
-        <w:pStyle w:val="TOC2"/>
-        <w:tabs>
-          <w:tab w:val="right" w:leader="dot" w:pos="9016"/>
-        </w:tabs>
-        <w:rPr>
-          <w:rFonts w:asciiTheme="minorHAnsi" w:hAnsiTheme="minorHAnsi" w:cstheme="minorBidi"/>
-          <w:noProof/>
-        </w:rPr>
-      </w:pPr>
-      <w:r>
-        <w:rPr>
-          <w:noProof/>
-        </w:rPr>
-        <w:t>4.2 IV&amp;V Integration Model for Kanban</w:t>
-      </w:r>
-      <w:r>
-        <w:rPr>
-          <w:noProof/>
-        </w:rPr>
-        <w:tab/>
-      </w:r>
-      <w:r>
-        <w:rPr>
-          <w:noProof/>
-        </w:rPr>
-        <w:fldChar w:fldCharType="begin"/>
-      </w:r>
-      <w:r>
-        <w:rPr>
-          <w:noProof/>
-        </w:rPr>
-        <w:instrText xml:space="preserve"> PAGEREF _Toc244220727 \h </w:instrText>
-      </w:r>
-      <w:r>
-        <w:rPr>
-          <w:noProof/>
-        </w:rPr>
-      </w:r>
-      <w:r>
-        <w:rPr>
-          <w:noProof/>
-        </w:rPr>
-        <w:fldChar w:fldCharType="separate"/>
-      </w:r>
-      <w:r>
-        <w:rPr>
-          <w:noProof/>
-        </w:rPr>
-        <w:t>14</w:t>
-      </w:r>
-      <w:r>
-        <w:rPr>
-          <w:noProof/>
-        </w:rPr>
-        <w:fldChar w:fldCharType="end"/>
-      </w:r>
-    </w:p>
-    <w:p>
-      <w:pPr>
-        <w:pStyle w:val="TOC2"/>
-        <w:tabs>
-          <w:tab w:val="right" w:leader="dot" w:pos="9016"/>
-        </w:tabs>
-        <w:rPr>
-          <w:rFonts w:asciiTheme="minorHAnsi" w:hAnsiTheme="minorHAnsi" w:cstheme="minorBidi"/>
-          <w:noProof/>
-        </w:rPr>
-      </w:pPr>
-      <w:r>
-        <w:rPr>
-          <w:noProof/>
-        </w:rPr>
-        <w:t>4.3 How the Integration Meets the Three Goals</w:t>
-      </w:r>
-      <w:r>
-        <w:rPr>
-          <w:noProof/>
-        </w:rPr>
-        <w:tab/>
-      </w:r>
-      <w:r>
-        <w:rPr>
-          <w:noProof/>
-        </w:rPr>
-        <w:fldChar w:fldCharType="begin"/>
-      </w:r>
-      <w:r>
-        <w:rPr>
-          <w:noProof/>
-        </w:rPr>
-        <w:instrText xml:space="preserve"> PAGEREF _Toc244220728 \h </w:instrText>
-      </w:r>
-      <w:r>
-        <w:rPr>
-          <w:noProof/>
-        </w:rPr>
-      </w:r>
-      <w:r>
-        <w:rPr>
-          <w:noProof/>
-        </w:rPr>
-        <w:fldChar w:fldCharType="separate"/>
-      </w:r>
-      <w:r>
-        <w:rPr>
-          <w:noProof/>
-        </w:rPr>
-        <w:t>15</w:t>
-      </w:r>
-      <w:r>
-        <w:rPr>
-          <w:noProof/>
-        </w:rPr>
-        <w:fldChar w:fldCharType="end"/>
-      </w:r>
-    </w:p>
-    <w:p>
-      <w:pPr>
-        <w:pStyle w:val="TOC1"/>
-        <w:tabs>
-          <w:tab w:val="right" w:leader="dot" w:pos="9016"/>
-        </w:tabs>
-        <w:rPr>
-          <w:rFonts w:asciiTheme="minorHAnsi" w:hAnsiTheme="minorHAnsi" w:cstheme="minorBidi"/>
-          <w:b w:val="0"/>
-          <w:noProof/>
-        </w:rPr>
-      </w:pPr>
-      <w:r>
-        <w:rPr>
-          <w:noProof/>
-        </w:rPr>
-        <w:t>References</w:t>
-      </w:r>
-      <w:r>
-        <w:rPr>
-          <w:noProof/>
-        </w:rPr>
-        <w:tab/>
-      </w:r>
-      <w:r>
-        <w:rPr>
-          <w:noProof/>
-        </w:rPr>
-        <w:fldChar w:fldCharType="begin"/>
-      </w:r>
-      <w:r>
-        <w:rPr>
-          <w:noProof/>
-        </w:rPr>
-        <w:instrText xml:space="preserve"> PAGEREF _Toc244220729 \h </w:instrText>
-      </w:r>
-      <w:r>
-        <w:rPr>
-          <w:noProof/>
-        </w:rPr>
-      </w:r>
-      <w:r>
-        <w:rPr>
-          <w:noProof/>
-        </w:rPr>
-        <w:fldChar w:fldCharType="separate"/>
-      </w:r>
-      <w:r>
-        <w:rPr>
-          <w:noProof/>
-        </w:rPr>
-        <w:t>17</w:t>
-      </w:r>
-      <w:r>
-        <w:rPr>
-          <w:noProof/>
-        </w:rPr>
-        <w:fldChar w:fldCharType="end"/>
-      </w:r>
-    </w:p>
-    <w:p>
-      <w:pPr>
-        <w:pStyle w:val="TOC1"/>
-        <w:tabs>
-          <w:tab w:val="right" w:leader="dot" w:pos="9016"/>
-        </w:tabs>
-        <w:rPr>
-          <w:rFonts w:asciiTheme="minorHAnsi" w:hAnsiTheme="minorHAnsi" w:cstheme="minorBidi"/>
-          <w:b w:val="0"/>
-          <w:noProof/>
-        </w:rPr>
-      </w:pPr>
-      <w:r>
-        <w:rPr>
-          <w:noProof/>
-        </w:rPr>
-        <w:t>Appendix A: Methodology Selection</w:t>
-      </w:r>
-      <w:r>
-        <w:rPr>
-          <w:noProof/>
-        </w:rPr>
-        <w:tab/>
-      </w:r>
-      <w:r>
-        <w:rPr>
-          <w:noProof/>
-        </w:rPr>
-        <w:fldChar w:fldCharType="begin"/>
-      </w:r>
-      <w:r>
-        <w:rPr>
-          <w:noProof/>
-        </w:rPr>
-        <w:instrText xml:space="preserve"> PAGEREF _Toc244220730 \h </w:instrText>
-      </w:r>
-      <w:r>
-        <w:rPr>
-          <w:noProof/>
-        </w:rPr>
-      </w:r>
-      <w:r>
-        <w:rPr>
-          <w:noProof/>
-        </w:rPr>
-        <w:fldChar w:fldCharType="separate"/>
-      </w:r>
-      <w:r>
-        <w:rPr>
-          <w:noProof/>
-        </w:rPr>
-        <w:t>20</w:t>
-      </w:r>
-      <w:r>
-        <w:rPr>
-          <w:noProof/>
-        </w:rPr>
-        <w:fldChar w:fldCharType="end"/>
-      </w:r>
-    </w:p>
-    <w:p>
-      <w:pPr>
-        <w:pStyle w:val="TOC2"/>
-        <w:tabs>
-          <w:tab w:val="right" w:leader="dot" w:pos="9016"/>
-        </w:tabs>
-        <w:rPr>
-          <w:rFonts w:asciiTheme="minorHAnsi" w:hAnsiTheme="minorHAnsi" w:cstheme="minorBidi"/>
-          <w:noProof/>
-        </w:rPr>
-      </w:pPr>
-      <w:r>
-        <w:rPr>
-          <w:noProof/>
-        </w:rPr>
-        <w:t>A.1 Project Characteristics and Requirements</w:t>
-      </w:r>
-      <w:r>
-        <w:rPr>
-          <w:noProof/>
-        </w:rPr>
-        <w:tab/>
-      </w:r>
-      <w:r>
-        <w:rPr>
-          <w:noProof/>
-        </w:rPr>
-        <w:fldChar w:fldCharType="begin"/>
-      </w:r>
-      <w:r>
-        <w:rPr>
-          <w:noProof/>
-        </w:rPr>
-        <w:instrText xml:space="preserve"> PAGEREF _Toc244220731 \h </w:instrText>
-      </w:r>
-      <w:r>
-        <w:rPr>
-          <w:noProof/>
-        </w:rPr>
-      </w:r>
-      <w:r>
-        <w:rPr>
-          <w:noProof/>
-        </w:rPr>
-        <w:fldChar w:fldCharType="separate"/>
-      </w:r>
-      <w:r>
-        <w:rPr>
-          <w:noProof/>
-        </w:rPr>
-        <w:t>20</w:t>
-      </w:r>
-      <w:r>
-        <w:rPr>
-          <w:noProof/>
-        </w:rPr>
-        <w:fldChar w:fldCharType="end"/>
-      </w:r>
-    </w:p>
-    <w:p>
-      <w:pPr>
-        <w:pStyle w:val="TOC2"/>
-        <w:tabs>
-          <w:tab w:val="right" w:leader="dot" w:pos="9016"/>
-        </w:tabs>
-        <w:rPr>
-          <w:rFonts w:asciiTheme="minorHAnsi" w:hAnsiTheme="minorHAnsi" w:cstheme="minorBidi"/>
-          <w:noProof/>
-        </w:rPr>
-      </w:pPr>
-      <w:r>
-        <w:rPr>
-          <w:noProof/>
-        </w:rPr>
-        <w:t>A.2 Candidate Methodologies</w:t>
-      </w:r>
-      <w:r>
-        <w:rPr>
-          <w:noProof/>
-        </w:rPr>
-        <w:tab/>
-      </w:r>
-      <w:r>
-        <w:rPr>
-          <w:noProof/>
-        </w:rPr>
-        <w:fldChar w:fldCharType="begin"/>
-      </w:r>
-      <w:r>
-        <w:rPr>
-          <w:noProof/>
-        </w:rPr>
-        <w:instrText xml:space="preserve"> PAGEREF _Toc244220732 \h </w:instrText>
-      </w:r>
-      <w:r>
-        <w:rPr>
-          <w:noProof/>
-        </w:rPr>
-      </w:r>
-      <w:r>
-        <w:rPr>
-          <w:noProof/>
-        </w:rPr>
-        <w:fldChar w:fldCharType="separate"/>
-      </w:r>
-      <w:r>
-        <w:rPr>
-          <w:noProof/>
-        </w:rPr>
-        <w:t>21</w:t>
-      </w:r>
-      <w:r>
-        <w:rPr>
-          <w:noProof/>
-        </w:rPr>
-        <w:fldChar w:fldCharType="end"/>
-      </w:r>
-    </w:p>
-    <w:p>
-      <w:pPr>
-        <w:pStyle w:val="TOC2"/>
-        <w:tabs>
-          <w:tab w:val="right" w:leader="dot" w:pos="9016"/>
-        </w:tabs>
-        <w:rPr>
-          <w:rFonts w:asciiTheme="minorHAnsi" w:hAnsiTheme="minorHAnsi" w:cstheme="minorBidi"/>
-          <w:noProof/>
-        </w:rPr>
-      </w:pPr>
-      <w:r>
-        <w:rPr>
-          <w:noProof/>
-        </w:rPr>
-        <w:t>A.3 Evaluation and Selection</w:t>
-      </w:r>
-      <w:r>
-        <w:rPr>
-          <w:noProof/>
-        </w:rPr>
-        <w:tab/>
-      </w:r>
-      <w:r>
-        <w:rPr>
-          <w:noProof/>
-        </w:rPr>
-        <w:fldChar w:fldCharType="begin"/>
-      </w:r>
-      <w:r>
-        <w:rPr>
-          <w:noProof/>
-        </w:rPr>
-        <w:instrText xml:space="preserve"> PAGEREF _Toc244220733 \h </w:instrText>
-      </w:r>
-      <w:r>
-        <w:rPr>
-          <w:noProof/>
-        </w:rPr>
-      </w:r>
-      <w:r>
-        <w:rPr>
-          <w:noProof/>
-        </w:rPr>
-        <w:fldChar w:fldCharType="separate"/>
-      </w:r>
-      <w:r>
-        <w:rPr>
-          <w:noProof/>
-        </w:rPr>
-        <w:t>21</w:t>
-      </w:r>
-      <w:r>
-        <w:rPr>
-          <w:noProof/>
-        </w:rPr>
-        <w:fldChar w:fldCharType="end"/>
-      </w:r>
-    </w:p>
-    <w:p>
-      <w:pPr>
-        <w:pStyle w:val="TOC1"/>
-        <w:tabs>
-          <w:tab w:val="right" w:leader="dot" w:pos="9016"/>
-        </w:tabs>
-        <w:rPr>
-          <w:rFonts w:asciiTheme="minorHAnsi" w:hAnsiTheme="minorHAnsi" w:cstheme="minorBidi"/>
-          <w:b w:val="0"/>
-          <w:noProof/>
-        </w:rPr>
-      </w:pPr>
-      <w:r>
-        <w:rPr>
-          <w:noProof/>
-        </w:rPr>
-        <w:t>Appendix B: Worked Example of the QA Plan</w:t>
-      </w:r>
-      <w:r>
-        <w:rPr>
-          <w:noProof/>
-        </w:rPr>
-        <w:tab/>
-      </w:r>
-      <w:r>
-        <w:rPr>
-          <w:noProof/>
-        </w:rPr>
-        <w:fldChar w:fldCharType="begin"/>
-      </w:r>
-      <w:r>
-        <w:rPr>
-          <w:noProof/>
-        </w:rPr>
-        <w:instrText xml:space="preserve"> PAGEREF _Toc244220734 \h </w:instrText>
-      </w:r>
-      <w:r>
-        <w:rPr>
-          <w:noProof/>
-        </w:rPr>
-      </w:r>
-      <w:r>
-        <w:rPr>
-          <w:noProof/>
-        </w:rPr>
-        <w:fldChar w:fldCharType="separate"/>
-      </w:r>
-      <w:r>
-        <w:rPr>
-          <w:noProof/>
-        </w:rPr>
-        <w:t>24</w:t>
-      </w:r>
-      <w:r>
-        <w:rPr>
-          <w:noProof/>
-        </w:rPr>
-        <w:fldChar w:fldCharType="end"/>
-      </w:r>
-    </w:p>
-    <w:p>
-      <w:r>
-        <w:fldChar w:fldCharType="end"/>
-      </w:r>
-    </w:p>
+          <w:color w:val="auto"/>
+          <w:sz w:val="24"/>
+          <w:szCs w:val="24"/>
+        </w:rPr>
+      </w:sdtEndPr>
+      <w:sdtContent>
+        <w:p>
+          <w:pPr>
+            <w:pStyle w:val="TOCHeading"/>
+          </w:pPr>
+          <w:r>
+            <w:t>Table of Contents</w:t>
+          </w:r>
+        </w:p>
+        <w:p>
+          <w:pPr>
+            <w:pStyle w:val="TOC1"/>
+            <w:tabs>
+              <w:tab w:val="right" w:leader="dot" w:pos="9016"/>
+            </w:tabs>
+            <w:rPr>
+              <w:rFonts w:asciiTheme="minorHAnsi" w:hAnsiTheme="minorHAnsi" w:cstheme="minorBidi"/>
+              <w:b w:val="0"/>
+              <w:noProof/>
+            </w:rPr>
+          </w:pPr>
+          <w:r>
+            <w:rPr>
+              <w:b w:val="0"/>
+            </w:rPr>
+            <w:fldChar w:fldCharType="begin"/>
+          </w:r>
+          <w:r>
+            <w:rPr>
+              <w:b w:val="0"/>
+            </w:rPr>
+            <w:instrText xml:space="preserve"> TOC \o "1-2" \h \z \u </w:instrText>
+          </w:r>
+          <w:r>
+            <w:rPr>
+              <w:b w:val="0"/>
+            </w:rPr>
+            <w:fldChar w:fldCharType="separate"/>
+          </w:r>
+          <w:hyperlink w:anchor="_Toc244220827" w:history="1">
+            <w:r>
+              <w:rPr>
+                <w:rStyle w:val="Hyperlink"/>
+                <w:noProof/>
+              </w:rPr>
+              <w:t>Executive Summary</w:t>
+            </w:r>
+            <w:r>
+              <w:rPr>
+                <w:noProof/>
+                <w:webHidden/>
+              </w:rPr>
+              <w:tab/>
+            </w:r>
+            <w:r>
+              <w:rPr>
+                <w:noProof/>
+                <w:webHidden/>
+              </w:rPr>
+              <w:fldChar w:fldCharType="begin"/>
+            </w:r>
+            <w:r>
+              <w:rPr>
+                <w:noProof/>
+                <w:webHidden/>
+              </w:rPr>
+              <w:instrText xml:space="preserve"> PAGEREF _Toc244220827 \h </w:instrText>
+            </w:r>
+            <w:r>
+              <w:rPr>
+                <w:noProof/>
+                <w:webHidden/>
+              </w:rPr>
+            </w:r>
+            <w:r>
+              <w:rPr>
+                <w:noProof/>
+                <w:webHidden/>
+              </w:rPr>
+              <w:fldChar w:fldCharType="separate"/>
+            </w:r>
+            <w:r>
+              <w:rPr>
+                <w:noProof/>
+                <w:webHidden/>
+              </w:rPr>
+              <w:t>1</w:t>
+            </w:r>
+            <w:r>
+              <w:rPr>
+                <w:noProof/>
+                <w:webHidden/>
+              </w:rPr>
+              <w:fldChar w:fldCharType="end"/>
+            </w:r>
+          </w:hyperlink>
+        </w:p>
+        <w:p>
+          <w:pPr>
+            <w:pStyle w:val="TOC1"/>
+            <w:tabs>
+              <w:tab w:val="right" w:leader="dot" w:pos="9016"/>
+            </w:tabs>
+            <w:rPr>
+              <w:rFonts w:asciiTheme="minorHAnsi" w:hAnsiTheme="minorHAnsi" w:cstheme="minorBidi"/>
+              <w:b w:val="0"/>
+              <w:noProof/>
+            </w:rPr>
+          </w:pPr>
+          <w:hyperlink w:anchor="_Toc244220828" w:history="1">
+            <w:r>
+              <w:rPr>
+                <w:rStyle w:val="Hyperlink"/>
+                <w:noProof/>
+              </w:rPr>
+              <w:t>1.0 Introduction</w:t>
+            </w:r>
+            <w:r>
+              <w:rPr>
+                <w:noProof/>
+                <w:webHidden/>
+              </w:rPr>
+              <w:tab/>
+            </w:r>
+            <w:r>
+              <w:rPr>
+                <w:noProof/>
+                <w:webHidden/>
+              </w:rPr>
+              <w:fldChar w:fldCharType="begin"/>
+            </w:r>
+            <w:r>
+              <w:rPr>
+                <w:noProof/>
+                <w:webHidden/>
+              </w:rPr>
+              <w:instrText xml:space="preserve"> PAGEREF _Toc244220828 \h </w:instrText>
+            </w:r>
+            <w:r>
+              <w:rPr>
+                <w:noProof/>
+                <w:webHidden/>
+              </w:rPr>
+            </w:r>
+            <w:r>
+              <w:rPr>
+                <w:noProof/>
+                <w:webHidden/>
+              </w:rPr>
+              <w:fldChar w:fldCharType="separate"/>
+            </w:r>
+            <w:r>
+              <w:rPr>
+                <w:noProof/>
+                <w:webHidden/>
+              </w:rPr>
+              <w:t>2</w:t>
+            </w:r>
+            <w:r>
+              <w:rPr>
+                <w:noProof/>
+                <w:webHidden/>
+              </w:rPr>
+              <w:fldChar w:fldCharType="end"/>
+            </w:r>
+          </w:hyperlink>
+        </w:p>
+        <w:p>
+          <w:pPr>
+            <w:pStyle w:val="TOC2"/>
+            <w:tabs>
+              <w:tab w:val="right" w:leader="dot" w:pos="9016"/>
+            </w:tabs>
+            <w:rPr>
+              <w:rFonts w:asciiTheme="minorHAnsi" w:hAnsiTheme="minorHAnsi" w:cstheme="minorBidi"/>
+              <w:noProof/>
+            </w:rPr>
+          </w:pPr>
+          <w:hyperlink w:anchor="_Toc244220829" w:history="1">
+            <w:r>
+              <w:rPr>
+                <w:rStyle w:val="Hyperlink"/>
+                <w:noProof/>
+              </w:rPr>
+              <w:t>1.1 Background and Purpose</w:t>
+            </w:r>
+            <w:r>
+              <w:rPr>
+                <w:noProof/>
+                <w:webHidden/>
+              </w:rPr>
+              <w:tab/>
+            </w:r>
+            <w:r>
+              <w:rPr>
+                <w:noProof/>
+                <w:webHidden/>
+              </w:rPr>
+              <w:fldChar w:fldCharType="begin"/>
+            </w:r>
+            <w:r>
+              <w:rPr>
+                <w:noProof/>
+                <w:webHidden/>
+              </w:rPr>
+              <w:instrText xml:space="preserve"> PAGEREF _Toc244220829 \h </w:instrText>
+            </w:r>
+            <w:r>
+              <w:rPr>
+                <w:noProof/>
+                <w:webHidden/>
+              </w:rPr>
+            </w:r>
+            <w:r>
+              <w:rPr>
+                <w:noProof/>
+                <w:webHidden/>
+              </w:rPr>
+              <w:fldChar w:fldCharType="separate"/>
+            </w:r>
+            <w:r>
+              <w:rPr>
+                <w:noProof/>
+                <w:webHidden/>
+              </w:rPr>
+              <w:t>2</w:t>
+            </w:r>
+            <w:r>
+              <w:rPr>
+                <w:noProof/>
+                <w:webHidden/>
+              </w:rPr>
+              <w:fldChar w:fldCharType="end"/>
+            </w:r>
+          </w:hyperlink>
+        </w:p>
+        <w:p>
+          <w:pPr>
+            <w:pStyle w:val="TOC2"/>
+            <w:tabs>
+              <w:tab w:val="right" w:leader="dot" w:pos="9016"/>
+            </w:tabs>
+            <w:rPr>
+              <w:rFonts w:asciiTheme="minorHAnsi" w:hAnsiTheme="minorHAnsi" w:cstheme="minorBidi"/>
+              <w:noProof/>
+            </w:rPr>
+          </w:pPr>
+          <w:hyperlink w:anchor="_Toc244220830" w:history="1">
+            <w:r>
+              <w:rPr>
+                <w:rStyle w:val="Hyperlink"/>
+                <w:noProof/>
+              </w:rPr>
+              <w:t>1.2 What Is Actual Budget</w:t>
+            </w:r>
+            <w:r>
+              <w:rPr>
+                <w:noProof/>
+                <w:webHidden/>
+              </w:rPr>
+              <w:tab/>
+            </w:r>
+            <w:r>
+              <w:rPr>
+                <w:noProof/>
+                <w:webHidden/>
+              </w:rPr>
+              <w:fldChar w:fldCharType="begin"/>
+            </w:r>
+            <w:r>
+              <w:rPr>
+                <w:noProof/>
+                <w:webHidden/>
+              </w:rPr>
+              <w:instrText xml:space="preserve"> PAGEREF _Toc244220830 \h </w:instrText>
+            </w:r>
+            <w:r>
+              <w:rPr>
+                <w:noProof/>
+                <w:webHidden/>
+              </w:rPr>
+            </w:r>
+            <w:r>
+              <w:rPr>
+                <w:noProof/>
+                <w:webHidden/>
+              </w:rPr>
+              <w:fldChar w:fldCharType="separate"/>
+            </w:r>
+            <w:r>
+              <w:rPr>
+                <w:noProof/>
+                <w:webHidden/>
+              </w:rPr>
+              <w:t>2</w:t>
+            </w:r>
+            <w:r>
+              <w:rPr>
+                <w:noProof/>
+                <w:webHidden/>
+              </w:rPr>
+              <w:fldChar w:fldCharType="end"/>
+            </w:r>
+          </w:hyperlink>
+        </w:p>
+        <w:p>
+          <w:pPr>
+            <w:pStyle w:val="TOC2"/>
+            <w:tabs>
+              <w:tab w:val="right" w:leader="dot" w:pos="9016"/>
+            </w:tabs>
+            <w:rPr>
+              <w:rFonts w:asciiTheme="minorHAnsi" w:hAnsiTheme="minorHAnsi" w:cstheme="minorBidi"/>
+              <w:noProof/>
+            </w:rPr>
+          </w:pPr>
+          <w:hyperlink w:anchor="_Toc244220831" w:history="1">
+            <w:r>
+              <w:rPr>
+                <w:rStyle w:val="Hyperlink"/>
+                <w:noProof/>
+              </w:rPr>
+              <w:t>1.3 Main Features and How It Works</w:t>
+            </w:r>
+            <w:r>
+              <w:rPr>
+                <w:noProof/>
+                <w:webHidden/>
+              </w:rPr>
+              <w:tab/>
+            </w:r>
+            <w:r>
+              <w:rPr>
+                <w:noProof/>
+                <w:webHidden/>
+              </w:rPr>
+              <w:fldChar w:fldCharType="begin"/>
+            </w:r>
+            <w:r>
+              <w:rPr>
+                <w:noProof/>
+                <w:webHidden/>
+              </w:rPr>
+              <w:instrText xml:space="preserve"> PAGEREF _Toc244220831 \h </w:instrText>
+            </w:r>
+            <w:r>
+              <w:rPr>
+                <w:noProof/>
+                <w:webHidden/>
+              </w:rPr>
+            </w:r>
+            <w:r>
+              <w:rPr>
+                <w:noProof/>
+                <w:webHidden/>
+              </w:rPr>
+              <w:fldChar w:fldCharType="separate"/>
+            </w:r>
+            <w:r>
+              <w:rPr>
+                <w:noProof/>
+                <w:webHidden/>
+              </w:rPr>
+              <w:t>2</w:t>
+            </w:r>
+            <w:r>
+              <w:rPr>
+                <w:noProof/>
+                <w:webHidden/>
+              </w:rPr>
+              <w:fldChar w:fldCharType="end"/>
+            </w:r>
+          </w:hyperlink>
+        </w:p>
+        <w:p>
+          <w:pPr>
+            <w:pStyle w:val="TOC2"/>
+            <w:tabs>
+              <w:tab w:val="right" w:leader="dot" w:pos="9016"/>
+            </w:tabs>
+            <w:rPr>
+              <w:rFonts w:asciiTheme="minorHAnsi" w:hAnsiTheme="minorHAnsi" w:cstheme="minorBidi"/>
+              <w:noProof/>
+            </w:rPr>
+          </w:pPr>
+          <w:hyperlink w:anchor="_Toc244220832" w:history="1">
+            <w:r>
+              <w:rPr>
+                <w:rStyle w:val="Hyperlink"/>
+                <w:noProof/>
+              </w:rPr>
+              <w:t>1.4 Who Is Involved</w:t>
+            </w:r>
+            <w:r>
+              <w:rPr>
+                <w:noProof/>
+                <w:webHidden/>
+              </w:rPr>
+              <w:tab/>
+            </w:r>
+            <w:r>
+              <w:rPr>
+                <w:noProof/>
+                <w:webHidden/>
+              </w:rPr>
+              <w:fldChar w:fldCharType="begin"/>
+            </w:r>
+            <w:r>
+              <w:rPr>
+                <w:noProof/>
+                <w:webHidden/>
+              </w:rPr>
+              <w:instrText xml:space="preserve"> PAGEREF _Toc244220832 \h </w:instrText>
+            </w:r>
+            <w:r>
+              <w:rPr>
+                <w:noProof/>
+                <w:webHidden/>
+              </w:rPr>
+            </w:r>
+            <w:r>
+              <w:rPr>
+                <w:noProof/>
+                <w:webHidden/>
+              </w:rPr>
+              <w:fldChar w:fldCharType="separate"/>
+            </w:r>
+            <w:r>
+              <w:rPr>
+                <w:noProof/>
+                <w:webHidden/>
+              </w:rPr>
+              <w:t>3</w:t>
+            </w:r>
+            <w:r>
+              <w:rPr>
+                <w:noProof/>
+                <w:webHidden/>
+              </w:rPr>
+              <w:fldChar w:fldCharType="end"/>
+            </w:r>
+          </w:hyperlink>
+        </w:p>
+        <w:p>
+          <w:pPr>
+            <w:pStyle w:val="TOC2"/>
+            <w:tabs>
+              <w:tab w:val="right" w:leader="dot" w:pos="9016"/>
+            </w:tabs>
+            <w:rPr>
+              <w:rFonts w:asciiTheme="minorHAnsi" w:hAnsiTheme="minorHAnsi" w:cstheme="minorBidi"/>
+              <w:noProof/>
+            </w:rPr>
+          </w:pPr>
+          <w:hyperlink w:anchor="_Toc244220833" w:history="1">
+            <w:r>
+              <w:rPr>
+                <w:rStyle w:val="Hyperlink"/>
+                <w:noProof/>
+              </w:rPr>
+              <w:t>1.5 Main Challenges</w:t>
+            </w:r>
+            <w:r>
+              <w:rPr>
+                <w:noProof/>
+                <w:webHidden/>
+              </w:rPr>
+              <w:tab/>
+            </w:r>
+            <w:r>
+              <w:rPr>
+                <w:noProof/>
+                <w:webHidden/>
+              </w:rPr>
+              <w:fldChar w:fldCharType="begin"/>
+            </w:r>
+            <w:r>
+              <w:rPr>
+                <w:noProof/>
+                <w:webHidden/>
+              </w:rPr>
+              <w:instrText xml:space="preserve"> PAGEREF _Toc244220833 \h </w:instrText>
+            </w:r>
+            <w:r>
+              <w:rPr>
+                <w:noProof/>
+                <w:webHidden/>
+              </w:rPr>
+            </w:r>
+            <w:r>
+              <w:rPr>
+                <w:noProof/>
+                <w:webHidden/>
+              </w:rPr>
+              <w:fldChar w:fldCharType="separate"/>
+            </w:r>
+            <w:r>
+              <w:rPr>
+                <w:noProof/>
+                <w:webHidden/>
+              </w:rPr>
+              <w:t>3</w:t>
+            </w:r>
+            <w:r>
+              <w:rPr>
+                <w:noProof/>
+                <w:webHidden/>
+              </w:rPr>
+              <w:fldChar w:fldCharType="end"/>
+            </w:r>
+          </w:hyperlink>
+        </w:p>
+        <w:p>
+          <w:pPr>
+            <w:pStyle w:val="TOC1"/>
+            <w:tabs>
+              <w:tab w:val="right" w:leader="dot" w:pos="9016"/>
+            </w:tabs>
+            <w:rPr>
+              <w:rFonts w:asciiTheme="minorHAnsi" w:hAnsiTheme="minorHAnsi" w:cstheme="minorBidi"/>
+              <w:b w:val="0"/>
+              <w:noProof/>
+            </w:rPr>
+          </w:pPr>
+          <w:hyperlink w:anchor="_Toc244220834" w:history="1">
+            <w:r>
+              <w:rPr>
+                <w:rStyle w:val="Hyperlink"/>
+                <w:noProof/>
+              </w:rPr>
+              <w:t>2.0 Software Development Methodology</w:t>
+            </w:r>
+            <w:r>
+              <w:rPr>
+                <w:noProof/>
+                <w:webHidden/>
+              </w:rPr>
+              <w:tab/>
+            </w:r>
+            <w:r>
+              <w:rPr>
+                <w:noProof/>
+                <w:webHidden/>
+              </w:rPr>
+              <w:fldChar w:fldCharType="begin"/>
+            </w:r>
+            <w:r>
+              <w:rPr>
+                <w:noProof/>
+                <w:webHidden/>
+              </w:rPr>
+              <w:instrText xml:space="preserve"> PAGEREF _Toc244220834 \h </w:instrText>
+            </w:r>
+            <w:r>
+              <w:rPr>
+                <w:noProof/>
+                <w:webHidden/>
+              </w:rPr>
+            </w:r>
+            <w:r>
+              <w:rPr>
+                <w:noProof/>
+                <w:webHidden/>
+              </w:rPr>
+              <w:fldChar w:fldCharType="separate"/>
+            </w:r>
+            <w:r>
+              <w:rPr>
+                <w:noProof/>
+                <w:webHidden/>
+              </w:rPr>
+              <w:t>4</w:t>
+            </w:r>
+            <w:r>
+              <w:rPr>
+                <w:noProof/>
+                <w:webHidden/>
+              </w:rPr>
+              <w:fldChar w:fldCharType="end"/>
+            </w:r>
+          </w:hyperlink>
+        </w:p>
+        <w:p>
+          <w:pPr>
+            <w:pStyle w:val="TOC2"/>
+            <w:tabs>
+              <w:tab w:val="right" w:leader="dot" w:pos="9016"/>
+            </w:tabs>
+            <w:rPr>
+              <w:rFonts w:asciiTheme="minorHAnsi" w:hAnsiTheme="minorHAnsi" w:cstheme="minorBidi"/>
+              <w:noProof/>
+            </w:rPr>
+          </w:pPr>
+          <w:hyperlink w:anchor="_Toc244220835" w:history="1">
+            <w:r>
+              <w:rPr>
+                <w:rStyle w:val="Hyperlink"/>
+                <w:noProof/>
+              </w:rPr>
+              <w:t>2.1 Current Development Process of Actual</w:t>
+            </w:r>
+            <w:r>
+              <w:rPr>
+                <w:noProof/>
+                <w:webHidden/>
+              </w:rPr>
+              <w:tab/>
+            </w:r>
+            <w:r>
+              <w:rPr>
+                <w:noProof/>
+                <w:webHidden/>
+              </w:rPr>
+              <w:fldChar w:fldCharType="begin"/>
+            </w:r>
+            <w:r>
+              <w:rPr>
+                <w:noProof/>
+                <w:webHidden/>
+              </w:rPr>
+              <w:instrText xml:space="preserve"> PAGEREF _Toc244220835 \h </w:instrText>
+            </w:r>
+            <w:r>
+              <w:rPr>
+                <w:noProof/>
+                <w:webHidden/>
+              </w:rPr>
+            </w:r>
+            <w:r>
+              <w:rPr>
+                <w:noProof/>
+                <w:webHidden/>
+              </w:rPr>
+              <w:fldChar w:fldCharType="separate"/>
+            </w:r>
+            <w:r>
+              <w:rPr>
+                <w:noProof/>
+                <w:webHidden/>
+              </w:rPr>
+              <w:t>4</w:t>
+            </w:r>
+            <w:r>
+              <w:rPr>
+                <w:noProof/>
+                <w:webHidden/>
+              </w:rPr>
+              <w:fldChar w:fldCharType="end"/>
+            </w:r>
+          </w:hyperlink>
+        </w:p>
+        <w:p>
+          <w:pPr>
+            <w:pStyle w:val="TOC2"/>
+            <w:tabs>
+              <w:tab w:val="right" w:leader="dot" w:pos="9016"/>
+            </w:tabs>
+            <w:rPr>
+              <w:rFonts w:asciiTheme="minorHAnsi" w:hAnsiTheme="minorHAnsi" w:cstheme="minorBidi"/>
+              <w:noProof/>
+            </w:rPr>
+          </w:pPr>
+          <w:hyperlink w:anchor="_Toc244220836" w:history="1">
+            <w:r>
+              <w:rPr>
+                <w:rStyle w:val="Hyperlink"/>
+                <w:noProof/>
+              </w:rPr>
+              <w:t>2.2 Why Kanban Fits Actual</w:t>
+            </w:r>
+            <w:r>
+              <w:rPr>
+                <w:noProof/>
+                <w:webHidden/>
+              </w:rPr>
+              <w:tab/>
+            </w:r>
+            <w:r>
+              <w:rPr>
+                <w:noProof/>
+                <w:webHidden/>
+              </w:rPr>
+              <w:fldChar w:fldCharType="begin"/>
+            </w:r>
+            <w:r>
+              <w:rPr>
+                <w:noProof/>
+                <w:webHidden/>
+              </w:rPr>
+              <w:instrText xml:space="preserve"> PAGEREF _Toc244220836 \h </w:instrText>
+            </w:r>
+            <w:r>
+              <w:rPr>
+                <w:noProof/>
+                <w:webHidden/>
+              </w:rPr>
+            </w:r>
+            <w:r>
+              <w:rPr>
+                <w:noProof/>
+                <w:webHidden/>
+              </w:rPr>
+              <w:fldChar w:fldCharType="separate"/>
+            </w:r>
+            <w:r>
+              <w:rPr>
+                <w:noProof/>
+                <w:webHidden/>
+              </w:rPr>
+              <w:t>5</w:t>
+            </w:r>
+            <w:r>
+              <w:rPr>
+                <w:noProof/>
+                <w:webHidden/>
+              </w:rPr>
+              <w:fldChar w:fldCharType="end"/>
+            </w:r>
+          </w:hyperlink>
+        </w:p>
+        <w:p>
+          <w:pPr>
+            <w:pStyle w:val="TOC2"/>
+            <w:tabs>
+              <w:tab w:val="right" w:leader="dot" w:pos="9016"/>
+            </w:tabs>
+            <w:rPr>
+              <w:rFonts w:asciiTheme="minorHAnsi" w:hAnsiTheme="minorHAnsi" w:cstheme="minorBidi"/>
+              <w:noProof/>
+            </w:rPr>
+          </w:pPr>
+          <w:hyperlink w:anchor="_Toc244220837" w:history="1">
+            <w:r>
+              <w:rPr>
+                <w:rStyle w:val="Hyperlink"/>
+                <w:noProof/>
+              </w:rPr>
+              <w:t>2.3 Applying Kanban to Actual</w:t>
+            </w:r>
+            <w:r>
+              <w:rPr>
+                <w:noProof/>
+                <w:webHidden/>
+              </w:rPr>
+              <w:tab/>
+            </w:r>
+            <w:r>
+              <w:rPr>
+                <w:noProof/>
+                <w:webHidden/>
+              </w:rPr>
+              <w:fldChar w:fldCharType="begin"/>
+            </w:r>
+            <w:r>
+              <w:rPr>
+                <w:noProof/>
+                <w:webHidden/>
+              </w:rPr>
+              <w:instrText xml:space="preserve"> PAGEREF _Toc244220837 \h </w:instrText>
+            </w:r>
+            <w:r>
+              <w:rPr>
+                <w:noProof/>
+                <w:webHidden/>
+              </w:rPr>
+            </w:r>
+            <w:r>
+              <w:rPr>
+                <w:noProof/>
+                <w:webHidden/>
+              </w:rPr>
+              <w:fldChar w:fldCharType="separate"/>
+            </w:r>
+            <w:r>
+              <w:rPr>
+                <w:noProof/>
+                <w:webHidden/>
+              </w:rPr>
+              <w:t>6</w:t>
+            </w:r>
+            <w:r>
+              <w:rPr>
+                <w:noProof/>
+                <w:webHidden/>
+              </w:rPr>
+              <w:fldChar w:fldCharType="end"/>
+            </w:r>
+          </w:hyperlink>
+        </w:p>
+        <w:p>
+          <w:pPr>
+            <w:pStyle w:val="TOC2"/>
+            <w:tabs>
+              <w:tab w:val="right" w:leader="dot" w:pos="9016"/>
+            </w:tabs>
+            <w:rPr>
+              <w:rFonts w:asciiTheme="minorHAnsi" w:hAnsiTheme="minorHAnsi" w:cstheme="minorBidi"/>
+              <w:noProof/>
+            </w:rPr>
+          </w:pPr>
+          <w:hyperlink w:anchor="_Toc244220838" w:history="1">
+            <w:r>
+              <w:rPr>
+                <w:rStyle w:val="Hyperlink"/>
+                <w:noProof/>
+              </w:rPr>
+              <w:t>2.4 Critical Evaluation</w:t>
+            </w:r>
+            <w:r>
+              <w:rPr>
+                <w:noProof/>
+                <w:webHidden/>
+              </w:rPr>
+              <w:tab/>
+            </w:r>
+            <w:r>
+              <w:rPr>
+                <w:noProof/>
+                <w:webHidden/>
+              </w:rPr>
+              <w:fldChar w:fldCharType="begin"/>
+            </w:r>
+            <w:r>
+              <w:rPr>
+                <w:noProof/>
+                <w:webHidden/>
+              </w:rPr>
+              <w:instrText xml:space="preserve"> PAGEREF _Toc244220838 \h </w:instrText>
+            </w:r>
+            <w:r>
+              <w:rPr>
+                <w:noProof/>
+                <w:webHidden/>
+              </w:rPr>
+            </w:r>
+            <w:r>
+              <w:rPr>
+                <w:noProof/>
+                <w:webHidden/>
+              </w:rPr>
+              <w:fldChar w:fldCharType="separate"/>
+            </w:r>
+            <w:r>
+              <w:rPr>
+                <w:noProof/>
+                <w:webHidden/>
+              </w:rPr>
+              <w:t>7</w:t>
+            </w:r>
+            <w:r>
+              <w:rPr>
+                <w:noProof/>
+                <w:webHidden/>
+              </w:rPr>
+              <w:fldChar w:fldCharType="end"/>
+            </w:r>
+          </w:hyperlink>
+        </w:p>
+        <w:p>
+          <w:pPr>
+            <w:pStyle w:val="TOC1"/>
+            <w:tabs>
+              <w:tab w:val="right" w:leader="dot" w:pos="9016"/>
+            </w:tabs>
+            <w:rPr>
+              <w:rFonts w:asciiTheme="minorHAnsi" w:hAnsiTheme="minorHAnsi" w:cstheme="minorBidi"/>
+              <w:b w:val="0"/>
+              <w:noProof/>
+            </w:rPr>
+          </w:pPr>
+          <w:hyperlink w:anchor="_Toc244220839" w:history="1">
+            <w:r>
+              <w:rPr>
+                <w:rStyle w:val="Hyperlink"/>
+                <w:noProof/>
+              </w:rPr>
+              <w:t>3.0 Quality Assurance Process</w:t>
+            </w:r>
+            <w:r>
+              <w:rPr>
+                <w:noProof/>
+                <w:webHidden/>
+              </w:rPr>
+              <w:tab/>
+            </w:r>
+            <w:r>
+              <w:rPr>
+                <w:noProof/>
+                <w:webHidden/>
+              </w:rPr>
+              <w:fldChar w:fldCharType="begin"/>
+            </w:r>
+            <w:r>
+              <w:rPr>
+                <w:noProof/>
+                <w:webHidden/>
+              </w:rPr>
+              <w:instrText xml:space="preserve"> PAGEREF _Toc244220839 \h </w:instrText>
+            </w:r>
+            <w:r>
+              <w:rPr>
+                <w:noProof/>
+                <w:webHidden/>
+              </w:rPr>
+            </w:r>
+            <w:r>
+              <w:rPr>
+                <w:noProof/>
+                <w:webHidden/>
+              </w:rPr>
+              <w:fldChar w:fldCharType="separate"/>
+            </w:r>
+            <w:r>
+              <w:rPr>
+                <w:noProof/>
+                <w:webHidden/>
+              </w:rPr>
+              <w:t>9</w:t>
+            </w:r>
+            <w:r>
+              <w:rPr>
+                <w:noProof/>
+                <w:webHidden/>
+              </w:rPr>
+              <w:fldChar w:fldCharType="end"/>
+            </w:r>
+          </w:hyperlink>
+        </w:p>
+        <w:p>
+          <w:pPr>
+            <w:pStyle w:val="TOC2"/>
+            <w:tabs>
+              <w:tab w:val="right" w:leader="dot" w:pos="9016"/>
+            </w:tabs>
+            <w:rPr>
+              <w:rFonts w:asciiTheme="minorHAnsi" w:hAnsiTheme="minorHAnsi" w:cstheme="minorBidi"/>
+              <w:noProof/>
+            </w:rPr>
+          </w:pPr>
+          <w:hyperlink w:anchor="_Toc244220840" w:history="1">
+            <w:r>
+              <w:rPr>
+                <w:rStyle w:val="Hyperlink"/>
+                <w:noProof/>
+              </w:rPr>
+              <w:t>3.1 What Quality Means for Actual</w:t>
+            </w:r>
+            <w:r>
+              <w:rPr>
+                <w:noProof/>
+                <w:webHidden/>
+              </w:rPr>
+              <w:tab/>
+            </w:r>
+            <w:r>
+              <w:rPr>
+                <w:noProof/>
+                <w:webHidden/>
+              </w:rPr>
+              <w:fldChar w:fldCharType="begin"/>
+            </w:r>
+            <w:r>
+              <w:rPr>
+                <w:noProof/>
+                <w:webHidden/>
+              </w:rPr>
+              <w:instrText xml:space="preserve"> PAGEREF _Toc244220840 \h </w:instrText>
+            </w:r>
+            <w:r>
+              <w:rPr>
+                <w:noProof/>
+                <w:webHidden/>
+              </w:rPr>
+            </w:r>
+            <w:r>
+              <w:rPr>
+                <w:noProof/>
+                <w:webHidden/>
+              </w:rPr>
+              <w:fldChar w:fldCharType="separate"/>
+            </w:r>
+            <w:r>
+              <w:rPr>
+                <w:noProof/>
+                <w:webHidden/>
+              </w:rPr>
+              <w:t>9</w:t>
+            </w:r>
+            <w:r>
+              <w:rPr>
+                <w:noProof/>
+                <w:webHidden/>
+              </w:rPr>
+              <w:fldChar w:fldCharType="end"/>
+            </w:r>
+          </w:hyperlink>
+        </w:p>
+        <w:p>
+          <w:pPr>
+            <w:pStyle w:val="TOC2"/>
+            <w:tabs>
+              <w:tab w:val="right" w:leader="dot" w:pos="9016"/>
+            </w:tabs>
+            <w:rPr>
+              <w:rFonts w:asciiTheme="minorHAnsi" w:hAnsiTheme="minorHAnsi" w:cstheme="minorBidi"/>
+              <w:noProof/>
+            </w:rPr>
+          </w:pPr>
+          <w:hyperlink w:anchor="_Toc244220841" w:history="1">
+            <w:r>
+              <w:rPr>
+                <w:rStyle w:val="Hyperlink"/>
+                <w:noProof/>
+              </w:rPr>
+              <w:t>3.2 Key Quality Attributes</w:t>
+            </w:r>
+            <w:r>
+              <w:rPr>
+                <w:noProof/>
+                <w:webHidden/>
+              </w:rPr>
+              <w:tab/>
+            </w:r>
+            <w:r>
+              <w:rPr>
+                <w:noProof/>
+                <w:webHidden/>
+              </w:rPr>
+              <w:fldChar w:fldCharType="begin"/>
+            </w:r>
+            <w:r>
+              <w:rPr>
+                <w:noProof/>
+                <w:webHidden/>
+              </w:rPr>
+              <w:instrText xml:space="preserve"> PAGEREF _Toc244220841 \h </w:instrText>
+            </w:r>
+            <w:r>
+              <w:rPr>
+                <w:noProof/>
+                <w:webHidden/>
+              </w:rPr>
+            </w:r>
+            <w:r>
+              <w:rPr>
+                <w:noProof/>
+                <w:webHidden/>
+              </w:rPr>
+              <w:fldChar w:fldCharType="separate"/>
+            </w:r>
+            <w:r>
+              <w:rPr>
+                <w:noProof/>
+                <w:webHidden/>
+              </w:rPr>
+              <w:t>9</w:t>
+            </w:r>
+            <w:r>
+              <w:rPr>
+                <w:noProof/>
+                <w:webHidden/>
+              </w:rPr>
+              <w:fldChar w:fldCharType="end"/>
+            </w:r>
+          </w:hyperlink>
+        </w:p>
+        <w:p>
+          <w:pPr>
+            <w:pStyle w:val="TOC2"/>
+            <w:tabs>
+              <w:tab w:val="right" w:leader="dot" w:pos="9016"/>
+            </w:tabs>
+            <w:rPr>
+              <w:rFonts w:asciiTheme="minorHAnsi" w:hAnsiTheme="minorHAnsi" w:cstheme="minorBidi"/>
+              <w:noProof/>
+            </w:rPr>
+          </w:pPr>
+          <w:hyperlink w:anchor="_Toc244220842" w:history="1">
+            <w:r>
+              <w:rPr>
+                <w:rStyle w:val="Hyperlink"/>
+                <w:noProof/>
+              </w:rPr>
+              <w:t>3.3 Current QA Practices and Gaps</w:t>
+            </w:r>
+            <w:r>
+              <w:rPr>
+                <w:noProof/>
+                <w:webHidden/>
+              </w:rPr>
+              <w:tab/>
+            </w:r>
+            <w:r>
+              <w:rPr>
+                <w:noProof/>
+                <w:webHidden/>
+              </w:rPr>
+              <w:fldChar w:fldCharType="begin"/>
+            </w:r>
+            <w:r>
+              <w:rPr>
+                <w:noProof/>
+                <w:webHidden/>
+              </w:rPr>
+              <w:instrText xml:space="preserve"> PAGEREF _Toc244220842 \h </w:instrText>
+            </w:r>
+            <w:r>
+              <w:rPr>
+                <w:noProof/>
+                <w:webHidden/>
+              </w:rPr>
+            </w:r>
+            <w:r>
+              <w:rPr>
+                <w:noProof/>
+                <w:webHidden/>
+              </w:rPr>
+              <w:fldChar w:fldCharType="separate"/>
+            </w:r>
+            <w:r>
+              <w:rPr>
+                <w:noProof/>
+                <w:webHidden/>
+              </w:rPr>
+              <w:t>10</w:t>
+            </w:r>
+            <w:r>
+              <w:rPr>
+                <w:noProof/>
+                <w:webHidden/>
+              </w:rPr>
+              <w:fldChar w:fldCharType="end"/>
+            </w:r>
+          </w:hyperlink>
+        </w:p>
+        <w:p>
+          <w:pPr>
+            <w:pStyle w:val="TOC2"/>
+            <w:tabs>
+              <w:tab w:val="right" w:leader="dot" w:pos="9016"/>
+            </w:tabs>
+            <w:rPr>
+              <w:rFonts w:asciiTheme="minorHAnsi" w:hAnsiTheme="minorHAnsi" w:cstheme="minorBidi"/>
+              <w:noProof/>
+            </w:rPr>
+          </w:pPr>
+          <w:hyperlink w:anchor="_Toc244220843" w:history="1">
+            <w:r>
+              <w:rPr>
+                <w:rStyle w:val="Hyperlink"/>
+                <w:noProof/>
+              </w:rPr>
+              <w:t>3.4 Selected Standards and Practices</w:t>
+            </w:r>
+            <w:r>
+              <w:rPr>
+                <w:noProof/>
+                <w:webHidden/>
+              </w:rPr>
+              <w:tab/>
+            </w:r>
+            <w:r>
+              <w:rPr>
+                <w:noProof/>
+                <w:webHidden/>
+              </w:rPr>
+              <w:fldChar w:fldCharType="begin"/>
+            </w:r>
+            <w:r>
+              <w:rPr>
+                <w:noProof/>
+                <w:webHidden/>
+              </w:rPr>
+              <w:instrText xml:space="preserve"> PAGEREF _Toc244220843 \h </w:instrText>
+            </w:r>
+            <w:r>
+              <w:rPr>
+                <w:noProof/>
+                <w:webHidden/>
+              </w:rPr>
+            </w:r>
+            <w:r>
+              <w:rPr>
+                <w:noProof/>
+                <w:webHidden/>
+              </w:rPr>
+              <w:fldChar w:fldCharType="separate"/>
+            </w:r>
+            <w:r>
+              <w:rPr>
+                <w:noProof/>
+                <w:webHidden/>
+              </w:rPr>
+              <w:t>10</w:t>
+            </w:r>
+            <w:r>
+              <w:rPr>
+                <w:noProof/>
+                <w:webHidden/>
+              </w:rPr>
+              <w:fldChar w:fldCharType="end"/>
+            </w:r>
+          </w:hyperlink>
+        </w:p>
+        <w:p>
+          <w:pPr>
+            <w:pStyle w:val="TOC2"/>
+            <w:tabs>
+              <w:tab w:val="right" w:leader="dot" w:pos="9016"/>
+            </w:tabs>
+            <w:rPr>
+              <w:rFonts w:asciiTheme="minorHAnsi" w:hAnsiTheme="minorHAnsi" w:cstheme="minorBidi"/>
+              <w:noProof/>
+            </w:rPr>
+          </w:pPr>
+          <w:hyperlink w:anchor="_Toc244220844" w:history="1">
+            <w:r>
+              <w:rPr>
+                <w:rStyle w:val="Hyperlink"/>
+                <w:noProof/>
+              </w:rPr>
+              <w:t>3.5 Applying the QA Process within Kanban</w:t>
+            </w:r>
+            <w:r>
+              <w:rPr>
+                <w:noProof/>
+                <w:webHidden/>
+              </w:rPr>
+              <w:tab/>
+            </w:r>
+            <w:r>
+              <w:rPr>
+                <w:noProof/>
+                <w:webHidden/>
+              </w:rPr>
+              <w:fldChar w:fldCharType="begin"/>
+            </w:r>
+            <w:r>
+              <w:rPr>
+                <w:noProof/>
+                <w:webHidden/>
+              </w:rPr>
+              <w:instrText xml:space="preserve"> PAGEREF _Toc244220844 \h </w:instrText>
+            </w:r>
+            <w:r>
+              <w:rPr>
+                <w:noProof/>
+                <w:webHidden/>
+              </w:rPr>
+            </w:r>
+            <w:r>
+              <w:rPr>
+                <w:noProof/>
+                <w:webHidden/>
+              </w:rPr>
+              <w:fldChar w:fldCharType="separate"/>
+            </w:r>
+            <w:r>
+              <w:rPr>
+                <w:noProof/>
+                <w:webHidden/>
+              </w:rPr>
+              <w:t>11</w:t>
+            </w:r>
+            <w:r>
+              <w:rPr>
+                <w:noProof/>
+                <w:webHidden/>
+              </w:rPr>
+              <w:fldChar w:fldCharType="end"/>
+            </w:r>
+          </w:hyperlink>
+        </w:p>
+        <w:p>
+          <w:pPr>
+            <w:pStyle w:val="TOC2"/>
+            <w:tabs>
+              <w:tab w:val="right" w:leader="dot" w:pos="9016"/>
+            </w:tabs>
+            <w:rPr>
+              <w:rFonts w:asciiTheme="minorHAnsi" w:hAnsiTheme="minorHAnsi" w:cstheme="minorBidi"/>
+              <w:noProof/>
+            </w:rPr>
+          </w:pPr>
+          <w:hyperlink w:anchor="_Toc244220845" w:history="1">
+            <w:r>
+              <w:rPr>
+                <w:rStyle w:val="Hyperlink"/>
+                <w:noProof/>
+              </w:rPr>
+              <w:t>3.6 Critical Evaluation</w:t>
+            </w:r>
+            <w:r>
+              <w:rPr>
+                <w:noProof/>
+                <w:webHidden/>
+              </w:rPr>
+              <w:tab/>
+            </w:r>
+            <w:r>
+              <w:rPr>
+                <w:noProof/>
+                <w:webHidden/>
+              </w:rPr>
+              <w:fldChar w:fldCharType="begin"/>
+            </w:r>
+            <w:r>
+              <w:rPr>
+                <w:noProof/>
+                <w:webHidden/>
+              </w:rPr>
+              <w:instrText xml:space="preserve"> PAGEREF _Toc244220845 \h </w:instrText>
+            </w:r>
+            <w:r>
+              <w:rPr>
+                <w:noProof/>
+                <w:webHidden/>
+              </w:rPr>
+            </w:r>
+            <w:r>
+              <w:rPr>
+                <w:noProof/>
+                <w:webHidden/>
+              </w:rPr>
+              <w:fldChar w:fldCharType="separate"/>
+            </w:r>
+            <w:r>
+              <w:rPr>
+                <w:noProof/>
+                <w:webHidden/>
+              </w:rPr>
+              <w:t>12</w:t>
+            </w:r>
+            <w:r>
+              <w:rPr>
+                <w:noProof/>
+                <w:webHidden/>
+              </w:rPr>
+              <w:fldChar w:fldCharType="end"/>
+            </w:r>
+          </w:hyperlink>
+        </w:p>
+        <w:p>
+          <w:pPr>
+            <w:pStyle w:val="TOC1"/>
+            <w:tabs>
+              <w:tab w:val="right" w:leader="dot" w:pos="9016"/>
+            </w:tabs>
+            <w:rPr>
+              <w:rFonts w:asciiTheme="minorHAnsi" w:hAnsiTheme="minorHAnsi" w:cstheme="minorBidi"/>
+              <w:b w:val="0"/>
+              <w:noProof/>
+            </w:rPr>
+          </w:pPr>
+          <w:hyperlink w:anchor="_Toc244220846" w:history="1">
+            <w:r>
+              <w:rPr>
+                <w:rStyle w:val="Hyperlink"/>
+                <w:noProof/>
+              </w:rPr>
+              <w:t>4.0 Integrating IV&amp;V with Kanban</w:t>
+            </w:r>
+            <w:r>
+              <w:rPr>
+                <w:noProof/>
+                <w:webHidden/>
+              </w:rPr>
+              <w:tab/>
+            </w:r>
+            <w:r>
+              <w:rPr>
+                <w:noProof/>
+                <w:webHidden/>
+              </w:rPr>
+              <w:fldChar w:fldCharType="begin"/>
+            </w:r>
+            <w:r>
+              <w:rPr>
+                <w:noProof/>
+                <w:webHidden/>
+              </w:rPr>
+              <w:instrText xml:space="preserve"> PAGEREF _Toc244220846 \h </w:instrText>
+            </w:r>
+            <w:r>
+              <w:rPr>
+                <w:noProof/>
+                <w:webHidden/>
+              </w:rPr>
+            </w:r>
+            <w:r>
+              <w:rPr>
+                <w:noProof/>
+                <w:webHidden/>
+              </w:rPr>
+              <w:fldChar w:fldCharType="separate"/>
+            </w:r>
+            <w:r>
+              <w:rPr>
+                <w:noProof/>
+                <w:webHidden/>
+              </w:rPr>
+              <w:t>13</w:t>
+            </w:r>
+            <w:r>
+              <w:rPr>
+                <w:noProof/>
+                <w:webHidden/>
+              </w:rPr>
+              <w:fldChar w:fldCharType="end"/>
+            </w:r>
+          </w:hyperlink>
+        </w:p>
+        <w:p>
+          <w:pPr>
+            <w:pStyle w:val="TOC2"/>
+            <w:tabs>
+              <w:tab w:val="right" w:leader="dot" w:pos="9016"/>
+            </w:tabs>
+            <w:rPr>
+              <w:rFonts w:asciiTheme="minorHAnsi" w:hAnsiTheme="minorHAnsi" w:cstheme="minorBidi"/>
+              <w:noProof/>
+            </w:rPr>
+          </w:pPr>
+          <w:hyperlink w:anchor="_Toc244220847" w:history="1">
+            <w:r>
+              <w:rPr>
+                <w:rStyle w:val="Hyperlink"/>
+                <w:noProof/>
+              </w:rPr>
+              <w:t>4.1 Current V&amp;V in Actual and Its Independence</w:t>
+            </w:r>
+            <w:r>
+              <w:rPr>
+                <w:noProof/>
+                <w:webHidden/>
+              </w:rPr>
+              <w:tab/>
+            </w:r>
+            <w:r>
+              <w:rPr>
+                <w:noProof/>
+                <w:webHidden/>
+              </w:rPr>
+              <w:fldChar w:fldCharType="begin"/>
+            </w:r>
+            <w:r>
+              <w:rPr>
+                <w:noProof/>
+                <w:webHidden/>
+              </w:rPr>
+              <w:instrText xml:space="preserve"> PAGEREF _Toc244220847 \h </w:instrText>
+            </w:r>
+            <w:r>
+              <w:rPr>
+                <w:noProof/>
+                <w:webHidden/>
+              </w:rPr>
+            </w:r>
+            <w:r>
+              <w:rPr>
+                <w:noProof/>
+                <w:webHidden/>
+              </w:rPr>
+              <w:fldChar w:fldCharType="separate"/>
+            </w:r>
+            <w:r>
+              <w:rPr>
+                <w:noProof/>
+                <w:webHidden/>
+              </w:rPr>
+              <w:t>13</w:t>
+            </w:r>
+            <w:r>
+              <w:rPr>
+                <w:noProof/>
+                <w:webHidden/>
+              </w:rPr>
+              <w:fldChar w:fldCharType="end"/>
+            </w:r>
+          </w:hyperlink>
+        </w:p>
+        <w:p>
+          <w:pPr>
+            <w:pStyle w:val="TOC2"/>
+            <w:tabs>
+              <w:tab w:val="right" w:leader="dot" w:pos="9016"/>
+            </w:tabs>
+            <w:rPr>
+              <w:rFonts w:asciiTheme="minorHAnsi" w:hAnsiTheme="minorHAnsi" w:cstheme="minorBidi"/>
+              <w:noProof/>
+            </w:rPr>
+          </w:pPr>
+          <w:hyperlink w:anchor="_Toc244220848" w:history="1">
+            <w:r>
+              <w:rPr>
+                <w:rStyle w:val="Hyperlink"/>
+                <w:noProof/>
+              </w:rPr>
+              <w:t>4.2 IV&amp;V Integration Model for Kanban</w:t>
+            </w:r>
+            <w:r>
+              <w:rPr>
+                <w:noProof/>
+                <w:webHidden/>
+              </w:rPr>
+              <w:tab/>
+            </w:r>
+            <w:r>
+              <w:rPr>
+                <w:noProof/>
+                <w:webHidden/>
+              </w:rPr>
+              <w:fldChar w:fldCharType="begin"/>
+            </w:r>
+            <w:r>
+              <w:rPr>
+                <w:noProof/>
+                <w:webHidden/>
+              </w:rPr>
+              <w:instrText xml:space="preserve"> PAGEREF _Toc244220848 \h </w:instrText>
+            </w:r>
+            <w:r>
+              <w:rPr>
+                <w:noProof/>
+                <w:webHidden/>
+              </w:rPr>
+            </w:r>
+            <w:r>
+              <w:rPr>
+                <w:noProof/>
+                <w:webHidden/>
+              </w:rPr>
+              <w:fldChar w:fldCharType="separate"/>
+            </w:r>
+            <w:r>
+              <w:rPr>
+                <w:noProof/>
+                <w:webHidden/>
+              </w:rPr>
+              <w:t>14</w:t>
+            </w:r>
+            <w:r>
+              <w:rPr>
+                <w:noProof/>
+                <w:webHidden/>
+              </w:rPr>
+              <w:fldChar w:fldCharType="end"/>
+            </w:r>
+          </w:hyperlink>
+        </w:p>
+        <w:p>
+          <w:pPr>
+            <w:pStyle w:val="TOC2"/>
+            <w:tabs>
+              <w:tab w:val="right" w:leader="dot" w:pos="9016"/>
+            </w:tabs>
+            <w:rPr>
+              <w:rFonts w:asciiTheme="minorHAnsi" w:hAnsiTheme="minorHAnsi" w:cstheme="minorBidi"/>
+              <w:noProof/>
+            </w:rPr>
+          </w:pPr>
+          <w:hyperlink w:anchor="_Toc244220849" w:history="1">
+            <w:r>
+              <w:rPr>
+                <w:rStyle w:val="Hyperlink"/>
+                <w:noProof/>
+              </w:rPr>
+              <w:t>4.3 How the Integration Meets the Three Goals</w:t>
+            </w:r>
+            <w:r>
+              <w:rPr>
+                <w:noProof/>
+                <w:webHidden/>
+              </w:rPr>
+              <w:tab/>
+            </w:r>
+            <w:r>
+              <w:rPr>
+                <w:noProof/>
+                <w:webHidden/>
+              </w:rPr>
+              <w:fldChar w:fldCharType="begin"/>
+            </w:r>
+            <w:r>
+              <w:rPr>
+                <w:noProof/>
+                <w:webHidden/>
+              </w:rPr>
+              <w:instrText xml:space="preserve"> PAGEREF _Toc244220849 \h </w:instrText>
+            </w:r>
+            <w:r>
+              <w:rPr>
+                <w:noProof/>
+                <w:webHidden/>
+              </w:rPr>
+            </w:r>
+            <w:r>
+              <w:rPr>
+                <w:noProof/>
+                <w:webHidden/>
+              </w:rPr>
+              <w:fldChar w:fldCharType="separate"/>
+            </w:r>
+            <w:r>
+              <w:rPr>
+                <w:noProof/>
+                <w:webHidden/>
+              </w:rPr>
+              <w:t>15</w:t>
+            </w:r>
+            <w:r>
+              <w:rPr>
+                <w:noProof/>
+                <w:webHidden/>
+              </w:rPr>
+              <w:fldChar w:fldCharType="end"/>
+            </w:r>
+          </w:hyperlink>
+        </w:p>
+        <w:p>
+          <w:pPr>
+            <w:pStyle w:val="TOC1"/>
+            <w:tabs>
+              <w:tab w:val="right" w:leader="dot" w:pos="9016"/>
+            </w:tabs>
+            <w:rPr>
+              <w:rFonts w:asciiTheme="minorHAnsi" w:hAnsiTheme="minorHAnsi" w:cstheme="minorBidi"/>
+              <w:b w:val="0"/>
+              <w:noProof/>
+            </w:rPr>
+          </w:pPr>
+          <w:hyperlink w:anchor="_Toc244220850" w:history="1">
+            <w:r>
+              <w:rPr>
+                <w:rStyle w:val="Hyperlink"/>
+                <w:noProof/>
+              </w:rPr>
+              <w:t>References</w:t>
+            </w:r>
+            <w:r>
+              <w:rPr>
+                <w:noProof/>
+                <w:webHidden/>
+              </w:rPr>
+              <w:tab/>
+            </w:r>
+            <w:r>
+              <w:rPr>
+                <w:noProof/>
+                <w:webHidden/>
+              </w:rPr>
+              <w:fldChar w:fldCharType="begin"/>
+            </w:r>
+            <w:r>
+              <w:rPr>
+                <w:noProof/>
+                <w:webHidden/>
+              </w:rPr>
+              <w:instrText xml:space="preserve"> PAGEREF _Toc244220850 \h </w:instrText>
+            </w:r>
+            <w:r>
+              <w:rPr>
+                <w:noProof/>
+                <w:webHidden/>
+              </w:rPr>
+            </w:r>
+            <w:r>
+              <w:rPr>
+                <w:noProof/>
+                <w:webHidden/>
+              </w:rPr>
+              <w:fldChar w:fldCharType="separate"/>
+            </w:r>
+            <w:r>
+              <w:rPr>
+                <w:noProof/>
+                <w:webHidden/>
+              </w:rPr>
+              <w:t>17</w:t>
+            </w:r>
+            <w:r>
+              <w:rPr>
+                <w:noProof/>
+                <w:webHidden/>
+              </w:rPr>
+              <w:fldChar w:fldCharType="end"/>
+            </w:r>
+          </w:hyperlink>
+        </w:p>
+        <w:p>
+          <w:pPr>
+            <w:pStyle w:val="TOC1"/>
+            <w:tabs>
+              <w:tab w:val="right" w:leader="dot" w:pos="9016"/>
+            </w:tabs>
+            <w:rPr>
+              <w:rFonts w:asciiTheme="minorHAnsi" w:hAnsiTheme="minorHAnsi" w:cstheme="minorBidi"/>
+              <w:b w:val="0"/>
+              <w:noProof/>
+            </w:rPr>
+          </w:pPr>
+          <w:hyperlink w:anchor="_Toc244220851" w:history="1">
+            <w:r>
+              <w:rPr>
+                <w:rStyle w:val="Hyperlink"/>
+                <w:noProof/>
+              </w:rPr>
+              <w:t>Appendix A: Methodology Selection</w:t>
+            </w:r>
+            <w:r>
+              <w:rPr>
+                <w:noProof/>
+                <w:webHidden/>
+              </w:rPr>
+              <w:tab/>
+            </w:r>
+            <w:r>
+              <w:rPr>
+                <w:noProof/>
+                <w:webHidden/>
+              </w:rPr>
+              <w:fldChar w:fldCharType="begin"/>
+            </w:r>
+            <w:r>
+              <w:rPr>
+                <w:noProof/>
+                <w:webHidden/>
+              </w:rPr>
+              <w:instrText xml:space="preserve"> PAGEREF _Toc244220851 \h </w:instrText>
+            </w:r>
+            <w:r>
+              <w:rPr>
+                <w:noProof/>
+                <w:webHidden/>
+              </w:rPr>
+            </w:r>
+            <w:r>
+              <w:rPr>
+                <w:noProof/>
+                <w:webHidden/>
+              </w:rPr>
+              <w:fldChar w:fldCharType="separate"/>
+            </w:r>
+            <w:r>
+              <w:rPr>
+                <w:noProof/>
+                <w:webHidden/>
+              </w:rPr>
+              <w:t>20</w:t>
+            </w:r>
+            <w:r>
+              <w:rPr>
+                <w:noProof/>
+                <w:webHidden/>
+              </w:rPr>
+              <w:fldChar w:fldCharType="end"/>
+            </w:r>
+          </w:hyperlink>
+        </w:p>
+        <w:p>
+          <w:pPr>
+            <w:pStyle w:val="TOC2"/>
+            <w:tabs>
+              <w:tab w:val="right" w:leader="dot" w:pos="9016"/>
+            </w:tabs>
+            <w:rPr>
+              <w:rFonts w:asciiTheme="minorHAnsi" w:hAnsiTheme="minorHAnsi" w:cstheme="minorBidi"/>
+              <w:noProof/>
+            </w:rPr>
+          </w:pPr>
+          <w:hyperlink w:anchor="_Toc244220852" w:history="1">
+            <w:r>
+              <w:rPr>
+                <w:rStyle w:val="Hyperlink"/>
+                <w:noProof/>
+              </w:rPr>
+              <w:t>A.1 Project Characteristics and Requirements</w:t>
+            </w:r>
+            <w:r>
+              <w:rPr>
+                <w:noProof/>
+                <w:webHidden/>
+              </w:rPr>
+              <w:tab/>
+            </w:r>
+            <w:r>
+              <w:rPr>
+                <w:noProof/>
+                <w:webHidden/>
+              </w:rPr>
+              <w:fldChar w:fldCharType="begin"/>
+            </w:r>
+            <w:r>
+              <w:rPr>
+                <w:noProof/>
+                <w:webHidden/>
+              </w:rPr>
+              <w:instrText xml:space="preserve"> PAGEREF _Toc244220852 \h </w:instrText>
+            </w:r>
+            <w:r>
+              <w:rPr>
+                <w:noProof/>
+                <w:webHidden/>
+              </w:rPr>
+            </w:r>
+            <w:r>
+              <w:rPr>
+                <w:noProof/>
+                <w:webHidden/>
+              </w:rPr>
+              <w:fldChar w:fldCharType="separate"/>
+            </w:r>
+            <w:r>
+              <w:rPr>
+                <w:noProof/>
+                <w:webHidden/>
+              </w:rPr>
+              <w:t>20</w:t>
+            </w:r>
+            <w:r>
+              <w:rPr>
+                <w:noProof/>
+                <w:webHidden/>
+              </w:rPr>
+              <w:fldChar w:fldCharType="end"/>
+            </w:r>
+          </w:hyperlink>
+        </w:p>
+        <w:p>
+          <w:pPr>
+            <w:pStyle w:val="TOC2"/>
+            <w:tabs>
+              <w:tab w:val="right" w:leader="dot" w:pos="9016"/>
+            </w:tabs>
+            <w:rPr>
+              <w:rFonts w:asciiTheme="minorHAnsi" w:hAnsiTheme="minorHAnsi" w:cstheme="minorBidi"/>
+              <w:noProof/>
+            </w:rPr>
+          </w:pPr>
+          <w:hyperlink w:anchor="_Toc244220853" w:history="1">
+            <w:r>
+              <w:rPr>
+                <w:rStyle w:val="Hyperlink"/>
+                <w:noProof/>
+              </w:rPr>
+              <w:t>A.2 Candidate Methodologies</w:t>
+            </w:r>
+            <w:r>
+              <w:rPr>
+                <w:noProof/>
+                <w:webHidden/>
+              </w:rPr>
+              <w:tab/>
+            </w:r>
+            <w:r>
+              <w:rPr>
+                <w:noProof/>
+                <w:webHidden/>
+              </w:rPr>
+              <w:fldChar w:fldCharType="begin"/>
+            </w:r>
+            <w:r>
+              <w:rPr>
+                <w:noProof/>
+                <w:webHidden/>
+              </w:rPr>
+              <w:instrText xml:space="preserve"> PAGEREF _Toc244220853 \h </w:instrText>
+            </w:r>
+            <w:r>
+              <w:rPr>
+                <w:noProof/>
+                <w:webHidden/>
+              </w:rPr>
+            </w:r>
+            <w:r>
+              <w:rPr>
+                <w:noProof/>
+                <w:webHidden/>
+              </w:rPr>
+              <w:fldChar w:fldCharType="separate"/>
+            </w:r>
+            <w:r>
+              <w:rPr>
+                <w:noProof/>
+                <w:webHidden/>
+              </w:rPr>
+              <w:t>21</w:t>
+            </w:r>
+            <w:r>
+              <w:rPr>
+                <w:noProof/>
+                <w:webHidden/>
+              </w:rPr>
+              <w:fldChar w:fldCharType="end"/>
+            </w:r>
+          </w:hyperlink>
+        </w:p>
+        <w:p>
+          <w:pPr>
+            <w:pStyle w:val="TOC2"/>
+            <w:tabs>
+              <w:tab w:val="right" w:leader="dot" w:pos="9016"/>
+            </w:tabs>
+            <w:rPr>
+              <w:rFonts w:asciiTheme="minorHAnsi" w:hAnsiTheme="minorHAnsi" w:cstheme="minorBidi"/>
+              <w:noProof/>
+            </w:rPr>
+          </w:pPr>
+          <w:hyperlink w:anchor="_Toc244220854" w:history="1">
+            <w:r>
+              <w:rPr>
+                <w:rStyle w:val="Hyperlink"/>
+                <w:noProof/>
+              </w:rPr>
+              <w:t>A.3 Evaluation and Selection</w:t>
+            </w:r>
+            <w:r>
+              <w:rPr>
+                <w:noProof/>
+                <w:webHidden/>
+              </w:rPr>
+              <w:tab/>
+            </w:r>
+            <w:r>
+              <w:rPr>
+                <w:noProof/>
+                <w:webHidden/>
+              </w:rPr>
+              <w:fldChar w:fldCharType="begin"/>
+            </w:r>
+            <w:r>
+              <w:rPr>
+                <w:noProof/>
+                <w:webHidden/>
+              </w:rPr>
+              <w:instrText xml:space="preserve"> PAGEREF _Toc244220854 \h </w:instrText>
+            </w:r>
+            <w:r>
+              <w:rPr>
+                <w:noProof/>
+                <w:webHidden/>
+              </w:rPr>
+            </w:r>
+            <w:r>
+              <w:rPr>
+                <w:noProof/>
+                <w:webHidden/>
+              </w:rPr>
+              <w:fldChar w:fldCharType="separate"/>
+            </w:r>
+            <w:r>
+              <w:rPr>
+                <w:noProof/>
+                <w:webHidden/>
+              </w:rPr>
+              <w:t>21</w:t>
+            </w:r>
+            <w:r>
+              <w:rPr>
+                <w:noProof/>
+                <w:webHidden/>
+              </w:rPr>
+              <w:fldChar w:fldCharType="end"/>
+            </w:r>
+          </w:hyperlink>
+        </w:p>
+        <w:p>
+          <w:pPr>
+            <w:pStyle w:val="TOC1"/>
+            <w:tabs>
+              <w:tab w:val="right" w:leader="dot" w:pos="9016"/>
+            </w:tabs>
+            <w:rPr>
+              <w:rFonts w:asciiTheme="minorHAnsi" w:hAnsiTheme="minorHAnsi" w:cstheme="minorBidi"/>
+              <w:b w:val="0"/>
+              <w:noProof/>
+            </w:rPr>
+          </w:pPr>
+          <w:hyperlink w:anchor="_Toc244220855" w:history="1">
+            <w:r>
+              <w:rPr>
+                <w:rStyle w:val="Hyperlink"/>
+                <w:noProof/>
+              </w:rPr>
+              <w:t>Appendix B: Worked Example of the QA Plan</w:t>
+            </w:r>
+            <w:r>
+              <w:rPr>
+                <w:noProof/>
+                <w:webHidden/>
+              </w:rPr>
+              <w:tab/>
+            </w:r>
+            <w:r>
+              <w:rPr>
+                <w:noProof/>
+                <w:webHidden/>
+              </w:rPr>
+              <w:fldChar w:fldCharType="begin"/>
+            </w:r>
+            <w:r>
+              <w:rPr>
+                <w:noProof/>
+                <w:webHidden/>
+              </w:rPr>
+              <w:instrText xml:space="preserve"> PAGEREF _Toc244220855 \h </w:instrText>
+            </w:r>
+            <w:r>
+              <w:rPr>
+                <w:noProof/>
+                <w:webHidden/>
+              </w:rPr>
+            </w:r>
+            <w:r>
+              <w:rPr>
+                <w:noProof/>
+                <w:webHidden/>
+              </w:rPr>
+              <w:fldChar w:fldCharType="separate"/>
+            </w:r>
+            <w:r>
+              <w:rPr>
+                <w:noProof/>
+                <w:webHidden/>
+              </w:rPr>
+              <w:t>24</w:t>
+            </w:r>
+            <w:r>
+              <w:rPr>
+                <w:noProof/>
+                <w:webHidden/>
+              </w:rPr>
+              <w:fldChar w:fldCharType="end"/>
+            </w:r>
+          </w:hyperlink>
+        </w:p>
+        <w:p>
+          <w:r>
+            <w:rPr>
+              <w:b/>
+            </w:rPr>
+            <w:fldChar w:fldCharType="end"/>
+          </w:r>
+        </w:p>
+      </w:sdtContent>
+    </w:sdt>
     <w:p>
       <w:pPr>
         <w:sectPr>
@@ -2427,11 +2704,13 @@
       </w:pPr>
       <w:bookmarkStart w:id="1" w:name="executive-summary"/>
       <w:bookmarkStart w:id="2" w:name="_Toc244220706"/>
+      <w:bookmarkStart w:id="3" w:name="_Toc244220827"/>
       <w:r>
         <w:lastRenderedPageBreak/>
         <w:t>Executive Summary</w:t>
       </w:r>
       <w:bookmarkEnd w:id="2"/>
+      <w:bookmarkEnd w:id="3"/>
     </w:p>
     <w:p>
       <w:pPr>
@@ -2469,25 +2748,29 @@
       <w:pPr>
         <w:pStyle w:val="Heading1"/>
       </w:pPr>
-      <w:bookmarkStart w:id="3" w:name="introduction"/>
-      <w:bookmarkStart w:id="4" w:name="_Toc244220707"/>
+      <w:bookmarkStart w:id="4" w:name="introduction"/>
+      <w:bookmarkStart w:id="5" w:name="_Toc244220707"/>
+      <w:bookmarkStart w:id="6" w:name="_Toc244220828"/>
       <w:bookmarkEnd w:id="1"/>
       <w:r>
         <w:lastRenderedPageBreak/>
         <w:t>Introduction</w:t>
       </w:r>
-      <w:bookmarkEnd w:id="4"/>
+      <w:bookmarkEnd w:id="5"/>
+      <w:bookmarkEnd w:id="6"/>
     </w:p>
     <w:p>
       <w:pPr>
         <w:pStyle w:val="Heading2"/>
       </w:pPr>
-      <w:bookmarkStart w:id="5" w:name="background-and-purpose"/>
-      <w:bookmarkStart w:id="6" w:name="_Toc244220708"/>
+      <w:bookmarkStart w:id="7" w:name="background-and-purpose"/>
+      <w:bookmarkStart w:id="8" w:name="_Toc244220708"/>
+      <w:bookmarkStart w:id="9" w:name="_Toc244220829"/>
       <w:r>
         <w:t>Background and Purpose</w:t>
       </w:r>
-      <w:bookmarkEnd w:id="6"/>
+      <w:bookmarkEnd w:id="8"/>
+      <w:bookmarkEnd w:id="9"/>
     </w:p>
     <w:p>
       <w:pPr>
@@ -2517,13 +2800,15 @@
       <w:pPr>
         <w:pStyle w:val="Heading2"/>
       </w:pPr>
-      <w:bookmarkStart w:id="7" w:name="what-is-actual-budget"/>
-      <w:bookmarkStart w:id="8" w:name="_Toc244220709"/>
-      <w:bookmarkEnd w:id="5"/>
+      <w:bookmarkStart w:id="10" w:name="what-is-actual-budget"/>
+      <w:bookmarkStart w:id="11" w:name="_Toc244220709"/>
+      <w:bookmarkStart w:id="12" w:name="_Toc244220830"/>
+      <w:bookmarkEnd w:id="7"/>
       <w:r>
         <w:t>What Is Actual Budget</w:t>
       </w:r>
-      <w:bookmarkEnd w:id="8"/>
+      <w:bookmarkEnd w:id="11"/>
+      <w:bookmarkEnd w:id="12"/>
     </w:p>
     <w:p>
       <w:pPr>
@@ -2545,13 +2830,15 @@
       <w:pPr>
         <w:pStyle w:val="Heading2"/>
       </w:pPr>
-      <w:bookmarkStart w:id="9" w:name="main-features-and-how-it-works"/>
-      <w:bookmarkStart w:id="10" w:name="_Toc244220710"/>
-      <w:bookmarkEnd w:id="7"/>
+      <w:bookmarkStart w:id="13" w:name="main-features-and-how-it-works"/>
+      <w:bookmarkStart w:id="14" w:name="_Toc244220710"/>
+      <w:bookmarkStart w:id="15" w:name="_Toc244220831"/>
+      <w:bookmarkEnd w:id="10"/>
       <w:r>
         <w:t>Main Features and How It Works</w:t>
       </w:r>
-      <w:bookmarkEnd w:id="10"/>
+      <w:bookmarkEnd w:id="14"/>
+      <w:bookmarkEnd w:id="15"/>
     </w:p>
     <w:p>
       <w:pPr>
@@ -2638,14 +2925,16 @@
       <w:pPr>
         <w:pStyle w:val="Heading2"/>
       </w:pPr>
-      <w:bookmarkStart w:id="11" w:name="who-is-involved"/>
-      <w:bookmarkStart w:id="12" w:name="_Toc244220711"/>
-      <w:bookmarkEnd w:id="9"/>
+      <w:bookmarkStart w:id="16" w:name="who-is-involved"/>
+      <w:bookmarkStart w:id="17" w:name="_Toc244220711"/>
+      <w:bookmarkStart w:id="18" w:name="_Toc244220832"/>
+      <w:bookmarkEnd w:id="13"/>
       <w:r>
         <w:lastRenderedPageBreak/>
         <w:t>Who Is Involved</w:t>
       </w:r>
-      <w:bookmarkEnd w:id="12"/>
+      <w:bookmarkEnd w:id="17"/>
+      <w:bookmarkEnd w:id="18"/>
     </w:p>
     <w:p>
       <w:pPr>
@@ -2914,13 +3203,15 @@
         <w:pStyle w:val="Heading2"/>
         <w:spacing w:before="240"/>
       </w:pPr>
-      <w:bookmarkStart w:id="13" w:name="main-challenges"/>
-      <w:bookmarkStart w:id="14" w:name="_Toc244220712"/>
-      <w:bookmarkEnd w:id="11"/>
+      <w:bookmarkStart w:id="19" w:name="main-challenges"/>
+      <w:bookmarkStart w:id="20" w:name="_Toc244220712"/>
+      <w:bookmarkStart w:id="21" w:name="_Toc244220833"/>
+      <w:bookmarkEnd w:id="16"/>
       <w:r>
         <w:t>Main Challenges</w:t>
       </w:r>
-      <w:bookmarkEnd w:id="14"/>
+      <w:bookmarkEnd w:id="20"/>
+      <w:bookmarkEnd w:id="21"/>
     </w:p>
     <w:p>
       <w:pPr>
@@ -2983,15 +3274,17 @@
       <w:pPr>
         <w:pStyle w:val="Heading1"/>
       </w:pPr>
-      <w:bookmarkStart w:id="15" w:name="software-development-methodology"/>
-      <w:bookmarkStart w:id="16" w:name="_Toc244220713"/>
-      <w:bookmarkEnd w:id="3"/>
-      <w:bookmarkEnd w:id="13"/>
+      <w:bookmarkStart w:id="22" w:name="software-development-methodology"/>
+      <w:bookmarkStart w:id="23" w:name="_Toc244220713"/>
+      <w:bookmarkStart w:id="24" w:name="_Toc244220834"/>
+      <w:bookmarkEnd w:id="4"/>
+      <w:bookmarkEnd w:id="19"/>
       <w:r>
         <w:lastRenderedPageBreak/>
         <w:t>Software Development Methodology</w:t>
       </w:r>
-      <w:bookmarkEnd w:id="16"/>
+      <w:bookmarkEnd w:id="23"/>
+      <w:bookmarkEnd w:id="24"/>
     </w:p>
     <w:p>
       <w:pPr>
@@ -3005,12 +3298,14 @@
       <w:pPr>
         <w:pStyle w:val="Heading2"/>
       </w:pPr>
-      <w:bookmarkStart w:id="17" w:name="current-development-process-of-actual"/>
-      <w:bookmarkStart w:id="18" w:name="_Toc244220714"/>
+      <w:bookmarkStart w:id="25" w:name="current-development-process-of-actual"/>
+      <w:bookmarkStart w:id="26" w:name="_Toc244220714"/>
+      <w:bookmarkStart w:id="27" w:name="_Toc244220835"/>
       <w:r>
         <w:t>Current Development Process of Actual</w:t>
       </w:r>
-      <w:bookmarkEnd w:id="18"/>
+      <w:bookmarkEnd w:id="26"/>
+      <w:bookmarkEnd w:id="27"/>
     </w:p>
     <w:p>
       <w:pPr>
@@ -3114,13 +3409,15 @@
       <w:pPr>
         <w:pStyle w:val="Heading2"/>
       </w:pPr>
-      <w:bookmarkStart w:id="19" w:name="why-kanban-fits-actual"/>
-      <w:bookmarkStart w:id="20" w:name="_Toc244220715"/>
-      <w:bookmarkEnd w:id="17"/>
+      <w:bookmarkStart w:id="28" w:name="why-kanban-fits-actual"/>
+      <w:bookmarkStart w:id="29" w:name="_Toc244220715"/>
+      <w:bookmarkStart w:id="30" w:name="_Toc244220836"/>
+      <w:bookmarkEnd w:id="25"/>
       <w:r>
         <w:t>Why Kanban Fits Actual</w:t>
       </w:r>
-      <w:bookmarkEnd w:id="20"/>
+      <w:bookmarkEnd w:id="29"/>
+      <w:bookmarkEnd w:id="30"/>
     </w:p>
     <w:p>
       <w:pPr>
@@ -3170,13 +3467,15 @@
       <w:pPr>
         <w:pStyle w:val="Heading2"/>
       </w:pPr>
-      <w:bookmarkStart w:id="21" w:name="applying-kanban-to-actual"/>
-      <w:bookmarkStart w:id="22" w:name="_Toc244220716"/>
-      <w:bookmarkEnd w:id="19"/>
+      <w:bookmarkStart w:id="31" w:name="applying-kanban-to-actual"/>
+      <w:bookmarkStart w:id="32" w:name="_Toc244220716"/>
+      <w:bookmarkStart w:id="33" w:name="_Toc244220837"/>
+      <w:bookmarkEnd w:id="28"/>
       <w:r>
         <w:t>Applying Kanban to Actual</w:t>
       </w:r>
-      <w:bookmarkEnd w:id="22"/>
+      <w:bookmarkEnd w:id="32"/>
+      <w:bookmarkEnd w:id="33"/>
     </w:p>
     <w:p>
       <w:pPr>
@@ -3264,13 +3563,15 @@
       <w:pPr>
         <w:pStyle w:val="Heading2"/>
       </w:pPr>
-      <w:bookmarkStart w:id="23" w:name="critical-evaluation"/>
-      <w:bookmarkStart w:id="24" w:name="_Toc244220717"/>
-      <w:bookmarkEnd w:id="21"/>
+      <w:bookmarkStart w:id="34" w:name="critical-evaluation"/>
+      <w:bookmarkStart w:id="35" w:name="_Toc244220717"/>
+      <w:bookmarkStart w:id="36" w:name="_Toc244220838"/>
+      <w:bookmarkEnd w:id="31"/>
       <w:r>
         <w:t>Critical Evaluation</w:t>
       </w:r>
-      <w:bookmarkEnd w:id="24"/>
+      <w:bookmarkEnd w:id="35"/>
+      <w:bookmarkEnd w:id="36"/>
     </w:p>
     <w:p>
       <w:pPr>
@@ -3288,15 +3589,17 @@
       <w:pPr>
         <w:pStyle w:val="Heading1"/>
       </w:pPr>
-      <w:bookmarkStart w:id="25" w:name="quality-assurance-process"/>
-      <w:bookmarkStart w:id="26" w:name="_Toc244220718"/>
-      <w:bookmarkEnd w:id="15"/>
-      <w:bookmarkEnd w:id="23"/>
+      <w:bookmarkStart w:id="37" w:name="quality-assurance-process"/>
+      <w:bookmarkStart w:id="38" w:name="_Toc244220718"/>
+      <w:bookmarkStart w:id="39" w:name="_Toc244220839"/>
+      <w:bookmarkEnd w:id="22"/>
+      <w:bookmarkEnd w:id="34"/>
       <w:r>
         <w:lastRenderedPageBreak/>
         <w:t>Quality Assurance Process</w:t>
       </w:r>
-      <w:bookmarkEnd w:id="26"/>
+      <w:bookmarkEnd w:id="38"/>
+      <w:bookmarkEnd w:id="39"/>
     </w:p>
     <w:p>
       <w:pPr>
@@ -3310,12 +3613,14 @@
       <w:pPr>
         <w:pStyle w:val="Heading2"/>
       </w:pPr>
-      <w:bookmarkStart w:id="27" w:name="what-quality-means-for-actual"/>
-      <w:bookmarkStart w:id="28" w:name="_Toc244220719"/>
+      <w:bookmarkStart w:id="40" w:name="what-quality-means-for-actual"/>
+      <w:bookmarkStart w:id="41" w:name="_Toc244220719"/>
+      <w:bookmarkStart w:id="42" w:name="_Toc244220840"/>
       <w:r>
         <w:t>What Quality Means for Actual</w:t>
       </w:r>
-      <w:bookmarkEnd w:id="28"/>
+      <w:bookmarkEnd w:id="41"/>
+      <w:bookmarkEnd w:id="42"/>
     </w:p>
     <w:p>
       <w:pPr>
@@ -3397,13 +3702,15 @@
       <w:pPr>
         <w:pStyle w:val="Heading2"/>
       </w:pPr>
-      <w:bookmarkStart w:id="29" w:name="key-quality-attributes"/>
-      <w:bookmarkStart w:id="30" w:name="_Toc244220720"/>
-      <w:bookmarkEnd w:id="27"/>
+      <w:bookmarkStart w:id="43" w:name="key-quality-attributes"/>
+      <w:bookmarkStart w:id="44" w:name="_Toc244220720"/>
+      <w:bookmarkStart w:id="45" w:name="_Toc244220841"/>
+      <w:bookmarkEnd w:id="40"/>
       <w:r>
         <w:t>Key Quality Attributes</w:t>
       </w:r>
-      <w:bookmarkEnd w:id="30"/>
+      <w:bookmarkEnd w:id="44"/>
+      <w:bookmarkEnd w:id="45"/>
     </w:p>
     <w:p>
       <w:pPr>
@@ -3453,14 +3760,16 @@
       <w:pPr>
         <w:pStyle w:val="Heading2"/>
       </w:pPr>
-      <w:bookmarkStart w:id="31" w:name="current-qa-practices-and-gaps"/>
-      <w:bookmarkStart w:id="32" w:name="_Toc244220721"/>
-      <w:bookmarkEnd w:id="29"/>
+      <w:bookmarkStart w:id="46" w:name="current-qa-practices-and-gaps"/>
+      <w:bookmarkStart w:id="47" w:name="_Toc244220721"/>
+      <w:bookmarkStart w:id="48" w:name="_Toc244220842"/>
+      <w:bookmarkEnd w:id="43"/>
       <w:r>
         <w:lastRenderedPageBreak/>
         <w:t>Current QA Practices and Gaps</w:t>
       </w:r>
-      <w:bookmarkEnd w:id="32"/>
+      <w:bookmarkEnd w:id="47"/>
+      <w:bookmarkEnd w:id="48"/>
     </w:p>
     <w:p>
       <w:pPr>
@@ -3490,13 +3799,15 @@
       <w:pPr>
         <w:pStyle w:val="Heading2"/>
       </w:pPr>
-      <w:bookmarkStart w:id="33" w:name="selected-standards-and-practices"/>
-      <w:bookmarkStart w:id="34" w:name="_Toc244220722"/>
-      <w:bookmarkEnd w:id="31"/>
+      <w:bookmarkStart w:id="49" w:name="selected-standards-and-practices"/>
+      <w:bookmarkStart w:id="50" w:name="_Toc244220722"/>
+      <w:bookmarkStart w:id="51" w:name="_Toc244220843"/>
+      <w:bookmarkEnd w:id="46"/>
       <w:r>
         <w:t>Selected Standards and Practices</w:t>
       </w:r>
-      <w:bookmarkEnd w:id="34"/>
+      <w:bookmarkEnd w:id="50"/>
+      <w:bookmarkEnd w:id="51"/>
     </w:p>
     <w:p>
       <w:pPr>
@@ -3874,13 +4185,15 @@
         <w:pStyle w:val="Heading2"/>
         <w:spacing w:before="240"/>
       </w:pPr>
-      <w:bookmarkStart w:id="35" w:name="applying-the-qa-process-within-kanban"/>
-      <w:bookmarkStart w:id="36" w:name="_Toc244220723"/>
-      <w:bookmarkEnd w:id="33"/>
+      <w:bookmarkStart w:id="52" w:name="applying-the-qa-process-within-kanban"/>
+      <w:bookmarkStart w:id="53" w:name="_Toc244220723"/>
+      <w:bookmarkStart w:id="54" w:name="_Toc244220844"/>
+      <w:bookmarkEnd w:id="49"/>
       <w:r>
         <w:t>Applying the QA Process within Kanban</w:t>
       </w:r>
-      <w:bookmarkEnd w:id="36"/>
+      <w:bookmarkEnd w:id="53"/>
+      <w:bookmarkEnd w:id="54"/>
     </w:p>
     <w:p>
       <w:pPr>
@@ -4483,13 +4796,15 @@
         <w:pStyle w:val="Heading2"/>
         <w:spacing w:before="240"/>
       </w:pPr>
-      <w:bookmarkStart w:id="37" w:name="critical-evaluation-1"/>
-      <w:bookmarkStart w:id="38" w:name="_Toc244220724"/>
-      <w:bookmarkEnd w:id="35"/>
+      <w:bookmarkStart w:id="55" w:name="critical-evaluation-1"/>
+      <w:bookmarkStart w:id="56" w:name="_Toc244220724"/>
+      <w:bookmarkStart w:id="57" w:name="_Toc244220845"/>
+      <w:bookmarkEnd w:id="52"/>
       <w:r>
         <w:t>Critical Evaluation</w:t>
       </w:r>
-      <w:bookmarkEnd w:id="38"/>
+      <w:bookmarkEnd w:id="56"/>
+      <w:bookmarkEnd w:id="57"/>
     </w:p>
     <w:p>
       <w:pPr>
@@ -4503,15 +4818,17 @@
       <w:pPr>
         <w:pStyle w:val="Heading1"/>
       </w:pPr>
-      <w:bookmarkStart w:id="39" w:name="integrating-ivv-with-kanban"/>
-      <w:bookmarkStart w:id="40" w:name="_Toc244220725"/>
-      <w:bookmarkEnd w:id="25"/>
+      <w:bookmarkStart w:id="58" w:name="integrating-ivv-with-kanban"/>
+      <w:bookmarkStart w:id="59" w:name="_Toc244220725"/>
+      <w:bookmarkStart w:id="60" w:name="_Toc244220846"/>
       <w:bookmarkEnd w:id="37"/>
+      <w:bookmarkEnd w:id="55"/>
       <w:r>
         <w:lastRenderedPageBreak/>
         <w:t>Integrating IV&amp;V with Kanban</w:t>
       </w:r>
-      <w:bookmarkEnd w:id="40"/>
+      <w:bookmarkEnd w:id="59"/>
+      <w:bookmarkEnd w:id="60"/>
     </w:p>
     <w:p>
       <w:pPr>
@@ -4525,12 +4842,14 @@
       <w:pPr>
         <w:pStyle w:val="Heading2"/>
       </w:pPr>
-      <w:bookmarkStart w:id="41" w:name="X0aa91b5be94bdb8348825913a91d765f72af6ee"/>
-      <w:bookmarkStart w:id="42" w:name="_Toc244220726"/>
+      <w:bookmarkStart w:id="61" w:name="X0aa91b5be94bdb8348825913a91d765f72af6ee"/>
+      <w:bookmarkStart w:id="62" w:name="_Toc244220726"/>
+      <w:bookmarkStart w:id="63" w:name="_Toc244220847"/>
       <w:r>
         <w:t>Current V&amp;V in Actual and Its Independence</w:t>
       </w:r>
-      <w:bookmarkEnd w:id="42"/>
+      <w:bookmarkEnd w:id="62"/>
+      <w:bookmarkEnd w:id="63"/>
     </w:p>
     <w:p>
       <w:pPr>
@@ -5297,13 +5616,15 @@
       <w:pPr>
         <w:pStyle w:val="Heading2"/>
       </w:pPr>
-      <w:bookmarkStart w:id="43" w:name="ivv-integration-model-for-kanban"/>
-      <w:bookmarkStart w:id="44" w:name="_Toc244220727"/>
-      <w:bookmarkEnd w:id="41"/>
+      <w:bookmarkStart w:id="64" w:name="ivv-integration-model-for-kanban"/>
+      <w:bookmarkStart w:id="65" w:name="_Toc244220727"/>
+      <w:bookmarkStart w:id="66" w:name="_Toc244220848"/>
+      <w:bookmarkEnd w:id="61"/>
       <w:r>
         <w:t>IV&amp;V Integration Model for Kanban</w:t>
       </w:r>
-      <w:bookmarkEnd w:id="44"/>
+      <w:bookmarkEnd w:id="65"/>
+      <w:bookmarkEnd w:id="66"/>
     </w:p>
     <w:p>
       <w:pPr>
@@ -5878,13 +6199,15 @@
       <w:pPr>
         <w:pStyle w:val="Heading2"/>
       </w:pPr>
-      <w:bookmarkStart w:id="45" w:name="X1475a41517db6ec60255518d1ac8cff0c25dd20"/>
-      <w:bookmarkStart w:id="46" w:name="_Toc244220728"/>
-      <w:bookmarkEnd w:id="43"/>
+      <w:bookmarkStart w:id="67" w:name="X1475a41517db6ec60255518d1ac8cff0c25dd20"/>
+      <w:bookmarkStart w:id="68" w:name="_Toc244220728"/>
+      <w:bookmarkStart w:id="69" w:name="_Toc244220849"/>
+      <w:bookmarkEnd w:id="64"/>
       <w:r>
         <w:t>How the Integration Meets the Three Goals</w:t>
       </w:r>
-      <w:bookmarkEnd w:id="46"/>
+      <w:bookmarkEnd w:id="68"/>
+      <w:bookmarkEnd w:id="69"/>
     </w:p>
     <w:p>
       <w:pPr>
@@ -5930,15 +6253,17 @@
           <w:numId w:val="0"/>
         </w:numPr>
       </w:pPr>
-      <w:bookmarkStart w:id="47" w:name="references"/>
-      <w:bookmarkStart w:id="48" w:name="_Toc244220729"/>
-      <w:bookmarkEnd w:id="39"/>
-      <w:bookmarkEnd w:id="45"/>
+      <w:bookmarkStart w:id="70" w:name="references"/>
+      <w:bookmarkStart w:id="71" w:name="_Toc244220729"/>
+      <w:bookmarkStart w:id="72" w:name="_Toc244220850"/>
+      <w:bookmarkEnd w:id="58"/>
+      <w:bookmarkEnd w:id="67"/>
       <w:r>
         <w:lastRenderedPageBreak/>
         <w:t>References</w:t>
       </w:r>
-      <w:bookmarkEnd w:id="48"/>
+      <w:bookmarkEnd w:id="71"/>
+      <w:bookmarkEnd w:id="72"/>
     </w:p>
     <w:p>
       <w:pPr>
@@ -6600,14 +6925,16 @@
           <w:numId w:val="0"/>
         </w:numPr>
       </w:pPr>
-      <w:bookmarkStart w:id="49" w:name="appendix-a-methodology-selection"/>
-      <w:bookmarkStart w:id="50" w:name="_Toc244220730"/>
-      <w:bookmarkEnd w:id="47"/>
+      <w:bookmarkStart w:id="73" w:name="appendix-a-methodology-selection"/>
+      <w:bookmarkStart w:id="74" w:name="_Toc244220730"/>
+      <w:bookmarkStart w:id="75" w:name="_Toc244220851"/>
+      <w:bookmarkEnd w:id="70"/>
       <w:r>
         <w:lastRenderedPageBreak/>
         <w:t>Appendix A: Methodology Selection</w:t>
       </w:r>
-      <w:bookmarkEnd w:id="50"/>
+      <w:bookmarkEnd w:id="74"/>
+      <w:bookmarkEnd w:id="75"/>
     </w:p>
     <w:p>
       <w:pPr>
@@ -6629,12 +6956,14 @@
           <w:numId w:val="0"/>
         </w:numPr>
       </w:pPr>
-      <w:bookmarkStart w:id="51" w:name="X028abdb72f6729402371f99d307e7d170450399"/>
-      <w:bookmarkStart w:id="52" w:name="_Toc244220731"/>
+      <w:bookmarkStart w:id="76" w:name="X028abdb72f6729402371f99d307e7d170450399"/>
+      <w:bookmarkStart w:id="77" w:name="_Toc244220731"/>
+      <w:bookmarkStart w:id="78" w:name="_Toc244220852"/>
       <w:r>
         <w:t>A.1 Project Characteristics and Requirements</w:t>
       </w:r>
-      <w:bookmarkEnd w:id="52"/>
+      <w:bookmarkEnd w:id="77"/>
+      <w:bookmarkEnd w:id="78"/>
     </w:p>
     <w:p>
       <w:pPr>
@@ -7548,13 +7877,15 @@
         </w:numPr>
         <w:spacing w:before="240"/>
       </w:pPr>
-      <w:bookmarkStart w:id="53" w:name="a.2-candidate-methodologies"/>
-      <w:bookmarkStart w:id="54" w:name="_Toc244220732"/>
-      <w:bookmarkEnd w:id="51"/>
+      <w:bookmarkStart w:id="79" w:name="a.2-candidate-methodologies"/>
+      <w:bookmarkStart w:id="80" w:name="_Toc244220732"/>
+      <w:bookmarkStart w:id="81" w:name="_Toc244220853"/>
+      <w:bookmarkEnd w:id="76"/>
       <w:r>
         <w:t>A.2 Candidate Methodologies</w:t>
       </w:r>
-      <w:bookmarkEnd w:id="54"/>
+      <w:bookmarkEnd w:id="80"/>
+      <w:bookmarkEnd w:id="81"/>
     </w:p>
     <w:p>
       <w:pPr>
@@ -7580,13 +7911,15 @@
           <w:numId w:val="0"/>
         </w:numPr>
       </w:pPr>
-      <w:bookmarkStart w:id="55" w:name="a.3-evaluation-and-selection"/>
-      <w:bookmarkStart w:id="56" w:name="_Toc244220733"/>
-      <w:bookmarkEnd w:id="53"/>
+      <w:bookmarkStart w:id="82" w:name="a.3-evaluation-and-selection"/>
+      <w:bookmarkStart w:id="83" w:name="_Toc244220733"/>
+      <w:bookmarkStart w:id="84" w:name="_Toc244220854"/>
+      <w:bookmarkEnd w:id="79"/>
       <w:r>
         <w:t>A.3 Evaluation and Selection</w:t>
       </w:r>
-      <w:bookmarkEnd w:id="56"/>
+      <w:bookmarkEnd w:id="83"/>
+      <w:bookmarkEnd w:id="84"/>
     </w:p>
     <w:p>
       <w:pPr>
@@ -8247,15 +8580,17 @@
           <w:numId w:val="0"/>
         </w:numPr>
       </w:pPr>
-      <w:bookmarkStart w:id="57" w:name="appendix-b-worked-example-of-the-qa-plan"/>
-      <w:bookmarkStart w:id="58" w:name="_Toc244220734"/>
-      <w:bookmarkEnd w:id="49"/>
-      <w:bookmarkEnd w:id="55"/>
+      <w:bookmarkStart w:id="85" w:name="appendix-b-worked-example-of-the-qa-plan"/>
+      <w:bookmarkStart w:id="86" w:name="_Toc244220734"/>
+      <w:bookmarkStart w:id="87" w:name="_Toc244220855"/>
+      <w:bookmarkEnd w:id="73"/>
+      <w:bookmarkEnd w:id="82"/>
       <w:r>
         <w:lastRenderedPageBreak/>
         <w:t>Appendix B: Worked Example of the QA Plan</w:t>
       </w:r>
-      <w:bookmarkEnd w:id="58"/>
+      <w:bookmarkEnd w:id="86"/>
+      <w:bookmarkEnd w:id="87"/>
     </w:p>
     <w:p>
       <w:pPr>
@@ -8277,7 +8612,7 @@
         <w:t>Suppose a contributor adds a new bank-sync provider, the kind of change behind GHSA-m2cq-xjgm-f668 (Section 3.3). At triage, the card is marked High tier because it touches bank sync, and an acceptance criterion is written: every new endpoint must refuse requests without a valid login. At design, the implementer lists the new endpoints and who may call each one. At Build/PR, the endpoints are added to the authorisation test matrix. If the login check is missing, that test fails and the card cannot move to Verify, so a flaw like the 2026 one could be stopped before release. A typo fix in the documentation, by contrast, is Low tier and passes through the normal checks only.</w:t>
       </w:r>
     </w:p>
-    <w:bookmarkEnd w:id="57"/>
+    <w:bookmarkEnd w:id="85"/>
     <w:p>
       <w:pPr>
         <w:spacing w:line="240" w:lineRule="auto"/>
@@ -8332,15 +8667,7 @@
       <w:pStyle w:val="Footer"/>
     </w:pPr>
     <w:r>
-      <w:t xml:space="preserve">Version 1.2 UCTI </w:t>
-    </w:r>
-    <w:proofErr w:type="spellStart"/>
-    <w:r>
-      <w:t>AssCv</w:t>
-    </w:r>
-    <w:proofErr w:type="spellEnd"/>
-    <w:r>
-      <w:t xml:space="preserve"> 2007-10-23</w:t>
+      <w:t>Version 1.2 UCTI AssCv 2007-10-23</w:t>
     </w:r>
   </w:p>
 </w:ftr>
@@ -9957,17 +10284,19 @@
   </w:style>
   <w:style w:type="paragraph" w:styleId="TOCHeading">
     <w:name w:val="TOC Heading"/>
-    <w:basedOn w:val="Heading1"/>
+    <w:basedOn w:val="Normal"/>
     <w:next w:val="Normal"/>
     <w:uiPriority w:val="39"/>
     <w:unhideWhenUsed/>
     <w:qFormat/>
     <w:rsid w:val="00CA2E77"/>
     <w:pPr>
-      <w:spacing w:before="240" w:after="0"/>
-      <w:outlineLvl w:val="9"/>
+      <w:spacing w:before="240" w:after="240"/>
     </w:pPr>
     <w:rPr>
+      <w:b/>
+      <w:color w:val="000000"/>
+      <w:sz w:val="32"/>
       <w:szCs w:val="32"/>
     </w:rPr>
   </w:style>
@@ -10103,7 +10432,6 @@
     <w:name w:val="Hyperlink"/>
     <w:basedOn w:val="DefaultParagraphFont"/>
     <w:uiPriority w:val="99"/>
-    <w:semiHidden/>
     <w:unhideWhenUsed/>
     <w:rsid w:val="00CA2E77"/>
     <w:rPr>

</xml_diff>

<commit_message>
Add a blank line of space before each subsection heading
Co-Authored-By: Claude Opus 5.5 <noreply@anthropic.com>
</commit_message>
<xml_diff>
--- a/report/assignment-1/Assignment-1-Report.docx
+++ b/report/assignment-1/Assignment-1-Report.docx
@@ -669,7 +669,7 @@
             </w:rPr>
             <w:fldChar w:fldCharType="separate"/>
           </w:r>
-          <w:hyperlink w:anchor="_Toc244220827" w:history="1">
+          <w:hyperlink w:anchor="_Toc244221174" w:history="1">
             <w:r>
               <w:rPr>
                 <w:rStyle w:val="Hyperlink"/>
@@ -696,7 +696,7 @@
                 <w:noProof/>
                 <w:webHidden/>
               </w:rPr>
-              <w:instrText xml:space="preserve"> PAGEREF _Toc244220827 \h </w:instrText>
+              <w:instrText xml:space="preserve"> PAGEREF _Toc244221174 \h </w:instrText>
             </w:r>
             <w:r>
               <w:rPr>
@@ -739,7 +739,7 @@
               <w:noProof/>
             </w:rPr>
           </w:pPr>
-          <w:hyperlink w:anchor="_Toc244220828" w:history="1">
+          <w:hyperlink w:anchor="_Toc244221175" w:history="1">
             <w:r>
               <w:rPr>
                 <w:rStyle w:val="Hyperlink"/>
@@ -766,7 +766,7 @@
                 <w:noProof/>
                 <w:webHidden/>
               </w:rPr>
-              <w:instrText xml:space="preserve"> PAGEREF _Toc244220828 \h </w:instrText>
+              <w:instrText xml:space="preserve"> PAGEREF _Toc244221175 \h </w:instrText>
             </w:r>
             <w:r>
               <w:rPr>
@@ -808,7 +808,7 @@
               <w:noProof/>
             </w:rPr>
           </w:pPr>
-          <w:hyperlink w:anchor="_Toc244220829" w:history="1">
+          <w:hyperlink w:anchor="_Toc244221176" w:history="1">
             <w:r>
               <w:rPr>
                 <w:rStyle w:val="Hyperlink"/>
@@ -835,7 +835,7 @@
                 <w:noProof/>
                 <w:webHidden/>
               </w:rPr>
-              <w:instrText xml:space="preserve"> PAGEREF _Toc244220829 \h </w:instrText>
+              <w:instrText xml:space="preserve"> PAGEREF _Toc244221176 \h </w:instrText>
             </w:r>
             <w:r>
               <w:rPr>
@@ -877,7 +877,7 @@
               <w:noProof/>
             </w:rPr>
           </w:pPr>
-          <w:hyperlink w:anchor="_Toc244220830" w:history="1">
+          <w:hyperlink w:anchor="_Toc244221177" w:history="1">
             <w:r>
               <w:rPr>
                 <w:rStyle w:val="Hyperlink"/>
@@ -904,7 +904,7 @@
                 <w:noProof/>
                 <w:webHidden/>
               </w:rPr>
-              <w:instrText xml:space="preserve"> PAGEREF _Toc244220830 \h </w:instrText>
+              <w:instrText xml:space="preserve"> PAGEREF _Toc244221177 \h </w:instrText>
             </w:r>
             <w:r>
               <w:rPr>
@@ -946,7 +946,7 @@
               <w:noProof/>
             </w:rPr>
           </w:pPr>
-          <w:hyperlink w:anchor="_Toc244220831" w:history="1">
+          <w:hyperlink w:anchor="_Toc244221178" w:history="1">
             <w:r>
               <w:rPr>
                 <w:rStyle w:val="Hyperlink"/>
@@ -973,7 +973,7 @@
                 <w:noProof/>
                 <w:webHidden/>
               </w:rPr>
-              <w:instrText xml:space="preserve"> PAGEREF _Toc244220831 \h </w:instrText>
+              <w:instrText xml:space="preserve"> PAGEREF _Toc244221178 \h </w:instrText>
             </w:r>
             <w:r>
               <w:rPr>
@@ -1015,7 +1015,7 @@
               <w:noProof/>
             </w:rPr>
           </w:pPr>
-          <w:hyperlink w:anchor="_Toc244220832" w:history="1">
+          <w:hyperlink w:anchor="_Toc244221179" w:history="1">
             <w:r>
               <w:rPr>
                 <w:rStyle w:val="Hyperlink"/>
@@ -1042,7 +1042,7 @@
                 <w:noProof/>
                 <w:webHidden/>
               </w:rPr>
-              <w:instrText xml:space="preserve"> PAGEREF _Toc244220832 \h </w:instrText>
+              <w:instrText xml:space="preserve"> PAGEREF _Toc244221179 \h </w:instrText>
             </w:r>
             <w:r>
               <w:rPr>
@@ -1084,7 +1084,7 @@
               <w:noProof/>
             </w:rPr>
           </w:pPr>
-          <w:hyperlink w:anchor="_Toc244220833" w:history="1">
+          <w:hyperlink w:anchor="_Toc244221180" w:history="1">
             <w:r>
               <w:rPr>
                 <w:rStyle w:val="Hyperlink"/>
@@ -1111,7 +1111,7 @@
                 <w:noProof/>
                 <w:webHidden/>
               </w:rPr>
-              <w:instrText xml:space="preserve"> PAGEREF _Toc244220833 \h </w:instrText>
+              <w:instrText xml:space="preserve"> PAGEREF _Toc244221180 \h </w:instrText>
             </w:r>
             <w:r>
               <w:rPr>
@@ -1154,7 +1154,7 @@
               <w:noProof/>
             </w:rPr>
           </w:pPr>
-          <w:hyperlink w:anchor="_Toc244220834" w:history="1">
+          <w:hyperlink w:anchor="_Toc244221181" w:history="1">
             <w:r>
               <w:rPr>
                 <w:rStyle w:val="Hyperlink"/>
@@ -1181,7 +1181,7 @@
                 <w:noProof/>
                 <w:webHidden/>
               </w:rPr>
-              <w:instrText xml:space="preserve"> PAGEREF _Toc244220834 \h </w:instrText>
+              <w:instrText xml:space="preserve"> PAGEREF _Toc244221181 \h </w:instrText>
             </w:r>
             <w:r>
               <w:rPr>
@@ -1223,7 +1223,7 @@
               <w:noProof/>
             </w:rPr>
           </w:pPr>
-          <w:hyperlink w:anchor="_Toc244220835" w:history="1">
+          <w:hyperlink w:anchor="_Toc244221182" w:history="1">
             <w:r>
               <w:rPr>
                 <w:rStyle w:val="Hyperlink"/>
@@ -1250,7 +1250,7 @@
                 <w:noProof/>
                 <w:webHidden/>
               </w:rPr>
-              <w:instrText xml:space="preserve"> PAGEREF _Toc244220835 \h </w:instrText>
+              <w:instrText xml:space="preserve"> PAGEREF _Toc244221182 \h </w:instrText>
             </w:r>
             <w:r>
               <w:rPr>
@@ -1292,7 +1292,7 @@
               <w:noProof/>
             </w:rPr>
           </w:pPr>
-          <w:hyperlink w:anchor="_Toc244220836" w:history="1">
+          <w:hyperlink w:anchor="_Toc244221183" w:history="1">
             <w:r>
               <w:rPr>
                 <w:rStyle w:val="Hyperlink"/>
@@ -1319,7 +1319,7 @@
                 <w:noProof/>
                 <w:webHidden/>
               </w:rPr>
-              <w:instrText xml:space="preserve"> PAGEREF _Toc244220836 \h </w:instrText>
+              <w:instrText xml:space="preserve"> PAGEREF _Toc244221183 \h </w:instrText>
             </w:r>
             <w:r>
               <w:rPr>
@@ -1361,7 +1361,7 @@
               <w:noProof/>
             </w:rPr>
           </w:pPr>
-          <w:hyperlink w:anchor="_Toc244220837" w:history="1">
+          <w:hyperlink w:anchor="_Toc244221184" w:history="1">
             <w:r>
               <w:rPr>
                 <w:rStyle w:val="Hyperlink"/>
@@ -1388,7 +1388,7 @@
                 <w:noProof/>
                 <w:webHidden/>
               </w:rPr>
-              <w:instrText xml:space="preserve"> PAGEREF _Toc244220837 \h </w:instrText>
+              <w:instrText xml:space="preserve"> PAGEREF _Toc244221184 \h </w:instrText>
             </w:r>
             <w:r>
               <w:rPr>
@@ -1430,7 +1430,7 @@
               <w:noProof/>
             </w:rPr>
           </w:pPr>
-          <w:hyperlink w:anchor="_Toc244220838" w:history="1">
+          <w:hyperlink w:anchor="_Toc244221185" w:history="1">
             <w:r>
               <w:rPr>
                 <w:rStyle w:val="Hyperlink"/>
@@ -1457,7 +1457,7 @@
                 <w:noProof/>
                 <w:webHidden/>
               </w:rPr>
-              <w:instrText xml:space="preserve"> PAGEREF _Toc244220838 \h </w:instrText>
+              <w:instrText xml:space="preserve"> PAGEREF _Toc244221185 \h </w:instrText>
             </w:r>
             <w:r>
               <w:rPr>
@@ -1477,7 +1477,7 @@
                 <w:noProof/>
                 <w:webHidden/>
               </w:rPr>
-              <w:t>7</w:t>
+              <w:t>8</w:t>
             </w:r>
             <w:r>
               <w:rPr>
@@ -1500,7 +1500,7 @@
               <w:noProof/>
             </w:rPr>
           </w:pPr>
-          <w:hyperlink w:anchor="_Toc244220839" w:history="1">
+          <w:hyperlink w:anchor="_Toc244221186" w:history="1">
             <w:r>
               <w:rPr>
                 <w:rStyle w:val="Hyperlink"/>
@@ -1527,7 +1527,7 @@
                 <w:noProof/>
                 <w:webHidden/>
               </w:rPr>
-              <w:instrText xml:space="preserve"> PAGEREF _Toc244220839 \h </w:instrText>
+              <w:instrText xml:space="preserve"> PAGEREF _Toc244221186 \h </w:instrText>
             </w:r>
             <w:r>
               <w:rPr>
@@ -1569,7 +1569,7 @@
               <w:noProof/>
             </w:rPr>
           </w:pPr>
-          <w:hyperlink w:anchor="_Toc244220840" w:history="1">
+          <w:hyperlink w:anchor="_Toc244221187" w:history="1">
             <w:r>
               <w:rPr>
                 <w:rStyle w:val="Hyperlink"/>
@@ -1596,7 +1596,7 @@
                 <w:noProof/>
                 <w:webHidden/>
               </w:rPr>
-              <w:instrText xml:space="preserve"> PAGEREF _Toc244220840 \h </w:instrText>
+              <w:instrText xml:space="preserve"> PAGEREF _Toc244221187 \h </w:instrText>
             </w:r>
             <w:r>
               <w:rPr>
@@ -1638,7 +1638,7 @@
               <w:noProof/>
             </w:rPr>
           </w:pPr>
-          <w:hyperlink w:anchor="_Toc244220841" w:history="1">
+          <w:hyperlink w:anchor="_Toc244221188" w:history="1">
             <w:r>
               <w:rPr>
                 <w:rStyle w:val="Hyperlink"/>
@@ -1665,7 +1665,7 @@
                 <w:noProof/>
                 <w:webHidden/>
               </w:rPr>
-              <w:instrText xml:space="preserve"> PAGEREF _Toc244220841 \h </w:instrText>
+              <w:instrText xml:space="preserve"> PAGEREF _Toc244221188 \h </w:instrText>
             </w:r>
             <w:r>
               <w:rPr>
@@ -1707,7 +1707,7 @@
               <w:noProof/>
             </w:rPr>
           </w:pPr>
-          <w:hyperlink w:anchor="_Toc244220842" w:history="1">
+          <w:hyperlink w:anchor="_Toc244221189" w:history="1">
             <w:r>
               <w:rPr>
                 <w:rStyle w:val="Hyperlink"/>
@@ -1734,7 +1734,7 @@
                 <w:noProof/>
                 <w:webHidden/>
               </w:rPr>
-              <w:instrText xml:space="preserve"> PAGEREF _Toc244220842 \h </w:instrText>
+              <w:instrText xml:space="preserve"> PAGEREF _Toc244221189 \h </w:instrText>
             </w:r>
             <w:r>
               <w:rPr>
@@ -1776,7 +1776,7 @@
               <w:noProof/>
             </w:rPr>
           </w:pPr>
-          <w:hyperlink w:anchor="_Toc244220843" w:history="1">
+          <w:hyperlink w:anchor="_Toc244221190" w:history="1">
             <w:r>
               <w:rPr>
                 <w:rStyle w:val="Hyperlink"/>
@@ -1803,7 +1803,7 @@
                 <w:noProof/>
                 <w:webHidden/>
               </w:rPr>
-              <w:instrText xml:space="preserve"> PAGEREF _Toc244220843 \h </w:instrText>
+              <w:instrText xml:space="preserve"> PAGEREF _Toc244221190 \h </w:instrText>
             </w:r>
             <w:r>
               <w:rPr>
@@ -1845,7 +1845,7 @@
               <w:noProof/>
             </w:rPr>
           </w:pPr>
-          <w:hyperlink w:anchor="_Toc244220844" w:history="1">
+          <w:hyperlink w:anchor="_Toc244221191" w:history="1">
             <w:r>
               <w:rPr>
                 <w:rStyle w:val="Hyperlink"/>
@@ -1872,7 +1872,7 @@
                 <w:noProof/>
                 <w:webHidden/>
               </w:rPr>
-              <w:instrText xml:space="preserve"> PAGEREF _Toc244220844 \h </w:instrText>
+              <w:instrText xml:space="preserve"> PAGEREF _Toc244221191 \h </w:instrText>
             </w:r>
             <w:r>
               <w:rPr>
@@ -1914,7 +1914,7 @@
               <w:noProof/>
             </w:rPr>
           </w:pPr>
-          <w:hyperlink w:anchor="_Toc244220845" w:history="1">
+          <w:hyperlink w:anchor="_Toc244221192" w:history="1">
             <w:r>
               <w:rPr>
                 <w:rStyle w:val="Hyperlink"/>
@@ -1941,7 +1941,7 @@
                 <w:noProof/>
                 <w:webHidden/>
               </w:rPr>
-              <w:instrText xml:space="preserve"> PAGEREF _Toc244220845 \h </w:instrText>
+              <w:instrText xml:space="preserve"> PAGEREF _Toc244221192 \h </w:instrText>
             </w:r>
             <w:r>
               <w:rPr>
@@ -1984,7 +1984,7 @@
               <w:noProof/>
             </w:rPr>
           </w:pPr>
-          <w:hyperlink w:anchor="_Toc244220846" w:history="1">
+          <w:hyperlink w:anchor="_Toc244221193" w:history="1">
             <w:r>
               <w:rPr>
                 <w:rStyle w:val="Hyperlink"/>
@@ -2011,7 +2011,7 @@
                 <w:noProof/>
                 <w:webHidden/>
               </w:rPr>
-              <w:instrText xml:space="preserve"> PAGEREF _Toc244220846 \h </w:instrText>
+              <w:instrText xml:space="preserve"> PAGEREF _Toc244221193 \h </w:instrText>
             </w:r>
             <w:r>
               <w:rPr>
@@ -2053,7 +2053,7 @@
               <w:noProof/>
             </w:rPr>
           </w:pPr>
-          <w:hyperlink w:anchor="_Toc244220847" w:history="1">
+          <w:hyperlink w:anchor="_Toc244221194" w:history="1">
             <w:r>
               <w:rPr>
                 <w:rStyle w:val="Hyperlink"/>
@@ -2080,7 +2080,7 @@
                 <w:noProof/>
                 <w:webHidden/>
               </w:rPr>
-              <w:instrText xml:space="preserve"> PAGEREF _Toc244220847 \h </w:instrText>
+              <w:instrText xml:space="preserve"> PAGEREF _Toc244221194 \h </w:instrText>
             </w:r>
             <w:r>
               <w:rPr>
@@ -2122,7 +2122,7 @@
               <w:noProof/>
             </w:rPr>
           </w:pPr>
-          <w:hyperlink w:anchor="_Toc244220848" w:history="1">
+          <w:hyperlink w:anchor="_Toc244221195" w:history="1">
             <w:r>
               <w:rPr>
                 <w:rStyle w:val="Hyperlink"/>
@@ -2149,7 +2149,7 @@
                 <w:noProof/>
                 <w:webHidden/>
               </w:rPr>
-              <w:instrText xml:space="preserve"> PAGEREF _Toc244220848 \h </w:instrText>
+              <w:instrText xml:space="preserve"> PAGEREF _Toc244221195 \h </w:instrText>
             </w:r>
             <w:r>
               <w:rPr>
@@ -2191,7 +2191,7 @@
               <w:noProof/>
             </w:rPr>
           </w:pPr>
-          <w:hyperlink w:anchor="_Toc244220849" w:history="1">
+          <w:hyperlink w:anchor="_Toc244221196" w:history="1">
             <w:r>
               <w:rPr>
                 <w:rStyle w:val="Hyperlink"/>
@@ -2218,7 +2218,7 @@
                 <w:noProof/>
                 <w:webHidden/>
               </w:rPr>
-              <w:instrText xml:space="preserve"> PAGEREF _Toc244220849 \h </w:instrText>
+              <w:instrText xml:space="preserve"> PAGEREF _Toc244221196 \h </w:instrText>
             </w:r>
             <w:r>
               <w:rPr>
@@ -2261,7 +2261,7 @@
               <w:noProof/>
             </w:rPr>
           </w:pPr>
-          <w:hyperlink w:anchor="_Toc244220850" w:history="1">
+          <w:hyperlink w:anchor="_Toc244221197" w:history="1">
             <w:r>
               <w:rPr>
                 <w:rStyle w:val="Hyperlink"/>
@@ -2288,7 +2288,7 @@
                 <w:noProof/>
                 <w:webHidden/>
               </w:rPr>
-              <w:instrText xml:space="preserve"> PAGEREF _Toc244220850 \h </w:instrText>
+              <w:instrText xml:space="preserve"> PAGEREF _Toc244221197 \h </w:instrText>
             </w:r>
             <w:r>
               <w:rPr>
@@ -2331,7 +2331,7 @@
               <w:noProof/>
             </w:rPr>
           </w:pPr>
-          <w:hyperlink w:anchor="_Toc244220851" w:history="1">
+          <w:hyperlink w:anchor="_Toc244221198" w:history="1">
             <w:r>
               <w:rPr>
                 <w:rStyle w:val="Hyperlink"/>
@@ -2358,7 +2358,7 @@
                 <w:noProof/>
                 <w:webHidden/>
               </w:rPr>
-              <w:instrText xml:space="preserve"> PAGEREF _Toc244220851 \h </w:instrText>
+              <w:instrText xml:space="preserve"> PAGEREF _Toc244221198 \h </w:instrText>
             </w:r>
             <w:r>
               <w:rPr>
@@ -2400,7 +2400,7 @@
               <w:noProof/>
             </w:rPr>
           </w:pPr>
-          <w:hyperlink w:anchor="_Toc244220852" w:history="1">
+          <w:hyperlink w:anchor="_Toc244221199" w:history="1">
             <w:r>
               <w:rPr>
                 <w:rStyle w:val="Hyperlink"/>
@@ -2427,7 +2427,7 @@
                 <w:noProof/>
                 <w:webHidden/>
               </w:rPr>
-              <w:instrText xml:space="preserve"> PAGEREF _Toc244220852 \h </w:instrText>
+              <w:instrText xml:space="preserve"> PAGEREF _Toc244221199 \h </w:instrText>
             </w:r>
             <w:r>
               <w:rPr>
@@ -2469,7 +2469,7 @@
               <w:noProof/>
             </w:rPr>
           </w:pPr>
-          <w:hyperlink w:anchor="_Toc244220853" w:history="1">
+          <w:hyperlink w:anchor="_Toc244221200" w:history="1">
             <w:r>
               <w:rPr>
                 <w:rStyle w:val="Hyperlink"/>
@@ -2496,7 +2496,7 @@
                 <w:noProof/>
                 <w:webHidden/>
               </w:rPr>
-              <w:instrText xml:space="preserve"> PAGEREF _Toc244220853 \h </w:instrText>
+              <w:instrText xml:space="preserve"> PAGEREF _Toc244221200 \h </w:instrText>
             </w:r>
             <w:r>
               <w:rPr>
@@ -2538,7 +2538,7 @@
               <w:noProof/>
             </w:rPr>
           </w:pPr>
-          <w:hyperlink w:anchor="_Toc244220854" w:history="1">
+          <w:hyperlink w:anchor="_Toc244221201" w:history="1">
             <w:r>
               <w:rPr>
                 <w:rStyle w:val="Hyperlink"/>
@@ -2565,7 +2565,7 @@
                 <w:noProof/>
                 <w:webHidden/>
               </w:rPr>
-              <w:instrText xml:space="preserve"> PAGEREF _Toc244220854 \h </w:instrText>
+              <w:instrText xml:space="preserve"> PAGEREF _Toc244221201 \h </w:instrText>
             </w:r>
             <w:r>
               <w:rPr>
@@ -2608,7 +2608,7 @@
               <w:noProof/>
             </w:rPr>
           </w:pPr>
-          <w:hyperlink w:anchor="_Toc244220855" w:history="1">
+          <w:hyperlink w:anchor="_Toc244221202" w:history="1">
             <w:r>
               <w:rPr>
                 <w:rStyle w:val="Hyperlink"/>
@@ -2635,7 +2635,7 @@
                 <w:noProof/>
                 <w:webHidden/>
               </w:rPr>
-              <w:instrText xml:space="preserve"> PAGEREF _Toc244220855 \h </w:instrText>
+              <w:instrText xml:space="preserve"> PAGEREF _Toc244221202 \h </w:instrText>
             </w:r>
             <w:r>
               <w:rPr>
@@ -2704,7 +2704,7 @@
       </w:pPr>
       <w:bookmarkStart w:id="1" w:name="executive-summary"/>
       <w:bookmarkStart w:id="2" w:name="_Toc244220706"/>
-      <w:bookmarkStart w:id="3" w:name="_Toc244220827"/>
+      <w:bookmarkStart w:id="3" w:name="_Toc244221174"/>
       <w:r>
         <w:lastRenderedPageBreak/>
         <w:t>Executive Summary</w:t>
@@ -2750,7 +2750,7 @@
       </w:pPr>
       <w:bookmarkStart w:id="4" w:name="introduction"/>
       <w:bookmarkStart w:id="5" w:name="_Toc244220707"/>
-      <w:bookmarkStart w:id="6" w:name="_Toc244220828"/>
+      <w:bookmarkStart w:id="6" w:name="_Toc244221175"/>
       <w:bookmarkEnd w:id="1"/>
       <w:r>
         <w:lastRenderedPageBreak/>
@@ -2765,7 +2765,7 @@
       </w:pPr>
       <w:bookmarkStart w:id="7" w:name="background-and-purpose"/>
       <w:bookmarkStart w:id="8" w:name="_Toc244220708"/>
-      <w:bookmarkStart w:id="9" w:name="_Toc244220829"/>
+      <w:bookmarkStart w:id="9" w:name="_Toc244221176"/>
       <w:r>
         <w:t>Background and Purpose</w:t>
       </w:r>
@@ -2802,7 +2802,7 @@
       </w:pPr>
       <w:bookmarkStart w:id="10" w:name="what-is-actual-budget"/>
       <w:bookmarkStart w:id="11" w:name="_Toc244220709"/>
-      <w:bookmarkStart w:id="12" w:name="_Toc244220830"/>
+      <w:bookmarkStart w:id="12" w:name="_Toc244221177"/>
       <w:bookmarkEnd w:id="7"/>
       <w:r>
         <w:t>What Is Actual Budget</w:t>
@@ -2832,7 +2832,7 @@
       </w:pPr>
       <w:bookmarkStart w:id="13" w:name="main-features-and-how-it-works"/>
       <w:bookmarkStart w:id="14" w:name="_Toc244220710"/>
-      <w:bookmarkStart w:id="15" w:name="_Toc244220831"/>
+      <w:bookmarkStart w:id="15" w:name="_Toc244221178"/>
       <w:bookmarkEnd w:id="10"/>
       <w:r>
         <w:t>Main Features and How It Works</w:t>
@@ -2866,6 +2866,7 @@
         <w:rPr>
           <w:noProof/>
         </w:rPr>
+        <w:lastRenderedPageBreak/>
         <w:drawing>
           <wp:inline distT="0" distB="0" distL="0" distR="0" wp14:anchorId="0C9A2258" wp14:editId="10243B93">
             <wp:extent cx="5334000" cy="1237102"/>
@@ -2927,10 +2928,9 @@
       </w:pPr>
       <w:bookmarkStart w:id="16" w:name="who-is-involved"/>
       <w:bookmarkStart w:id="17" w:name="_Toc244220711"/>
-      <w:bookmarkStart w:id="18" w:name="_Toc244220832"/>
+      <w:bookmarkStart w:id="18" w:name="_Toc244221179"/>
       <w:bookmarkEnd w:id="13"/>
       <w:r>
-        <w:lastRenderedPageBreak/>
         <w:t>Who Is Involved</w:t>
       </w:r>
       <w:bookmarkEnd w:id="17"/>
@@ -3201,11 +3201,10 @@
     <w:p>
       <w:pPr>
         <w:pStyle w:val="Heading2"/>
-        <w:spacing w:before="240"/>
       </w:pPr>
       <w:bookmarkStart w:id="19" w:name="main-challenges"/>
       <w:bookmarkStart w:id="20" w:name="_Toc244220712"/>
-      <w:bookmarkStart w:id="21" w:name="_Toc244220833"/>
+      <w:bookmarkStart w:id="21" w:name="_Toc244221180"/>
       <w:bookmarkEnd w:id="16"/>
       <w:r>
         <w:t>Main Challenges</w:t>
@@ -3276,7 +3275,7 @@
       </w:pPr>
       <w:bookmarkStart w:id="22" w:name="software-development-methodology"/>
       <w:bookmarkStart w:id="23" w:name="_Toc244220713"/>
-      <w:bookmarkStart w:id="24" w:name="_Toc244220834"/>
+      <w:bookmarkStart w:id="24" w:name="_Toc244221181"/>
       <w:bookmarkEnd w:id="4"/>
       <w:bookmarkEnd w:id="19"/>
       <w:r>
@@ -3300,7 +3299,7 @@
       </w:pPr>
       <w:bookmarkStart w:id="25" w:name="current-development-process-of-actual"/>
       <w:bookmarkStart w:id="26" w:name="_Toc244220714"/>
-      <w:bookmarkStart w:id="27" w:name="_Toc244220835"/>
+      <w:bookmarkStart w:id="27" w:name="_Toc244221182"/>
       <w:r>
         <w:t>Current Development Process of Actual</w:t>
       </w:r>
@@ -3411,7 +3410,7 @@
       </w:pPr>
       <w:bookmarkStart w:id="28" w:name="why-kanban-fits-actual"/>
       <w:bookmarkStart w:id="29" w:name="_Toc244220715"/>
-      <w:bookmarkStart w:id="30" w:name="_Toc244220836"/>
+      <w:bookmarkStart w:id="30" w:name="_Toc244221183"/>
       <w:bookmarkEnd w:id="25"/>
       <w:r>
         <w:t>Why Kanban Fits Actual</w:t>
@@ -3469,7 +3468,7 @@
       </w:pPr>
       <w:bookmarkStart w:id="31" w:name="applying-kanban-to-actual"/>
       <w:bookmarkStart w:id="32" w:name="_Toc244220716"/>
-      <w:bookmarkStart w:id="33" w:name="_Toc244220837"/>
+      <w:bookmarkStart w:id="33" w:name="_Toc244221184"/>
       <w:bookmarkEnd w:id="28"/>
       <w:r>
         <w:t>Applying Kanban to Actual</w:t>
@@ -3565,9 +3564,10 @@
       </w:pPr>
       <w:bookmarkStart w:id="34" w:name="critical-evaluation"/>
       <w:bookmarkStart w:id="35" w:name="_Toc244220717"/>
-      <w:bookmarkStart w:id="36" w:name="_Toc244220838"/>
+      <w:bookmarkStart w:id="36" w:name="_Toc244221185"/>
       <w:bookmarkEnd w:id="31"/>
       <w:r>
+        <w:lastRenderedPageBreak/>
         <w:t>Critical Evaluation</w:t>
       </w:r>
       <w:bookmarkEnd w:id="35"/>
@@ -3578,11 +3578,7 @@
         <w:pStyle w:val="FirstParagraph"/>
       </w:pPr>
       <w:r>
-        <w:t xml:space="preserve">Kanban manages flow but does not improve quality by itself. It is "a relatively basic flow tool that needs to be supported by additional practices" (Ahmad et al., 2018, p. 110), which is why </w:t>
-      </w:r>
-      <w:r>
-        <w:lastRenderedPageBreak/>
-        <w:t>the QA gates in section 3 are mandatory. Its WIP limit is also weaker in a volunteer project. It holds new PRs back and those PRs would wait like unanswered ones, which maintainers report discourages new contributors (Salkever, 2023, p. 5). However, PRs has already been waited months for review before any limit existed (Aboltins, 2025), so the limit makes the wait visible rather than creating it. Maintainers can also raise the limit at any moment if it starts to deter newcomers. The choice could also be revisited if Actual gains staff who can commit fixed hours in the future, which would make Scrum's commitments realistic, or runs its own hosted service which would give DevOps operations a chance to be implemented.</w:t>
+        <w:t>Kanban manages flow but does not improve quality by itself. It is "a relatively basic flow tool that needs to be supported by additional practices" (Ahmad et al., 2018, p. 110), which is why the QA gates in section 3 are mandatory. Its WIP limit is also weaker in a volunteer project. It holds new PRs back and those PRs would wait like unanswered ones, which maintainers report discourages new contributors (Salkever, 2023, p. 5). However, PRs has already been waited months for review before any limit existed (Aboltins, 2025), so the limit makes the wait visible rather than creating it. Maintainers can also raise the limit at any moment if it starts to deter newcomers. The choice could also be revisited if Actual gains staff who can commit fixed hours in the future, which would make Scrum's commitments realistic, or runs its own hosted service which would give DevOps operations a chance to be implemented.</w:t>
       </w:r>
     </w:p>
     <w:p>
@@ -3591,7 +3587,7 @@
       </w:pPr>
       <w:bookmarkStart w:id="37" w:name="quality-assurance-process"/>
       <w:bookmarkStart w:id="38" w:name="_Toc244220718"/>
-      <w:bookmarkStart w:id="39" w:name="_Toc244220839"/>
+      <w:bookmarkStart w:id="39" w:name="_Toc244221186"/>
       <w:bookmarkEnd w:id="22"/>
       <w:bookmarkEnd w:id="34"/>
       <w:r>
@@ -3615,7 +3611,7 @@
       </w:pPr>
       <w:bookmarkStart w:id="40" w:name="what-quality-means-for-actual"/>
       <w:bookmarkStart w:id="41" w:name="_Toc244220719"/>
-      <w:bookmarkStart w:id="42" w:name="_Toc244220840"/>
+      <w:bookmarkStart w:id="42" w:name="_Toc244221187"/>
       <w:r>
         <w:t>What Quality Means for Actual</w:t>
       </w:r>
@@ -3704,7 +3700,7 @@
       </w:pPr>
       <w:bookmarkStart w:id="43" w:name="key-quality-attributes"/>
       <w:bookmarkStart w:id="44" w:name="_Toc244220720"/>
-      <w:bookmarkStart w:id="45" w:name="_Toc244220841"/>
+      <w:bookmarkStart w:id="45" w:name="_Toc244221188"/>
       <w:bookmarkEnd w:id="40"/>
       <w:r>
         <w:t>Key Quality Attributes</w:t>
@@ -3762,7 +3758,7 @@
       </w:pPr>
       <w:bookmarkStart w:id="46" w:name="current-qa-practices-and-gaps"/>
       <w:bookmarkStart w:id="47" w:name="_Toc244220721"/>
-      <w:bookmarkStart w:id="48" w:name="_Toc244220842"/>
+      <w:bookmarkStart w:id="48" w:name="_Toc244221189"/>
       <w:bookmarkEnd w:id="43"/>
       <w:r>
         <w:lastRenderedPageBreak/>
@@ -3801,7 +3797,7 @@
       </w:pPr>
       <w:bookmarkStart w:id="49" w:name="selected-standards-and-practices"/>
       <w:bookmarkStart w:id="50" w:name="_Toc244220722"/>
-      <w:bookmarkStart w:id="51" w:name="_Toc244220843"/>
+      <w:bookmarkStart w:id="51" w:name="_Toc244221190"/>
       <w:bookmarkEnd w:id="46"/>
       <w:r>
         <w:t>Selected Standards and Practices</w:t>
@@ -4183,11 +4179,10 @@
     <w:p>
       <w:pPr>
         <w:pStyle w:val="Heading2"/>
-        <w:spacing w:before="240"/>
       </w:pPr>
       <w:bookmarkStart w:id="52" w:name="applying-the-qa-process-within-kanban"/>
       <w:bookmarkStart w:id="53" w:name="_Toc244220723"/>
-      <w:bookmarkStart w:id="54" w:name="_Toc244220844"/>
+      <w:bookmarkStart w:id="54" w:name="_Toc244221191"/>
       <w:bookmarkEnd w:id="49"/>
       <w:r>
         <w:t>Applying the QA Process within Kanban</w:t>
@@ -4544,6 +4539,7 @@
               <w:jc w:val="left"/>
             </w:pPr>
             <w:r>
+              <w:lastRenderedPageBreak/>
               <w:t>Build/PR</w:t>
             </w:r>
           </w:p>
@@ -4609,7 +4605,6 @@
               <w:jc w:val="left"/>
             </w:pPr>
             <w:r>
-              <w:lastRenderedPageBreak/>
               <w:t>Verify</w:t>
             </w:r>
           </w:p>
@@ -4794,11 +4789,10 @@
     <w:p>
       <w:pPr>
         <w:pStyle w:val="Heading2"/>
-        <w:spacing w:before="240"/>
       </w:pPr>
       <w:bookmarkStart w:id="55" w:name="critical-evaluation-1"/>
       <w:bookmarkStart w:id="56" w:name="_Toc244220724"/>
-      <w:bookmarkStart w:id="57" w:name="_Toc244220845"/>
+      <w:bookmarkStart w:id="57" w:name="_Toc244221192"/>
       <w:bookmarkEnd w:id="52"/>
       <w:r>
         <w:t>Critical Evaluation</w:t>
@@ -4820,7 +4814,7 @@
       </w:pPr>
       <w:bookmarkStart w:id="58" w:name="integrating-ivv-with-kanban"/>
       <w:bookmarkStart w:id="59" w:name="_Toc244220725"/>
-      <w:bookmarkStart w:id="60" w:name="_Toc244220846"/>
+      <w:bookmarkStart w:id="60" w:name="_Toc244221193"/>
       <w:bookmarkEnd w:id="37"/>
       <w:bookmarkEnd w:id="55"/>
       <w:r>
@@ -4844,7 +4838,7 @@
       </w:pPr>
       <w:bookmarkStart w:id="61" w:name="X0aa91b5be94bdb8348825913a91d765f72af6ee"/>
       <w:bookmarkStart w:id="62" w:name="_Toc244220726"/>
-      <w:bookmarkStart w:id="63" w:name="_Toc244220847"/>
+      <w:bookmarkStart w:id="63" w:name="_Toc244221194"/>
       <w:r>
         <w:t>Current V&amp;V in Actual and Its Independence</w:t>
       </w:r>
@@ -5605,11 +5599,8 @@
         <w:spacing w:before="240"/>
       </w:pPr>
       <w:r>
-        <w:t xml:space="preserve">Actual already has some independent checking, but it is ad hoc. Nobody other than the contributor checks requirements or design, and how closely a change is checked depends on </w:t>
-      </w:r>
-      <w:r>
         <w:lastRenderedPageBreak/>
-        <w:t>who happens to review it, whatever its risk is. Some of the checking also comes late after release, such as the three 2026 advisories in Section 3.3 which were found in released versions, by reporters outside the core team (Actual Budget, 2026b, 2026c, 2026d).</w:t>
+        <w:t>Actual already has some independent checking, but it is ad hoc. Nobody other than the contributor checks requirements or design, and how closely a change is checked depends on who happens to review it, whatever its risk is. Some of the checking also comes late after release, such as the three 2026 advisories in Section 3.3 which were found in released versions, by reporters outside the core team (Actual Budget, 2026b, 2026c, 2026d).</w:t>
       </w:r>
     </w:p>
     <w:p>
@@ -5618,7 +5609,7 @@
       </w:pPr>
       <w:bookmarkStart w:id="64" w:name="ivv-integration-model-for-kanban"/>
       <w:bookmarkStart w:id="65" w:name="_Toc244220727"/>
-      <w:bookmarkStart w:id="66" w:name="_Toc244220848"/>
+      <w:bookmarkStart w:id="66" w:name="_Toc244221195"/>
       <w:bookmarkEnd w:id="61"/>
       <w:r>
         <w:t>IV&amp;V Integration Model for Kanban</w:t>
@@ -6201,7 +6192,7 @@
       </w:pPr>
       <w:bookmarkStart w:id="67" w:name="X1475a41517db6ec60255518d1ac8cff0c25dd20"/>
       <w:bookmarkStart w:id="68" w:name="_Toc244220728"/>
-      <w:bookmarkStart w:id="69" w:name="_Toc244220849"/>
+      <w:bookmarkStart w:id="69" w:name="_Toc244221196"/>
       <w:bookmarkEnd w:id="64"/>
       <w:r>
         <w:t>How the Integration Meets the Three Goals</w:t>
@@ -6230,11 +6221,11 @@
         <w:pStyle w:val="BodyText"/>
       </w:pPr>
       <w:r>
-        <w:t xml:space="preserve">Requirements compliance means showing that what users asked for was built and tested. In Actual, a feature request starts as an issue, the PR template asks the contributor to link that issue, and a release note describes what shipped (Actual Budget, 2026a). However, no step checks that the finished PR actually does what the issue asked for. Under the proposed model, </w:t>
+        <w:t xml:space="preserve">Requirements compliance means showing that what users asked for was built and tested. In Actual, a feature request starts as an issue, the PR template asks the contributor to link that issue, and a release note describes what shipped (Actual Budget, 2026a). However, no step </w:t>
       </w:r>
       <w:r>
         <w:lastRenderedPageBreak/>
-        <w:t>someone other than the requester makes sure that at triage, each acceptance criterion can be tested, and the reviewer only approves at Verify once every criterion has a passing test.</w:t>
+        <w:t>checks that the finished PR actually does what the issue asked for. Under the proposed model, someone other than the requester makes sure that at triage, each acceptance criterion can be tested, and the reviewer only approves at Verify once every criterion has a passing test.</w:t>
       </w:r>
     </w:p>
     <w:p>
@@ -6255,7 +6246,7 @@
       </w:pPr>
       <w:bookmarkStart w:id="70" w:name="references"/>
       <w:bookmarkStart w:id="71" w:name="_Toc244220729"/>
-      <w:bookmarkStart w:id="72" w:name="_Toc244220850"/>
+      <w:bookmarkStart w:id="72" w:name="_Toc244221197"/>
       <w:bookmarkEnd w:id="58"/>
       <w:bookmarkEnd w:id="67"/>
       <w:r>
@@ -6927,7 +6918,7 @@
       </w:pPr>
       <w:bookmarkStart w:id="73" w:name="appendix-a-methodology-selection"/>
       <w:bookmarkStart w:id="74" w:name="_Toc244220730"/>
-      <w:bookmarkStart w:id="75" w:name="_Toc244220851"/>
+      <w:bookmarkStart w:id="75" w:name="_Toc244221198"/>
       <w:bookmarkEnd w:id="70"/>
       <w:r>
         <w:lastRenderedPageBreak/>
@@ -6958,7 +6949,7 @@
       </w:pPr>
       <w:bookmarkStart w:id="76" w:name="X028abdb72f6729402371f99d307e7d170450399"/>
       <w:bookmarkStart w:id="77" w:name="_Toc244220731"/>
-      <w:bookmarkStart w:id="78" w:name="_Toc244220852"/>
+      <w:bookmarkStart w:id="78" w:name="_Toc244221199"/>
       <w:r>
         <w:t>A.1 Project Characteristics and Requirements</w:t>
       </w:r>
@@ -7875,11 +7866,10 @@
           <w:ilvl w:val="0"/>
           <w:numId w:val="0"/>
         </w:numPr>
-        <w:spacing w:before="240"/>
       </w:pPr>
       <w:bookmarkStart w:id="79" w:name="a.2-candidate-methodologies"/>
       <w:bookmarkStart w:id="80" w:name="_Toc244220732"/>
-      <w:bookmarkStart w:id="81" w:name="_Toc244220853"/>
+      <w:bookmarkStart w:id="81" w:name="_Toc244221200"/>
       <w:bookmarkEnd w:id="76"/>
       <w:r>
         <w:t>A.2 Candidate Methodologies</w:t>
@@ -7913,7 +7903,7 @@
       </w:pPr>
       <w:bookmarkStart w:id="82" w:name="a.3-evaluation-and-selection"/>
       <w:bookmarkStart w:id="83" w:name="_Toc244220733"/>
-      <w:bookmarkStart w:id="84" w:name="_Toc244220854"/>
+      <w:bookmarkStart w:id="84" w:name="_Toc244221201"/>
       <w:bookmarkEnd w:id="79"/>
       <w:r>
         <w:t>A.3 Evaluation and Selection</w:t>
@@ -8582,7 +8572,7 @@
       </w:pPr>
       <w:bookmarkStart w:id="85" w:name="appendix-b-worked-example-of-the-qa-plan"/>
       <w:bookmarkStart w:id="86" w:name="_Toc244220734"/>
-      <w:bookmarkStart w:id="87" w:name="_Toc244220855"/>
+      <w:bookmarkStart w:id="87" w:name="_Toc244221202"/>
       <w:bookmarkEnd w:id="73"/>
       <w:bookmarkEnd w:id="82"/>
       <w:r>
@@ -9721,7 +9711,7 @@
         <w:ilvl w:val="1"/>
         <w:numId w:val="3"/>
       </w:numPr>
-      <w:spacing w:before="360" w:after="120" w:line="240" w:lineRule="auto"/>
+      <w:spacing w:before="600" w:after="120" w:line="240" w:lineRule="auto"/>
       <w:outlineLvl w:val="1"/>
     </w:pPr>
     <w:rPr>
@@ -9749,7 +9739,7 @@
         <w:ilvl w:val="2"/>
         <w:numId w:val="3"/>
       </w:numPr>
-      <w:spacing w:before="360" w:after="120" w:line="240" w:lineRule="auto"/>
+      <w:spacing w:before="480" w:after="120" w:line="240" w:lineRule="auto"/>
       <w:outlineLvl w:val="2"/>
     </w:pPr>
     <w:rPr>

</xml_diff>

<commit_message>
Centre figure captions in the Word report
Co-Authored-By: Claude Opus 5.5 <noreply@anthropic.com>
</commit_message>
<xml_diff>
--- a/report/assignment-1/Assignment-1-Report.docx
+++ b/report/assignment-1/Assignment-1-Report.docx
@@ -217,7 +217,15 @@
         <w:t xml:space="preserve">HAND OUT DATE: </w:t>
       </w:r>
       <w:r>
-        <w:t>- dd-mm-yyyy -</w:t>
+        <w:t>- dd-mm-</w:t>
+      </w:r>
+      <w:proofErr w:type="spellStart"/>
+      <w:r>
+        <w:t>yyyy</w:t>
+      </w:r>
+      <w:proofErr w:type="spellEnd"/>
+      <w:r>
+        <w:t xml:space="preserve"> -</w:t>
       </w:r>
     </w:p>
     <w:p>
@@ -243,7 +251,21 @@
         <w:rPr>
           <w:sz w:val="28"/>
         </w:rPr>
-        <w:t xml:space="preserve">HAND IN DATE:     - dd-mm-yyyy -   </w:t>
+        <w:t>HAND IN DATE:     - dd-mm-</w:t>
+      </w:r>
+      <w:proofErr w:type="spellStart"/>
+      <w:r>
+        <w:rPr>
+          <w:sz w:val="28"/>
+        </w:rPr>
+        <w:t>yyyy</w:t>
+      </w:r>
+      <w:proofErr w:type="spellEnd"/>
+      <w:r>
+        <w:rPr>
+          <w:sz w:val="28"/>
+        </w:rPr>
+        <w:t xml:space="preserve"> -   </w:t>
       </w:r>
     </w:p>
     <w:p>
@@ -2913,6 +2935,7 @@
     <w:p>
       <w:pPr>
         <w:pStyle w:val="BodyText"/>
+        <w:jc w:val="center"/>
       </w:pPr>
       <w:r>
         <w:rPr>
@@ -3395,6 +3418,7 @@
     <w:p>
       <w:pPr>
         <w:pStyle w:val="BodyText"/>
+        <w:jc w:val="center"/>
       </w:pPr>
       <w:r>
         <w:rPr>
@@ -3549,6 +3573,7 @@
     <w:p>
       <w:pPr>
         <w:pStyle w:val="BodyText"/>
+        <w:jc w:val="center"/>
       </w:pPr>
       <w:r>
         <w:rPr>
@@ -8657,7 +8682,15 @@
       <w:pStyle w:val="Footer"/>
     </w:pPr>
     <w:r>
-      <w:t>Version 1.2 UCTI AssCv 2007-10-23</w:t>
+      <w:t xml:space="preserve">Version 1.2 UCTI </w:t>
+    </w:r>
+    <w:proofErr w:type="spellStart"/>
+    <w:r>
+      <w:t>AssCv</w:t>
+    </w:r>
+    <w:proofErr w:type="spellEnd"/>
+    <w:r>
+      <w:t xml:space="preserve"> 2007-10-23</w:t>
     </w:r>
   </w:p>
 </w:ftr>

</xml_diff>

<commit_message>
Move table captions below tables (centred); fix 3.3 gap bullets
Co-Authored-By: Claude Opus 5.5 <noreply@anthropic.com>
</commit_message>
<xml_diff>
--- a/report/assignment-1/Assignment-1-Report.docx
+++ b/report/assignment-1/Assignment-1-Report.docx
@@ -217,15 +217,7 @@
         <w:t xml:space="preserve">HAND OUT DATE: </w:t>
       </w:r>
       <w:r>
-        <w:t>- dd-mm-</w:t>
-      </w:r>
-      <w:proofErr w:type="spellStart"/>
-      <w:r>
-        <w:t>yyyy</w:t>
-      </w:r>
-      <w:proofErr w:type="spellEnd"/>
-      <w:r>
-        <w:t xml:space="preserve"> -</w:t>
+        <w:t>- dd-mm-yyyy -</w:t>
       </w:r>
     </w:p>
     <w:p>
@@ -251,21 +243,7 @@
         <w:rPr>
           <w:sz w:val="28"/>
         </w:rPr>
-        <w:t>HAND IN DATE:     - dd-mm-</w:t>
-      </w:r>
-      <w:proofErr w:type="spellStart"/>
-      <w:r>
-        <w:rPr>
-          <w:sz w:val="28"/>
-        </w:rPr>
-        <w:t>yyyy</w:t>
-      </w:r>
-      <w:proofErr w:type="spellEnd"/>
-      <w:r>
-        <w:rPr>
-          <w:sz w:val="28"/>
-        </w:rPr>
-        <w:t xml:space="preserve"> -   </w:t>
+        <w:t xml:space="preserve">HAND IN DATE:     - dd-mm-yyyy -   </w:t>
       </w:r>
     </w:p>
     <w:p>
@@ -691,7 +669,7 @@
             </w:rPr>
             <w:fldChar w:fldCharType="separate"/>
           </w:r>
-          <w:hyperlink w:anchor="_Toc244221174" w:history="1">
+          <w:hyperlink w:anchor="_Toc244221394" w:history="1">
             <w:r>
               <w:rPr>
                 <w:rStyle w:val="Hyperlink"/>
@@ -718,7 +696,7 @@
                 <w:noProof/>
                 <w:webHidden/>
               </w:rPr>
-              <w:instrText xml:space="preserve"> PAGEREF _Toc244221174 \h </w:instrText>
+              <w:instrText xml:space="preserve"> PAGEREF _Toc244221394 \h </w:instrText>
             </w:r>
             <w:r>
               <w:rPr>
@@ -761,7 +739,7 @@
               <w:noProof/>
             </w:rPr>
           </w:pPr>
-          <w:hyperlink w:anchor="_Toc244221175" w:history="1">
+          <w:hyperlink w:anchor="_Toc244221395" w:history="1">
             <w:r>
               <w:rPr>
                 <w:rStyle w:val="Hyperlink"/>
@@ -788,7 +766,7 @@
                 <w:noProof/>
                 <w:webHidden/>
               </w:rPr>
-              <w:instrText xml:space="preserve"> PAGEREF _Toc244221175 \h </w:instrText>
+              <w:instrText xml:space="preserve"> PAGEREF _Toc244221395 \h </w:instrText>
             </w:r>
             <w:r>
               <w:rPr>
@@ -830,7 +808,7 @@
               <w:noProof/>
             </w:rPr>
           </w:pPr>
-          <w:hyperlink w:anchor="_Toc244221176" w:history="1">
+          <w:hyperlink w:anchor="_Toc244221396" w:history="1">
             <w:r>
               <w:rPr>
                 <w:rStyle w:val="Hyperlink"/>
@@ -857,7 +835,7 @@
                 <w:noProof/>
                 <w:webHidden/>
               </w:rPr>
-              <w:instrText xml:space="preserve"> PAGEREF _Toc244221176 \h </w:instrText>
+              <w:instrText xml:space="preserve"> PAGEREF _Toc244221396 \h </w:instrText>
             </w:r>
             <w:r>
               <w:rPr>
@@ -899,7 +877,7 @@
               <w:noProof/>
             </w:rPr>
           </w:pPr>
-          <w:hyperlink w:anchor="_Toc244221177" w:history="1">
+          <w:hyperlink w:anchor="_Toc244221397" w:history="1">
             <w:r>
               <w:rPr>
                 <w:rStyle w:val="Hyperlink"/>
@@ -926,7 +904,7 @@
                 <w:noProof/>
                 <w:webHidden/>
               </w:rPr>
-              <w:instrText xml:space="preserve"> PAGEREF _Toc244221177 \h </w:instrText>
+              <w:instrText xml:space="preserve"> PAGEREF _Toc244221397 \h </w:instrText>
             </w:r>
             <w:r>
               <w:rPr>
@@ -968,7 +946,7 @@
               <w:noProof/>
             </w:rPr>
           </w:pPr>
-          <w:hyperlink w:anchor="_Toc244221178" w:history="1">
+          <w:hyperlink w:anchor="_Toc244221398" w:history="1">
             <w:r>
               <w:rPr>
                 <w:rStyle w:val="Hyperlink"/>
@@ -995,7 +973,7 @@
                 <w:noProof/>
                 <w:webHidden/>
               </w:rPr>
-              <w:instrText xml:space="preserve"> PAGEREF _Toc244221178 \h </w:instrText>
+              <w:instrText xml:space="preserve"> PAGEREF _Toc244221398 \h </w:instrText>
             </w:r>
             <w:r>
               <w:rPr>
@@ -1037,7 +1015,7 @@
               <w:noProof/>
             </w:rPr>
           </w:pPr>
-          <w:hyperlink w:anchor="_Toc244221179" w:history="1">
+          <w:hyperlink w:anchor="_Toc244221399" w:history="1">
             <w:r>
               <w:rPr>
                 <w:rStyle w:val="Hyperlink"/>
@@ -1064,7 +1042,7 @@
                 <w:noProof/>
                 <w:webHidden/>
               </w:rPr>
-              <w:instrText xml:space="preserve"> PAGEREF _Toc244221179 \h </w:instrText>
+              <w:instrText xml:space="preserve"> PAGEREF _Toc244221399 \h </w:instrText>
             </w:r>
             <w:r>
               <w:rPr>
@@ -1106,7 +1084,7 @@
               <w:noProof/>
             </w:rPr>
           </w:pPr>
-          <w:hyperlink w:anchor="_Toc244221180" w:history="1">
+          <w:hyperlink w:anchor="_Toc244221400" w:history="1">
             <w:r>
               <w:rPr>
                 <w:rStyle w:val="Hyperlink"/>
@@ -1133,7 +1111,7 @@
                 <w:noProof/>
                 <w:webHidden/>
               </w:rPr>
-              <w:instrText xml:space="preserve"> PAGEREF _Toc244221180 \h </w:instrText>
+              <w:instrText xml:space="preserve"> PAGEREF _Toc244221400 \h </w:instrText>
             </w:r>
             <w:r>
               <w:rPr>
@@ -1176,7 +1154,7 @@
               <w:noProof/>
             </w:rPr>
           </w:pPr>
-          <w:hyperlink w:anchor="_Toc244221181" w:history="1">
+          <w:hyperlink w:anchor="_Toc244221401" w:history="1">
             <w:r>
               <w:rPr>
                 <w:rStyle w:val="Hyperlink"/>
@@ -1203,7 +1181,7 @@
                 <w:noProof/>
                 <w:webHidden/>
               </w:rPr>
-              <w:instrText xml:space="preserve"> PAGEREF _Toc244221181 \h </w:instrText>
+              <w:instrText xml:space="preserve"> PAGEREF _Toc244221401 \h </w:instrText>
             </w:r>
             <w:r>
               <w:rPr>
@@ -1245,7 +1223,7 @@
               <w:noProof/>
             </w:rPr>
           </w:pPr>
-          <w:hyperlink w:anchor="_Toc244221182" w:history="1">
+          <w:hyperlink w:anchor="_Toc244221402" w:history="1">
             <w:r>
               <w:rPr>
                 <w:rStyle w:val="Hyperlink"/>
@@ -1272,7 +1250,7 @@
                 <w:noProof/>
                 <w:webHidden/>
               </w:rPr>
-              <w:instrText xml:space="preserve"> PAGEREF _Toc244221182 \h </w:instrText>
+              <w:instrText xml:space="preserve"> PAGEREF _Toc244221402 \h </w:instrText>
             </w:r>
             <w:r>
               <w:rPr>
@@ -1314,7 +1292,7 @@
               <w:noProof/>
             </w:rPr>
           </w:pPr>
-          <w:hyperlink w:anchor="_Toc244221183" w:history="1">
+          <w:hyperlink w:anchor="_Toc244221403" w:history="1">
             <w:r>
               <w:rPr>
                 <w:rStyle w:val="Hyperlink"/>
@@ -1341,7 +1319,7 @@
                 <w:noProof/>
                 <w:webHidden/>
               </w:rPr>
-              <w:instrText xml:space="preserve"> PAGEREF _Toc244221183 \h </w:instrText>
+              <w:instrText xml:space="preserve"> PAGEREF _Toc244221403 \h </w:instrText>
             </w:r>
             <w:r>
               <w:rPr>
@@ -1383,7 +1361,7 @@
               <w:noProof/>
             </w:rPr>
           </w:pPr>
-          <w:hyperlink w:anchor="_Toc244221184" w:history="1">
+          <w:hyperlink w:anchor="_Toc244221404" w:history="1">
             <w:r>
               <w:rPr>
                 <w:rStyle w:val="Hyperlink"/>
@@ -1410,7 +1388,7 @@
                 <w:noProof/>
                 <w:webHidden/>
               </w:rPr>
-              <w:instrText xml:space="preserve"> PAGEREF _Toc244221184 \h </w:instrText>
+              <w:instrText xml:space="preserve"> PAGEREF _Toc244221404 \h </w:instrText>
             </w:r>
             <w:r>
               <w:rPr>
@@ -1452,7 +1430,7 @@
               <w:noProof/>
             </w:rPr>
           </w:pPr>
-          <w:hyperlink w:anchor="_Toc244221185" w:history="1">
+          <w:hyperlink w:anchor="_Toc244221405" w:history="1">
             <w:r>
               <w:rPr>
                 <w:rStyle w:val="Hyperlink"/>
@@ -1479,7 +1457,7 @@
                 <w:noProof/>
                 <w:webHidden/>
               </w:rPr>
-              <w:instrText xml:space="preserve"> PAGEREF _Toc244221185 \h </w:instrText>
+              <w:instrText xml:space="preserve"> PAGEREF _Toc244221405 \h </w:instrText>
             </w:r>
             <w:r>
               <w:rPr>
@@ -1522,7 +1500,7 @@
               <w:noProof/>
             </w:rPr>
           </w:pPr>
-          <w:hyperlink w:anchor="_Toc244221186" w:history="1">
+          <w:hyperlink w:anchor="_Toc244221406" w:history="1">
             <w:r>
               <w:rPr>
                 <w:rStyle w:val="Hyperlink"/>
@@ -1549,7 +1527,7 @@
                 <w:noProof/>
                 <w:webHidden/>
               </w:rPr>
-              <w:instrText xml:space="preserve"> PAGEREF _Toc244221186 \h </w:instrText>
+              <w:instrText xml:space="preserve"> PAGEREF _Toc244221406 \h </w:instrText>
             </w:r>
             <w:r>
               <w:rPr>
@@ -1591,7 +1569,7 @@
               <w:noProof/>
             </w:rPr>
           </w:pPr>
-          <w:hyperlink w:anchor="_Toc244221187" w:history="1">
+          <w:hyperlink w:anchor="_Toc244221407" w:history="1">
             <w:r>
               <w:rPr>
                 <w:rStyle w:val="Hyperlink"/>
@@ -1618,7 +1596,7 @@
                 <w:noProof/>
                 <w:webHidden/>
               </w:rPr>
-              <w:instrText xml:space="preserve"> PAGEREF _Toc244221187 \h </w:instrText>
+              <w:instrText xml:space="preserve"> PAGEREF _Toc244221407 \h </w:instrText>
             </w:r>
             <w:r>
               <w:rPr>
@@ -1660,7 +1638,7 @@
               <w:noProof/>
             </w:rPr>
           </w:pPr>
-          <w:hyperlink w:anchor="_Toc244221188" w:history="1">
+          <w:hyperlink w:anchor="_Toc244221408" w:history="1">
             <w:r>
               <w:rPr>
                 <w:rStyle w:val="Hyperlink"/>
@@ -1687,7 +1665,7 @@
                 <w:noProof/>
                 <w:webHidden/>
               </w:rPr>
-              <w:instrText xml:space="preserve"> PAGEREF _Toc244221188 \h </w:instrText>
+              <w:instrText xml:space="preserve"> PAGEREF _Toc244221408 \h </w:instrText>
             </w:r>
             <w:r>
               <w:rPr>
@@ -1729,7 +1707,7 @@
               <w:noProof/>
             </w:rPr>
           </w:pPr>
-          <w:hyperlink w:anchor="_Toc244221189" w:history="1">
+          <w:hyperlink w:anchor="_Toc244221409" w:history="1">
             <w:r>
               <w:rPr>
                 <w:rStyle w:val="Hyperlink"/>
@@ -1756,7 +1734,7 @@
                 <w:noProof/>
                 <w:webHidden/>
               </w:rPr>
-              <w:instrText xml:space="preserve"> PAGEREF _Toc244221189 \h </w:instrText>
+              <w:instrText xml:space="preserve"> PAGEREF _Toc244221409 \h </w:instrText>
             </w:r>
             <w:r>
               <w:rPr>
@@ -1798,7 +1776,7 @@
               <w:noProof/>
             </w:rPr>
           </w:pPr>
-          <w:hyperlink w:anchor="_Toc244221190" w:history="1">
+          <w:hyperlink w:anchor="_Toc244221410" w:history="1">
             <w:r>
               <w:rPr>
                 <w:rStyle w:val="Hyperlink"/>
@@ -1825,7 +1803,7 @@
                 <w:noProof/>
                 <w:webHidden/>
               </w:rPr>
-              <w:instrText xml:space="preserve"> PAGEREF _Toc244221190 \h </w:instrText>
+              <w:instrText xml:space="preserve"> PAGEREF _Toc244221410 \h </w:instrText>
             </w:r>
             <w:r>
               <w:rPr>
@@ -1867,7 +1845,7 @@
               <w:noProof/>
             </w:rPr>
           </w:pPr>
-          <w:hyperlink w:anchor="_Toc244221191" w:history="1">
+          <w:hyperlink w:anchor="_Toc244221411" w:history="1">
             <w:r>
               <w:rPr>
                 <w:rStyle w:val="Hyperlink"/>
@@ -1894,7 +1872,7 @@
                 <w:noProof/>
                 <w:webHidden/>
               </w:rPr>
-              <w:instrText xml:space="preserve"> PAGEREF _Toc244221191 \h </w:instrText>
+              <w:instrText xml:space="preserve"> PAGEREF _Toc244221411 \h </w:instrText>
             </w:r>
             <w:r>
               <w:rPr>
@@ -1936,7 +1914,7 @@
               <w:noProof/>
             </w:rPr>
           </w:pPr>
-          <w:hyperlink w:anchor="_Toc244221192" w:history="1">
+          <w:hyperlink w:anchor="_Toc244221412" w:history="1">
             <w:r>
               <w:rPr>
                 <w:rStyle w:val="Hyperlink"/>
@@ -1963,7 +1941,7 @@
                 <w:noProof/>
                 <w:webHidden/>
               </w:rPr>
-              <w:instrText xml:space="preserve"> PAGEREF _Toc244221192 \h </w:instrText>
+              <w:instrText xml:space="preserve"> PAGEREF _Toc244221412 \h </w:instrText>
             </w:r>
             <w:r>
               <w:rPr>
@@ -2006,7 +1984,7 @@
               <w:noProof/>
             </w:rPr>
           </w:pPr>
-          <w:hyperlink w:anchor="_Toc244221193" w:history="1">
+          <w:hyperlink w:anchor="_Toc244221413" w:history="1">
             <w:r>
               <w:rPr>
                 <w:rStyle w:val="Hyperlink"/>
@@ -2033,7 +2011,7 @@
                 <w:noProof/>
                 <w:webHidden/>
               </w:rPr>
-              <w:instrText xml:space="preserve"> PAGEREF _Toc244221193 \h </w:instrText>
+              <w:instrText xml:space="preserve"> PAGEREF _Toc244221413 \h </w:instrText>
             </w:r>
             <w:r>
               <w:rPr>
@@ -2075,7 +2053,7 @@
               <w:noProof/>
             </w:rPr>
           </w:pPr>
-          <w:hyperlink w:anchor="_Toc244221194" w:history="1">
+          <w:hyperlink w:anchor="_Toc244221414" w:history="1">
             <w:r>
               <w:rPr>
                 <w:rStyle w:val="Hyperlink"/>
@@ -2102,7 +2080,7 @@
                 <w:noProof/>
                 <w:webHidden/>
               </w:rPr>
-              <w:instrText xml:space="preserve"> PAGEREF _Toc244221194 \h </w:instrText>
+              <w:instrText xml:space="preserve"> PAGEREF _Toc244221414 \h </w:instrText>
             </w:r>
             <w:r>
               <w:rPr>
@@ -2144,7 +2122,7 @@
               <w:noProof/>
             </w:rPr>
           </w:pPr>
-          <w:hyperlink w:anchor="_Toc244221195" w:history="1">
+          <w:hyperlink w:anchor="_Toc244221415" w:history="1">
             <w:r>
               <w:rPr>
                 <w:rStyle w:val="Hyperlink"/>
@@ -2171,7 +2149,7 @@
                 <w:noProof/>
                 <w:webHidden/>
               </w:rPr>
-              <w:instrText xml:space="preserve"> PAGEREF _Toc244221195 \h </w:instrText>
+              <w:instrText xml:space="preserve"> PAGEREF _Toc244221415 \h </w:instrText>
             </w:r>
             <w:r>
               <w:rPr>
@@ -2213,7 +2191,7 @@
               <w:noProof/>
             </w:rPr>
           </w:pPr>
-          <w:hyperlink w:anchor="_Toc244221196" w:history="1">
+          <w:hyperlink w:anchor="_Toc244221416" w:history="1">
             <w:r>
               <w:rPr>
                 <w:rStyle w:val="Hyperlink"/>
@@ -2240,7 +2218,7 @@
                 <w:noProof/>
                 <w:webHidden/>
               </w:rPr>
-              <w:instrText xml:space="preserve"> PAGEREF _Toc244221196 \h </w:instrText>
+              <w:instrText xml:space="preserve"> PAGEREF _Toc244221416 \h </w:instrText>
             </w:r>
             <w:r>
               <w:rPr>
@@ -2283,7 +2261,7 @@
               <w:noProof/>
             </w:rPr>
           </w:pPr>
-          <w:hyperlink w:anchor="_Toc244221197" w:history="1">
+          <w:hyperlink w:anchor="_Toc244221417" w:history="1">
             <w:r>
               <w:rPr>
                 <w:rStyle w:val="Hyperlink"/>
@@ -2310,7 +2288,7 @@
                 <w:noProof/>
                 <w:webHidden/>
               </w:rPr>
-              <w:instrText xml:space="preserve"> PAGEREF _Toc244221197 \h </w:instrText>
+              <w:instrText xml:space="preserve"> PAGEREF _Toc244221417 \h </w:instrText>
             </w:r>
             <w:r>
               <w:rPr>
@@ -2353,7 +2331,7 @@
               <w:noProof/>
             </w:rPr>
           </w:pPr>
-          <w:hyperlink w:anchor="_Toc244221198" w:history="1">
+          <w:hyperlink w:anchor="_Toc244221418" w:history="1">
             <w:r>
               <w:rPr>
                 <w:rStyle w:val="Hyperlink"/>
@@ -2380,7 +2358,7 @@
                 <w:noProof/>
                 <w:webHidden/>
               </w:rPr>
-              <w:instrText xml:space="preserve"> PAGEREF _Toc244221198 \h </w:instrText>
+              <w:instrText xml:space="preserve"> PAGEREF _Toc244221418 \h </w:instrText>
             </w:r>
             <w:r>
               <w:rPr>
@@ -2422,7 +2400,7 @@
               <w:noProof/>
             </w:rPr>
           </w:pPr>
-          <w:hyperlink w:anchor="_Toc244221199" w:history="1">
+          <w:hyperlink w:anchor="_Toc244221419" w:history="1">
             <w:r>
               <w:rPr>
                 <w:rStyle w:val="Hyperlink"/>
@@ -2449,7 +2427,7 @@
                 <w:noProof/>
                 <w:webHidden/>
               </w:rPr>
-              <w:instrText xml:space="preserve"> PAGEREF _Toc244221199 \h </w:instrText>
+              <w:instrText xml:space="preserve"> PAGEREF _Toc244221419 \h </w:instrText>
             </w:r>
             <w:r>
               <w:rPr>
@@ -2491,7 +2469,7 @@
               <w:noProof/>
             </w:rPr>
           </w:pPr>
-          <w:hyperlink w:anchor="_Toc244221200" w:history="1">
+          <w:hyperlink w:anchor="_Toc244221420" w:history="1">
             <w:r>
               <w:rPr>
                 <w:rStyle w:val="Hyperlink"/>
@@ -2518,7 +2496,7 @@
                 <w:noProof/>
                 <w:webHidden/>
               </w:rPr>
-              <w:instrText xml:space="preserve"> PAGEREF _Toc244221200 \h </w:instrText>
+              <w:instrText xml:space="preserve"> PAGEREF _Toc244221420 \h </w:instrText>
             </w:r>
             <w:r>
               <w:rPr>
@@ -2560,7 +2538,7 @@
               <w:noProof/>
             </w:rPr>
           </w:pPr>
-          <w:hyperlink w:anchor="_Toc244221201" w:history="1">
+          <w:hyperlink w:anchor="_Toc244221421" w:history="1">
             <w:r>
               <w:rPr>
                 <w:rStyle w:val="Hyperlink"/>
@@ -2587,7 +2565,7 @@
                 <w:noProof/>
                 <w:webHidden/>
               </w:rPr>
-              <w:instrText xml:space="preserve"> PAGEREF _Toc244221201 \h </w:instrText>
+              <w:instrText xml:space="preserve"> PAGEREF _Toc244221421 \h </w:instrText>
             </w:r>
             <w:r>
               <w:rPr>
@@ -2630,7 +2608,7 @@
               <w:noProof/>
             </w:rPr>
           </w:pPr>
-          <w:hyperlink w:anchor="_Toc244221202" w:history="1">
+          <w:hyperlink w:anchor="_Toc244221422" w:history="1">
             <w:r>
               <w:rPr>
                 <w:rStyle w:val="Hyperlink"/>
@@ -2657,7 +2635,7 @@
                 <w:noProof/>
                 <w:webHidden/>
               </w:rPr>
-              <w:instrText xml:space="preserve"> PAGEREF _Toc244221202 \h </w:instrText>
+              <w:instrText xml:space="preserve"> PAGEREF _Toc244221422 \h </w:instrText>
             </w:r>
             <w:r>
               <w:rPr>
@@ -2726,7 +2704,7 @@
       </w:pPr>
       <w:bookmarkStart w:id="1" w:name="executive-summary"/>
       <w:bookmarkStart w:id="2" w:name="_Toc244220706"/>
-      <w:bookmarkStart w:id="3" w:name="_Toc244221174"/>
+      <w:bookmarkStart w:id="3" w:name="_Toc244221394"/>
       <w:r>
         <w:lastRenderedPageBreak/>
         <w:t>Executive Summary</w:t>
@@ -2772,7 +2750,7 @@
       </w:pPr>
       <w:bookmarkStart w:id="4" w:name="introduction"/>
       <w:bookmarkStart w:id="5" w:name="_Toc244220707"/>
-      <w:bookmarkStart w:id="6" w:name="_Toc244221175"/>
+      <w:bookmarkStart w:id="6" w:name="_Toc244221395"/>
       <w:bookmarkEnd w:id="1"/>
       <w:r>
         <w:lastRenderedPageBreak/>
@@ -2787,7 +2765,7 @@
       </w:pPr>
       <w:bookmarkStart w:id="7" w:name="background-and-purpose"/>
       <w:bookmarkStart w:id="8" w:name="_Toc244220708"/>
-      <w:bookmarkStart w:id="9" w:name="_Toc244221176"/>
+      <w:bookmarkStart w:id="9" w:name="_Toc244221396"/>
       <w:r>
         <w:t>Background and Purpose</w:t>
       </w:r>
@@ -2824,7 +2802,7 @@
       </w:pPr>
       <w:bookmarkStart w:id="10" w:name="what-is-actual-budget"/>
       <w:bookmarkStart w:id="11" w:name="_Toc244220709"/>
-      <w:bookmarkStart w:id="12" w:name="_Toc244221177"/>
+      <w:bookmarkStart w:id="12" w:name="_Toc244221397"/>
       <w:bookmarkEnd w:id="7"/>
       <w:r>
         <w:t>What Is Actual Budget</w:t>
@@ -2854,7 +2832,7 @@
       </w:pPr>
       <w:bookmarkStart w:id="13" w:name="main-features-and-how-it-works"/>
       <w:bookmarkStart w:id="14" w:name="_Toc244220710"/>
-      <w:bookmarkStart w:id="15" w:name="_Toc244221178"/>
+      <w:bookmarkStart w:id="15" w:name="_Toc244221398"/>
       <w:bookmarkEnd w:id="10"/>
       <w:r>
         <w:t>Main Features and How It Works</w:t>
@@ -2951,26 +2929,13 @@
       </w:pPr>
       <w:bookmarkStart w:id="16" w:name="who-is-involved"/>
       <w:bookmarkStart w:id="17" w:name="_Toc244220711"/>
-      <w:bookmarkStart w:id="18" w:name="_Toc244221179"/>
+      <w:bookmarkStart w:id="18" w:name="_Toc244221399"/>
       <w:bookmarkEnd w:id="13"/>
       <w:r>
         <w:t>Who Is Involved</w:t>
       </w:r>
       <w:bookmarkEnd w:id="17"/>
       <w:bookmarkEnd w:id="18"/>
-    </w:p>
-    <w:p>
-      <w:pPr>
-        <w:pStyle w:val="FirstParagraph"/>
-        <w:keepNext/>
-      </w:pPr>
-      <w:r>
-        <w:rPr>
-          <w:i/>
-          <w:iCs/>
-        </w:rPr>
-        <w:t>Table 1.1. Main stakeholders of Actual Budget.</w:t>
-      </w:r>
     </w:p>
     <w:tbl>
       <w:tblPr>
@@ -3196,6 +3161,7 @@
           <w:p>
             <w:pPr>
               <w:pStyle w:val="Compact"/>
+              <w:keepNext/>
               <w:spacing w:before="40" w:after="40"/>
               <w:jc w:val="left"/>
             </w:pPr>
@@ -3211,6 +3177,7 @@
           <w:p>
             <w:pPr>
               <w:pStyle w:val="Compact"/>
+              <w:keepNext/>
               <w:spacing w:before="40" w:after="40"/>
               <w:jc w:val="left"/>
             </w:pPr>
@@ -3223,12 +3190,30 @@
     </w:tbl>
     <w:p>
       <w:pPr>
-        <w:pStyle w:val="Heading2"/>
+        <w:pStyle w:val="FirstParagraph"/>
+        <w:spacing w:before="120"/>
+        <w:jc w:val="center"/>
+        <w:rPr>
+          <w:i/>
+          <w:color w:val="000000"/>
+        </w:rPr>
       </w:pPr>
       <w:bookmarkStart w:id="19" w:name="main-challenges"/>
       <w:bookmarkStart w:id="20" w:name="_Toc244220712"/>
-      <w:bookmarkStart w:id="21" w:name="_Toc244221180"/>
       <w:bookmarkEnd w:id="16"/>
+      <w:r>
+        <w:rPr>
+          <w:i/>
+          <w:color w:val="000000"/>
+        </w:rPr>
+        <w:t>Table 1.1. Main stakeholders of Actual Budget.</w:t>
+      </w:r>
+    </w:p>
+    <w:p>
+      <w:pPr>
+        <w:pStyle w:val="Heading2"/>
+      </w:pPr>
+      <w:bookmarkStart w:id="21" w:name="_Toc244221400"/>
       <w:r>
         <w:t>Main Challenges</w:t>
       </w:r>
@@ -3298,7 +3283,7 @@
       </w:pPr>
       <w:bookmarkStart w:id="22" w:name="software-development-methodology"/>
       <w:bookmarkStart w:id="23" w:name="_Toc244220713"/>
-      <w:bookmarkStart w:id="24" w:name="_Toc244221181"/>
+      <w:bookmarkStart w:id="24" w:name="_Toc244221401"/>
       <w:bookmarkEnd w:id="4"/>
       <w:bookmarkEnd w:id="19"/>
       <w:r>
@@ -3322,7 +3307,7 @@
       </w:pPr>
       <w:bookmarkStart w:id="25" w:name="current-development-process-of-actual"/>
       <w:bookmarkStart w:id="26" w:name="_Toc244220714"/>
-      <w:bookmarkStart w:id="27" w:name="_Toc244221182"/>
+      <w:bookmarkStart w:id="27" w:name="_Toc244221402"/>
       <w:r>
         <w:t>Current Development Process of Actual</w:t>
       </w:r>
@@ -3434,7 +3419,7 @@
       </w:pPr>
       <w:bookmarkStart w:id="28" w:name="why-kanban-fits-actual"/>
       <w:bookmarkStart w:id="29" w:name="_Toc244220715"/>
-      <w:bookmarkStart w:id="30" w:name="_Toc244221183"/>
+      <w:bookmarkStart w:id="30" w:name="_Toc244221403"/>
       <w:bookmarkEnd w:id="25"/>
       <w:r>
         <w:t>Why Kanban Fits Actual</w:t>
@@ -3492,7 +3477,7 @@
       </w:pPr>
       <w:bookmarkStart w:id="31" w:name="applying-kanban-to-actual"/>
       <w:bookmarkStart w:id="32" w:name="_Toc244220716"/>
-      <w:bookmarkStart w:id="33" w:name="_Toc244221184"/>
+      <w:bookmarkStart w:id="33" w:name="_Toc244221404"/>
       <w:bookmarkEnd w:id="28"/>
       <w:r>
         <w:t>Applying Kanban to Actual</w:t>
@@ -3589,7 +3574,7 @@
       </w:pPr>
       <w:bookmarkStart w:id="34" w:name="critical-evaluation"/>
       <w:bookmarkStart w:id="35" w:name="_Toc244220717"/>
-      <w:bookmarkStart w:id="36" w:name="_Toc244221185"/>
+      <w:bookmarkStart w:id="36" w:name="_Toc244221405"/>
       <w:bookmarkEnd w:id="31"/>
       <w:r>
         <w:lastRenderedPageBreak/>
@@ -3612,7 +3597,7 @@
       </w:pPr>
       <w:bookmarkStart w:id="37" w:name="quality-assurance-process"/>
       <w:bookmarkStart w:id="38" w:name="_Toc244220718"/>
-      <w:bookmarkStart w:id="39" w:name="_Toc244221186"/>
+      <w:bookmarkStart w:id="39" w:name="_Toc244221406"/>
       <w:bookmarkEnd w:id="22"/>
       <w:bookmarkEnd w:id="34"/>
       <w:r>
@@ -3636,7 +3621,7 @@
       </w:pPr>
       <w:bookmarkStart w:id="40" w:name="what-quality-means-for-actual"/>
       <w:bookmarkStart w:id="41" w:name="_Toc244220719"/>
-      <w:bookmarkStart w:id="42" w:name="_Toc244221187"/>
+      <w:bookmarkStart w:id="42" w:name="_Toc244221407"/>
       <w:r>
         <w:t>What Quality Means for Actual</w:t>
       </w:r>
@@ -3725,7 +3710,7 @@
       </w:pPr>
       <w:bookmarkStart w:id="43" w:name="key-quality-attributes"/>
       <w:bookmarkStart w:id="44" w:name="_Toc244220720"/>
-      <w:bookmarkStart w:id="45" w:name="_Toc244221188"/>
+      <w:bookmarkStart w:id="45" w:name="_Toc244221408"/>
       <w:bookmarkEnd w:id="40"/>
       <w:r>
         <w:t>Key Quality Attributes</w:t>
@@ -3783,7 +3768,7 @@
       </w:pPr>
       <w:bookmarkStart w:id="46" w:name="current-qa-practices-and-gaps"/>
       <w:bookmarkStart w:id="47" w:name="_Toc244220721"/>
-      <w:bookmarkStart w:id="48" w:name="_Toc244221189"/>
+      <w:bookmarkStart w:id="48" w:name="_Toc244221409"/>
       <w:bookmarkEnd w:id="43"/>
       <w:r>
         <w:lastRenderedPageBreak/>
@@ -3813,7 +3798,67 @@
         <w:pStyle w:val="BodyText"/>
       </w:pPr>
       <w:r>
-        <w:t>There are also four gaps that are discovered or happened from the research: - Security: No proactive check of access control before release. Three access-control flaws in the sync server feature were published in 2026 (Actual Budget, 2026b, 2026c, 2026d). The most critical one was about missing authentication on six of the SimpleFIN and Pluggy AI bank-sync endpoints, which the GoCardless endpoints had it (Actual Budget, 2026c). This shows inconsistent authentication across bank-sync providers, and the flaw was only found after release. The security policy also states no response time for reports (Actual Budget, n.d.-g). - Reliability: There is no test coverage measurement. Test coverage would not prove that the code is correct, but it would at least show what is untested. And reliability defects still reach users, like a sync defect that stopped some budgets from opening and it's stayed in released versions for years (Brown, 2026). Although Actual's testing checklist asks for "appropriate test coverage" (Actual Budget, n.d.-i, Testing Checklist section), there's no coverage report found in the repository, and sync-server tests have coverage switched off (Actual Budget, 2026a). Therefore, nobody can tell how much of the sync and migration code is actually tested and actually safe. - Interaction capability: No automated accessibility testing was found, despite the WCAG target (Actual Budget, 2026a). - Process: No written QA plan. Quality rules are spread across documentation, templates and CI files, so there's no a single place that states what must be checked before work moves on.</w:t>
+        <w:t>There are also four gaps that are discovered or happened from the research:</w:t>
+      </w:r>
+    </w:p>
+    <w:p>
+      <w:pPr>
+        <w:pStyle w:val="Compact"/>
+        <w:numPr>
+          <w:ilvl w:val="0"/>
+          <w:numId w:val="2"/>
+        </w:numPr>
+      </w:pPr>
+      <w:r>
+        <w:t>Security:</w:t>
+      </w:r>
+      <w:r>
+        <w:t xml:space="preserve"> No proactive check of access control before release. Three access-control flaws in the sync server feature were published in 2026 (Actual Budget, 2026b, 2026c, 2026d). The most critical one was about missing authentication on six of the SimpleFIN and Pluggy AI bank-sync endpoints, which the GoCardless endpoints had it (Actual Budget, 2026c). This shows inconsistent authentication across bank-sync providers, and the flaw was only found after release. The security policy also states no response time for reports (Actual Budget, n.d.-g).</w:t>
+      </w:r>
+    </w:p>
+    <w:p>
+      <w:pPr>
+        <w:pStyle w:val="Compact"/>
+        <w:numPr>
+          <w:ilvl w:val="0"/>
+          <w:numId w:val="2"/>
+        </w:numPr>
+      </w:pPr>
+      <w:r>
+        <w:t>Reliability:</w:t>
+      </w:r>
+      <w:r>
+        <w:t xml:space="preserve"> There is no test coverage measurement. Test coverage would not prove that the code is correct, but it would at least show what is untested. And reliability defects still reach users, like a sync defect that stopped some budgets from opening and it's stayed in released versions for years (Brown, 2026). Although Actual's testing checklist asks for "appropriate test coverage" (Actual Budget, n.d.-i, Testing Checklist section), there's no coverage report found in the repository, and sync-server tests have coverage switched off (Actual Budget, 2026a). Therefore, nobody can tell how much of the sync and migration code is actually tested and actually safe.</w:t>
+      </w:r>
+    </w:p>
+    <w:p>
+      <w:pPr>
+        <w:pStyle w:val="Compact"/>
+        <w:numPr>
+          <w:ilvl w:val="0"/>
+          <w:numId w:val="2"/>
+        </w:numPr>
+      </w:pPr>
+      <w:r>
+        <w:t>Interaction capability:</w:t>
+      </w:r>
+      <w:r>
+        <w:t xml:space="preserve"> No automated accessibility testing was found, despite the WCAG target (Actual Budget, 2026a).</w:t>
+      </w:r>
+    </w:p>
+    <w:p>
+      <w:pPr>
+        <w:pStyle w:val="Compact"/>
+        <w:numPr>
+          <w:ilvl w:val="0"/>
+          <w:numId w:val="2"/>
+        </w:numPr>
+      </w:pPr>
+      <w:r>
+        <w:t>Process:</w:t>
+      </w:r>
+      <w:r>
+        <w:t xml:space="preserve"> No written QA plan. Quality rules are spread across documentation, templates and CI files, so there's no a single place that states what must be checked before work moves on.</w:t>
       </w:r>
     </w:p>
     <w:p>
@@ -3822,7 +3867,7 @@
       </w:pPr>
       <w:bookmarkStart w:id="49" w:name="selected-standards-and-practices"/>
       <w:bookmarkStart w:id="50" w:name="_Toc244220722"/>
-      <w:bookmarkStart w:id="51" w:name="_Toc244221190"/>
+      <w:bookmarkStart w:id="51" w:name="_Toc244221410"/>
       <w:bookmarkEnd w:id="46"/>
       <w:r>
         <w:t>Selected Standards and Practices</w:t>
@@ -3836,19 +3881,6 @@
       </w:pPr>
       <w:r>
         <w:t>Table 3.1 lists the standard that closes each gap from Section 3.3. Two standard are published standards that a volunteer team can use for free, while the rest are practices proposed in this report.</w:t>
-      </w:r>
-    </w:p>
-    <w:p>
-      <w:pPr>
-        <w:pStyle w:val="BodyText"/>
-        <w:keepNext/>
-      </w:pPr>
-      <w:r>
-        <w:rPr>
-          <w:i/>
-          <w:iCs/>
-        </w:rPr>
-        <w:t>Table 3.1. How each gap is closed.</w:t>
       </w:r>
     </w:p>
     <w:tbl>
@@ -3866,9 +3898,9 @@
         <w:tblLook w:val="0020" w:firstRow="1" w:lastRow="0" w:firstColumn="0" w:lastColumn="0" w:noHBand="0" w:noVBand="0"/>
       </w:tblPr>
       <w:tblGrid>
-        <w:gridCol w:w="1256"/>
+        <w:gridCol w:w="1257"/>
         <w:gridCol w:w="1536"/>
-        <w:gridCol w:w="6224"/>
+        <w:gridCol w:w="6223"/>
       </w:tblGrid>
       <w:tr>
         <w:trPr>
@@ -3878,7 +3910,7 @@
         </w:trPr>
         <w:tc>
           <w:tcPr>
-            <w:tcW w:w="601" w:type="pct"/>
+            <w:tcW w:w="697" w:type="pct"/>
             <w:tcBorders>
               <w:bottom w:val="none" w:sz="0" w:space="0" w:color="auto"/>
             </w:tcBorders>
@@ -3902,7 +3934,7 @@
         </w:tc>
         <w:tc>
           <w:tcPr>
-            <w:tcW w:w="792" w:type="pct"/>
+            <w:tcW w:w="852" w:type="pct"/>
             <w:tcBorders>
               <w:bottom w:val="none" w:sz="0" w:space="0" w:color="auto"/>
             </w:tcBorders>
@@ -3926,7 +3958,7 @@
         </w:tc>
         <w:tc>
           <w:tcPr>
-            <w:tcW w:w="3607" w:type="pct"/>
+            <w:tcW w:w="3452" w:type="pct"/>
             <w:tcBorders>
               <w:bottom w:val="none" w:sz="0" w:space="0" w:color="auto"/>
             </w:tcBorders>
@@ -3955,7 +3987,7 @@
         </w:trPr>
         <w:tc>
           <w:tcPr>
-            <w:tcW w:w="601" w:type="pct"/>
+            <w:tcW w:w="697" w:type="pct"/>
           </w:tcPr>
           <w:p>
             <w:pPr>
@@ -3970,7 +4002,7 @@
         </w:tc>
         <w:tc>
           <w:tcPr>
-            <w:tcW w:w="792" w:type="pct"/>
+            <w:tcW w:w="852" w:type="pct"/>
           </w:tcPr>
           <w:p>
             <w:pPr>
@@ -3985,7 +4017,7 @@
         </w:tc>
         <w:tc>
           <w:tcPr>
-            <w:tcW w:w="3607" w:type="pct"/>
+            <w:tcW w:w="3452" w:type="pct"/>
           </w:tcPr>
           <w:p>
             <w:pPr>
@@ -4005,7 +4037,7 @@
         </w:trPr>
         <w:tc>
           <w:tcPr>
-            <w:tcW w:w="601" w:type="pct"/>
+            <w:tcW w:w="697" w:type="pct"/>
           </w:tcPr>
           <w:p>
             <w:pPr>
@@ -4020,7 +4052,7 @@
         </w:tc>
         <w:tc>
           <w:tcPr>
-            <w:tcW w:w="792" w:type="pct"/>
+            <w:tcW w:w="852" w:type="pct"/>
           </w:tcPr>
           <w:p>
             <w:pPr>
@@ -4035,7 +4067,7 @@
         </w:tc>
         <w:tc>
           <w:tcPr>
-            <w:tcW w:w="3607" w:type="pct"/>
+            <w:tcW w:w="3452" w:type="pct"/>
           </w:tcPr>
           <w:p>
             <w:pPr>
@@ -4055,22 +4087,23 @@
         </w:trPr>
         <w:tc>
           <w:tcPr>
-            <w:tcW w:w="601" w:type="pct"/>
-          </w:tcPr>
-          <w:p>
-            <w:pPr>
-              <w:pStyle w:val="Compact"/>
-              <w:spacing w:before="40" w:after="40"/>
-              <w:jc w:val="left"/>
-            </w:pPr>
-            <w:r>
+            <w:tcW w:w="697" w:type="pct"/>
+          </w:tcPr>
+          <w:p>
+            <w:pPr>
+              <w:pStyle w:val="Compact"/>
+              <w:spacing w:before="40" w:after="40"/>
+              <w:jc w:val="left"/>
+            </w:pPr>
+            <w:r>
+              <w:lastRenderedPageBreak/>
               <w:t>Reliability</w:t>
             </w:r>
           </w:p>
         </w:tc>
         <w:tc>
           <w:tcPr>
-            <w:tcW w:w="792" w:type="pct"/>
+            <w:tcW w:w="852" w:type="pct"/>
           </w:tcPr>
           <w:p>
             <w:pPr>
@@ -4085,7 +4118,7 @@
         </w:tc>
         <w:tc>
           <w:tcPr>
-            <w:tcW w:w="3607" w:type="pct"/>
+            <w:tcW w:w="3452" w:type="pct"/>
           </w:tcPr>
           <w:p>
             <w:pPr>
@@ -4105,23 +4138,22 @@
         </w:trPr>
         <w:tc>
           <w:tcPr>
-            <w:tcW w:w="601" w:type="pct"/>
-          </w:tcPr>
-          <w:p>
-            <w:pPr>
-              <w:pStyle w:val="Compact"/>
-              <w:spacing w:before="40" w:after="40"/>
-              <w:jc w:val="left"/>
-            </w:pPr>
-            <w:r>
-              <w:lastRenderedPageBreak/>
+            <w:tcW w:w="697" w:type="pct"/>
+          </w:tcPr>
+          <w:p>
+            <w:pPr>
+              <w:pStyle w:val="Compact"/>
+              <w:spacing w:before="40" w:after="40"/>
+              <w:jc w:val="left"/>
+            </w:pPr>
+            <w:r>
               <w:t>Interaction capability</w:t>
             </w:r>
           </w:p>
         </w:tc>
         <w:tc>
           <w:tcPr>
-            <w:tcW w:w="792" w:type="pct"/>
+            <w:tcW w:w="852" w:type="pct"/>
           </w:tcPr>
           <w:p>
             <w:pPr>
@@ -4136,7 +4168,7 @@
         </w:tc>
         <w:tc>
           <w:tcPr>
-            <w:tcW w:w="3607" w:type="pct"/>
+            <w:tcW w:w="3452" w:type="pct"/>
           </w:tcPr>
           <w:p>
             <w:pPr>
@@ -4156,11 +4188,12 @@
         </w:trPr>
         <w:tc>
           <w:tcPr>
-            <w:tcW w:w="601" w:type="pct"/>
-          </w:tcPr>
-          <w:p>
-            <w:pPr>
-              <w:pStyle w:val="Compact"/>
+            <w:tcW w:w="697" w:type="pct"/>
+          </w:tcPr>
+          <w:p>
+            <w:pPr>
+              <w:pStyle w:val="Compact"/>
+              <w:keepNext/>
               <w:spacing w:before="40" w:after="40"/>
               <w:jc w:val="left"/>
             </w:pPr>
@@ -4171,11 +4204,12 @@
         </w:tc>
         <w:tc>
           <w:tcPr>
-            <w:tcW w:w="792" w:type="pct"/>
-          </w:tcPr>
-          <w:p>
-            <w:pPr>
-              <w:pStyle w:val="Compact"/>
+            <w:tcW w:w="852" w:type="pct"/>
+          </w:tcPr>
+          <w:p>
+            <w:pPr>
+              <w:pStyle w:val="Compact"/>
+              <w:keepNext/>
               <w:spacing w:before="40" w:after="40"/>
               <w:jc w:val="left"/>
             </w:pPr>
@@ -4186,11 +4220,12 @@
         </w:tc>
         <w:tc>
           <w:tcPr>
-            <w:tcW w:w="3607" w:type="pct"/>
-          </w:tcPr>
-          <w:p>
-            <w:pPr>
-              <w:pStyle w:val="Compact"/>
+            <w:tcW w:w="3452" w:type="pct"/>
+          </w:tcPr>
+          <w:p>
+            <w:pPr>
+              <w:pStyle w:val="Compact"/>
+              <w:keepNext/>
               <w:spacing w:before="40" w:after="40"/>
               <w:jc w:val="left"/>
             </w:pPr>
@@ -4203,12 +4238,30 @@
     </w:tbl>
     <w:p>
       <w:pPr>
-        <w:pStyle w:val="Heading2"/>
+        <w:pStyle w:val="BodyText"/>
+        <w:spacing w:before="120"/>
+        <w:jc w:val="center"/>
+        <w:rPr>
+          <w:i/>
+          <w:color w:val="000000"/>
+        </w:rPr>
       </w:pPr>
       <w:bookmarkStart w:id="52" w:name="applying-the-qa-process-within-kanban"/>
       <w:bookmarkStart w:id="53" w:name="_Toc244220723"/>
-      <w:bookmarkStart w:id="54" w:name="_Toc244221191"/>
       <w:bookmarkEnd w:id="49"/>
+      <w:r>
+        <w:rPr>
+          <w:i/>
+          <w:color w:val="000000"/>
+        </w:rPr>
+        <w:t>Table 3.1. How each gap is closed.</w:t>
+      </w:r>
+    </w:p>
+    <w:p>
+      <w:pPr>
+        <w:pStyle w:val="Heading2"/>
+      </w:pPr>
+      <w:bookmarkStart w:id="54" w:name="_Toc244221411"/>
       <w:r>
         <w:t>Applying the QA Process within Kanban</w:t>
       </w:r>
@@ -4281,19 +4334,6 @@
       </w:pPr>
       <w:r>
         <w:t>Table 3.2 shows the resulting QA plan, it explains the checks that are added to each Kanban column's exit policy, which cards they apply to, and who is responsible for what.</w:t>
-      </w:r>
-    </w:p>
-    <w:p>
-      <w:pPr>
-        <w:pStyle w:val="BodyText"/>
-        <w:keepNext/>
-      </w:pPr>
-      <w:r>
-        <w:rPr>
-          <w:i/>
-          <w:iCs/>
-        </w:rPr>
-        <w:t>Table 3.2. QA checks added to each Kanban column.</w:t>
       </w:r>
     </w:p>
     <w:tbl>
@@ -4324,7 +4364,7 @@
         </w:trPr>
         <w:tc>
           <w:tcPr>
-            <w:tcW w:w="1019" w:type="pct"/>
+            <w:tcW w:w="1200" w:type="pct"/>
             <w:tcBorders>
               <w:bottom w:val="none" w:sz="0" w:space="0" w:color="auto"/>
             </w:tcBorders>
@@ -4348,7 +4388,7 @@
         </w:tc>
         <w:tc>
           <w:tcPr>
-            <w:tcW w:w="2370" w:type="pct"/>
+            <w:tcW w:w="2223" w:type="pct"/>
             <w:tcBorders>
               <w:bottom w:val="none" w:sz="0" w:space="0" w:color="auto"/>
             </w:tcBorders>
@@ -4372,7 +4412,7 @@
         </w:tc>
         <w:tc>
           <w:tcPr>
-            <w:tcW w:w="924" w:type="pct"/>
+            <w:tcW w:w="777" w:type="pct"/>
             <w:tcBorders>
               <w:bottom w:val="none" w:sz="0" w:space="0" w:color="auto"/>
             </w:tcBorders>
@@ -4396,7 +4436,7 @@
         </w:tc>
         <w:tc>
           <w:tcPr>
-            <w:tcW w:w="687" w:type="pct"/>
+            <w:tcW w:w="800" w:type="pct"/>
             <w:tcBorders>
               <w:bottom w:val="none" w:sz="0" w:space="0" w:color="auto"/>
             </w:tcBorders>
@@ -4425,7 +4465,7 @@
         </w:trPr>
         <w:tc>
           <w:tcPr>
-            <w:tcW w:w="1019" w:type="pct"/>
+            <w:tcW w:w="1200" w:type="pct"/>
           </w:tcPr>
           <w:p>
             <w:pPr>
@@ -4440,7 +4480,7 @@
         </w:tc>
         <w:tc>
           <w:tcPr>
-            <w:tcW w:w="2370" w:type="pct"/>
+            <w:tcW w:w="2223" w:type="pct"/>
           </w:tcPr>
           <w:p>
             <w:pPr>
@@ -4455,7 +4495,7 @@
         </w:tc>
         <w:tc>
           <w:tcPr>
-            <w:tcW w:w="924" w:type="pct"/>
+            <w:tcW w:w="777" w:type="pct"/>
           </w:tcPr>
           <w:p>
             <w:pPr>
@@ -4470,7 +4510,7 @@
         </w:tc>
         <w:tc>
           <w:tcPr>
-            <w:tcW w:w="687" w:type="pct"/>
+            <w:tcW w:w="800" w:type="pct"/>
           </w:tcPr>
           <w:p>
             <w:pPr>
@@ -4490,7 +4530,7 @@
         </w:trPr>
         <w:tc>
           <w:tcPr>
-            <w:tcW w:w="1019" w:type="pct"/>
+            <w:tcW w:w="1200" w:type="pct"/>
           </w:tcPr>
           <w:p>
             <w:pPr>
@@ -4505,7 +4545,7 @@
         </w:tc>
         <w:tc>
           <w:tcPr>
-            <w:tcW w:w="2370" w:type="pct"/>
+            <w:tcW w:w="2223" w:type="pct"/>
           </w:tcPr>
           <w:p>
             <w:pPr>
@@ -4520,7 +4560,7 @@
         </w:tc>
         <w:tc>
           <w:tcPr>
-            <w:tcW w:w="924" w:type="pct"/>
+            <w:tcW w:w="777" w:type="pct"/>
           </w:tcPr>
           <w:p>
             <w:pPr>
@@ -4535,7 +4575,7 @@
         </w:tc>
         <w:tc>
           <w:tcPr>
-            <w:tcW w:w="687" w:type="pct"/>
+            <w:tcW w:w="800" w:type="pct"/>
           </w:tcPr>
           <w:p>
             <w:pPr>
@@ -4555,7 +4595,7 @@
         </w:trPr>
         <w:tc>
           <w:tcPr>
-            <w:tcW w:w="1019" w:type="pct"/>
+            <w:tcW w:w="1200" w:type="pct"/>
           </w:tcPr>
           <w:p>
             <w:pPr>
@@ -4571,7 +4611,7 @@
         </w:tc>
         <w:tc>
           <w:tcPr>
-            <w:tcW w:w="2370" w:type="pct"/>
+            <w:tcW w:w="2223" w:type="pct"/>
           </w:tcPr>
           <w:p>
             <w:pPr>
@@ -4586,7 +4626,7 @@
         </w:tc>
         <w:tc>
           <w:tcPr>
-            <w:tcW w:w="924" w:type="pct"/>
+            <w:tcW w:w="777" w:type="pct"/>
           </w:tcPr>
           <w:p>
             <w:pPr>
@@ -4601,7 +4641,7 @@
         </w:tc>
         <w:tc>
           <w:tcPr>
-            <w:tcW w:w="687" w:type="pct"/>
+            <w:tcW w:w="800" w:type="pct"/>
           </w:tcPr>
           <w:p>
             <w:pPr>
@@ -4621,7 +4661,7 @@
         </w:trPr>
         <w:tc>
           <w:tcPr>
-            <w:tcW w:w="1019" w:type="pct"/>
+            <w:tcW w:w="1200" w:type="pct"/>
           </w:tcPr>
           <w:p>
             <w:pPr>
@@ -4636,7 +4676,7 @@
         </w:tc>
         <w:tc>
           <w:tcPr>
-            <w:tcW w:w="2370" w:type="pct"/>
+            <w:tcW w:w="2223" w:type="pct"/>
           </w:tcPr>
           <w:p>
             <w:pPr>
@@ -4651,7 +4691,7 @@
         </w:tc>
         <w:tc>
           <w:tcPr>
-            <w:tcW w:w="924" w:type="pct"/>
+            <w:tcW w:w="777" w:type="pct"/>
           </w:tcPr>
           <w:p>
             <w:pPr>
@@ -4666,7 +4706,7 @@
         </w:tc>
         <w:tc>
           <w:tcPr>
-            <w:tcW w:w="687" w:type="pct"/>
+            <w:tcW w:w="800" w:type="pct"/>
           </w:tcPr>
           <w:p>
             <w:pPr>
@@ -4686,7 +4726,7 @@
         </w:trPr>
         <w:tc>
           <w:tcPr>
-            <w:tcW w:w="1019" w:type="pct"/>
+            <w:tcW w:w="1200" w:type="pct"/>
           </w:tcPr>
           <w:p>
             <w:pPr>
@@ -4701,7 +4741,7 @@
         </w:tc>
         <w:tc>
           <w:tcPr>
-            <w:tcW w:w="2370" w:type="pct"/>
+            <w:tcW w:w="2223" w:type="pct"/>
           </w:tcPr>
           <w:p>
             <w:pPr>
@@ -4716,7 +4756,7 @@
         </w:tc>
         <w:tc>
           <w:tcPr>
-            <w:tcW w:w="924" w:type="pct"/>
+            <w:tcW w:w="777" w:type="pct"/>
           </w:tcPr>
           <w:p>
             <w:pPr>
@@ -4731,7 +4771,7 @@
         </w:tc>
         <w:tc>
           <w:tcPr>
-            <w:tcW w:w="687" w:type="pct"/>
+            <w:tcW w:w="800" w:type="pct"/>
           </w:tcPr>
           <w:p>
             <w:pPr>
@@ -4751,11 +4791,12 @@
         </w:trPr>
         <w:tc>
           <w:tcPr>
-            <w:tcW w:w="1019" w:type="pct"/>
-          </w:tcPr>
-          <w:p>
-            <w:pPr>
-              <w:pStyle w:val="Compact"/>
+            <w:tcW w:w="1200" w:type="pct"/>
+          </w:tcPr>
+          <w:p>
+            <w:pPr>
+              <w:pStyle w:val="Compact"/>
+              <w:keepNext/>
               <w:spacing w:before="40" w:after="40"/>
               <w:jc w:val="left"/>
             </w:pPr>
@@ -4766,11 +4807,12 @@
         </w:tc>
         <w:tc>
           <w:tcPr>
-            <w:tcW w:w="2370" w:type="pct"/>
-          </w:tcPr>
-          <w:p>
-            <w:pPr>
-              <w:pStyle w:val="Compact"/>
+            <w:tcW w:w="2223" w:type="pct"/>
+          </w:tcPr>
+          <w:p>
+            <w:pPr>
+              <w:pStyle w:val="Compact"/>
+              <w:keepNext/>
               <w:spacing w:before="40" w:after="40"/>
               <w:jc w:val="left"/>
             </w:pPr>
@@ -4781,11 +4823,12 @@
         </w:tc>
         <w:tc>
           <w:tcPr>
-            <w:tcW w:w="924" w:type="pct"/>
-          </w:tcPr>
-          <w:p>
-            <w:pPr>
-              <w:pStyle w:val="Compact"/>
+            <w:tcW w:w="777" w:type="pct"/>
+          </w:tcPr>
+          <w:p>
+            <w:pPr>
+              <w:pStyle w:val="Compact"/>
+              <w:keepNext/>
               <w:spacing w:before="40" w:after="40"/>
               <w:jc w:val="left"/>
             </w:pPr>
@@ -4796,11 +4839,12 @@
         </w:tc>
         <w:tc>
           <w:tcPr>
-            <w:tcW w:w="687" w:type="pct"/>
-          </w:tcPr>
-          <w:p>
-            <w:pPr>
-              <w:pStyle w:val="Compact"/>
+            <w:tcW w:w="800" w:type="pct"/>
+          </w:tcPr>
+          <w:p>
+            <w:pPr>
+              <w:pStyle w:val="Compact"/>
+              <w:keepNext/>
               <w:spacing w:before="40" w:after="40"/>
               <w:jc w:val="left"/>
             </w:pPr>
@@ -4813,12 +4857,30 @@
     </w:tbl>
     <w:p>
       <w:pPr>
-        <w:pStyle w:val="Heading2"/>
+        <w:pStyle w:val="BodyText"/>
+        <w:spacing w:before="120"/>
+        <w:jc w:val="center"/>
+        <w:rPr>
+          <w:i/>
+          <w:color w:val="000000"/>
+        </w:rPr>
       </w:pPr>
       <w:bookmarkStart w:id="55" w:name="critical-evaluation-1"/>
       <w:bookmarkStart w:id="56" w:name="_Toc244220724"/>
-      <w:bookmarkStart w:id="57" w:name="_Toc244221192"/>
       <w:bookmarkEnd w:id="52"/>
+      <w:r>
+        <w:rPr>
+          <w:i/>
+          <w:color w:val="000000"/>
+        </w:rPr>
+        <w:t>Table 3.2. QA checks added to each Kanban column.</w:t>
+      </w:r>
+    </w:p>
+    <w:p>
+      <w:pPr>
+        <w:pStyle w:val="Heading2"/>
+      </w:pPr>
+      <w:bookmarkStart w:id="57" w:name="_Toc244221412"/>
       <w:r>
         <w:t>Critical Evaluation</w:t>
       </w:r>
@@ -4839,7 +4901,7 @@
       </w:pPr>
       <w:bookmarkStart w:id="58" w:name="integrating-ivv-with-kanban"/>
       <w:bookmarkStart w:id="59" w:name="_Toc244220725"/>
-      <w:bookmarkStart w:id="60" w:name="_Toc244221193"/>
+      <w:bookmarkStart w:id="60" w:name="_Toc244221413"/>
       <w:bookmarkEnd w:id="37"/>
       <w:bookmarkEnd w:id="55"/>
       <w:r>
@@ -4863,7 +4925,7 @@
       </w:pPr>
       <w:bookmarkStart w:id="61" w:name="X0aa91b5be94bdb8348825913a91d765f72af6ee"/>
       <w:bookmarkStart w:id="62" w:name="_Toc244220726"/>
-      <w:bookmarkStart w:id="63" w:name="_Toc244221194"/>
+      <w:bookmarkStart w:id="63" w:name="_Toc244221414"/>
       <w:r>
         <w:t>Current V&amp;V in Actual and Its Independence</w:t>
       </w:r>
@@ -4894,19 +4956,6 @@
       </w:r>
       <w:r>
         <w:t xml:space="preserve"> means independent but limited, because it is covered by automated tests, and nobody has to test the preview builds too.</w:t>
-      </w:r>
-    </w:p>
-    <w:p>
-      <w:pPr>
-        <w:pStyle w:val="BodyText"/>
-        <w:keepNext/>
-      </w:pPr>
-      <w:r>
-        <w:rPr>
-          <w:i/>
-          <w:iCs/>
-        </w:rPr>
-        <w:t>Table 4.1. Independence of Actual's existing V&amp;V activities.</w:t>
       </w:r>
     </w:p>
     <w:tbl>
@@ -4938,7 +4987,7 @@
         </w:trPr>
         <w:tc>
           <w:tcPr>
-            <w:tcW w:w="736" w:type="pct"/>
+            <w:tcW w:w="860" w:type="pct"/>
             <w:tcBorders>
               <w:bottom w:val="none" w:sz="0" w:space="0" w:color="auto"/>
             </w:tcBorders>
@@ -4962,7 +5011,7 @@
         </w:tc>
         <w:tc>
           <w:tcPr>
-            <w:tcW w:w="850" w:type="pct"/>
+            <w:tcW w:w="996" w:type="pct"/>
             <w:tcBorders>
               <w:bottom w:val="none" w:sz="0" w:space="0" w:color="auto"/>
             </w:tcBorders>
@@ -4986,7 +5035,7 @@
         </w:tc>
         <w:tc>
           <w:tcPr>
-            <w:tcW w:w="687" w:type="pct"/>
+            <w:tcW w:w="800" w:type="pct"/>
             <w:tcBorders>
               <w:bottom w:val="none" w:sz="0" w:space="0" w:color="auto"/>
             </w:tcBorders>
@@ -5010,7 +5059,7 @@
         </w:tc>
         <w:tc>
           <w:tcPr>
-            <w:tcW w:w="2085" w:type="pct"/>
+            <w:tcW w:w="1744" w:type="pct"/>
             <w:tcBorders>
               <w:bottom w:val="none" w:sz="0" w:space="0" w:color="auto"/>
             </w:tcBorders>
@@ -5034,7 +5083,7 @@
         </w:tc>
         <w:tc>
           <w:tcPr>
-            <w:tcW w:w="642" w:type="pct"/>
+            <w:tcW w:w="601" w:type="pct"/>
             <w:tcBorders>
               <w:bottom w:val="none" w:sz="0" w:space="0" w:color="auto"/>
             </w:tcBorders>
@@ -5063,7 +5112,7 @@
         </w:trPr>
         <w:tc>
           <w:tcPr>
-            <w:tcW w:w="736" w:type="pct"/>
+            <w:tcW w:w="860" w:type="pct"/>
           </w:tcPr>
           <w:p>
             <w:pPr>
@@ -5078,7 +5127,7 @@
         </w:tc>
         <w:tc>
           <w:tcPr>
-            <w:tcW w:w="850" w:type="pct"/>
+            <w:tcW w:w="996" w:type="pct"/>
           </w:tcPr>
           <w:p>
             <w:pPr>
@@ -5093,7 +5142,7 @@
         </w:tc>
         <w:tc>
           <w:tcPr>
-            <w:tcW w:w="687" w:type="pct"/>
+            <w:tcW w:w="800" w:type="pct"/>
           </w:tcPr>
           <w:p>
             <w:pPr>
@@ -5108,7 +5157,7 @@
         </w:tc>
         <w:tc>
           <w:tcPr>
-            <w:tcW w:w="2085" w:type="pct"/>
+            <w:tcW w:w="1744" w:type="pct"/>
           </w:tcPr>
           <w:p>
             <w:pPr>
@@ -5123,7 +5172,7 @@
         </w:tc>
         <w:tc>
           <w:tcPr>
-            <w:tcW w:w="642" w:type="pct"/>
+            <w:tcW w:w="601" w:type="pct"/>
           </w:tcPr>
           <w:p>
             <w:pPr>
@@ -5143,7 +5192,7 @@
         </w:trPr>
         <w:tc>
           <w:tcPr>
-            <w:tcW w:w="736" w:type="pct"/>
+            <w:tcW w:w="860" w:type="pct"/>
           </w:tcPr>
           <w:p>
             <w:pPr>
@@ -5158,7 +5207,7 @@
         </w:tc>
         <w:tc>
           <w:tcPr>
-            <w:tcW w:w="850" w:type="pct"/>
+            <w:tcW w:w="996" w:type="pct"/>
           </w:tcPr>
           <w:p>
             <w:pPr>
@@ -5173,7 +5222,7 @@
         </w:tc>
         <w:tc>
           <w:tcPr>
-            <w:tcW w:w="687" w:type="pct"/>
+            <w:tcW w:w="800" w:type="pct"/>
           </w:tcPr>
           <w:p>
             <w:pPr>
@@ -5188,7 +5237,7 @@
         </w:tc>
         <w:tc>
           <w:tcPr>
-            <w:tcW w:w="2085" w:type="pct"/>
+            <w:tcW w:w="1744" w:type="pct"/>
           </w:tcPr>
           <w:p>
             <w:pPr>
@@ -5203,7 +5252,7 @@
         </w:tc>
         <w:tc>
           <w:tcPr>
-            <w:tcW w:w="642" w:type="pct"/>
+            <w:tcW w:w="601" w:type="pct"/>
           </w:tcPr>
           <w:p>
             <w:pPr>
@@ -5223,7 +5272,7 @@
         </w:trPr>
         <w:tc>
           <w:tcPr>
-            <w:tcW w:w="736" w:type="pct"/>
+            <w:tcW w:w="860" w:type="pct"/>
           </w:tcPr>
           <w:p>
             <w:pPr>
@@ -5238,7 +5287,7 @@
         </w:tc>
         <w:tc>
           <w:tcPr>
-            <w:tcW w:w="850" w:type="pct"/>
+            <w:tcW w:w="996" w:type="pct"/>
           </w:tcPr>
           <w:p>
             <w:pPr>
@@ -5253,7 +5302,7 @@
         </w:tc>
         <w:tc>
           <w:tcPr>
-            <w:tcW w:w="687" w:type="pct"/>
+            <w:tcW w:w="800" w:type="pct"/>
           </w:tcPr>
           <w:p>
             <w:pPr>
@@ -5268,7 +5317,7 @@
         </w:tc>
         <w:tc>
           <w:tcPr>
-            <w:tcW w:w="2085" w:type="pct"/>
+            <w:tcW w:w="1744" w:type="pct"/>
           </w:tcPr>
           <w:p>
             <w:pPr>
@@ -5283,7 +5332,7 @@
         </w:tc>
         <w:tc>
           <w:tcPr>
-            <w:tcW w:w="642" w:type="pct"/>
+            <w:tcW w:w="601" w:type="pct"/>
           </w:tcPr>
           <w:p>
             <w:pPr>
@@ -5303,7 +5352,7 @@
         </w:trPr>
         <w:tc>
           <w:tcPr>
-            <w:tcW w:w="736" w:type="pct"/>
+            <w:tcW w:w="860" w:type="pct"/>
           </w:tcPr>
           <w:p>
             <w:pPr>
@@ -5318,7 +5367,7 @@
         </w:tc>
         <w:tc>
           <w:tcPr>
-            <w:tcW w:w="850" w:type="pct"/>
+            <w:tcW w:w="996" w:type="pct"/>
           </w:tcPr>
           <w:p>
             <w:pPr>
@@ -5333,7 +5382,7 @@
         </w:tc>
         <w:tc>
           <w:tcPr>
-            <w:tcW w:w="687" w:type="pct"/>
+            <w:tcW w:w="800" w:type="pct"/>
           </w:tcPr>
           <w:p>
             <w:pPr>
@@ -5348,7 +5397,7 @@
         </w:tc>
         <w:tc>
           <w:tcPr>
-            <w:tcW w:w="2085" w:type="pct"/>
+            <w:tcW w:w="1744" w:type="pct"/>
           </w:tcPr>
           <w:p>
             <w:pPr>
@@ -5363,7 +5412,7 @@
         </w:tc>
         <w:tc>
           <w:tcPr>
-            <w:tcW w:w="642" w:type="pct"/>
+            <w:tcW w:w="601" w:type="pct"/>
           </w:tcPr>
           <w:p>
             <w:pPr>
@@ -5383,7 +5432,7 @@
         </w:trPr>
         <w:tc>
           <w:tcPr>
-            <w:tcW w:w="736" w:type="pct"/>
+            <w:tcW w:w="860" w:type="pct"/>
           </w:tcPr>
           <w:p>
             <w:pPr>
@@ -5398,7 +5447,7 @@
         </w:tc>
         <w:tc>
           <w:tcPr>
-            <w:tcW w:w="850" w:type="pct"/>
+            <w:tcW w:w="996" w:type="pct"/>
           </w:tcPr>
           <w:p>
             <w:pPr>
@@ -5413,7 +5462,7 @@
         </w:tc>
         <w:tc>
           <w:tcPr>
-            <w:tcW w:w="687" w:type="pct"/>
+            <w:tcW w:w="800" w:type="pct"/>
           </w:tcPr>
           <w:p>
             <w:pPr>
@@ -5428,7 +5477,7 @@
         </w:tc>
         <w:tc>
           <w:tcPr>
-            <w:tcW w:w="2085" w:type="pct"/>
+            <w:tcW w:w="1744" w:type="pct"/>
           </w:tcPr>
           <w:p>
             <w:pPr>
@@ -5443,7 +5492,7 @@
         </w:tc>
         <w:tc>
           <w:tcPr>
-            <w:tcW w:w="642" w:type="pct"/>
+            <w:tcW w:w="601" w:type="pct"/>
           </w:tcPr>
           <w:p>
             <w:pPr>
@@ -5463,7 +5512,7 @@
         </w:trPr>
         <w:tc>
           <w:tcPr>
-            <w:tcW w:w="736" w:type="pct"/>
+            <w:tcW w:w="860" w:type="pct"/>
           </w:tcPr>
           <w:p>
             <w:pPr>
@@ -5478,7 +5527,7 @@
         </w:tc>
         <w:tc>
           <w:tcPr>
-            <w:tcW w:w="850" w:type="pct"/>
+            <w:tcW w:w="996" w:type="pct"/>
           </w:tcPr>
           <w:p>
             <w:pPr>
@@ -5493,7 +5542,7 @@
         </w:tc>
         <w:tc>
           <w:tcPr>
-            <w:tcW w:w="687" w:type="pct"/>
+            <w:tcW w:w="800" w:type="pct"/>
           </w:tcPr>
           <w:p>
             <w:pPr>
@@ -5508,7 +5557,7 @@
         </w:tc>
         <w:tc>
           <w:tcPr>
-            <w:tcW w:w="2085" w:type="pct"/>
+            <w:tcW w:w="1744" w:type="pct"/>
           </w:tcPr>
           <w:p>
             <w:pPr>
@@ -5523,7 +5572,7 @@
         </w:tc>
         <w:tc>
           <w:tcPr>
-            <w:tcW w:w="642" w:type="pct"/>
+            <w:tcW w:w="601" w:type="pct"/>
           </w:tcPr>
           <w:p>
             <w:pPr>
@@ -5543,11 +5592,12 @@
         </w:trPr>
         <w:tc>
           <w:tcPr>
-            <w:tcW w:w="736" w:type="pct"/>
-          </w:tcPr>
-          <w:p>
-            <w:pPr>
-              <w:pStyle w:val="Compact"/>
+            <w:tcW w:w="860" w:type="pct"/>
+          </w:tcPr>
+          <w:p>
+            <w:pPr>
+              <w:pStyle w:val="Compact"/>
+              <w:keepNext/>
               <w:spacing w:before="40" w:after="40"/>
               <w:jc w:val="left"/>
             </w:pPr>
@@ -5558,11 +5608,12 @@
         </w:tc>
         <w:tc>
           <w:tcPr>
-            <w:tcW w:w="850" w:type="pct"/>
-          </w:tcPr>
-          <w:p>
-            <w:pPr>
-              <w:pStyle w:val="Compact"/>
+            <w:tcW w:w="996" w:type="pct"/>
+          </w:tcPr>
+          <w:p>
+            <w:pPr>
+              <w:pStyle w:val="Compact"/>
+              <w:keepNext/>
               <w:spacing w:before="40" w:after="40"/>
               <w:jc w:val="left"/>
             </w:pPr>
@@ -5573,11 +5624,12 @@
         </w:tc>
         <w:tc>
           <w:tcPr>
-            <w:tcW w:w="687" w:type="pct"/>
-          </w:tcPr>
-          <w:p>
-            <w:pPr>
-              <w:pStyle w:val="Compact"/>
+            <w:tcW w:w="800" w:type="pct"/>
+          </w:tcPr>
+          <w:p>
+            <w:pPr>
+              <w:pStyle w:val="Compact"/>
+              <w:keepNext/>
               <w:spacing w:before="40" w:after="40"/>
               <w:jc w:val="left"/>
             </w:pPr>
@@ -5588,11 +5640,12 @@
         </w:tc>
         <w:tc>
           <w:tcPr>
-            <w:tcW w:w="2085" w:type="pct"/>
-          </w:tcPr>
-          <w:p>
-            <w:pPr>
-              <w:pStyle w:val="Compact"/>
+            <w:tcW w:w="1744" w:type="pct"/>
+          </w:tcPr>
+          <w:p>
+            <w:pPr>
+              <w:pStyle w:val="Compact"/>
+              <w:keepNext/>
               <w:spacing w:before="40" w:after="40"/>
               <w:jc w:val="left"/>
             </w:pPr>
@@ -5603,11 +5656,12 @@
         </w:tc>
         <w:tc>
           <w:tcPr>
-            <w:tcW w:w="642" w:type="pct"/>
-          </w:tcPr>
-          <w:p>
-            <w:pPr>
-              <w:pStyle w:val="Compact"/>
+            <w:tcW w:w="601" w:type="pct"/>
+          </w:tcPr>
+          <w:p>
+            <w:pPr>
+              <w:pStyle w:val="Compact"/>
+              <w:keepNext/>
               <w:spacing w:before="40" w:after="40"/>
               <w:jc w:val="left"/>
             </w:pPr>
@@ -5621,11 +5675,32 @@
     <w:p>
       <w:pPr>
         <w:pStyle w:val="BodyText"/>
+        <w:spacing w:before="120"/>
+        <w:jc w:val="center"/>
+        <w:rPr>
+          <w:i/>
+          <w:color w:val="000000"/>
+        </w:rPr>
+      </w:pPr>
+      <w:r>
+        <w:rPr>
+          <w:i/>
+          <w:color w:val="000000"/>
+        </w:rPr>
+        <w:t>Table 4.1. Independence of Actual's existing V&amp;V activities.</w:t>
+      </w:r>
+    </w:p>
+    <w:p>
+      <w:pPr>
+        <w:pStyle w:val="BodyText"/>
         <w:spacing w:before="240"/>
       </w:pPr>
       <w:r>
+        <w:t xml:space="preserve">Actual already has some independent checking, but it is ad hoc. Nobody other than the contributor checks requirements or design, and how closely a change is checked depends on </w:t>
+      </w:r>
+      <w:r>
         <w:lastRenderedPageBreak/>
-        <w:t>Actual already has some independent checking, but it is ad hoc. Nobody other than the contributor checks requirements or design, and how closely a change is checked depends on who happens to review it, whatever its risk is. Some of the checking also comes late after release, such as the three 2026 advisories in Section 3.3 which were found in released versions, by reporters outside the core team (Actual Budget, 2026b, 2026c, 2026d).</w:t>
+        <w:t>who happens to review it, whatever its risk is. Some of the checking also comes late after release, such as the three 2026 advisories in Section 3.3 which were found in released versions, by reporters outside the core team (Actual Budget, 2026b, 2026c, 2026d).</w:t>
       </w:r>
     </w:p>
     <w:p>
@@ -5634,7 +5709,7 @@
       </w:pPr>
       <w:bookmarkStart w:id="64" w:name="ivv-integration-model-for-kanban"/>
       <w:bookmarkStart w:id="65" w:name="_Toc244220727"/>
-      <w:bookmarkStart w:id="66" w:name="_Toc244221195"/>
+      <w:bookmarkStart w:id="66" w:name="_Toc244221415"/>
       <w:bookmarkEnd w:id="61"/>
       <w:r>
         <w:t>IV&amp;V Integration Model for Kanban</w:t>
@@ -5672,19 +5747,6 @@
       </w:pPr>
       <w:r>
         <w:t>Table 4.2 shows where each independent check sits on the Kanban board. A card cannot move on until the condition in the exit policy is met.</w:t>
-      </w:r>
-    </w:p>
-    <w:p>
-      <w:pPr>
-        <w:pStyle w:val="BodyText"/>
-        <w:keepNext/>
-      </w:pPr>
-      <w:r>
-        <w:rPr>
-          <w:i/>
-          <w:iCs/>
-        </w:rPr>
-        <w:t>Table 4.2. Independent checks on the Kanban board (High-tier cards unless stated).</w:t>
       </w:r>
     </w:p>
     <w:tbl>
@@ -5715,7 +5777,7 @@
         </w:trPr>
         <w:tc>
           <w:tcPr>
-            <w:tcW w:w="1019" w:type="pct"/>
+            <w:tcW w:w="1200" w:type="pct"/>
             <w:tcBorders>
               <w:bottom w:val="none" w:sz="0" w:space="0" w:color="auto"/>
             </w:tcBorders>
@@ -5739,7 +5801,7 @@
         </w:tc>
         <w:tc>
           <w:tcPr>
-            <w:tcW w:w="713" w:type="pct"/>
+            <w:tcW w:w="792" w:type="pct"/>
             <w:tcBorders>
               <w:bottom w:val="none" w:sz="0" w:space="0" w:color="auto"/>
             </w:tcBorders>
@@ -5763,7 +5825,7 @@
         </w:tc>
         <w:tc>
           <w:tcPr>
-            <w:tcW w:w="2356" w:type="pct"/>
+            <w:tcW w:w="2226" w:type="pct"/>
             <w:tcBorders>
               <w:bottom w:val="none" w:sz="0" w:space="0" w:color="auto"/>
             </w:tcBorders>
@@ -5787,7 +5849,7 @@
         </w:tc>
         <w:tc>
           <w:tcPr>
-            <w:tcW w:w="911" w:type="pct"/>
+            <w:tcW w:w="782" w:type="pct"/>
             <w:tcBorders>
               <w:bottom w:val="none" w:sz="0" w:space="0" w:color="auto"/>
             </w:tcBorders>
@@ -5816,7 +5878,7 @@
         </w:trPr>
         <w:tc>
           <w:tcPr>
-            <w:tcW w:w="1019" w:type="pct"/>
+            <w:tcW w:w="1200" w:type="pct"/>
           </w:tcPr>
           <w:p>
             <w:pPr>
@@ -5831,7 +5893,7 @@
         </w:tc>
         <w:tc>
           <w:tcPr>
-            <w:tcW w:w="713" w:type="pct"/>
+            <w:tcW w:w="792" w:type="pct"/>
           </w:tcPr>
           <w:p>
             <w:pPr>
@@ -5846,7 +5908,7 @@
         </w:tc>
         <w:tc>
           <w:tcPr>
-            <w:tcW w:w="2356" w:type="pct"/>
+            <w:tcW w:w="2226" w:type="pct"/>
           </w:tcPr>
           <w:p>
             <w:pPr>
@@ -5861,7 +5923,7 @@
         </w:tc>
         <w:tc>
           <w:tcPr>
-            <w:tcW w:w="911" w:type="pct"/>
+            <w:tcW w:w="782" w:type="pct"/>
           </w:tcPr>
           <w:p>
             <w:pPr>
@@ -5881,7 +5943,7 @@
         </w:trPr>
         <w:tc>
           <w:tcPr>
-            <w:tcW w:w="1019" w:type="pct"/>
+            <w:tcW w:w="1200" w:type="pct"/>
           </w:tcPr>
           <w:p>
             <w:pPr>
@@ -5896,7 +5958,7 @@
         </w:tc>
         <w:tc>
           <w:tcPr>
-            <w:tcW w:w="713" w:type="pct"/>
+            <w:tcW w:w="792" w:type="pct"/>
           </w:tcPr>
           <w:p>
             <w:pPr>
@@ -5911,7 +5973,7 @@
         </w:tc>
         <w:tc>
           <w:tcPr>
-            <w:tcW w:w="2356" w:type="pct"/>
+            <w:tcW w:w="2226" w:type="pct"/>
           </w:tcPr>
           <w:p>
             <w:pPr>
@@ -5926,7 +5988,7 @@
         </w:tc>
         <w:tc>
           <w:tcPr>
-            <w:tcW w:w="911" w:type="pct"/>
+            <w:tcW w:w="782" w:type="pct"/>
           </w:tcPr>
           <w:p>
             <w:pPr>
@@ -5946,7 +6008,7 @@
         </w:trPr>
         <w:tc>
           <w:tcPr>
-            <w:tcW w:w="1019" w:type="pct"/>
+            <w:tcW w:w="1200" w:type="pct"/>
           </w:tcPr>
           <w:p>
             <w:pPr>
@@ -5961,7 +6023,7 @@
         </w:tc>
         <w:tc>
           <w:tcPr>
-            <w:tcW w:w="713" w:type="pct"/>
+            <w:tcW w:w="792" w:type="pct"/>
           </w:tcPr>
           <w:p>
             <w:pPr>
@@ -5976,7 +6038,7 @@
         </w:tc>
         <w:tc>
           <w:tcPr>
-            <w:tcW w:w="2356" w:type="pct"/>
+            <w:tcW w:w="2226" w:type="pct"/>
           </w:tcPr>
           <w:p>
             <w:pPr>
@@ -5991,7 +6053,7 @@
         </w:tc>
         <w:tc>
           <w:tcPr>
-            <w:tcW w:w="911" w:type="pct"/>
+            <w:tcW w:w="782" w:type="pct"/>
           </w:tcPr>
           <w:p>
             <w:pPr>
@@ -6011,7 +6073,7 @@
         </w:trPr>
         <w:tc>
           <w:tcPr>
-            <w:tcW w:w="1019" w:type="pct"/>
+            <w:tcW w:w="1200" w:type="pct"/>
           </w:tcPr>
           <w:p>
             <w:pPr>
@@ -6027,7 +6089,7 @@
         </w:tc>
         <w:tc>
           <w:tcPr>
-            <w:tcW w:w="713" w:type="pct"/>
+            <w:tcW w:w="792" w:type="pct"/>
           </w:tcPr>
           <w:p>
             <w:pPr>
@@ -6042,7 +6104,7 @@
         </w:tc>
         <w:tc>
           <w:tcPr>
-            <w:tcW w:w="2356" w:type="pct"/>
+            <w:tcW w:w="2226" w:type="pct"/>
           </w:tcPr>
           <w:p>
             <w:pPr>
@@ -6057,7 +6119,7 @@
         </w:tc>
         <w:tc>
           <w:tcPr>
-            <w:tcW w:w="911" w:type="pct"/>
+            <w:tcW w:w="782" w:type="pct"/>
           </w:tcPr>
           <w:p>
             <w:pPr>
@@ -6077,7 +6139,7 @@
         </w:trPr>
         <w:tc>
           <w:tcPr>
-            <w:tcW w:w="1019" w:type="pct"/>
+            <w:tcW w:w="1200" w:type="pct"/>
           </w:tcPr>
           <w:p>
             <w:pPr>
@@ -6092,7 +6154,7 @@
         </w:tc>
         <w:tc>
           <w:tcPr>
-            <w:tcW w:w="713" w:type="pct"/>
+            <w:tcW w:w="792" w:type="pct"/>
           </w:tcPr>
           <w:p>
             <w:pPr>
@@ -6107,7 +6169,7 @@
         </w:tc>
         <w:tc>
           <w:tcPr>
-            <w:tcW w:w="2356" w:type="pct"/>
+            <w:tcW w:w="2226" w:type="pct"/>
           </w:tcPr>
           <w:p>
             <w:pPr>
@@ -6122,7 +6184,7 @@
         </w:tc>
         <w:tc>
           <w:tcPr>
-            <w:tcW w:w="911" w:type="pct"/>
+            <w:tcW w:w="782" w:type="pct"/>
           </w:tcPr>
           <w:p>
             <w:pPr>
@@ -6142,11 +6204,12 @@
         </w:trPr>
         <w:tc>
           <w:tcPr>
-            <w:tcW w:w="1019" w:type="pct"/>
-          </w:tcPr>
-          <w:p>
-            <w:pPr>
-              <w:pStyle w:val="Compact"/>
+            <w:tcW w:w="1200" w:type="pct"/>
+          </w:tcPr>
+          <w:p>
+            <w:pPr>
+              <w:pStyle w:val="Compact"/>
+              <w:keepNext/>
               <w:spacing w:before="40" w:after="40"/>
               <w:jc w:val="left"/>
             </w:pPr>
@@ -6157,11 +6220,12 @@
         </w:tc>
         <w:tc>
           <w:tcPr>
-            <w:tcW w:w="713" w:type="pct"/>
-          </w:tcPr>
-          <w:p>
-            <w:pPr>
-              <w:pStyle w:val="Compact"/>
+            <w:tcW w:w="792" w:type="pct"/>
+          </w:tcPr>
+          <w:p>
+            <w:pPr>
+              <w:pStyle w:val="Compact"/>
+              <w:keepNext/>
               <w:spacing w:before="40" w:after="40"/>
               <w:jc w:val="left"/>
             </w:pPr>
@@ -6172,11 +6236,12 @@
         </w:tc>
         <w:tc>
           <w:tcPr>
-            <w:tcW w:w="2356" w:type="pct"/>
-          </w:tcPr>
-          <w:p>
-            <w:pPr>
-              <w:pStyle w:val="Compact"/>
+            <w:tcW w:w="2226" w:type="pct"/>
+          </w:tcPr>
+          <w:p>
+            <w:pPr>
+              <w:pStyle w:val="Compact"/>
+              <w:keepNext/>
               <w:spacing w:before="40" w:after="40"/>
               <w:jc w:val="left"/>
             </w:pPr>
@@ -6187,11 +6252,12 @@
         </w:tc>
         <w:tc>
           <w:tcPr>
-            <w:tcW w:w="911" w:type="pct"/>
-          </w:tcPr>
-          <w:p>
-            <w:pPr>
-              <w:pStyle w:val="Compact"/>
+            <w:tcW w:w="782" w:type="pct"/>
+          </w:tcPr>
+          <w:p>
+            <w:pPr>
+              <w:pStyle w:val="Compact"/>
+              <w:keepNext/>
               <w:spacing w:before="40" w:after="40"/>
               <w:jc w:val="left"/>
             </w:pPr>
@@ -6205,6 +6271,24 @@
     <w:p>
       <w:pPr>
         <w:pStyle w:val="BodyText"/>
+        <w:spacing w:before="120"/>
+        <w:jc w:val="center"/>
+        <w:rPr>
+          <w:i/>
+          <w:color w:val="000000"/>
+        </w:rPr>
+      </w:pPr>
+      <w:r>
+        <w:rPr>
+          <w:i/>
+          <w:color w:val="000000"/>
+        </w:rPr>
+        <w:t>Table 4.2. Independent checks on the Kanban board (High-tier cards unless stated).</w:t>
+      </w:r>
+    </w:p>
+    <w:p>
+      <w:pPr>
+        <w:pStyle w:val="BodyText"/>
         <w:spacing w:before="240"/>
       </w:pPr>
       <w:r>
@@ -6217,7 +6301,7 @@
       </w:pPr>
       <w:bookmarkStart w:id="67" w:name="X1475a41517db6ec60255518d1ac8cff0c25dd20"/>
       <w:bookmarkStart w:id="68" w:name="_Toc244220728"/>
-      <w:bookmarkStart w:id="69" w:name="_Toc244221196"/>
+      <w:bookmarkStart w:id="69" w:name="_Toc244221416"/>
       <w:bookmarkEnd w:id="64"/>
       <w:r>
         <w:t>How the Integration Meets the Three Goals</w:t>
@@ -6246,11 +6330,11 @@
         <w:pStyle w:val="BodyText"/>
       </w:pPr>
       <w:r>
-        <w:t xml:space="preserve">Requirements compliance means showing that what users asked for was built and tested. In Actual, a feature request starts as an issue, the PR template asks the contributor to link that issue, and a release note describes what shipped (Actual Budget, 2026a). However, no step </w:t>
+        <w:t xml:space="preserve">Requirements compliance means showing that what users asked for was built and tested. In Actual, a feature request starts as an issue, the PR template asks the contributor to link that </w:t>
       </w:r>
       <w:r>
         <w:lastRenderedPageBreak/>
-        <w:t>checks that the finished PR actually does what the issue asked for. Under the proposed model, someone other than the requester makes sure that at triage, each acceptance criterion can be tested, and the reviewer only approves at Verify once every criterion has a passing test.</w:t>
+        <w:t>issue, and a release note describes what shipped (Actual Budget, 2026a). However, no step checks that the finished PR actually does what the issue asked for. Under the proposed model, someone other than the requester makes sure that at triage, each acceptance criterion can be tested, and the reviewer only approves at Verify once every criterion has a passing test.</w:t>
       </w:r>
     </w:p>
     <w:p>
@@ -6271,7 +6355,7 @@
       </w:pPr>
       <w:bookmarkStart w:id="70" w:name="references"/>
       <w:bookmarkStart w:id="71" w:name="_Toc244220729"/>
-      <w:bookmarkStart w:id="72" w:name="_Toc244221197"/>
+      <w:bookmarkStart w:id="72" w:name="_Toc244221417"/>
       <w:bookmarkEnd w:id="58"/>
       <w:bookmarkEnd w:id="67"/>
       <w:r>
@@ -6943,7 +7027,7 @@
       </w:pPr>
       <w:bookmarkStart w:id="73" w:name="appendix-a-methodology-selection"/>
       <w:bookmarkStart w:id="74" w:name="_Toc244220730"/>
-      <w:bookmarkStart w:id="75" w:name="_Toc244221198"/>
+      <w:bookmarkStart w:id="75" w:name="_Toc244221418"/>
       <w:bookmarkEnd w:id="70"/>
       <w:r>
         <w:lastRenderedPageBreak/>
@@ -6974,7 +7058,7 @@
       </w:pPr>
       <w:bookmarkStart w:id="76" w:name="X028abdb72f6729402371f99d307e7d170450399"/>
       <w:bookmarkStart w:id="77" w:name="_Toc244220731"/>
-      <w:bookmarkStart w:id="78" w:name="_Toc244221199"/>
+      <w:bookmarkStart w:id="78" w:name="_Toc244221419"/>
       <w:r>
         <w:t>A.1 Project Characteristics and Requirements</w:t>
       </w:r>
@@ -6987,19 +7071,6 @@
       </w:pPr>
       <w:r>
         <w:t>Actual's situation is first described against the eight factors commonly considered when selecting a software process model (GeeksforGeeks, 2025). Each factor points either to an iterative, agile model, suited to changing requirements and close customer involvement, or to a linear model such as Waterfall, suited to stable requirements, fixed deadlines and predictability. Table A.1 applies the factors to Actual; the last column shows which kind of model each points to.</w:t>
-      </w:r>
-    </w:p>
-    <w:p>
-      <w:pPr>
-        <w:pStyle w:val="BodyText"/>
-        <w:keepNext/>
-      </w:pPr>
-      <w:r>
-        <w:rPr>
-          <w:i/>
-          <w:iCs/>
-        </w:rPr>
-        <w:t>Table A.1. Actual against the selection factors.</w:t>
       </w:r>
     </w:p>
     <w:tbl>
@@ -7461,6 +7532,7 @@
           <w:p>
             <w:pPr>
               <w:pStyle w:val="Compact"/>
+              <w:keepNext/>
               <w:spacing w:before="40" w:after="40"/>
               <w:jc w:val="left"/>
             </w:pPr>
@@ -7476,6 +7548,7 @@
           <w:p>
             <w:pPr>
               <w:pStyle w:val="Compact"/>
+              <w:keepNext/>
               <w:spacing w:before="40" w:after="40"/>
               <w:jc w:val="left"/>
             </w:pPr>
@@ -7491,6 +7564,7 @@
           <w:p>
             <w:pPr>
               <w:pStyle w:val="Compact"/>
+              <w:keepNext/>
               <w:spacing w:before="40" w:after="40"/>
               <w:jc w:val="left"/>
             </w:pPr>
@@ -7504,6 +7578,24 @@
     <w:p>
       <w:pPr>
         <w:pStyle w:val="BodyText"/>
+        <w:spacing w:before="120"/>
+        <w:jc w:val="center"/>
+        <w:rPr>
+          <w:i/>
+          <w:color w:val="000000"/>
+        </w:rPr>
+      </w:pPr>
+      <w:r>
+        <w:rPr>
+          <w:i/>
+          <w:color w:val="000000"/>
+        </w:rPr>
+        <w:t>Table A.1. Actual against the selection factors.</w:t>
+      </w:r>
+    </w:p>
+    <w:p>
+      <w:pPr>
+        <w:pStyle w:val="BodyText"/>
         <w:spacing w:before="240"/>
       </w:pPr>
       <w:r>
@@ -7520,19 +7612,6 @@
       <w:r>
         <w:lastRenderedPageBreak/>
         <w:t>requirements, each with the reason Actual needs it and the part of the brief it answers. Section A.3 tests every candidate against them.</w:t>
-      </w:r>
-    </w:p>
-    <w:p>
-      <w:pPr>
-        <w:pStyle w:val="BodyText"/>
-        <w:keepNext/>
-      </w:pPr>
-      <w:r>
-        <w:rPr>
-          <w:i/>
-          <w:iCs/>
-        </w:rPr>
-        <w:t>Table A.2. Requirements for Actual's methodology.</w:t>
       </w:r>
     </w:p>
     <w:tbl>
@@ -7844,6 +7923,7 @@
           <w:p>
             <w:pPr>
               <w:pStyle w:val="Compact"/>
+              <w:keepNext/>
               <w:spacing w:before="40" w:after="40"/>
               <w:jc w:val="left"/>
             </w:pPr>
@@ -7859,6 +7939,7 @@
           <w:p>
             <w:pPr>
               <w:pStyle w:val="Compact"/>
+              <w:keepNext/>
               <w:spacing w:before="40" w:after="40"/>
               <w:jc w:val="left"/>
             </w:pPr>
@@ -7874,6 +7955,7 @@
           <w:p>
             <w:pPr>
               <w:pStyle w:val="Compact"/>
+              <w:keepNext/>
               <w:spacing w:before="40" w:after="40"/>
               <w:jc w:val="left"/>
             </w:pPr>
@@ -7884,6 +7966,27 @@
         </w:tc>
       </w:tr>
     </w:tbl>
+    <w:p>
+      <w:pPr>
+        <w:pStyle w:val="BodyText"/>
+        <w:spacing w:before="120"/>
+        <w:jc w:val="center"/>
+        <w:rPr>
+          <w:i/>
+          <w:color w:val="000000"/>
+        </w:rPr>
+      </w:pPr>
+      <w:bookmarkStart w:id="79" w:name="a.2-candidate-methodologies"/>
+      <w:bookmarkStart w:id="80" w:name="_Toc244220732"/>
+      <w:bookmarkEnd w:id="76"/>
+      <w:r>
+        <w:rPr>
+          <w:i/>
+          <w:color w:val="000000"/>
+        </w:rPr>
+        <w:t>Table A.2. Requirements for Actual's methodology.</w:t>
+      </w:r>
+    </w:p>
     <w:p>
       <w:pPr>
         <w:pStyle w:val="Heading2"/>
@@ -7892,10 +7995,7 @@
           <w:numId w:val="0"/>
         </w:numPr>
       </w:pPr>
-      <w:bookmarkStart w:id="79" w:name="a.2-candidate-methodologies"/>
-      <w:bookmarkStart w:id="80" w:name="_Toc244220732"/>
-      <w:bookmarkStart w:id="81" w:name="_Toc244221200"/>
-      <w:bookmarkEnd w:id="76"/>
+      <w:bookmarkStart w:id="81" w:name="_Toc244221420"/>
       <w:r>
         <w:t>A.2 Candidate Methodologies</w:t>
       </w:r>
@@ -7928,7 +8028,7 @@
       </w:pPr>
       <w:bookmarkStart w:id="82" w:name="a.3-evaluation-and-selection"/>
       <w:bookmarkStart w:id="83" w:name="_Toc244220733"/>
-      <w:bookmarkStart w:id="84" w:name="_Toc244221201"/>
+      <w:bookmarkStart w:id="84" w:name="_Toc244221421"/>
       <w:bookmarkEnd w:id="79"/>
       <w:r>
         <w:t>A.3 Evaluation and Selection</w:t>
@@ -7995,19 +8095,6 @@
       </w:pPr>
       <w:r>
         <w:t>Every candidate is assumed to keep Actual's existing CI, review and monthly release, so none is credited for what Actual already does. Table A.3 sets out what each candidate requires of a team and the resulting findings.</w:t>
-      </w:r>
-    </w:p>
-    <w:p>
-      <w:pPr>
-        <w:pStyle w:val="BodyText"/>
-        <w:keepNext/>
-      </w:pPr>
-      <w:r>
-        <w:rPr>
-          <w:i/>
-          <w:iCs/>
-        </w:rPr>
-        <w:t>Table A.3. What each candidate requires, and its clashes and gaps.</w:t>
       </w:r>
     </w:p>
     <w:tbl>
@@ -8473,6 +8560,7 @@
           <w:p>
             <w:pPr>
               <w:pStyle w:val="Compact"/>
+              <w:keepNext/>
               <w:spacing w:before="40" w:after="40"/>
               <w:jc w:val="left"/>
             </w:pPr>
@@ -8489,6 +8577,7 @@
           <w:p>
             <w:pPr>
               <w:pStyle w:val="Compact"/>
+              <w:keepNext/>
               <w:spacing w:before="40" w:after="40"/>
               <w:jc w:val="left"/>
             </w:pPr>
@@ -8504,6 +8593,7 @@
           <w:p>
             <w:pPr>
               <w:pStyle w:val="Compact"/>
+              <w:keepNext/>
               <w:spacing w:before="40" w:after="40"/>
               <w:jc w:val="left"/>
             </w:pPr>
@@ -8519,6 +8609,7 @@
           <w:p>
             <w:pPr>
               <w:pStyle w:val="Compact"/>
+              <w:keepNext/>
               <w:spacing w:before="40" w:after="40"/>
               <w:jc w:val="left"/>
             </w:pPr>
@@ -8529,6 +8620,24 @@
         </w:tc>
       </w:tr>
     </w:tbl>
+    <w:p>
+      <w:pPr>
+        <w:pStyle w:val="BodyText"/>
+        <w:spacing w:before="120"/>
+        <w:jc w:val="center"/>
+        <w:rPr>
+          <w:i/>
+          <w:color w:val="000000"/>
+        </w:rPr>
+      </w:pPr>
+      <w:r>
+        <w:rPr>
+          <w:i/>
+          <w:color w:val="000000"/>
+        </w:rPr>
+        <w:t>Table A.3. What each candidate requires, and its clashes and gaps.</w:t>
+      </w:r>
+    </w:p>
     <w:p>
       <w:pPr>
         <w:pStyle w:val="BodyText"/>
@@ -8597,7 +8706,7 @@
       </w:pPr>
       <w:bookmarkStart w:id="85" w:name="appendix-b-worked-example-of-the-qa-plan"/>
       <w:bookmarkStart w:id="86" w:name="_Toc244220734"/>
-      <w:bookmarkStart w:id="87" w:name="_Toc244221202"/>
+      <w:bookmarkStart w:id="87" w:name="_Toc244221422"/>
       <w:bookmarkEnd w:id="73"/>
       <w:bookmarkEnd w:id="82"/>
       <w:r>
@@ -8682,15 +8791,7 @@
       <w:pStyle w:val="Footer"/>
     </w:pPr>
     <w:r>
-      <w:t xml:space="preserve">Version 1.2 UCTI </w:t>
-    </w:r>
-    <w:proofErr w:type="spellStart"/>
-    <w:r>
-      <w:t>AssCv</w:t>
-    </w:r>
-    <w:proofErr w:type="spellEnd"/>
-    <w:r>
-      <w:t xml:space="preserve"> 2007-10-23</w:t>
+      <w:t>Version 1.2 UCTI AssCv 2007-10-23</w:t>
     </w:r>
   </w:p>
 </w:ftr>

</xml_diff>

<commit_message>
Trim figure captions; number references and link URLs in Word report
Co-Authored-By: Claude Opus 5.5 <noreply@anthropic.com>
</commit_message>
<xml_diff>
--- a/report/assignment-1/Assignment-1-Report.docx
+++ b/report/assignment-1/Assignment-1-Report.docx
@@ -217,7 +217,15 @@
         <w:t xml:space="preserve">HAND OUT DATE: </w:t>
       </w:r>
       <w:r>
-        <w:t>- dd-mm-yyyy -</w:t>
+        <w:t>- dd-mm-</w:t>
+      </w:r>
+      <w:proofErr w:type="spellStart"/>
+      <w:r>
+        <w:t>yyyy</w:t>
+      </w:r>
+      <w:proofErr w:type="spellEnd"/>
+      <w:r>
+        <w:t xml:space="preserve"> -</w:t>
       </w:r>
     </w:p>
     <w:p>
@@ -243,7 +251,21 @@
         <w:rPr>
           <w:sz w:val="28"/>
         </w:rPr>
-        <w:t xml:space="preserve">HAND IN DATE:     - dd-mm-yyyy -   </w:t>
+        <w:t>HAND IN DATE:     - dd-mm-</w:t>
+      </w:r>
+      <w:proofErr w:type="spellStart"/>
+      <w:r>
+        <w:rPr>
+          <w:sz w:val="28"/>
+        </w:rPr>
+        <w:t>yyyy</w:t>
+      </w:r>
+      <w:proofErr w:type="spellEnd"/>
+      <w:r>
+        <w:rPr>
+          <w:sz w:val="28"/>
+        </w:rPr>
+        <w:t xml:space="preserve"> -   </w:t>
       </w:r>
     </w:p>
     <w:p>
@@ -2920,7 +2942,7 @@
           <w:i/>
           <w:iCs/>
         </w:rPr>
-        <w:t>Figure 1. How Actual Budget works (based on Actual Budget, n.d.-c).</w:t>
+        <w:t>Figure 1. How Actual Budget works.</w:t>
       </w:r>
     </w:p>
     <w:p>
@@ -3410,7 +3432,7 @@
           <w:i/>
           <w:iCs/>
         </w:rPr>
-        <w:t>Figure 2. Actual's as-is development workflow (compiled from the sources cited in 2.1).</w:t>
+        <w:t>Figure 2. Actual's as-is development workflow.</w:t>
       </w:r>
     </w:p>
     <w:p>
@@ -3565,7 +3587,21 @@
           <w:i/>
           <w:iCs/>
         </w:rPr>
-        <w:t>Figure 3. Proposed (to-be) Kanban workflow for Actual with explicit exit policies.</w:t>
+        <w:t xml:space="preserve">Figure 3. </w:t>
+      </w:r>
+      <w:r>
+        <w:rPr>
+          <w:i/>
+          <w:iCs/>
+        </w:rPr>
+        <w:t>Proposed Kanban</w:t>
+      </w:r>
+      <w:r>
+        <w:rPr>
+          <w:i/>
+          <w:iCs/>
+        </w:rPr>
+        <w:t xml:space="preserve"> workflow for Actual with explicit exit policies.</w:t>
       </w:r>
     </w:p>
     <w:p>
@@ -3828,7 +3864,39 @@
         <w:t>Reliability:</w:t>
       </w:r>
       <w:r>
-        <w:t xml:space="preserve"> There is no test coverage measurement. Test coverage would not prove that the code is correct, but it would at least show what is untested. And reliability defects still reach users, like a sync defect that stopped some budgets from opening and it's stayed in released versions for years (Brown, 2026). Although Actual's testing checklist asks for "appropriate test coverage" (Actual Budget, n.d.-i, Testing Checklist section), there's no coverage report found in the repository, and sync-server tests have coverage switched off (Actual Budget, 2026a). Therefore, nobody can tell how much of the sync and migration code is actually tested and actually safe.</w:t>
+        <w:t xml:space="preserve"> There is no test coverage measurement. Test coverage would not prove that the code is correct, but it would at least show what is untested. And reliability defects still reach users, like a sync defect that stopped some budgets from </w:t>
+      </w:r>
+      <w:proofErr w:type="gramStart"/>
+      <w:r>
+        <w:t>opening</w:t>
+      </w:r>
+      <w:proofErr w:type="gramEnd"/>
+      <w:r>
+        <w:t xml:space="preserve"> and it's stayed in released versions for years (Brown, 2026). Although Actual's testing checklist asks for "appropriate test coverage" (Actual Budget, n.d</w:t>
+      </w:r>
+      <w:proofErr w:type="gramStart"/>
+      <w:r>
+        <w:t>.-</w:t>
+      </w:r>
+      <w:proofErr w:type="gramEnd"/>
+      <w:r>
+        <w:t xml:space="preserve">i, Testing Checklist section), there's no coverage report found in the repository, and sync-server tests have coverage switched off (Actual Budget, 2026a). Therefore, nobody can tell how much of the sync and migration code is </w:t>
+      </w:r>
+      <w:proofErr w:type="gramStart"/>
+      <w:r>
+        <w:t>actually tested</w:t>
+      </w:r>
+      <w:proofErr w:type="gramEnd"/>
+      <w:r>
+        <w:t xml:space="preserve"> and </w:t>
+      </w:r>
+      <w:proofErr w:type="gramStart"/>
+      <w:r>
+        <w:t>actually safe</w:t>
+      </w:r>
+      <w:proofErr w:type="gramEnd"/>
+      <w:r>
+        <w:t>.</w:t>
       </w:r>
     </w:p>
     <w:p>
@@ -3858,7 +3926,15 @@
         <w:t>Process:</w:t>
       </w:r>
       <w:r>
-        <w:t xml:space="preserve"> No written QA plan. Quality rules are spread across documentation, templates and CI files, so there's no a single place that states what must be checked before work moves on.</w:t>
+        <w:t xml:space="preserve"> No written QA plan. Quality rules are spread across documentation, templates and CI files, so there's </w:t>
+      </w:r>
+      <w:proofErr w:type="gramStart"/>
+      <w:r>
+        <w:t>no</w:t>
+      </w:r>
+      <w:proofErr w:type="gramEnd"/>
+      <w:r>
+        <w:t xml:space="preserve"> a single place that states what must be checked before work moves on.</w:t>
       </w:r>
     </w:p>
     <w:p>
@@ -6368,7 +6444,10 @@
     <w:p>
       <w:pPr>
         <w:pStyle w:val="FirstParagraph"/>
-        <w:ind w:left="720" w:hanging="720"/>
+        <w:numPr>
+          <w:ilvl w:val="0"/>
+          <w:numId w:val="4"/>
+        </w:numPr>
         <w:jc w:val="left"/>
       </w:pPr>
       <w:r>
@@ -6382,13 +6461,24 @@
         <w:t>Roadmap for 2025</w:t>
       </w:r>
       <w:r>
-        <w:t>. Actual Budget. https://actualbudget.org/blog/roadmap-for-2025/</w:t>
-      </w:r>
+        <w:t xml:space="preserve">. Actual Budget. </w:t>
+      </w:r>
+      <w:hyperlink r:id="rId20" w:history="1">
+        <w:r>
+          <w:rPr>
+            <w:rStyle w:val="Hyperlink"/>
+          </w:rPr>
+          <w:t>https://actualbudget.org/blog/roadmap-for-2025/</w:t>
+        </w:r>
+      </w:hyperlink>
     </w:p>
     <w:p>
       <w:pPr>
         <w:pStyle w:val="BodyText"/>
-        <w:ind w:left="720" w:hanging="720"/>
+        <w:numPr>
+          <w:ilvl w:val="0"/>
+          <w:numId w:val="4"/>
+        </w:numPr>
         <w:jc w:val="left"/>
       </w:pPr>
       <w:r>
@@ -6402,13 +6492,24 @@
         <w:t>Contributing to Actual Budget</w:t>
       </w:r>
       <w:r>
-        <w:t>. Retrieved October 22, 2026, from https://actualbudget.org/docs/contributing/</w:t>
-      </w:r>
+        <w:t xml:space="preserve">. Retrieved October 22, 2026, from </w:t>
+      </w:r>
+      <w:hyperlink r:id="rId21" w:history="1">
+        <w:r>
+          <w:rPr>
+            <w:rStyle w:val="Hyperlink"/>
+          </w:rPr>
+          <w:t>https://actualbudget.org/docs/contributing/</w:t>
+        </w:r>
+      </w:hyperlink>
     </w:p>
     <w:p>
       <w:pPr>
         <w:pStyle w:val="BodyText"/>
-        <w:ind w:left="720" w:hanging="720"/>
+        <w:numPr>
+          <w:ilvl w:val="0"/>
+          <w:numId w:val="4"/>
+        </w:numPr>
         <w:jc w:val="left"/>
       </w:pPr>
       <w:r>
@@ -6422,13 +6523,24 @@
         <w:t>How to cut a release</w:t>
       </w:r>
       <w:r>
-        <w:t>. Retrieved October 22, 2026, from https://actualbudget.org/docs/contributing/releasing/</w:t>
-      </w:r>
+        <w:t xml:space="preserve">. Retrieved October 22, 2026, from </w:t>
+      </w:r>
+      <w:hyperlink r:id="rId22" w:history="1">
+        <w:r>
+          <w:rPr>
+            <w:rStyle w:val="Hyperlink"/>
+          </w:rPr>
+          <w:t>https://actualbudget.org/docs/contributing/releasing/</w:t>
+        </w:r>
+      </w:hyperlink>
     </w:p>
     <w:p>
       <w:pPr>
         <w:pStyle w:val="BodyText"/>
-        <w:ind w:left="720" w:hanging="720"/>
+        <w:numPr>
+          <w:ilvl w:val="0"/>
+          <w:numId w:val="4"/>
+        </w:numPr>
         <w:jc w:val="left"/>
       </w:pPr>
       <w:r>
@@ -6442,13 +6554,24 @@
         <w:t>Installing Actual</w:t>
       </w:r>
       <w:r>
-        <w:t>. Retrieved October 22, 2026, from https://actualbudget.org/docs/install/</w:t>
-      </w:r>
+        <w:t xml:space="preserve">. Retrieved October 22, 2026, from </w:t>
+      </w:r>
+      <w:hyperlink r:id="rId23" w:history="1">
+        <w:r>
+          <w:rPr>
+            <w:rStyle w:val="Hyperlink"/>
+          </w:rPr>
+          <w:t>https://actualbudget.org/docs/install/</w:t>
+        </w:r>
+      </w:hyperlink>
     </w:p>
     <w:p>
       <w:pPr>
         <w:pStyle w:val="BodyText"/>
-        <w:ind w:left="720" w:hanging="720"/>
+        <w:numPr>
+          <w:ilvl w:val="0"/>
+          <w:numId w:val="4"/>
+        </w:numPr>
         <w:jc w:val="left"/>
       </w:pPr>
       <w:r>
@@ -6462,13 +6585,24 @@
         <w:t>New core contributors guide</w:t>
       </w:r>
       <w:r>
-        <w:t>. Retrieved October 22, 2026, from https://actualbudget.org/docs/contributing/leadership/new-core-contributors-guide/</w:t>
-      </w:r>
+        <w:t xml:space="preserve">. Retrieved October 22, 2026, from </w:t>
+      </w:r>
+      <w:hyperlink r:id="rId24" w:history="1">
+        <w:r>
+          <w:rPr>
+            <w:rStyle w:val="Hyperlink"/>
+          </w:rPr>
+          <w:t>https://actualbudget.org/docs/contributing/leadership/new-core-contributors-guide/</w:t>
+        </w:r>
+      </w:hyperlink>
     </w:p>
     <w:p>
       <w:pPr>
         <w:pStyle w:val="BodyText"/>
-        <w:ind w:left="720" w:hanging="720"/>
+        <w:numPr>
+          <w:ilvl w:val="0"/>
+          <w:numId w:val="4"/>
+        </w:numPr>
         <w:jc w:val="left"/>
       </w:pPr>
       <w:r>
@@ -6482,13 +6616,24 @@
         <w:t>Paying reviewers for administrative work</w:t>
       </w:r>
       <w:r>
-        <w:t>. Retrieved October 22, 2026, from https://actualbudget.org/docs/contributing/leadership/paying-contributors/</w:t>
-      </w:r>
+        <w:t xml:space="preserve">. Retrieved October 22, 2026, from </w:t>
+      </w:r>
+      <w:hyperlink r:id="rId25" w:history="1">
+        <w:r>
+          <w:rPr>
+            <w:rStyle w:val="Hyperlink"/>
+          </w:rPr>
+          <w:t>https://actualbudget.org/docs/contributing/leadership/paying-contributors/</w:t>
+        </w:r>
+      </w:hyperlink>
     </w:p>
     <w:p>
       <w:pPr>
         <w:pStyle w:val="BodyText"/>
-        <w:ind w:left="720" w:hanging="720"/>
+        <w:numPr>
+          <w:ilvl w:val="0"/>
+          <w:numId w:val="4"/>
+        </w:numPr>
         <w:jc w:val="left"/>
       </w:pPr>
       <w:r>
@@ -6502,13 +6647,24 @@
         <w:t>Preview builds</w:t>
       </w:r>
       <w:r>
-        <w:t>. Retrieved October 22, 2026, from https://actualbudget.org/docs/contributing/preview-builds/</w:t>
-      </w:r>
+        <w:t xml:space="preserve">. Retrieved October 22, 2026, from </w:t>
+      </w:r>
+      <w:hyperlink r:id="rId26" w:history="1">
+        <w:r>
+          <w:rPr>
+            <w:rStyle w:val="Hyperlink"/>
+          </w:rPr>
+          <w:t>https://actualbudget.org/docs/contributing/preview-builds/</w:t>
+        </w:r>
+      </w:hyperlink>
     </w:p>
     <w:p>
       <w:pPr>
         <w:pStyle w:val="BodyText"/>
-        <w:ind w:left="720" w:hanging="720"/>
+        <w:numPr>
+          <w:ilvl w:val="0"/>
+          <w:numId w:val="4"/>
+        </w:numPr>
         <w:jc w:val="left"/>
       </w:pPr>
       <w:r>
@@ -6522,13 +6678,24 @@
         <w:t>Security policy</w:t>
       </w:r>
       <w:r>
-        <w:t xml:space="preserve"> [SECURITY.md]. GitHub. Retrieved October 22, 2026, from https://github.com/actualbudget/.github/blob/main/SECURITY.md</w:t>
-      </w:r>
+        <w:t xml:space="preserve"> [SECURITY.md]. GitHub. Retrieved October 22, 2026, from </w:t>
+      </w:r>
+      <w:hyperlink r:id="rId27" w:history="1">
+        <w:r>
+          <w:rPr>
+            <w:rStyle w:val="Hyperlink"/>
+          </w:rPr>
+          <w:t>https://github.com/actualbudget/.github/blob/main/SECURITY.md</w:t>
+        </w:r>
+      </w:hyperlink>
     </w:p>
     <w:p>
       <w:pPr>
         <w:pStyle w:val="BodyText"/>
-        <w:ind w:left="720" w:hanging="720"/>
+        <w:numPr>
+          <w:ilvl w:val="0"/>
+          <w:numId w:val="4"/>
+        </w:numPr>
         <w:jc w:val="left"/>
       </w:pPr>
       <w:r>
@@ -6542,13 +6709,24 @@
         <w:t>Syncing across devices</w:t>
       </w:r>
       <w:r>
-        <w:t>. Retrieved October 22, 2026, from https://actualbudget.org/docs/getting-started/sync/</w:t>
-      </w:r>
+        <w:t xml:space="preserve">. Retrieved October 22, 2026, from </w:t>
+      </w:r>
+      <w:hyperlink r:id="rId28" w:history="1">
+        <w:r>
+          <w:rPr>
+            <w:rStyle w:val="Hyperlink"/>
+          </w:rPr>
+          <w:t>https://actualbudget.org/docs/getting-started/sync/</w:t>
+        </w:r>
+      </w:hyperlink>
     </w:p>
     <w:p>
       <w:pPr>
         <w:pStyle w:val="BodyText"/>
-        <w:ind w:left="720" w:hanging="720"/>
+        <w:numPr>
+          <w:ilvl w:val="0"/>
+          <w:numId w:val="4"/>
+        </w:numPr>
         <w:jc w:val="left"/>
       </w:pPr>
       <w:r>
@@ -6562,13 +6740,24 @@
         <w:t>Testing</w:t>
       </w:r>
       <w:r>
-        <w:t>. Retrieved October 22, 2026, from https://actualbudget.org/docs/contributing/testing/</w:t>
-      </w:r>
+        <w:t xml:space="preserve">. Retrieved October 22, 2026, from </w:t>
+      </w:r>
+      <w:hyperlink r:id="rId29" w:history="1">
+        <w:r>
+          <w:rPr>
+            <w:rStyle w:val="Hyperlink"/>
+          </w:rPr>
+          <w:t>https://actualbudget.org/docs/contributing/testing/</w:t>
+        </w:r>
+      </w:hyperlink>
     </w:p>
     <w:p>
       <w:pPr>
         <w:pStyle w:val="BodyText"/>
-        <w:ind w:left="720" w:hanging="720"/>
+        <w:numPr>
+          <w:ilvl w:val="0"/>
+          <w:numId w:val="4"/>
+        </w:numPr>
         <w:jc w:val="left"/>
       </w:pPr>
       <w:r>
@@ -6582,18 +6771,30 @@
         <w:t>A tour of Actual</w:t>
       </w:r>
       <w:r>
-        <w:t>. Retrieved October 22, 2026, from https://actualbudget.org/docs/tour/</w:t>
-      </w:r>
+        <w:t xml:space="preserve">. Retrieved October 22, 2026, from </w:t>
+      </w:r>
+      <w:hyperlink r:id="rId30" w:history="1">
+        <w:r>
+          <w:rPr>
+            <w:rStyle w:val="Hyperlink"/>
+          </w:rPr>
+          <w:t>https://actualbudget.org/docs/tour/</w:t>
+        </w:r>
+      </w:hyperlink>
     </w:p>
     <w:p>
       <w:pPr>
         <w:pStyle w:val="BodyText"/>
-        <w:ind w:left="720" w:hanging="720"/>
+        <w:numPr>
+          <w:ilvl w:val="0"/>
+          <w:numId w:val="4"/>
+        </w:numPr>
         <w:jc w:val="left"/>
       </w:pPr>
       <w:r>
         <w:t xml:space="preserve">Actual Budget. (2026a). </w:t>
       </w:r>
+      <w:proofErr w:type="gramStart"/>
       <w:r>
         <w:rPr>
           <w:i/>
@@ -6601,14 +6802,26 @@
         </w:rPr>
         <w:t>Actual</w:t>
       </w:r>
-      <w:r>
-        <w:t xml:space="preserve"> [Computer software]. GitHub. https://github.com/actualbudget/actual</w:t>
-      </w:r>
+      <w:proofErr w:type="gramEnd"/>
+      <w:r>
+        <w:t xml:space="preserve"> [Computer software]. GitHub. </w:t>
+      </w:r>
+      <w:hyperlink r:id="rId31" w:history="1">
+        <w:r>
+          <w:rPr>
+            <w:rStyle w:val="Hyperlink"/>
+          </w:rPr>
+          <w:t>https://github.com/actualbudget/actual</w:t>
+        </w:r>
+      </w:hyperlink>
     </w:p>
     <w:p>
       <w:pPr>
         <w:pStyle w:val="BodyText"/>
-        <w:ind w:left="720" w:hanging="720"/>
+        <w:numPr>
+          <w:ilvl w:val="0"/>
+          <w:numId w:val="4"/>
+        </w:numPr>
         <w:jc w:val="left"/>
       </w:pPr>
       <w:r>
@@ -6622,13 +6835,24 @@
         <w:t>Disabled OpenID users keep access through existing session tokens</w:t>
       </w:r>
       <w:r>
-        <w:t xml:space="preserve"> (GHSA-cq9c-6w48-qmfg) [Security advisory]. GitHub. https://github.com/actualbudget/actual/security/advisories/GHSA-cq9c-6w48-qmfg</w:t>
-      </w:r>
+        <w:t xml:space="preserve"> (GHSA-cq9c-6w48-qmfg) [Security advisory]. GitHub. </w:t>
+      </w:r>
+      <w:hyperlink r:id="rId32" w:history="1">
+        <w:r>
+          <w:rPr>
+            <w:rStyle w:val="Hyperlink"/>
+          </w:rPr>
+          <w:t>https://github.com/actualbudget/actual/security/advisories/GHSA-cq9c-6w48-qmfg</w:t>
+        </w:r>
+      </w:hyperlink>
     </w:p>
     <w:p>
       <w:pPr>
         <w:pStyle w:val="BodyText"/>
-        <w:ind w:left="720" w:hanging="720"/>
+        <w:numPr>
+          <w:ilvl w:val="0"/>
+          <w:numId w:val="4"/>
+        </w:numPr>
         <w:jc w:val="left"/>
       </w:pPr>
       <w:r>
@@ -6642,13 +6866,24 @@
         <w:t>Missing authentication for SimpleFIN and Pluggy AI bank sync endpoints</w:t>
       </w:r>
       <w:r>
-        <w:t xml:space="preserve"> (GHSA-m2cq-xjgm-f668) [Security advisory]. GitHub. https://github.com/actualbudget/actual/security/advisories/GHSA-m2cq-xjgm-f668</w:t>
-      </w:r>
+        <w:t xml:space="preserve"> (GHSA-m2cq-xjgm-f668) [Security advisory]. GitHub. </w:t>
+      </w:r>
+      <w:hyperlink r:id="rId33" w:history="1">
+        <w:r>
+          <w:rPr>
+            <w:rStyle w:val="Hyperlink"/>
+          </w:rPr>
+          <w:t>https://github.com/actualbudget/actual/security/advisories/GHSA-m2cq-xjgm-f668</w:t>
+        </w:r>
+      </w:hyperlink>
     </w:p>
     <w:p>
       <w:pPr>
         <w:pStyle w:val="BodyText"/>
-        <w:ind w:left="720" w:hanging="720"/>
+        <w:numPr>
+          <w:ilvl w:val="0"/>
+          <w:numId w:val="4"/>
+        </w:numPr>
         <w:jc w:val="left"/>
       </w:pPr>
       <w:r>
@@ -6662,17 +6897,31 @@
         <w:t>Privilege escalation via 'change-password' endpoint on OpenID-migrated servers</w:t>
       </w:r>
       <w:r>
-        <w:t xml:space="preserve"> (GHSA-prp4-2f49-fcgp) [Security advisory]. GitHub. https://github.com/actualbudget/actual/security/advisories/GHSA-prp4-2f49-fcgp</w:t>
-      </w:r>
+        <w:t xml:space="preserve"> (GHSA-prp4-2f49-fcgp) [Security advisory]. </w:t>
+      </w:r>
+      <w:r>
+        <w:lastRenderedPageBreak/>
+        <w:t xml:space="preserve">GitHub. </w:t>
+      </w:r>
+      <w:hyperlink r:id="rId34" w:history="1">
+        <w:r>
+          <w:rPr>
+            <w:rStyle w:val="Hyperlink"/>
+          </w:rPr>
+          <w:t>https://github.com/actualbudget/actual/security/advisories/GHSA-prp4-2f49-fcgp</w:t>
+        </w:r>
+      </w:hyperlink>
     </w:p>
     <w:p>
       <w:pPr>
         <w:pStyle w:val="BodyText"/>
-        <w:ind w:left="720" w:hanging="720"/>
+        <w:numPr>
+          <w:ilvl w:val="0"/>
+          <w:numId w:val="4"/>
+        </w:numPr>
         <w:jc w:val="left"/>
       </w:pPr>
       <w:r>
-        <w:lastRenderedPageBreak/>
         <w:t xml:space="preserve">Ahmad, M. O., Dennehy, D., Conboy, K., &amp; Oivo, M. (2018). Kanban in software engineering: A systematic mapping study. </w:t>
       </w:r>
       <w:r>
@@ -6683,13 +6932,24 @@
         <w:t>Journal of Systems and Software, 137</w:t>
       </w:r>
       <w:r>
-        <w:t>, 96–113. https://doi.org/10.1016/j.jss.2017.11.045</w:t>
-      </w:r>
+        <w:t xml:space="preserve">, 96–113. </w:t>
+      </w:r>
+      <w:hyperlink r:id="rId35" w:history="1">
+        <w:r>
+          <w:rPr>
+            <w:rStyle w:val="Hyperlink"/>
+          </w:rPr>
+          <w:t>https://doi.org/10.1016/j.jss.2017.11.045</w:t>
+        </w:r>
+      </w:hyperlink>
     </w:p>
     <w:p>
       <w:pPr>
         <w:pStyle w:val="BodyText"/>
-        <w:ind w:left="720" w:hanging="720"/>
+        <w:numPr>
+          <w:ilvl w:val="0"/>
+          <w:numId w:val="4"/>
+        </w:numPr>
         <w:jc w:val="left"/>
       </w:pPr>
       <w:r>
@@ -6703,13 +6963,24 @@
         <w:t>Getting started with eXtreme Programming: Toe dipping, racing dives, and cannonballs: Appendix: Primary practices</w:t>
       </w:r>
       <w:r>
-        <w:t>. InformIT. https://www.informit.com/articles/article.aspx?p=390816&amp;seqNum=3</w:t>
-      </w:r>
+        <w:t xml:space="preserve">. InformIT. </w:t>
+      </w:r>
+      <w:hyperlink r:id="rId36" w:history="1">
+        <w:r>
+          <w:rPr>
+            <w:rStyle w:val="Hyperlink"/>
+          </w:rPr>
+          <w:t>https://www.informit.com/articles/article.aspx?p=390816&amp;seqNum=3</w:t>
+        </w:r>
+      </w:hyperlink>
     </w:p>
     <w:p>
       <w:pPr>
         <w:pStyle w:val="BodyText"/>
-        <w:ind w:left="720" w:hanging="720"/>
+        <w:numPr>
+          <w:ilvl w:val="0"/>
+          <w:numId w:val="4"/>
+        </w:numPr>
         <w:jc w:val="left"/>
       </w:pPr>
       <w:r>
@@ -6723,13 +6994,24 @@
         <w:t>Computer, 21</w:t>
       </w:r>
       <w:r>
-        <w:t>(5), 61–72. https://doi.org/10.1109/2.59</w:t>
-      </w:r>
+        <w:t xml:space="preserve">(5), 61–72. </w:t>
+      </w:r>
+      <w:hyperlink r:id="rId37" w:history="1">
+        <w:r>
+          <w:rPr>
+            <w:rStyle w:val="Hyperlink"/>
+          </w:rPr>
+          <w:t>https://doi.org/10.1109/2.59</w:t>
+        </w:r>
+      </w:hyperlink>
     </w:p>
     <w:p>
       <w:pPr>
         <w:pStyle w:val="BodyText"/>
-        <w:ind w:left="720" w:hanging="720"/>
+        <w:numPr>
+          <w:ilvl w:val="0"/>
+          <w:numId w:val="4"/>
+        </w:numPr>
         <w:jc w:val="left"/>
       </w:pPr>
       <w:r>
@@ -6740,282 +7022,516 @@
           <w:i/>
           <w:iCs/>
         </w:rPr>
-        <w:t>[AI] fix(sync): receive only the latest timestamp to stop counter overflow</w:t>
-      </w:r>
-      <w:r>
-        <w:t xml:space="preserve"> (#8706) [Commit]. GitHub. https://github.com/actualbudget/actual/commit/5f60f2971ca0f4a84133ba43a047a9f7b029d409</w:t>
-      </w:r>
-    </w:p>
-    <w:p>
-      <w:pPr>
-        <w:pStyle w:val="BodyText"/>
-        <w:ind w:left="720" w:hanging="720"/>
-        <w:jc w:val="left"/>
-      </w:pPr>
-      <w:r>
-        <w:t xml:space="preserve">DORA. (n.d.). </w:t>
-      </w:r>
+        <w:t xml:space="preserve">[AI] fix(sync): receive only the latest timestamp to stop counter </w:t>
+      </w:r>
+      <w:proofErr w:type="gramStart"/>
       <w:r>
         <w:rPr>
           <w:i/>
           <w:iCs/>
         </w:rPr>
-        <w:t>Test automation</w:t>
-      </w:r>
-      <w:r>
-        <w:t>. Retrieved October 26, 2026, from https://dora.dev/capabilities/test-automation/</w:t>
-      </w:r>
+        <w:t>overflow</w:t>
+      </w:r>
+      <w:r>
+        <w:t xml:space="preserve"> (#</w:t>
+      </w:r>
+      <w:proofErr w:type="gramEnd"/>
+      <w:r>
+        <w:t xml:space="preserve">8706) [Commit]. GitHub. </w:t>
+      </w:r>
+      <w:hyperlink r:id="rId38" w:history="1">
+        <w:r>
+          <w:rPr>
+            <w:rStyle w:val="Hyperlink"/>
+          </w:rPr>
+          <w:t>https://github.com/actualbudget/actual/commit/5f60f2971ca0f4a84133ba43a047a9f7b029d409</w:t>
+        </w:r>
+      </w:hyperlink>
     </w:p>
     <w:p>
       <w:pPr>
         <w:pStyle w:val="BodyText"/>
-        <w:ind w:left="720" w:hanging="720"/>
+        <w:numPr>
+          <w:ilvl w:val="0"/>
+          <w:numId w:val="4"/>
+        </w:numPr>
         <w:jc w:val="left"/>
       </w:pPr>
       <w:r>
-        <w:t xml:space="preserve">Garvin, D. A. (1984). What does "product quality" really mean? </w:t>
+        <w:t xml:space="preserve">DORA. (n.d.). </w:t>
       </w:r>
       <w:r>
         <w:rPr>
           <w:i/>
           <w:iCs/>
         </w:rPr>
-        <w:t>Sloan Management Review, 26</w:t>
-      </w:r>
-      <w:r>
-        <w:t>(1), 25–43. https://sloanreview.mit.edu/article/what-does-product-quality-really-mean/</w:t>
-      </w:r>
+        <w:t>Test automation</w:t>
+      </w:r>
+      <w:r>
+        <w:t xml:space="preserve">. Retrieved October 26, 2026, from </w:t>
+      </w:r>
+      <w:hyperlink r:id="rId39" w:history="1">
+        <w:r>
+          <w:rPr>
+            <w:rStyle w:val="Hyperlink"/>
+          </w:rPr>
+          <w:t>https://dora.dev/capabilities/test-automation/</w:t>
+        </w:r>
+      </w:hyperlink>
     </w:p>
     <w:p>
       <w:pPr>
         <w:pStyle w:val="BodyText"/>
-        <w:ind w:left="720" w:hanging="720"/>
+        <w:numPr>
+          <w:ilvl w:val="0"/>
+          <w:numId w:val="4"/>
+        </w:numPr>
         <w:jc w:val="left"/>
       </w:pPr>
       <w:r>
-        <w:t xml:space="preserve">GeeksforGeeks. (2025, July 23). </w:t>
+        <w:t xml:space="preserve">Garvin, D. A. (1984). What does "product quality" really mean? </w:t>
       </w:r>
       <w:r>
         <w:rPr>
           <w:i/>
           <w:iCs/>
         </w:rPr>
-        <w:t>How to choose the best SDLC model for your project</w:t>
-      </w:r>
-      <w:r>
-        <w:t>. https://www.geeksforgeeks.org/software-engineering/how-to-choose-the-best-sdlc-model-for-your-project/</w:t>
-      </w:r>
+        <w:t>Sloan Management Review, 26</w:t>
+      </w:r>
+      <w:r>
+        <w:t xml:space="preserve">(1), 25–43. </w:t>
+      </w:r>
+      <w:hyperlink r:id="rId40" w:history="1">
+        <w:r>
+          <w:rPr>
+            <w:rStyle w:val="Hyperlink"/>
+          </w:rPr>
+          <w:t>https://sloanreview.mit.edu/article/what-does-product-quality-really-mean/</w:t>
+        </w:r>
+      </w:hyperlink>
     </w:p>
     <w:p>
       <w:pPr>
         <w:pStyle w:val="BodyText"/>
-        <w:ind w:left="720" w:hanging="720"/>
+        <w:numPr>
+          <w:ilvl w:val="0"/>
+          <w:numId w:val="4"/>
+        </w:numPr>
         <w:jc w:val="left"/>
       </w:pPr>
       <w:r>
-        <w:t xml:space="preserve">Institute of Electrical and Electronics Engineers. (2025). </w:t>
+        <w:t xml:space="preserve">GeeksforGeeks. (2025, July 23). </w:t>
       </w:r>
       <w:r>
         <w:rPr>
           <w:i/>
           <w:iCs/>
         </w:rPr>
-        <w:t>IEEE standard for system, software, and hardware verification and validation</w:t>
-      </w:r>
-      <w:r>
-        <w:t xml:space="preserve"> (IEEE Std 1012-2024). https://standards.ieee.org/ieee/1800.2/7324/</w:t>
-      </w:r>
+        <w:t>How to choose the best SDLC model for your project</w:t>
+      </w:r>
+      <w:r>
+        <w:t xml:space="preserve">. </w:t>
+      </w:r>
+      <w:hyperlink r:id="rId41" w:history="1">
+        <w:r>
+          <w:rPr>
+            <w:rStyle w:val="Hyperlink"/>
+          </w:rPr>
+          <w:t>https://www.geeksforgeeks.org/software-engineering/how-to-choose-the-best-sdlc-model-for-your-project/</w:t>
+        </w:r>
+      </w:hyperlink>
     </w:p>
     <w:p>
       <w:pPr>
         <w:pStyle w:val="BodyText"/>
-        <w:ind w:left="720" w:hanging="720"/>
+        <w:numPr>
+          <w:ilvl w:val="0"/>
+          <w:numId w:val="4"/>
+        </w:numPr>
         <w:jc w:val="left"/>
       </w:pPr>
       <w:r>
-        <w:t xml:space="preserve">International Organization for Standardization &amp; International Electrotechnical Commission. (2023). </w:t>
+        <w:t xml:space="preserve">Institute of Electrical and Electronics Engineers. (2025). </w:t>
       </w:r>
       <w:r>
         <w:rPr>
           <w:i/>
           <w:iCs/>
         </w:rPr>
-        <w:t>Systems and software engineering — Systems and software Quality Requirements and Evaluation (SQuaRE) — Product quality model</w:t>
-      </w:r>
-      <w:r>
-        <w:t xml:space="preserve"> (ISO/IEC Standard No. 25010:2023). https://www.iso.org/standard/78176.html</w:t>
-      </w:r>
+        <w:t>IEEE standard for system, software, and hardware verification and validation</w:t>
+      </w:r>
+      <w:r>
+        <w:t xml:space="preserve"> (IEEE Std 1012-2024). </w:t>
+      </w:r>
+      <w:hyperlink r:id="rId42" w:history="1">
+        <w:r>
+          <w:rPr>
+            <w:rStyle w:val="Hyperlink"/>
+          </w:rPr>
+          <w:t>https://standards.ieee.org/ieee/1800.2/7324/</w:t>
+        </w:r>
+      </w:hyperlink>
     </w:p>
     <w:p>
       <w:pPr>
         <w:pStyle w:val="BodyText"/>
-        <w:ind w:left="720" w:hanging="720"/>
+        <w:numPr>
+          <w:ilvl w:val="0"/>
+          <w:numId w:val="4"/>
+        </w:numPr>
         <w:jc w:val="left"/>
       </w:pPr>
       <w:r>
-        <w:t xml:space="preserve">Kanban University. (n.d.). </w:t>
+        <w:t xml:space="preserve">International Organization for Standardization &amp; International Electrotechnical Commission. (2023). </w:t>
       </w:r>
       <w:r>
         <w:rPr>
           <w:i/>
           <w:iCs/>
         </w:rPr>
-        <w:t>The official guide to the Kanban method</w:t>
-      </w:r>
-      <w:r>
-        <w:t>. Retrieved October 22, 2026, from https://kanban.university/kanban-guide/</w:t>
-      </w:r>
-    </w:p>
-    <w:p>
-      <w:pPr>
-        <w:pStyle w:val="BodyText"/>
-        <w:ind w:left="720" w:hanging="720"/>
-        <w:jc w:val="left"/>
-      </w:pPr>
-      <w:r>
-        <w:t xml:space="preserve">Open Source Technology Improvement Fund. (2026, January 30). </w:t>
-      </w:r>
+        <w:t>Systems and software engineering — Systems and software Quality Requirements and Evaluation (</w:t>
+      </w:r>
+      <w:proofErr w:type="gramStart"/>
       <w:r>
         <w:rPr>
           <w:i/>
           <w:iCs/>
         </w:rPr>
-        <w:t>2025 annual report</w:t>
-      </w:r>
-      <w:r>
-        <w:t>. https://ostif.org/2025-annual-report/</w:t>
-      </w:r>
-    </w:p>
-    <w:p>
-      <w:pPr>
-        <w:pStyle w:val="BodyText"/>
-        <w:ind w:left="720" w:hanging="720"/>
-        <w:jc w:val="left"/>
-      </w:pPr>
-      <w:r>
-        <w:t xml:space="preserve">OWASP Foundation. (2025). </w:t>
-      </w:r>
+        <w:t>SQuaRE) —</w:t>
+      </w:r>
+      <w:proofErr w:type="gramEnd"/>
       <w:r>
         <w:rPr>
           <w:i/>
           <w:iCs/>
         </w:rPr>
-        <w:t>OWASP application security verification standard</w:t>
-      </w:r>
-      <w:r>
-        <w:t xml:space="preserve"> (Version 5.0.0). https://owasp.org/www-project-application-security-verification-standard/</w:t>
-      </w:r>
+        <w:t xml:space="preserve"> Product quality model</w:t>
+      </w:r>
+      <w:r>
+        <w:t xml:space="preserve"> (ISO/IEC Standard No. 25010:2023). </w:t>
+      </w:r>
+      <w:hyperlink r:id="rId43" w:history="1">
+        <w:r>
+          <w:rPr>
+            <w:rStyle w:val="Hyperlink"/>
+          </w:rPr>
+          <w:t>https://www.iso.org/standard/78176.html</w:t>
+        </w:r>
+      </w:hyperlink>
     </w:p>
     <w:p>
       <w:pPr>
         <w:pStyle w:val="BodyText"/>
-        <w:ind w:left="720" w:hanging="720"/>
+        <w:numPr>
+          <w:ilvl w:val="0"/>
+          <w:numId w:val="4"/>
+        </w:numPr>
         <w:jc w:val="left"/>
       </w:pPr>
       <w:r>
-        <w:t xml:space="preserve">Salkever, A. (2023). </w:t>
+        <w:t xml:space="preserve">Kanban University. (n.d.). </w:t>
       </w:r>
       <w:r>
         <w:rPr>
           <w:i/>
           <w:iCs/>
         </w:rPr>
-        <w:t>Open source maintainers: Exploring the people, practices, and constraints facing the world's most critical open source software projects</w:t>
-      </w:r>
-      <w:r>
-        <w:t>. The Linux Foundation. https://doi.org/10.70828/lddj8886</w:t>
-      </w:r>
+        <w:t>The official guide to the Kanban method</w:t>
+      </w:r>
+      <w:r>
+        <w:t xml:space="preserve">. Retrieved October 22, 2026, from </w:t>
+      </w:r>
+      <w:hyperlink r:id="rId44" w:history="1">
+        <w:r>
+          <w:rPr>
+            <w:rStyle w:val="Hyperlink"/>
+          </w:rPr>
+          <w:t>https://kanban.university/kanban-guide/</w:t>
+        </w:r>
+      </w:hyperlink>
     </w:p>
     <w:p>
       <w:pPr>
         <w:pStyle w:val="BodyText"/>
-        <w:ind w:left="720" w:hanging="720"/>
+        <w:numPr>
+          <w:ilvl w:val="0"/>
+          <w:numId w:val="4"/>
+        </w:numPr>
         <w:jc w:val="left"/>
       </w:pPr>
-      <w:r>
-        <w:t xml:space="preserve">Schwaber, K., &amp; Sutherland, J. (2020). </w:t>
+      <w:proofErr w:type="gramStart"/>
+      <w:r>
+        <w:t>Open Source</w:t>
+      </w:r>
+      <w:proofErr w:type="gramEnd"/>
+      <w:r>
+        <w:t xml:space="preserve"> Technology Improvement Fund. (2026, January 30). </w:t>
       </w:r>
       <w:r>
         <w:rPr>
           <w:i/>
           <w:iCs/>
         </w:rPr>
-        <w:t>The Scrum guide</w:t>
-      </w:r>
-      <w:r>
-        <w:t>. https://scrumguides.org/scrum-guide.html</w:t>
-      </w:r>
+        <w:t>2025 annual report</w:t>
+      </w:r>
+      <w:r>
+        <w:t xml:space="preserve">. </w:t>
+      </w:r>
+      <w:hyperlink r:id="rId45" w:history="1">
+        <w:r>
+          <w:rPr>
+            <w:rStyle w:val="Hyperlink"/>
+          </w:rPr>
+          <w:t>https://ostif.org/2025-annual-report/</w:t>
+        </w:r>
+      </w:hyperlink>
     </w:p>
     <w:p>
       <w:pPr>
         <w:pStyle w:val="BodyText"/>
-        <w:ind w:left="720" w:hanging="720"/>
+        <w:numPr>
+          <w:ilvl w:val="0"/>
+          <w:numId w:val="4"/>
+        </w:numPr>
         <w:jc w:val="left"/>
       </w:pPr>
       <w:r>
-        <w:lastRenderedPageBreak/>
-        <w:t xml:space="preserve">Stacoviak, A., &amp; Santo, J. (Hosts). (2022, July 1). </w:t>
+        <w:t xml:space="preserve">OWASP Foundation. (2025). </w:t>
       </w:r>
       <w:r>
         <w:rPr>
           <w:i/>
           <w:iCs/>
         </w:rPr>
-        <w:t>Actual(ly) opening up with James Long</w:t>
-      </w:r>
-      <w:r>
-        <w:t xml:space="preserve"> (No. 495) [Audio podcast episode]. In </w:t>
-      </w:r>
+        <w:t>OWASP application security verification standard</w:t>
+      </w:r>
+      <w:r>
+        <w:t xml:space="preserve"> (Version 5.0.0). </w:t>
+      </w:r>
+      <w:hyperlink r:id="rId46" w:history="1">
+        <w:r>
+          <w:rPr>
+            <w:rStyle w:val="Hyperlink"/>
+          </w:rPr>
+          <w:t>https://owasp.org/www-project-application-security-verification-standard/</w:t>
+        </w:r>
+      </w:hyperlink>
+    </w:p>
+    <w:p>
+      <w:pPr>
+        <w:pStyle w:val="BodyText"/>
+        <w:numPr>
+          <w:ilvl w:val="0"/>
+          <w:numId w:val="4"/>
+        </w:numPr>
+        <w:jc w:val="left"/>
+      </w:pPr>
+      <w:r>
+        <w:t xml:space="preserve">Salkever, A. (2023). </w:t>
+      </w:r>
+      <w:proofErr w:type="gramStart"/>
       <w:r>
         <w:rPr>
           <w:i/>
           <w:iCs/>
         </w:rPr>
-        <w:t>The Changelog</w:t>
-      </w:r>
-      <w:r>
-        <w:t>. Changelog Media. https://changelog.com/podcast/495</w:t>
-      </w:r>
-    </w:p>
-    <w:p>
-      <w:pPr>
-        <w:pStyle w:val="BodyText"/>
-        <w:ind w:left="720" w:hanging="720"/>
-        <w:jc w:val="left"/>
-      </w:pPr>
-      <w:r>
-        <w:t xml:space="preserve">World Wide Web Consortium. (2024, December 12). </w:t>
-      </w:r>
+        <w:t>Open source</w:t>
+      </w:r>
+      <w:proofErr w:type="gramEnd"/>
       <w:r>
         <w:rPr>
           <w:i/>
           <w:iCs/>
         </w:rPr>
-        <w:t>Web content accessibility guidelines (WCAG) 2.2</w:t>
-      </w:r>
-      <w:r>
-        <w:t xml:space="preserve"> (W3C Recommendation). https://www.w3.org/TR/WCAG22/</w:t>
-      </w:r>
-    </w:p>
-    <w:p>
-      <w:pPr>
-        <w:pStyle w:val="BodyText"/>
-        <w:ind w:left="720" w:hanging="720"/>
-        <w:jc w:val="left"/>
-      </w:pPr>
-      <w:r>
-        <w:t xml:space="preserve">youngcw. (2025, December 20). </w:t>
-      </w:r>
+        <w:t xml:space="preserve"> maintainers: Exploring the people, practices, and constraints facing the world's most critical </w:t>
+      </w:r>
+      <w:proofErr w:type="gramStart"/>
       <w:r>
         <w:rPr>
           <w:i/>
           <w:iCs/>
         </w:rPr>
+        <w:t>open source</w:t>
+      </w:r>
+      <w:proofErr w:type="gramEnd"/>
+      <w:r>
+        <w:rPr>
+          <w:i/>
+          <w:iCs/>
+        </w:rPr>
+        <w:t xml:space="preserve"> software projects</w:t>
+      </w:r>
+      <w:r>
+        <w:t xml:space="preserve">. The Linux Foundation. </w:t>
+      </w:r>
+      <w:hyperlink r:id="rId47" w:history="1">
+        <w:r>
+          <w:rPr>
+            <w:rStyle w:val="Hyperlink"/>
+          </w:rPr>
+          <w:t>https://doi.org/10.70828/lddj8886</w:t>
+        </w:r>
+      </w:hyperlink>
+    </w:p>
+    <w:p>
+      <w:pPr>
+        <w:pStyle w:val="BodyText"/>
+        <w:numPr>
+          <w:ilvl w:val="0"/>
+          <w:numId w:val="4"/>
+        </w:numPr>
+        <w:jc w:val="left"/>
+      </w:pPr>
+      <w:r>
+        <w:lastRenderedPageBreak/>
+        <w:t xml:space="preserve">Schwaber, K., &amp; Sutherland, J. (2020). </w:t>
+      </w:r>
+      <w:r>
+        <w:rPr>
+          <w:i/>
+          <w:iCs/>
+        </w:rPr>
+        <w:t>The Scrum guide</w:t>
+      </w:r>
+      <w:r>
+        <w:t xml:space="preserve">. </w:t>
+      </w:r>
+      <w:hyperlink r:id="rId48" w:history="1">
+        <w:r>
+          <w:rPr>
+            <w:rStyle w:val="Hyperlink"/>
+          </w:rPr>
+          <w:t>https://scrumguides.org/scrum-guide.html</w:t>
+        </w:r>
+      </w:hyperlink>
+    </w:p>
+    <w:p>
+      <w:pPr>
+        <w:pStyle w:val="BodyText"/>
+        <w:numPr>
+          <w:ilvl w:val="0"/>
+          <w:numId w:val="4"/>
+        </w:numPr>
+        <w:jc w:val="left"/>
+      </w:pPr>
+      <w:r>
+        <w:t xml:space="preserve">Stacoviak, A., &amp; Santo, J. (Hosts). (2022, July 1). </w:t>
+      </w:r>
+      <w:proofErr w:type="gramStart"/>
+      <w:r>
+        <w:rPr>
+          <w:i/>
+          <w:iCs/>
+        </w:rPr>
+        <w:t>Actual</w:t>
+      </w:r>
+      <w:proofErr w:type="gramEnd"/>
+      <w:r>
+        <w:rPr>
+          <w:i/>
+          <w:iCs/>
+        </w:rPr>
+        <w:t xml:space="preserve">(ly) </w:t>
+      </w:r>
+      <w:proofErr w:type="gramStart"/>
+      <w:r>
+        <w:rPr>
+          <w:i/>
+          <w:iCs/>
+        </w:rPr>
+        <w:t>opening up</w:t>
+      </w:r>
+      <w:proofErr w:type="gramEnd"/>
+      <w:r>
+        <w:rPr>
+          <w:i/>
+          <w:iCs/>
+        </w:rPr>
+        <w:t xml:space="preserve"> with James Long</w:t>
+      </w:r>
+      <w:r>
+        <w:t xml:space="preserve"> (No. 495) [Audio podcast episode]. In </w:t>
+      </w:r>
+      <w:r>
+        <w:rPr>
+          <w:i/>
+          <w:iCs/>
+        </w:rPr>
+        <w:t>The Changelog</w:t>
+      </w:r>
+      <w:r>
+        <w:t xml:space="preserve">. Changelog Media. </w:t>
+      </w:r>
+      <w:hyperlink r:id="rId49" w:history="1">
+        <w:r>
+          <w:rPr>
+            <w:rStyle w:val="Hyperlink"/>
+          </w:rPr>
+          <w:t>https://changelog.com/podcast/495</w:t>
+        </w:r>
+      </w:hyperlink>
+    </w:p>
+    <w:p>
+      <w:pPr>
+        <w:pStyle w:val="BodyText"/>
+        <w:numPr>
+          <w:ilvl w:val="0"/>
+          <w:numId w:val="4"/>
+        </w:numPr>
+        <w:jc w:val="left"/>
+      </w:pPr>
+      <w:r>
+        <w:t xml:space="preserve">World Wide Web Consortium. (2024, December 12). </w:t>
+      </w:r>
+      <w:r>
+        <w:rPr>
+          <w:i/>
+          <w:iCs/>
+        </w:rPr>
+        <w:t>Web content accessibility guidelines (WCAG) 2.2</w:t>
+      </w:r>
+      <w:r>
+        <w:t xml:space="preserve"> (W3C Recommendation). </w:t>
+      </w:r>
+      <w:hyperlink r:id="rId50" w:history="1">
+        <w:r>
+          <w:rPr>
+            <w:rStyle w:val="Hyperlink"/>
+          </w:rPr>
+          <w:t>https://www.w3.org/TR/WCAG22/</w:t>
+        </w:r>
+      </w:hyperlink>
+    </w:p>
+    <w:p>
+      <w:pPr>
+        <w:pStyle w:val="BodyText"/>
+        <w:numPr>
+          <w:ilvl w:val="0"/>
+          <w:numId w:val="4"/>
+        </w:numPr>
+        <w:jc w:val="left"/>
+      </w:pPr>
+      <w:r>
+        <w:t xml:space="preserve">youngcw. (2025, December 20). </w:t>
+      </w:r>
+      <w:r>
+        <w:rPr>
+          <w:i/>
+          <w:iCs/>
+        </w:rPr>
         <w:t>Roadmap for 2026</w:t>
       </w:r>
       <w:r>
-        <w:t>. Actual Budget. https://actualbudget.org/blog/roadmap-for-2026/</w:t>
-      </w:r>
+        <w:t xml:space="preserve">. Actual Budget. </w:t>
+      </w:r>
+      <w:hyperlink r:id="rId51" w:history="1">
+        <w:r>
+          <w:rPr>
+            <w:rStyle w:val="Hyperlink"/>
+          </w:rPr>
+          <w:t>https://actualbudget.org/blog/roadmap-for-2026/</w:t>
+        </w:r>
+      </w:hyperlink>
     </w:p>
     <w:p>
       <w:pPr>
@@ -8743,12 +9259,12 @@
       </w:pPr>
     </w:p>
     <w:sectPr>
-      <w:headerReference w:type="even" r:id="rId20"/>
-      <w:headerReference w:type="default" r:id="rId21"/>
-      <w:footerReference w:type="even" r:id="rId22"/>
-      <w:footerReference w:type="default" r:id="rId23"/>
-      <w:headerReference w:type="first" r:id="rId24"/>
-      <w:footerReference w:type="first" r:id="rId25"/>
+      <w:headerReference w:type="even" r:id="rId52"/>
+      <w:headerReference w:type="default" r:id="rId53"/>
+      <w:footerReference w:type="even" r:id="rId54"/>
+      <w:footerReference w:type="default" r:id="rId55"/>
+      <w:headerReference w:type="first" r:id="rId56"/>
+      <w:footerReference w:type="first" r:id="rId57"/>
       <w:pgSz w:w="11906" w:h="16838"/>
       <w:pgMar w:top="1440" w:right="1440" w:bottom="1440" w:left="1440" w:header="708" w:footer="708" w:gutter="0"/>
       <w:pgNumType w:start="1"/>
@@ -8791,7 +9307,15 @@
       <w:pStyle w:val="Footer"/>
     </w:pPr>
     <w:r>
-      <w:t>Version 1.2 UCTI AssCv 2007-10-23</w:t>
+      <w:t xml:space="preserve">Version 1.2 UCTI </w:t>
+    </w:r>
+    <w:proofErr w:type="spellStart"/>
+    <w:r>
+      <w:t>AssCv</w:t>
+    </w:r>
+    <w:proofErr w:type="spellEnd"/>
+    <w:r>
+      <w:t xml:space="preserve"> 2007-10-23</w:t>
     </w:r>
   </w:p>
 </w:ftr>
@@ -9281,6 +9805,30 @@
     </w:lvl>
   </w:abstractNum>
   <w:abstractNum w:abstractNumId="2" w15:restartNumberingAfterBreak="0">
+    <w:nsid w:val="44C91F01"/>
+    <w:multiLevelType w:val="singleLevel"/>
+    <w:tmpl w:val="607627D4"/>
+    <w:name w:val="RefNumbers"/>
+    <w:lvl w:ilvl="0">
+      <w:start w:val="1"/>
+      <w:numFmt w:val="decimal"/>
+      <w:lvlText w:val="%1."/>
+      <w:lvlJc w:val="left"/>
+      <w:pPr>
+        <w:tabs>
+          <w:tab w:val="num" w:pos="720"/>
+        </w:tabs>
+        <w:ind w:left="720" w:hanging="720"/>
+      </w:pPr>
+      <w:rPr>
+        <w:rFonts w:ascii="Times New Roman" w:hAnsi="Times New Roman" w:cs="Times New Roman"/>
+        <w:b w:val="0"/>
+        <w:i w:val="0"/>
+        <w:sz w:val="24"/>
+      </w:rPr>
+    </w:lvl>
+  </w:abstractNum>
+  <w:abstractNum w:abstractNumId="3" w15:restartNumberingAfterBreak="0">
     <w:nsid w:val="7CE06A69"/>
     <w:multiLevelType w:val="multilevel"/>
     <w:tmpl w:val="081EB290"/>
@@ -9390,6 +9938,9 @@
     <w:abstractNumId w:val="0"/>
   </w:num>
   <w:num w:numId="3" w16cid:durableId="1996765505">
+    <w:abstractNumId w:val="3"/>
+  </w:num>
+  <w:num w:numId="4" w16cid:durableId="659387958">
     <w:abstractNumId w:val="2"/>
   </w:num>
 </w:numbering>
@@ -10606,6 +11157,18 @@
     <w:unhideWhenUsed/>
     <w:rsid w:val="00CA2E77"/>
   </w:style>
+  <w:style w:type="character" w:styleId="UnresolvedMention">
+    <w:name w:val="Unresolved Mention"/>
+    <w:basedOn w:val="DefaultParagraphFont"/>
+    <w:uiPriority w:val="99"/>
+    <w:semiHidden/>
+    <w:unhideWhenUsed/>
+    <w:rsid w:val="00EF0A9F"/>
+    <w:rPr>
+      <w:color w:val="605E5C"/>
+      <w:shd w:val="clear" w:color="auto" w:fill="E1DFDD"/>
+    </w:rPr>
+  </w:style>
 </w:styles>
 </file>
 

</xml_diff>

<commit_message>
Apply Table 3.1 header style to all tables in Word report
Co-Authored-By: Claude Opus 5.5 <noreply@anthropic.com>
</commit_message>
<xml_diff>
--- a/report/assignment-1/Assignment-1-Report.docx
+++ b/report/assignment-1/Assignment-1-Report.docx
@@ -2974,8 +2974,8 @@
         <w:tblLook w:val="0020" w:firstRow="1" w:lastRow="0" w:firstColumn="0" w:lastColumn="0" w:noHBand="0" w:noVBand="0"/>
       </w:tblPr>
       <w:tblGrid>
-        <w:gridCol w:w="4508"/>
-        <w:gridCol w:w="4508"/>
+        <w:gridCol w:w="3114"/>
+        <w:gridCol w:w="5902"/>
       </w:tblGrid>
       <w:tr>
         <w:trPr>
@@ -2985,16 +2985,18 @@
         </w:trPr>
         <w:tc>
           <w:tcPr>
-            <w:tcW w:w="2500" w:type="pct"/>
+            <w:tcW w:w="1727" w:type="pct"/>
             <w:tcBorders>
               <w:bottom w:val="none" w:sz="0" w:space="0" w:color="auto"/>
             </w:tcBorders>
-          </w:tcPr>
-          <w:p>
-            <w:pPr>
-              <w:pStyle w:val="Compact"/>
-              <w:spacing w:before="40" w:after="40"/>
-              <w:jc w:val="left"/>
+            <w:shd w:val="clear" w:color="auto" w:fill="D9D9D9" w:themeFill="background1" w:themeFillShade="D9"/>
+            <w:vAlign w:val="center"/>
+          </w:tcPr>
+          <w:p>
+            <w:pPr>
+              <w:pStyle w:val="Compact"/>
+              <w:spacing w:before="40" w:after="40"/>
+              <w:jc w:val="center"/>
               <w:rPr>
                 <w:b/>
               </w:rPr>
@@ -3009,16 +3011,18 @@
         </w:tc>
         <w:tc>
           <w:tcPr>
-            <w:tcW w:w="2500" w:type="pct"/>
+            <w:tcW w:w="3273" w:type="pct"/>
             <w:tcBorders>
               <w:bottom w:val="none" w:sz="0" w:space="0" w:color="auto"/>
             </w:tcBorders>
-          </w:tcPr>
-          <w:p>
-            <w:pPr>
-              <w:pStyle w:val="Compact"/>
-              <w:spacing w:before="40" w:after="40"/>
-              <w:jc w:val="left"/>
+            <w:shd w:val="clear" w:color="auto" w:fill="D9D9D9" w:themeFill="background1" w:themeFillShade="D9"/>
+            <w:vAlign w:val="center"/>
+          </w:tcPr>
+          <w:p>
+            <w:pPr>
+              <w:pStyle w:val="Compact"/>
+              <w:spacing w:before="40" w:after="40"/>
+              <w:jc w:val="center"/>
               <w:rPr>
                 <w:b/>
               </w:rPr>
@@ -3038,7 +3042,7 @@
         </w:trPr>
         <w:tc>
           <w:tcPr>
-            <w:tcW w:w="2500" w:type="pct"/>
+            <w:tcW w:w="1727" w:type="pct"/>
           </w:tcPr>
           <w:p>
             <w:pPr>
@@ -3053,7 +3057,7 @@
         </w:tc>
         <w:tc>
           <w:tcPr>
-            <w:tcW w:w="2500" w:type="pct"/>
+            <w:tcW w:w="3273" w:type="pct"/>
           </w:tcPr>
           <w:p>
             <w:pPr>
@@ -3073,7 +3077,7 @@
         </w:trPr>
         <w:tc>
           <w:tcPr>
-            <w:tcW w:w="2500" w:type="pct"/>
+            <w:tcW w:w="1727" w:type="pct"/>
           </w:tcPr>
           <w:p>
             <w:pPr>
@@ -3088,7 +3092,7 @@
         </w:tc>
         <w:tc>
           <w:tcPr>
-            <w:tcW w:w="2500" w:type="pct"/>
+            <w:tcW w:w="3273" w:type="pct"/>
           </w:tcPr>
           <w:p>
             <w:pPr>
@@ -3108,7 +3112,7 @@
         </w:trPr>
         <w:tc>
           <w:tcPr>
-            <w:tcW w:w="2500" w:type="pct"/>
+            <w:tcW w:w="1727" w:type="pct"/>
           </w:tcPr>
           <w:p>
             <w:pPr>
@@ -3123,7 +3127,7 @@
         </w:tc>
         <w:tc>
           <w:tcPr>
-            <w:tcW w:w="2500" w:type="pct"/>
+            <w:tcW w:w="3273" w:type="pct"/>
           </w:tcPr>
           <w:p>
             <w:pPr>
@@ -3143,7 +3147,7 @@
         </w:trPr>
         <w:tc>
           <w:tcPr>
-            <w:tcW w:w="2500" w:type="pct"/>
+            <w:tcW w:w="1727" w:type="pct"/>
           </w:tcPr>
           <w:p>
             <w:pPr>
@@ -3158,7 +3162,7 @@
         </w:tc>
         <w:tc>
           <w:tcPr>
-            <w:tcW w:w="2500" w:type="pct"/>
+            <w:tcW w:w="3273" w:type="pct"/>
           </w:tcPr>
           <w:p>
             <w:pPr>
@@ -3178,7 +3182,7 @@
         </w:trPr>
         <w:tc>
           <w:tcPr>
-            <w:tcW w:w="2500" w:type="pct"/>
+            <w:tcW w:w="1727" w:type="pct"/>
           </w:tcPr>
           <w:p>
             <w:pPr>
@@ -3194,7 +3198,7 @@
         </w:tc>
         <w:tc>
           <w:tcPr>
-            <w:tcW w:w="2500" w:type="pct"/>
+            <w:tcW w:w="3273" w:type="pct"/>
           </w:tcPr>
           <w:p>
             <w:pPr>
@@ -3864,39 +3868,7 @@
         <w:t>Reliability:</w:t>
       </w:r>
       <w:r>
-        <w:t xml:space="preserve"> There is no test coverage measurement. Test coverage would not prove that the code is correct, but it would at least show what is untested. And reliability defects still reach users, like a sync defect that stopped some budgets from </w:t>
-      </w:r>
-      <w:proofErr w:type="gramStart"/>
-      <w:r>
-        <w:t>opening</w:t>
-      </w:r>
-      <w:proofErr w:type="gramEnd"/>
-      <w:r>
-        <w:t xml:space="preserve"> and it's stayed in released versions for years (Brown, 2026). Although Actual's testing checklist asks for "appropriate test coverage" (Actual Budget, n.d</w:t>
-      </w:r>
-      <w:proofErr w:type="gramStart"/>
-      <w:r>
-        <w:t>.-</w:t>
-      </w:r>
-      <w:proofErr w:type="gramEnd"/>
-      <w:r>
-        <w:t xml:space="preserve">i, Testing Checklist section), there's no coverage report found in the repository, and sync-server tests have coverage switched off (Actual Budget, 2026a). Therefore, nobody can tell how much of the sync and migration code is </w:t>
-      </w:r>
-      <w:proofErr w:type="gramStart"/>
-      <w:r>
-        <w:t>actually tested</w:t>
-      </w:r>
-      <w:proofErr w:type="gramEnd"/>
-      <w:r>
-        <w:t xml:space="preserve"> and </w:t>
-      </w:r>
-      <w:proofErr w:type="gramStart"/>
-      <w:r>
-        <w:t>actually safe</w:t>
-      </w:r>
-      <w:proofErr w:type="gramEnd"/>
-      <w:r>
-        <w:t>.</w:t>
+        <w:t xml:space="preserve"> There is no test coverage measurement. Test coverage would not prove that the code is correct, but it would at least show what is untested. And reliability defects still reach users, like a sync defect that stopped some budgets from opening and it's stayed in released versions for years (Brown, 2026). Although Actual's testing checklist asks for "appropriate test coverage" (Actual Budget, n.d.-i, Testing Checklist section), there's no coverage report found in the repository, and sync-server tests have coverage switched off (Actual Budget, 2026a). Therefore, nobody can tell how much of the sync and migration code is actually tested and actually safe.</w:t>
       </w:r>
     </w:p>
     <w:p>
@@ -3926,15 +3898,7 @@
         <w:t>Process:</w:t>
       </w:r>
       <w:r>
-        <w:t xml:space="preserve"> No written QA plan. Quality rules are spread across documentation, templates and CI files, so there's </w:t>
-      </w:r>
-      <w:proofErr w:type="gramStart"/>
-      <w:r>
-        <w:t>no</w:t>
-      </w:r>
-      <w:proofErr w:type="gramEnd"/>
-      <w:r>
-        <w:t xml:space="preserve"> a single place that states what must be checked before work moves on.</w:t>
+        <w:t xml:space="preserve"> No written QA plan. Quality rules are spread across documentation, templates and CI files, so there's no a single place that states what must be checked before work moves on.</w:t>
       </w:r>
     </w:p>
     <w:p>
@@ -3990,12 +3954,14 @@
             <w:tcBorders>
               <w:bottom w:val="none" w:sz="0" w:space="0" w:color="auto"/>
             </w:tcBorders>
-          </w:tcPr>
-          <w:p>
-            <w:pPr>
-              <w:pStyle w:val="Compact"/>
-              <w:spacing w:before="40" w:after="40"/>
-              <w:jc w:val="left"/>
+            <w:shd w:val="clear" w:color="auto" w:fill="D9D9D9" w:themeFill="background1" w:themeFillShade="D9"/>
+            <w:vAlign w:val="center"/>
+          </w:tcPr>
+          <w:p>
+            <w:pPr>
+              <w:pStyle w:val="Compact"/>
+              <w:spacing w:before="40" w:after="40"/>
+              <w:jc w:val="center"/>
               <w:rPr>
                 <w:b/>
               </w:rPr>
@@ -4014,12 +3980,14 @@
             <w:tcBorders>
               <w:bottom w:val="none" w:sz="0" w:space="0" w:color="auto"/>
             </w:tcBorders>
-          </w:tcPr>
-          <w:p>
-            <w:pPr>
-              <w:pStyle w:val="Compact"/>
-              <w:spacing w:before="40" w:after="40"/>
-              <w:jc w:val="left"/>
+            <w:shd w:val="clear" w:color="auto" w:fill="D9D9D9" w:themeFill="background1" w:themeFillShade="D9"/>
+            <w:vAlign w:val="center"/>
+          </w:tcPr>
+          <w:p>
+            <w:pPr>
+              <w:pStyle w:val="Compact"/>
+              <w:spacing w:before="40" w:after="40"/>
+              <w:jc w:val="center"/>
               <w:rPr>
                 <w:b/>
               </w:rPr>
@@ -4038,12 +4006,14 @@
             <w:tcBorders>
               <w:bottom w:val="none" w:sz="0" w:space="0" w:color="auto"/>
             </w:tcBorders>
-          </w:tcPr>
-          <w:p>
-            <w:pPr>
-              <w:pStyle w:val="Compact"/>
-              <w:spacing w:before="40" w:after="40"/>
-              <w:jc w:val="left"/>
+            <w:shd w:val="clear" w:color="auto" w:fill="D9D9D9" w:themeFill="background1" w:themeFillShade="D9"/>
+            <w:vAlign w:val="center"/>
+          </w:tcPr>
+          <w:p>
+            <w:pPr>
+              <w:pStyle w:val="Compact"/>
+              <w:spacing w:before="40" w:after="40"/>
+              <w:jc w:val="center"/>
               <w:rPr>
                 <w:b/>
               </w:rPr>
@@ -4444,12 +4414,14 @@
             <w:tcBorders>
               <w:bottom w:val="none" w:sz="0" w:space="0" w:color="auto"/>
             </w:tcBorders>
-          </w:tcPr>
-          <w:p>
-            <w:pPr>
-              <w:pStyle w:val="Compact"/>
-              <w:spacing w:before="40" w:after="40"/>
-              <w:jc w:val="left"/>
+            <w:shd w:val="clear" w:color="auto" w:fill="D9D9D9" w:themeFill="background1" w:themeFillShade="D9"/>
+            <w:vAlign w:val="center"/>
+          </w:tcPr>
+          <w:p>
+            <w:pPr>
+              <w:pStyle w:val="Compact"/>
+              <w:spacing w:before="40" w:after="40"/>
+              <w:jc w:val="center"/>
               <w:rPr>
                 <w:b/>
               </w:rPr>
@@ -4468,12 +4440,14 @@
             <w:tcBorders>
               <w:bottom w:val="none" w:sz="0" w:space="0" w:color="auto"/>
             </w:tcBorders>
-          </w:tcPr>
-          <w:p>
-            <w:pPr>
-              <w:pStyle w:val="Compact"/>
-              <w:spacing w:before="40" w:after="40"/>
-              <w:jc w:val="left"/>
+            <w:shd w:val="clear" w:color="auto" w:fill="D9D9D9" w:themeFill="background1" w:themeFillShade="D9"/>
+            <w:vAlign w:val="center"/>
+          </w:tcPr>
+          <w:p>
+            <w:pPr>
+              <w:pStyle w:val="Compact"/>
+              <w:spacing w:before="40" w:after="40"/>
+              <w:jc w:val="center"/>
               <w:rPr>
                 <w:b/>
               </w:rPr>
@@ -4492,12 +4466,14 @@
             <w:tcBorders>
               <w:bottom w:val="none" w:sz="0" w:space="0" w:color="auto"/>
             </w:tcBorders>
-          </w:tcPr>
-          <w:p>
-            <w:pPr>
-              <w:pStyle w:val="Compact"/>
-              <w:spacing w:before="40" w:after="40"/>
-              <w:jc w:val="left"/>
+            <w:shd w:val="clear" w:color="auto" w:fill="D9D9D9" w:themeFill="background1" w:themeFillShade="D9"/>
+            <w:vAlign w:val="center"/>
+          </w:tcPr>
+          <w:p>
+            <w:pPr>
+              <w:pStyle w:val="Compact"/>
+              <w:spacing w:before="40" w:after="40"/>
+              <w:jc w:val="center"/>
               <w:rPr>
                 <w:b/>
               </w:rPr>
@@ -4516,12 +4492,14 @@
             <w:tcBorders>
               <w:bottom w:val="none" w:sz="0" w:space="0" w:color="auto"/>
             </w:tcBorders>
-          </w:tcPr>
-          <w:p>
-            <w:pPr>
-              <w:pStyle w:val="Compact"/>
-              <w:spacing w:before="40" w:after="40"/>
-              <w:jc w:val="left"/>
+            <w:shd w:val="clear" w:color="auto" w:fill="D9D9D9" w:themeFill="background1" w:themeFillShade="D9"/>
+            <w:vAlign w:val="center"/>
+          </w:tcPr>
+          <w:p>
+            <w:pPr>
+              <w:pStyle w:val="Compact"/>
+              <w:spacing w:before="40" w:after="40"/>
+              <w:jc w:val="center"/>
               <w:rPr>
                 <w:b/>
               </w:rPr>
@@ -5067,12 +5045,14 @@
             <w:tcBorders>
               <w:bottom w:val="none" w:sz="0" w:space="0" w:color="auto"/>
             </w:tcBorders>
-          </w:tcPr>
-          <w:p>
-            <w:pPr>
-              <w:pStyle w:val="Compact"/>
-              <w:spacing w:before="40" w:after="40"/>
-              <w:jc w:val="left"/>
+            <w:shd w:val="clear" w:color="auto" w:fill="D9D9D9" w:themeFill="background1" w:themeFillShade="D9"/>
+            <w:vAlign w:val="center"/>
+          </w:tcPr>
+          <w:p>
+            <w:pPr>
+              <w:pStyle w:val="Compact"/>
+              <w:spacing w:before="40" w:after="40"/>
+              <w:jc w:val="center"/>
               <w:rPr>
                 <w:b/>
               </w:rPr>
@@ -5091,12 +5071,14 @@
             <w:tcBorders>
               <w:bottom w:val="none" w:sz="0" w:space="0" w:color="auto"/>
             </w:tcBorders>
-          </w:tcPr>
-          <w:p>
-            <w:pPr>
-              <w:pStyle w:val="Compact"/>
-              <w:spacing w:before="40" w:after="40"/>
-              <w:jc w:val="left"/>
+            <w:shd w:val="clear" w:color="auto" w:fill="D9D9D9" w:themeFill="background1" w:themeFillShade="D9"/>
+            <w:vAlign w:val="center"/>
+          </w:tcPr>
+          <w:p>
+            <w:pPr>
+              <w:pStyle w:val="Compact"/>
+              <w:spacing w:before="40" w:after="40"/>
+              <w:jc w:val="center"/>
               <w:rPr>
                 <w:b/>
               </w:rPr>
@@ -5115,12 +5097,14 @@
             <w:tcBorders>
               <w:bottom w:val="none" w:sz="0" w:space="0" w:color="auto"/>
             </w:tcBorders>
-          </w:tcPr>
-          <w:p>
-            <w:pPr>
-              <w:pStyle w:val="Compact"/>
-              <w:spacing w:before="40" w:after="40"/>
-              <w:jc w:val="left"/>
+            <w:shd w:val="clear" w:color="auto" w:fill="D9D9D9" w:themeFill="background1" w:themeFillShade="D9"/>
+            <w:vAlign w:val="center"/>
+          </w:tcPr>
+          <w:p>
+            <w:pPr>
+              <w:pStyle w:val="Compact"/>
+              <w:spacing w:before="40" w:after="40"/>
+              <w:jc w:val="center"/>
               <w:rPr>
                 <w:b/>
               </w:rPr>
@@ -5139,12 +5123,14 @@
             <w:tcBorders>
               <w:bottom w:val="none" w:sz="0" w:space="0" w:color="auto"/>
             </w:tcBorders>
-          </w:tcPr>
-          <w:p>
-            <w:pPr>
-              <w:pStyle w:val="Compact"/>
-              <w:spacing w:before="40" w:after="40"/>
-              <w:jc w:val="left"/>
+            <w:shd w:val="clear" w:color="auto" w:fill="D9D9D9" w:themeFill="background1" w:themeFillShade="D9"/>
+            <w:vAlign w:val="center"/>
+          </w:tcPr>
+          <w:p>
+            <w:pPr>
+              <w:pStyle w:val="Compact"/>
+              <w:spacing w:before="40" w:after="40"/>
+              <w:jc w:val="center"/>
               <w:rPr>
                 <w:b/>
               </w:rPr>
@@ -5163,12 +5149,14 @@
             <w:tcBorders>
               <w:bottom w:val="none" w:sz="0" w:space="0" w:color="auto"/>
             </w:tcBorders>
-          </w:tcPr>
-          <w:p>
-            <w:pPr>
-              <w:pStyle w:val="Compact"/>
-              <w:spacing w:before="40" w:after="40"/>
-              <w:jc w:val="left"/>
+            <w:shd w:val="clear" w:color="auto" w:fill="D9D9D9" w:themeFill="background1" w:themeFillShade="D9"/>
+            <w:vAlign w:val="center"/>
+          </w:tcPr>
+          <w:p>
+            <w:pPr>
+              <w:pStyle w:val="Compact"/>
+              <w:spacing w:before="40" w:after="40"/>
+              <w:jc w:val="center"/>
               <w:rPr>
                 <w:b/>
               </w:rPr>
@@ -5857,12 +5845,14 @@
             <w:tcBorders>
               <w:bottom w:val="none" w:sz="0" w:space="0" w:color="auto"/>
             </w:tcBorders>
-          </w:tcPr>
-          <w:p>
-            <w:pPr>
-              <w:pStyle w:val="Compact"/>
-              <w:spacing w:before="40" w:after="40"/>
-              <w:jc w:val="left"/>
+            <w:shd w:val="clear" w:color="auto" w:fill="D9D9D9" w:themeFill="background1" w:themeFillShade="D9"/>
+            <w:vAlign w:val="center"/>
+          </w:tcPr>
+          <w:p>
+            <w:pPr>
+              <w:pStyle w:val="Compact"/>
+              <w:spacing w:before="40" w:after="40"/>
+              <w:jc w:val="center"/>
               <w:rPr>
                 <w:b/>
               </w:rPr>
@@ -5881,12 +5871,14 @@
             <w:tcBorders>
               <w:bottom w:val="none" w:sz="0" w:space="0" w:color="auto"/>
             </w:tcBorders>
-          </w:tcPr>
-          <w:p>
-            <w:pPr>
-              <w:pStyle w:val="Compact"/>
-              <w:spacing w:before="40" w:after="40"/>
-              <w:jc w:val="left"/>
+            <w:shd w:val="clear" w:color="auto" w:fill="D9D9D9" w:themeFill="background1" w:themeFillShade="D9"/>
+            <w:vAlign w:val="center"/>
+          </w:tcPr>
+          <w:p>
+            <w:pPr>
+              <w:pStyle w:val="Compact"/>
+              <w:spacing w:before="40" w:after="40"/>
+              <w:jc w:val="center"/>
               <w:rPr>
                 <w:b/>
               </w:rPr>
@@ -5905,12 +5897,14 @@
             <w:tcBorders>
               <w:bottom w:val="none" w:sz="0" w:space="0" w:color="auto"/>
             </w:tcBorders>
-          </w:tcPr>
-          <w:p>
-            <w:pPr>
-              <w:pStyle w:val="Compact"/>
-              <w:spacing w:before="40" w:after="40"/>
-              <w:jc w:val="left"/>
+            <w:shd w:val="clear" w:color="auto" w:fill="D9D9D9" w:themeFill="background1" w:themeFillShade="D9"/>
+            <w:vAlign w:val="center"/>
+          </w:tcPr>
+          <w:p>
+            <w:pPr>
+              <w:pStyle w:val="Compact"/>
+              <w:spacing w:before="40" w:after="40"/>
+              <w:jc w:val="center"/>
               <w:rPr>
                 <w:b/>
               </w:rPr>
@@ -5929,12 +5923,14 @@
             <w:tcBorders>
               <w:bottom w:val="none" w:sz="0" w:space="0" w:color="auto"/>
             </w:tcBorders>
-          </w:tcPr>
-          <w:p>
-            <w:pPr>
-              <w:pStyle w:val="Compact"/>
-              <w:spacing w:before="40" w:after="40"/>
-              <w:jc w:val="left"/>
+            <w:shd w:val="clear" w:color="auto" w:fill="D9D9D9" w:themeFill="background1" w:themeFillShade="D9"/>
+            <w:vAlign w:val="center"/>
+          </w:tcPr>
+          <w:p>
+            <w:pPr>
+              <w:pStyle w:val="Compact"/>
+              <w:spacing w:before="40" w:after="40"/>
+              <w:jc w:val="center"/>
               <w:rPr>
                 <w:b/>
               </w:rPr>
@@ -6794,7 +6790,6 @@
       <w:r>
         <w:t xml:space="preserve">Actual Budget. (2026a). </w:t>
       </w:r>
-      <w:proofErr w:type="gramStart"/>
       <w:r>
         <w:rPr>
           <w:i/>
@@ -6802,7 +6797,6 @@
         </w:rPr>
         <w:t>Actual</w:t>
       </w:r>
-      <w:proofErr w:type="gramEnd"/>
       <w:r>
         <w:t xml:space="preserve"> [Computer software]. GitHub. </w:t>
       </w:r>
@@ -7022,22 +7016,10 @@
           <w:i/>
           <w:iCs/>
         </w:rPr>
-        <w:t xml:space="preserve">[AI] fix(sync): receive only the latest timestamp to stop counter </w:t>
-      </w:r>
-      <w:proofErr w:type="gramStart"/>
-      <w:r>
-        <w:rPr>
-          <w:i/>
-          <w:iCs/>
-        </w:rPr>
-        <w:t>overflow</w:t>
-      </w:r>
-      <w:r>
-        <w:t xml:space="preserve"> (#</w:t>
-      </w:r>
-      <w:proofErr w:type="gramEnd"/>
-      <w:r>
-        <w:t xml:space="preserve">8706) [Commit]. GitHub. </w:t>
+        <w:t>[AI] fix(sync): receive only the latest timestamp to stop counter overflow</w:t>
+      </w:r>
+      <w:r>
+        <w:t xml:space="preserve"> (#8706) [Commit]. GitHub. </w:t>
       </w:r>
       <w:hyperlink r:id="rId38" w:history="1">
         <w:r>
@@ -7189,23 +7171,7 @@
           <w:i/>
           <w:iCs/>
         </w:rPr>
-        <w:t>Systems and software engineering — Systems and software Quality Requirements and Evaluation (</w:t>
-      </w:r>
-      <w:proofErr w:type="gramStart"/>
-      <w:r>
-        <w:rPr>
-          <w:i/>
-          <w:iCs/>
-        </w:rPr>
-        <w:t>SQuaRE) —</w:t>
-      </w:r>
-      <w:proofErr w:type="gramEnd"/>
-      <w:r>
-        <w:rPr>
-          <w:i/>
-          <w:iCs/>
-        </w:rPr>
-        <w:t xml:space="preserve"> Product quality model</w:t>
+        <w:t>Systems and software engineering — Systems and software Quality Requirements and Evaluation (SQuaRE) — Product quality model</w:t>
       </w:r>
       <w:r>
         <w:t xml:space="preserve"> (ISO/IEC Standard No. 25010:2023). </w:t>
@@ -7259,13 +7225,8 @@
         </w:numPr>
         <w:jc w:val="left"/>
       </w:pPr>
-      <w:proofErr w:type="gramStart"/>
-      <w:r>
-        <w:t>Open Source</w:t>
-      </w:r>
-      <w:proofErr w:type="gramEnd"/>
-      <w:r>
-        <w:t xml:space="preserve"> Technology Improvement Fund. (2026, January 30). </w:t>
+      <w:r>
+        <w:t xml:space="preserve">Open Source Technology Improvement Fund. (2026, January 30). </w:t>
       </w:r>
       <w:r>
         <w:rPr>
@@ -7329,37 +7290,12 @@
       <w:r>
         <w:t xml:space="preserve">Salkever, A. (2023). </w:t>
       </w:r>
-      <w:proofErr w:type="gramStart"/>
       <w:r>
         <w:rPr>
           <w:i/>
           <w:iCs/>
         </w:rPr>
-        <w:t>Open source</w:t>
-      </w:r>
-      <w:proofErr w:type="gramEnd"/>
-      <w:r>
-        <w:rPr>
-          <w:i/>
-          <w:iCs/>
-        </w:rPr>
-        <w:t xml:space="preserve"> maintainers: Exploring the people, practices, and constraints facing the world's most critical </w:t>
-      </w:r>
-      <w:proofErr w:type="gramStart"/>
-      <w:r>
-        <w:rPr>
-          <w:i/>
-          <w:iCs/>
-        </w:rPr>
-        <w:t>open source</w:t>
-      </w:r>
-      <w:proofErr w:type="gramEnd"/>
-      <w:r>
-        <w:rPr>
-          <w:i/>
-          <w:iCs/>
-        </w:rPr>
-        <w:t xml:space="preserve"> software projects</w:t>
+        <w:t>Open source maintainers: Exploring the people, practices, and constraints facing the world's most critical open source software projects</w:t>
       </w:r>
       <w:r>
         <w:t xml:space="preserve">. The Linux Foundation. </w:t>
@@ -7417,37 +7353,12 @@
       <w:r>
         <w:t xml:space="preserve">Stacoviak, A., &amp; Santo, J. (Hosts). (2022, July 1). </w:t>
       </w:r>
-      <w:proofErr w:type="gramStart"/>
       <w:r>
         <w:rPr>
           <w:i/>
           <w:iCs/>
         </w:rPr>
-        <w:t>Actual</w:t>
-      </w:r>
-      <w:proofErr w:type="gramEnd"/>
-      <w:r>
-        <w:rPr>
-          <w:i/>
-          <w:iCs/>
-        </w:rPr>
-        <w:t xml:space="preserve">(ly) </w:t>
-      </w:r>
-      <w:proofErr w:type="gramStart"/>
-      <w:r>
-        <w:rPr>
-          <w:i/>
-          <w:iCs/>
-        </w:rPr>
-        <w:t>opening up</w:t>
-      </w:r>
-      <w:proofErr w:type="gramEnd"/>
-      <w:r>
-        <w:rPr>
-          <w:i/>
-          <w:iCs/>
-        </w:rPr>
-        <w:t xml:space="preserve"> with James Long</w:t>
+        <w:t>Actual(ly) opening up with James Long</w:t>
       </w:r>
       <w:r>
         <w:t xml:space="preserve"> (No. 495) [Audio podcast episode]. In </w:t>
@@ -7620,12 +7531,14 @@
             <w:tcBorders>
               <w:bottom w:val="none" w:sz="0" w:space="0" w:color="auto"/>
             </w:tcBorders>
-          </w:tcPr>
-          <w:p>
-            <w:pPr>
-              <w:pStyle w:val="Compact"/>
-              <w:spacing w:before="40" w:after="40"/>
-              <w:jc w:val="left"/>
+            <w:shd w:val="clear" w:color="auto" w:fill="D9D9D9" w:themeFill="background1" w:themeFillShade="D9"/>
+            <w:vAlign w:val="center"/>
+          </w:tcPr>
+          <w:p>
+            <w:pPr>
+              <w:pStyle w:val="Compact"/>
+              <w:spacing w:before="40" w:after="40"/>
+              <w:jc w:val="center"/>
               <w:rPr>
                 <w:b/>
               </w:rPr>
@@ -7644,12 +7557,14 @@
             <w:tcBorders>
               <w:bottom w:val="none" w:sz="0" w:space="0" w:color="auto"/>
             </w:tcBorders>
-          </w:tcPr>
-          <w:p>
-            <w:pPr>
-              <w:pStyle w:val="Compact"/>
-              <w:spacing w:before="40" w:after="40"/>
-              <w:jc w:val="left"/>
+            <w:shd w:val="clear" w:color="auto" w:fill="D9D9D9" w:themeFill="background1" w:themeFillShade="D9"/>
+            <w:vAlign w:val="center"/>
+          </w:tcPr>
+          <w:p>
+            <w:pPr>
+              <w:pStyle w:val="Compact"/>
+              <w:spacing w:before="40" w:after="40"/>
+              <w:jc w:val="center"/>
               <w:rPr>
                 <w:b/>
               </w:rPr>
@@ -7668,12 +7583,14 @@
             <w:tcBorders>
               <w:bottom w:val="none" w:sz="0" w:space="0" w:color="auto"/>
             </w:tcBorders>
-          </w:tcPr>
-          <w:p>
-            <w:pPr>
-              <w:pStyle w:val="Compact"/>
-              <w:spacing w:before="40" w:after="40"/>
-              <w:jc w:val="left"/>
+            <w:shd w:val="clear" w:color="auto" w:fill="D9D9D9" w:themeFill="background1" w:themeFillShade="D9"/>
+            <w:vAlign w:val="center"/>
+          </w:tcPr>
+          <w:p>
+            <w:pPr>
+              <w:pStyle w:val="Compact"/>
+              <w:spacing w:before="40" w:after="40"/>
+              <w:jc w:val="center"/>
               <w:rPr>
                 <w:b/>
               </w:rPr>
@@ -8161,12 +8078,14 @@
             <w:tcBorders>
               <w:bottom w:val="none" w:sz="0" w:space="0" w:color="auto"/>
             </w:tcBorders>
-          </w:tcPr>
-          <w:p>
-            <w:pPr>
-              <w:pStyle w:val="Compact"/>
-              <w:spacing w:before="40" w:after="40"/>
-              <w:jc w:val="left"/>
+            <w:shd w:val="clear" w:color="auto" w:fill="D9D9D9" w:themeFill="background1" w:themeFillShade="D9"/>
+            <w:vAlign w:val="center"/>
+          </w:tcPr>
+          <w:p>
+            <w:pPr>
+              <w:pStyle w:val="Compact"/>
+              <w:spacing w:before="40" w:after="40"/>
+              <w:jc w:val="center"/>
               <w:rPr>
                 <w:b/>
               </w:rPr>
@@ -8185,12 +8104,14 @@
             <w:tcBorders>
               <w:bottom w:val="none" w:sz="0" w:space="0" w:color="auto"/>
             </w:tcBorders>
-          </w:tcPr>
-          <w:p>
-            <w:pPr>
-              <w:pStyle w:val="Compact"/>
-              <w:spacing w:before="40" w:after="40"/>
-              <w:jc w:val="left"/>
+            <w:shd w:val="clear" w:color="auto" w:fill="D9D9D9" w:themeFill="background1" w:themeFillShade="D9"/>
+            <w:vAlign w:val="center"/>
+          </w:tcPr>
+          <w:p>
+            <w:pPr>
+              <w:pStyle w:val="Compact"/>
+              <w:spacing w:before="40" w:after="40"/>
+              <w:jc w:val="center"/>
               <w:rPr>
                 <w:b/>
               </w:rPr>
@@ -8209,12 +8130,14 @@
             <w:tcBorders>
               <w:bottom w:val="none" w:sz="0" w:space="0" w:color="auto"/>
             </w:tcBorders>
-          </w:tcPr>
-          <w:p>
-            <w:pPr>
-              <w:pStyle w:val="Compact"/>
-              <w:spacing w:before="40" w:after="40"/>
-              <w:jc w:val="left"/>
+            <w:shd w:val="clear" w:color="auto" w:fill="D9D9D9" w:themeFill="background1" w:themeFillShade="D9"/>
+            <w:vAlign w:val="center"/>
+          </w:tcPr>
+          <w:p>
+            <w:pPr>
+              <w:pStyle w:val="Compact"/>
+              <w:spacing w:before="40" w:after="40"/>
+              <w:jc w:val="center"/>
               <w:rPr>
                 <w:b/>
               </w:rPr>
@@ -8645,12 +8568,14 @@
             <w:tcBorders>
               <w:bottom w:val="none" w:sz="0" w:space="0" w:color="auto"/>
             </w:tcBorders>
-          </w:tcPr>
-          <w:p>
-            <w:pPr>
-              <w:pStyle w:val="Compact"/>
-              <w:spacing w:before="40" w:after="40"/>
-              <w:jc w:val="left"/>
+            <w:shd w:val="clear" w:color="auto" w:fill="D9D9D9" w:themeFill="background1" w:themeFillShade="D9"/>
+            <w:vAlign w:val="center"/>
+          </w:tcPr>
+          <w:p>
+            <w:pPr>
+              <w:pStyle w:val="Compact"/>
+              <w:spacing w:before="40" w:after="40"/>
+              <w:jc w:val="center"/>
               <w:rPr>
                 <w:b/>
               </w:rPr>
@@ -8669,12 +8594,14 @@
             <w:tcBorders>
               <w:bottom w:val="none" w:sz="0" w:space="0" w:color="auto"/>
             </w:tcBorders>
-          </w:tcPr>
-          <w:p>
-            <w:pPr>
-              <w:pStyle w:val="Compact"/>
-              <w:spacing w:before="40" w:after="40"/>
-              <w:jc w:val="left"/>
+            <w:shd w:val="clear" w:color="auto" w:fill="D9D9D9" w:themeFill="background1" w:themeFillShade="D9"/>
+            <w:vAlign w:val="center"/>
+          </w:tcPr>
+          <w:p>
+            <w:pPr>
+              <w:pStyle w:val="Compact"/>
+              <w:spacing w:before="40" w:after="40"/>
+              <w:jc w:val="center"/>
               <w:rPr>
                 <w:b/>
               </w:rPr>
@@ -8693,12 +8620,14 @@
             <w:tcBorders>
               <w:bottom w:val="none" w:sz="0" w:space="0" w:color="auto"/>
             </w:tcBorders>
-          </w:tcPr>
-          <w:p>
-            <w:pPr>
-              <w:pStyle w:val="Compact"/>
-              <w:spacing w:before="40" w:after="40"/>
-              <w:jc w:val="left"/>
+            <w:shd w:val="clear" w:color="auto" w:fill="D9D9D9" w:themeFill="background1" w:themeFillShade="D9"/>
+            <w:vAlign w:val="center"/>
+          </w:tcPr>
+          <w:p>
+            <w:pPr>
+              <w:pStyle w:val="Compact"/>
+              <w:spacing w:before="40" w:after="40"/>
+              <w:jc w:val="center"/>
               <w:rPr>
                 <w:b/>
               </w:rPr>
@@ -8717,12 +8646,14 @@
             <w:tcBorders>
               <w:bottom w:val="none" w:sz="0" w:space="0" w:color="auto"/>
             </w:tcBorders>
-          </w:tcPr>
-          <w:p>
-            <w:pPr>
-              <w:pStyle w:val="Compact"/>
-              <w:spacing w:before="40" w:after="40"/>
-              <w:jc w:val="left"/>
+            <w:shd w:val="clear" w:color="auto" w:fill="D9D9D9" w:themeFill="background1" w:themeFillShade="D9"/>
+            <w:vAlign w:val="center"/>
+          </w:tcPr>
+          <w:p>
+            <w:pPr>
+              <w:pStyle w:val="Compact"/>
+              <w:spacing w:before="40" w:after="40"/>
+              <w:jc w:val="center"/>
               <w:rPr>
                 <w:b/>
               </w:rPr>

</xml_diff>

<commit_message>
Close gap between list labels and descriptions in 3.2
Co-Authored-By: Claude Opus 5.5 <noreply@anthropic.com>
</commit_message>
<xml_diff>
--- a/report/assignment-1/Assignment-1-Report.docx
+++ b/report/assignment-1/Assignment-1-Report.docx
@@ -3769,13 +3769,132 @@
     <w:p>
       <w:pPr>
         <w:pStyle w:val="Compact"/>
+        <w:keepNext/>
         <w:numPr>
           <w:ilvl w:val="0"/>
           <w:numId w:val="2"/>
         </w:numPr>
-      </w:pPr>
-      <w:r>
-        <w:t>Security: Actual stores user's transactions, balances and bank connections, which is some of the most private data a person has. If that data leaks or is changed without any permission, the users could face fraud or lose control of their finances.</w:t>
+        <w:spacing w:after="0"/>
+      </w:pPr>
+      <w:r>
+        <w:t xml:space="preserve">Security: </w:t>
+      </w:r>
+    </w:p>
+    <w:p>
+      <w:pPr>
+        <w:pStyle w:val="Compact"/>
+        <w:ind w:left="720"/>
+      </w:pPr>
+      <w:r>
+        <w:t xml:space="preserve">Actual </w:t>
+      </w:r>
+      <w:proofErr w:type="gramStart"/>
+      <w:r>
+        <w:t>stores</w:t>
+      </w:r>
+      <w:proofErr w:type="gramEnd"/>
+      <w:r>
+        <w:t xml:space="preserve"> user's transactions, balances and bank connections, which </w:t>
+      </w:r>
+      <w:r>
+        <w:t>are</w:t>
+      </w:r>
+      <w:r>
+        <w:t xml:space="preserve"> some of the most private data a person has. If that data leaks or is changed without any permission, the users could face fraud or lose control of their finances.</w:t>
+      </w:r>
+    </w:p>
+    <w:p>
+      <w:pPr>
+        <w:pStyle w:val="Compact"/>
+        <w:keepNext/>
+        <w:numPr>
+          <w:ilvl w:val="0"/>
+          <w:numId w:val="2"/>
+        </w:numPr>
+        <w:spacing w:after="0"/>
+      </w:pPr>
+      <w:r>
+        <w:t xml:space="preserve">Reliability: </w:t>
+      </w:r>
+    </w:p>
+    <w:p>
+      <w:pPr>
+        <w:pStyle w:val="Compact"/>
+        <w:ind w:left="720"/>
+      </w:pPr>
+      <w:r>
+        <w:t>Users decide what to spend based on the balances Actual shows, so budget data must stay correct and in sync across devices, including after the app recovers from a failure. If it fails, users may stop trusting their numbers or be locked out of their own budget.</w:t>
+      </w:r>
+    </w:p>
+    <w:p>
+      <w:pPr>
+        <w:pStyle w:val="Compact"/>
+        <w:keepNext/>
+        <w:numPr>
+          <w:ilvl w:val="0"/>
+          <w:numId w:val="2"/>
+        </w:numPr>
+        <w:spacing w:after="0"/>
+      </w:pPr>
+      <w:r>
+        <w:t xml:space="preserve">Interaction capability: </w:t>
+      </w:r>
+    </w:p>
+    <w:p>
+      <w:pPr>
+        <w:pStyle w:val="Compact"/>
+        <w:ind w:left="720"/>
+      </w:pPr>
+      <w:r>
+        <w:t xml:space="preserve">Actual is used by normal people to manage their own money, so it must be </w:t>
+      </w:r>
+      <w:r>
+        <w:t>used</w:t>
+      </w:r>
+      <w:r>
+        <w:t xml:space="preserve"> by people with different abilities and help them understand envelope budgeting. Actual </w:t>
+      </w:r>
+      <w:r>
+        <w:lastRenderedPageBreak/>
+        <w:t>already targets WCAG 2.1 AA (Actual Budget, 2026a), so accessibility is already a stated requirement.</w:t>
+      </w:r>
+    </w:p>
+    <w:p>
+      <w:pPr>
+        <w:pStyle w:val="Heading2"/>
+      </w:pPr>
+      <w:bookmarkStart w:id="46" w:name="current-qa-practices-and-gaps"/>
+      <w:bookmarkStart w:id="47" w:name="_Toc244220721"/>
+      <w:bookmarkStart w:id="48" w:name="_Toc244221409"/>
+      <w:bookmarkEnd w:id="43"/>
+      <w:r>
+        <w:t>Current QA Practices and Gaps</w:t>
+      </w:r>
+      <w:bookmarkEnd w:id="47"/>
+      <w:bookmarkEnd w:id="48"/>
+    </w:p>
+    <w:p>
+      <w:pPr>
+        <w:pStyle w:val="FirstParagraph"/>
+      </w:pPr>
+      <w:r>
+        <w:t>Actual already runs substantial automated QA. Every pull request triggers linting, type checking, Vitest unit tests and a database migration check, Playwright end-to-end and visual regression tests run on pull requests or in the merge queue (Actual Budget, 2026a, n.d.-i).</w:t>
+      </w:r>
+    </w:p>
+    <w:p>
+      <w:pPr>
+        <w:pStyle w:val="BodyText"/>
+      </w:pPr>
+      <w:r>
+        <w:t>It also uses a semantic code analysis engine (CodeQL) to scan every pull requests and pushes (Actual Budget, 2026a). Moreover, releases will need approval from at least two other maintainers and do smoke tests (Actual Budget, n.d.-b). Actual's own security policy also asks for private vulnerability reporting and coordinated disclosure (Actual Budget, n.d.-g).</w:t>
+      </w:r>
+    </w:p>
+    <w:p>
+      <w:pPr>
+        <w:pStyle w:val="BodyText"/>
+      </w:pPr>
+      <w:r>
+        <w:t>There are also four gaps that are discovered or happened from the research:</w:t>
       </w:r>
     </w:p>
     <w:p>
@@ -3787,7 +3906,10 @@
         </w:numPr>
       </w:pPr>
       <w:r>
-        <w:t>Reliability: Users decide what to spend based on the balances Actual shows, so budget data must stay correct and in sync across devices, including after the app recovers from a failure. If it fails, users may stop trusting their numbers or be locked out of their own budget.</w:t>
+        <w:t>Security:</w:t>
+      </w:r>
+      <w:r>
+        <w:t xml:space="preserve"> No proactive check of access control before release. Three access-control flaws in the sync server feature were published in 2026 (Actual Budget, 2026b, 2026c, 2026d). The most critical one was about missing authentication on six of the SimpleFIN and Pluggy AI bank-sync endpoints, which the GoCardless endpoints had it (Actual Budget, 2026c). This shows inconsistent authentication across bank-sync providers, and the flaw was only found after release. The security policy also states no response time for reports (Actual Budget, n.d.-g).</w:t>
       </w:r>
     </w:p>
     <w:p>
@@ -3799,46 +3921,42 @@
         </w:numPr>
       </w:pPr>
       <w:r>
-        <w:t>Interaction capability: Actual is used by normal people to manage their own money, so it must be usable by people with different abilities and help them understand envelope budgeting. Actual already targets WCAG 2.1 AA (Actual Budget, 2026a), so accessibility is already a stated requirement.</w:t>
-      </w:r>
-    </w:p>
-    <w:p>
-      <w:pPr>
-        <w:pStyle w:val="Heading2"/>
-      </w:pPr>
-      <w:bookmarkStart w:id="46" w:name="current-qa-practices-and-gaps"/>
-      <w:bookmarkStart w:id="47" w:name="_Toc244220721"/>
-      <w:bookmarkStart w:id="48" w:name="_Toc244221409"/>
-      <w:bookmarkEnd w:id="43"/>
-      <w:r>
-        <w:lastRenderedPageBreak/>
-        <w:t>Current QA Practices and Gaps</w:t>
-      </w:r>
-      <w:bookmarkEnd w:id="47"/>
-      <w:bookmarkEnd w:id="48"/>
-    </w:p>
-    <w:p>
-      <w:pPr>
-        <w:pStyle w:val="FirstParagraph"/>
-      </w:pPr>
-      <w:r>
-        <w:t>Actual already runs substantial automated QA. Every pull request triggers linting, type checking, Vitest unit tests and a database migration check, Playwright end-to-end and visual regression tests run on pull requests or in the merge queue (Actual Budget, 2026a, n.d.-i).</w:t>
-      </w:r>
-    </w:p>
-    <w:p>
-      <w:pPr>
-        <w:pStyle w:val="BodyText"/>
-      </w:pPr>
-      <w:r>
-        <w:t>It also uses a semantic code analysis engine (CodeQL) to scan every pull requests and pushes (Actual Budget, 2026a). Moreover, releases will need approval from at least two other maintainers and do smoke tests (Actual Budget, n.d.-b). Actual's own security policy also asks for private vulnerability reporting and coordinated disclosure (Actual Budget, n.d.-g).</w:t>
-      </w:r>
-    </w:p>
-    <w:p>
-      <w:pPr>
-        <w:pStyle w:val="BodyText"/>
-      </w:pPr>
-      <w:r>
-        <w:t>There are also four gaps that are discovered or happened from the research:</w:t>
+        <w:t>Reliability:</w:t>
+      </w:r>
+      <w:r>
+        <w:t xml:space="preserve"> There is no test coverage measurement. Test coverage would not prove that the code is correct, but it would at least show what is untested. And reliability defects still reach users, like a sync defect that stopped some budgets from </w:t>
+      </w:r>
+      <w:proofErr w:type="gramStart"/>
+      <w:r>
+        <w:t>opening</w:t>
+      </w:r>
+      <w:proofErr w:type="gramEnd"/>
+      <w:r>
+        <w:t xml:space="preserve"> and it's stayed in released versions for years (Brown, 2026). Although Actual's testing checklist asks for "appropriate test coverage" (Actual Budget, n.d</w:t>
+      </w:r>
+      <w:proofErr w:type="gramStart"/>
+      <w:r>
+        <w:t>.-</w:t>
+      </w:r>
+      <w:proofErr w:type="gramEnd"/>
+      <w:r>
+        <w:t xml:space="preserve">i, Testing Checklist section), there's no coverage report found in the repository, and sync-server tests have coverage switched off (Actual Budget, 2026a). Therefore, nobody can tell how much of the sync and migration code is </w:t>
+      </w:r>
+      <w:proofErr w:type="gramStart"/>
+      <w:r>
+        <w:t>actually tested</w:t>
+      </w:r>
+      <w:proofErr w:type="gramEnd"/>
+      <w:r>
+        <w:t xml:space="preserve"> and </w:t>
+      </w:r>
+      <w:proofErr w:type="gramStart"/>
+      <w:r>
+        <w:t>actually safe</w:t>
+      </w:r>
+      <w:proofErr w:type="gramEnd"/>
+      <w:r>
+        <w:t>.</w:t>
       </w:r>
     </w:p>
     <w:p>
@@ -3850,10 +3968,10 @@
         </w:numPr>
       </w:pPr>
       <w:r>
-        <w:t>Security:</w:t>
-      </w:r>
-      <w:r>
-        <w:t xml:space="preserve"> No proactive check of access control before release. Three access-control flaws in the sync server feature were published in 2026 (Actual Budget, 2026b, 2026c, 2026d). The most critical one was about missing authentication on six of the SimpleFIN and Pluggy AI bank-sync endpoints, which the GoCardless endpoints had it (Actual Budget, 2026c). This shows inconsistent authentication across bank-sync providers, and the flaw was only found after release. The security policy also states no response time for reports (Actual Budget, n.d.-g).</w:t>
+        <w:t>Interaction capability:</w:t>
+      </w:r>
+      <w:r>
+        <w:t xml:space="preserve"> No automated accessibility testing was found, despite the WCAG target (Actual Budget, 2026a).</w:t>
       </w:r>
     </w:p>
     <w:p>
@@ -3865,40 +3983,18 @@
         </w:numPr>
       </w:pPr>
       <w:r>
-        <w:t>Reliability:</w:t>
-      </w:r>
-      <w:r>
-        <w:t xml:space="preserve"> There is no test coverage measurement. Test coverage would not prove that the code is correct, but it would at least show what is untested. And reliability defects still reach users, like a sync defect that stopped some budgets from opening and it's stayed in released versions for years (Brown, 2026). Although Actual's testing checklist asks for "appropriate test coverage" (Actual Budget, n.d.-i, Testing Checklist section), there's no coverage report found in the repository, and sync-server tests have coverage switched off (Actual Budget, 2026a). Therefore, nobody can tell how much of the sync and migration code is actually tested and actually safe.</w:t>
-      </w:r>
-    </w:p>
-    <w:p>
-      <w:pPr>
-        <w:pStyle w:val="Compact"/>
-        <w:numPr>
-          <w:ilvl w:val="0"/>
-          <w:numId w:val="2"/>
-        </w:numPr>
-      </w:pPr>
-      <w:r>
-        <w:t>Interaction capability:</w:t>
-      </w:r>
-      <w:r>
-        <w:t xml:space="preserve"> No automated accessibility testing was found, despite the WCAG target (Actual Budget, 2026a).</w:t>
-      </w:r>
-    </w:p>
-    <w:p>
-      <w:pPr>
-        <w:pStyle w:val="Compact"/>
-        <w:numPr>
-          <w:ilvl w:val="0"/>
-          <w:numId w:val="2"/>
-        </w:numPr>
-      </w:pPr>
-      <w:r>
         <w:t>Process:</w:t>
       </w:r>
       <w:r>
-        <w:t xml:space="preserve"> No written QA plan. Quality rules are spread across documentation, templates and CI files, so there's no a single place that states what must be checked before work moves on.</w:t>
+        <w:t xml:space="preserve"> No written QA plan. Quality rules are spread across documentation, templates and CI files, so there's </w:t>
+      </w:r>
+      <w:proofErr w:type="gramStart"/>
+      <w:r>
+        <w:t>no</w:t>
+      </w:r>
+      <w:proofErr w:type="gramEnd"/>
+      <w:r>
+        <w:t xml:space="preserve"> a single place that states what must be checked before work moves on.</w:t>
       </w:r>
     </w:p>
     <w:p>
@@ -3970,6 +4066,7 @@
               <w:rPr>
                 <w:b/>
               </w:rPr>
+              <w:lastRenderedPageBreak/>
               <w:t>Gap</w:t>
             </w:r>
           </w:p>
@@ -4142,7 +4239,6 @@
               <w:jc w:val="left"/>
             </w:pPr>
             <w:r>
-              <w:lastRenderedPageBreak/>
               <w:t>Reliability</w:t>
             </w:r>
           </w:p>
@@ -4430,6 +4526,7 @@
               <w:rPr>
                 <w:b/>
               </w:rPr>
+              <w:lastRenderedPageBreak/>
               <w:t>Kanban column</w:t>
             </w:r>
           </w:p>
@@ -4658,7 +4755,6 @@
               <w:jc w:val="left"/>
             </w:pPr>
             <w:r>
-              <w:lastRenderedPageBreak/>
               <w:t>Build/PR</w:t>
             </w:r>
           </w:p>
@@ -6790,6 +6886,7 @@
       <w:r>
         <w:t xml:space="preserve">Actual Budget. (2026a). </w:t>
       </w:r>
+      <w:proofErr w:type="gramStart"/>
       <w:r>
         <w:rPr>
           <w:i/>
@@ -6797,6 +6894,7 @@
         </w:rPr>
         <w:t>Actual</w:t>
       </w:r>
+      <w:proofErr w:type="gramEnd"/>
       <w:r>
         <w:t xml:space="preserve"> [Computer software]. GitHub. </w:t>
       </w:r>
@@ -7016,10 +7114,22 @@
           <w:i/>
           <w:iCs/>
         </w:rPr>
-        <w:t>[AI] fix(sync): receive only the latest timestamp to stop counter overflow</w:t>
-      </w:r>
-      <w:r>
-        <w:t xml:space="preserve"> (#8706) [Commit]. GitHub. </w:t>
+        <w:t xml:space="preserve">[AI] fix(sync): receive only the latest timestamp to stop counter </w:t>
+      </w:r>
+      <w:proofErr w:type="gramStart"/>
+      <w:r>
+        <w:rPr>
+          <w:i/>
+          <w:iCs/>
+        </w:rPr>
+        <w:t>overflow</w:t>
+      </w:r>
+      <w:r>
+        <w:t xml:space="preserve"> (#</w:t>
+      </w:r>
+      <w:proofErr w:type="gramEnd"/>
+      <w:r>
+        <w:t xml:space="preserve">8706) [Commit]. GitHub. </w:t>
       </w:r>
       <w:hyperlink r:id="rId38" w:history="1">
         <w:r>
@@ -7171,7 +7281,23 @@
           <w:i/>
           <w:iCs/>
         </w:rPr>
-        <w:t>Systems and software engineering — Systems and software Quality Requirements and Evaluation (SQuaRE) — Product quality model</w:t>
+        <w:t>Systems and software engineering — Systems and software Quality Requirements and Evaluation (</w:t>
+      </w:r>
+      <w:proofErr w:type="gramStart"/>
+      <w:r>
+        <w:rPr>
+          <w:i/>
+          <w:iCs/>
+        </w:rPr>
+        <w:t>SQuaRE) —</w:t>
+      </w:r>
+      <w:proofErr w:type="gramEnd"/>
+      <w:r>
+        <w:rPr>
+          <w:i/>
+          <w:iCs/>
+        </w:rPr>
+        <w:t xml:space="preserve"> Product quality model</w:t>
       </w:r>
       <w:r>
         <w:t xml:space="preserve"> (ISO/IEC Standard No. 25010:2023). </w:t>
@@ -7225,8 +7351,13 @@
         </w:numPr>
         <w:jc w:val="left"/>
       </w:pPr>
-      <w:r>
-        <w:t xml:space="preserve">Open Source Technology Improvement Fund. (2026, January 30). </w:t>
+      <w:proofErr w:type="gramStart"/>
+      <w:r>
+        <w:t>Open Source</w:t>
+      </w:r>
+      <w:proofErr w:type="gramEnd"/>
+      <w:r>
+        <w:t xml:space="preserve"> Technology Improvement Fund. (2026, January 30). </w:t>
       </w:r>
       <w:r>
         <w:rPr>
@@ -7290,12 +7421,37 @@
       <w:r>
         <w:t xml:space="preserve">Salkever, A. (2023). </w:t>
       </w:r>
+      <w:proofErr w:type="gramStart"/>
       <w:r>
         <w:rPr>
           <w:i/>
           <w:iCs/>
         </w:rPr>
-        <w:t>Open source maintainers: Exploring the people, practices, and constraints facing the world's most critical open source software projects</w:t>
+        <w:t>Open source</w:t>
+      </w:r>
+      <w:proofErr w:type="gramEnd"/>
+      <w:r>
+        <w:rPr>
+          <w:i/>
+          <w:iCs/>
+        </w:rPr>
+        <w:t xml:space="preserve"> maintainers: Exploring the people, practices, and constraints facing the world's most critical </w:t>
+      </w:r>
+      <w:proofErr w:type="gramStart"/>
+      <w:r>
+        <w:rPr>
+          <w:i/>
+          <w:iCs/>
+        </w:rPr>
+        <w:t>open source</w:t>
+      </w:r>
+      <w:proofErr w:type="gramEnd"/>
+      <w:r>
+        <w:rPr>
+          <w:i/>
+          <w:iCs/>
+        </w:rPr>
+        <w:t xml:space="preserve"> software projects</w:t>
       </w:r>
       <w:r>
         <w:t xml:space="preserve">. The Linux Foundation. </w:t>
@@ -7353,12 +7509,37 @@
       <w:r>
         <w:t xml:space="preserve">Stacoviak, A., &amp; Santo, J. (Hosts). (2022, July 1). </w:t>
       </w:r>
+      <w:proofErr w:type="gramStart"/>
       <w:r>
         <w:rPr>
           <w:i/>
           <w:iCs/>
         </w:rPr>
-        <w:t>Actual(ly) opening up with James Long</w:t>
+        <w:t>Actual</w:t>
+      </w:r>
+      <w:proofErr w:type="gramEnd"/>
+      <w:r>
+        <w:rPr>
+          <w:i/>
+          <w:iCs/>
+        </w:rPr>
+        <w:t xml:space="preserve">(ly) </w:t>
+      </w:r>
+      <w:proofErr w:type="gramStart"/>
+      <w:r>
+        <w:rPr>
+          <w:i/>
+          <w:iCs/>
+        </w:rPr>
+        <w:t>opening up</w:t>
+      </w:r>
+      <w:proofErr w:type="gramEnd"/>
+      <w:r>
+        <w:rPr>
+          <w:i/>
+          <w:iCs/>
+        </w:rPr>
+        <w:t xml:space="preserve"> with James Long</w:t>
       </w:r>
       <w:r>
         <w:t xml:space="preserve"> (No. 495) [Audio podcast episode]. In </w:t>

</xml_diff>

<commit_message>
Apply two-line bold-label bullet format to 3.1, 3.3 and 3.5
Co-Authored-By: Claude Opus 5.5 <noreply@anthropic.com>
</commit_message>
<xml_diff>
--- a/report/assignment-1/Assignment-1-Report.docx
+++ b/report/assignment-1/Assignment-1-Report.docx
@@ -3679,91 +3679,27 @@
     <w:p>
       <w:pPr>
         <w:pStyle w:val="Compact"/>
+        <w:keepNext/>
         <w:numPr>
           <w:ilvl w:val="0"/>
           <w:numId w:val="2"/>
         </w:numPr>
-      </w:pPr>
-      <w:r>
-        <w:t>User-based: For users, quality means balances and envelope totals that are correct, private and easy to understand.</w:t>
+        <w:spacing w:after="0"/>
+      </w:pPr>
+      <w:r>
+        <w:rPr>
+          <w:b/>
+        </w:rPr>
+        <w:t>User-based</w:t>
       </w:r>
     </w:p>
     <w:p>
       <w:pPr>
         <w:pStyle w:val="Compact"/>
-        <w:numPr>
-          <w:ilvl w:val="0"/>
-          <w:numId w:val="2"/>
-        </w:numPr>
-      </w:pPr>
-      <w:r>
-        <w:t>Product-based: Quality lies in properties of the software itself, such as access control on the sync server and the integrity of budget data.</w:t>
-      </w:r>
-    </w:p>
-    <w:p>
-      <w:pPr>
-        <w:pStyle w:val="Compact"/>
-        <w:numPr>
-          <w:ilvl w:val="0"/>
-          <w:numId w:val="2"/>
-        </w:numPr>
-      </w:pPr>
-      <w:r>
-        <w:t>Process-based: For Actual, quality means every change passes the same written checks, no matter who reviews it.</w:t>
-      </w:r>
-    </w:p>
-    <w:p>
-      <w:pPr>
-        <w:pStyle w:val="Compact"/>
-        <w:numPr>
-          <w:ilvl w:val="0"/>
-          <w:numId w:val="2"/>
-        </w:numPr>
-      </w:pPr>
-      <w:r>
-        <w:t>Value-based: Actual is free and funded by donations, so the quality work must be affordable in volunteer time.</w:t>
-      </w:r>
-    </w:p>
-    <w:p>
-      <w:pPr>
-        <w:pStyle w:val="Compact"/>
-        <w:numPr>
-          <w:ilvl w:val="0"/>
-          <w:numId w:val="2"/>
-        </w:numPr>
-      </w:pPr>
-      <w:r>
-        <w:t>Transcendent: In terms of transcendent view, quality refer to the sense that the app can be trusted with one's money. Users recognise it through daily use, and it will also be built up when the other four views above are met.</w:t>
-      </w:r>
-    </w:p>
-    <w:p>
-      <w:pPr>
-        <w:pStyle w:val="FirstParagraph"/>
-      </w:pPr>
-      <w:r>
-        <w:t>Together, these views give Actual's QA process one aim, which is to keep users' financial data correct and private, through checks that apply to every change but cost little volunteer time.</w:t>
-      </w:r>
-    </w:p>
-    <w:p>
-      <w:pPr>
-        <w:pStyle w:val="Heading2"/>
-      </w:pPr>
-      <w:bookmarkStart w:id="43" w:name="key-quality-attributes"/>
-      <w:bookmarkStart w:id="44" w:name="_Toc244220720"/>
-      <w:bookmarkStart w:id="45" w:name="_Toc244221408"/>
-      <w:bookmarkEnd w:id="40"/>
-      <w:r>
-        <w:t>Key Quality Attributes</w:t>
-      </w:r>
-      <w:bookmarkEnd w:id="44"/>
-      <w:bookmarkEnd w:id="45"/>
-    </w:p>
-    <w:p>
-      <w:pPr>
-        <w:pStyle w:val="FirstParagraph"/>
-      </w:pPr>
-      <w:r>
-        <w:t>ISO/IEC 25010:2023 defines nine product quality characteristics (International Organization for Standardization &amp; International Electrotechnical Commission, 2023). This report focuses on three of them: Security, Reliability and Interaction capability. Each was chosen because it meets two criteria, a failure would seriously harm users, by risking their money or data or locking them out of the app, and public evidence shows that Actual's current checks leave a gap (Section 3.3).</w:t>
+        <w:ind w:left="720"/>
+      </w:pPr>
+      <w:r>
+        <w:t>For users, quality means balances and envelope totals that are correct, private and easy to understand.</w:t>
       </w:r>
     </w:p>
     <w:p>
@@ -3777,7 +3713,10 @@
         <w:spacing w:after="0"/>
       </w:pPr>
       <w:r>
-        <w:t xml:space="preserve">Security: </w:t>
+        <w:rPr>
+          <w:b/>
+        </w:rPr>
+        <w:t>Product-based</w:t>
       </w:r>
     </w:p>
     <w:p>
@@ -3786,21 +3725,7 @@
         <w:ind w:left="720"/>
       </w:pPr>
       <w:r>
-        <w:t xml:space="preserve">Actual </w:t>
-      </w:r>
-      <w:proofErr w:type="gramStart"/>
-      <w:r>
-        <w:t>stores</w:t>
-      </w:r>
-      <w:proofErr w:type="gramEnd"/>
-      <w:r>
-        <w:t xml:space="preserve"> user's transactions, balances and bank connections, which </w:t>
-      </w:r>
-      <w:r>
-        <w:t>are</w:t>
-      </w:r>
-      <w:r>
-        <w:t xml:space="preserve"> some of the most private data a person has. If that data leaks or is changed without any permission, the users could face fraud or lose control of their finances.</w:t>
+        <w:t>Quality lies in properties of the software itself, such as access control on the sync server and the integrity of budget data.</w:t>
       </w:r>
     </w:p>
     <w:p>
@@ -3814,7 +3739,10 @@
         <w:spacing w:after="0"/>
       </w:pPr>
       <w:r>
-        <w:t xml:space="preserve">Reliability: </w:t>
+        <w:rPr>
+          <w:b/>
+        </w:rPr>
+        <w:t>Process-based</w:t>
       </w:r>
     </w:p>
     <w:p>
@@ -3823,7 +3751,7 @@
         <w:ind w:left="720"/>
       </w:pPr>
       <w:r>
-        <w:t>Users decide what to spend based on the balances Actual shows, so budget data must stay correct and in sync across devices, including after the app recovers from a failure. If it fails, users may stop trusting their numbers or be locked out of their own budget.</w:t>
+        <w:t>For Actual, quality means every change passes the same written checks, no matter who reviews it.</w:t>
       </w:r>
     </w:p>
     <w:p>
@@ -3837,7 +3765,10 @@
         <w:spacing w:after="0"/>
       </w:pPr>
       <w:r>
-        <w:t xml:space="preserve">Interaction capability: </w:t>
+        <w:rPr>
+          <w:b/>
+        </w:rPr>
+        <w:t>Value-based</w:t>
       </w:r>
     </w:p>
     <w:p>
@@ -3846,17 +3777,169 @@
         <w:ind w:left="720"/>
       </w:pPr>
       <w:r>
+        <w:t>Actual is free and funded by donations, so the quality work must be affordable in volunteer time.</w:t>
+      </w:r>
+    </w:p>
+    <w:p>
+      <w:pPr>
+        <w:pStyle w:val="Compact"/>
+        <w:keepNext/>
+        <w:numPr>
+          <w:ilvl w:val="0"/>
+          <w:numId w:val="2"/>
+        </w:numPr>
+        <w:spacing w:after="0"/>
+      </w:pPr>
+      <w:r>
+        <w:rPr>
+          <w:b/>
+        </w:rPr>
+        <w:t>Transcendent</w:t>
+      </w:r>
+    </w:p>
+    <w:p>
+      <w:pPr>
+        <w:pStyle w:val="Compact"/>
+        <w:ind w:left="720"/>
+      </w:pPr>
+      <w:r>
+        <w:t>In terms of transcendent view, quality refer to the sense that the app can be trusted with one's money. Users recognise it through daily use, and it will also be built up when the other four views above are met.</w:t>
+      </w:r>
+    </w:p>
+    <w:p>
+      <w:pPr>
+        <w:pStyle w:val="FirstParagraph"/>
+      </w:pPr>
+      <w:r>
+        <w:t>Together, these views give Actual's QA process one aim, which is to keep users' financial data correct and private, through checks that apply to every change but cost little volunteer time.</w:t>
+      </w:r>
+    </w:p>
+    <w:p>
+      <w:pPr>
+        <w:pStyle w:val="Heading2"/>
+      </w:pPr>
+      <w:bookmarkStart w:id="43" w:name="key-quality-attributes"/>
+      <w:bookmarkStart w:id="44" w:name="_Toc244220720"/>
+      <w:bookmarkStart w:id="45" w:name="_Toc244221408"/>
+      <w:bookmarkEnd w:id="40"/>
+      <w:r>
+        <w:t>Key Quality Attributes</w:t>
+      </w:r>
+      <w:bookmarkEnd w:id="44"/>
+      <w:bookmarkEnd w:id="45"/>
+    </w:p>
+    <w:p>
+      <w:pPr>
+        <w:pStyle w:val="FirstParagraph"/>
+      </w:pPr>
+      <w:r>
+        <w:t>ISO/IEC 25010:2023 defines nine product quality characteristics (International Organization for Standardization &amp; International Electrotechnical Commission, 2023). This report focuses on three of them: Security, Reliability and Interaction capability. Each was chosen because it meets two criteria, a failure would seriously harm users, by risking their money or data or locking them out of the app, and public evidence shows that Actual's current checks leave a gap (Section 3.3).</w:t>
+      </w:r>
+    </w:p>
+    <w:p>
+      <w:pPr>
+        <w:pStyle w:val="Compact"/>
+        <w:keepNext/>
+        <w:numPr>
+          <w:ilvl w:val="0"/>
+          <w:numId w:val="2"/>
+        </w:numPr>
+        <w:spacing w:after="0"/>
+        <w:rPr>
+          <w:b/>
+          <w:bCs/>
+        </w:rPr>
+      </w:pPr>
+      <w:r>
+        <w:rPr>
+          <w:b/>
+          <w:bCs/>
+        </w:rPr>
+        <w:t>Security</w:t>
+      </w:r>
+    </w:p>
+    <w:p>
+      <w:pPr>
+        <w:pStyle w:val="Compact"/>
+        <w:ind w:left="720"/>
+      </w:pPr>
+      <w:r>
+        <w:t xml:space="preserve">Actual stores user's transactions, balances and bank connections, which </w:t>
+      </w:r>
+      <w:r>
+        <w:t>are</w:t>
+      </w:r>
+      <w:r>
+        <w:t xml:space="preserve"> some of the most private data a person has. If that data leaks or is changed without any permission, the users could face fraud or lose control of their finances.</w:t>
+      </w:r>
+    </w:p>
+    <w:p>
+      <w:pPr>
+        <w:pStyle w:val="Compact"/>
+        <w:keepNext/>
+        <w:numPr>
+          <w:ilvl w:val="0"/>
+          <w:numId w:val="2"/>
+        </w:numPr>
+        <w:spacing w:after="0"/>
+        <w:rPr>
+          <w:b/>
+          <w:bCs/>
+        </w:rPr>
+      </w:pPr>
+      <w:r>
+        <w:rPr>
+          <w:b/>
+          <w:bCs/>
+        </w:rPr>
+        <w:lastRenderedPageBreak/>
+        <w:t>Reliability</w:t>
+      </w:r>
+    </w:p>
+    <w:p>
+      <w:pPr>
+        <w:pStyle w:val="Compact"/>
+        <w:ind w:left="720"/>
+      </w:pPr>
+      <w:r>
+        <w:t>Users decide what to spend based on the balances Actual shows, so budget data must stay correct and in sync across devices, including after the app recovers from a failure. If it fails, users may stop trusting their numbers or be locked out of their own budget.</w:t>
+      </w:r>
+    </w:p>
+    <w:p>
+      <w:pPr>
+        <w:pStyle w:val="Compact"/>
+        <w:keepNext/>
+        <w:numPr>
+          <w:ilvl w:val="0"/>
+          <w:numId w:val="2"/>
+        </w:numPr>
+        <w:spacing w:after="0"/>
+        <w:rPr>
+          <w:b/>
+          <w:bCs/>
+        </w:rPr>
+      </w:pPr>
+      <w:r>
+        <w:rPr>
+          <w:b/>
+          <w:bCs/>
+        </w:rPr>
+        <w:t>Interaction capability</w:t>
+      </w:r>
+    </w:p>
+    <w:p>
+      <w:pPr>
+        <w:pStyle w:val="Compact"/>
+        <w:ind w:left="720"/>
+      </w:pPr>
+      <w:r>
         <w:t xml:space="preserve">Actual is used by normal people to manage their own money, so it must be </w:t>
       </w:r>
       <w:r>
         <w:t>used</w:t>
       </w:r>
       <w:r>
-        <w:t xml:space="preserve"> by people with different abilities and help them understand envelope budgeting. Actual </w:t>
-      </w:r>
-      <w:r>
-        <w:lastRenderedPageBreak/>
-        <w:t>already targets WCAG 2.1 AA (Actual Budget, 2026a), so accessibility is already a stated requirement.</w:t>
+        <w:t xml:space="preserve"> by people with different abilities and help them understand envelope budgeting. Actual already targets WCAG 2.1 AA (Actual Budget, 2026a), so accessibility is already a stated requirement.</w:t>
       </w:r>
     </w:p>
     <w:p>
@@ -3900,101 +3983,105 @@
     <w:p>
       <w:pPr>
         <w:pStyle w:val="Compact"/>
+        <w:keepNext/>
         <w:numPr>
           <w:ilvl w:val="0"/>
           <w:numId w:val="2"/>
         </w:numPr>
-      </w:pPr>
-      <w:r>
-        <w:t>Security:</w:t>
-      </w:r>
-      <w:r>
-        <w:t xml:space="preserve"> No proactive check of access control before release. Three access-control flaws in the sync server feature were published in 2026 (Actual Budget, 2026b, 2026c, 2026d). The most critical one was about missing authentication on six of the SimpleFIN and Pluggy AI bank-sync endpoints, which the GoCardless endpoints had it (Actual Budget, 2026c). This shows inconsistent authentication across bank-sync providers, and the flaw was only found after release. The security policy also states no response time for reports (Actual Budget, n.d.-g).</w:t>
+        <w:spacing w:after="0"/>
+      </w:pPr>
+      <w:r>
+        <w:rPr>
+          <w:b/>
+        </w:rPr>
+        <w:t>Security</w:t>
       </w:r>
     </w:p>
     <w:p>
       <w:pPr>
         <w:pStyle w:val="Compact"/>
+        <w:ind w:left="720"/>
+      </w:pPr>
+      <w:r>
+        <w:t>No proactive check of access control before release. Three access-control flaws in the sync server feature were published in 2026 (Actual Budget, 2026b, 2026c, 2026d). The most critical one was about missing authentication on six of the SimpleFIN and Pluggy AI bank-sync endpoints, which the GoCardless endpoints had it (Actual Budget, 2026c). This shows inconsistent authentication across bank-sync providers, and the flaw was only found after release. The security policy also states no response time for reports (Actual Budget, n.d.-g).</w:t>
+      </w:r>
+    </w:p>
+    <w:p>
+      <w:pPr>
+        <w:pStyle w:val="Compact"/>
+        <w:keepNext/>
         <w:numPr>
           <w:ilvl w:val="0"/>
           <w:numId w:val="2"/>
         </w:numPr>
-      </w:pPr>
-      <w:r>
-        <w:t>Reliability:</w:t>
-      </w:r>
-      <w:r>
-        <w:t xml:space="preserve"> There is no test coverage measurement. Test coverage would not prove that the code is correct, but it would at least show what is untested. And reliability defects still reach users, like a sync defect that stopped some budgets from </w:t>
-      </w:r>
-      <w:proofErr w:type="gramStart"/>
-      <w:r>
-        <w:t>opening</w:t>
-      </w:r>
-      <w:proofErr w:type="gramEnd"/>
-      <w:r>
-        <w:t xml:space="preserve"> and it's stayed in released versions for years (Brown, 2026). Although Actual's testing checklist asks for "appropriate test coverage" (Actual Budget, n.d</w:t>
-      </w:r>
-      <w:proofErr w:type="gramStart"/>
-      <w:r>
-        <w:t>.-</w:t>
-      </w:r>
-      <w:proofErr w:type="gramEnd"/>
-      <w:r>
-        <w:t xml:space="preserve">i, Testing Checklist section), there's no coverage report found in the repository, and sync-server tests have coverage switched off (Actual Budget, 2026a). Therefore, nobody can tell how much of the sync and migration code is </w:t>
-      </w:r>
-      <w:proofErr w:type="gramStart"/>
-      <w:r>
-        <w:t>actually tested</w:t>
-      </w:r>
-      <w:proofErr w:type="gramEnd"/>
-      <w:r>
-        <w:t xml:space="preserve"> and </w:t>
-      </w:r>
-      <w:proofErr w:type="gramStart"/>
-      <w:r>
-        <w:t>actually safe</w:t>
-      </w:r>
-      <w:proofErr w:type="gramEnd"/>
-      <w:r>
-        <w:t>.</w:t>
+        <w:spacing w:after="0"/>
+      </w:pPr>
+      <w:r>
+        <w:rPr>
+          <w:b/>
+        </w:rPr>
+        <w:t>Reliability</w:t>
       </w:r>
     </w:p>
     <w:p>
       <w:pPr>
         <w:pStyle w:val="Compact"/>
+        <w:ind w:left="720"/>
+      </w:pPr>
+      <w:r>
+        <w:t>There is no test coverage measurement. Test coverage would not prove that the code is correct, but it would at least show what is untested. And reliability defects still reach users, like a sync defect that stopped some budgets from opening and it's stayed in released versions for years (Brown, 2026). Although Actual's testing checklist asks for "appropriate test coverage" (Actual Budget, n.d.-i, Testing Checklist section), there's no coverage report found in the repository, and sync-server tests have coverage switched off (Actual Budget, 2026a). Therefore, nobody can tell how much of the sync and migration code is actually tested and actually safe.</w:t>
+      </w:r>
+    </w:p>
+    <w:p>
+      <w:pPr>
+        <w:pStyle w:val="Compact"/>
+        <w:keepNext/>
         <w:numPr>
           <w:ilvl w:val="0"/>
           <w:numId w:val="2"/>
         </w:numPr>
-      </w:pPr>
-      <w:r>
-        <w:t>Interaction capability:</w:t>
-      </w:r>
-      <w:r>
-        <w:t xml:space="preserve"> No automated accessibility testing was found, despite the WCAG target (Actual Budget, 2026a).</w:t>
+        <w:spacing w:after="0"/>
+      </w:pPr>
+      <w:r>
+        <w:rPr>
+          <w:b/>
+        </w:rPr>
+        <w:t>Interaction capability</w:t>
       </w:r>
     </w:p>
     <w:p>
       <w:pPr>
         <w:pStyle w:val="Compact"/>
+        <w:ind w:left="720"/>
+      </w:pPr>
+      <w:r>
+        <w:t>No automated accessibility testing was found, despite the WCAG target (Actual Budget, 2026a).</w:t>
+      </w:r>
+    </w:p>
+    <w:p>
+      <w:pPr>
+        <w:pStyle w:val="Compact"/>
+        <w:keepNext/>
         <w:numPr>
           <w:ilvl w:val="0"/>
           <w:numId w:val="2"/>
         </w:numPr>
-      </w:pPr>
-      <w:r>
-        <w:t>Process:</w:t>
-      </w:r>
-      <w:r>
-        <w:t xml:space="preserve"> No written QA plan. Quality rules are spread across documentation, templates and CI files, so there's </w:t>
-      </w:r>
-      <w:proofErr w:type="gramStart"/>
-      <w:r>
-        <w:t>no</w:t>
-      </w:r>
-      <w:proofErr w:type="gramEnd"/>
-      <w:r>
-        <w:t xml:space="preserve"> a single place that states what must be checked before work moves on.</w:t>
+        <w:spacing w:after="0"/>
+      </w:pPr>
+      <w:r>
+        <w:rPr>
+          <w:b/>
+        </w:rPr>
+        <w:t>Process</w:t>
+      </w:r>
+    </w:p>
+    <w:p>
+      <w:pPr>
+        <w:pStyle w:val="Compact"/>
+        <w:ind w:left="720"/>
+      </w:pPr>
+      <w:r>
+        <w:t>No written QA plan. Quality rules are spread across documentation, templates and CI files, so there's no a single place that states what must be checked before work moves on.</w:t>
       </w:r>
     </w:p>
     <w:p>
@@ -4006,6 +4093,7 @@
       <w:bookmarkStart w:id="51" w:name="_Toc244221410"/>
       <w:bookmarkEnd w:id="46"/>
       <w:r>
+        <w:lastRenderedPageBreak/>
         <w:t>Selected Standards and Practices</w:t>
       </w:r>
       <w:bookmarkEnd w:id="50"/>
@@ -4066,7 +4154,6 @@
               <w:rPr>
                 <w:b/>
               </w:rPr>
-              <w:lastRenderedPageBreak/>
               <w:t>Gap</w:t>
             </w:r>
           </w:p>
@@ -4429,37 +4516,88 @@
     <w:p>
       <w:pPr>
         <w:pStyle w:val="Compact"/>
+        <w:keepNext/>
         <w:numPr>
           <w:ilvl w:val="0"/>
           <w:numId w:val="2"/>
         </w:numPr>
-      </w:pPr>
-      <w:r>
-        <w:t>High: a failure that could expose financial data or credentials, give wrong money figures or lose budget data. Such as authentication &amp; authorisation, bank integration, budget and balance calculations or sync and encryption).</w:t>
+        <w:spacing w:after="0"/>
+      </w:pPr>
+      <w:r>
+        <w:rPr>
+          <w:b/>
+        </w:rPr>
+        <w:t>High</w:t>
       </w:r>
     </w:p>
     <w:p>
       <w:pPr>
         <w:pStyle w:val="Compact"/>
+        <w:ind w:left="720"/>
+      </w:pPr>
+      <w:r>
+        <w:t>A</w:t>
+      </w:r>
+      <w:r>
+        <w:t xml:space="preserve"> failure that could expose financial data or credentials, give wrong money figures or lose budget data. Such as authentication &amp; authorisation, bank integration, budget and balance calculations or sync and encryption).</w:t>
+      </w:r>
+    </w:p>
+    <w:p>
+      <w:pPr>
+        <w:pStyle w:val="Compact"/>
+        <w:keepNext/>
         <w:numPr>
           <w:ilvl w:val="0"/>
           <w:numId w:val="2"/>
         </w:numPr>
-      </w:pPr>
-      <w:r>
-        <w:t>Standard: a failure would be visible but recoverable without data loss. Most of the features, such as reports, rules and UI components.</w:t>
+        <w:spacing w:after="0"/>
+      </w:pPr>
+      <w:r>
+        <w:rPr>
+          <w:b/>
+        </w:rPr>
+        <w:t>Standard</w:t>
       </w:r>
     </w:p>
     <w:p>
       <w:pPr>
         <w:pStyle w:val="Compact"/>
+        <w:ind w:left="720"/>
+      </w:pPr>
+      <w:r>
+        <w:t>A</w:t>
+      </w:r>
+      <w:r>
+        <w:t xml:space="preserve"> failure would be visible but recoverable without data loss. Most of the features, such as reports, rules and UI components.</w:t>
+      </w:r>
+    </w:p>
+    <w:p>
+      <w:pPr>
+        <w:pStyle w:val="Compact"/>
+        <w:keepNext/>
         <w:numPr>
           <w:ilvl w:val="0"/>
           <w:numId w:val="2"/>
         </w:numPr>
-      </w:pPr>
-      <w:r>
-        <w:t>Low: a failure would be cosmetic like themes, wording and documentation.</w:t>
+        <w:spacing w:after="0"/>
+      </w:pPr>
+      <w:r>
+        <w:rPr>
+          <w:b/>
+        </w:rPr>
+        <w:t>Low</w:t>
+      </w:r>
+    </w:p>
+    <w:p>
+      <w:pPr>
+        <w:pStyle w:val="Compact"/>
+        <w:ind w:left="720"/>
+      </w:pPr>
+      <w:r>
+        <w:t>A</w:t>
+      </w:r>
+      <w:r>
+        <w:t xml:space="preserve"> failure would be cosmetic like themes, wording and documentation.</w:t>
       </w:r>
     </w:p>
     <w:p>
@@ -4467,6 +4605,7 @@
         <w:pStyle w:val="FirstParagraph"/>
       </w:pPr>
       <w:r>
+        <w:lastRenderedPageBreak/>
         <w:t>These tiers were created for this report. They borrow the one idea from IEEE 1012-2024 standard: the more serious a component's possible failure, the more verification it needs (Institute of Electrical and Electronics Engineers [IEEE], 2025).</w:t>
       </w:r>
     </w:p>
@@ -4526,7 +4665,6 @@
               <w:rPr>
                 <w:b/>
               </w:rPr>
-              <w:lastRenderedPageBreak/>
               <w:t>Kanban column</w:t>
             </w:r>
           </w:p>
@@ -6886,7 +7024,6 @@
       <w:r>
         <w:t xml:space="preserve">Actual Budget. (2026a). </w:t>
       </w:r>
-      <w:proofErr w:type="gramStart"/>
       <w:r>
         <w:rPr>
           <w:i/>
@@ -6894,7 +7031,6 @@
         </w:rPr>
         <w:t>Actual</w:t>
       </w:r>
-      <w:proofErr w:type="gramEnd"/>
       <w:r>
         <w:t xml:space="preserve"> [Computer software]. GitHub. </w:t>
       </w:r>
@@ -7114,22 +7250,10 @@
           <w:i/>
           <w:iCs/>
         </w:rPr>
-        <w:t xml:space="preserve">[AI] fix(sync): receive only the latest timestamp to stop counter </w:t>
-      </w:r>
-      <w:proofErr w:type="gramStart"/>
-      <w:r>
-        <w:rPr>
-          <w:i/>
-          <w:iCs/>
-        </w:rPr>
-        <w:t>overflow</w:t>
-      </w:r>
-      <w:r>
-        <w:t xml:space="preserve"> (#</w:t>
-      </w:r>
-      <w:proofErr w:type="gramEnd"/>
-      <w:r>
-        <w:t xml:space="preserve">8706) [Commit]. GitHub. </w:t>
+        <w:t>[AI] fix(sync): receive only the latest timestamp to stop counter overflow</w:t>
+      </w:r>
+      <w:r>
+        <w:t xml:space="preserve"> (#8706) [Commit]. GitHub. </w:t>
       </w:r>
       <w:hyperlink r:id="rId38" w:history="1">
         <w:r>
@@ -7281,23 +7405,7 @@
           <w:i/>
           <w:iCs/>
         </w:rPr>
-        <w:t>Systems and software engineering — Systems and software Quality Requirements and Evaluation (</w:t>
-      </w:r>
-      <w:proofErr w:type="gramStart"/>
-      <w:r>
-        <w:rPr>
-          <w:i/>
-          <w:iCs/>
-        </w:rPr>
-        <w:t>SQuaRE) —</w:t>
-      </w:r>
-      <w:proofErr w:type="gramEnd"/>
-      <w:r>
-        <w:rPr>
-          <w:i/>
-          <w:iCs/>
-        </w:rPr>
-        <w:t xml:space="preserve"> Product quality model</w:t>
+        <w:t>Systems and software engineering — Systems and software Quality Requirements and Evaluation (SQuaRE) — Product quality model</w:t>
       </w:r>
       <w:r>
         <w:t xml:space="preserve"> (ISO/IEC Standard No. 25010:2023). </w:t>
@@ -7351,13 +7459,8 @@
         </w:numPr>
         <w:jc w:val="left"/>
       </w:pPr>
-      <w:proofErr w:type="gramStart"/>
-      <w:r>
-        <w:t>Open Source</w:t>
-      </w:r>
-      <w:proofErr w:type="gramEnd"/>
-      <w:r>
-        <w:t xml:space="preserve"> Technology Improvement Fund. (2026, January 30). </w:t>
+      <w:r>
+        <w:t xml:space="preserve">Open Source Technology Improvement Fund. (2026, January 30). </w:t>
       </w:r>
       <w:r>
         <w:rPr>
@@ -7421,37 +7524,12 @@
       <w:r>
         <w:t xml:space="preserve">Salkever, A. (2023). </w:t>
       </w:r>
-      <w:proofErr w:type="gramStart"/>
       <w:r>
         <w:rPr>
           <w:i/>
           <w:iCs/>
         </w:rPr>
-        <w:t>Open source</w:t>
-      </w:r>
-      <w:proofErr w:type="gramEnd"/>
-      <w:r>
-        <w:rPr>
-          <w:i/>
-          <w:iCs/>
-        </w:rPr>
-        <w:t xml:space="preserve"> maintainers: Exploring the people, practices, and constraints facing the world's most critical </w:t>
-      </w:r>
-      <w:proofErr w:type="gramStart"/>
-      <w:r>
-        <w:rPr>
-          <w:i/>
-          <w:iCs/>
-        </w:rPr>
-        <w:t>open source</w:t>
-      </w:r>
-      <w:proofErr w:type="gramEnd"/>
-      <w:r>
-        <w:rPr>
-          <w:i/>
-          <w:iCs/>
-        </w:rPr>
-        <w:t xml:space="preserve"> software projects</w:t>
+        <w:t>Open source maintainers: Exploring the people, practices, and constraints facing the world's most critical open source software projects</w:t>
       </w:r>
       <w:r>
         <w:t xml:space="preserve">. The Linux Foundation. </w:t>
@@ -7509,37 +7587,12 @@
       <w:r>
         <w:t xml:space="preserve">Stacoviak, A., &amp; Santo, J. (Hosts). (2022, July 1). </w:t>
       </w:r>
-      <w:proofErr w:type="gramStart"/>
       <w:r>
         <w:rPr>
           <w:i/>
           <w:iCs/>
         </w:rPr>
-        <w:t>Actual</w:t>
-      </w:r>
-      <w:proofErr w:type="gramEnd"/>
-      <w:r>
-        <w:rPr>
-          <w:i/>
-          <w:iCs/>
-        </w:rPr>
-        <w:t xml:space="preserve">(ly) </w:t>
-      </w:r>
-      <w:proofErr w:type="gramStart"/>
-      <w:r>
-        <w:rPr>
-          <w:i/>
-          <w:iCs/>
-        </w:rPr>
-        <w:t>opening up</w:t>
-      </w:r>
-      <w:proofErr w:type="gramEnd"/>
-      <w:r>
-        <w:rPr>
-          <w:i/>
-          <w:iCs/>
-        </w:rPr>
-        <w:t xml:space="preserve"> with James Long</w:t>
+        <w:t>Actual(ly) opening up with James Long</w:t>
       </w:r>
       <w:r>
         <w:t xml:space="preserve"> (No. 495) [Audio podcast episode]. In </w:t>

</xml_diff>

<commit_message>
Close label/description gaps in 1.5 bullets
Co-Authored-By: Claude Opus 5.5 <noreply@anthropic.com>
</commit_message>
<xml_diff>
--- a/report/assignment-1/Assignment-1-Report.docx
+++ b/report/assignment-1/Assignment-1-Report.docx
@@ -3249,10 +3249,12 @@
     <w:p>
       <w:pPr>
         <w:pStyle w:val="Compact"/>
+        <w:keepNext/>
         <w:numPr>
           <w:ilvl w:val="0"/>
           <w:numId w:val="2"/>
         </w:numPr>
+        <w:spacing w:after="0"/>
       </w:pPr>
       <w:r>
         <w:rPr>
@@ -3262,16 +3264,33 @@
         <w:t>Volunteer capacity and changing requirements.</w:t>
       </w:r>
       <w:r>
-        <w:t xml:space="preserve"> Work depends on volunteers, and review has been a bottleneck before (Aboltins, 2025).</w:t>
+        <w:t xml:space="preserve"> </w:t>
       </w:r>
     </w:p>
     <w:p>
       <w:pPr>
         <w:pStyle w:val="Compact"/>
+        <w:ind w:left="720"/>
+      </w:pPr>
+      <w:r>
+        <w:t xml:space="preserve">Work depends on volunteers, and </w:t>
+      </w:r>
+      <w:r>
+        <w:t>reviews have</w:t>
+      </w:r>
+      <w:r>
+        <w:t xml:space="preserve"> been a bottleneck before (Aboltins, 2025).</w:t>
+      </w:r>
+    </w:p>
+    <w:p>
+      <w:pPr>
+        <w:pStyle w:val="Compact"/>
+        <w:keepNext/>
         <w:numPr>
           <w:ilvl w:val="0"/>
           <w:numId w:val="2"/>
         </w:numPr>
+        <w:spacing w:after="0"/>
       </w:pPr>
       <w:r>
         <w:rPr>
@@ -3281,16 +3300,27 @@
         <w:t>Trust in the numbers and data security.</w:t>
       </w:r>
       <w:r>
-        <w:t xml:space="preserve"> Users rely on correct figures and protected data.</w:t>
+        <w:t xml:space="preserve"> </w:t>
       </w:r>
     </w:p>
     <w:p>
       <w:pPr>
         <w:pStyle w:val="Compact"/>
+        <w:ind w:left="720"/>
+      </w:pPr>
+      <w:r>
+        <w:t>Users rely on correct figures and protected data.</w:t>
+      </w:r>
+    </w:p>
+    <w:p>
+      <w:pPr>
+        <w:pStyle w:val="Compact"/>
+        <w:keepNext/>
         <w:numPr>
           <w:ilvl w:val="0"/>
           <w:numId w:val="2"/>
         </w:numPr>
+        <w:spacing w:after="0"/>
       </w:pPr>
       <w:r>
         <w:rPr>
@@ -3300,7 +3330,22 @@
         <w:t>Escaped defects and security flaws.</w:t>
       </w:r>
       <w:r>
-        <w:t xml:space="preserve"> Problems found after release harm users.</w:t>
+        <w:t xml:space="preserve"> </w:t>
+      </w:r>
+    </w:p>
+    <w:p>
+      <w:pPr>
+        <w:pStyle w:val="Compact"/>
+        <w:ind w:left="720"/>
+      </w:pPr>
+      <w:r>
+        <w:t xml:space="preserve">Problems found after </w:t>
+      </w:r>
+      <w:r>
+        <w:t>releasing</w:t>
+      </w:r>
+      <w:r>
+        <w:t xml:space="preserve"> harm users.</w:t>
       </w:r>
     </w:p>
     <w:p>
@@ -3699,7 +3744,15 @@
         <w:ind w:left="720"/>
       </w:pPr>
       <w:r>
-        <w:t>For users, quality means balances and envelope totals that are correct, private and easy to understand.</w:t>
+        <w:t xml:space="preserve">For users, quality means balances and </w:t>
+      </w:r>
+      <w:proofErr w:type="gramStart"/>
+      <w:r>
+        <w:t>envelope</w:t>
+      </w:r>
+      <w:proofErr w:type="gramEnd"/>
+      <w:r>
+        <w:t xml:space="preserve"> totals that are correct, private and easy to understand.</w:t>
       </w:r>
     </w:p>
     <w:p>
@@ -3803,7 +3856,15 @@
         <w:ind w:left="720"/>
       </w:pPr>
       <w:r>
-        <w:t>In terms of transcendent view, quality refer to the sense that the app can be trusted with one's money. Users recognise it through daily use, and it will also be built up when the other four views above are met.</w:t>
+        <w:t xml:space="preserve">In terms of transcendent view, quality </w:t>
+      </w:r>
+      <w:proofErr w:type="gramStart"/>
+      <w:r>
+        <w:t>refer</w:t>
+      </w:r>
+      <w:proofErr w:type="gramEnd"/>
+      <w:r>
+        <w:t xml:space="preserve"> to the sense that the app can be trusted with one's money. Users recognise it through daily use, and it will also be built up when the other four views above are met.</w:t>
       </w:r>
     </w:p>
     <w:p>
@@ -3864,7 +3925,15 @@
         <w:ind w:left="720"/>
       </w:pPr>
       <w:r>
-        <w:t xml:space="preserve">Actual stores user's transactions, balances and bank connections, which </w:t>
+        <w:t xml:space="preserve">Actual </w:t>
+      </w:r>
+      <w:proofErr w:type="gramStart"/>
+      <w:r>
+        <w:t>stores</w:t>
+      </w:r>
+      <w:proofErr w:type="gramEnd"/>
+      <w:r>
+        <w:t xml:space="preserve"> user's transactions, balances and bank connections, which </w:t>
       </w:r>
       <w:r>
         <w:t>are</w:t>
@@ -4029,7 +4098,39 @@
         <w:ind w:left="720"/>
       </w:pPr>
       <w:r>
-        <w:t>There is no test coverage measurement. Test coverage would not prove that the code is correct, but it would at least show what is untested. And reliability defects still reach users, like a sync defect that stopped some budgets from opening and it's stayed in released versions for years (Brown, 2026). Although Actual's testing checklist asks for "appropriate test coverage" (Actual Budget, n.d.-i, Testing Checklist section), there's no coverage report found in the repository, and sync-server tests have coverage switched off (Actual Budget, 2026a). Therefore, nobody can tell how much of the sync and migration code is actually tested and actually safe.</w:t>
+        <w:t xml:space="preserve">There is no test coverage measurement. Test coverage would not prove that the code is correct, but it would at least show what is untested. And reliability defects still reach users, like a sync defect that stopped some budgets from </w:t>
+      </w:r>
+      <w:proofErr w:type="gramStart"/>
+      <w:r>
+        <w:t>opening</w:t>
+      </w:r>
+      <w:proofErr w:type="gramEnd"/>
+      <w:r>
+        <w:t xml:space="preserve"> and it's stayed in released versions for years (Brown, 2026). Although Actual's testing checklist asks for "appropriate test coverage" (Actual Budget, n.d</w:t>
+      </w:r>
+      <w:proofErr w:type="gramStart"/>
+      <w:r>
+        <w:t>.-</w:t>
+      </w:r>
+      <w:proofErr w:type="gramEnd"/>
+      <w:r>
+        <w:t xml:space="preserve">i, Testing Checklist section), there's no coverage report found in the repository, and sync-server tests have coverage switched off (Actual Budget, 2026a). Therefore, nobody can tell how much of the sync and migration code is </w:t>
+      </w:r>
+      <w:proofErr w:type="gramStart"/>
+      <w:r>
+        <w:t>actually tested</w:t>
+      </w:r>
+      <w:proofErr w:type="gramEnd"/>
+      <w:r>
+        <w:t xml:space="preserve"> and </w:t>
+      </w:r>
+      <w:proofErr w:type="gramStart"/>
+      <w:r>
+        <w:t>actually safe</w:t>
+      </w:r>
+      <w:proofErr w:type="gramEnd"/>
+      <w:r>
+        <w:t>.</w:t>
       </w:r>
     </w:p>
     <w:p>
@@ -4081,7 +4182,15 @@
         <w:ind w:left="720"/>
       </w:pPr>
       <w:r>
-        <w:t>No written QA plan. Quality rules are spread across documentation, templates and CI files, so there's no a single place that states what must be checked before work moves on.</w:t>
+        <w:t xml:space="preserve">No written QA plan. Quality rules are spread across documentation, templates and CI files, so there's </w:t>
+      </w:r>
+      <w:proofErr w:type="gramStart"/>
+      <w:r>
+        <w:t>no</w:t>
+      </w:r>
+      <w:proofErr w:type="gramEnd"/>
+      <w:r>
+        <w:t xml:space="preserve"> a single place that states what must be checked before work moves on.</w:t>
       </w:r>
     </w:p>
     <w:p>
@@ -7024,6 +7133,7 @@
       <w:r>
         <w:t xml:space="preserve">Actual Budget. (2026a). </w:t>
       </w:r>
+      <w:proofErr w:type="gramStart"/>
       <w:r>
         <w:rPr>
           <w:i/>
@@ -7031,6 +7141,7 @@
         </w:rPr>
         <w:t>Actual</w:t>
       </w:r>
+      <w:proofErr w:type="gramEnd"/>
       <w:r>
         <w:t xml:space="preserve"> [Computer software]. GitHub. </w:t>
       </w:r>
@@ -7250,10 +7361,22 @@
           <w:i/>
           <w:iCs/>
         </w:rPr>
-        <w:t>[AI] fix(sync): receive only the latest timestamp to stop counter overflow</w:t>
-      </w:r>
-      <w:r>
-        <w:t xml:space="preserve"> (#8706) [Commit]. GitHub. </w:t>
+        <w:t xml:space="preserve">[AI] fix(sync): receive only the latest timestamp to stop counter </w:t>
+      </w:r>
+      <w:proofErr w:type="gramStart"/>
+      <w:r>
+        <w:rPr>
+          <w:i/>
+          <w:iCs/>
+        </w:rPr>
+        <w:t>overflow</w:t>
+      </w:r>
+      <w:r>
+        <w:t xml:space="preserve"> (#</w:t>
+      </w:r>
+      <w:proofErr w:type="gramEnd"/>
+      <w:r>
+        <w:t xml:space="preserve">8706) [Commit]. GitHub. </w:t>
       </w:r>
       <w:hyperlink r:id="rId38" w:history="1">
         <w:r>
@@ -7405,7 +7528,23 @@
           <w:i/>
           <w:iCs/>
         </w:rPr>
-        <w:t>Systems and software engineering — Systems and software Quality Requirements and Evaluation (SQuaRE) — Product quality model</w:t>
+        <w:t>Systems and software engineering — Systems and software Quality Requirements and Evaluation (</w:t>
+      </w:r>
+      <w:proofErr w:type="gramStart"/>
+      <w:r>
+        <w:rPr>
+          <w:i/>
+          <w:iCs/>
+        </w:rPr>
+        <w:t>SQuaRE) —</w:t>
+      </w:r>
+      <w:proofErr w:type="gramEnd"/>
+      <w:r>
+        <w:rPr>
+          <w:i/>
+          <w:iCs/>
+        </w:rPr>
+        <w:t xml:space="preserve"> Product quality model</w:t>
       </w:r>
       <w:r>
         <w:t xml:space="preserve"> (ISO/IEC Standard No. 25010:2023). </w:t>
@@ -7459,8 +7598,13 @@
         </w:numPr>
         <w:jc w:val="left"/>
       </w:pPr>
-      <w:r>
-        <w:t xml:space="preserve">Open Source Technology Improvement Fund. (2026, January 30). </w:t>
+      <w:proofErr w:type="gramStart"/>
+      <w:r>
+        <w:t>Open Source</w:t>
+      </w:r>
+      <w:proofErr w:type="gramEnd"/>
+      <w:r>
+        <w:t xml:space="preserve"> Technology Improvement Fund. (2026, January 30). </w:t>
       </w:r>
       <w:r>
         <w:rPr>
@@ -7524,12 +7668,37 @@
       <w:r>
         <w:t xml:space="preserve">Salkever, A. (2023). </w:t>
       </w:r>
+      <w:proofErr w:type="gramStart"/>
       <w:r>
         <w:rPr>
           <w:i/>
           <w:iCs/>
         </w:rPr>
-        <w:t>Open source maintainers: Exploring the people, practices, and constraints facing the world's most critical open source software projects</w:t>
+        <w:t>Open source</w:t>
+      </w:r>
+      <w:proofErr w:type="gramEnd"/>
+      <w:r>
+        <w:rPr>
+          <w:i/>
+          <w:iCs/>
+        </w:rPr>
+        <w:t xml:space="preserve"> maintainers: Exploring the people, practices, and constraints facing the world's most critical </w:t>
+      </w:r>
+      <w:proofErr w:type="gramStart"/>
+      <w:r>
+        <w:rPr>
+          <w:i/>
+          <w:iCs/>
+        </w:rPr>
+        <w:t>open source</w:t>
+      </w:r>
+      <w:proofErr w:type="gramEnd"/>
+      <w:r>
+        <w:rPr>
+          <w:i/>
+          <w:iCs/>
+        </w:rPr>
+        <w:t xml:space="preserve"> software projects</w:t>
       </w:r>
       <w:r>
         <w:t xml:space="preserve">. The Linux Foundation. </w:t>
@@ -7587,12 +7756,37 @@
       <w:r>
         <w:t xml:space="preserve">Stacoviak, A., &amp; Santo, J. (Hosts). (2022, July 1). </w:t>
       </w:r>
+      <w:proofErr w:type="gramStart"/>
       <w:r>
         <w:rPr>
           <w:i/>
           <w:iCs/>
         </w:rPr>
-        <w:t>Actual(ly) opening up with James Long</w:t>
+        <w:t>Actual</w:t>
+      </w:r>
+      <w:proofErr w:type="gramEnd"/>
+      <w:r>
+        <w:rPr>
+          <w:i/>
+          <w:iCs/>
+        </w:rPr>
+        <w:t xml:space="preserve">(ly) </w:t>
+      </w:r>
+      <w:proofErr w:type="gramStart"/>
+      <w:r>
+        <w:rPr>
+          <w:i/>
+          <w:iCs/>
+        </w:rPr>
+        <w:t>opening up</w:t>
+      </w:r>
+      <w:proofErr w:type="gramEnd"/>
+      <w:r>
+        <w:rPr>
+          <w:i/>
+          <w:iCs/>
+        </w:rPr>
+        <w:t xml:space="preserve"> with James Long</w:t>
       </w:r>
       <w:r>
         <w:t xml:space="preserve"> (No. 495) [Audio podcast episode]. In </w:t>

</xml_diff>

<commit_message>
Number the 1.5 Main Challenges list
Co-Authored-By: Claude Opus 5.5 <noreply@anthropic.com>
</commit_message>
<xml_diff>
--- a/report/assignment-1/Assignment-1-Report.docx
+++ b/report/assignment-1/Assignment-1-Report.docx
@@ -2289,7 +2289,21 @@
                 <w:rStyle w:val="Hyperlink"/>
                 <w:noProof/>
               </w:rPr>
-              <w:t>References</w:t>
+              <w:t>Refere</w:t>
+            </w:r>
+            <w:r>
+              <w:rPr>
+                <w:rStyle w:val="Hyperlink"/>
+                <w:noProof/>
+              </w:rPr>
+              <w:t>n</w:t>
+            </w:r>
+            <w:r>
+              <w:rPr>
+                <w:rStyle w:val="Hyperlink"/>
+                <w:noProof/>
+              </w:rPr>
+              <w:t>ces</w:t>
             </w:r>
             <w:r>
               <w:rPr>
@@ -3744,15 +3758,7 @@
         <w:ind w:left="720"/>
       </w:pPr>
       <w:r>
-        <w:t xml:space="preserve">For users, quality means balances and </w:t>
-      </w:r>
-      <w:proofErr w:type="gramStart"/>
-      <w:r>
-        <w:t>envelope</w:t>
-      </w:r>
-      <w:proofErr w:type="gramEnd"/>
-      <w:r>
-        <w:t xml:space="preserve"> totals that are correct, private and easy to understand.</w:t>
+        <w:t>For users, quality means balances and envelope totals that are correct, private and easy to understand.</w:t>
       </w:r>
     </w:p>
     <w:p>
@@ -3856,15 +3862,7 @@
         <w:ind w:left="720"/>
       </w:pPr>
       <w:r>
-        <w:t xml:space="preserve">In terms of transcendent view, quality </w:t>
-      </w:r>
-      <w:proofErr w:type="gramStart"/>
-      <w:r>
-        <w:t>refer</w:t>
-      </w:r>
-      <w:proofErr w:type="gramEnd"/>
-      <w:r>
-        <w:t xml:space="preserve"> to the sense that the app can be trusted with one's money. Users recognise it through daily use, and it will also be built up when the other four views above are met.</w:t>
+        <w:t>In terms of transcendent view, quality refer to the sense that the app can be trusted with one's money. Users recognise it through daily use, and it will also be built up when the other four views above are met.</w:t>
       </w:r>
     </w:p>
     <w:p>
@@ -3925,15 +3923,7 @@
         <w:ind w:left="720"/>
       </w:pPr>
       <w:r>
-        <w:t xml:space="preserve">Actual </w:t>
-      </w:r>
-      <w:proofErr w:type="gramStart"/>
-      <w:r>
-        <w:t>stores</w:t>
-      </w:r>
-      <w:proofErr w:type="gramEnd"/>
-      <w:r>
-        <w:t xml:space="preserve"> user's transactions, balances and bank connections, which </w:t>
+        <w:t xml:space="preserve">Actual stores user's transactions, balances and bank connections, which </w:t>
       </w:r>
       <w:r>
         <w:t>are</w:t>
@@ -4098,39 +4088,7 @@
         <w:ind w:left="720"/>
       </w:pPr>
       <w:r>
-        <w:t xml:space="preserve">There is no test coverage measurement. Test coverage would not prove that the code is correct, but it would at least show what is untested. And reliability defects still reach users, like a sync defect that stopped some budgets from </w:t>
-      </w:r>
-      <w:proofErr w:type="gramStart"/>
-      <w:r>
-        <w:t>opening</w:t>
-      </w:r>
-      <w:proofErr w:type="gramEnd"/>
-      <w:r>
-        <w:t xml:space="preserve"> and it's stayed in released versions for years (Brown, 2026). Although Actual's testing checklist asks for "appropriate test coverage" (Actual Budget, n.d</w:t>
-      </w:r>
-      <w:proofErr w:type="gramStart"/>
-      <w:r>
-        <w:t>.-</w:t>
-      </w:r>
-      <w:proofErr w:type="gramEnd"/>
-      <w:r>
-        <w:t xml:space="preserve">i, Testing Checklist section), there's no coverage report found in the repository, and sync-server tests have coverage switched off (Actual Budget, 2026a). Therefore, nobody can tell how much of the sync and migration code is </w:t>
-      </w:r>
-      <w:proofErr w:type="gramStart"/>
-      <w:r>
-        <w:t>actually tested</w:t>
-      </w:r>
-      <w:proofErr w:type="gramEnd"/>
-      <w:r>
-        <w:t xml:space="preserve"> and </w:t>
-      </w:r>
-      <w:proofErr w:type="gramStart"/>
-      <w:r>
-        <w:t>actually safe</w:t>
-      </w:r>
-      <w:proofErr w:type="gramEnd"/>
-      <w:r>
-        <w:t>.</w:t>
+        <w:t>There is no test coverage measurement. Test coverage would not prove that the code is correct, but it would at least show what is untested. And reliability defects still reach users, like a sync defect that stopped some budgets from opening and it's stayed in released versions for years (Brown, 2026). Although Actual's testing checklist asks for "appropriate test coverage" (Actual Budget, n.d.-i, Testing Checklist section), there's no coverage report found in the repository, and sync-server tests have coverage switched off (Actual Budget, 2026a). Therefore, nobody can tell how much of the sync and migration code is actually tested and actually safe.</w:t>
       </w:r>
     </w:p>
     <w:p>
@@ -4182,15 +4140,7 @@
         <w:ind w:left="720"/>
       </w:pPr>
       <w:r>
-        <w:t xml:space="preserve">No written QA plan. Quality rules are spread across documentation, templates and CI files, so there's </w:t>
-      </w:r>
-      <w:proofErr w:type="gramStart"/>
-      <w:r>
-        <w:t>no</w:t>
-      </w:r>
-      <w:proofErr w:type="gramEnd"/>
-      <w:r>
-        <w:t xml:space="preserve"> a single place that states what must be checked before work moves on.</w:t>
+        <w:t>No written QA plan. Quality rules are spread across documentation, templates and CI files, so there's no a single place that states what must be checked before work moves on.</w:t>
       </w:r>
     </w:p>
     <w:p>
@@ -7133,7 +7083,6 @@
       <w:r>
         <w:t xml:space="preserve">Actual Budget. (2026a). </w:t>
       </w:r>
-      <w:proofErr w:type="gramStart"/>
       <w:r>
         <w:rPr>
           <w:i/>
@@ -7141,7 +7090,6 @@
         </w:rPr>
         <w:t>Actual</w:t>
       </w:r>
-      <w:proofErr w:type="gramEnd"/>
       <w:r>
         <w:t xml:space="preserve"> [Computer software]. GitHub. </w:t>
       </w:r>
@@ -7361,22 +7309,10 @@
           <w:i/>
           <w:iCs/>
         </w:rPr>
-        <w:t xml:space="preserve">[AI] fix(sync): receive only the latest timestamp to stop counter </w:t>
-      </w:r>
-      <w:proofErr w:type="gramStart"/>
-      <w:r>
-        <w:rPr>
-          <w:i/>
-          <w:iCs/>
-        </w:rPr>
-        <w:t>overflow</w:t>
-      </w:r>
-      <w:r>
-        <w:t xml:space="preserve"> (#</w:t>
-      </w:r>
-      <w:proofErr w:type="gramEnd"/>
-      <w:r>
-        <w:t xml:space="preserve">8706) [Commit]. GitHub. </w:t>
+        <w:t>[AI] fix(sync): receive only the latest timestamp to stop counter overflow</w:t>
+      </w:r>
+      <w:r>
+        <w:t xml:space="preserve"> (#8706) [Commit]. GitHub. </w:t>
       </w:r>
       <w:hyperlink r:id="rId38" w:history="1">
         <w:r>
@@ -7528,23 +7464,7 @@
           <w:i/>
           <w:iCs/>
         </w:rPr>
-        <w:t>Systems and software engineering — Systems and software Quality Requirements and Evaluation (</w:t>
-      </w:r>
-      <w:proofErr w:type="gramStart"/>
-      <w:r>
-        <w:rPr>
-          <w:i/>
-          <w:iCs/>
-        </w:rPr>
-        <w:t>SQuaRE) —</w:t>
-      </w:r>
-      <w:proofErr w:type="gramEnd"/>
-      <w:r>
-        <w:rPr>
-          <w:i/>
-          <w:iCs/>
-        </w:rPr>
-        <w:t xml:space="preserve"> Product quality model</w:t>
+        <w:t>Systems and software engineering — Systems and software Quality Requirements and Evaluation (SQuaRE) — Product quality model</w:t>
       </w:r>
       <w:r>
         <w:t xml:space="preserve"> (ISO/IEC Standard No. 25010:2023). </w:t>
@@ -7598,13 +7518,8 @@
         </w:numPr>
         <w:jc w:val="left"/>
       </w:pPr>
-      <w:proofErr w:type="gramStart"/>
-      <w:r>
-        <w:t>Open Source</w:t>
-      </w:r>
-      <w:proofErr w:type="gramEnd"/>
-      <w:r>
-        <w:t xml:space="preserve"> Technology Improvement Fund. (2026, January 30). </w:t>
+      <w:r>
+        <w:t xml:space="preserve">Open Source Technology Improvement Fund. (2026, January 30). </w:t>
       </w:r>
       <w:r>
         <w:rPr>
@@ -7668,37 +7583,12 @@
       <w:r>
         <w:t xml:space="preserve">Salkever, A. (2023). </w:t>
       </w:r>
-      <w:proofErr w:type="gramStart"/>
       <w:r>
         <w:rPr>
           <w:i/>
           <w:iCs/>
         </w:rPr>
-        <w:t>Open source</w:t>
-      </w:r>
-      <w:proofErr w:type="gramEnd"/>
-      <w:r>
-        <w:rPr>
-          <w:i/>
-          <w:iCs/>
-        </w:rPr>
-        <w:t xml:space="preserve"> maintainers: Exploring the people, practices, and constraints facing the world's most critical </w:t>
-      </w:r>
-      <w:proofErr w:type="gramStart"/>
-      <w:r>
-        <w:rPr>
-          <w:i/>
-          <w:iCs/>
-        </w:rPr>
-        <w:t>open source</w:t>
-      </w:r>
-      <w:proofErr w:type="gramEnd"/>
-      <w:r>
-        <w:rPr>
-          <w:i/>
-          <w:iCs/>
-        </w:rPr>
-        <w:t xml:space="preserve"> software projects</w:t>
+        <w:t>Open source maintainers: Exploring the people, practices, and constraints facing the world's most critical open source software projects</w:t>
       </w:r>
       <w:r>
         <w:t xml:space="preserve">. The Linux Foundation. </w:t>
@@ -7756,37 +7646,12 @@
       <w:r>
         <w:t xml:space="preserve">Stacoviak, A., &amp; Santo, J. (Hosts). (2022, July 1). </w:t>
       </w:r>
-      <w:proofErr w:type="gramStart"/>
       <w:r>
         <w:rPr>
           <w:i/>
           <w:iCs/>
         </w:rPr>
-        <w:t>Actual</w:t>
-      </w:r>
-      <w:proofErr w:type="gramEnd"/>
-      <w:r>
-        <w:rPr>
-          <w:i/>
-          <w:iCs/>
-        </w:rPr>
-        <w:t xml:space="preserve">(ly) </w:t>
-      </w:r>
-      <w:proofErr w:type="gramStart"/>
-      <w:r>
-        <w:rPr>
-          <w:i/>
-          <w:iCs/>
-        </w:rPr>
-        <w:t>opening up</w:t>
-      </w:r>
-      <w:proofErr w:type="gramEnd"/>
-      <w:r>
-        <w:rPr>
-          <w:i/>
-          <w:iCs/>
-        </w:rPr>
-        <w:t xml:space="preserve"> with James Long</w:t>
+        <w:t>Actual(ly) opening up with James Long</w:t>
       </w:r>
       <w:r>
         <w:t xml:space="preserve"> (No. 495) [Audio podcast episode]. In </w:t>
@@ -9974,106 +9839,25 @@
 <file path=word/numbering.xml><?xml version="1.0" encoding="utf-8"?>
 <w:numbering xmlns:wpc="http://schemas.microsoft.com/office/word/2010/wordprocessingCanvas" xmlns:cx="http://schemas.microsoft.com/office/drawing/2014/chartex" xmlns:cx1="http://schemas.microsoft.com/office/drawing/2015/9/8/chartex" xmlns:cx2="http://schemas.microsoft.com/office/drawing/2015/10/21/chartex" xmlns:cx3="http://schemas.microsoft.com/office/drawing/2016/5/9/chartex" xmlns:cx4="http://schemas.microsoft.com/office/drawing/2016/5/10/chartex" xmlns:cx5="http://schemas.microsoft.com/office/drawing/2016/5/11/chartex" xmlns:cx6="http://schemas.microsoft.com/office/drawing/2016/5/12/chartex" xmlns:cx7="http://schemas.microsoft.com/office/drawing/2016/5/13/chartex" xmlns:cx8="http://schemas.microsoft.com/office/drawing/2016/5/14/chartex" xmlns:mc="http://schemas.openxmlformats.org/markup-compatibility/2006" xmlns:aink="http://schemas.microsoft.com/office/drawing/2016/ink" xmlns:am3d="http://schemas.microsoft.com/office/drawing/2017/model3d" xmlns:o="urn:schemas-microsoft-com:office:office" xmlns:oel="http://schemas.microsoft.com/office/2019/extlst" xmlns:r="http://schemas.openxmlformats.org/officeDocument/2006/relationships" xmlns:m="http://schemas.openxmlformats.org/officeDocument/2006/math" xmlns:v="urn:schemas-microsoft-com:vml" xmlns:wp14="http://schemas.microsoft.com/office/word/2010/wordprocessingDrawing" xmlns:wp="http://schemas.openxmlformats.org/drawingml/2006/wordprocessingDrawing" xmlns:w10="urn:schemas-microsoft-com:office:word" xmlns:w="http://schemas.openxmlformats.org/wordprocessingml/2006/main" xmlns:w14="http://schemas.microsoft.com/office/word/2010/wordml" xmlns:w15="http://schemas.microsoft.com/office/word/2012/wordml" xmlns:w16cex="http://schemas.microsoft.com/office/word/2018/wordml/cex" xmlns:w16cid="http://schemas.microsoft.com/office/word/2016/wordml/cid" xmlns:w16="http://schemas.microsoft.com/office/word/2018/wordml" xmlns:w16du="http://schemas.microsoft.com/office/word/2023/wordml/word16du" xmlns:w16sdtdh="http://schemas.microsoft.com/office/word/2020/wordml/sdtdatahash" xmlns:w16sdtfl="http://schemas.microsoft.com/office/word/2024/wordml/sdtformatlock" xmlns:w16se="http://schemas.microsoft.com/office/word/2015/wordml/symex" xmlns:wpg="http://schemas.microsoft.com/office/word/2010/wordprocessingGroup" xmlns:wpi="http://schemas.microsoft.com/office/word/2010/wordprocessingInk" xmlns:wne="http://schemas.microsoft.com/office/word/2006/wordml" xmlns:wps="http://schemas.microsoft.com/office/word/2010/wordprocessingShape" mc:Ignorable="w14 w15 w16se w16cid w16 w16cex w16sdtdh w16sdtfl w16du wp14">
   <w:abstractNum w:abstractNumId="0" w15:restartNumberingAfterBreak="0">
-    <w:nsid w:val="0000A991"/>
-    <w:multiLevelType w:val="multilevel"/>
-    <w:tmpl w:val="3E025CE6"/>
+    <w:nsid w:val="1F7575AA"/>
+    <w:multiLevelType w:val="singleLevel"/>
+    <w:tmpl w:val="F8E29858"/>
+    <w:name w:val="ChallengeNumbers"/>
     <w:lvl w:ilvl="0">
-      <w:numFmt w:val="bullet"/>
-      <w:lvlText w:val=""/>
+      <w:start w:val="1"/>
+      <w:numFmt w:val="decimal"/>
+      <w:lvlText w:val="%1."/>
       <w:lvlJc w:val="left"/>
       <w:pPr>
+        <w:tabs>
+          <w:tab w:val="num" w:pos="720"/>
+        </w:tabs>
         <w:ind w:left="720" w:hanging="360"/>
       </w:pPr>
       <w:rPr>
-        <w:rFonts w:ascii="Symbol" w:hAnsi="Symbol" w:cs="Symbol" w:hint="default"/>
-      </w:rPr>
-    </w:lvl>
-    <w:lvl w:ilvl="1">
-      <w:numFmt w:val="bullet"/>
-      <w:lvlText w:val="o"/>
-      <w:lvlJc w:val="left"/>
-      <w:pPr>
-        <w:ind w:left="1440" w:hanging="360"/>
-      </w:pPr>
-      <w:rPr>
-        <w:rFonts w:ascii="Courier New" w:hAnsi="Courier New" w:cs="Courier New" w:hint="default"/>
-      </w:rPr>
-    </w:lvl>
-    <w:lvl w:ilvl="2">
-      <w:numFmt w:val="bullet"/>
-      <w:lvlText w:val=""/>
-      <w:lvlJc w:val="left"/>
-      <w:pPr>
-        <w:ind w:left="2160" w:hanging="360"/>
-      </w:pPr>
-      <w:rPr>
-        <w:rFonts w:ascii="Wingdings" w:hAnsi="Wingdings" w:cs="Wingdings" w:hint="default"/>
-      </w:rPr>
-    </w:lvl>
-    <w:lvl w:ilvl="3">
-      <w:numFmt w:val="bullet"/>
-      <w:lvlText w:val=""/>
-      <w:lvlJc w:val="left"/>
-      <w:pPr>
-        <w:ind w:left="2880" w:hanging="360"/>
-      </w:pPr>
-      <w:rPr>
-        <w:rFonts w:ascii="Symbol" w:hAnsi="Symbol" w:cs="Symbol" w:hint="default"/>
-      </w:rPr>
-    </w:lvl>
-    <w:lvl w:ilvl="4">
-      <w:numFmt w:val="bullet"/>
-      <w:lvlText w:val="o"/>
-      <w:lvlJc w:val="left"/>
-      <w:pPr>
-        <w:ind w:left="3600" w:hanging="360"/>
-      </w:pPr>
-      <w:rPr>
-        <w:rFonts w:ascii="Courier New" w:hAnsi="Courier New" w:cs="Courier New" w:hint="default"/>
-      </w:rPr>
-    </w:lvl>
-    <w:lvl w:ilvl="5">
-      <w:numFmt w:val="bullet"/>
-      <w:lvlText w:val=""/>
-      <w:lvlJc w:val="left"/>
-      <w:pPr>
-        <w:ind w:left="4320" w:hanging="360"/>
-      </w:pPr>
-      <w:rPr>
-        <w:rFonts w:ascii="Wingdings" w:hAnsi="Wingdings" w:cs="Wingdings" w:hint="default"/>
-      </w:rPr>
-    </w:lvl>
-    <w:lvl w:ilvl="6">
-      <w:numFmt w:val="bullet"/>
-      <w:lvlText w:val=""/>
-      <w:lvlJc w:val="left"/>
-      <w:pPr>
-        <w:ind w:left="5040" w:hanging="360"/>
-      </w:pPr>
-      <w:rPr>
-        <w:rFonts w:ascii="Symbol" w:hAnsi="Symbol" w:cs="Symbol" w:hint="default"/>
-      </w:rPr>
-    </w:lvl>
-    <w:lvl w:ilvl="7">
-      <w:numFmt w:val="bullet"/>
-      <w:lvlText w:val="o"/>
-      <w:lvlJc w:val="left"/>
-      <w:pPr>
-        <w:ind w:left="5760" w:hanging="360"/>
-      </w:pPr>
-      <w:rPr>
-        <w:rFonts w:ascii="Courier New" w:hAnsi="Courier New" w:cs="Courier New" w:hint="default"/>
-      </w:rPr>
-    </w:lvl>
-    <w:lvl w:ilvl="8">
-      <w:numFmt w:val="bullet"/>
-      <w:lvlText w:val=""/>
-      <w:lvlJc w:val="left"/>
-      <w:pPr>
-        <w:ind w:left="6480" w:hanging="360"/>
-      </w:pPr>
-      <w:rPr>
-        <w:rFonts w:ascii="Wingdings" w:hAnsi="Wingdings" w:cs="Wingdings" w:hint="default"/>
+        <w:rFonts w:ascii="Times New Roman" w:hAnsi="Times New Roman" w:cs="Times New Roman"/>
+        <w:b/>
+        <w:sz w:val="24"/>
       </w:rPr>
     </w:lvl>
   </w:abstractNum>
@@ -10164,6 +9948,28 @@
     </w:lvl>
   </w:abstractNum>
   <w:abstractNum w:abstractNumId="2" w15:restartNumberingAfterBreak="0">
+    <w:nsid w:val="3AD8336D"/>
+    <w:multiLevelType w:val="singleLevel"/>
+    <w:tmpl w:val="F8E29858"/>
+    <w:lvl w:ilvl="0">
+      <w:start w:val="1"/>
+      <w:numFmt w:val="decimal"/>
+      <w:lvlText w:val="%1."/>
+      <w:lvlJc w:val="left"/>
+      <w:pPr>
+        <w:tabs>
+          <w:tab w:val="num" w:pos="720"/>
+        </w:tabs>
+        <w:ind w:left="720" w:hanging="360"/>
+      </w:pPr>
+      <w:rPr>
+        <w:rFonts w:ascii="Times New Roman" w:hAnsi="Times New Roman" w:cs="Times New Roman"/>
+        <w:b/>
+        <w:sz w:val="24"/>
+      </w:rPr>
+    </w:lvl>
+  </w:abstractNum>
+  <w:abstractNum w:abstractNumId="3" w15:restartNumberingAfterBreak="0">
     <w:nsid w:val="44C91F01"/>
     <w:multiLevelType w:val="singleLevel"/>
     <w:tmpl w:val="607627D4"/>
@@ -10187,7 +9993,7 @@
       </w:rPr>
     </w:lvl>
   </w:abstractNum>
-  <w:abstractNum w:abstractNumId="3" w15:restartNumberingAfterBreak="0">
+  <w:abstractNum w:abstractNumId="4" w15:restartNumberingAfterBreak="0">
     <w:nsid w:val="7CE06A69"/>
     <w:multiLevelType w:val="multilevel"/>
     <w:tmpl w:val="081EB290"/>
@@ -10294,13 +10100,16 @@
     <w:abstractNumId w:val="1"/>
   </w:num>
   <w:num w:numId="2" w16cid:durableId="2114588318">
-    <w:abstractNumId w:val="0"/>
+    <w:abstractNumId w:val="2"/>
   </w:num>
   <w:num w:numId="3" w16cid:durableId="1996765505">
+    <w:abstractNumId w:val="4"/>
+  </w:num>
+  <w:num w:numId="4" w16cid:durableId="659387958">
     <w:abstractNumId w:val="3"/>
   </w:num>
-  <w:num w:numId="4" w16cid:durableId="659387958">
-    <w:abstractNumId w:val="2"/>
+  <w:num w:numId="5" w16cid:durableId="2092699276">
+    <w:abstractNumId w:val="0"/>
   </w:num>
 </w:numbering>
 </file>

</xml_diff>

<commit_message>
Tighten gap between reference numbers and text
Co-Authored-By: Claude Opus 5.5 <noreply@anthropic.com>
</commit_message>
<xml_diff>
--- a/report/assignment-1/Assignment-1-Report.docx
+++ b/report/assignment-1/Assignment-1-Report.docx
@@ -3758,7 +3758,15 @@
         <w:ind w:left="720"/>
       </w:pPr>
       <w:r>
-        <w:t>For users, quality means balances and envelope totals that are correct, private and easy to understand.</w:t>
+        <w:t xml:space="preserve">For users, quality means balances and </w:t>
+      </w:r>
+      <w:proofErr w:type="gramStart"/>
+      <w:r>
+        <w:t>envelope</w:t>
+      </w:r>
+      <w:proofErr w:type="gramEnd"/>
+      <w:r>
+        <w:t xml:space="preserve"> totals that are correct, private and easy to understand.</w:t>
       </w:r>
     </w:p>
     <w:p>
@@ -3862,7 +3870,15 @@
         <w:ind w:left="720"/>
       </w:pPr>
       <w:r>
-        <w:t>In terms of transcendent view, quality refer to the sense that the app can be trusted with one's money. Users recognise it through daily use, and it will also be built up when the other four views above are met.</w:t>
+        <w:t xml:space="preserve">In terms of transcendent view, quality </w:t>
+      </w:r>
+      <w:proofErr w:type="gramStart"/>
+      <w:r>
+        <w:t>refer</w:t>
+      </w:r>
+      <w:proofErr w:type="gramEnd"/>
+      <w:r>
+        <w:t xml:space="preserve"> to the sense that the app can be trusted with one's money. Users recognise it through daily use, and it will also be built up when the other four views above are met.</w:t>
       </w:r>
     </w:p>
     <w:p>
@@ -3923,7 +3939,15 @@
         <w:ind w:left="720"/>
       </w:pPr>
       <w:r>
-        <w:t xml:space="preserve">Actual stores user's transactions, balances and bank connections, which </w:t>
+        <w:t xml:space="preserve">Actual </w:t>
+      </w:r>
+      <w:proofErr w:type="gramStart"/>
+      <w:r>
+        <w:t>stores</w:t>
+      </w:r>
+      <w:proofErr w:type="gramEnd"/>
+      <w:r>
+        <w:t xml:space="preserve"> user's transactions, balances and bank connections, which </w:t>
       </w:r>
       <w:r>
         <w:t>are</w:t>
@@ -4088,7 +4112,39 @@
         <w:ind w:left="720"/>
       </w:pPr>
       <w:r>
-        <w:t>There is no test coverage measurement. Test coverage would not prove that the code is correct, but it would at least show what is untested. And reliability defects still reach users, like a sync defect that stopped some budgets from opening and it's stayed in released versions for years (Brown, 2026). Although Actual's testing checklist asks for "appropriate test coverage" (Actual Budget, n.d.-i, Testing Checklist section), there's no coverage report found in the repository, and sync-server tests have coverage switched off (Actual Budget, 2026a). Therefore, nobody can tell how much of the sync and migration code is actually tested and actually safe.</w:t>
+        <w:t xml:space="preserve">There is no test coverage measurement. Test coverage would not prove that the code is correct, but it would at least show what is untested. And reliability defects still reach users, like a sync defect that stopped some budgets from </w:t>
+      </w:r>
+      <w:proofErr w:type="gramStart"/>
+      <w:r>
+        <w:t>opening</w:t>
+      </w:r>
+      <w:proofErr w:type="gramEnd"/>
+      <w:r>
+        <w:t xml:space="preserve"> and it's stayed in released versions for years (Brown, 2026). Although Actual's testing checklist asks for "appropriate test coverage" (Actual Budget, n.d</w:t>
+      </w:r>
+      <w:proofErr w:type="gramStart"/>
+      <w:r>
+        <w:t>.-</w:t>
+      </w:r>
+      <w:proofErr w:type="gramEnd"/>
+      <w:r>
+        <w:t xml:space="preserve">i, Testing Checklist section), there's no coverage report found in the repository, and sync-server tests have coverage switched off (Actual Budget, 2026a). Therefore, nobody can tell how much of the sync and migration code is </w:t>
+      </w:r>
+      <w:proofErr w:type="gramStart"/>
+      <w:r>
+        <w:t>actually tested</w:t>
+      </w:r>
+      <w:proofErr w:type="gramEnd"/>
+      <w:r>
+        <w:t xml:space="preserve"> and </w:t>
+      </w:r>
+      <w:proofErr w:type="gramStart"/>
+      <w:r>
+        <w:t>actually safe</w:t>
+      </w:r>
+      <w:proofErr w:type="gramEnd"/>
+      <w:r>
+        <w:t>.</w:t>
       </w:r>
     </w:p>
     <w:p>
@@ -4140,7 +4196,15 @@
         <w:ind w:left="720"/>
       </w:pPr>
       <w:r>
-        <w:t>No written QA plan. Quality rules are spread across documentation, templates and CI files, so there's no a single place that states what must be checked before work moves on.</w:t>
+        <w:t xml:space="preserve">No written QA plan. Quality rules are spread across documentation, templates and CI files, so there's </w:t>
+      </w:r>
+      <w:proofErr w:type="gramStart"/>
+      <w:r>
+        <w:t>no</w:t>
+      </w:r>
+      <w:proofErr w:type="gramEnd"/>
+      <w:r>
+        <w:t xml:space="preserve"> a single place that states what must be checked before work moves on.</w:t>
       </w:r>
     </w:p>
     <w:p>
@@ -7083,6 +7147,7 @@
       <w:r>
         <w:t xml:space="preserve">Actual Budget. (2026a). </w:t>
       </w:r>
+      <w:proofErr w:type="gramStart"/>
       <w:r>
         <w:rPr>
           <w:i/>
@@ -7090,6 +7155,7 @@
         </w:rPr>
         <w:t>Actual</w:t>
       </w:r>
+      <w:proofErr w:type="gramEnd"/>
       <w:r>
         <w:t xml:space="preserve"> [Computer software]. GitHub. </w:t>
       </w:r>
@@ -7309,10 +7375,22 @@
           <w:i/>
           <w:iCs/>
         </w:rPr>
-        <w:t>[AI] fix(sync): receive only the latest timestamp to stop counter overflow</w:t>
-      </w:r>
-      <w:r>
-        <w:t xml:space="preserve"> (#8706) [Commit]. GitHub. </w:t>
+        <w:t xml:space="preserve">[AI] fix(sync): receive only the latest timestamp to stop counter </w:t>
+      </w:r>
+      <w:proofErr w:type="gramStart"/>
+      <w:r>
+        <w:rPr>
+          <w:i/>
+          <w:iCs/>
+        </w:rPr>
+        <w:t>overflow</w:t>
+      </w:r>
+      <w:r>
+        <w:t xml:space="preserve"> (#</w:t>
+      </w:r>
+      <w:proofErr w:type="gramEnd"/>
+      <w:r>
+        <w:t xml:space="preserve">8706) [Commit]. GitHub. </w:t>
       </w:r>
       <w:hyperlink r:id="rId38" w:history="1">
         <w:r>
@@ -7464,7 +7542,23 @@
           <w:i/>
           <w:iCs/>
         </w:rPr>
-        <w:t>Systems and software engineering — Systems and software Quality Requirements and Evaluation (SQuaRE) — Product quality model</w:t>
+        <w:t>Systems and software engineering — Systems and software Quality Requirements and Evaluation (</w:t>
+      </w:r>
+      <w:proofErr w:type="gramStart"/>
+      <w:r>
+        <w:rPr>
+          <w:i/>
+          <w:iCs/>
+        </w:rPr>
+        <w:t>SQuaRE) —</w:t>
+      </w:r>
+      <w:proofErr w:type="gramEnd"/>
+      <w:r>
+        <w:rPr>
+          <w:i/>
+          <w:iCs/>
+        </w:rPr>
+        <w:t xml:space="preserve"> Product quality model</w:t>
       </w:r>
       <w:r>
         <w:t xml:space="preserve"> (ISO/IEC Standard No. 25010:2023). </w:t>
@@ -7518,8 +7612,13 @@
         </w:numPr>
         <w:jc w:val="left"/>
       </w:pPr>
-      <w:r>
-        <w:t xml:space="preserve">Open Source Technology Improvement Fund. (2026, January 30). </w:t>
+      <w:proofErr w:type="gramStart"/>
+      <w:r>
+        <w:t>Open Source</w:t>
+      </w:r>
+      <w:proofErr w:type="gramEnd"/>
+      <w:r>
+        <w:t xml:space="preserve"> Technology Improvement Fund. (2026, January 30). </w:t>
       </w:r>
       <w:r>
         <w:rPr>
@@ -7583,12 +7682,37 @@
       <w:r>
         <w:t xml:space="preserve">Salkever, A. (2023). </w:t>
       </w:r>
+      <w:proofErr w:type="gramStart"/>
       <w:r>
         <w:rPr>
           <w:i/>
           <w:iCs/>
         </w:rPr>
-        <w:t>Open source maintainers: Exploring the people, practices, and constraints facing the world's most critical open source software projects</w:t>
+        <w:t>Open source</w:t>
+      </w:r>
+      <w:proofErr w:type="gramEnd"/>
+      <w:r>
+        <w:rPr>
+          <w:i/>
+          <w:iCs/>
+        </w:rPr>
+        <w:t xml:space="preserve"> maintainers: Exploring the people, practices, and constraints facing the world's most critical </w:t>
+      </w:r>
+      <w:proofErr w:type="gramStart"/>
+      <w:r>
+        <w:rPr>
+          <w:i/>
+          <w:iCs/>
+        </w:rPr>
+        <w:t>open source</w:t>
+      </w:r>
+      <w:proofErr w:type="gramEnd"/>
+      <w:r>
+        <w:rPr>
+          <w:i/>
+          <w:iCs/>
+        </w:rPr>
+        <w:t xml:space="preserve"> software projects</w:t>
       </w:r>
       <w:r>
         <w:t xml:space="preserve">. The Linux Foundation. </w:t>
@@ -7646,12 +7770,37 @@
       <w:r>
         <w:t xml:space="preserve">Stacoviak, A., &amp; Santo, J. (Hosts). (2022, July 1). </w:t>
       </w:r>
+      <w:proofErr w:type="gramStart"/>
       <w:r>
         <w:rPr>
           <w:i/>
           <w:iCs/>
         </w:rPr>
-        <w:t>Actual(ly) opening up with James Long</w:t>
+        <w:t>Actual</w:t>
+      </w:r>
+      <w:proofErr w:type="gramEnd"/>
+      <w:r>
+        <w:rPr>
+          <w:i/>
+          <w:iCs/>
+        </w:rPr>
+        <w:t xml:space="preserve">(ly) </w:t>
+      </w:r>
+      <w:proofErr w:type="gramStart"/>
+      <w:r>
+        <w:rPr>
+          <w:i/>
+          <w:iCs/>
+        </w:rPr>
+        <w:t>opening up</w:t>
+      </w:r>
+      <w:proofErr w:type="gramEnd"/>
+      <w:r>
+        <w:rPr>
+          <w:i/>
+          <w:iCs/>
+        </w:rPr>
+        <w:t xml:space="preserve"> with James Long</w:t>
       </w:r>
       <w:r>
         <w:t xml:space="preserve"> (No. 495) [Audio podcast episode]. In </w:t>
@@ -9972,7 +10121,7 @@
   <w:abstractNum w:abstractNumId="3" w15:restartNumberingAfterBreak="0">
     <w:nsid w:val="44C91F01"/>
     <w:multiLevelType w:val="singleLevel"/>
-    <w:tmpl w:val="607627D4"/>
+    <w:tmpl w:val="3F9E1BA6"/>
     <w:name w:val="RefNumbers"/>
     <w:lvl w:ilvl="0">
       <w:start w:val="1"/>
@@ -9981,9 +10130,9 @@
       <w:lvlJc w:val="left"/>
       <w:pPr>
         <w:tabs>
-          <w:tab w:val="num" w:pos="720"/>
+          <w:tab w:val="num" w:pos="440"/>
         </w:tabs>
-        <w:ind w:left="720" w:hanging="720"/>
+        <w:ind w:left="440" w:hanging="440"/>
       </w:pPr>
       <w:rPr>
         <w:rFonts w:ascii="Times New Roman" w:hAnsi="Times New Roman" w:cs="Times New Roman"/>

</xml_diff>

<commit_message>
Close gap between figures and their captions
Co-Authored-By: Claude Opus 5.5 <noreply@anthropic.com>
</commit_message>
<xml_diff>
--- a/report/assignment-1/Assignment-1-Report.docx
+++ b/report/assignment-1/Assignment-1-Report.docx
@@ -2896,6 +2896,7 @@
       <w:pPr>
         <w:pStyle w:val="BodyText"/>
         <w:keepNext/>
+        <w:spacing w:before="120" w:after="0"/>
         <w:jc w:val="center"/>
       </w:pPr>
       <w:r>
@@ -3435,6 +3436,7 @@
       <w:pPr>
         <w:pStyle w:val="BodyText"/>
         <w:keepNext/>
+        <w:spacing w:before="120" w:after="0"/>
         <w:jc w:val="center"/>
       </w:pPr>
       <w:r>
@@ -3590,6 +3592,7 @@
       <w:pPr>
         <w:pStyle w:val="BodyText"/>
         <w:keepNext/>
+        <w:spacing w:before="120" w:after="0"/>
         <w:jc w:val="center"/>
       </w:pPr>
       <w:r>
@@ -7250,11 +7253,7 @@
         <w:t>Privilege escalation via 'change-password' endpoint on OpenID-migrated servers</w:t>
       </w:r>
       <w:r>
-        <w:t xml:space="preserve"> (GHSA-prp4-2f49-fcgp) [Security advisory]. </w:t>
-      </w:r>
-      <w:r>
-        <w:lastRenderedPageBreak/>
-        <w:t xml:space="preserve">GitHub. </w:t>
+        <w:t xml:space="preserve"> (GHSA-prp4-2f49-fcgp) [Security advisory]. GitHub. </w:t>
       </w:r>
       <w:hyperlink r:id="rId34" w:history="1">
         <w:r>
@@ -7275,6 +7274,7 @@
         <w:jc w:val="left"/>
       </w:pPr>
       <w:r>
+        <w:lastRenderedPageBreak/>
         <w:t xml:space="preserve">Ahmad, M. O., Dennehy, D., Conboy, K., &amp; Oivo, M. (2018). Kanban in software engineering: A systematic mapping study. </w:t>
       </w:r>
       <w:r>
@@ -7736,7 +7736,6 @@
         <w:jc w:val="left"/>
       </w:pPr>
       <w:r>
-        <w:lastRenderedPageBreak/>
         <w:t xml:space="preserve">Schwaber, K., &amp; Sutherland, J. (2020). </w:t>
       </w:r>
       <w:r>
@@ -7768,6 +7767,7 @@
         <w:jc w:val="left"/>
       </w:pPr>
       <w:r>
+        <w:lastRenderedPageBreak/>
         <w:t xml:space="preserve">Stacoviak, A., &amp; Santo, J. (Hosts). (2022, July 1). </w:t>
       </w:r>
       <w:proofErr w:type="gramStart"/>

</xml_diff>

<commit_message>
Save author's Word edits; ignore Office lock files
Co-Authored-By: Claude Opus 5.5 <noreply@anthropic.com>
</commit_message>
<xml_diff>
--- a/report/assignment-1/Assignment-1-Report.docx
+++ b/report/assignment-1/Assignment-1-Report.docx
@@ -691,7 +691,7 @@
             </w:rPr>
             <w:fldChar w:fldCharType="separate"/>
           </w:r>
-          <w:hyperlink w:anchor="_Toc244221394" w:history="1">
+          <w:hyperlink w:anchor="_Toc244222479" w:history="1">
             <w:r>
               <w:rPr>
                 <w:rStyle w:val="Hyperlink"/>
@@ -718,7 +718,7 @@
                 <w:noProof/>
                 <w:webHidden/>
               </w:rPr>
-              <w:instrText xml:space="preserve"> PAGEREF _Toc244221394 \h </w:instrText>
+              <w:instrText xml:space="preserve"> PAGEREF _Toc244222479 \h </w:instrText>
             </w:r>
             <w:r>
               <w:rPr>
@@ -761,7 +761,7 @@
               <w:noProof/>
             </w:rPr>
           </w:pPr>
-          <w:hyperlink w:anchor="_Toc244221395" w:history="1">
+          <w:hyperlink w:anchor="_Toc244222480" w:history="1">
             <w:r>
               <w:rPr>
                 <w:rStyle w:val="Hyperlink"/>
@@ -788,7 +788,7 @@
                 <w:noProof/>
                 <w:webHidden/>
               </w:rPr>
-              <w:instrText xml:space="preserve"> PAGEREF _Toc244221395 \h </w:instrText>
+              <w:instrText xml:space="preserve"> PAGEREF _Toc244222480 \h </w:instrText>
             </w:r>
             <w:r>
               <w:rPr>
@@ -830,7 +830,7 @@
               <w:noProof/>
             </w:rPr>
           </w:pPr>
-          <w:hyperlink w:anchor="_Toc244221396" w:history="1">
+          <w:hyperlink w:anchor="_Toc244222481" w:history="1">
             <w:r>
               <w:rPr>
                 <w:rStyle w:val="Hyperlink"/>
@@ -857,7 +857,7 @@
                 <w:noProof/>
                 <w:webHidden/>
               </w:rPr>
-              <w:instrText xml:space="preserve"> PAGEREF _Toc244221396 \h </w:instrText>
+              <w:instrText xml:space="preserve"> PAGEREF _Toc244222481 \h </w:instrText>
             </w:r>
             <w:r>
               <w:rPr>
@@ -899,7 +899,7 @@
               <w:noProof/>
             </w:rPr>
           </w:pPr>
-          <w:hyperlink w:anchor="_Toc244221397" w:history="1">
+          <w:hyperlink w:anchor="_Toc244222482" w:history="1">
             <w:r>
               <w:rPr>
                 <w:rStyle w:val="Hyperlink"/>
@@ -926,7 +926,7 @@
                 <w:noProof/>
                 <w:webHidden/>
               </w:rPr>
-              <w:instrText xml:space="preserve"> PAGEREF _Toc244221397 \h </w:instrText>
+              <w:instrText xml:space="preserve"> PAGEREF _Toc244222482 \h </w:instrText>
             </w:r>
             <w:r>
               <w:rPr>
@@ -968,7 +968,7 @@
               <w:noProof/>
             </w:rPr>
           </w:pPr>
-          <w:hyperlink w:anchor="_Toc244221398" w:history="1">
+          <w:hyperlink w:anchor="_Toc244222483" w:history="1">
             <w:r>
               <w:rPr>
                 <w:rStyle w:val="Hyperlink"/>
@@ -995,7 +995,7 @@
                 <w:noProof/>
                 <w:webHidden/>
               </w:rPr>
-              <w:instrText xml:space="preserve"> PAGEREF _Toc244221398 \h </w:instrText>
+              <w:instrText xml:space="preserve"> PAGEREF _Toc244222483 \h </w:instrText>
             </w:r>
             <w:r>
               <w:rPr>
@@ -1037,7 +1037,7 @@
               <w:noProof/>
             </w:rPr>
           </w:pPr>
-          <w:hyperlink w:anchor="_Toc244221399" w:history="1">
+          <w:hyperlink w:anchor="_Toc244222484" w:history="1">
             <w:r>
               <w:rPr>
                 <w:rStyle w:val="Hyperlink"/>
@@ -1064,7 +1064,7 @@
                 <w:noProof/>
                 <w:webHidden/>
               </w:rPr>
-              <w:instrText xml:space="preserve"> PAGEREF _Toc244221399 \h </w:instrText>
+              <w:instrText xml:space="preserve"> PAGEREF _Toc244222484 \h </w:instrText>
             </w:r>
             <w:r>
               <w:rPr>
@@ -1106,7 +1106,7 @@
               <w:noProof/>
             </w:rPr>
           </w:pPr>
-          <w:hyperlink w:anchor="_Toc244221400" w:history="1">
+          <w:hyperlink w:anchor="_Toc244222485" w:history="1">
             <w:r>
               <w:rPr>
                 <w:rStyle w:val="Hyperlink"/>
@@ -1133,7 +1133,7 @@
                 <w:noProof/>
                 <w:webHidden/>
               </w:rPr>
-              <w:instrText xml:space="preserve"> PAGEREF _Toc244221400 \h </w:instrText>
+              <w:instrText xml:space="preserve"> PAGEREF _Toc244222485 \h </w:instrText>
             </w:r>
             <w:r>
               <w:rPr>
@@ -1176,7 +1176,7 @@
               <w:noProof/>
             </w:rPr>
           </w:pPr>
-          <w:hyperlink w:anchor="_Toc244221401" w:history="1">
+          <w:hyperlink w:anchor="_Toc244222486" w:history="1">
             <w:r>
               <w:rPr>
                 <w:rStyle w:val="Hyperlink"/>
@@ -1203,7 +1203,7 @@
                 <w:noProof/>
                 <w:webHidden/>
               </w:rPr>
-              <w:instrText xml:space="preserve"> PAGEREF _Toc244221401 \h </w:instrText>
+              <w:instrText xml:space="preserve"> PAGEREF _Toc244222486 \h </w:instrText>
             </w:r>
             <w:r>
               <w:rPr>
@@ -1245,7 +1245,7 @@
               <w:noProof/>
             </w:rPr>
           </w:pPr>
-          <w:hyperlink w:anchor="_Toc244221402" w:history="1">
+          <w:hyperlink w:anchor="_Toc244222487" w:history="1">
             <w:r>
               <w:rPr>
                 <w:rStyle w:val="Hyperlink"/>
@@ -1272,7 +1272,7 @@
                 <w:noProof/>
                 <w:webHidden/>
               </w:rPr>
-              <w:instrText xml:space="preserve"> PAGEREF _Toc244221402 \h </w:instrText>
+              <w:instrText xml:space="preserve"> PAGEREF _Toc244222487 \h </w:instrText>
             </w:r>
             <w:r>
               <w:rPr>
@@ -1314,7 +1314,7 @@
               <w:noProof/>
             </w:rPr>
           </w:pPr>
-          <w:hyperlink w:anchor="_Toc244221403" w:history="1">
+          <w:hyperlink w:anchor="_Toc244222488" w:history="1">
             <w:r>
               <w:rPr>
                 <w:rStyle w:val="Hyperlink"/>
@@ -1341,7 +1341,7 @@
                 <w:noProof/>
                 <w:webHidden/>
               </w:rPr>
-              <w:instrText xml:space="preserve"> PAGEREF _Toc244221403 \h </w:instrText>
+              <w:instrText xml:space="preserve"> PAGEREF _Toc244222488 \h </w:instrText>
             </w:r>
             <w:r>
               <w:rPr>
@@ -1383,7 +1383,7 @@
               <w:noProof/>
             </w:rPr>
           </w:pPr>
-          <w:hyperlink w:anchor="_Toc244221404" w:history="1">
+          <w:hyperlink w:anchor="_Toc244222489" w:history="1">
             <w:r>
               <w:rPr>
                 <w:rStyle w:val="Hyperlink"/>
@@ -1410,7 +1410,7 @@
                 <w:noProof/>
                 <w:webHidden/>
               </w:rPr>
-              <w:instrText xml:space="preserve"> PAGEREF _Toc244221404 \h </w:instrText>
+              <w:instrText xml:space="preserve"> PAGEREF _Toc244222489 \h </w:instrText>
             </w:r>
             <w:r>
               <w:rPr>
@@ -1452,7 +1452,7 @@
               <w:noProof/>
             </w:rPr>
           </w:pPr>
-          <w:hyperlink w:anchor="_Toc244221405" w:history="1">
+          <w:hyperlink w:anchor="_Toc244222490" w:history="1">
             <w:r>
               <w:rPr>
                 <w:rStyle w:val="Hyperlink"/>
@@ -1479,7 +1479,7 @@
                 <w:noProof/>
                 <w:webHidden/>
               </w:rPr>
-              <w:instrText xml:space="preserve"> PAGEREF _Toc244221405 \h </w:instrText>
+              <w:instrText xml:space="preserve"> PAGEREF _Toc244222490 \h </w:instrText>
             </w:r>
             <w:r>
               <w:rPr>
@@ -1499,7 +1499,7 @@
                 <w:noProof/>
                 <w:webHidden/>
               </w:rPr>
-              <w:t>8</w:t>
+              <w:t>7</w:t>
             </w:r>
             <w:r>
               <w:rPr>
@@ -1522,7 +1522,7 @@
               <w:noProof/>
             </w:rPr>
           </w:pPr>
-          <w:hyperlink w:anchor="_Toc244221406" w:history="1">
+          <w:hyperlink w:anchor="_Toc244222491" w:history="1">
             <w:r>
               <w:rPr>
                 <w:rStyle w:val="Hyperlink"/>
@@ -1549,7 +1549,7 @@
                 <w:noProof/>
                 <w:webHidden/>
               </w:rPr>
-              <w:instrText xml:space="preserve"> PAGEREF _Toc244221406 \h </w:instrText>
+              <w:instrText xml:space="preserve"> PAGEREF _Toc244222491 \h </w:instrText>
             </w:r>
             <w:r>
               <w:rPr>
@@ -1591,7 +1591,7 @@
               <w:noProof/>
             </w:rPr>
           </w:pPr>
-          <w:hyperlink w:anchor="_Toc244221407" w:history="1">
+          <w:hyperlink w:anchor="_Toc244222492" w:history="1">
             <w:r>
               <w:rPr>
                 <w:rStyle w:val="Hyperlink"/>
@@ -1618,7 +1618,7 @@
                 <w:noProof/>
                 <w:webHidden/>
               </w:rPr>
-              <w:instrText xml:space="preserve"> PAGEREF _Toc244221407 \h </w:instrText>
+              <w:instrText xml:space="preserve"> PAGEREF _Toc244222492 \h </w:instrText>
             </w:r>
             <w:r>
               <w:rPr>
@@ -1660,7 +1660,7 @@
               <w:noProof/>
             </w:rPr>
           </w:pPr>
-          <w:hyperlink w:anchor="_Toc244221408" w:history="1">
+          <w:hyperlink w:anchor="_Toc244222493" w:history="1">
             <w:r>
               <w:rPr>
                 <w:rStyle w:val="Hyperlink"/>
@@ -1687,7 +1687,7 @@
                 <w:noProof/>
                 <w:webHidden/>
               </w:rPr>
-              <w:instrText xml:space="preserve"> PAGEREF _Toc244221408 \h </w:instrText>
+              <w:instrText xml:space="preserve"> PAGEREF _Toc244222493 \h </w:instrText>
             </w:r>
             <w:r>
               <w:rPr>
@@ -1729,7 +1729,7 @@
               <w:noProof/>
             </w:rPr>
           </w:pPr>
-          <w:hyperlink w:anchor="_Toc244221409" w:history="1">
+          <w:hyperlink w:anchor="_Toc244222494" w:history="1">
             <w:r>
               <w:rPr>
                 <w:rStyle w:val="Hyperlink"/>
@@ -1756,7 +1756,7 @@
                 <w:noProof/>
                 <w:webHidden/>
               </w:rPr>
-              <w:instrText xml:space="preserve"> PAGEREF _Toc244221409 \h </w:instrText>
+              <w:instrText xml:space="preserve"> PAGEREF _Toc244222494 \h </w:instrText>
             </w:r>
             <w:r>
               <w:rPr>
@@ -1798,7 +1798,7 @@
               <w:noProof/>
             </w:rPr>
           </w:pPr>
-          <w:hyperlink w:anchor="_Toc244221410" w:history="1">
+          <w:hyperlink w:anchor="_Toc244222495" w:history="1">
             <w:r>
               <w:rPr>
                 <w:rStyle w:val="Hyperlink"/>
@@ -1825,7 +1825,7 @@
                 <w:noProof/>
                 <w:webHidden/>
               </w:rPr>
-              <w:instrText xml:space="preserve"> PAGEREF _Toc244221410 \h </w:instrText>
+              <w:instrText xml:space="preserve"> PAGEREF _Toc244222495 \h </w:instrText>
             </w:r>
             <w:r>
               <w:rPr>
@@ -1845,7 +1845,7 @@
                 <w:noProof/>
                 <w:webHidden/>
               </w:rPr>
-              <w:t>10</w:t>
+              <w:t>11</w:t>
             </w:r>
             <w:r>
               <w:rPr>
@@ -1867,7 +1867,7 @@
               <w:noProof/>
             </w:rPr>
           </w:pPr>
-          <w:hyperlink w:anchor="_Toc244221411" w:history="1">
+          <w:hyperlink w:anchor="_Toc244222496" w:history="1">
             <w:r>
               <w:rPr>
                 <w:rStyle w:val="Hyperlink"/>
@@ -1894,7 +1894,7 @@
                 <w:noProof/>
                 <w:webHidden/>
               </w:rPr>
-              <w:instrText xml:space="preserve"> PAGEREF _Toc244221411 \h </w:instrText>
+              <w:instrText xml:space="preserve"> PAGEREF _Toc244222496 \h </w:instrText>
             </w:r>
             <w:r>
               <w:rPr>
@@ -1936,7 +1936,7 @@
               <w:noProof/>
             </w:rPr>
           </w:pPr>
-          <w:hyperlink w:anchor="_Toc244221412" w:history="1">
+          <w:hyperlink w:anchor="_Toc244222497" w:history="1">
             <w:r>
               <w:rPr>
                 <w:rStyle w:val="Hyperlink"/>
@@ -1963,7 +1963,7 @@
                 <w:noProof/>
                 <w:webHidden/>
               </w:rPr>
-              <w:instrText xml:space="preserve"> PAGEREF _Toc244221412 \h </w:instrText>
+              <w:instrText xml:space="preserve"> PAGEREF _Toc244222497 \h </w:instrText>
             </w:r>
             <w:r>
               <w:rPr>
@@ -2006,7 +2006,7 @@
               <w:noProof/>
             </w:rPr>
           </w:pPr>
-          <w:hyperlink w:anchor="_Toc244221413" w:history="1">
+          <w:hyperlink w:anchor="_Toc244222498" w:history="1">
             <w:r>
               <w:rPr>
                 <w:rStyle w:val="Hyperlink"/>
@@ -2033,7 +2033,7 @@
                 <w:noProof/>
                 <w:webHidden/>
               </w:rPr>
-              <w:instrText xml:space="preserve"> PAGEREF _Toc244221413 \h </w:instrText>
+              <w:instrText xml:space="preserve"> PAGEREF _Toc244222498 \h </w:instrText>
             </w:r>
             <w:r>
               <w:rPr>
@@ -2075,7 +2075,7 @@
               <w:noProof/>
             </w:rPr>
           </w:pPr>
-          <w:hyperlink w:anchor="_Toc244221414" w:history="1">
+          <w:hyperlink w:anchor="_Toc244222499" w:history="1">
             <w:r>
               <w:rPr>
                 <w:rStyle w:val="Hyperlink"/>
@@ -2102,7 +2102,7 @@
                 <w:noProof/>
                 <w:webHidden/>
               </w:rPr>
-              <w:instrText xml:space="preserve"> PAGEREF _Toc244221414 \h </w:instrText>
+              <w:instrText xml:space="preserve"> PAGEREF _Toc244222499 \h </w:instrText>
             </w:r>
             <w:r>
               <w:rPr>
@@ -2144,7 +2144,7 @@
               <w:noProof/>
             </w:rPr>
           </w:pPr>
-          <w:hyperlink w:anchor="_Toc244221415" w:history="1">
+          <w:hyperlink w:anchor="_Toc244222500" w:history="1">
             <w:r>
               <w:rPr>
                 <w:rStyle w:val="Hyperlink"/>
@@ -2171,7 +2171,7 @@
                 <w:noProof/>
                 <w:webHidden/>
               </w:rPr>
-              <w:instrText xml:space="preserve"> PAGEREF _Toc244221415 \h </w:instrText>
+              <w:instrText xml:space="preserve"> PAGEREF _Toc244222500 \h </w:instrText>
             </w:r>
             <w:r>
               <w:rPr>
@@ -2213,7 +2213,7 @@
               <w:noProof/>
             </w:rPr>
           </w:pPr>
-          <w:hyperlink w:anchor="_Toc244221416" w:history="1">
+          <w:hyperlink w:anchor="_Toc244222501" w:history="1">
             <w:r>
               <w:rPr>
                 <w:rStyle w:val="Hyperlink"/>
@@ -2240,7 +2240,7 @@
                 <w:noProof/>
                 <w:webHidden/>
               </w:rPr>
-              <w:instrText xml:space="preserve"> PAGEREF _Toc244221416 \h </w:instrText>
+              <w:instrText xml:space="preserve"> PAGEREF _Toc244222501 \h </w:instrText>
             </w:r>
             <w:r>
               <w:rPr>
@@ -2283,27 +2283,13 @@
               <w:noProof/>
             </w:rPr>
           </w:pPr>
-          <w:hyperlink w:anchor="_Toc244221417" w:history="1">
+          <w:hyperlink w:anchor="_Toc244222502" w:history="1">
             <w:r>
               <w:rPr>
                 <w:rStyle w:val="Hyperlink"/>
                 <w:noProof/>
               </w:rPr>
-              <w:t>Refere</w:t>
-            </w:r>
-            <w:r>
-              <w:rPr>
-                <w:rStyle w:val="Hyperlink"/>
-                <w:noProof/>
-              </w:rPr>
-              <w:t>n</w:t>
-            </w:r>
-            <w:r>
-              <w:rPr>
-                <w:rStyle w:val="Hyperlink"/>
-                <w:noProof/>
-              </w:rPr>
-              <w:t>ces</w:t>
+              <w:t>References</w:t>
             </w:r>
             <w:r>
               <w:rPr>
@@ -2324,7 +2310,7 @@
                 <w:noProof/>
                 <w:webHidden/>
               </w:rPr>
-              <w:instrText xml:space="preserve"> PAGEREF _Toc244221417 \h </w:instrText>
+              <w:instrText xml:space="preserve"> PAGEREF _Toc244222502 \h </w:instrText>
             </w:r>
             <w:r>
               <w:rPr>
@@ -2367,7 +2353,7 @@
               <w:noProof/>
             </w:rPr>
           </w:pPr>
-          <w:hyperlink w:anchor="_Toc244221418" w:history="1">
+          <w:hyperlink w:anchor="_Toc244222503" w:history="1">
             <w:r>
               <w:rPr>
                 <w:rStyle w:val="Hyperlink"/>
@@ -2394,7 +2380,7 @@
                 <w:noProof/>
                 <w:webHidden/>
               </w:rPr>
-              <w:instrText xml:space="preserve"> PAGEREF _Toc244221418 \h </w:instrText>
+              <w:instrText xml:space="preserve"> PAGEREF _Toc244222503 \h </w:instrText>
             </w:r>
             <w:r>
               <w:rPr>
@@ -2436,7 +2422,7 @@
               <w:noProof/>
             </w:rPr>
           </w:pPr>
-          <w:hyperlink w:anchor="_Toc244221419" w:history="1">
+          <w:hyperlink w:anchor="_Toc244222504" w:history="1">
             <w:r>
               <w:rPr>
                 <w:rStyle w:val="Hyperlink"/>
@@ -2463,7 +2449,7 @@
                 <w:noProof/>
                 <w:webHidden/>
               </w:rPr>
-              <w:instrText xml:space="preserve"> PAGEREF _Toc244221419 \h </w:instrText>
+              <w:instrText xml:space="preserve"> PAGEREF _Toc244222504 \h </w:instrText>
             </w:r>
             <w:r>
               <w:rPr>
@@ -2505,7 +2491,7 @@
               <w:noProof/>
             </w:rPr>
           </w:pPr>
-          <w:hyperlink w:anchor="_Toc244221420" w:history="1">
+          <w:hyperlink w:anchor="_Toc244222505" w:history="1">
             <w:r>
               <w:rPr>
                 <w:rStyle w:val="Hyperlink"/>
@@ -2532,7 +2518,7 @@
                 <w:noProof/>
                 <w:webHidden/>
               </w:rPr>
-              <w:instrText xml:space="preserve"> PAGEREF _Toc244221420 \h </w:instrText>
+              <w:instrText xml:space="preserve"> PAGEREF _Toc244222505 \h </w:instrText>
             </w:r>
             <w:r>
               <w:rPr>
@@ -2574,7 +2560,7 @@
               <w:noProof/>
             </w:rPr>
           </w:pPr>
-          <w:hyperlink w:anchor="_Toc244221421" w:history="1">
+          <w:hyperlink w:anchor="_Toc244222506" w:history="1">
             <w:r>
               <w:rPr>
                 <w:rStyle w:val="Hyperlink"/>
@@ -2601,7 +2587,7 @@
                 <w:noProof/>
                 <w:webHidden/>
               </w:rPr>
-              <w:instrText xml:space="preserve"> PAGEREF _Toc244221421 \h </w:instrText>
+              <w:instrText xml:space="preserve"> PAGEREF _Toc244222506 \h </w:instrText>
             </w:r>
             <w:r>
               <w:rPr>
@@ -2644,7 +2630,7 @@
               <w:noProof/>
             </w:rPr>
           </w:pPr>
-          <w:hyperlink w:anchor="_Toc244221422" w:history="1">
+          <w:hyperlink w:anchor="_Toc244222507" w:history="1">
             <w:r>
               <w:rPr>
                 <w:rStyle w:val="Hyperlink"/>
@@ -2671,7 +2657,7 @@
                 <w:noProof/>
                 <w:webHidden/>
               </w:rPr>
-              <w:instrText xml:space="preserve"> PAGEREF _Toc244221422 \h </w:instrText>
+              <w:instrText xml:space="preserve"> PAGEREF _Toc244222507 \h </w:instrText>
             </w:r>
             <w:r>
               <w:rPr>
@@ -2740,7 +2726,7 @@
       </w:pPr>
       <w:bookmarkStart w:id="1" w:name="executive-summary"/>
       <w:bookmarkStart w:id="2" w:name="_Toc244220706"/>
-      <w:bookmarkStart w:id="3" w:name="_Toc244221394"/>
+      <w:bookmarkStart w:id="3" w:name="_Toc244222479"/>
       <w:r>
         <w:lastRenderedPageBreak/>
         <w:t>Executive Summary</w:t>
@@ -2786,7 +2772,7 @@
       </w:pPr>
       <w:bookmarkStart w:id="4" w:name="introduction"/>
       <w:bookmarkStart w:id="5" w:name="_Toc244220707"/>
-      <w:bookmarkStart w:id="6" w:name="_Toc244221395"/>
+      <w:bookmarkStart w:id="6" w:name="_Toc244222480"/>
       <w:bookmarkEnd w:id="1"/>
       <w:r>
         <w:lastRenderedPageBreak/>
@@ -2801,7 +2787,7 @@
       </w:pPr>
       <w:bookmarkStart w:id="7" w:name="background-and-purpose"/>
       <w:bookmarkStart w:id="8" w:name="_Toc244220708"/>
-      <w:bookmarkStart w:id="9" w:name="_Toc244221396"/>
+      <w:bookmarkStart w:id="9" w:name="_Toc244222481"/>
       <w:r>
         <w:t>Background and Purpose</w:t>
       </w:r>
@@ -2838,7 +2824,7 @@
       </w:pPr>
       <w:bookmarkStart w:id="10" w:name="what-is-actual-budget"/>
       <w:bookmarkStart w:id="11" w:name="_Toc244220709"/>
-      <w:bookmarkStart w:id="12" w:name="_Toc244221397"/>
+      <w:bookmarkStart w:id="12" w:name="_Toc244222482"/>
       <w:bookmarkEnd w:id="7"/>
       <w:r>
         <w:t>What Is Actual Budget</w:t>
@@ -2868,7 +2854,7 @@
       </w:pPr>
       <w:bookmarkStart w:id="13" w:name="main-features-and-how-it-works"/>
       <w:bookmarkStart w:id="14" w:name="_Toc244220710"/>
-      <w:bookmarkStart w:id="15" w:name="_Toc244221398"/>
+      <w:bookmarkStart w:id="15" w:name="_Toc244222483"/>
       <w:bookmarkEnd w:id="10"/>
       <w:r>
         <w:t>Main Features and How It Works</w:t>
@@ -2966,7 +2952,7 @@
       </w:pPr>
       <w:bookmarkStart w:id="16" w:name="who-is-involved"/>
       <w:bookmarkStart w:id="17" w:name="_Toc244220711"/>
-      <w:bookmarkStart w:id="18" w:name="_Toc244221399"/>
+      <w:bookmarkStart w:id="18" w:name="_Toc244222484"/>
       <w:bookmarkEnd w:id="13"/>
       <w:r>
         <w:t>Who Is Involved</w:t>
@@ -3254,7 +3240,7 @@
       <w:pPr>
         <w:pStyle w:val="Heading2"/>
       </w:pPr>
-      <w:bookmarkStart w:id="21" w:name="_Toc244221400"/>
+      <w:bookmarkStart w:id="21" w:name="_Toc244222485"/>
       <w:r>
         <w:t>Main Challenges</w:t>
       </w:r>
@@ -3369,7 +3355,7 @@
       </w:pPr>
       <w:bookmarkStart w:id="22" w:name="software-development-methodology"/>
       <w:bookmarkStart w:id="23" w:name="_Toc244220713"/>
-      <w:bookmarkStart w:id="24" w:name="_Toc244221401"/>
+      <w:bookmarkStart w:id="24" w:name="_Toc244222486"/>
       <w:bookmarkEnd w:id="4"/>
       <w:bookmarkEnd w:id="19"/>
       <w:r>
@@ -3393,7 +3379,7 @@
       </w:pPr>
       <w:bookmarkStart w:id="25" w:name="current-development-process-of-actual"/>
       <w:bookmarkStart w:id="26" w:name="_Toc244220714"/>
-      <w:bookmarkStart w:id="27" w:name="_Toc244221402"/>
+      <w:bookmarkStart w:id="27" w:name="_Toc244222487"/>
       <w:r>
         <w:t>Current Development Process of Actual</w:t>
       </w:r>
@@ -3506,7 +3492,7 @@
       </w:pPr>
       <w:bookmarkStart w:id="28" w:name="why-kanban-fits-actual"/>
       <w:bookmarkStart w:id="29" w:name="_Toc244220715"/>
-      <w:bookmarkStart w:id="30" w:name="_Toc244221403"/>
+      <w:bookmarkStart w:id="30" w:name="_Toc244222488"/>
       <w:bookmarkEnd w:id="25"/>
       <w:r>
         <w:t>Why Kanban Fits Actual</w:t>
@@ -3564,7 +3550,7 @@
       </w:pPr>
       <w:bookmarkStart w:id="31" w:name="applying-kanban-to-actual"/>
       <w:bookmarkStart w:id="32" w:name="_Toc244220716"/>
-      <w:bookmarkStart w:id="33" w:name="_Toc244221404"/>
+      <w:bookmarkStart w:id="33" w:name="_Toc244222489"/>
       <w:bookmarkEnd w:id="28"/>
       <w:r>
         <w:t>Applying Kanban to Actual</w:t>
@@ -3676,10 +3662,9 @@
       </w:pPr>
       <w:bookmarkStart w:id="34" w:name="critical-evaluation"/>
       <w:bookmarkStart w:id="35" w:name="_Toc244220717"/>
-      <w:bookmarkStart w:id="36" w:name="_Toc244221405"/>
+      <w:bookmarkStart w:id="36" w:name="_Toc244222490"/>
       <w:bookmarkEnd w:id="31"/>
       <w:r>
-        <w:lastRenderedPageBreak/>
         <w:t>Critical Evaluation</w:t>
       </w:r>
       <w:bookmarkEnd w:id="35"/>
@@ -3690,7 +3675,11 @@
         <w:pStyle w:val="FirstParagraph"/>
       </w:pPr>
       <w:r>
-        <w:t>Kanban manages flow but does not improve quality by itself. It is "a relatively basic flow tool that needs to be supported by additional practices" (Ahmad et al., 2018, p. 110), which is why the QA gates in section 3 are mandatory. Its WIP limit is also weaker in a volunteer project. It holds new PRs back and those PRs would wait like unanswered ones, which maintainers report discourages new contributors (Salkever, 2023, p. 5). However, PRs has already been waited months for review before any limit existed (Aboltins, 2025), so the limit makes the wait visible rather than creating it. Maintainers can also raise the limit at any moment if it starts to deter newcomers. The choice could also be revisited if Actual gains staff who can commit fixed hours in the future, which would make Scrum's commitments realistic, or runs its own hosted service which would give DevOps operations a chance to be implemented.</w:t>
+        <w:t xml:space="preserve">Kanban manages flow but does not improve quality by itself. It is "a relatively basic flow tool that needs to be supported by additional practices" (Ahmad et al., 2018, p. 110), which is why </w:t>
+      </w:r>
+      <w:r>
+        <w:lastRenderedPageBreak/>
+        <w:t>the QA gates in section 3 are mandatory. Its WIP limit is also weaker in a volunteer project. It holds new PRs back and those PRs would wait like unanswered ones, which maintainers report discourages new contributors (Salkever, 2023, p. 5). However, PRs has already been waited months for review before any limit existed (Aboltins, 2025), so the limit makes the wait visible rather than creating it. Maintainers can also raise the limit at any moment if it starts to deter newcomers. The choice could also be revisited if Actual gains staff who can commit fixed hours in the future, which would make Scrum's commitments realistic, or runs its own hosted service which would give DevOps operations a chance to be implemented.</w:t>
       </w:r>
     </w:p>
     <w:p>
@@ -3699,7 +3688,7 @@
       </w:pPr>
       <w:bookmarkStart w:id="37" w:name="quality-assurance-process"/>
       <w:bookmarkStart w:id="38" w:name="_Toc244220718"/>
-      <w:bookmarkStart w:id="39" w:name="_Toc244221406"/>
+      <w:bookmarkStart w:id="39" w:name="_Toc244222491"/>
       <w:bookmarkEnd w:id="22"/>
       <w:bookmarkEnd w:id="34"/>
       <w:r>
@@ -3723,7 +3712,7 @@
       </w:pPr>
       <w:bookmarkStart w:id="40" w:name="what-quality-means-for-actual"/>
       <w:bookmarkStart w:id="41" w:name="_Toc244220719"/>
-      <w:bookmarkStart w:id="42" w:name="_Toc244221407"/>
+      <w:bookmarkStart w:id="42" w:name="_Toc244222492"/>
       <w:r>
         <w:t>What Quality Means for Actual</w:t>
       </w:r>
@@ -3898,7 +3887,7 @@
       </w:pPr>
       <w:bookmarkStart w:id="43" w:name="key-quality-attributes"/>
       <w:bookmarkStart w:id="44" w:name="_Toc244220720"/>
-      <w:bookmarkStart w:id="45" w:name="_Toc244221408"/>
+      <w:bookmarkStart w:id="45" w:name="_Toc244222493"/>
       <w:bookmarkEnd w:id="40"/>
       <w:r>
         <w:t>Key Quality Attributes</w:t>
@@ -4034,7 +4023,7 @@
       </w:pPr>
       <w:bookmarkStart w:id="46" w:name="current-qa-practices-and-gaps"/>
       <w:bookmarkStart w:id="47" w:name="_Toc244220721"/>
-      <w:bookmarkStart w:id="48" w:name="_Toc244221409"/>
+      <w:bookmarkStart w:id="48" w:name="_Toc244222494"/>
       <w:bookmarkEnd w:id="43"/>
       <w:r>
         <w:t>Current QA Practices and Gaps</w:t>
@@ -4216,7 +4205,7 @@
       </w:pPr>
       <w:bookmarkStart w:id="49" w:name="selected-standards-and-practices"/>
       <w:bookmarkStart w:id="50" w:name="_Toc244220722"/>
-      <w:bookmarkStart w:id="51" w:name="_Toc244221410"/>
+      <w:bookmarkStart w:id="51" w:name="_Toc244222495"/>
       <w:bookmarkEnd w:id="46"/>
       <w:r>
         <w:lastRenderedPageBreak/>
@@ -4616,7 +4605,7 @@
       <w:pPr>
         <w:pStyle w:val="Heading2"/>
       </w:pPr>
-      <w:bookmarkStart w:id="54" w:name="_Toc244221411"/>
+      <w:bookmarkStart w:id="54" w:name="_Toc244222496"/>
       <w:r>
         <w:t>Applying the QA Process within Kanban</w:t>
       </w:r>
@@ -5294,7 +5283,7 @@
       <w:pPr>
         <w:pStyle w:val="Heading2"/>
       </w:pPr>
-      <w:bookmarkStart w:id="57" w:name="_Toc244221412"/>
+      <w:bookmarkStart w:id="57" w:name="_Toc244222497"/>
       <w:r>
         <w:t>Critical Evaluation</w:t>
       </w:r>
@@ -5315,7 +5304,7 @@
       </w:pPr>
       <w:bookmarkStart w:id="58" w:name="integrating-ivv-with-kanban"/>
       <w:bookmarkStart w:id="59" w:name="_Toc244220725"/>
-      <w:bookmarkStart w:id="60" w:name="_Toc244221413"/>
+      <w:bookmarkStart w:id="60" w:name="_Toc244222498"/>
       <w:bookmarkEnd w:id="37"/>
       <w:bookmarkEnd w:id="55"/>
       <w:r>
@@ -5339,7 +5328,7 @@
       </w:pPr>
       <w:bookmarkStart w:id="61" w:name="X0aa91b5be94bdb8348825913a91d765f72af6ee"/>
       <w:bookmarkStart w:id="62" w:name="_Toc244220726"/>
-      <w:bookmarkStart w:id="63" w:name="_Toc244221414"/>
+      <w:bookmarkStart w:id="63" w:name="_Toc244222499"/>
       <w:r>
         <w:t>Current V&amp;V in Actual and Its Independence</w:t>
       </w:r>
@@ -6133,7 +6122,7 @@
       </w:pPr>
       <w:bookmarkStart w:id="64" w:name="ivv-integration-model-for-kanban"/>
       <w:bookmarkStart w:id="65" w:name="_Toc244220727"/>
-      <w:bookmarkStart w:id="66" w:name="_Toc244221415"/>
+      <w:bookmarkStart w:id="66" w:name="_Toc244222500"/>
       <w:bookmarkEnd w:id="61"/>
       <w:r>
         <w:t>IV&amp;V Integration Model for Kanban</w:t>
@@ -6733,7 +6722,7 @@
       </w:pPr>
       <w:bookmarkStart w:id="67" w:name="X1475a41517db6ec60255518d1ac8cff0c25dd20"/>
       <w:bookmarkStart w:id="68" w:name="_Toc244220728"/>
-      <w:bookmarkStart w:id="69" w:name="_Toc244221416"/>
+      <w:bookmarkStart w:id="69" w:name="_Toc244222501"/>
       <w:bookmarkEnd w:id="64"/>
       <w:r>
         <w:t>How the Integration Meets the Three Goals</w:t>
@@ -6787,7 +6776,7 @@
       </w:pPr>
       <w:bookmarkStart w:id="70" w:name="references"/>
       <w:bookmarkStart w:id="71" w:name="_Toc244220729"/>
-      <w:bookmarkStart w:id="72" w:name="_Toc244221417"/>
+      <w:bookmarkStart w:id="72" w:name="_Toc244222502"/>
       <w:bookmarkEnd w:id="58"/>
       <w:bookmarkEnd w:id="67"/>
       <w:r>
@@ -7896,7 +7885,7 @@
       </w:pPr>
       <w:bookmarkStart w:id="73" w:name="appendix-a-methodology-selection"/>
       <w:bookmarkStart w:id="74" w:name="_Toc244220730"/>
-      <w:bookmarkStart w:id="75" w:name="_Toc244221418"/>
+      <w:bookmarkStart w:id="75" w:name="_Toc244222503"/>
       <w:bookmarkEnd w:id="70"/>
       <w:r>
         <w:lastRenderedPageBreak/>
@@ -7927,7 +7916,7 @@
       </w:pPr>
       <w:bookmarkStart w:id="76" w:name="X028abdb72f6729402371f99d307e7d170450399"/>
       <w:bookmarkStart w:id="77" w:name="_Toc244220731"/>
-      <w:bookmarkStart w:id="78" w:name="_Toc244221419"/>
+      <w:bookmarkStart w:id="78" w:name="_Toc244222504"/>
       <w:r>
         <w:t>A.1 Project Characteristics and Requirements</w:t>
       </w:r>
@@ -8876,7 +8865,7 @@
           <w:numId w:val="0"/>
         </w:numPr>
       </w:pPr>
-      <w:bookmarkStart w:id="81" w:name="_Toc244221420"/>
+      <w:bookmarkStart w:id="81" w:name="_Toc244222505"/>
       <w:r>
         <w:t>A.2 Candidate Methodologies</w:t>
       </w:r>
@@ -8909,7 +8898,7 @@
       </w:pPr>
       <w:bookmarkStart w:id="82" w:name="a.3-evaluation-and-selection"/>
       <w:bookmarkStart w:id="83" w:name="_Toc244220733"/>
-      <w:bookmarkStart w:id="84" w:name="_Toc244221421"/>
+      <w:bookmarkStart w:id="84" w:name="_Toc244222506"/>
       <w:bookmarkEnd w:id="79"/>
       <w:r>
         <w:t>A.3 Evaluation and Selection</w:t>
@@ -9595,7 +9584,7 @@
       </w:pPr>
       <w:bookmarkStart w:id="85" w:name="appendix-b-worked-example-of-the-qa-plan"/>
       <w:bookmarkStart w:id="86" w:name="_Toc244220734"/>
-      <w:bookmarkStart w:id="87" w:name="_Toc244221422"/>
+      <w:bookmarkStart w:id="87" w:name="_Toc244222507"/>
       <w:bookmarkEnd w:id="73"/>
       <w:bookmarkEnd w:id="82"/>
       <w:r>

</xml_diff>

<commit_message>
List the five methodology needs in 2.2 as bullets (md and Word)
Co-Authored-By: Claude Opus 5.5 <noreply@anthropic.com>
</commit_message>
<xml_diff>
--- a/report/assignment-1/Assignment-1-Report.docx
+++ b/report/assignment-1/Assignment-1-Report.docx
@@ -217,15 +217,7 @@
         <w:t xml:space="preserve">HAND OUT DATE: </w:t>
       </w:r>
       <w:r>
-        <w:t>- dd-mm-</w:t>
-      </w:r>
-      <w:proofErr w:type="spellStart"/>
-      <w:r>
-        <w:t>yyyy</w:t>
-      </w:r>
-      <w:proofErr w:type="spellEnd"/>
-      <w:r>
-        <w:t xml:space="preserve"> -</w:t>
+        <w:t>- dd-mm-yyyy -</w:t>
       </w:r>
     </w:p>
     <w:p>
@@ -251,21 +243,7 @@
         <w:rPr>
           <w:sz w:val="28"/>
         </w:rPr>
-        <w:t>HAND IN DATE:     - dd-mm-</w:t>
-      </w:r>
-      <w:proofErr w:type="spellStart"/>
-      <w:r>
-        <w:rPr>
-          <w:sz w:val="28"/>
-        </w:rPr>
-        <w:t>yyyy</w:t>
-      </w:r>
-      <w:proofErr w:type="spellEnd"/>
-      <w:r>
-        <w:rPr>
-          <w:sz w:val="28"/>
-        </w:rPr>
-        <w:t xml:space="preserve"> -   </w:t>
+        <w:t xml:space="preserve">HAND IN DATE:     - dd-mm-yyyy -   </w:t>
       </w:r>
     </w:p>
     <w:p>
@@ -694,7 +672,7 @@
             </w:rPr>
             <w:fldChar w:fldCharType="separate"/>
           </w:r>
-          <w:hyperlink w:anchor="_Toc244222994" w:history="1">
+          <w:hyperlink w:anchor="_Toc244223156" w:history="1">
             <w:r>
               <w:rPr>
                 <w:rStyle w:val="Hyperlink"/>
@@ -721,7 +699,7 @@
                 <w:noProof/>
                 <w:webHidden/>
               </w:rPr>
-              <w:instrText xml:space="preserve"> PAGEREF _Toc244222994 \h </w:instrText>
+              <w:instrText xml:space="preserve"> PAGEREF _Toc244223156 \h </w:instrText>
             </w:r>
             <w:r>
               <w:rPr>
@@ -764,7 +742,7 @@
               <w:noProof/>
             </w:rPr>
           </w:pPr>
-          <w:hyperlink w:anchor="_Toc244222995" w:history="1">
+          <w:hyperlink w:anchor="_Toc244223157" w:history="1">
             <w:r>
               <w:rPr>
                 <w:rStyle w:val="Hyperlink"/>
@@ -791,7 +769,7 @@
                 <w:noProof/>
                 <w:webHidden/>
               </w:rPr>
-              <w:instrText xml:space="preserve"> PAGEREF _Toc244222995 \h </w:instrText>
+              <w:instrText xml:space="preserve"> PAGEREF _Toc244223157 \h </w:instrText>
             </w:r>
             <w:r>
               <w:rPr>
@@ -833,7 +811,7 @@
               <w:noProof/>
             </w:rPr>
           </w:pPr>
-          <w:hyperlink w:anchor="_Toc244222996" w:history="1">
+          <w:hyperlink w:anchor="_Toc244223158" w:history="1">
             <w:r>
               <w:rPr>
                 <w:rStyle w:val="Hyperlink"/>
@@ -860,7 +838,7 @@
                 <w:noProof/>
                 <w:webHidden/>
               </w:rPr>
-              <w:instrText xml:space="preserve"> PAGEREF _Toc244222996 \h </w:instrText>
+              <w:instrText xml:space="preserve"> PAGEREF _Toc244223158 \h </w:instrText>
             </w:r>
             <w:r>
               <w:rPr>
@@ -902,7 +880,7 @@
               <w:noProof/>
             </w:rPr>
           </w:pPr>
-          <w:hyperlink w:anchor="_Toc244222997" w:history="1">
+          <w:hyperlink w:anchor="_Toc244223159" w:history="1">
             <w:r>
               <w:rPr>
                 <w:rStyle w:val="Hyperlink"/>
@@ -929,7 +907,7 @@
                 <w:noProof/>
                 <w:webHidden/>
               </w:rPr>
-              <w:instrText xml:space="preserve"> PAGEREF _Toc244222997 \h </w:instrText>
+              <w:instrText xml:space="preserve"> PAGEREF _Toc244223159 \h </w:instrText>
             </w:r>
             <w:r>
               <w:rPr>
@@ -971,7 +949,7 @@
               <w:noProof/>
             </w:rPr>
           </w:pPr>
-          <w:hyperlink w:anchor="_Toc244222998" w:history="1">
+          <w:hyperlink w:anchor="_Toc244223160" w:history="1">
             <w:r>
               <w:rPr>
                 <w:rStyle w:val="Hyperlink"/>
@@ -998,7 +976,7 @@
                 <w:noProof/>
                 <w:webHidden/>
               </w:rPr>
-              <w:instrText xml:space="preserve"> PAGEREF _Toc244222998 \h </w:instrText>
+              <w:instrText xml:space="preserve"> PAGEREF _Toc244223160 \h </w:instrText>
             </w:r>
             <w:r>
               <w:rPr>
@@ -1040,7 +1018,7 @@
               <w:noProof/>
             </w:rPr>
           </w:pPr>
-          <w:hyperlink w:anchor="_Toc244222999" w:history="1">
+          <w:hyperlink w:anchor="_Toc244223161" w:history="1">
             <w:r>
               <w:rPr>
                 <w:rStyle w:val="Hyperlink"/>
@@ -1067,7 +1045,7 @@
                 <w:noProof/>
                 <w:webHidden/>
               </w:rPr>
-              <w:instrText xml:space="preserve"> PAGEREF _Toc244222999 \h </w:instrText>
+              <w:instrText xml:space="preserve"> PAGEREF _Toc244223161 \h </w:instrText>
             </w:r>
             <w:r>
               <w:rPr>
@@ -1109,7 +1087,7 @@
               <w:noProof/>
             </w:rPr>
           </w:pPr>
-          <w:hyperlink w:anchor="_Toc244223000" w:history="1">
+          <w:hyperlink w:anchor="_Toc244223162" w:history="1">
             <w:r>
               <w:rPr>
                 <w:rStyle w:val="Hyperlink"/>
@@ -1136,7 +1114,7 @@
                 <w:noProof/>
                 <w:webHidden/>
               </w:rPr>
-              <w:instrText xml:space="preserve"> PAGEREF _Toc244223000 \h </w:instrText>
+              <w:instrText xml:space="preserve"> PAGEREF _Toc244223162 \h </w:instrText>
             </w:r>
             <w:r>
               <w:rPr>
@@ -1179,7 +1157,7 @@
               <w:noProof/>
             </w:rPr>
           </w:pPr>
-          <w:hyperlink w:anchor="_Toc244223001" w:history="1">
+          <w:hyperlink w:anchor="_Toc244223163" w:history="1">
             <w:r>
               <w:rPr>
                 <w:rStyle w:val="Hyperlink"/>
@@ -1206,7 +1184,7 @@
                 <w:noProof/>
                 <w:webHidden/>
               </w:rPr>
-              <w:instrText xml:space="preserve"> PAGEREF _Toc244223001 \h </w:instrText>
+              <w:instrText xml:space="preserve"> PAGEREF _Toc244223163 \h </w:instrText>
             </w:r>
             <w:r>
               <w:rPr>
@@ -1248,7 +1226,7 @@
               <w:noProof/>
             </w:rPr>
           </w:pPr>
-          <w:hyperlink w:anchor="_Toc244223002" w:history="1">
+          <w:hyperlink w:anchor="_Toc244223164" w:history="1">
             <w:r>
               <w:rPr>
                 <w:rStyle w:val="Hyperlink"/>
@@ -1275,7 +1253,7 @@
                 <w:noProof/>
                 <w:webHidden/>
               </w:rPr>
-              <w:instrText xml:space="preserve"> PAGEREF _Toc244223002 \h </w:instrText>
+              <w:instrText xml:space="preserve"> PAGEREF _Toc244223164 \h </w:instrText>
             </w:r>
             <w:r>
               <w:rPr>
@@ -1317,7 +1295,7 @@
               <w:noProof/>
             </w:rPr>
           </w:pPr>
-          <w:hyperlink w:anchor="_Toc244223003" w:history="1">
+          <w:hyperlink w:anchor="_Toc244223165" w:history="1">
             <w:r>
               <w:rPr>
                 <w:rStyle w:val="Hyperlink"/>
@@ -1344,7 +1322,7 @@
                 <w:noProof/>
                 <w:webHidden/>
               </w:rPr>
-              <w:instrText xml:space="preserve"> PAGEREF _Toc244223003 \h </w:instrText>
+              <w:instrText xml:space="preserve"> PAGEREF _Toc244223165 \h </w:instrText>
             </w:r>
             <w:r>
               <w:rPr>
@@ -1386,7 +1364,7 @@
               <w:noProof/>
             </w:rPr>
           </w:pPr>
-          <w:hyperlink w:anchor="_Toc244223004" w:history="1">
+          <w:hyperlink w:anchor="_Toc244223166" w:history="1">
             <w:r>
               <w:rPr>
                 <w:rStyle w:val="Hyperlink"/>
@@ -1413,7 +1391,7 @@
                 <w:noProof/>
                 <w:webHidden/>
               </w:rPr>
-              <w:instrText xml:space="preserve"> PAGEREF _Toc244223004 \h </w:instrText>
+              <w:instrText xml:space="preserve"> PAGEREF _Toc244223166 \h </w:instrText>
             </w:r>
             <w:r>
               <w:rPr>
@@ -1455,7 +1433,7 @@
               <w:noProof/>
             </w:rPr>
           </w:pPr>
-          <w:hyperlink w:anchor="_Toc244223005" w:history="1">
+          <w:hyperlink w:anchor="_Toc244223167" w:history="1">
             <w:r>
               <w:rPr>
                 <w:rStyle w:val="Hyperlink"/>
@@ -1482,7 +1460,7 @@
                 <w:noProof/>
                 <w:webHidden/>
               </w:rPr>
-              <w:instrText xml:space="preserve"> PAGEREF _Toc244223005 \h </w:instrText>
+              <w:instrText xml:space="preserve"> PAGEREF _Toc244223167 \h </w:instrText>
             </w:r>
             <w:r>
               <w:rPr>
@@ -1525,7 +1503,7 @@
               <w:noProof/>
             </w:rPr>
           </w:pPr>
-          <w:hyperlink w:anchor="_Toc244223006" w:history="1">
+          <w:hyperlink w:anchor="_Toc244223168" w:history="1">
             <w:r>
               <w:rPr>
                 <w:rStyle w:val="Hyperlink"/>
@@ -1552,7 +1530,7 @@
                 <w:noProof/>
                 <w:webHidden/>
               </w:rPr>
-              <w:instrText xml:space="preserve"> PAGEREF _Toc244223006 \h </w:instrText>
+              <w:instrText xml:space="preserve"> PAGEREF _Toc244223168 \h </w:instrText>
             </w:r>
             <w:r>
               <w:rPr>
@@ -1594,7 +1572,7 @@
               <w:noProof/>
             </w:rPr>
           </w:pPr>
-          <w:hyperlink w:anchor="_Toc244223007" w:history="1">
+          <w:hyperlink w:anchor="_Toc244223169" w:history="1">
             <w:r>
               <w:rPr>
                 <w:rStyle w:val="Hyperlink"/>
@@ -1621,7 +1599,7 @@
                 <w:noProof/>
                 <w:webHidden/>
               </w:rPr>
-              <w:instrText xml:space="preserve"> PAGEREF _Toc244223007 \h </w:instrText>
+              <w:instrText xml:space="preserve"> PAGEREF _Toc244223169 \h </w:instrText>
             </w:r>
             <w:r>
               <w:rPr>
@@ -1663,7 +1641,7 @@
               <w:noProof/>
             </w:rPr>
           </w:pPr>
-          <w:hyperlink w:anchor="_Toc244223008" w:history="1">
+          <w:hyperlink w:anchor="_Toc244223170" w:history="1">
             <w:r>
               <w:rPr>
                 <w:rStyle w:val="Hyperlink"/>
@@ -1690,7 +1668,7 @@
                 <w:noProof/>
                 <w:webHidden/>
               </w:rPr>
-              <w:instrText xml:space="preserve"> PAGEREF _Toc244223008 \h </w:instrText>
+              <w:instrText xml:space="preserve"> PAGEREF _Toc244223170 \h </w:instrText>
             </w:r>
             <w:r>
               <w:rPr>
@@ -1732,7 +1710,7 @@
               <w:noProof/>
             </w:rPr>
           </w:pPr>
-          <w:hyperlink w:anchor="_Toc244223009" w:history="1">
+          <w:hyperlink w:anchor="_Toc244223171" w:history="1">
             <w:r>
               <w:rPr>
                 <w:rStyle w:val="Hyperlink"/>
@@ -1759,7 +1737,7 @@
                 <w:noProof/>
                 <w:webHidden/>
               </w:rPr>
-              <w:instrText xml:space="preserve"> PAGEREF _Toc244223009 \h </w:instrText>
+              <w:instrText xml:space="preserve"> PAGEREF _Toc244223171 \h </w:instrText>
             </w:r>
             <w:r>
               <w:rPr>
@@ -1801,7 +1779,7 @@
               <w:noProof/>
             </w:rPr>
           </w:pPr>
-          <w:hyperlink w:anchor="_Toc244223010" w:history="1">
+          <w:hyperlink w:anchor="_Toc244223172" w:history="1">
             <w:r>
               <w:rPr>
                 <w:rStyle w:val="Hyperlink"/>
@@ -1828,7 +1806,7 @@
                 <w:noProof/>
                 <w:webHidden/>
               </w:rPr>
-              <w:instrText xml:space="preserve"> PAGEREF _Toc244223010 \h </w:instrText>
+              <w:instrText xml:space="preserve"> PAGEREF _Toc244223172 \h </w:instrText>
             </w:r>
             <w:r>
               <w:rPr>
@@ -1870,7 +1848,7 @@
               <w:noProof/>
             </w:rPr>
           </w:pPr>
-          <w:hyperlink w:anchor="_Toc244223011" w:history="1">
+          <w:hyperlink w:anchor="_Toc244223173" w:history="1">
             <w:r>
               <w:rPr>
                 <w:rStyle w:val="Hyperlink"/>
@@ -1897,7 +1875,7 @@
                 <w:noProof/>
                 <w:webHidden/>
               </w:rPr>
-              <w:instrText xml:space="preserve"> PAGEREF _Toc244223011 \h </w:instrText>
+              <w:instrText xml:space="preserve"> PAGEREF _Toc244223173 \h </w:instrText>
             </w:r>
             <w:r>
               <w:rPr>
@@ -1939,7 +1917,7 @@
               <w:noProof/>
             </w:rPr>
           </w:pPr>
-          <w:hyperlink w:anchor="_Toc244223012" w:history="1">
+          <w:hyperlink w:anchor="_Toc244223174" w:history="1">
             <w:r>
               <w:rPr>
                 <w:rStyle w:val="Hyperlink"/>
@@ -1966,7 +1944,7 @@
                 <w:noProof/>
                 <w:webHidden/>
               </w:rPr>
-              <w:instrText xml:space="preserve"> PAGEREF _Toc244223012 \h </w:instrText>
+              <w:instrText xml:space="preserve"> PAGEREF _Toc244223174 \h </w:instrText>
             </w:r>
             <w:r>
               <w:rPr>
@@ -2009,7 +1987,7 @@
               <w:noProof/>
             </w:rPr>
           </w:pPr>
-          <w:hyperlink w:anchor="_Toc244223013" w:history="1">
+          <w:hyperlink w:anchor="_Toc244223175" w:history="1">
             <w:r>
               <w:rPr>
                 <w:rStyle w:val="Hyperlink"/>
@@ -2036,7 +2014,7 @@
                 <w:noProof/>
                 <w:webHidden/>
               </w:rPr>
-              <w:instrText xml:space="preserve"> PAGEREF _Toc244223013 \h </w:instrText>
+              <w:instrText xml:space="preserve"> PAGEREF _Toc244223175 \h </w:instrText>
             </w:r>
             <w:r>
               <w:rPr>
@@ -2078,7 +2056,7 @@
               <w:noProof/>
             </w:rPr>
           </w:pPr>
-          <w:hyperlink w:anchor="_Toc244223014" w:history="1">
+          <w:hyperlink w:anchor="_Toc244223176" w:history="1">
             <w:r>
               <w:rPr>
                 <w:rStyle w:val="Hyperlink"/>
@@ -2105,7 +2083,7 @@
                 <w:noProof/>
                 <w:webHidden/>
               </w:rPr>
-              <w:instrText xml:space="preserve"> PAGEREF _Toc244223014 \h </w:instrText>
+              <w:instrText xml:space="preserve"> PAGEREF _Toc244223176 \h </w:instrText>
             </w:r>
             <w:r>
               <w:rPr>
@@ -2147,7 +2125,7 @@
               <w:noProof/>
             </w:rPr>
           </w:pPr>
-          <w:hyperlink w:anchor="_Toc244223015" w:history="1">
+          <w:hyperlink w:anchor="_Toc244223177" w:history="1">
             <w:r>
               <w:rPr>
                 <w:rStyle w:val="Hyperlink"/>
@@ -2174,7 +2152,7 @@
                 <w:noProof/>
                 <w:webHidden/>
               </w:rPr>
-              <w:instrText xml:space="preserve"> PAGEREF _Toc244223015 \h </w:instrText>
+              <w:instrText xml:space="preserve"> PAGEREF _Toc244223177 \h </w:instrText>
             </w:r>
             <w:r>
               <w:rPr>
@@ -2216,7 +2194,7 @@
               <w:noProof/>
             </w:rPr>
           </w:pPr>
-          <w:hyperlink w:anchor="_Toc244223016" w:history="1">
+          <w:hyperlink w:anchor="_Toc244223178" w:history="1">
             <w:r>
               <w:rPr>
                 <w:rStyle w:val="Hyperlink"/>
@@ -2243,7 +2221,7 @@
                 <w:noProof/>
                 <w:webHidden/>
               </w:rPr>
-              <w:instrText xml:space="preserve"> PAGEREF _Toc244223016 \h </w:instrText>
+              <w:instrText xml:space="preserve"> PAGEREF _Toc244223178 \h </w:instrText>
             </w:r>
             <w:r>
               <w:rPr>
@@ -2286,7 +2264,7 @@
               <w:noProof/>
             </w:rPr>
           </w:pPr>
-          <w:hyperlink w:anchor="_Toc244223017" w:history="1">
+          <w:hyperlink w:anchor="_Toc244223179" w:history="1">
             <w:r>
               <w:rPr>
                 <w:rStyle w:val="Hyperlink"/>
@@ -2313,7 +2291,7 @@
                 <w:noProof/>
                 <w:webHidden/>
               </w:rPr>
-              <w:instrText xml:space="preserve"> PAGEREF _Toc244223017 \h </w:instrText>
+              <w:instrText xml:space="preserve"> PAGEREF _Toc244223179 \h </w:instrText>
             </w:r>
             <w:r>
               <w:rPr>
@@ -2356,7 +2334,7 @@
               <w:noProof/>
             </w:rPr>
           </w:pPr>
-          <w:hyperlink w:anchor="_Toc244223018" w:history="1">
+          <w:hyperlink w:anchor="_Toc244223180" w:history="1">
             <w:r>
               <w:rPr>
                 <w:rStyle w:val="Hyperlink"/>
@@ -2383,7 +2361,7 @@
                 <w:noProof/>
                 <w:webHidden/>
               </w:rPr>
-              <w:instrText xml:space="preserve"> PAGEREF _Toc244223018 \h </w:instrText>
+              <w:instrText xml:space="preserve"> PAGEREF _Toc244223180 \h </w:instrText>
             </w:r>
             <w:r>
               <w:rPr>
@@ -2425,7 +2403,7 @@
               <w:noProof/>
             </w:rPr>
           </w:pPr>
-          <w:hyperlink w:anchor="_Toc244223019" w:history="1">
+          <w:hyperlink w:anchor="_Toc244223181" w:history="1">
             <w:r>
               <w:rPr>
                 <w:rStyle w:val="Hyperlink"/>
@@ -2452,7 +2430,7 @@
                 <w:noProof/>
                 <w:webHidden/>
               </w:rPr>
-              <w:instrText xml:space="preserve"> PAGEREF _Toc244223019 \h </w:instrText>
+              <w:instrText xml:space="preserve"> PAGEREF _Toc244223181 \h </w:instrText>
             </w:r>
             <w:r>
               <w:rPr>
@@ -2494,7 +2472,7 @@
               <w:noProof/>
             </w:rPr>
           </w:pPr>
-          <w:hyperlink w:anchor="_Toc244223020" w:history="1">
+          <w:hyperlink w:anchor="_Toc244223182" w:history="1">
             <w:r>
               <w:rPr>
                 <w:rStyle w:val="Hyperlink"/>
@@ -2521,7 +2499,7 @@
                 <w:noProof/>
                 <w:webHidden/>
               </w:rPr>
-              <w:instrText xml:space="preserve"> PAGEREF _Toc244223020 \h </w:instrText>
+              <w:instrText xml:space="preserve"> PAGEREF _Toc244223182 \h </w:instrText>
             </w:r>
             <w:r>
               <w:rPr>
@@ -2563,7 +2541,7 @@
               <w:noProof/>
             </w:rPr>
           </w:pPr>
-          <w:hyperlink w:anchor="_Toc244223021" w:history="1">
+          <w:hyperlink w:anchor="_Toc244223183" w:history="1">
             <w:r>
               <w:rPr>
                 <w:rStyle w:val="Hyperlink"/>
@@ -2590,7 +2568,7 @@
                 <w:noProof/>
                 <w:webHidden/>
               </w:rPr>
-              <w:instrText xml:space="preserve"> PAGEREF _Toc244223021 \h </w:instrText>
+              <w:instrText xml:space="preserve"> PAGEREF _Toc244223183 \h </w:instrText>
             </w:r>
             <w:r>
               <w:rPr>
@@ -2633,7 +2611,7 @@
               <w:noProof/>
             </w:rPr>
           </w:pPr>
-          <w:hyperlink w:anchor="_Toc244223022" w:history="1">
+          <w:hyperlink w:anchor="_Toc244223184" w:history="1">
             <w:r>
               <w:rPr>
                 <w:rStyle w:val="Hyperlink"/>
@@ -2660,7 +2638,7 @@
                 <w:noProof/>
                 <w:webHidden/>
               </w:rPr>
-              <w:instrText xml:space="preserve"> PAGEREF _Toc244223022 \h </w:instrText>
+              <w:instrText xml:space="preserve"> PAGEREF _Toc244223184 \h </w:instrText>
             </w:r>
             <w:r>
               <w:rPr>
@@ -2729,7 +2707,7 @@
       </w:pPr>
       <w:bookmarkStart w:id="1" w:name="_Toc244220706"/>
       <w:bookmarkStart w:id="2" w:name="executive-summary"/>
-      <w:bookmarkStart w:id="3" w:name="_Toc244222994"/>
+      <w:bookmarkStart w:id="3" w:name="_Toc244223156"/>
       <w:r>
         <w:lastRenderedPageBreak/>
         <w:t>Executive Summary</w:t>
@@ -2775,7 +2753,7 @@
       </w:pPr>
       <w:bookmarkStart w:id="4" w:name="_Toc244220707"/>
       <w:bookmarkStart w:id="5" w:name="introduction"/>
-      <w:bookmarkStart w:id="6" w:name="_Toc244222995"/>
+      <w:bookmarkStart w:id="6" w:name="_Toc244223157"/>
       <w:bookmarkEnd w:id="2"/>
       <w:r>
         <w:lastRenderedPageBreak/>
@@ -2790,7 +2768,7 @@
       </w:pPr>
       <w:bookmarkStart w:id="7" w:name="_Toc244220708"/>
       <w:bookmarkStart w:id="8" w:name="background-and-purpose"/>
-      <w:bookmarkStart w:id="9" w:name="_Toc244222996"/>
+      <w:bookmarkStart w:id="9" w:name="_Toc244223158"/>
       <w:r>
         <w:t>Background and Purpose</w:t>
       </w:r>
@@ -2827,7 +2805,7 @@
       </w:pPr>
       <w:bookmarkStart w:id="10" w:name="_Toc244220709"/>
       <w:bookmarkStart w:id="11" w:name="what-is-actual-budget"/>
-      <w:bookmarkStart w:id="12" w:name="_Toc244222997"/>
+      <w:bookmarkStart w:id="12" w:name="_Toc244223159"/>
       <w:bookmarkEnd w:id="8"/>
       <w:r>
         <w:t>What Is Actual Budget</w:t>
@@ -2857,7 +2835,7 @@
       </w:pPr>
       <w:bookmarkStart w:id="13" w:name="_Toc244220710"/>
       <w:bookmarkStart w:id="14" w:name="main-features-and-how-it-works"/>
-      <w:bookmarkStart w:id="15" w:name="_Toc244222998"/>
+      <w:bookmarkStart w:id="15" w:name="_Toc244223160"/>
       <w:bookmarkEnd w:id="11"/>
       <w:r>
         <w:t>Main Features and How It Works</w:t>
@@ -2955,7 +2933,7 @@
       </w:pPr>
       <w:bookmarkStart w:id="16" w:name="_Toc244220711"/>
       <w:bookmarkStart w:id="17" w:name="who-is-involved"/>
-      <w:bookmarkStart w:id="18" w:name="_Toc244222999"/>
+      <w:bookmarkStart w:id="18" w:name="_Toc244223161"/>
       <w:bookmarkEnd w:id="14"/>
       <w:r>
         <w:t>Who Is Involved</w:t>
@@ -3308,7 +3286,7 @@
       <w:pPr>
         <w:pStyle w:val="Heading2"/>
       </w:pPr>
-      <w:bookmarkStart w:id="21" w:name="_Toc244223000"/>
+      <w:bookmarkStart w:id="21" w:name="_Toc244223162"/>
       <w:r>
         <w:t>Main Challenges</w:t>
       </w:r>
@@ -3423,7 +3401,7 @@
       </w:pPr>
       <w:bookmarkStart w:id="22" w:name="_Toc244220713"/>
       <w:bookmarkStart w:id="23" w:name="software-development-methodology"/>
-      <w:bookmarkStart w:id="24" w:name="_Toc244223001"/>
+      <w:bookmarkStart w:id="24" w:name="_Toc244223163"/>
       <w:bookmarkEnd w:id="5"/>
       <w:bookmarkEnd w:id="20"/>
       <w:r>
@@ -3447,7 +3425,7 @@
       </w:pPr>
       <w:bookmarkStart w:id="25" w:name="_Toc244220714"/>
       <w:bookmarkStart w:id="26" w:name="current-development-process-of-actual"/>
-      <w:bookmarkStart w:id="27" w:name="_Toc244223002"/>
+      <w:bookmarkStart w:id="27" w:name="_Toc244223164"/>
       <w:r>
         <w:t>Current Development Process of Actual</w:t>
       </w:r>
@@ -3560,7 +3538,7 @@
       </w:pPr>
       <w:bookmarkStart w:id="28" w:name="_Toc244220715"/>
       <w:bookmarkStart w:id="29" w:name="why-kanban-fits-actual"/>
-      <w:bookmarkStart w:id="30" w:name="_Toc244223003"/>
+      <w:bookmarkStart w:id="30" w:name="_Toc244223165"/>
       <w:bookmarkEnd w:id="26"/>
       <w:r>
         <w:t>Why Kanban Fits Actual</w:t>
@@ -3583,9 +3561,80 @@
     <w:p>
       <w:pPr>
         <w:pStyle w:val="BodyText"/>
-      </w:pPr>
-      <w:r>
-        <w:t>From this profile, the methodology has to meet five needs: handle changing priorities, work with tasks that volunteers choose themselves, keep its rules written down, protect review time, and also include quality and risk controls.</w:t>
+        <w:spacing w:after="120"/>
+      </w:pPr>
+      <w:r>
+        <w:t>From this profile, the methodology has to meet five needs:</w:t>
+      </w:r>
+    </w:p>
+    <w:p>
+      <w:pPr>
+        <w:pStyle w:val="Compact"/>
+        <w:numPr>
+          <w:ilvl w:val="0"/>
+          <w:numId w:val="23"/>
+        </w:numPr>
+        <w:spacing w:after="60"/>
+        <w:jc w:val="left"/>
+      </w:pPr>
+      <w:r>
+        <w:t>Handle changing priorities</w:t>
+      </w:r>
+    </w:p>
+    <w:p>
+      <w:pPr>
+        <w:pStyle w:val="Compact"/>
+        <w:numPr>
+          <w:ilvl w:val="0"/>
+          <w:numId w:val="24"/>
+        </w:numPr>
+        <w:spacing w:after="60"/>
+        <w:jc w:val="left"/>
+      </w:pPr>
+      <w:r>
+        <w:t>Work with tasks that volunteers choose themselves</w:t>
+      </w:r>
+    </w:p>
+    <w:p>
+      <w:pPr>
+        <w:pStyle w:val="Compact"/>
+        <w:numPr>
+          <w:ilvl w:val="0"/>
+          <w:numId w:val="25"/>
+        </w:numPr>
+        <w:spacing w:after="60"/>
+        <w:jc w:val="left"/>
+      </w:pPr>
+      <w:r>
+        <w:t>Keep its rules written down</w:t>
+      </w:r>
+    </w:p>
+    <w:p>
+      <w:pPr>
+        <w:pStyle w:val="Compact"/>
+        <w:numPr>
+          <w:ilvl w:val="0"/>
+          <w:numId w:val="26"/>
+        </w:numPr>
+        <w:spacing w:after="60"/>
+        <w:jc w:val="left"/>
+      </w:pPr>
+      <w:r>
+        <w:t>Protect review time</w:t>
+      </w:r>
+    </w:p>
+    <w:p>
+      <w:pPr>
+        <w:pStyle w:val="Compact"/>
+        <w:numPr>
+          <w:ilvl w:val="0"/>
+          <w:numId w:val="27"/>
+        </w:numPr>
+        <w:spacing w:after="240"/>
+        <w:jc w:val="left"/>
+      </w:pPr>
+      <w:r>
+        <w:t>Include quality and risk controls</w:t>
       </w:r>
     </w:p>
     <w:p>
@@ -3618,7 +3667,7 @@
       </w:pPr>
       <w:bookmarkStart w:id="31" w:name="_Toc244220716"/>
       <w:bookmarkStart w:id="32" w:name="applying-kanban-to-actual"/>
-      <w:bookmarkStart w:id="33" w:name="_Toc244223004"/>
+      <w:bookmarkStart w:id="33" w:name="_Toc244223166"/>
       <w:bookmarkEnd w:id="29"/>
       <w:r>
         <w:t>Applying Kanban to Actual</w:t>
@@ -3730,7 +3779,7 @@
       </w:pPr>
       <w:bookmarkStart w:id="34" w:name="_Toc244220717"/>
       <w:bookmarkStart w:id="35" w:name="critical-evaluation"/>
-      <w:bookmarkStart w:id="36" w:name="_Toc244223005"/>
+      <w:bookmarkStart w:id="36" w:name="_Toc244223167"/>
       <w:bookmarkEnd w:id="32"/>
       <w:r>
         <w:t>Critical Evaluation</w:t>
@@ -3756,7 +3805,7 @@
       </w:pPr>
       <w:bookmarkStart w:id="37" w:name="_Toc244220718"/>
       <w:bookmarkStart w:id="38" w:name="quality-assurance-process"/>
-      <w:bookmarkStart w:id="39" w:name="_Toc244223006"/>
+      <w:bookmarkStart w:id="39" w:name="_Toc244223168"/>
       <w:bookmarkEnd w:id="23"/>
       <w:bookmarkEnd w:id="35"/>
       <w:r>
@@ -3780,7 +3829,7 @@
       </w:pPr>
       <w:bookmarkStart w:id="40" w:name="_Toc244220719"/>
       <w:bookmarkStart w:id="41" w:name="what-quality-means-for-actual"/>
-      <w:bookmarkStart w:id="42" w:name="_Toc244223007"/>
+      <w:bookmarkStart w:id="42" w:name="_Toc244223169"/>
       <w:r>
         <w:t>What Quality Means for Actual</w:t>
       </w:r>
@@ -3939,7 +3988,7 @@
       </w:pPr>
       <w:bookmarkStart w:id="43" w:name="_Toc244220720"/>
       <w:bookmarkStart w:id="44" w:name="key-quality-attributes"/>
-      <w:bookmarkStart w:id="45" w:name="_Toc244223008"/>
+      <w:bookmarkStart w:id="45" w:name="_Toc244223170"/>
       <w:bookmarkEnd w:id="41"/>
       <w:r>
         <w:t>Key Quality Attributes</w:t>
@@ -4067,7 +4116,7 @@
       </w:pPr>
       <w:bookmarkStart w:id="46" w:name="_Toc244220721"/>
       <w:bookmarkStart w:id="47" w:name="current-qa-practices-and-gaps"/>
-      <w:bookmarkStart w:id="48" w:name="_Toc244223009"/>
+      <w:bookmarkStart w:id="48" w:name="_Toc244223171"/>
       <w:bookmarkEnd w:id="44"/>
       <w:r>
         <w:t>Current QA Practices and Gaps</w:t>
@@ -4209,7 +4258,7 @@
       </w:pPr>
       <w:bookmarkStart w:id="49" w:name="_Toc244220722"/>
       <w:bookmarkStart w:id="50" w:name="selected-standards-and-practices"/>
-      <w:bookmarkStart w:id="51" w:name="_Toc244223010"/>
+      <w:bookmarkStart w:id="51" w:name="_Toc244223172"/>
       <w:bookmarkEnd w:id="47"/>
       <w:r>
         <w:lastRenderedPageBreak/>
@@ -4706,7 +4755,7 @@
       <w:pPr>
         <w:pStyle w:val="Heading2"/>
       </w:pPr>
-      <w:bookmarkStart w:id="54" w:name="_Toc244223011"/>
+      <w:bookmarkStart w:id="54" w:name="_Toc244223173"/>
       <w:r>
         <w:t>Applying the QA Process within Kanban</w:t>
       </w:r>
@@ -5609,7 +5658,7 @@
       <w:pPr>
         <w:pStyle w:val="Heading2"/>
       </w:pPr>
-      <w:bookmarkStart w:id="57" w:name="_Toc244223012"/>
+      <w:bookmarkStart w:id="57" w:name="_Toc244223174"/>
       <w:r>
         <w:t>Critical Evaluation</w:t>
       </w:r>
@@ -5630,7 +5679,7 @@
       </w:pPr>
       <w:bookmarkStart w:id="58" w:name="_Toc244220725"/>
       <w:bookmarkStart w:id="59" w:name="integrating-ivv-with-kanban"/>
-      <w:bookmarkStart w:id="60" w:name="_Toc244223013"/>
+      <w:bookmarkStart w:id="60" w:name="_Toc244223175"/>
       <w:bookmarkEnd w:id="38"/>
       <w:bookmarkEnd w:id="56"/>
       <w:r>
@@ -5654,7 +5703,7 @@
       </w:pPr>
       <w:bookmarkStart w:id="61" w:name="_Toc244220726"/>
       <w:bookmarkStart w:id="62" w:name="X0aa91b5be94bdb8348825913a91d765f72af6ee"/>
-      <w:bookmarkStart w:id="63" w:name="_Toc244223014"/>
+      <w:bookmarkStart w:id="63" w:name="_Toc244223176"/>
       <w:r>
         <w:t>Current V&amp;V in Actual and Its Independence</w:t>
       </w:r>
@@ -6666,7 +6715,7 @@
       </w:pPr>
       <w:bookmarkStart w:id="64" w:name="_Toc244220727"/>
       <w:bookmarkStart w:id="65" w:name="ivv-integration-model-for-kanban"/>
-      <w:bookmarkStart w:id="66" w:name="_Toc244223015"/>
+      <w:bookmarkStart w:id="66" w:name="_Toc244223177"/>
       <w:bookmarkEnd w:id="62"/>
       <w:r>
         <w:t>IV&amp;V Integration Model for Kanban</w:t>
@@ -7491,7 +7540,7 @@
       </w:pPr>
       <w:bookmarkStart w:id="67" w:name="_Toc244220728"/>
       <w:bookmarkStart w:id="68" w:name="X1475a41517db6ec60255518d1ac8cff0c25dd20"/>
-      <w:bookmarkStart w:id="69" w:name="_Toc244223016"/>
+      <w:bookmarkStart w:id="69" w:name="_Toc244223178"/>
       <w:bookmarkEnd w:id="65"/>
       <w:r>
         <w:t>How the Integration Meets the Three Goals</w:t>
@@ -7545,7 +7594,7 @@
       </w:pPr>
       <w:bookmarkStart w:id="70" w:name="_Toc244220729"/>
       <w:bookmarkStart w:id="71" w:name="references"/>
-      <w:bookmarkStart w:id="72" w:name="_Toc244223017"/>
+      <w:bookmarkStart w:id="72" w:name="_Toc244223179"/>
       <w:bookmarkEnd w:id="59"/>
       <w:bookmarkEnd w:id="68"/>
       <w:r>
@@ -8569,7 +8618,7 @@
       </w:pPr>
       <w:bookmarkStart w:id="73" w:name="_Toc244220730"/>
       <w:bookmarkStart w:id="74" w:name="appendix-a-methodology-selection"/>
-      <w:bookmarkStart w:id="75" w:name="_Toc244223018"/>
+      <w:bookmarkStart w:id="75" w:name="_Toc244223180"/>
       <w:bookmarkEnd w:id="71"/>
       <w:r>
         <w:lastRenderedPageBreak/>
@@ -8600,7 +8649,7 @@
       </w:pPr>
       <w:bookmarkStart w:id="76" w:name="_Toc244220731"/>
       <w:bookmarkStart w:id="77" w:name="X028abdb72f6729402371f99d307e7d170450399"/>
-      <w:bookmarkStart w:id="78" w:name="_Toc244223019"/>
+      <w:bookmarkStart w:id="78" w:name="_Toc244223181"/>
       <w:r>
         <w:t>A.1 Project Characteristics and Requirements</w:t>
       </w:r>
@@ -9797,7 +9846,7 @@
           <w:numId w:val="0"/>
         </w:numPr>
       </w:pPr>
-      <w:bookmarkStart w:id="81" w:name="_Toc244223020"/>
+      <w:bookmarkStart w:id="81" w:name="_Toc244223182"/>
       <w:r>
         <w:t>A.2 Candidate Methodologies</w:t>
       </w:r>
@@ -9830,7 +9879,7 @@
       </w:pPr>
       <w:bookmarkStart w:id="82" w:name="_Toc244220733"/>
       <w:bookmarkStart w:id="83" w:name="a.3-evaluation-and-selection"/>
-      <w:bookmarkStart w:id="84" w:name="_Toc244223021"/>
+      <w:bookmarkStart w:id="84" w:name="_Toc244223183"/>
       <w:bookmarkEnd w:id="80"/>
       <w:r>
         <w:t>A.3 Evaluation and Selection</w:t>
@@ -10670,7 +10719,7 @@
       </w:pPr>
       <w:bookmarkStart w:id="85" w:name="_Toc244220734"/>
       <w:bookmarkStart w:id="86" w:name="appendix-b-worked-example-of-the-qa-plan"/>
-      <w:bookmarkStart w:id="87" w:name="_Toc244223022"/>
+      <w:bookmarkStart w:id="87" w:name="_Toc244223184"/>
       <w:bookmarkEnd w:id="74"/>
       <w:bookmarkEnd w:id="83"/>
       <w:r>
@@ -10755,15 +10804,7 @@
       <w:pStyle w:val="Footer"/>
     </w:pPr>
     <w:r>
-      <w:t xml:space="preserve">Version 1.2 UCTI </w:t>
-    </w:r>
-    <w:proofErr w:type="spellStart"/>
-    <w:r>
-      <w:t>AssCv</w:t>
-    </w:r>
-    <w:proofErr w:type="spellEnd"/>
-    <w:r>
-      <w:t xml:space="preserve"> 2007-10-23</w:t>
+      <w:t>Version 1.2 UCTI AssCv 2007-10-23</w:t>
     </w:r>
   </w:p>
 </w:ftr>
@@ -11063,6 +11104,50 @@
 <file path=word/numbering.xml><?xml version="1.0" encoding="utf-8"?>
 <w:numbering xmlns:wpc="http://schemas.microsoft.com/office/word/2010/wordprocessingCanvas" xmlns:cx="http://schemas.microsoft.com/office/drawing/2014/chartex" xmlns:cx1="http://schemas.microsoft.com/office/drawing/2015/9/8/chartex" xmlns:cx2="http://schemas.microsoft.com/office/drawing/2015/10/21/chartex" xmlns:cx3="http://schemas.microsoft.com/office/drawing/2016/5/9/chartex" xmlns:cx4="http://schemas.microsoft.com/office/drawing/2016/5/10/chartex" xmlns:cx5="http://schemas.microsoft.com/office/drawing/2016/5/11/chartex" xmlns:cx6="http://schemas.microsoft.com/office/drawing/2016/5/12/chartex" xmlns:cx7="http://schemas.microsoft.com/office/drawing/2016/5/13/chartex" xmlns:cx8="http://schemas.microsoft.com/office/drawing/2016/5/14/chartex" xmlns:mc="http://schemas.openxmlformats.org/markup-compatibility/2006" xmlns:aink="http://schemas.microsoft.com/office/drawing/2016/ink" xmlns:am3d="http://schemas.microsoft.com/office/drawing/2017/model3d" xmlns:o="urn:schemas-microsoft-com:office:office" xmlns:oel="http://schemas.microsoft.com/office/2019/extlst" xmlns:r="http://schemas.openxmlformats.org/officeDocument/2006/relationships" xmlns:m="http://schemas.openxmlformats.org/officeDocument/2006/math" xmlns:v="urn:schemas-microsoft-com:vml" xmlns:wp14="http://schemas.microsoft.com/office/word/2010/wordprocessingDrawing" xmlns:wp="http://schemas.openxmlformats.org/drawingml/2006/wordprocessingDrawing" xmlns:w10="urn:schemas-microsoft-com:office:word" xmlns:w="http://schemas.openxmlformats.org/wordprocessingml/2006/main" xmlns:w14="http://schemas.microsoft.com/office/word/2010/wordml" xmlns:w15="http://schemas.microsoft.com/office/word/2012/wordml" xmlns:w16cex="http://schemas.microsoft.com/office/word/2018/wordml/cex" xmlns:w16cid="http://schemas.microsoft.com/office/word/2016/wordml/cid" xmlns:w16="http://schemas.microsoft.com/office/word/2018/wordml" xmlns:w16du="http://schemas.microsoft.com/office/word/2023/wordml/word16du" xmlns:w16sdtdh="http://schemas.microsoft.com/office/word/2020/wordml/sdtdatahash" xmlns:w16sdtfl="http://schemas.microsoft.com/office/word/2024/wordml/sdtformatlock" xmlns:w16se="http://schemas.microsoft.com/office/word/2015/wordml/symex" xmlns:wpg="http://schemas.microsoft.com/office/word/2010/wordprocessingGroup" xmlns:wpi="http://schemas.microsoft.com/office/word/2010/wordprocessingInk" xmlns:wne="http://schemas.microsoft.com/office/word/2006/wordml" xmlns:wps="http://schemas.microsoft.com/office/word/2010/wordprocessingShape" mc:Ignorable="w14 w15 w16se w16cid w16 w16cex w16sdtdh w16sdtfl w16du wp14">
   <w:abstractNum w:abstractNumId="0" w15:restartNumberingAfterBreak="0">
+    <w:nsid w:val="00225772"/>
+    <w:multiLevelType w:val="singleLevel"/>
+    <w:tmpl w:val="F8E29858"/>
+    <w:lvl w:ilvl="0">
+      <w:start w:val="1"/>
+      <w:numFmt w:val="decimal"/>
+      <w:lvlText w:val=""/>
+      <w:lvlJc w:val="left"/>
+      <w:pPr>
+        <w:tabs>
+          <w:tab w:val="num" w:pos="720"/>
+        </w:tabs>
+        <w:ind w:left="720" w:hanging="360"/>
+      </w:pPr>
+      <w:rPr>
+        <w:rFonts w:ascii="Symbol" w:hAnsi="Symbol" w:hint="default"/>
+        <w:b w:val="0"/>
+        <w:sz w:val="24"/>
+      </w:rPr>
+    </w:lvl>
+  </w:abstractNum>
+  <w:abstractNum w:abstractNumId="1" w15:restartNumberingAfterBreak="0">
+    <w:nsid w:val="06BA419D"/>
+    <w:multiLevelType w:val="singleLevel"/>
+    <w:tmpl w:val="F8E29858"/>
+    <w:lvl w:ilvl="0">
+      <w:start w:val="1"/>
+      <w:numFmt w:val="decimal"/>
+      <w:lvlText w:val=""/>
+      <w:lvlJc w:val="left"/>
+      <w:pPr>
+        <w:tabs>
+          <w:tab w:val="num" w:pos="720"/>
+        </w:tabs>
+        <w:ind w:left="720" w:hanging="360"/>
+      </w:pPr>
+      <w:rPr>
+        <w:rFonts w:ascii="Symbol" w:hAnsi="Symbol" w:hint="default"/>
+        <w:b w:val="0"/>
+        <w:sz w:val="24"/>
+      </w:rPr>
+    </w:lvl>
+  </w:abstractNum>
+  <w:abstractNum w:abstractNumId="2" w15:restartNumberingAfterBreak="0">
     <w:nsid w:val="1F7575AA"/>
     <w:multiLevelType w:val="singleLevel"/>
     <w:tmpl w:val="F8E29858"/>
@@ -11085,7 +11170,7 @@
       </w:rPr>
     </w:lvl>
   </w:abstractNum>
-  <w:abstractNum w:abstractNumId="1" w15:restartNumberingAfterBreak="0">
+  <w:abstractNum w:abstractNumId="3" w15:restartNumberingAfterBreak="0">
     <w:nsid w:val="350128B0"/>
     <w:multiLevelType w:val="hybridMultilevel"/>
     <w:tmpl w:val="50E6ED9E"/>
@@ -11171,7 +11256,7 @@
       </w:pPr>
     </w:lvl>
   </w:abstractNum>
-  <w:abstractNum w:abstractNumId="2" w15:restartNumberingAfterBreak="0">
+  <w:abstractNum w:abstractNumId="4" w15:restartNumberingAfterBreak="0">
     <w:nsid w:val="3AD8336D"/>
     <w:multiLevelType w:val="singleLevel"/>
     <w:tmpl w:val="F8E29858"/>
@@ -11193,7 +11278,29 @@
       </w:rPr>
     </w:lvl>
   </w:abstractNum>
-  <w:abstractNum w:abstractNumId="3" w15:restartNumberingAfterBreak="0">
+  <w:abstractNum w:abstractNumId="5" w15:restartNumberingAfterBreak="0">
+    <w:nsid w:val="42284894"/>
+    <w:multiLevelType w:val="singleLevel"/>
+    <w:tmpl w:val="F8E29858"/>
+    <w:lvl w:ilvl="0">
+      <w:start w:val="1"/>
+      <w:numFmt w:val="decimal"/>
+      <w:lvlText w:val=""/>
+      <w:lvlJc w:val="left"/>
+      <w:pPr>
+        <w:tabs>
+          <w:tab w:val="num" w:pos="720"/>
+        </w:tabs>
+        <w:ind w:left="720" w:hanging="360"/>
+      </w:pPr>
+      <w:rPr>
+        <w:rFonts w:ascii="Symbol" w:hAnsi="Symbol" w:hint="default"/>
+        <w:b w:val="0"/>
+        <w:sz w:val="24"/>
+      </w:rPr>
+    </w:lvl>
+  </w:abstractNum>
+  <w:abstractNum w:abstractNumId="6" w15:restartNumberingAfterBreak="0">
     <w:nsid w:val="42C076C2"/>
     <w:multiLevelType w:val="singleLevel"/>
     <w:tmpl w:val="F1D0832A"/>
@@ -11216,7 +11323,7 @@
       </w:rPr>
     </w:lvl>
   </w:abstractNum>
-  <w:abstractNum w:abstractNumId="4" w15:restartNumberingAfterBreak="0">
+  <w:abstractNum w:abstractNumId="7" w15:restartNumberingAfterBreak="0">
     <w:nsid w:val="44C91F01"/>
     <w:multiLevelType w:val="singleLevel"/>
     <w:tmpl w:val="3F9E1BA6"/>
@@ -11240,7 +11347,7 @@
       </w:rPr>
     </w:lvl>
   </w:abstractNum>
-  <w:abstractNum w:abstractNumId="5" w15:restartNumberingAfterBreak="0">
+  <w:abstractNum w:abstractNumId="8" w15:restartNumberingAfterBreak="0">
     <w:nsid w:val="45104A2F"/>
     <w:multiLevelType w:val="singleLevel"/>
     <w:tmpl w:val="F8E29858"/>
@@ -11262,7 +11369,29 @@
       </w:rPr>
     </w:lvl>
   </w:abstractNum>
-  <w:abstractNum w:abstractNumId="6" w15:restartNumberingAfterBreak="0">
+  <w:abstractNum w:abstractNumId="9" w15:restartNumberingAfterBreak="0">
+    <w:nsid w:val="5E7C0DEB"/>
+    <w:multiLevelType w:val="singleLevel"/>
+    <w:tmpl w:val="F8E29858"/>
+    <w:lvl w:ilvl="0">
+      <w:start w:val="1"/>
+      <w:numFmt w:val="decimal"/>
+      <w:lvlText w:val=""/>
+      <w:lvlJc w:val="left"/>
+      <w:pPr>
+        <w:tabs>
+          <w:tab w:val="num" w:pos="720"/>
+        </w:tabs>
+        <w:ind w:left="720" w:hanging="360"/>
+      </w:pPr>
+      <w:rPr>
+        <w:rFonts w:ascii="Symbol" w:hAnsi="Symbol" w:hint="default"/>
+        <w:b w:val="0"/>
+        <w:sz w:val="24"/>
+      </w:rPr>
+    </w:lvl>
+  </w:abstractNum>
+  <w:abstractNum w:abstractNumId="10" w15:restartNumberingAfterBreak="0">
     <w:nsid w:val="7CE06A69"/>
     <w:multiLevelType w:val="multilevel"/>
     <w:tmpl w:val="081EB290"/>
@@ -11365,26 +11494,48 @@
       </w:pPr>
     </w:lvl>
   </w:abstractNum>
+  <w:abstractNum w:abstractNumId="11" w15:restartNumberingAfterBreak="0">
+    <w:nsid w:val="7DDD4F61"/>
+    <w:multiLevelType w:val="singleLevel"/>
+    <w:tmpl w:val="F8E29858"/>
+    <w:lvl w:ilvl="0">
+      <w:start w:val="1"/>
+      <w:numFmt w:val="decimal"/>
+      <w:lvlText w:val=""/>
+      <w:lvlJc w:val="left"/>
+      <w:pPr>
+        <w:tabs>
+          <w:tab w:val="num" w:pos="720"/>
+        </w:tabs>
+        <w:ind w:left="720" w:hanging="360"/>
+      </w:pPr>
+      <w:rPr>
+        <w:rFonts w:ascii="Symbol" w:hAnsi="Symbol" w:hint="default"/>
+        <w:b w:val="0"/>
+        <w:sz w:val="24"/>
+      </w:rPr>
+    </w:lvl>
+  </w:abstractNum>
   <w:num w:numId="1" w16cid:durableId="822158145">
-    <w:abstractNumId w:val="1"/>
+    <w:abstractNumId w:val="3"/>
   </w:num>
   <w:num w:numId="2" w16cid:durableId="2114588318">
+    <w:abstractNumId w:val="4"/>
+  </w:num>
+  <w:num w:numId="3" w16cid:durableId="1996765505">
+    <w:abstractNumId w:val="10"/>
+  </w:num>
+  <w:num w:numId="4" w16cid:durableId="659387958">
+    <w:abstractNumId w:val="7"/>
+  </w:num>
+  <w:num w:numId="5" w16cid:durableId="2092699276">
     <w:abstractNumId w:val="2"/>
   </w:num>
-  <w:num w:numId="3" w16cid:durableId="1996765505">
+  <w:num w:numId="6" w16cid:durableId="651911250">
     <w:abstractNumId w:val="6"/>
   </w:num>
-  <w:num w:numId="4" w16cid:durableId="659387958">
+  <w:num w:numId="7" w16cid:durableId="522284668">
     <w:abstractNumId w:val="4"/>
-  </w:num>
-  <w:num w:numId="5" w16cid:durableId="2092699276">
-    <w:abstractNumId w:val="0"/>
-  </w:num>
-  <w:num w:numId="6" w16cid:durableId="651911250">
-    <w:abstractNumId w:val="3"/>
-  </w:num>
-  <w:num w:numId="7" w16cid:durableId="522284668">
-    <w:abstractNumId w:val="2"/>
     <w:lvlOverride w:ilvl="0">
       <w:lvl w:ilvl="0">
         <w:start w:val="1"/>
@@ -11406,7 +11557,7 @@
     </w:lvlOverride>
   </w:num>
   <w:num w:numId="8" w16cid:durableId="1595477983">
-    <w:abstractNumId w:val="2"/>
+    <w:abstractNumId w:val="4"/>
     <w:lvlOverride w:ilvl="0">
       <w:lvl w:ilvl="0">
         <w:start w:val="1"/>
@@ -11428,7 +11579,7 @@
     </w:lvlOverride>
   </w:num>
   <w:num w:numId="9" w16cid:durableId="1620913943">
-    <w:abstractNumId w:val="2"/>
+    <w:abstractNumId w:val="4"/>
     <w:lvlOverride w:ilvl="0">
       <w:lvl w:ilvl="0">
         <w:start w:val="1"/>
@@ -11450,7 +11601,7 @@
     </w:lvlOverride>
   </w:num>
   <w:num w:numId="10" w16cid:durableId="179245032">
-    <w:abstractNumId w:val="2"/>
+    <w:abstractNumId w:val="4"/>
     <w:lvlOverride w:ilvl="0">
       <w:lvl w:ilvl="0">
         <w:start w:val="1"/>
@@ -11472,7 +11623,7 @@
     </w:lvlOverride>
   </w:num>
   <w:num w:numId="11" w16cid:durableId="957220776">
-    <w:abstractNumId w:val="2"/>
+    <w:abstractNumId w:val="4"/>
     <w:lvlOverride w:ilvl="0">
       <w:lvl w:ilvl="0">
         <w:start w:val="1"/>
@@ -11494,7 +11645,7 @@
     </w:lvlOverride>
   </w:num>
   <w:num w:numId="12" w16cid:durableId="527644236">
-    <w:abstractNumId w:val="2"/>
+    <w:abstractNumId w:val="4"/>
     <w:lvlOverride w:ilvl="0">
       <w:lvl w:ilvl="0">
         <w:start w:val="1"/>
@@ -11516,7 +11667,7 @@
     </w:lvlOverride>
   </w:num>
   <w:num w:numId="13" w16cid:durableId="546525157">
-    <w:abstractNumId w:val="2"/>
+    <w:abstractNumId w:val="4"/>
     <w:lvlOverride w:ilvl="0">
       <w:lvl w:ilvl="0">
         <w:start w:val="1"/>
@@ -11538,7 +11689,7 @@
     </w:lvlOverride>
   </w:num>
   <w:num w:numId="14" w16cid:durableId="1135610050">
-    <w:abstractNumId w:val="2"/>
+    <w:abstractNumId w:val="4"/>
     <w:lvlOverride w:ilvl="0">
       <w:lvl w:ilvl="0">
         <w:start w:val="1"/>
@@ -11560,7 +11711,7 @@
     </w:lvlOverride>
   </w:num>
   <w:num w:numId="15" w16cid:durableId="901210146">
-    <w:abstractNumId w:val="2"/>
+    <w:abstractNumId w:val="4"/>
     <w:lvlOverride w:ilvl="0">
       <w:lvl w:ilvl="0">
         <w:start w:val="1"/>
@@ -11582,7 +11733,7 @@
     </w:lvlOverride>
   </w:num>
   <w:num w:numId="16" w16cid:durableId="1537499868">
-    <w:abstractNumId w:val="2"/>
+    <w:abstractNumId w:val="4"/>
     <w:lvlOverride w:ilvl="0">
       <w:lvl w:ilvl="0">
         <w:start w:val="1"/>
@@ -11604,7 +11755,7 @@
     </w:lvlOverride>
   </w:num>
   <w:num w:numId="17" w16cid:durableId="1616979640">
-    <w:abstractNumId w:val="2"/>
+    <w:abstractNumId w:val="4"/>
     <w:lvlOverride w:ilvl="0">
       <w:lvl w:ilvl="0">
         <w:start w:val="1"/>
@@ -11626,7 +11777,7 @@
     </w:lvlOverride>
   </w:num>
   <w:num w:numId="18" w16cid:durableId="331569286">
-    <w:abstractNumId w:val="2"/>
+    <w:abstractNumId w:val="4"/>
     <w:lvlOverride w:ilvl="0">
       <w:lvl w:ilvl="0">
         <w:start w:val="1"/>
@@ -11648,7 +11799,7 @@
     </w:lvlOverride>
   </w:num>
   <w:num w:numId="19" w16cid:durableId="350685493">
-    <w:abstractNumId w:val="2"/>
+    <w:abstractNumId w:val="4"/>
     <w:lvlOverride w:ilvl="0">
       <w:lvl w:ilvl="0">
         <w:start w:val="1"/>
@@ -11670,7 +11821,7 @@
     </w:lvlOverride>
   </w:num>
   <w:num w:numId="20" w16cid:durableId="1454523378">
-    <w:abstractNumId w:val="2"/>
+    <w:abstractNumId w:val="4"/>
     <w:lvlOverride w:ilvl="0">
       <w:lvl w:ilvl="0">
         <w:start w:val="1"/>
@@ -11692,7 +11843,7 @@
     </w:lvlOverride>
   </w:num>
   <w:num w:numId="21" w16cid:durableId="72972083">
-    <w:abstractNumId w:val="2"/>
+    <w:abstractNumId w:val="4"/>
     <w:lvlOverride w:ilvl="0">
       <w:lvl w:ilvl="0">
         <w:start w:val="1"/>
@@ -11714,7 +11865,22 @@
     </w:lvlOverride>
   </w:num>
   <w:num w:numId="22" w16cid:durableId="1299609375">
+    <w:abstractNumId w:val="8"/>
+  </w:num>
+  <w:num w:numId="23" w16cid:durableId="1810511591">
+    <w:abstractNumId w:val="0"/>
+  </w:num>
+  <w:num w:numId="24" w16cid:durableId="979109984">
+    <w:abstractNumId w:val="11"/>
+  </w:num>
+  <w:num w:numId="25" w16cid:durableId="1316301744">
     <w:abstractNumId w:val="5"/>
+  </w:num>
+  <w:num w:numId="26" w16cid:durableId="1870871839">
+    <w:abstractNumId w:val="1"/>
+  </w:num>
+  <w:num w:numId="27" w16cid:durableId="618681001">
+    <w:abstractNumId w:val="9"/>
   </w:num>
 </w:numbering>
 </file>

</xml_diff>

<commit_message>
Author's edits to the Word report
Co-Authored-By: Claude Opus 5.5 <noreply@anthropic.com>
</commit_message>
<xml_diff>
--- a/report/assignment-1/Assignment-1-Report.docx
+++ b/report/assignment-1/Assignment-1-Report.docx
@@ -217,7 +217,15 @@
         <w:t xml:space="preserve">HAND OUT DATE: </w:t>
       </w:r>
       <w:r>
-        <w:t>- dd-mm-yyyy -</w:t>
+        <w:t>- dd-mm-</w:t>
+      </w:r>
+      <w:proofErr w:type="spellStart"/>
+      <w:r>
+        <w:t>yyyy</w:t>
+      </w:r>
+      <w:proofErr w:type="spellEnd"/>
+      <w:r>
+        <w:t xml:space="preserve"> -</w:t>
       </w:r>
     </w:p>
     <w:p>
@@ -243,7 +251,21 @@
         <w:rPr>
           <w:sz w:val="28"/>
         </w:rPr>
-        <w:t xml:space="preserve">HAND IN DATE:     - dd-mm-yyyy -   </w:t>
+        <w:t>HAND IN DATE:     - dd-mm-</w:t>
+      </w:r>
+      <w:proofErr w:type="spellStart"/>
+      <w:r>
+        <w:rPr>
+          <w:sz w:val="28"/>
+        </w:rPr>
+        <w:t>yyyy</w:t>
+      </w:r>
+      <w:proofErr w:type="spellEnd"/>
+      <w:r>
+        <w:rPr>
+          <w:sz w:val="28"/>
+        </w:rPr>
+        <w:t xml:space="preserve"> -   </w:t>
       </w:r>
     </w:p>
     <w:p>
@@ -3564,7 +3586,13 @@
         <w:spacing w:after="120"/>
       </w:pPr>
       <w:r>
-        <w:t>From this profile, the methodology has to meet five needs:</w:t>
+        <w:t xml:space="preserve">From this profile, the methodology </w:t>
+      </w:r>
+      <w:r>
+        <w:t>must</w:t>
+      </w:r>
+      <w:r>
+        <w:t xml:space="preserve"> meet five needs:</w:t>
       </w:r>
     </w:p>
     <w:p>
@@ -3578,7 +3606,10 @@
         <w:jc w:val="left"/>
       </w:pPr>
       <w:r>
-        <w:t>Handle changing priorities</w:t>
+        <w:t>Handling</w:t>
+      </w:r>
+      <w:r>
+        <w:t xml:space="preserve"> changing priorities</w:t>
       </w:r>
     </w:p>
     <w:p>
@@ -3867,7 +3898,19 @@
         <w:ind w:left="720"/>
       </w:pPr>
       <w:r>
-        <w:t>For users, quality means balances and envelope totals that are correct, private and easy to understand.</w:t>
+        <w:t xml:space="preserve">For users, quality means </w:t>
+      </w:r>
+      <w:r>
+        <w:t>balance</w:t>
+      </w:r>
+      <w:r>
+        <w:t xml:space="preserve"> and </w:t>
+      </w:r>
+      <w:r>
+        <w:t>envelopes</w:t>
+      </w:r>
+      <w:r>
+        <w:t xml:space="preserve"> totals that are correct, private and easy to understand.</w:t>
       </w:r>
     </w:p>
     <w:p>
@@ -3971,7 +4014,13 @@
         <w:ind w:left="720"/>
       </w:pPr>
       <w:r>
-        <w:t>In terms of transcendent view, quality refer to the sense that the app can be trusted with one's money. Users recognise it through daily use, and it will also be built up when the other four views above are met.</w:t>
+        <w:t xml:space="preserve">In terms of transcendent view, quality </w:t>
+      </w:r>
+      <w:r>
+        <w:t>refers</w:t>
+      </w:r>
+      <w:r>
+        <w:t xml:space="preserve"> to the sense that the app can be trusted with one's money. Users recognise it through daily use, and it will also be built up when the other four views above are met.</w:t>
       </w:r>
     </w:p>
     <w:p>
@@ -4032,7 +4081,13 @@
         <w:ind w:left="720"/>
       </w:pPr>
       <w:r>
-        <w:t xml:space="preserve">Actual stores user's transactions, balances and bank connections, which </w:t>
+        <w:t xml:space="preserve">Actual </w:t>
+      </w:r>
+      <w:r>
+        <w:t>stores’</w:t>
+      </w:r>
+      <w:r>
+        <w:t xml:space="preserve"> user's transactions, balances and bank connections, which </w:t>
       </w:r>
       <w:r>
         <w:t>are</w:t>
@@ -4197,7 +4252,33 @@
         <w:ind w:left="720"/>
       </w:pPr>
       <w:r>
-        <w:t>There is no test coverage measurement. Test coverage would not prove that the code is correct, but it would at least show what is untested. And reliability defects still reach users, like a sync defect that stopped some budgets from opening and it's stayed in released versions for years (Brown, 2026). Although Actual's testing checklist asks for "appropriate test coverage" (Actual Budget, n.d.-i, Testing Checklist section), there's no coverage report found in the repository, and sync-server tests have coverage switched off (Actual Budget, 2026a). Therefore, nobody can tell how much of the sync and migration code is actually tested and actually safe.</w:t>
+        <w:t xml:space="preserve">There is no test coverage measurement. Test coverage would not prove that the code is correct, but it would at least show what is untested. And reliability defects still reach users, like a sync defect that stopped some budgets from </w:t>
+      </w:r>
+      <w:r>
+        <w:t>opening,</w:t>
+      </w:r>
+      <w:r>
+        <w:t xml:space="preserve"> and it's stayed in released versions for years (Brown, 2026). Although Actual's testing checklist asks for "appropriate test coverage" (Actual Budget, n.d.-i, Testing Checklist section), there's no coverage report found in the repository, and sync-server tests have coverage switched off (Actual Budget, 2026a). Therefore, nobody can tell how </w:t>
+      </w:r>
+      <w:r>
+        <w:t>much</w:t>
+      </w:r>
+      <w:r>
+        <w:t xml:space="preserve"> the sync and migration code is </w:t>
+      </w:r>
+      <w:proofErr w:type="gramStart"/>
+      <w:r>
+        <w:t>actually tested</w:t>
+      </w:r>
+      <w:proofErr w:type="gramEnd"/>
+      <w:r>
+        <w:t xml:space="preserve"> and </w:t>
+      </w:r>
+      <w:r>
+        <w:t>safe</w:t>
+      </w:r>
+      <w:r>
+        <w:t>.</w:t>
       </w:r>
     </w:p>
     <w:p>
@@ -4249,7 +4330,13 @@
         <w:ind w:left="720"/>
       </w:pPr>
       <w:r>
-        <w:t>No written QA plan. Quality rules are spread across documentation, templates and CI files, so there's no a single place that states what must be checked before work moves on.</w:t>
+        <w:t xml:space="preserve">No written QA plan. Quality rules are spread across documentation, templates and CI files, so there's </w:t>
+      </w:r>
+      <w:r>
+        <w:t>not</w:t>
+      </w:r>
+      <w:r>
+        <w:t xml:space="preserve"> a single place that states what must be checked before work moves on.</w:t>
       </w:r>
     </w:p>
     <w:p>
@@ -7957,6 +8044,7 @@
       <w:r>
         <w:t xml:space="preserve">Actual Budget. (2026a). </w:t>
       </w:r>
+      <w:proofErr w:type="gramStart"/>
       <w:r>
         <w:rPr>
           <w:i/>
@@ -7964,6 +8052,7 @@
         </w:rPr>
         <w:t>Actual</w:t>
       </w:r>
+      <w:proofErr w:type="gramEnd"/>
       <w:r>
         <w:t xml:space="preserve"> [Computer software]. GitHub. </w:t>
       </w:r>
@@ -8180,10 +8269,22 @@
           <w:i/>
           <w:iCs/>
         </w:rPr>
-        <w:t>[AI] fix(sync): receive only the latest timestamp to stop counter overflow</w:t>
-      </w:r>
-      <w:r>
-        <w:t xml:space="preserve"> (#8706) [Commit]. GitHub. </w:t>
+        <w:t xml:space="preserve">[AI] fix(sync): receive only the latest timestamp to stop counter </w:t>
+      </w:r>
+      <w:proofErr w:type="gramStart"/>
+      <w:r>
+        <w:rPr>
+          <w:i/>
+          <w:iCs/>
+        </w:rPr>
+        <w:t>overflow</w:t>
+      </w:r>
+      <w:r>
+        <w:t xml:space="preserve"> (#</w:t>
+      </w:r>
+      <w:proofErr w:type="gramEnd"/>
+      <w:r>
+        <w:t xml:space="preserve">8706) [Commit]. GitHub. </w:t>
       </w:r>
       <w:hyperlink r:id="rId38" w:history="1">
         <w:r>
@@ -8335,7 +8436,23 @@
           <w:i/>
           <w:iCs/>
         </w:rPr>
-        <w:t>Systems and software engineering — Systems and software Quality Requirements and Evaluation (SQuaRE) — Product quality model</w:t>
+        <w:t>Systems and software engineering — Systems and software Quality Requirements and Evaluation (</w:t>
+      </w:r>
+      <w:proofErr w:type="gramStart"/>
+      <w:r>
+        <w:rPr>
+          <w:i/>
+          <w:iCs/>
+        </w:rPr>
+        <w:t>SQuaRE) —</w:t>
+      </w:r>
+      <w:proofErr w:type="gramEnd"/>
+      <w:r>
+        <w:rPr>
+          <w:i/>
+          <w:iCs/>
+        </w:rPr>
+        <w:t xml:space="preserve"> Product quality model</w:t>
       </w:r>
       <w:r>
         <w:t xml:space="preserve"> (ISO/IEC Standard No. 25010:2023). </w:t>
@@ -8389,8 +8506,13 @@
         </w:numPr>
         <w:jc w:val="left"/>
       </w:pPr>
-      <w:r>
-        <w:t xml:space="preserve">Open Source Technology Improvement Fund. (2026, January 30). </w:t>
+      <w:proofErr w:type="gramStart"/>
+      <w:r>
+        <w:t>Open Source</w:t>
+      </w:r>
+      <w:proofErr w:type="gramEnd"/>
+      <w:r>
+        <w:t xml:space="preserve"> Technology Improvement Fund. (2026, January 30). </w:t>
       </w:r>
       <w:r>
         <w:rPr>
@@ -8454,12 +8576,37 @@
       <w:r>
         <w:t xml:space="preserve">Salkever, A. (2023). </w:t>
       </w:r>
+      <w:proofErr w:type="gramStart"/>
       <w:r>
         <w:rPr>
           <w:i/>
           <w:iCs/>
         </w:rPr>
-        <w:t>Open source maintainers: Exploring the people, practices, and constraints facing the world's most critical open source software projects</w:t>
+        <w:t>Open source</w:t>
+      </w:r>
+      <w:proofErr w:type="gramEnd"/>
+      <w:r>
+        <w:rPr>
+          <w:i/>
+          <w:iCs/>
+        </w:rPr>
+        <w:t xml:space="preserve"> maintainers: Exploring the people, practices, and constraints facing the world's most critical </w:t>
+      </w:r>
+      <w:proofErr w:type="gramStart"/>
+      <w:r>
+        <w:rPr>
+          <w:i/>
+          <w:iCs/>
+        </w:rPr>
+        <w:t>open source</w:t>
+      </w:r>
+      <w:proofErr w:type="gramEnd"/>
+      <w:r>
+        <w:rPr>
+          <w:i/>
+          <w:iCs/>
+        </w:rPr>
+        <w:t xml:space="preserve"> software projects</w:t>
       </w:r>
       <w:r>
         <w:t xml:space="preserve">. The Linux Foundation. </w:t>
@@ -8517,12 +8664,37 @@
         <w:lastRenderedPageBreak/>
         <w:t xml:space="preserve">Stacoviak, A., &amp; Santo, J. (Hosts). (2022, July 1). </w:t>
       </w:r>
+      <w:proofErr w:type="gramStart"/>
       <w:r>
         <w:rPr>
           <w:i/>
           <w:iCs/>
         </w:rPr>
-        <w:t>Actual(ly) opening up with James Long</w:t>
+        <w:t>Actual</w:t>
+      </w:r>
+      <w:proofErr w:type="gramEnd"/>
+      <w:r>
+        <w:rPr>
+          <w:i/>
+          <w:iCs/>
+        </w:rPr>
+        <w:t xml:space="preserve">(ly) </w:t>
+      </w:r>
+      <w:proofErr w:type="gramStart"/>
+      <w:r>
+        <w:rPr>
+          <w:i/>
+          <w:iCs/>
+        </w:rPr>
+        <w:t>opening up</w:t>
+      </w:r>
+      <w:proofErr w:type="gramEnd"/>
+      <w:r>
+        <w:rPr>
+          <w:i/>
+          <w:iCs/>
+        </w:rPr>
+        <w:t xml:space="preserve"> with James Long</w:t>
       </w:r>
       <w:r>
         <w:t xml:space="preserve"> (No. 495) [Audio podcast episode]. In </w:t>
@@ -10804,7 +10976,15 @@
       <w:pStyle w:val="Footer"/>
     </w:pPr>
     <w:r>
-      <w:t>Version 1.2 UCTI AssCv 2007-10-23</w:t>
+      <w:t xml:space="preserve">Version 1.2 UCTI </w:t>
+    </w:r>
+    <w:proofErr w:type="spellStart"/>
+    <w:r>
+      <w:t>AssCv</w:t>
+    </w:r>
+    <w:proofErr w:type="spellEnd"/>
+    <w:r>
+      <w:t xml:space="preserve"> 2007-10-23</w:t>
     </w:r>
   </w:p>
 </w:ftr>

</xml_diff>

<commit_message>
Add SQAP summary poster as Appendix C (md and Word)
Co-Authored-By: Claude Opus 5.5 <noreply@anthropic.com>
</commit_message>
<xml_diff>
--- a/report/assignment-1/Assignment-1-Report.docx
+++ b/report/assignment-1/Assignment-1-Report.docx
@@ -10922,6 +10922,99 @@
       </w:r>
     </w:p>
     <w:bookmarkEnd w:id="86"/>
+    <w:p>
+      <w:pPr>
+        <w:pStyle w:val="Heading1"/>
+        <w:numPr>
+          <w:ilvl w:val="0"/>
+          <w:numId w:val="0"/>
+        </w:numPr>
+      </w:pPr>
+      <w:bookmarkStart w:id="88" w:name="appendix-c-sqap-summary-poster"/>
+      <w:r>
+        <w:t>Appendix C: SQAP Summary Poster</w:t>
+      </w:r>
+      <w:bookmarkEnd w:id="88"/>
+    </w:p>
+    <w:p>
+      <w:pPr>
+        <w:pStyle w:val="FirstParagraph"/>
+      </w:pPr>
+      <w:r>
+        <w:rPr>
+          <w:i/>
+          <w:iCs/>
+        </w:rPr>
+        <w:t>Supplementary one-page summary of the QA plan (Section 3.5, Table 3.2) and the IV&amp;V model (Section 4.2, Table 4.2). It adds no new checks.</w:t>
+      </w:r>
+    </w:p>
+    <w:p>
+      <w:pPr>
+        <w:pStyle w:val="BodyText"/>
+        <w:keepNext/>
+        <w:spacing w:before="120" w:after="0"/>
+        <w:jc w:val="center"/>
+      </w:pPr>
+      <w:r>
+        <w:rPr>
+          <w:noProof/>
+        </w:rPr>
+        <w:drawing>
+          <wp:inline distT="0" distB="0" distL="0" distR="0">
+            <wp:extent cx="4731995" cy="7223760"/>
+            <wp:effectExtent l="0" t="0" r="0" b="0"/>
+            <wp:docPr id="30" name="Picture" descr="Figure C.1: one-page SQAP summary poster for Actual"/>
+            <wp:cNvGraphicFramePr/>
+            <a:graphic xmlns:a="http://schemas.openxmlformats.org/drawingml/2006/main">
+              <a:graphicData uri="http://schemas.openxmlformats.org/drawingml/2006/picture">
+                <pic:pic xmlns:pic="http://schemas.openxmlformats.org/drawingml/2006/picture">
+                  <pic:nvPicPr>
+                    <pic:cNvPr id="31" name="Picture" descr="figures/appendix-c-sqap.png"/>
+                    <pic:cNvPicPr>
+                      <a:picLocks noChangeAspect="1" noChangeArrowheads="1"/>
+                    </pic:cNvPicPr>
+                  </pic:nvPicPr>
+                  <pic:blipFill>
+                    <a:blip r:embed="rId60"/>
+                    <a:stretch>
+                      <a:fillRect/>
+                    </a:stretch>
+                  </pic:blipFill>
+                  <pic:spPr bwMode="auto">
+                    <a:xfrm>
+                      <a:off x="0" y="0"/>
+                      <a:ext cx="4731995" cy="7223760"/>
+                    </a:xfrm>
+                    <a:prstGeom prst="rect">
+                      <a:avLst/>
+                    </a:prstGeom>
+                    <a:noFill/>
+                    <a:ln w="9525">
+                      <a:noFill/>
+                      <a:headEnd/>
+                      <a:tailEnd/>
+                    </a:ln>
+                  </pic:spPr>
+                </pic:pic>
+              </a:graphicData>
+            </a:graphic>
+          </wp:inline>
+        </w:drawing>
+      </w:r>
+    </w:p>
+    <w:p>
+      <w:pPr>
+        <w:pStyle w:val="BodyText"/>
+        <w:jc w:val="center"/>
+      </w:pPr>
+      <w:r>
+        <w:rPr>
+          <w:i/>
+          <w:iCs/>
+        </w:rPr>
+        <w:t>Figure C.1. Software Quality Assurance Plan for Actual Budget, summarised as a poster.</w:t>
+      </w:r>
+    </w:p>
     <w:p>
       <w:pPr>
         <w:spacing w:line="240" w:lineRule="auto"/>

</xml_diff>

<commit_message>
Split SQAP poster: Figure 4 in 3.5, plan sections in Appendix C; trim labels
Co-Authored-By: Claude Opus 5.5 <noreply@anthropic.com>
</commit_message>
<xml_diff>
--- a/report/assignment-1/Assignment-1-Report.docx
+++ b/report/assignment-1/Assignment-1-Report.docx
@@ -5743,6 +5743,81 @@
     </w:p>
     <w:p>
       <w:pPr>
+        <w:pStyle w:val="BodyText"/>
+      </w:pPr>
+      <w:r>
+        <w:t>Figure 4 shows these checks on the board, together with the aim and quality objectives they serve.</w:t>
+      </w:r>
+    </w:p>
+    <w:p>
+      <w:pPr>
+        <w:pStyle w:val="BodyText"/>
+        <w:keepNext/>
+        <w:spacing w:before="120" w:after="0"/>
+        <w:jc w:val="center"/>
+      </w:pPr>
+      <w:r>
+        <w:rPr>
+          <w:noProof/>
+        </w:rPr>
+        <w:drawing>
+          <wp:inline distT="0" distB="0" distL="0" distR="0">
+            <wp:extent cx="5733000" cy="2742698"/>
+            <wp:effectExtent l="0" t="0" r="0" b="0"/>
+            <wp:docPr id="32" name="Picture" descr="Figure 4: QA checks per Kanban exit policy and risk tiers"/>
+            <wp:cNvGraphicFramePr/>
+            <a:graphic xmlns:a="http://schemas.openxmlformats.org/drawingml/2006/main">
+              <a:graphicData uri="http://schemas.openxmlformats.org/drawingml/2006/picture">
+                <pic:pic xmlns:pic="http://schemas.openxmlformats.org/drawingml/2006/picture">
+                  <pic:nvPicPr>
+                    <pic:cNvPr id="33" name="Picture" descr="figures/figure-4.png"/>
+                    <pic:cNvPicPr>
+                      <a:picLocks noChangeAspect="1" noChangeArrowheads="1"/>
+                    </pic:cNvPicPr>
+                  </pic:nvPicPr>
+                  <pic:blipFill>
+                    <a:blip r:embed="rId61"/>
+                    <a:stretch>
+                      <a:fillRect/>
+                    </a:stretch>
+                  </pic:blipFill>
+                  <pic:spPr bwMode="auto">
+                    <a:xfrm>
+                      <a:off x="0" y="0"/>
+                      <a:ext cx="5733000" cy="2742698"/>
+                    </a:xfrm>
+                    <a:prstGeom prst="rect">
+                      <a:avLst/>
+                    </a:prstGeom>
+                    <a:noFill/>
+                    <a:ln w="9525">
+                      <a:noFill/>
+                      <a:headEnd/>
+                      <a:tailEnd/>
+                    </a:ln>
+                  </pic:spPr>
+                </pic:pic>
+              </a:graphicData>
+            </a:graphic>
+          </wp:inline>
+        </w:drawing>
+      </w:r>
+    </w:p>
+    <w:p>
+      <w:pPr>
+        <w:pStyle w:val="BodyText"/>
+        <w:jc w:val="center"/>
+      </w:pPr>
+      <w:r>
+        <w:rPr>
+          <w:i/>
+          <w:iCs/>
+        </w:rPr>
+        <w:t>Figure 4. QA checks on the Kanban board, by risk tier.</w:t>
+      </w:r>
+    </w:p>
+    <w:p>
+      <w:pPr>
         <w:pStyle w:val="Heading2"/>
       </w:pPr>
       <w:bookmarkStart w:id="57" w:name="_Toc244223174"/>
@@ -10945,7 +11020,7 @@
           <w:i/>
           <w:iCs/>
         </w:rPr>
-        <w:t>Supplementary one-page summary of the QA plan (Section 3.5, Table 3.2) and the IV&amp;V model (Section 4.2, Table 4.2). It adds no new checks.</w:t>
+        <w:t>Supplementary summary of Sections 3 and 4, arranged by SQAP section. It adds no new checks.</w:t>
       </w:r>
     </w:p>
     <w:p>
@@ -10961,9 +11036,9 @@
         </w:rPr>
         <w:drawing>
           <wp:inline distT="0" distB="0" distL="0" distR="0">
-            <wp:extent cx="4731995" cy="7223760"/>
+            <wp:extent cx="5733000" cy="4152140"/>
             <wp:effectExtent l="0" t="0" r="0" b="0"/>
-            <wp:docPr id="30" name="Picture" descr="Figure C.1: one-page SQAP summary poster for Actual"/>
+            <wp:docPr id="30" name="Picture" descr="Figure C.1: SQAP summary poster for Actual"/>
             <wp:cNvGraphicFramePr/>
             <a:graphic xmlns:a="http://schemas.openxmlformats.org/drawingml/2006/main">
               <a:graphicData uri="http://schemas.openxmlformats.org/drawingml/2006/picture">
@@ -10983,7 +11058,7 @@
                   <pic:spPr bwMode="auto">
                     <a:xfrm>
                       <a:off x="0" y="0"/>
-                      <a:ext cx="4731995" cy="7223760"/>
+                      <a:ext cx="5733000" cy="4152140"/>
                     </a:xfrm>
                     <a:prstGeom prst="rect">
                       <a:avLst/>

</xml_diff>

<commit_message>
Redraw Figure 4 as swimlanes with existing Design policy and clear feedback loop
Co-Authored-By: Claude Opus 5.5 <noreply@anthropic.com>
</commit_message>
<xml_diff>
--- a/report/assignment-1/Assignment-1-Report.docx
+++ b/report/assignment-1/Assignment-1-Report.docx
@@ -5762,7 +5762,7 @@
         </w:rPr>
         <w:drawing>
           <wp:inline distT="0" distB="0" distL="0" distR="0">
-            <wp:extent cx="5733000" cy="2742698"/>
+            <wp:extent cx="5733000" cy="2971256"/>
             <wp:effectExtent l="0" t="0" r="0" b="0"/>
             <wp:docPr id="32" name="Picture" descr="Figure 4: QA checks per Kanban exit policy and risk tiers"/>
             <wp:cNvGraphicFramePr/>
@@ -5784,7 +5784,7 @@
                   <pic:spPr bwMode="auto">
                     <a:xfrm>
                       <a:off x="0" y="0"/>
-                      <a:ext cx="5733000" cy="2742698"/>
+                      <a:ext cx="5733000" cy="2971256"/>
                     </a:xfrm>
                     <a:prstGeom prst="rect">
                       <a:avLst/>

</xml_diff>

<commit_message>
Add student details page and fill cover dates in Word report
Co-Authored-By: Claude Opus 5.5 <noreply@anthropic.com>
</commit_message>
<xml_diff>
--- a/report/assignment-1/Assignment-1-Report.docx
+++ b/report/assignment-1/Assignment-1-Report.docx
@@ -217,15 +217,10 @@
         <w:t xml:space="preserve">HAND OUT DATE: </w:t>
       </w:r>
       <w:r>
-        <w:t>- dd-mm-</w:t>
-      </w:r>
-      <w:proofErr w:type="spellStart"/>
-      <w:r>
-        <w:t>yyyy</w:t>
-      </w:r>
-      <w:proofErr w:type="spellEnd"/>
-      <w:r>
-        <w:t xml:space="preserve"> -</w:t>
+        <w:rPr>
+          <w:sz w:val="28"/>
+        </w:rPr>
+        <w:t>11-09-2026</w:t>
       </w:r>
     </w:p>
     <w:p>
@@ -251,21 +246,7 @@
         <w:rPr>
           <w:sz w:val="28"/>
         </w:rPr>
-        <w:t>HAND IN DATE:     - dd-mm-</w:t>
-      </w:r>
-      <w:proofErr w:type="spellStart"/>
-      <w:r>
-        <w:rPr>
-          <w:sz w:val="28"/>
-        </w:rPr>
-        <w:t>yyyy</w:t>
-      </w:r>
-      <w:proofErr w:type="spellEnd"/>
-      <w:r>
-        <w:rPr>
-          <w:sz w:val="28"/>
-        </w:rPr>
-        <w:t xml:space="preserve"> -   </w:t>
+        <w:t xml:space="preserve">HAND IN DATE:     30-10-2026</w:t>
       </w:r>
     </w:p>
     <w:p>
@@ -622,15 +603,595 @@
     </w:p>
     <w:p>
       <w:pPr>
+        <w:pageBreakBefore/>
+        <w:spacing w:before="600" w:after="0"/>
+        <w:jc w:val="center"/>
+      </w:pPr>
+      <w:r>
+        <w:rPr>
+          <w:noProof/>
+        </w:rPr>
+        <w:drawing>
+          <wp:inline distT="0" distB="0" distL="0" distR="0">
+            <wp:extent cx="2377440" cy="2377440"/>
+            <wp:effectExtent l="0" t="0" r="0" b="0"/>
+            <wp:docPr id="40" name="APU logo" descr="Asia Pacific University logo"/>
+            <wp:cNvGraphicFramePr/>
+            <a:graphic xmlns:a="http://schemas.openxmlformats.org/drawingml/2006/main">
+              <a:graphicData uri="http://schemas.openxmlformats.org/drawingml/2006/picture">
+                <pic:pic xmlns:pic="http://schemas.openxmlformats.org/drawingml/2006/picture">
+                  <pic:nvPicPr>
+                    <pic:cNvPr id="41" name="APU logo"/>
+                    <pic:cNvPicPr>
+                      <a:picLocks noChangeAspect="1"/>
+                    </pic:cNvPicPr>
+                  </pic:nvPicPr>
+                  <pic:blipFill>
+                    <a:blip r:embed="rId9"/>
+                    <a:stretch>
+                      <a:fillRect/>
+                    </a:stretch>
+                  </pic:blipFill>
+                  <pic:spPr>
+                    <a:xfrm>
+                      <a:off x="0" y="0"/>
+                      <a:ext cx="2377440" cy="2377440"/>
+                    </a:xfrm>
+                    <a:prstGeom prst="rect">
+                      <a:avLst/>
+                    </a:prstGeom>
+                  </pic:spPr>
+                </pic:pic>
+              </a:graphicData>
+            </a:graphic>
+          </wp:inline>
+        </w:drawing>
+      </w:r>
+    </w:p>
+    <w:p>
+      <w:pPr>
+        <w:spacing w:before="0" w:after="0"/>
+      </w:pPr>
+    </w:p>
+    <w:p>
+      <w:pPr>
+        <w:spacing w:before="1000" w:after="0"/>
+      </w:pPr>
+    </w:p>
+    <w:tbl>
+      <w:tblPr>
+        <w:tblW w:w="9026" w:type="dxa"/>
+        <w:jc w:val="center"/>
+        <w:tblBorders>
+          <w:top w:val="single" w:sz="4" w:space="0" w:color="000000"/>
+          <w:left w:val="single" w:sz="4" w:space="0" w:color="000000"/>
+          <w:bottom w:val="single" w:sz="4" w:space="0" w:color="000000"/>
+          <w:right w:val="single" w:sz="4" w:space="0" w:color="000000"/>
+          <w:insideH w:val="single" w:sz="4" w:space="0" w:color="000000"/>
+          <w:insideV w:val="single" w:sz="4" w:space="0" w:color="000000"/>
+        </w:tblBorders>
+        <w:tblLayout w:type="fixed"/>
+        <w:tblCellMar>
+          <w:left w:w="100" w:type="dxa"/>
+          <w:right w:w="100" w:type="dxa"/>
+        </w:tblCellMar>
+        <w:tblLook w:val="0000"/>
+      </w:tblPr>
+      <w:tblGrid>
+        <w:gridCol w:w="2100"/>
+        <w:gridCol w:w="450"/>
+        <w:gridCol w:w="6476"/>
+      </w:tblGrid>
+      <w:tr>
+        <w:trPr>
+          <w:trHeight w:val="420"/>
+        </w:trPr>
+        <w:tc>
+          <w:tcPr>
+            <w:tcW w:w="2100" w:type="dxa"/>
+            <w:vAlign w:val="center"/>
+          </w:tcPr>
+          <w:p>
+            <w:pPr>
+              <w:spacing w:before="40" w:after="40" w:line="240" w:lineRule="auto"/>
+              <w:jc w:val="left"/>
+            </w:pPr>
+            <w:r>
+              <w:rPr>
+                <w:rFonts w:ascii="Times New Roman" w:hAnsi="Times New Roman" w:cs="Times New Roman"/>
+                <w:b/>
+                <w:bCs/>
+                <w:sz w:val="24"/>
+                <w:szCs w:val="24"/>
+              </w:rPr>
+              <w:t xml:space="preserve">Module Code</w:t>
+            </w:r>
+          </w:p>
+        </w:tc>
+        <w:tc>
+          <w:tcPr>
+            <w:tcW w:w="450" w:type="dxa"/>
+            <w:vAlign w:val="center"/>
+          </w:tcPr>
+          <w:p>
+            <w:pPr>
+              <w:spacing w:before="40" w:after="40" w:line="240" w:lineRule="auto"/>
+              <w:jc w:val="left"/>
+            </w:pPr>
+            <w:r>
+              <w:rPr>
+                <w:rFonts w:ascii="Times New Roman" w:hAnsi="Times New Roman" w:cs="Times New Roman"/>
+                <w:b/>
+                <w:bCs/>
+                <w:sz w:val="24"/>
+                <w:szCs w:val="24"/>
+              </w:rPr>
+              <w:t xml:space="preserve">:</w:t>
+            </w:r>
+          </w:p>
+        </w:tc>
+        <w:tc>
+          <w:tcPr>
+            <w:tcW w:w="6476" w:type="dxa"/>
+            <w:vAlign w:val="center"/>
+          </w:tcPr>
+          <w:p>
+            <w:pPr>
+              <w:spacing w:before="40" w:after="40" w:line="240" w:lineRule="auto"/>
+              <w:jc w:val="left"/>
+            </w:pPr>
+            <w:r>
+              <w:rPr>
+                <w:rFonts w:ascii="Times New Roman" w:hAnsi="Times New Roman" w:cs="Times New Roman"/>
+                <w:b/>
+                <w:bCs/>
+                <w:sz w:val="24"/>
+                <w:szCs w:val="24"/>
+              </w:rPr>
+              <w:t xml:space="preserve">CT051-3-3-SQE</w:t>
+            </w:r>
+          </w:p>
+        </w:tc>
+      </w:tr>
+      <w:tr>
+        <w:trPr>
+          <w:trHeight w:val="420"/>
+        </w:trPr>
+        <w:tc>
+          <w:tcPr>
+            <w:tcW w:w="2100" w:type="dxa"/>
+            <w:vAlign w:val="center"/>
+          </w:tcPr>
+          <w:p>
+            <w:pPr>
+              <w:spacing w:before="40" w:after="40" w:line="240" w:lineRule="auto"/>
+              <w:jc w:val="left"/>
+            </w:pPr>
+            <w:r>
+              <w:rPr>
+                <w:rFonts w:ascii="Times New Roman" w:hAnsi="Times New Roman" w:cs="Times New Roman"/>
+                <w:b/>
+                <w:bCs/>
+                <w:sz w:val="24"/>
+                <w:szCs w:val="24"/>
+              </w:rPr>
+              <w:t xml:space="preserve">Intake Code</w:t>
+            </w:r>
+          </w:p>
+        </w:tc>
+        <w:tc>
+          <w:tcPr>
+            <w:tcW w:w="450" w:type="dxa"/>
+            <w:vAlign w:val="center"/>
+          </w:tcPr>
+          <w:p>
+            <w:pPr>
+              <w:spacing w:before="40" w:after="40" w:line="240" w:lineRule="auto"/>
+              <w:jc w:val="left"/>
+            </w:pPr>
+            <w:r>
+              <w:rPr>
+                <w:rFonts w:ascii="Times New Roman" w:hAnsi="Times New Roman" w:cs="Times New Roman"/>
+                <w:b/>
+                <w:bCs/>
+                <w:sz w:val="24"/>
+                <w:szCs w:val="24"/>
+              </w:rPr>
+              <w:t xml:space="preserve">:</w:t>
+            </w:r>
+          </w:p>
+        </w:tc>
+        <w:tc>
+          <w:tcPr>
+            <w:tcW w:w="6476" w:type="dxa"/>
+            <w:vAlign w:val="center"/>
+          </w:tcPr>
+          <w:p>
+            <w:pPr>
+              <w:spacing w:before="40" w:after="40" w:line="240" w:lineRule="auto"/>
+              <w:jc w:val="left"/>
+            </w:pPr>
+            <w:r>
+              <w:rPr>
+                <w:rFonts w:ascii="Times New Roman" w:hAnsi="Times New Roman" w:cs="Times New Roman"/>
+                <w:b/>
+                <w:bCs/>
+                <w:sz w:val="24"/>
+                <w:szCs w:val="24"/>
+              </w:rPr>
+              <w:t xml:space="preserve">APU3F2609SE</w:t>
+            </w:r>
+          </w:p>
+        </w:tc>
+      </w:tr>
+      <w:tr>
+        <w:trPr>
+          <w:trHeight w:val="420"/>
+        </w:trPr>
+        <w:tc>
+          <w:tcPr>
+            <w:tcW w:w="2100" w:type="dxa"/>
+            <w:vAlign w:val="center"/>
+          </w:tcPr>
+          <w:p>
+            <w:pPr>
+              <w:spacing w:before="40" w:after="40" w:line="240" w:lineRule="auto"/>
+              <w:jc w:val="left"/>
+            </w:pPr>
+            <w:r>
+              <w:rPr>
+                <w:rFonts w:ascii="Times New Roman" w:hAnsi="Times New Roman" w:cs="Times New Roman"/>
+                <w:b/>
+                <w:bCs/>
+                <w:sz w:val="24"/>
+                <w:szCs w:val="24"/>
+              </w:rPr>
+              <w:t xml:space="preserve">Lecturer Name</w:t>
+            </w:r>
+          </w:p>
+        </w:tc>
+        <w:tc>
+          <w:tcPr>
+            <w:tcW w:w="450" w:type="dxa"/>
+            <w:vAlign w:val="center"/>
+          </w:tcPr>
+          <w:p>
+            <w:pPr>
+              <w:spacing w:before="40" w:after="40" w:line="240" w:lineRule="auto"/>
+              <w:jc w:val="left"/>
+            </w:pPr>
+            <w:r>
+              <w:rPr>
+                <w:rFonts w:ascii="Times New Roman" w:hAnsi="Times New Roman" w:cs="Times New Roman"/>
+                <w:b/>
+                <w:bCs/>
+                <w:sz w:val="24"/>
+                <w:szCs w:val="24"/>
+              </w:rPr>
+              <w:t xml:space="preserve">:</w:t>
+            </w:r>
+          </w:p>
+        </w:tc>
+        <w:tc>
+          <w:tcPr>
+            <w:tcW w:w="6476" w:type="dxa"/>
+            <w:vAlign w:val="center"/>
+          </w:tcPr>
+          <w:p>
+            <w:pPr>
+              <w:spacing w:before="40" w:after="40" w:line="240" w:lineRule="auto"/>
+              <w:jc w:val="left"/>
+            </w:pPr>
+            <w:r>
+              <w:rPr>
+                <w:rFonts w:ascii="Times New Roman" w:hAnsi="Times New Roman" w:cs="Times New Roman"/>
+                <w:b/>
+                <w:bCs/>
+                <w:sz w:val="24"/>
+                <w:szCs w:val="24"/>
+              </w:rPr>
+              <w:t xml:space="preserve">Dr. Kesava Pillai A/L Rajadorai @ Rajoo</w:t>
+            </w:r>
+          </w:p>
+        </w:tc>
+      </w:tr>
+      <w:tr>
+        <w:trPr>
+          <w:trHeight w:val="420"/>
+        </w:trPr>
+        <w:tc>
+          <w:tcPr>
+            <w:tcW w:w="2100" w:type="dxa"/>
+            <w:vAlign w:val="center"/>
+          </w:tcPr>
+          <w:p>
+            <w:pPr>
+              <w:spacing w:before="40" w:after="40" w:line="240" w:lineRule="auto"/>
+              <w:jc w:val="left"/>
+            </w:pPr>
+            <w:r>
+              <w:rPr>
+                <w:rFonts w:ascii="Times New Roman" w:hAnsi="Times New Roman" w:cs="Times New Roman"/>
+                <w:b/>
+                <w:bCs/>
+                <w:sz w:val="24"/>
+                <w:szCs w:val="24"/>
+              </w:rPr>
+              <w:t xml:space="preserve">Hand-In-Date</w:t>
+            </w:r>
+          </w:p>
+        </w:tc>
+        <w:tc>
+          <w:tcPr>
+            <w:tcW w:w="450" w:type="dxa"/>
+            <w:vAlign w:val="center"/>
+          </w:tcPr>
+          <w:p>
+            <w:pPr>
+              <w:spacing w:before="40" w:after="40" w:line="240" w:lineRule="auto"/>
+              <w:jc w:val="left"/>
+            </w:pPr>
+            <w:r>
+              <w:rPr>
+                <w:rFonts w:ascii="Times New Roman" w:hAnsi="Times New Roman" w:cs="Times New Roman"/>
+                <w:b/>
+                <w:bCs/>
+                <w:sz w:val="24"/>
+                <w:szCs w:val="24"/>
+              </w:rPr>
+              <w:t xml:space="preserve">:</w:t>
+            </w:r>
+          </w:p>
+        </w:tc>
+        <w:tc>
+          <w:tcPr>
+            <w:tcW w:w="6476" w:type="dxa"/>
+            <w:vAlign w:val="center"/>
+          </w:tcPr>
+          <w:p>
+            <w:pPr>
+              <w:spacing w:before="40" w:after="40" w:line="240" w:lineRule="auto"/>
+              <w:jc w:val="left"/>
+            </w:pPr>
+            <w:r>
+              <w:rPr>
+                <w:rFonts w:ascii="Times New Roman" w:hAnsi="Times New Roman" w:cs="Times New Roman"/>
+                <w:b/>
+                <w:bCs/>
+                <w:sz w:val="24"/>
+                <w:szCs w:val="24"/>
+              </w:rPr>
+              <w:t xml:space="preserve">30 October 2026</w:t>
+            </w:r>
+          </w:p>
+        </w:tc>
+      </w:tr>
+      <w:tr>
+        <w:trPr>
+          <w:trHeight w:val="420"/>
+        </w:trPr>
+        <w:tc>
+          <w:tcPr>
+            <w:tcW w:w="2100" w:type="dxa"/>
+            <w:vAlign w:val="center"/>
+          </w:tcPr>
+          <w:p>
+            <w:pPr>
+              <w:spacing w:before="40" w:after="40" w:line="240" w:lineRule="auto"/>
+              <w:jc w:val="left"/>
+            </w:pPr>
+            <w:r>
+              <w:rPr>
+                <w:rFonts w:ascii="Times New Roman" w:hAnsi="Times New Roman" w:cs="Times New Roman"/>
+                <w:b/>
+                <w:bCs/>
+                <w:sz w:val="24"/>
+                <w:szCs w:val="24"/>
+              </w:rPr>
+              <w:t xml:space="preserve">Hand-Out-Date</w:t>
+            </w:r>
+          </w:p>
+        </w:tc>
+        <w:tc>
+          <w:tcPr>
+            <w:tcW w:w="450" w:type="dxa"/>
+            <w:vAlign w:val="center"/>
+          </w:tcPr>
+          <w:p>
+            <w:pPr>
+              <w:spacing w:before="40" w:after="40" w:line="240" w:lineRule="auto"/>
+              <w:jc w:val="left"/>
+            </w:pPr>
+            <w:r>
+              <w:rPr>
+                <w:rFonts w:ascii="Times New Roman" w:hAnsi="Times New Roman" w:cs="Times New Roman"/>
+                <w:b/>
+                <w:bCs/>
+                <w:sz w:val="24"/>
+                <w:szCs w:val="24"/>
+              </w:rPr>
+              <w:t xml:space="preserve">:</w:t>
+            </w:r>
+          </w:p>
+        </w:tc>
+        <w:tc>
+          <w:tcPr>
+            <w:tcW w:w="6476" w:type="dxa"/>
+            <w:vAlign w:val="center"/>
+          </w:tcPr>
+          <w:p>
+            <w:pPr>
+              <w:spacing w:before="40" w:after="40" w:line="240" w:lineRule="auto"/>
+              <w:jc w:val="left"/>
+            </w:pPr>
+            <w:r>
+              <w:rPr>
+                <w:rFonts w:ascii="Times New Roman" w:hAnsi="Times New Roman" w:cs="Times New Roman"/>
+                <w:b/>
+                <w:bCs/>
+                <w:sz w:val="24"/>
+                <w:szCs w:val="24"/>
+              </w:rPr>
+              <w:t xml:space="preserve">11 September 2026</w:t>
+            </w:r>
+          </w:p>
+        </w:tc>
+      </w:tr>
+      <w:tr>
+        <w:trPr>
+          <w:trHeight w:val="420"/>
+        </w:trPr>
+        <w:tc>
+          <w:tcPr>
+            <w:tcW w:w="2100" w:type="dxa"/>
+            <w:vAlign w:val="center"/>
+          </w:tcPr>
+          <w:p>
+            <w:pPr>
+              <w:spacing w:before="40" w:after="40" w:line="240" w:lineRule="auto"/>
+              <w:jc w:val="left"/>
+            </w:pPr>
+            <w:r>
+              <w:rPr>
+                <w:rFonts w:ascii="Times New Roman" w:hAnsi="Times New Roman" w:cs="Times New Roman"/>
+                <w:b/>
+                <w:bCs/>
+                <w:sz w:val="24"/>
+                <w:szCs w:val="24"/>
+              </w:rPr>
+              <w:t xml:space="preserve">Student Name</w:t>
+            </w:r>
+          </w:p>
+        </w:tc>
+        <w:tc>
+          <w:tcPr>
+            <w:tcW w:w="450" w:type="dxa"/>
+            <w:vAlign w:val="center"/>
+          </w:tcPr>
+          <w:p>
+            <w:pPr>
+              <w:spacing w:before="40" w:after="40" w:line="240" w:lineRule="auto"/>
+              <w:jc w:val="left"/>
+            </w:pPr>
+            <w:r>
+              <w:rPr>
+                <w:rFonts w:ascii="Times New Roman" w:hAnsi="Times New Roman" w:cs="Times New Roman"/>
+                <w:b/>
+                <w:bCs/>
+                <w:sz w:val="24"/>
+                <w:szCs w:val="24"/>
+              </w:rPr>
+              <w:t xml:space="preserve">:</w:t>
+            </w:r>
+          </w:p>
+        </w:tc>
+        <w:tc>
+          <w:tcPr>
+            <w:tcW w:w="6476" w:type="dxa"/>
+            <w:vAlign w:val="center"/>
+          </w:tcPr>
+          <w:p>
+            <w:pPr>
+              <w:spacing w:before="40" w:after="40" w:line="240" w:lineRule="auto"/>
+              <w:jc w:val="left"/>
+            </w:pPr>
+            <w:r>
+              <w:rPr>
+                <w:rFonts w:ascii="Times New Roman" w:hAnsi="Times New Roman" w:cs="Times New Roman"/>
+                <w:b/>
+                <w:bCs/>
+                <w:sz w:val="24"/>
+                <w:szCs w:val="24"/>
+              </w:rPr>
+              <w:t xml:space="preserve">Tee Xing Yang</w:t>
+            </w:r>
+          </w:p>
+        </w:tc>
+      </w:tr>
+      <w:tr>
+        <w:trPr>
+          <w:trHeight w:val="420"/>
+        </w:trPr>
+        <w:tc>
+          <w:tcPr>
+            <w:tcW w:w="2100" w:type="dxa"/>
+            <w:vAlign w:val="center"/>
+          </w:tcPr>
+          <w:p>
+            <w:pPr>
+              <w:spacing w:before="40" w:after="40" w:line="240" w:lineRule="auto"/>
+              <w:jc w:val="left"/>
+            </w:pPr>
+            <w:r>
+              <w:rPr>
+                <w:rFonts w:ascii="Times New Roman" w:hAnsi="Times New Roman" w:cs="Times New Roman"/>
+                <w:b/>
+                <w:bCs/>
+                <w:sz w:val="24"/>
+                <w:szCs w:val="24"/>
+              </w:rPr>
+              <w:t xml:space="preserve">Student ID</w:t>
+            </w:r>
+          </w:p>
+        </w:tc>
+        <w:tc>
+          <w:tcPr>
+            <w:tcW w:w="450" w:type="dxa"/>
+            <w:vAlign w:val="center"/>
+          </w:tcPr>
+          <w:p>
+            <w:pPr>
+              <w:spacing w:before="40" w:after="40" w:line="240" w:lineRule="auto"/>
+              <w:jc w:val="left"/>
+            </w:pPr>
+            <w:r>
+              <w:rPr>
+                <w:rFonts w:ascii="Times New Roman" w:hAnsi="Times New Roman" w:cs="Times New Roman"/>
+                <w:b/>
+                <w:bCs/>
+                <w:sz w:val="24"/>
+                <w:szCs w:val="24"/>
+              </w:rPr>
+              <w:t xml:space="preserve">:</w:t>
+            </w:r>
+          </w:p>
+        </w:tc>
+        <w:tc>
+          <w:tcPr>
+            <w:tcW w:w="6476" w:type="dxa"/>
+            <w:vAlign w:val="center"/>
+          </w:tcPr>
+          <w:p>
+            <w:pPr>
+              <w:spacing w:before="40" w:after="40" w:line="240" w:lineRule="auto"/>
+              <w:jc w:val="left"/>
+            </w:pPr>
+            <w:r>
+              <w:rPr>
+                <w:rFonts w:ascii="Times New Roman" w:hAnsi="Times New Roman" w:cs="Times New Roman"/>
+                <w:b/>
+                <w:bCs/>
+                <w:sz w:val="24"/>
+                <w:szCs w:val="24"/>
+              </w:rPr>
+              <w:t xml:space="preserve">TP076174</w:t>
+            </w:r>
+          </w:p>
+        </w:tc>
+      </w:tr>
+    </w:tbl>
+    <w:p>
+      <w:pPr>
         <w:spacing w:after="0" w:line="240" w:lineRule="auto"/>
         <w:rPr>
           <w:sz w:val="2"/>
         </w:rPr>
         <w:sectPr>
-          <w:footerReference w:type="default" r:id="rId10"/>
+          <w:footerReference w:type="first" r:id="rId10"/>
           <w:pgSz w:w="11906" w:h="16838"/>
           <w:pgMar w:top="1440" w:right="1440" w:bottom="1440" w:left="1440" w:header="708" w:footer="708" w:gutter="0"/>
           <w:cols w:space="708"/>
+          <w:titlePg/>
           <w:docGrid w:linePitch="360"/>
         </w:sectPr>
       </w:pPr>

</xml_diff>

<commit_message>
Update Word table of contents (page numbers, Appendix C); ignore LibreOffice lock files
Co-Authored-By: Claude Opus 5.5 <noreply@anthropic.com>
</commit_message>
<xml_diff>
--- a/report/assignment-1/Assignment-1-Report.docx
+++ b/report/assignment-1/Assignment-1-Report.docx
@@ -2547,7 +2547,7 @@
                 <w:noProof/>
                 <w:webHidden/>
               </w:rPr>
-              <w:t>12</w:t>
+              <w:t>13</w:t>
             </w:r>
             <w:r>
               <w:rPr>
@@ -2617,7 +2617,7 @@
                 <w:noProof/>
                 <w:webHidden/>
               </w:rPr>
-              <w:t>13</w:t>
+              <w:t>14</w:t>
             </w:r>
             <w:r>
               <w:rPr>
@@ -2686,7 +2686,7 @@
                 <w:noProof/>
                 <w:webHidden/>
               </w:rPr>
-              <w:t>13</w:t>
+              <w:t>14</w:t>
             </w:r>
             <w:r>
               <w:rPr>
@@ -2755,7 +2755,7 @@
                 <w:noProof/>
                 <w:webHidden/>
               </w:rPr>
-              <w:t>14</w:t>
+              <w:t>15</w:t>
             </w:r>
             <w:r>
               <w:rPr>
@@ -2824,7 +2824,7 @@
                 <w:noProof/>
                 <w:webHidden/>
               </w:rPr>
-              <w:t>15</w:t>
+              <w:t>16</w:t>
             </w:r>
             <w:r>
               <w:rPr>
@@ -2894,7 +2894,7 @@
                 <w:noProof/>
                 <w:webHidden/>
               </w:rPr>
-              <w:t>17</w:t>
+              <w:t>18</w:t>
             </w:r>
             <w:r>
               <w:rPr>
@@ -2964,7 +2964,7 @@
                 <w:noProof/>
                 <w:webHidden/>
               </w:rPr>
-              <w:t>20</w:t>
+              <w:t>21</w:t>
             </w:r>
             <w:r>
               <w:rPr>
@@ -3033,7 +3033,7 @@
                 <w:noProof/>
                 <w:webHidden/>
               </w:rPr>
-              <w:t>20</w:t>
+              <w:t>21</w:t>
             </w:r>
             <w:r>
               <w:rPr>
@@ -3102,7 +3102,7 @@
                 <w:noProof/>
                 <w:webHidden/>
               </w:rPr>
-              <w:t>21</w:t>
+              <w:t>22</w:t>
             </w:r>
             <w:r>
               <w:rPr>
@@ -3171,7 +3171,7 @@
                 <w:noProof/>
                 <w:webHidden/>
               </w:rPr>
-              <w:t>21</w:t>
+              <w:t>22</w:t>
             </w:r>
             <w:r>
               <w:rPr>
@@ -3241,7 +3241,77 @@
                 <w:noProof/>
                 <w:webHidden/>
               </w:rPr>
-              <w:t>24</w:t>
+              <w:t>25</w:t>
+            </w:r>
+            <w:r>
+              <w:rPr>
+                <w:noProof/>
+                <w:webHidden/>
+              </w:rPr>
+              <w:fldChar w:fldCharType="end"/>
+            </w:r>
+          </w:hyperlink>
+        </w:p>
+        <w:p>
+          <w:pPr>
+            <w:pStyle w:val="TOC1"/>
+            <w:tabs>
+              <w:tab w:val="right" w:leader="dot" w:pos="9016"/>
+            </w:tabs>
+            <w:rPr>
+              <w:rFonts w:asciiTheme="minorHAnsi" w:hAnsiTheme="minorHAnsi" w:cstheme="minorBidi"/>
+              <w:b w:val="0"/>
+              <w:noProof/>
+            </w:rPr>
+          </w:pPr>
+          <w:hyperlink w:anchor="_Toc244223185" w:history="1">
+            <w:r>
+              <w:rPr>
+                <w:rStyle w:val="Hyperlink"/>
+                <w:noProof/>
+              </w:rPr>
+              <w:t>Appendix C: SQAP Summary Poster</w:t>
+            </w:r>
+            <w:r>
+              <w:rPr>
+                <w:noProof/>
+                <w:webHidden/>
+              </w:rPr>
+              <w:tab/>
+            </w:r>
+            <w:r>
+              <w:rPr>
+                <w:noProof/>
+                <w:webHidden/>
+              </w:rPr>
+              <w:fldChar w:fldCharType="begin"/>
+            </w:r>
+            <w:r>
+              <w:rPr>
+                <w:noProof/>
+                <w:webHidden/>
+              </w:rPr>
+              <w:instrText xml:space="preserve"> PAGEREF _Toc244223185 \h </w:instrText>
+            </w:r>
+            <w:r>
+              <w:rPr>
+                <w:noProof/>
+                <w:webHidden/>
+              </w:rPr>
+            </w:r>
+            <w:r>
+              <w:rPr>
+                <w:noProof/>
+                <w:webHidden/>
+              </w:rPr>
+              <w:fldChar w:fldCharType="separate"/>
+            </w:r>
+            <w:r>
+              <w:rPr>
+                <w:noProof/>
+                <w:webHidden/>
+              </w:rPr>
+              <w:t>26</w:t>
             </w:r>
             <w:r>
               <w:rPr>
@@ -11567,9 +11637,11 @@
         </w:numPr>
       </w:pPr>
       <w:bookmarkStart w:id="88" w:name="appendix-c-sqap-summary-poster"/>
+      <w:bookmarkStart w:id="89" w:name="_Toc244223185"/>
       <w:r>
         <w:t>Appendix C: SQAP Summary Poster</w:t>
       </w:r>
+      <w:bookmarkEnd w:id="89"/>
       <w:bookmarkEnd w:id="88"/>
     </w:p>
     <w:p>

</xml_diff>

<commit_message>
Export report to PDF; remove hidden UCTI logo from cover
Co-Authored-By: Claude Opus 5.5 <noreply@anthropic.com>
</commit_message>
<xml_diff>
--- a/report/assignment-1/Assignment-1-Report.docx
+++ b/report/assignment-1/Assignment-1-Report.docx
@@ -17,7 +17,7 @@
           <w:noProof/>
           <w:sz w:val="20"/>
         </w:rPr>
-        <w:pict w14:anchorId="3B470537">
+        <w:pict w14:anchorId="2E9FE4B3">
           <v:shapetype id="_x0000_t75" coordsize="21600,21600" o:spt="75" o:preferrelative="t" path="m@4@5l@4@11@9@11@9@5xe" filled="f" stroked="f">
             <v:stroke joinstyle="miter"/>
             <v:formulas>
@@ -37,17 +37,6 @@
             <v:path o:extrusionok="f" gradientshapeok="t" o:connecttype="rect"/>
             <o:lock v:ext="edit" aspectratio="t"/>
           </v:shapetype>
-          <v:shape id="Image1" o:spid="_x0000_s2051" type="#_x0000_t75" style="position:absolute;left:0;text-align:left;margin-left:148.05pt;margin-top:-35.8pt;width:117pt;height:117pt;z-index:251660288;visibility:visible;mso-wrap-style:square;mso-wrap-distance-left:9.05pt;mso-wrap-distance-top:0;mso-wrap-distance-right:9.05pt;mso-wrap-distance-bottom:0;mso-position-horizontal:absolute;mso-position-horizontal-relative:text;mso-position-vertical:absolute;mso-position-vertical-relative:text">
-            <v:imagedata r:id="rId8" o:title="" croptop="-3f" cropbottom="-3f" cropleft="-2131f" cropright="-3f"/>
-          </v:shape>
-        </w:pict>
-      </w:r>
-      <w:r>
-        <w:rPr>
-          <w:noProof/>
-          <w:sz w:val="20"/>
-        </w:rPr>
-        <w:pict w14:anchorId="2E9FE4B3">
           <v:shape id="APU Logo Final" o:spid="_x0000_s2052" type="#_x0000_t75" style="position:absolute;left:0;text-align:left;margin-left:0;margin-top:-40.8pt;width:133.55pt;height:133.55pt;z-index:251661312;visibility:visible;mso-wrap-style:square;mso-wrap-distance-left:9.05pt;mso-wrap-distance-top:0;mso-wrap-distance-right:9.05pt;mso-wrap-distance-bottom:0;mso-position-horizontal:center;mso-position-horizontal-relative:text;mso-position-vertical:absolute;mso-position-vertical-relative:text">
             <v:imagedata r:id="rId9" o:title="" croptop="-2f" cropbottom="-2f" cropleft="-2f" cropright="-2f"/>
           </v:shape>

</xml_diff>

<commit_message>
Use standard bullet character so lists render in LibreOffice; re-export PDF
Co-Authored-By: Claude Opus 5.5 <noreply@anthropic.com>
</commit_message>
<xml_diff>
--- a/report/assignment-1/Assignment-1-Report.docx
+++ b/report/assignment-1/Assignment-1-Report.docx
@@ -12079,8 +12079,8 @@
     <w:tmpl w:val="F8E29858"/>
     <w:lvl w:ilvl="0">
       <w:start w:val="1"/>
-      <w:numFmt w:val="decimal"/>
-      <w:lvlText w:val=""/>
+      <w:numFmt w:val="bullet"/>
+      <w:lvlText w:val="•"/>
       <w:lvlJc w:val="left"/>
       <w:pPr>
         <w:tabs>
@@ -12089,7 +12089,7 @@
         <w:ind w:left="720" w:hanging="360"/>
       </w:pPr>
       <w:rPr>
-        <w:rFonts w:ascii="Symbol" w:hAnsi="Symbol" w:hint="default"/>
+        <w:rFonts w:ascii="Times New Roman" w:hAnsi="Times New Roman" w:cs="Times New Roman" w:hint="default"/>
         <w:b w:val="0"/>
         <w:sz w:val="24"/>
       </w:rPr>
@@ -12101,8 +12101,8 @@
     <w:tmpl w:val="F8E29858"/>
     <w:lvl w:ilvl="0">
       <w:start w:val="1"/>
-      <w:numFmt w:val="decimal"/>
-      <w:lvlText w:val=""/>
+      <w:numFmt w:val="bullet"/>
+      <w:lvlText w:val="•"/>
       <w:lvlJc w:val="left"/>
       <w:pPr>
         <w:tabs>
@@ -12111,7 +12111,7 @@
         <w:ind w:left="720" w:hanging="360"/>
       </w:pPr>
       <w:rPr>
-        <w:rFonts w:ascii="Symbol" w:hAnsi="Symbol" w:hint="default"/>
+        <w:rFonts w:ascii="Times New Roman" w:hAnsi="Times New Roman" w:cs="Times New Roman" w:hint="default"/>
         <w:b w:val="0"/>
         <w:sz w:val="24"/>
       </w:rPr>
@@ -12254,8 +12254,8 @@
     <w:tmpl w:val="F8E29858"/>
     <w:lvl w:ilvl="0">
       <w:start w:val="1"/>
-      <w:numFmt w:val="decimal"/>
-      <w:lvlText w:val=""/>
+      <w:numFmt w:val="bullet"/>
+      <w:lvlText w:val="•"/>
       <w:lvlJc w:val="left"/>
       <w:pPr>
         <w:tabs>
@@ -12264,7 +12264,7 @@
         <w:ind w:left="720" w:hanging="360"/>
       </w:pPr>
       <w:rPr>
-        <w:rFonts w:ascii="Symbol" w:hAnsi="Symbol" w:hint="default"/>
+        <w:rFonts w:ascii="Times New Roman" w:hAnsi="Times New Roman" w:cs="Times New Roman" w:hint="default"/>
         <w:b w:val="0"/>
         <w:sz w:val="24"/>
       </w:rPr>
@@ -12277,8 +12277,8 @@
     <w:name w:val="BodyBullets"/>
     <w:lvl w:ilvl="0">
       <w:start w:val="1"/>
-      <w:numFmt w:val="decimal"/>
-      <w:lvlText w:val=""/>
+      <w:numFmt w:val="bullet"/>
+      <w:lvlText w:val="•"/>
       <w:lvlJc w:val="left"/>
       <w:pPr>
         <w:tabs>
@@ -12287,7 +12287,7 @@
         <w:ind w:left="720" w:hanging="360"/>
       </w:pPr>
       <w:rPr>
-        <w:rFonts w:ascii="Symbol" w:hAnsi="Symbol" w:hint="default"/>
+        <w:rFonts w:ascii="Times New Roman" w:hAnsi="Times New Roman" w:cs="Times New Roman" w:hint="default"/>
         <w:b w:val="0"/>
         <w:sz w:val="24"/>
       </w:rPr>
@@ -12323,8 +12323,8 @@
     <w:tmpl w:val="F8E29858"/>
     <w:lvl w:ilvl="0">
       <w:start w:val="1"/>
-      <w:numFmt w:val="decimal"/>
-      <w:lvlText w:val=""/>
+      <w:numFmt w:val="bullet"/>
+      <w:lvlText w:val="•"/>
       <w:lvlJc w:val="left"/>
       <w:pPr>
         <w:tabs>
@@ -12333,7 +12333,7 @@
         <w:ind w:left="720" w:hanging="360"/>
       </w:pPr>
       <w:rPr>
-        <w:rFonts w:ascii="Symbol" w:hAnsi="Symbol" w:hint="default"/>
+        <w:rFonts w:ascii="Times New Roman" w:hAnsi="Times New Roman" w:cs="Times New Roman" w:hint="default"/>
         <w:b w:val="0"/>
         <w:sz w:val="24"/>
       </w:rPr>
@@ -12345,8 +12345,8 @@
     <w:tmpl w:val="F8E29858"/>
     <w:lvl w:ilvl="0">
       <w:start w:val="1"/>
-      <w:numFmt w:val="decimal"/>
-      <w:lvlText w:val=""/>
+      <w:numFmt w:val="bullet"/>
+      <w:lvlText w:val="•"/>
       <w:lvlJc w:val="left"/>
       <w:pPr>
         <w:tabs>
@@ -12355,7 +12355,7 @@
         <w:ind w:left="720" w:hanging="360"/>
       </w:pPr>
       <w:rPr>
-        <w:rFonts w:ascii="Symbol" w:hAnsi="Symbol" w:hint="default"/>
+        <w:rFonts w:ascii="Times New Roman" w:hAnsi="Times New Roman" w:cs="Times New Roman" w:hint="default"/>
         <w:b w:val="0"/>
         <w:sz w:val="24"/>
       </w:rPr>
@@ -12470,8 +12470,8 @@
     <w:tmpl w:val="F8E29858"/>
     <w:lvl w:ilvl="0">
       <w:start w:val="1"/>
-      <w:numFmt w:val="decimal"/>
-      <w:lvlText w:val=""/>
+      <w:numFmt w:val="bullet"/>
+      <w:lvlText w:val="•"/>
       <w:lvlJc w:val="left"/>
       <w:pPr>
         <w:tabs>
@@ -12480,7 +12480,7 @@
         <w:ind w:left="720" w:hanging="360"/>
       </w:pPr>
       <w:rPr>
-        <w:rFonts w:ascii="Symbol" w:hAnsi="Symbol" w:hint="default"/>
+        <w:rFonts w:ascii="Times New Roman" w:hAnsi="Times New Roman" w:cs="Times New Roman" w:hint="default"/>
         <w:b w:val="0"/>
         <w:sz w:val="24"/>
       </w:rPr>
@@ -12509,8 +12509,8 @@
     <w:lvlOverride w:ilvl="0">
       <w:lvl w:ilvl="0">
         <w:start w:val="1"/>
-        <w:numFmt w:val="decimal"/>
-        <w:lvlText w:val=""/>
+        <w:numFmt w:val="bullet"/>
+        <w:lvlText w:val="•"/>
         <w:lvlJc w:val="left"/>
         <w:pPr>
           <w:tabs>
@@ -12519,7 +12519,7 @@
           <w:ind w:left="720" w:hanging="360"/>
         </w:pPr>
         <w:rPr>
-          <w:rFonts w:ascii="Symbol" w:hAnsi="Symbol" w:hint="default"/>
+          <w:rFonts w:ascii="Times New Roman" w:hAnsi="Times New Roman" w:cs="Times New Roman" w:hint="default"/>
           <w:b w:val="0"/>
           <w:sz w:val="24"/>
         </w:rPr>
@@ -12531,8 +12531,8 @@
     <w:lvlOverride w:ilvl="0">
       <w:lvl w:ilvl="0">
         <w:start w:val="1"/>
-        <w:numFmt w:val="decimal"/>
-        <w:lvlText w:val=""/>
+        <w:numFmt w:val="bullet"/>
+        <w:lvlText w:val="•"/>
         <w:lvlJc w:val="left"/>
         <w:pPr>
           <w:tabs>
@@ -12541,7 +12541,7 @@
           <w:ind w:left="720" w:hanging="360"/>
         </w:pPr>
         <w:rPr>
-          <w:rFonts w:ascii="Symbol" w:hAnsi="Symbol" w:hint="default"/>
+          <w:rFonts w:ascii="Times New Roman" w:hAnsi="Times New Roman" w:cs="Times New Roman" w:hint="default"/>
           <w:b w:val="0"/>
           <w:sz w:val="24"/>
         </w:rPr>
@@ -12553,8 +12553,8 @@
     <w:lvlOverride w:ilvl="0">
       <w:lvl w:ilvl="0">
         <w:start w:val="1"/>
-        <w:numFmt w:val="decimal"/>
-        <w:lvlText w:val=""/>
+        <w:numFmt w:val="bullet"/>
+        <w:lvlText w:val="•"/>
         <w:lvlJc w:val="left"/>
         <w:pPr>
           <w:tabs>
@@ -12563,7 +12563,7 @@
           <w:ind w:left="720" w:hanging="360"/>
         </w:pPr>
         <w:rPr>
-          <w:rFonts w:ascii="Symbol" w:hAnsi="Symbol" w:hint="default"/>
+          <w:rFonts w:ascii="Times New Roman" w:hAnsi="Times New Roman" w:cs="Times New Roman" w:hint="default"/>
           <w:b w:val="0"/>
           <w:sz w:val="24"/>
         </w:rPr>
@@ -12575,8 +12575,8 @@
     <w:lvlOverride w:ilvl="0">
       <w:lvl w:ilvl="0">
         <w:start w:val="1"/>
-        <w:numFmt w:val="decimal"/>
-        <w:lvlText w:val=""/>
+        <w:numFmt w:val="bullet"/>
+        <w:lvlText w:val="•"/>
         <w:lvlJc w:val="left"/>
         <w:pPr>
           <w:tabs>
@@ -12585,7 +12585,7 @@
           <w:ind w:left="720" w:hanging="360"/>
         </w:pPr>
         <w:rPr>
-          <w:rFonts w:ascii="Symbol" w:hAnsi="Symbol" w:hint="default"/>
+          <w:rFonts w:ascii="Times New Roman" w:hAnsi="Times New Roman" w:cs="Times New Roman" w:hint="default"/>
           <w:b w:val="0"/>
           <w:sz w:val="24"/>
         </w:rPr>
@@ -12597,8 +12597,8 @@
     <w:lvlOverride w:ilvl="0">
       <w:lvl w:ilvl="0">
         <w:start w:val="1"/>
-        <w:numFmt w:val="decimal"/>
-        <w:lvlText w:val=""/>
+        <w:numFmt w:val="bullet"/>
+        <w:lvlText w:val="•"/>
         <w:lvlJc w:val="left"/>
         <w:pPr>
           <w:tabs>
@@ -12607,7 +12607,7 @@
           <w:ind w:left="720" w:hanging="360"/>
         </w:pPr>
         <w:rPr>
-          <w:rFonts w:ascii="Symbol" w:hAnsi="Symbol" w:hint="default"/>
+          <w:rFonts w:ascii="Times New Roman" w:hAnsi="Times New Roman" w:cs="Times New Roman" w:hint="default"/>
           <w:b w:val="0"/>
           <w:sz w:val="24"/>
         </w:rPr>
@@ -12619,8 +12619,8 @@
     <w:lvlOverride w:ilvl="0">
       <w:lvl w:ilvl="0">
         <w:start w:val="1"/>
-        <w:numFmt w:val="decimal"/>
-        <w:lvlText w:val=""/>
+        <w:numFmt w:val="bullet"/>
+        <w:lvlText w:val="•"/>
         <w:lvlJc w:val="left"/>
         <w:pPr>
           <w:tabs>
@@ -12629,7 +12629,7 @@
           <w:ind w:left="720" w:hanging="360"/>
         </w:pPr>
         <w:rPr>
-          <w:rFonts w:ascii="Symbol" w:hAnsi="Symbol" w:hint="default"/>
+          <w:rFonts w:ascii="Times New Roman" w:hAnsi="Times New Roman" w:cs="Times New Roman" w:hint="default"/>
           <w:b w:val="0"/>
           <w:sz w:val="24"/>
         </w:rPr>
@@ -12641,8 +12641,8 @@
     <w:lvlOverride w:ilvl="0">
       <w:lvl w:ilvl="0">
         <w:start w:val="1"/>
-        <w:numFmt w:val="decimal"/>
-        <w:lvlText w:val=""/>
+        <w:numFmt w:val="bullet"/>
+        <w:lvlText w:val="•"/>
         <w:lvlJc w:val="left"/>
         <w:pPr>
           <w:tabs>
@@ -12651,7 +12651,7 @@
           <w:ind w:left="720" w:hanging="360"/>
         </w:pPr>
         <w:rPr>
-          <w:rFonts w:ascii="Symbol" w:hAnsi="Symbol" w:hint="default"/>
+          <w:rFonts w:ascii="Times New Roman" w:hAnsi="Times New Roman" w:cs="Times New Roman" w:hint="default"/>
           <w:b w:val="0"/>
           <w:sz w:val="24"/>
         </w:rPr>
@@ -12663,8 +12663,8 @@
     <w:lvlOverride w:ilvl="0">
       <w:lvl w:ilvl="0">
         <w:start w:val="1"/>
-        <w:numFmt w:val="decimal"/>
-        <w:lvlText w:val=""/>
+        <w:numFmt w:val="bullet"/>
+        <w:lvlText w:val="•"/>
         <w:lvlJc w:val="left"/>
         <w:pPr>
           <w:tabs>
@@ -12673,7 +12673,7 @@
           <w:ind w:left="720" w:hanging="360"/>
         </w:pPr>
         <w:rPr>
-          <w:rFonts w:ascii="Symbol" w:hAnsi="Symbol" w:hint="default"/>
+          <w:rFonts w:ascii="Times New Roman" w:hAnsi="Times New Roman" w:cs="Times New Roman" w:hint="default"/>
           <w:b w:val="0"/>
           <w:sz w:val="24"/>
         </w:rPr>
@@ -12685,8 +12685,8 @@
     <w:lvlOverride w:ilvl="0">
       <w:lvl w:ilvl="0">
         <w:start w:val="1"/>
-        <w:numFmt w:val="decimal"/>
-        <w:lvlText w:val=""/>
+        <w:numFmt w:val="bullet"/>
+        <w:lvlText w:val="•"/>
         <w:lvlJc w:val="left"/>
         <w:pPr>
           <w:tabs>
@@ -12695,7 +12695,7 @@
           <w:ind w:left="720" w:hanging="360"/>
         </w:pPr>
         <w:rPr>
-          <w:rFonts w:ascii="Symbol" w:hAnsi="Symbol" w:hint="default"/>
+          <w:rFonts w:ascii="Times New Roman" w:hAnsi="Times New Roman" w:cs="Times New Roman" w:hint="default"/>
           <w:b w:val="0"/>
           <w:sz w:val="24"/>
         </w:rPr>
@@ -12707,8 +12707,8 @@
     <w:lvlOverride w:ilvl="0">
       <w:lvl w:ilvl="0">
         <w:start w:val="1"/>
-        <w:numFmt w:val="decimal"/>
-        <w:lvlText w:val=""/>
+        <w:numFmt w:val="bullet"/>
+        <w:lvlText w:val="•"/>
         <w:lvlJc w:val="left"/>
         <w:pPr>
           <w:tabs>
@@ -12717,7 +12717,7 @@
           <w:ind w:left="720" w:hanging="360"/>
         </w:pPr>
         <w:rPr>
-          <w:rFonts w:ascii="Symbol" w:hAnsi="Symbol" w:hint="default"/>
+          <w:rFonts w:ascii="Times New Roman" w:hAnsi="Times New Roman" w:cs="Times New Roman" w:hint="default"/>
           <w:b w:val="0"/>
           <w:sz w:val="24"/>
         </w:rPr>
@@ -12729,8 +12729,8 @@
     <w:lvlOverride w:ilvl="0">
       <w:lvl w:ilvl="0">
         <w:start w:val="1"/>
-        <w:numFmt w:val="decimal"/>
-        <w:lvlText w:val=""/>
+        <w:numFmt w:val="bullet"/>
+        <w:lvlText w:val="•"/>
         <w:lvlJc w:val="left"/>
         <w:pPr>
           <w:tabs>
@@ -12739,7 +12739,7 @@
           <w:ind w:left="720" w:hanging="360"/>
         </w:pPr>
         <w:rPr>
-          <w:rFonts w:ascii="Symbol" w:hAnsi="Symbol" w:hint="default"/>
+          <w:rFonts w:ascii="Times New Roman" w:hAnsi="Times New Roman" w:cs="Times New Roman" w:hint="default"/>
           <w:b w:val="0"/>
           <w:sz w:val="24"/>
         </w:rPr>
@@ -12751,8 +12751,8 @@
     <w:lvlOverride w:ilvl="0">
       <w:lvl w:ilvl="0">
         <w:start w:val="1"/>
-        <w:numFmt w:val="decimal"/>
-        <w:lvlText w:val=""/>
+        <w:numFmt w:val="bullet"/>
+        <w:lvlText w:val="•"/>
         <w:lvlJc w:val="left"/>
         <w:pPr>
           <w:tabs>
@@ -12761,7 +12761,7 @@
           <w:ind w:left="720" w:hanging="360"/>
         </w:pPr>
         <w:rPr>
-          <w:rFonts w:ascii="Symbol" w:hAnsi="Symbol" w:hint="default"/>
+          <w:rFonts w:ascii="Times New Roman" w:hAnsi="Times New Roman" w:cs="Times New Roman" w:hint="default"/>
           <w:b w:val="0"/>
           <w:sz w:val="24"/>
         </w:rPr>
@@ -12773,8 +12773,8 @@
     <w:lvlOverride w:ilvl="0">
       <w:lvl w:ilvl="0">
         <w:start w:val="1"/>
-        <w:numFmt w:val="decimal"/>
-        <w:lvlText w:val=""/>
+        <w:numFmt w:val="bullet"/>
+        <w:lvlText w:val="•"/>
         <w:lvlJc w:val="left"/>
         <w:pPr>
           <w:tabs>
@@ -12783,7 +12783,7 @@
           <w:ind w:left="720" w:hanging="360"/>
         </w:pPr>
         <w:rPr>
-          <w:rFonts w:ascii="Symbol" w:hAnsi="Symbol" w:hint="default"/>
+          <w:rFonts w:ascii="Times New Roman" w:hAnsi="Times New Roman" w:cs="Times New Roman" w:hint="default"/>
           <w:b w:val="0"/>
           <w:sz w:val="24"/>
         </w:rPr>
@@ -12795,8 +12795,8 @@
     <w:lvlOverride w:ilvl="0">
       <w:lvl w:ilvl="0">
         <w:start w:val="1"/>
-        <w:numFmt w:val="decimal"/>
-        <w:lvlText w:val=""/>
+        <w:numFmt w:val="bullet"/>
+        <w:lvlText w:val="•"/>
         <w:lvlJc w:val="left"/>
         <w:pPr>
           <w:tabs>
@@ -12805,7 +12805,7 @@
           <w:ind w:left="720" w:hanging="360"/>
         </w:pPr>
         <w:rPr>
-          <w:rFonts w:ascii="Symbol" w:hAnsi="Symbol" w:hint="default"/>
+          <w:rFonts w:ascii="Times New Roman" w:hAnsi="Times New Roman" w:cs="Times New Roman" w:hint="default"/>
           <w:b w:val="0"/>
           <w:sz w:val="24"/>
         </w:rPr>
@@ -12817,8 +12817,8 @@
     <w:lvlOverride w:ilvl="0">
       <w:lvl w:ilvl="0">
         <w:start w:val="1"/>
-        <w:numFmt w:val="decimal"/>
-        <w:lvlText w:val=""/>
+        <w:numFmt w:val="bullet"/>
+        <w:lvlText w:val="•"/>
         <w:lvlJc w:val="left"/>
         <w:pPr>
           <w:tabs>
@@ -12827,7 +12827,7 @@
           <w:ind w:left="720" w:hanging="360"/>
         </w:pPr>
         <w:rPr>
-          <w:rFonts w:ascii="Symbol" w:hAnsi="Symbol" w:hint="default"/>
+          <w:rFonts w:ascii="Times New Roman" w:hAnsi="Times New Roman" w:cs="Times New Roman" w:hint="default"/>
           <w:b w:val="0"/>
           <w:sz w:val="24"/>
         </w:rPr>

</xml_diff>

<commit_message>
Humanize Appendix A (Gemini 3.8 + humanizer skill); sync md, Word and PDF
Co-Authored-By: Claude Opus 5.5 <noreply@anthropic.com>
</commit_message>
<xml_diff>
--- a/report/assignment-1/Assignment-1-Report.docx
+++ b/report/assignment-1/Assignment-1-Report.docx
@@ -9528,7 +9528,7 @@
         <w:pStyle w:val="FirstParagraph"/>
       </w:pPr>
       <w:r>
-        <w:t>Actual's situation is first described against the eight factors commonly considered when selecting a software process model (GeeksforGeeks, 2025). Each factor points either to an iterative, agile model, suited to changing requirements and close customer involvement, or to a linear model such as Waterfall, suited to stable requirements, fixed deadlines and predictability. Table A.1 applies the factors to Actual; the last column shows which kind of model each points to.</w:t>
+        <w:t xml:space="preserve">Selecting a software process model involves assessing project characteristics against eight standard factors (GeeksforGeeks, 2025). These factors indicate whether a project requires an iterative, agile model suited to changing requirements and direct user involvement, or a linear model such as Waterfall suited to predictable requirements, fixed deadlines, and stability. Table A.1 evaluates Actual against these criteria.</w:t>
       </w:r>
     </w:p>
     <w:tbl>
@@ -10214,7 +10214,7 @@
         <w:spacing w:before="240"/>
       </w:pPr>
       <w:r>
-        <w:t>Most factors point to an agile model, but two complicate it. Agile models need an experienced, self-disciplined team, and low risk tolerance favours linear models (GeeksforGeeks, 2025). Actual's experienced reviewers are few volunteers whose review time has already run out once, and a wrong balance can lead a household to a poor spending decision; in 2026 a critical security flaw let anyone read users' bank balances and transactions without logging in (Actual Budget, 2026c).</w:t>
+        <w:t xml:space="preserve">While most factors support an agile approach, team expertise and risk tolerance complicate the choice. Agile methods rely on an experienced, self-disciplined team, whereas low risk tolerance favours linear models (GeeksforGeeks, 2025). Actual has only a few experienced volunteer reviewers, and their capacity has failed under load previously (Aboltins, 2025). Furthermore, a wrong balance can lead a household to a poor spending decision, and in 2026 a critical security flaw permitted unauthenticated access to users' bank balances and transactions (Actual Budget, 2026c).</w:t>
       </w:r>
     </w:p>
     <w:p>
@@ -10222,11 +10222,7 @@
         <w:pStyle w:val="BodyText"/>
       </w:pPr>
       <w:r>
-        <w:t xml:space="preserve">Actual therefore needs an agile model with written controls added where team expertise and risk tolerance leave it exposed, as the same guidance recommends combining approaches when a project's needs are mixed (GeeksforGeeks, 2025). Table A.2 turns this profile into five </w:t>
-      </w:r>
-      <w:r>
-        <w:lastRenderedPageBreak/>
-        <w:t>requirements, each with the reason Actual needs it and the part of the brief it answers. Section A.3 tests every candidate against them.</w:t>
+        <w:t xml:space="preserve">Because standard guidance recommends combining approaches when project characteristics diverge (GeeksforGeeks, 2025), Actual requires an agile workflow supplemented with written controls where volunteer capacity and risk tolerance leave it exposed. Table A.2 maps these considerations to five specific requirements tested in Section A.3.</w:t>
       </w:r>
     </w:p>
     <w:tbl>
@@ -10725,7 +10721,7 @@
         <w:pStyle w:val="FirstParagraph"/>
       </w:pPr>
       <w:r>
-        <w:t>The comparison focuses on five established methodologies, each representing a different approach: Spiral, Scrum, Extreme Programming (XP), Kanban and DevOps. Waterfall and the V-Model were not shortlisted, because they suit stable requirements and leave little room for change (GeeksforGeeks, 2025), whereas Actual's requirements change with every vote. RAD and RUP were set aside because their planned phases and deliverables assume a team that can be scheduled, while Actual's volunteers choose their own work. Spiral is included although it is not agile, because risk tolerance is the one factor on which Actual leans away from agile methods.</w:t>
+        <w:t xml:space="preserve">Five methodologies reflect distinct approaches to software delivery: Spiral, Scrum, Extreme Programming (XP), Kanban, and DevOps. Linear models such as Waterfall and the V-Model were excluded because they suit stable requirements and offer little flexibility (GeeksforGeeks, 2025), which conflicts with Actual's vote-driven backlog. Rapid Application Development (RAD) and the Rational Unified Process (RUP) were also set aside because their structured phases and scheduled deliverables require assignable staff rather than self-directed volunteers. Although Spiral is not an agile methodology, it is evaluated because Actual's low risk tolerance favours systematic risk analysis.</w:t>
       </w:r>
     </w:p>
     <w:p>
@@ -10733,7 +10729,7 @@
         <w:pStyle w:val="BodyText"/>
       </w:pPr>
       <w:r>
-        <w:t>Actual's current process is also kept in the comparison as a reference point. It is not a candidate, but any change must prove better than today.</w:t>
+        <w:t xml:space="preserve">Actual's existing workflow serves as a baseline for the evaluation. Any adopted methodology must demonstrate clear improvements over current practice.</w:t>
       </w:r>
     </w:p>
     <w:p>
@@ -10759,7 +10755,7 @@
         <w:pStyle w:val="FirstParagraph"/>
       </w:pPr>
       <w:r>
-        <w:t>Each candidate is compared with how Actual works, using the requirements in Table A.2. The comparison can produce two kinds of finding:</w:t>
+        <w:t xml:space="preserve">Each candidate is assessed against the requirements in Table A.2, assuming that existing practices (specifically continuous integration, peer review, and monthly releases) remain in place. The assessment distinguishes between two outcomes:</w:t>
       </w:r>
     </w:p>
     <w:p>
@@ -10771,17 +10767,7 @@
         </w:numPr>
       </w:pPr>
       <w:r>
-        <w:t xml:space="preserve">a </w:t>
-      </w:r>
-      <w:r>
-        <w:rPr>
-          <w:b/>
-          <w:bCs/>
-        </w:rPr>
-        <w:t>clash</w:t>
-      </w:r>
-      <w:r>
-        <w:t>, where the methodology demands something Actual cannot provide. A clash rules the candidate out, because removing it would mean abandoning the methodology itself;</w:t>
+        <w:t xml:space="preserve">a clash occurs when a candidate requires conditions that Actual cannot provide, disqualifying the methodology;</w:t>
       </w:r>
     </w:p>
     <w:p>
@@ -10793,17 +10779,7 @@
         </w:numPr>
       </w:pPr>
       <w:r>
-        <w:t xml:space="preserve">a </w:t>
-      </w:r>
-      <w:r>
-        <w:rPr>
-          <w:b/>
-          <w:bCs/>
-        </w:rPr>
-        <w:t>gap</w:t>
-      </w:r>
-      <w:r>
-        <w:t>, where the methodology does not cover one of the requirements. A gap does not rule a candidate out, because a missing practice can be added.</w:t>
+        <w:t xml:space="preserve">a gap occurs when a candidate omits a required practice, which can be resolved by introducing supplementary controls.</w:t>
       </w:r>
     </w:p>
     <w:p>
@@ -10811,8 +10787,7 @@
         <w:pStyle w:val="FirstParagraph"/>
       </w:pPr>
       <w:r>
-        <w:lastRenderedPageBreak/>
-        <w:t>Every candidate is assumed to keep Actual's existing CI, review and monthly release, so none is credited for what Actual already does. Table A.3 sets out what each candidate requires of a team and the resulting findings.</w:t>
+        <w:t xml:space="preserve">Table A.3 outlines the demands, clashes, and gaps identified for each candidate.</w:t>
       </w:r>
     </w:p>
     <w:tbl>
@@ -11520,7 +11495,7 @@
         <w:spacing w:before="240"/>
       </w:pPr>
       <w:r>
-        <w:t>First, three candidates clash with how Actual works. Scrum and XP both assume team members who commit their time together. Scrum's Sprint Goal "is a commitment by the Developers" (Schwaber &amp; Sutherland, 2020, Commitment: Sprint Goal section) and its Product Owner "is one person, not a committee" (Schwaber &amp; Sutherland, 2020, Product Owner section), while XP's pair programming needs two developers available at once, even when pairs work remotely (Beck &amp; Andres, 2005). Actual's volunteers choose their own work and cannot promise to be available together, and its priorities come from users' votes, so neither assumption holds.</w:t>
+        <w:t xml:space="preserve">Three candidate methodologies clash directly with Actual's volunteer structure. Scrum and XP require team members who can coordinate schedules and commit time collectively. In Scrum, the Sprint Goal "is a commitment by the Developers" (Schwaber &amp; Sutherland, 2020, Commitment: Sprint Goal section) and the Product Owner "is one person, not a committee" (Schwaber &amp; Sutherland, 2020, Product Owner section). Similarly, XP relies on pair programming, which requires two developers to work simultaneously even when collaborating remotely (Beck &amp; Andres, 2005). Because Actual's contributors volunteer irregularly without schedule commitments, and priorities are determined by community voting rather than an individual owner, these core assumptions fail.</w:t>
       </w:r>
     </w:p>
     <w:p>
@@ -11528,11 +11503,7 @@
         <w:pStyle w:val="BodyText"/>
       </w:pPr>
       <w:r>
-        <w:t xml:space="preserve">Spiral fits Actual's low risk tolerance best, because every cycle starts with risk analysis. That analysis, however, needs expert judgement (Boehm, 1988), which is why Spiral is usually </w:t>
-      </w:r>
-      <w:r>
-        <w:lastRenderedPageBreak/>
-        <w:t>described as complex and expertise-dependent (GeeksforGeeks, 2025). In Actual the experts are the same few maintainers whose review time is already the bottleneck.</w:t>
+        <w:t xml:space="preserve">Spiral addresses low risk tolerance by commencing each cycle with risk analysis. However, effective risk evaluation demands experienced technical judgement (Boehm, 1988), which is why Spiral is usually described as complex and dependent on specialist expertise (GeeksforGeeks, 2025). In Actual's case, that analytical burden would fall on the small group of maintainers who already represent the project's primary bottleneck.</w:t>
       </w:r>
     </w:p>
     <w:p>
@@ -11540,7 +11511,7 @@
         <w:pStyle w:val="BodyText"/>
       </w:pPr>
       <w:r>
-        <w:t>Next, Kanban and DevOps have no clash, so the question is which would add more to what Actual already does. DevOps mainly adds automated testing throughout delivery (DORA, n.d.), which Actual's CI already provides, and integration with operations, which has little to attach to because users run the server themselves or through a hosting provider (Actual Budget, n.d.-c). Neither addresses Actual's real bottleneck: human review.</w:t>
+        <w:t xml:space="preserve">Neither Kanban nor DevOps clashes with Actual's working model, shifting the evaluation to what each adds beyond existing practice. DevOps emphasises continuous automated testing across delivery (DORA, n.d.), which Actual already maintains within its CI pipeline, alongside closer operational integration. Operational integration offers limited benefit here, as end users host the server independently or through third-party hosting services (Actual Budget, n.d.-c). Consequently, DevOps leaves maintainer review capacity unaddressed.</w:t>
       </w:r>
     </w:p>
     <w:p>
@@ -11548,7 +11519,7 @@
         <w:pStyle w:val="BodyText"/>
       </w:pPr>
       <w:r>
-        <w:t>Kanban, in contrast, targets the problem identified in Section 2.1: nothing limits how many PRs wait for review. It adds three things. First, it limits work in progress (WIP), the number of items allowed in a stage at once (Kanban University, n.d.). This assignment proposes placing that limit on review: once it is reached, no new PRs enter review until waiting ones are cleared, which protects the maintainers' review time. Second, the rules for moving work from one stage to the next are written down, so they do not depend on who happens to be on the team. Third, contributors still pick tasks from the voted backlog whenever they have time, so nobody has to commit to a fixed amount of work as Scrum would require.</w:t>
+        <w:t xml:space="preserve">Kanban directly addresses the bottleneck identified in Section 2.1, where nothing limits how many pull requests wait for review. By capping work in progress (WIP), Kanban restricts the number of active items permitted in any workflow stage (Kanban University, n.d.). Applying this limit to the review column ensures that once the threshold is reached, new submissions cannot enter review until pending requests are processed, thereby protecting maintainer time. Furthermore, establishing explicit, written policies for transitioning work between stages preserves process knowledge despite changes in team membership. Contributors can continue selecting issues from the voted backlog whenever their availability permits, preserving volunteer flexibility without requiring fixed sprint commitments.</w:t>
       </w:r>
     </w:p>
     <w:p>
@@ -11556,24 +11527,24 @@
         <w:pStyle w:val="BodyText"/>
       </w:pPr>
       <w:r>
-        <w:t xml:space="preserve">Finally, Kanban has to be better than keeping today's process. The gain is modest but real: Actual's process already suits volunteers, and Kanban adds a review limit and written rules on top of it without replacing it. Kanban does not, however, say how quality should be checked, for example which tests a change must pass, and this matters because Actual's risk tolerance is low. The report therefore adds </w:t>
+        <w:t xml:space="preserve">Compared to maintaining the status quo, Kanban introduces structured WIP limits and explicit transition rules while preserving the autonomy volunteer contributors require. However, core Kanban does not define technical quality verification or prescribe required test standards. Because Actual operates with low risk tolerance regarding financial accuracy and privacy, process oversight must be strengthened. This report therefore incorporates </w:t>
       </w:r>
       <w:r>
         <w:rPr>
           <w:b/>
           <w:bCs/>
         </w:rPr>
-        <w:t>mandatory quality gates (QA gates)</w:t>
-      </w:r>
-      <w:r>
-        <w:t xml:space="preserve">: risk-scaled checks, defined in Section 3, added to each column's exit policy. </w:t>
+        <w:t xml:space="preserve">mandatory quality gates (QA gates)</w:t>
+      </w:r>
+      <w:r>
+        <w:t xml:space="preserve">, embedding the risk-scaled verification criteria detailed in Section 3 into each column's exit policy. </w:t>
       </w:r>
       <w:r>
         <w:rPr>
           <w:b/>
           <w:bCs/>
         </w:rPr>
-        <w:t>The selected methodology is Kanban, tailored with mandatory QA gates.</w:t>
+        <w:t xml:space="preserve">The selected methodology is Kanban, tailored with mandatory QA gates.</w:t>
       </w:r>
     </w:p>
     <w:p>

</xml_diff>

<commit_message>
Move humanized worked example back into 3.5; SQAP poster becomes Appendix B
Co-Authored-By: Claude Opus 5.5 <noreply@anthropic.com>
</commit_message>
<xml_diff>
--- a/report/assignment-1/Assignment-1-Report.docx
+++ b/report/assignment-1/Assignment-1-Report.docx
@@ -3183,83 +3183,13 @@
               <w:noProof/>
             </w:rPr>
           </w:pPr>
-          <w:hyperlink w:anchor="_Toc244223184" w:history="1">
+          <w:hyperlink w:anchor="_Toc244223185" w:history="1">
             <w:r>
               <w:rPr>
                 <w:rStyle w:val="Hyperlink"/>
                 <w:noProof/>
               </w:rPr>
-              <w:t>Appendix B: Worked Example of the QA Plan</w:t>
-            </w:r>
-            <w:r>
-              <w:rPr>
-                <w:noProof/>
-                <w:webHidden/>
-              </w:rPr>
-              <w:tab/>
-            </w:r>
-            <w:r>
-              <w:rPr>
-                <w:noProof/>
-                <w:webHidden/>
-              </w:rPr>
-              <w:fldChar w:fldCharType="begin"/>
-            </w:r>
-            <w:r>
-              <w:rPr>
-                <w:noProof/>
-                <w:webHidden/>
-              </w:rPr>
-              <w:instrText xml:space="preserve"> PAGEREF _Toc244223184 \h </w:instrText>
-            </w:r>
-            <w:r>
-              <w:rPr>
-                <w:noProof/>
-                <w:webHidden/>
-              </w:rPr>
-            </w:r>
-            <w:r>
-              <w:rPr>
-                <w:noProof/>
-                <w:webHidden/>
-              </w:rPr>
-              <w:fldChar w:fldCharType="separate"/>
-            </w:r>
-            <w:r>
-              <w:rPr>
-                <w:noProof/>
-                <w:webHidden/>
-              </w:rPr>
-              <w:t>25</w:t>
-            </w:r>
-            <w:r>
-              <w:rPr>
-                <w:noProof/>
-                <w:webHidden/>
-              </w:rPr>
-              <w:fldChar w:fldCharType="end"/>
-            </w:r>
-          </w:hyperlink>
-        </w:p>
-        <w:p>
-          <w:pPr>
-            <w:pStyle w:val="TOC1"/>
-            <w:tabs>
-              <w:tab w:val="right" w:leader="dot" w:pos="9016"/>
-            </w:tabs>
-            <w:rPr>
-              <w:rFonts w:asciiTheme="minorHAnsi" w:hAnsiTheme="minorHAnsi" w:cstheme="minorBidi"/>
-              <w:b w:val="0"/>
-              <w:noProof/>
-            </w:rPr>
-          </w:pPr>
-          <w:hyperlink w:anchor="_Toc244223185" w:history="1">
-            <w:r>
-              <w:rPr>
-                <w:rStyle w:val="Hyperlink"/>
-                <w:noProof/>
-              </w:rPr>
-              <w:t>Appendix C: SQAP Summary Poster</w:t>
+              <w:t>Appendix B: SQAP Summary Poster</w:t>
             </w:r>
             <w:r>
               <w:rPr>
@@ -6438,6 +6368,14 @@
     </w:p>
     <w:p>
       <w:pPr>
+        <w:pStyle w:val="BodyText"/>
+      </w:pPr>
+      <w:r>
+        <w:t>As an example of a card moving through the plan in Table 3.2, consider a contributor who adds a new bank-sync provider, the kind of change behind GHSA-m2cq-xjgm-f668 (Section 3.3). At triage, the card is marked High tier because it touches bank sync, with an acceptance criterion that every new endpoint must refuse requests without a valid login. In Design, the implementer lists the new endpoints and who may call each one; at Build/PR, those endpoints are added to the authorisation test matrix. Without the login check, that test fails and the card cannot move to Verify, so a flaw like the 2026 one could be stopped before release. By contrast, a documentation typo fix is Low tier and passes through the normal checks only.</w:t>
+      </w:r>
+    </w:p>
+    <w:p>
+      <w:pPr>
         <w:pStyle w:val="Heading2"/>
       </w:pPr>
       <w:bookmarkStart w:id="57" w:name="_Toc244223174"/>
@@ -11555,51 +11493,12 @@
           <w:numId w:val="0"/>
         </w:numPr>
       </w:pPr>
-      <w:bookmarkStart w:id="85" w:name="_Toc244220734"/>
-      <w:bookmarkStart w:id="86" w:name="appendix-b-worked-example-of-the-qa-plan"/>
-      <w:bookmarkStart w:id="87" w:name="_Toc244223184"/>
+      <w:bookmarkStart w:id="88" w:name="appendix-b-sqap-summary-poster"/>
+      <w:bookmarkStart w:id="89" w:name="_Toc244223185"/>
       <w:bookmarkEnd w:id="74"/>
       <w:bookmarkEnd w:id="83"/>
       <w:r>
-        <w:lastRenderedPageBreak/>
-        <w:t>Appendix B: Worked Example of the QA Plan</w:t>
-      </w:r>
-      <w:bookmarkEnd w:id="85"/>
-      <w:bookmarkEnd w:id="87"/>
-    </w:p>
-    <w:p>
-      <w:pPr>
-        <w:pStyle w:val="FirstParagraph"/>
-      </w:pPr>
-      <w:r>
-        <w:rPr>
-          <w:i/>
-          <w:iCs/>
-        </w:rPr>
-        <w:t>Supplementary illustration of Table 3.2 (Section 3.5).</w:t>
-      </w:r>
-    </w:p>
-    <w:p>
-      <w:pPr>
-        <w:pStyle w:val="BodyText"/>
-      </w:pPr>
-      <w:r>
-        <w:t>Suppose a contributor adds a new bank-sync provider, the kind of change behind GHSA-m2cq-xjgm-f668 (Section 3.3). At triage, the card is marked High tier because it touches bank sync, and an acceptance criterion is written: every new endpoint must refuse requests without a valid login. At design, the implementer lists the new endpoints and who may call each one. At Build/PR, the endpoints are added to the authorisation test matrix. If the login check is missing, that test fails and the card cannot move to Verify, so a flaw like the 2026 one could be stopped before release. A typo fix in the documentation, by contrast, is Low tier and passes through the normal checks only.</w:t>
-      </w:r>
-    </w:p>
-    <w:bookmarkEnd w:id="86"/>
-    <w:p>
-      <w:pPr>
-        <w:pStyle w:val="Heading1"/>
-        <w:numPr>
-          <w:ilvl w:val="0"/>
-          <w:numId w:val="0"/>
-        </w:numPr>
-      </w:pPr>
-      <w:bookmarkStart w:id="88" w:name="appendix-c-sqap-summary-poster"/>
-      <w:bookmarkStart w:id="89" w:name="_Toc244223185"/>
-      <w:r>
-        <w:t>Appendix C: SQAP Summary Poster</w:t>
+        <w:t>Appendix B: SQAP Summary Poster</w:t>
       </w:r>
       <w:bookmarkEnd w:id="89"/>
       <w:bookmarkEnd w:id="88"/>
@@ -11631,13 +11530,13 @@
           <wp:inline distT="0" distB="0" distL="0" distR="0">
             <wp:extent cx="5733000" cy="4152140"/>
             <wp:effectExtent l="0" t="0" r="0" b="0"/>
-            <wp:docPr id="30" name="Picture" descr="Figure C.1: SQAP summary poster for Actual"/>
+            <wp:docPr id="30" name="Picture" descr="Figure B.1: SQAP summary poster for Actual"/>
             <wp:cNvGraphicFramePr/>
             <a:graphic xmlns:a="http://schemas.openxmlformats.org/drawingml/2006/main">
               <a:graphicData uri="http://schemas.openxmlformats.org/drawingml/2006/picture">
                 <pic:pic xmlns:pic="http://schemas.openxmlformats.org/drawingml/2006/picture">
                   <pic:nvPicPr>
-                    <pic:cNvPr id="31" name="Picture" descr="figures/appendix-c-sqap.png"/>
+                    <pic:cNvPr id="31" name="Picture" descr="figures/appendix-b-sqap.png"/>
                     <pic:cNvPicPr>
                       <a:picLocks noChangeAspect="1" noChangeArrowheads="1"/>
                     </pic:cNvPicPr>
@@ -11680,7 +11579,7 @@
           <w:i/>
           <w:iCs/>
         </w:rPr>
-        <w:t>Figure C.1. Software Quality Assurance Plan for Actual Budget, summarised as a poster.</w:t>
+        <w:t>Figure B.1. Software Quality Assurance Plan for Actual Budget, summarised as a poster.</w:t>
       </w:r>
     </w:p>
     <w:p>

</xml_diff>

<commit_message>
Remove Appendix B intro line
Co-Authored-By: Claude Opus 5.5 <noreply@anthropic.com>
</commit_message>
<xml_diff>
--- a/report/assignment-1/Assignment-1-Report.docx
+++ b/report/assignment-1/Assignment-1-Report.docx
@@ -11502,18 +11502,6 @@
       </w:r>
       <w:bookmarkEnd w:id="89"/>
       <w:bookmarkEnd w:id="88"/>
-    </w:p>
-    <w:p>
-      <w:pPr>
-        <w:pStyle w:val="FirstParagraph"/>
-      </w:pPr>
-      <w:r>
-        <w:rPr>
-          <w:i/>
-          <w:iCs/>
-        </w:rPr>
-        <w:t>Supplementary summary of Sections 3 and 4, arranged by SQAP section. It adds no new checks.</w:t>
-      </w:r>
     </w:p>
     <w:p>
       <w:pPr>

</xml_diff>

<commit_message>
Unbold Appendix A closing sentence; shorten Figure B.1 caption
Co-Authored-By: Claude Opus 5.5 <noreply@anthropic.com>
</commit_message>
<xml_diff>
--- a/report/assignment-1/Assignment-1-Report.docx
+++ b/report/assignment-1/Assignment-1-Report.docx
@@ -11468,20 +11468,12 @@
         <w:t xml:space="preserve">Compared to maintaining the status quo, Kanban introduces structured WIP limits and explicit transition rules while preserving the autonomy volunteer contributors require. However, core Kanban does not define technical quality verification or prescribe required test standards. Because Actual operates with low risk tolerance regarding financial accuracy and privacy, process oversight must be strengthened. This report therefore incorporates </w:t>
       </w:r>
       <w:r>
-        <w:rPr>
-          <w:b/>
-          <w:bCs/>
-        </w:rPr>
         <w:t xml:space="preserve">mandatory quality gates (QA gates)</w:t>
       </w:r>
       <w:r>
         <w:t xml:space="preserve">, embedding the risk-scaled verification criteria detailed in Section 3 into each column's exit policy. </w:t>
       </w:r>
       <w:r>
-        <w:rPr>
-          <w:b/>
-          <w:bCs/>
-        </w:rPr>
         <w:t xml:space="preserve">The selected methodology is Kanban, tailored with mandatory QA gates.</w:t>
       </w:r>
     </w:p>
@@ -11567,7 +11559,7 @@
           <w:i/>
           <w:iCs/>
         </w:rPr>
-        <w:t>Figure B.1. Software Quality Assurance Plan for Actual Budget, summarised as a poster.</w:t>
+        <w:t>Figure B.1. Software Quality Assurance Plan for Actual Budget.</w:t>
       </w:r>
     </w:p>
     <w:p>

</xml_diff>